<commit_message>
Partie 2 Prompt structuré
</commit_message>
<xml_diff>
--- a/ai-business_assistant.docx
+++ b/ai-business_assistant.docx
@@ -1829,6 +1829,7 @@
     </w:p>
     <w:p>
       <w:pPr>
+        <w:ind w:left="360"/>
         <w:rPr>
           <w:rFonts w:ascii="Times New Roman" w:eastAsia="Times New Roman" w:hAnsi="Times New Roman" w:cs="Times New Roman"/>
           <w:b/>
@@ -1837,6 +1838,719 @@
           <w:lang w:eastAsia="fr-FR"/>
         </w:rPr>
       </w:pPr>
+    </w:p>
+    <w:p>
+      <w:pPr>
+        <w:pStyle w:val="Paragraphedeliste"/>
+        <w:numPr>
+          <w:ilvl w:val="0"/>
+          <w:numId w:val="2"/>
+        </w:numPr>
+        <w:rPr>
+          <w:rFonts w:ascii="Times New Roman" w:hAnsi="Times New Roman" w:cs="Times New Roman"/>
+          <w:b/>
+          <w:sz w:val="28"/>
+          <w:szCs w:val="28"/>
+        </w:rPr>
+      </w:pPr>
+      <w:r>
+        <w:rPr>
+          <w:rFonts w:ascii="Times New Roman" w:hAnsi="Times New Roman" w:cs="Times New Roman"/>
+          <w:b/>
+          <w:sz w:val="28"/>
+          <w:szCs w:val="28"/>
+        </w:rPr>
+        <w:lastRenderedPageBreak/>
+        <w:t>Prompt structuré (avec raisonnement guidé)</w:t>
+      </w:r>
+    </w:p>
+    <w:p>
+      <w:pPr>
+        <w:pStyle w:val="PrformatHTML"/>
+        <w:ind w:left="708"/>
+        <w:rPr>
+          <w:rStyle w:val="CodeHTML"/>
+          <w:rFonts w:ascii="Times New Roman" w:hAnsi="Times New Roman" w:cs="Times New Roman"/>
+          <w:sz w:val="24"/>
+          <w:szCs w:val="24"/>
+        </w:rPr>
+      </w:pPr>
+      <w:r>
+        <w:rPr>
+          <w:rStyle w:val="CodeHTML"/>
+          <w:rFonts w:ascii="Times New Roman" w:hAnsi="Times New Roman" w:cs="Times New Roman"/>
+          <w:b/>
+          <w:bCs/>
+          <w:sz w:val="24"/>
+          <w:szCs w:val="24"/>
+        </w:rPr>
+        <w:t>Rôle</w:t>
+      </w:r>
+      <w:r>
+        <w:rPr>
+          <w:rStyle w:val="CodeHTML"/>
+          <w:rFonts w:ascii="Times New Roman" w:hAnsi="Times New Roman" w:cs="Times New Roman"/>
+          <w:sz w:val="24"/>
+          <w:szCs w:val="24"/>
+        </w:rPr>
+        <w:t xml:space="preserve"> : </w:t>
+      </w:r>
+      <w:r>
+        <w:rPr>
+          <w:rStyle w:val="CodeHTML"/>
+          <w:rFonts w:ascii="Times New Roman" w:hAnsi="Times New Roman" w:cs="Times New Roman"/>
+          <w:sz w:val="24"/>
+          <w:szCs w:val="24"/>
+        </w:rPr>
+        <w:t>Tu es un système de classification de sentiment client.</w:t>
+      </w:r>
+    </w:p>
+    <w:p>
+      <w:pPr>
+        <w:pStyle w:val="PrformatHTML"/>
+        <w:ind w:left="708"/>
+        <w:rPr>
+          <w:rStyle w:val="CodeHTML"/>
+          <w:rFonts w:ascii="Times New Roman" w:hAnsi="Times New Roman" w:cs="Times New Roman"/>
+          <w:sz w:val="24"/>
+          <w:szCs w:val="24"/>
+        </w:rPr>
+      </w:pPr>
+    </w:p>
+    <w:p>
+      <w:pPr>
+        <w:pStyle w:val="PrformatHTML"/>
+        <w:ind w:left="708"/>
+        <w:rPr>
+          <w:rStyle w:val="CodeHTML"/>
+          <w:rFonts w:ascii="Times New Roman" w:hAnsi="Times New Roman" w:cs="Times New Roman"/>
+          <w:sz w:val="24"/>
+          <w:szCs w:val="24"/>
+        </w:rPr>
+      </w:pPr>
+      <w:r>
+        <w:rPr>
+          <w:rStyle w:val="CodeHTML"/>
+          <w:rFonts w:ascii="Times New Roman" w:hAnsi="Times New Roman" w:cs="Times New Roman"/>
+          <w:b/>
+          <w:bCs/>
+          <w:sz w:val="24"/>
+          <w:szCs w:val="24"/>
+        </w:rPr>
+        <w:t>Tâche</w:t>
+      </w:r>
+      <w:r>
+        <w:rPr>
+          <w:rStyle w:val="CodeHTML"/>
+          <w:rFonts w:ascii="Times New Roman" w:hAnsi="Times New Roman" w:cs="Times New Roman"/>
+          <w:sz w:val="24"/>
+          <w:szCs w:val="24"/>
+        </w:rPr>
+        <w:t xml:space="preserve"> : Classer le commentaire ci-dessous dans une des classes suivantes :</w:t>
+      </w:r>
+    </w:p>
+    <w:p>
+      <w:pPr>
+        <w:pStyle w:val="PrformatHTML"/>
+        <w:ind w:left="708"/>
+        <w:rPr>
+          <w:rStyle w:val="CodeHTML"/>
+          <w:rFonts w:ascii="Times New Roman" w:hAnsi="Times New Roman" w:cs="Times New Roman"/>
+          <w:sz w:val="24"/>
+          <w:szCs w:val="24"/>
+        </w:rPr>
+      </w:pPr>
+      <w:r>
+        <w:rPr>
+          <w:rStyle w:val="CodeHTML"/>
+          <w:rFonts w:ascii="Times New Roman" w:hAnsi="Times New Roman" w:cs="Times New Roman"/>
+          <w:sz w:val="24"/>
+          <w:szCs w:val="24"/>
+        </w:rPr>
+        <w:t>Positif</w:t>
+      </w:r>
+      <w:r>
+        <w:rPr>
+          <w:rStyle w:val="CodeHTML"/>
+          <w:rFonts w:ascii="Times New Roman" w:hAnsi="Times New Roman" w:cs="Times New Roman"/>
+          <w:sz w:val="24"/>
+          <w:szCs w:val="24"/>
+        </w:rPr>
+        <w:t>, négatif, neutre.</w:t>
+      </w:r>
+    </w:p>
+    <w:p>
+      <w:pPr>
+        <w:pStyle w:val="PrformatHTML"/>
+        <w:ind w:left="708"/>
+        <w:rPr>
+          <w:rStyle w:val="CodeHTML"/>
+          <w:rFonts w:ascii="Times New Roman" w:hAnsi="Times New Roman" w:cs="Times New Roman"/>
+          <w:sz w:val="24"/>
+          <w:szCs w:val="24"/>
+        </w:rPr>
+      </w:pPr>
+    </w:p>
+    <w:p>
+      <w:pPr>
+        <w:pStyle w:val="PrformatHTML"/>
+        <w:ind w:left="708"/>
+        <w:rPr>
+          <w:rStyle w:val="CodeHTML"/>
+          <w:rFonts w:ascii="Times New Roman" w:hAnsi="Times New Roman" w:cs="Times New Roman"/>
+          <w:sz w:val="24"/>
+          <w:szCs w:val="24"/>
+        </w:rPr>
+      </w:pPr>
+      <w:r>
+        <w:rPr>
+          <w:rStyle w:val="CodeHTML"/>
+          <w:rFonts w:ascii="Times New Roman" w:hAnsi="Times New Roman" w:cs="Times New Roman"/>
+          <w:sz w:val="24"/>
+          <w:szCs w:val="24"/>
+        </w:rPr>
+        <w:t>1. Identifie les éléments positifs mentionnés.</w:t>
+      </w:r>
+    </w:p>
+    <w:p>
+      <w:pPr>
+        <w:pStyle w:val="PrformatHTML"/>
+        <w:ind w:left="708"/>
+        <w:rPr>
+          <w:rStyle w:val="CodeHTML"/>
+          <w:rFonts w:ascii="Times New Roman" w:hAnsi="Times New Roman" w:cs="Times New Roman"/>
+          <w:sz w:val="24"/>
+          <w:szCs w:val="24"/>
+        </w:rPr>
+      </w:pPr>
+      <w:r>
+        <w:rPr>
+          <w:rStyle w:val="CodeHTML"/>
+          <w:rFonts w:ascii="Times New Roman" w:hAnsi="Times New Roman" w:cs="Times New Roman"/>
+          <w:sz w:val="24"/>
+          <w:szCs w:val="24"/>
+        </w:rPr>
+        <w:t>2. Identifie les éléments négatifs mentionnés.</w:t>
+      </w:r>
+    </w:p>
+    <w:p>
+      <w:pPr>
+        <w:pStyle w:val="PrformatHTML"/>
+        <w:ind w:left="708"/>
+        <w:rPr>
+          <w:rStyle w:val="CodeHTML"/>
+          <w:rFonts w:ascii="Times New Roman" w:hAnsi="Times New Roman" w:cs="Times New Roman"/>
+          <w:sz w:val="24"/>
+          <w:szCs w:val="24"/>
+        </w:rPr>
+      </w:pPr>
+      <w:r>
+        <w:rPr>
+          <w:rStyle w:val="CodeHTML"/>
+          <w:rFonts w:ascii="Times New Roman" w:hAnsi="Times New Roman" w:cs="Times New Roman"/>
+          <w:sz w:val="24"/>
+          <w:szCs w:val="24"/>
+        </w:rPr>
+        <w:t>3. Détermine si le commentaire est globalement positif, négatif ou neutre</w:t>
+      </w:r>
+    </w:p>
+    <w:p>
+      <w:pPr>
+        <w:pStyle w:val="PrformatHTML"/>
+        <w:ind w:left="708"/>
+        <w:rPr>
+          <w:rStyle w:val="CodeHTML"/>
+          <w:rFonts w:ascii="Times New Roman" w:hAnsi="Times New Roman" w:cs="Times New Roman"/>
+          <w:sz w:val="24"/>
+          <w:szCs w:val="24"/>
+        </w:rPr>
+      </w:pPr>
+      <w:r>
+        <w:rPr>
+          <w:rStyle w:val="CodeHTML"/>
+          <w:rFonts w:ascii="Times New Roman" w:hAnsi="Times New Roman" w:cs="Times New Roman"/>
+          <w:sz w:val="24"/>
+          <w:szCs w:val="24"/>
+        </w:rPr>
+        <w:t xml:space="preserve">   (</w:t>
+      </w:r>
+      <w:proofErr w:type="gramStart"/>
+      <w:r>
+        <w:rPr>
+          <w:rStyle w:val="CodeHTML"/>
+          <w:rFonts w:ascii="Times New Roman" w:hAnsi="Times New Roman" w:cs="Times New Roman"/>
+          <w:sz w:val="24"/>
+          <w:szCs w:val="24"/>
+        </w:rPr>
+        <w:t>un</w:t>
+      </w:r>
+      <w:proofErr w:type="gramEnd"/>
+      <w:r>
+        <w:rPr>
+          <w:rStyle w:val="CodeHTML"/>
+          <w:rFonts w:ascii="Times New Roman" w:hAnsi="Times New Roman" w:cs="Times New Roman"/>
+          <w:sz w:val="24"/>
+          <w:szCs w:val="24"/>
+        </w:rPr>
+        <w:t xml:space="preserve"> commentaire mixte penche généralement vers négatif si le problème</w:t>
+      </w:r>
+    </w:p>
+    <w:p>
+      <w:pPr>
+        <w:pStyle w:val="PrformatHTML"/>
+        <w:ind w:left="708"/>
+        <w:rPr>
+          <w:rStyle w:val="CodeHTML"/>
+          <w:rFonts w:ascii="Times New Roman" w:hAnsi="Times New Roman" w:cs="Times New Roman"/>
+          <w:sz w:val="24"/>
+          <w:szCs w:val="24"/>
+        </w:rPr>
+      </w:pPr>
+      <w:r>
+        <w:rPr>
+          <w:rStyle w:val="CodeHTML"/>
+          <w:rFonts w:ascii="Times New Roman" w:hAnsi="Times New Roman" w:cs="Times New Roman"/>
+          <w:sz w:val="24"/>
+          <w:szCs w:val="24"/>
+        </w:rPr>
+        <w:t xml:space="preserve">   </w:t>
+      </w:r>
+      <w:proofErr w:type="gramStart"/>
+      <w:r>
+        <w:rPr>
+          <w:rStyle w:val="CodeHTML"/>
+          <w:rFonts w:ascii="Times New Roman" w:hAnsi="Times New Roman" w:cs="Times New Roman"/>
+          <w:sz w:val="24"/>
+          <w:szCs w:val="24"/>
+        </w:rPr>
+        <w:t>mentionné</w:t>
+      </w:r>
+      <w:proofErr w:type="gramEnd"/>
+      <w:r>
+        <w:rPr>
+          <w:rStyle w:val="CodeHTML"/>
+          <w:rFonts w:ascii="Times New Roman" w:hAnsi="Times New Roman" w:cs="Times New Roman"/>
+          <w:sz w:val="24"/>
+          <w:szCs w:val="24"/>
+        </w:rPr>
+        <w:t xml:space="preserve"> affecte l'usage du produit).</w:t>
+      </w:r>
+    </w:p>
+    <w:p>
+      <w:pPr>
+        <w:pStyle w:val="PrformatHTML"/>
+        <w:ind w:left="708"/>
+        <w:rPr>
+          <w:rStyle w:val="CodeHTML"/>
+          <w:rFonts w:ascii="Times New Roman" w:hAnsi="Times New Roman" w:cs="Times New Roman"/>
+          <w:sz w:val="24"/>
+          <w:szCs w:val="24"/>
+        </w:rPr>
+      </w:pPr>
+    </w:p>
+    <w:p>
+      <w:pPr>
+        <w:pStyle w:val="PrformatHTML"/>
+        <w:ind w:left="708"/>
+        <w:rPr>
+          <w:rStyle w:val="CodeHTML"/>
+          <w:rFonts w:ascii="Times New Roman" w:hAnsi="Times New Roman" w:cs="Times New Roman"/>
+          <w:sz w:val="24"/>
+          <w:szCs w:val="24"/>
+        </w:rPr>
+      </w:pPr>
+      <w:r>
+        <w:rPr>
+          <w:rStyle w:val="CodeHTML"/>
+          <w:rFonts w:ascii="Times New Roman" w:hAnsi="Times New Roman" w:cs="Times New Roman"/>
+          <w:b/>
+          <w:bCs/>
+          <w:sz w:val="24"/>
+          <w:szCs w:val="24"/>
+        </w:rPr>
+        <w:t>Données d'entrée</w:t>
+      </w:r>
+      <w:r>
+        <w:rPr>
+          <w:rStyle w:val="CodeHTML"/>
+          <w:rFonts w:ascii="Times New Roman" w:hAnsi="Times New Roman" w:cs="Times New Roman"/>
+          <w:sz w:val="24"/>
+          <w:szCs w:val="24"/>
+        </w:rPr>
+        <w:t> :</w:t>
+      </w:r>
+      <w:r>
+        <w:rPr>
+          <w:rStyle w:val="CodeHTML"/>
+          <w:rFonts w:ascii="Times New Roman" w:hAnsi="Times New Roman" w:cs="Times New Roman"/>
+          <w:sz w:val="24"/>
+          <w:szCs w:val="24"/>
+        </w:rPr>
+        <w:t xml:space="preserve"> </w:t>
+      </w:r>
+      <w:r>
+        <w:rPr>
+          <w:rStyle w:val="CodeHTML"/>
+          <w:rFonts w:ascii="Times New Roman" w:hAnsi="Times New Roman" w:cs="Times New Roman"/>
+          <w:sz w:val="24"/>
+          <w:szCs w:val="24"/>
+        </w:rPr>
+        <w:t>Commentaire : "Le service est rapide mais l'application plante régulièrement."</w:t>
+      </w:r>
+    </w:p>
+    <w:p>
+      <w:pPr>
+        <w:pStyle w:val="PrformatHTML"/>
+        <w:ind w:left="708"/>
+        <w:rPr>
+          <w:rStyle w:val="CodeHTML"/>
+          <w:rFonts w:ascii="Times New Roman" w:hAnsi="Times New Roman" w:cs="Times New Roman"/>
+          <w:sz w:val="24"/>
+          <w:szCs w:val="24"/>
+        </w:rPr>
+      </w:pPr>
+    </w:p>
+    <w:p>
+      <w:pPr>
+        <w:pStyle w:val="PrformatHTML"/>
+        <w:ind w:left="708"/>
+        <w:rPr>
+          <w:rStyle w:val="CodeHTML"/>
+          <w:rFonts w:ascii="Times New Roman" w:hAnsi="Times New Roman" w:cs="Times New Roman"/>
+          <w:b/>
+          <w:bCs/>
+          <w:sz w:val="24"/>
+          <w:szCs w:val="24"/>
+        </w:rPr>
+      </w:pPr>
+      <w:r>
+        <w:rPr>
+          <w:rStyle w:val="CodeHTML"/>
+          <w:rFonts w:ascii="Times New Roman" w:hAnsi="Times New Roman" w:cs="Times New Roman"/>
+          <w:b/>
+          <w:bCs/>
+          <w:sz w:val="24"/>
+          <w:szCs w:val="24"/>
+        </w:rPr>
+        <w:t>Format de sortie :</w:t>
+      </w:r>
+    </w:p>
+    <w:p>
+      <w:pPr>
+        <w:pStyle w:val="PrformatHTML"/>
+        <w:ind w:left="708"/>
+        <w:rPr>
+          <w:rStyle w:val="CodeHTML"/>
+          <w:rFonts w:ascii="Times New Roman" w:hAnsi="Times New Roman" w:cs="Times New Roman"/>
+          <w:sz w:val="24"/>
+          <w:szCs w:val="24"/>
+        </w:rPr>
+      </w:pPr>
+      <w:r>
+        <w:rPr>
+          <w:rStyle w:val="CodeHTML"/>
+          <w:rFonts w:ascii="Times New Roman" w:hAnsi="Times New Roman" w:cs="Times New Roman"/>
+          <w:sz w:val="24"/>
+          <w:szCs w:val="24"/>
+        </w:rPr>
+        <w:t>{</w:t>
+      </w:r>
+    </w:p>
+    <w:p>
+      <w:pPr>
+        <w:pStyle w:val="PrformatHTML"/>
+        <w:ind w:left="708"/>
+        <w:rPr>
+          <w:rStyle w:val="CodeHTML"/>
+          <w:rFonts w:ascii="Times New Roman" w:hAnsi="Times New Roman" w:cs="Times New Roman"/>
+          <w:sz w:val="24"/>
+          <w:szCs w:val="24"/>
+        </w:rPr>
+      </w:pPr>
+      <w:r>
+        <w:rPr>
+          <w:rStyle w:val="CodeHTML"/>
+          <w:rFonts w:ascii="Times New Roman" w:hAnsi="Times New Roman" w:cs="Times New Roman"/>
+          <w:sz w:val="24"/>
+          <w:szCs w:val="24"/>
+        </w:rPr>
+        <w:t xml:space="preserve">  "</w:t>
+      </w:r>
+      <w:proofErr w:type="spellStart"/>
+      <w:r>
+        <w:rPr>
+          <w:rStyle w:val="CodeHTML"/>
+          <w:rFonts w:ascii="Times New Roman" w:hAnsi="Times New Roman" w:cs="Times New Roman"/>
+          <w:sz w:val="24"/>
+          <w:szCs w:val="24"/>
+        </w:rPr>
+        <w:t>elements_positifs</w:t>
+      </w:r>
+      <w:proofErr w:type="spellEnd"/>
+      <w:proofErr w:type="gramStart"/>
+      <w:r>
+        <w:rPr>
+          <w:rStyle w:val="CodeHTML"/>
+          <w:rFonts w:ascii="Times New Roman" w:hAnsi="Times New Roman" w:cs="Times New Roman"/>
+          <w:sz w:val="24"/>
+          <w:szCs w:val="24"/>
+        </w:rPr>
+        <w:t>":</w:t>
+      </w:r>
+      <w:proofErr w:type="gramEnd"/>
+      <w:r>
+        <w:rPr>
+          <w:rStyle w:val="CodeHTML"/>
+          <w:rFonts w:ascii="Times New Roman" w:hAnsi="Times New Roman" w:cs="Times New Roman"/>
+          <w:sz w:val="24"/>
+          <w:szCs w:val="24"/>
+        </w:rPr>
+        <w:t xml:space="preserve"> [...],</w:t>
+      </w:r>
+    </w:p>
+    <w:p>
+      <w:pPr>
+        <w:pStyle w:val="PrformatHTML"/>
+        <w:ind w:left="708"/>
+        <w:rPr>
+          <w:rStyle w:val="CodeHTML"/>
+          <w:rFonts w:ascii="Times New Roman" w:hAnsi="Times New Roman" w:cs="Times New Roman"/>
+          <w:sz w:val="24"/>
+          <w:szCs w:val="24"/>
+        </w:rPr>
+      </w:pPr>
+      <w:r>
+        <w:rPr>
+          <w:rStyle w:val="CodeHTML"/>
+          <w:rFonts w:ascii="Times New Roman" w:hAnsi="Times New Roman" w:cs="Times New Roman"/>
+          <w:sz w:val="24"/>
+          <w:szCs w:val="24"/>
+        </w:rPr>
+        <w:t xml:space="preserve">  "</w:t>
+      </w:r>
+      <w:proofErr w:type="spellStart"/>
+      <w:r>
+        <w:rPr>
+          <w:rStyle w:val="CodeHTML"/>
+          <w:rFonts w:ascii="Times New Roman" w:hAnsi="Times New Roman" w:cs="Times New Roman"/>
+          <w:sz w:val="24"/>
+          <w:szCs w:val="24"/>
+        </w:rPr>
+        <w:t>elements_negatifs</w:t>
+      </w:r>
+      <w:proofErr w:type="spellEnd"/>
+      <w:proofErr w:type="gramStart"/>
+      <w:r>
+        <w:rPr>
+          <w:rStyle w:val="CodeHTML"/>
+          <w:rFonts w:ascii="Times New Roman" w:hAnsi="Times New Roman" w:cs="Times New Roman"/>
+          <w:sz w:val="24"/>
+          <w:szCs w:val="24"/>
+        </w:rPr>
+        <w:t>":</w:t>
+      </w:r>
+      <w:proofErr w:type="gramEnd"/>
+      <w:r>
+        <w:rPr>
+          <w:rStyle w:val="CodeHTML"/>
+          <w:rFonts w:ascii="Times New Roman" w:hAnsi="Times New Roman" w:cs="Times New Roman"/>
+          <w:sz w:val="24"/>
+          <w:szCs w:val="24"/>
+        </w:rPr>
+        <w:t xml:space="preserve"> [...],</w:t>
+      </w:r>
+    </w:p>
+    <w:p>
+      <w:pPr>
+        <w:pStyle w:val="PrformatHTML"/>
+        <w:ind w:left="708"/>
+        <w:rPr>
+          <w:rStyle w:val="CodeHTML"/>
+          <w:rFonts w:ascii="Times New Roman" w:hAnsi="Times New Roman" w:cs="Times New Roman"/>
+          <w:sz w:val="24"/>
+          <w:szCs w:val="24"/>
+        </w:rPr>
+      </w:pPr>
+      <w:r>
+        <w:rPr>
+          <w:rStyle w:val="CodeHTML"/>
+          <w:rFonts w:ascii="Times New Roman" w:hAnsi="Times New Roman" w:cs="Times New Roman"/>
+          <w:sz w:val="24"/>
+          <w:szCs w:val="24"/>
+        </w:rPr>
+        <w:t xml:space="preserve">  "classe</w:t>
+      </w:r>
+      <w:proofErr w:type="gramStart"/>
+      <w:r>
+        <w:rPr>
+          <w:rStyle w:val="CodeHTML"/>
+          <w:rFonts w:ascii="Times New Roman" w:hAnsi="Times New Roman" w:cs="Times New Roman"/>
+          <w:sz w:val="24"/>
+          <w:szCs w:val="24"/>
+        </w:rPr>
+        <w:t>":</w:t>
+      </w:r>
+      <w:proofErr w:type="gramEnd"/>
+      <w:r>
+        <w:rPr>
+          <w:rStyle w:val="CodeHTML"/>
+          <w:rFonts w:ascii="Times New Roman" w:hAnsi="Times New Roman" w:cs="Times New Roman"/>
+          <w:sz w:val="24"/>
+          <w:szCs w:val="24"/>
+        </w:rPr>
+        <w:t xml:space="preserve"> "positif | négatif | neutre",</w:t>
+      </w:r>
+    </w:p>
+    <w:p>
+      <w:pPr>
+        <w:pStyle w:val="PrformatHTML"/>
+        <w:ind w:left="708"/>
+        <w:rPr>
+          <w:rStyle w:val="CodeHTML"/>
+          <w:rFonts w:ascii="Times New Roman" w:hAnsi="Times New Roman" w:cs="Times New Roman"/>
+          <w:sz w:val="24"/>
+          <w:szCs w:val="24"/>
+        </w:rPr>
+      </w:pPr>
+      <w:r>
+        <w:rPr>
+          <w:rStyle w:val="CodeHTML"/>
+          <w:rFonts w:ascii="Times New Roman" w:hAnsi="Times New Roman" w:cs="Times New Roman"/>
+          <w:sz w:val="24"/>
+          <w:szCs w:val="24"/>
+        </w:rPr>
+        <w:t xml:space="preserve">  "justification</w:t>
+      </w:r>
+      <w:proofErr w:type="gramStart"/>
+      <w:r>
+        <w:rPr>
+          <w:rStyle w:val="CodeHTML"/>
+          <w:rFonts w:ascii="Times New Roman" w:hAnsi="Times New Roman" w:cs="Times New Roman"/>
+          <w:sz w:val="24"/>
+          <w:szCs w:val="24"/>
+        </w:rPr>
+        <w:t>":</w:t>
+      </w:r>
+      <w:proofErr w:type="gramEnd"/>
+      <w:r>
+        <w:rPr>
+          <w:rStyle w:val="CodeHTML"/>
+          <w:rFonts w:ascii="Times New Roman" w:hAnsi="Times New Roman" w:cs="Times New Roman"/>
+          <w:sz w:val="24"/>
+          <w:szCs w:val="24"/>
+        </w:rPr>
+        <w:t xml:space="preserve"> "..."</w:t>
+      </w:r>
+    </w:p>
+    <w:p>
+      <w:pPr>
+        <w:pStyle w:val="PrformatHTML"/>
+        <w:ind w:left="708"/>
+        <w:rPr>
+          <w:rFonts w:ascii="Times New Roman" w:hAnsi="Times New Roman" w:cs="Times New Roman"/>
+          <w:sz w:val="24"/>
+          <w:szCs w:val="24"/>
+        </w:rPr>
+      </w:pPr>
+      <w:r>
+        <w:rPr>
+          <w:rStyle w:val="CodeHTML"/>
+          <w:rFonts w:ascii="Times New Roman" w:hAnsi="Times New Roman" w:cs="Times New Roman"/>
+          <w:sz w:val="24"/>
+          <w:szCs w:val="24"/>
+        </w:rPr>
+        <w:t>}</w:t>
+      </w:r>
+    </w:p>
+    <w:p>
+      <w:pPr>
+        <w:ind w:left="360"/>
+        <w:rPr>
+          <w:rFonts w:ascii="Times New Roman" w:eastAsia="Times New Roman" w:hAnsi="Times New Roman" w:cs="Times New Roman"/>
+          <w:b/>
+          <w:sz w:val="28"/>
+          <w:szCs w:val="28"/>
+          <w:lang w:eastAsia="fr-FR"/>
+        </w:rPr>
+      </w:pPr>
+      <w:proofErr w:type="spellStart"/>
+      <w:r>
+        <w:rPr>
+          <w:rFonts w:ascii="Times New Roman" w:eastAsia="Times New Roman" w:hAnsi="Times New Roman" w:cs="Times New Roman"/>
+          <w:b/>
+          <w:sz w:val="28"/>
+          <w:szCs w:val="28"/>
+          <w:lang w:eastAsia="fr-FR"/>
+        </w:rPr>
+        <w:t>Resultat</w:t>
+      </w:r>
+      <w:proofErr w:type="spellEnd"/>
+      <w:r>
+        <w:rPr>
+          <w:rFonts w:ascii="Times New Roman" w:eastAsia="Times New Roman" w:hAnsi="Times New Roman" w:cs="Times New Roman"/>
+          <w:b/>
+          <w:sz w:val="28"/>
+          <w:szCs w:val="28"/>
+          <w:lang w:eastAsia="fr-FR"/>
+        </w:rPr>
+        <w:t> :</w:t>
+      </w:r>
+    </w:p>
+    <w:p>
+      <w:pPr>
+        <w:ind w:left="360"/>
+        <w:rPr>
+          <w:rFonts w:ascii="Times New Roman" w:eastAsia="Times New Roman" w:hAnsi="Times New Roman" w:cs="Times New Roman"/>
+          <w:b/>
+          <w:sz w:val="28"/>
+          <w:szCs w:val="28"/>
+          <w:lang w:eastAsia="fr-FR"/>
+        </w:rPr>
+      </w:pPr>
+      <w:r>
+        <w:rPr>
+          <w:rFonts w:ascii="Times New Roman" w:eastAsia="Times New Roman" w:hAnsi="Times New Roman" w:cs="Times New Roman"/>
+          <w:b/>
+          <w:sz w:val="28"/>
+          <w:szCs w:val="28"/>
+          <w:lang w:eastAsia="fr-FR"/>
+        </w:rPr>
+        <w:drawing>
+          <wp:inline distT="0" distB="0" distL="0" distR="0" wp14:anchorId="27FBF6CF" wp14:editId="54D9B7EE">
+            <wp:extent cx="5759450" cy="1259840"/>
+            <wp:effectExtent l="0" t="0" r="0" b="0"/>
+            <wp:docPr id="8" name="Image 8"/>
+            <wp:cNvGraphicFramePr>
+              <a:graphicFrameLocks xmlns:a="http://schemas.openxmlformats.org/drawingml/2006/main" noChangeAspect="1"/>
+            </wp:cNvGraphicFramePr>
+            <a:graphic xmlns:a="http://schemas.openxmlformats.org/drawingml/2006/main">
+              <a:graphicData uri="http://schemas.openxmlformats.org/drawingml/2006/picture">
+                <pic:pic xmlns:pic="http://schemas.openxmlformats.org/drawingml/2006/picture">
+                  <pic:nvPicPr>
+                    <pic:cNvPr id="1" name=""/>
+                    <pic:cNvPicPr/>
+                  </pic:nvPicPr>
+                  <pic:blipFill>
+                    <a:blip r:embed="rId12"/>
+                    <a:stretch>
+                      <a:fillRect/>
+                    </a:stretch>
+                  </pic:blipFill>
+                  <pic:spPr>
+                    <a:xfrm>
+                      <a:off x="0" y="0"/>
+                      <a:ext cx="5759450" cy="1259840"/>
+                    </a:xfrm>
+                    <a:prstGeom prst="rect">
+                      <a:avLst/>
+                    </a:prstGeom>
+                  </pic:spPr>
+                </pic:pic>
+              </a:graphicData>
+            </a:graphic>
+          </wp:inline>
+        </w:drawing>
+      </w:r>
     </w:p>
     <w:sectPr>
       <w:pgSz w:w="11906" w:h="16838"/>

</xml_diff>

<commit_message>
Partie 3 Decomposition du prompt
</commit_message>
<xml_diff>
--- a/ai-business_assistant.docx
+++ b/ai-business_assistant.docx
@@ -2552,6 +2552,539 @@
         </w:drawing>
       </w:r>
     </w:p>
+    <w:p>
+      <w:pPr>
+        <w:rPr>
+          <w:rFonts w:ascii="Times New Roman" w:hAnsi="Times New Roman" w:cs="Times New Roman"/>
+          <w:sz w:val="36"/>
+          <w:szCs w:val="36"/>
+        </w:rPr>
+      </w:pPr>
+      <w:r>
+        <w:rPr>
+          <w:rFonts w:ascii="Times New Roman" w:hAnsi="Times New Roman" w:cs="Times New Roman"/>
+          <w:sz w:val="36"/>
+          <w:szCs w:val="36"/>
+        </w:rPr>
+        <w:t>Partie 3</w:t>
+      </w:r>
+      <w:r>
+        <w:rPr>
+          <w:rFonts w:ascii="Times New Roman" w:hAnsi="Times New Roman" w:cs="Times New Roman"/>
+          <w:sz w:val="36"/>
+          <w:szCs w:val="36"/>
+        </w:rPr>
+        <w:t> :</w:t>
+      </w:r>
+      <w:r>
+        <w:rPr>
+          <w:rFonts w:ascii="Times New Roman" w:hAnsi="Times New Roman" w:cs="Times New Roman"/>
+          <w:sz w:val="36"/>
+          <w:szCs w:val="36"/>
+        </w:rPr>
+        <w:t xml:space="preserve"> Prompt Engineering et raisonnement</w:t>
+      </w:r>
+    </w:p>
+    <w:p>
+      <w:pPr>
+        <w:pStyle w:val="Paragraphedeliste"/>
+        <w:numPr>
+          <w:ilvl w:val="0"/>
+          <w:numId w:val="6"/>
+        </w:numPr>
+        <w:ind w:left="426"/>
+        <w:rPr>
+          <w:rFonts w:ascii="Times New Roman" w:hAnsi="Times New Roman" w:cs="Times New Roman"/>
+          <w:b/>
+          <w:bCs/>
+          <w:sz w:val="28"/>
+          <w:szCs w:val="28"/>
+        </w:rPr>
+      </w:pPr>
+      <w:r>
+        <w:rPr>
+          <w:rFonts w:ascii="Times New Roman" w:hAnsi="Times New Roman" w:cs="Times New Roman"/>
+          <w:b/>
+          <w:bCs/>
+          <w:sz w:val="28"/>
+          <w:szCs w:val="28"/>
+        </w:rPr>
+        <w:t>Décomposition du prompt</w:t>
+      </w:r>
+    </w:p>
+    <w:p>
+      <w:pPr>
+        <w:pStyle w:val="NormalWeb"/>
+        <w:rPr>
+          <w:b/>
+          <w:bCs/>
+        </w:rPr>
+      </w:pPr>
+      <w:r>
+        <w:rPr>
+          <w:b/>
+          <w:bCs/>
+        </w:rPr>
+        <w:t>Prompt initial</w:t>
+      </w:r>
+    </w:p>
+    <w:p>
+      <w:pPr>
+        <w:pStyle w:val="NormalWeb"/>
+        <w:ind w:left="426"/>
+      </w:pPr>
+      <w:r>
+        <w:t>« Analyse ces avis clients et donne-moi les problèmes les plus importants ainsi que les recommandations. »</w:t>
+      </w:r>
+    </w:p>
+    <w:p>
+      <w:pPr>
+        <w:pStyle w:val="NormalWeb"/>
+      </w:pPr>
+      <w:r>
+        <w:lastRenderedPageBreak/>
+        <w:drawing>
+          <wp:inline distT="0" distB="0" distL="0" distR="0" wp14:anchorId="6E8E32D7" wp14:editId="1D390B78">
+            <wp:extent cx="5759450" cy="2895600"/>
+            <wp:effectExtent l="0" t="0" r="0" b="0"/>
+            <wp:docPr id="9" name="Image 9"/>
+            <wp:cNvGraphicFramePr>
+              <a:graphicFrameLocks xmlns:a="http://schemas.openxmlformats.org/drawingml/2006/main" noChangeAspect="1"/>
+            </wp:cNvGraphicFramePr>
+            <a:graphic xmlns:a="http://schemas.openxmlformats.org/drawingml/2006/main">
+              <a:graphicData uri="http://schemas.openxmlformats.org/drawingml/2006/picture">
+                <pic:pic xmlns:pic="http://schemas.openxmlformats.org/drawingml/2006/picture">
+                  <pic:nvPicPr>
+                    <pic:cNvPr id="1" name=""/>
+                    <pic:cNvPicPr/>
+                  </pic:nvPicPr>
+                  <pic:blipFill>
+                    <a:blip r:embed="rId13"/>
+                    <a:stretch>
+                      <a:fillRect/>
+                    </a:stretch>
+                  </pic:blipFill>
+                  <pic:spPr>
+                    <a:xfrm>
+                      <a:off x="0" y="0"/>
+                      <a:ext cx="5759450" cy="2895600"/>
+                    </a:xfrm>
+                    <a:prstGeom prst="rect">
+                      <a:avLst/>
+                    </a:prstGeom>
+                  </pic:spPr>
+                </pic:pic>
+              </a:graphicData>
+            </a:graphic>
+          </wp:inline>
+        </w:drawing>
+      </w:r>
+    </w:p>
+    <w:p>
+      <w:pPr>
+        <w:rPr>
+          <w:rStyle w:val="CodeHTML"/>
+          <w:rFonts w:ascii="Times New Roman" w:eastAsiaTheme="minorHAnsi" w:hAnsi="Times New Roman" w:cs="Times New Roman"/>
+          <w:b/>
+          <w:bCs/>
+          <w:sz w:val="24"/>
+          <w:szCs w:val="24"/>
+        </w:rPr>
+      </w:pPr>
+      <w:r>
+        <w:rPr>
+          <w:rFonts w:ascii="Times New Roman" w:hAnsi="Times New Roman" w:cs="Times New Roman"/>
+          <w:b/>
+          <w:bCs/>
+          <w:sz w:val="24"/>
+          <w:szCs w:val="24"/>
+        </w:rPr>
+        <w:t>Décomposition en sous-tâches</w:t>
+      </w:r>
+      <w:r>
+        <w:rPr>
+          <w:rFonts w:ascii="Times New Roman" w:hAnsi="Times New Roman" w:cs="Times New Roman"/>
+          <w:b/>
+          <w:bCs/>
+          <w:sz w:val="24"/>
+          <w:szCs w:val="24"/>
+        </w:rPr>
+        <w:tab/>
+      </w:r>
+    </w:p>
+    <w:p>
+      <w:pPr>
+        <w:pStyle w:val="PrformatHTML"/>
+        <w:spacing w:line="276" w:lineRule="auto"/>
+        <w:rPr>
+          <w:rStyle w:val="CodeHTML"/>
+          <w:rFonts w:ascii="Times New Roman" w:hAnsi="Times New Roman" w:cs="Times New Roman"/>
+          <w:sz w:val="24"/>
+          <w:szCs w:val="24"/>
+        </w:rPr>
+      </w:pPr>
+      <w:r>
+        <w:rPr>
+          <w:rStyle w:val="CodeHTML"/>
+          <w:rFonts w:ascii="Times New Roman" w:hAnsi="Times New Roman" w:cs="Times New Roman"/>
+          <w:sz w:val="24"/>
+          <w:szCs w:val="24"/>
+        </w:rPr>
+        <w:t xml:space="preserve">Rôle : </w:t>
+      </w:r>
+      <w:r>
+        <w:rPr>
+          <w:rStyle w:val="CodeHTML"/>
+          <w:rFonts w:ascii="Times New Roman" w:hAnsi="Times New Roman" w:cs="Times New Roman"/>
+          <w:sz w:val="24"/>
+          <w:szCs w:val="24"/>
+        </w:rPr>
+        <w:t xml:space="preserve">Tu es un analyste </w:t>
+      </w:r>
+      <w:proofErr w:type="spellStart"/>
+      <w:r>
+        <w:rPr>
+          <w:rStyle w:val="CodeHTML"/>
+          <w:rFonts w:ascii="Times New Roman" w:hAnsi="Times New Roman" w:cs="Times New Roman"/>
+          <w:sz w:val="24"/>
+          <w:szCs w:val="24"/>
+        </w:rPr>
+        <w:t>customer</w:t>
+      </w:r>
+      <w:proofErr w:type="spellEnd"/>
+      <w:r>
+        <w:rPr>
+          <w:rStyle w:val="CodeHTML"/>
+          <w:rFonts w:ascii="Times New Roman" w:hAnsi="Times New Roman" w:cs="Times New Roman"/>
+          <w:sz w:val="24"/>
+          <w:szCs w:val="24"/>
+        </w:rPr>
+        <w:t xml:space="preserve"> </w:t>
+      </w:r>
+      <w:proofErr w:type="spellStart"/>
+      <w:r>
+        <w:rPr>
+          <w:rStyle w:val="CodeHTML"/>
+          <w:rFonts w:ascii="Times New Roman" w:hAnsi="Times New Roman" w:cs="Times New Roman"/>
+          <w:sz w:val="24"/>
+          <w:szCs w:val="24"/>
+        </w:rPr>
+        <w:t>experience</w:t>
+      </w:r>
+      <w:proofErr w:type="spellEnd"/>
+      <w:r>
+        <w:rPr>
+          <w:rStyle w:val="CodeHTML"/>
+          <w:rFonts w:ascii="Times New Roman" w:hAnsi="Times New Roman" w:cs="Times New Roman"/>
+          <w:sz w:val="24"/>
+          <w:szCs w:val="24"/>
+        </w:rPr>
+        <w:t>.</w:t>
+      </w:r>
+    </w:p>
+    <w:p>
+      <w:pPr>
+        <w:pStyle w:val="PrformatHTML"/>
+        <w:spacing w:line="276" w:lineRule="auto"/>
+        <w:rPr>
+          <w:rStyle w:val="CodeHTML"/>
+          <w:rFonts w:ascii="Times New Roman" w:hAnsi="Times New Roman" w:cs="Times New Roman"/>
+          <w:sz w:val="24"/>
+          <w:szCs w:val="24"/>
+        </w:rPr>
+      </w:pPr>
+    </w:p>
+    <w:p>
+      <w:pPr>
+        <w:pStyle w:val="PrformatHTML"/>
+        <w:spacing w:line="276" w:lineRule="auto"/>
+        <w:rPr>
+          <w:rStyle w:val="CodeHTML"/>
+          <w:rFonts w:ascii="Times New Roman" w:hAnsi="Times New Roman" w:cs="Times New Roman"/>
+          <w:sz w:val="24"/>
+          <w:szCs w:val="24"/>
+        </w:rPr>
+      </w:pPr>
+      <w:r>
+        <w:rPr>
+          <w:rStyle w:val="CodeHTML"/>
+          <w:rFonts w:ascii="Times New Roman" w:hAnsi="Times New Roman" w:cs="Times New Roman"/>
+          <w:sz w:val="24"/>
+          <w:szCs w:val="24"/>
+        </w:rPr>
+        <w:t>Étape 1 : Identifie, dans les avis clients fournis, les thèmes récurrents.</w:t>
+      </w:r>
+    </w:p>
+    <w:p>
+      <w:pPr>
+        <w:pStyle w:val="PrformatHTML"/>
+        <w:spacing w:line="276" w:lineRule="auto"/>
+        <w:rPr>
+          <w:rStyle w:val="CodeHTML"/>
+          <w:rFonts w:ascii="Times New Roman" w:hAnsi="Times New Roman" w:cs="Times New Roman"/>
+          <w:sz w:val="24"/>
+          <w:szCs w:val="24"/>
+        </w:rPr>
+      </w:pPr>
+      <w:r>
+        <w:rPr>
+          <w:rStyle w:val="CodeHTML"/>
+          <w:rFonts w:ascii="Times New Roman" w:hAnsi="Times New Roman" w:cs="Times New Roman"/>
+          <w:sz w:val="24"/>
+          <w:szCs w:val="24"/>
+        </w:rPr>
+        <w:t>Étape 2 : Pour chaque thème, identifie les problèmes concrets mentionnés par les clients.</w:t>
+      </w:r>
+    </w:p>
+    <w:p>
+      <w:pPr>
+        <w:pStyle w:val="PrformatHTML"/>
+        <w:spacing w:line="276" w:lineRule="auto"/>
+        <w:rPr>
+          <w:rStyle w:val="CodeHTML"/>
+          <w:rFonts w:ascii="Times New Roman" w:hAnsi="Times New Roman" w:cs="Times New Roman"/>
+          <w:sz w:val="24"/>
+          <w:szCs w:val="24"/>
+        </w:rPr>
+      </w:pPr>
+      <w:r>
+        <w:rPr>
+          <w:rStyle w:val="CodeHTML"/>
+          <w:rFonts w:ascii="Times New Roman" w:hAnsi="Times New Roman" w:cs="Times New Roman"/>
+          <w:sz w:val="24"/>
+          <w:szCs w:val="24"/>
+        </w:rPr>
+        <w:t>Étape 3 : Classe ces problèmes par ordre d'importance (fréquence + impact perçu).</w:t>
+      </w:r>
+    </w:p>
+    <w:p>
+      <w:pPr>
+        <w:pStyle w:val="PrformatHTML"/>
+        <w:spacing w:line="276" w:lineRule="auto"/>
+        <w:rPr>
+          <w:rStyle w:val="CodeHTML"/>
+          <w:rFonts w:ascii="Times New Roman" w:hAnsi="Times New Roman" w:cs="Times New Roman"/>
+          <w:sz w:val="24"/>
+          <w:szCs w:val="24"/>
+        </w:rPr>
+      </w:pPr>
+      <w:r>
+        <w:rPr>
+          <w:rStyle w:val="CodeHTML"/>
+          <w:rFonts w:ascii="Times New Roman" w:hAnsi="Times New Roman" w:cs="Times New Roman"/>
+          <w:sz w:val="24"/>
+          <w:szCs w:val="24"/>
+        </w:rPr>
+        <w:t>Étape 4 : Formule une recommandation concrète et actionnable pour chacun des 3</w:t>
+      </w:r>
+      <w:r>
+        <w:rPr>
+          <w:rStyle w:val="CodeHTML"/>
+          <w:rFonts w:ascii="Times New Roman" w:hAnsi="Times New Roman" w:cs="Times New Roman"/>
+          <w:sz w:val="24"/>
+          <w:szCs w:val="24"/>
+        </w:rPr>
+        <w:t xml:space="preserve"> </w:t>
+      </w:r>
+      <w:r>
+        <w:rPr>
+          <w:rStyle w:val="CodeHTML"/>
+          <w:rFonts w:ascii="Times New Roman" w:hAnsi="Times New Roman" w:cs="Times New Roman"/>
+          <w:sz w:val="24"/>
+          <w:szCs w:val="24"/>
+        </w:rPr>
+        <w:t>problèmes les plus importants.</w:t>
+      </w:r>
+    </w:p>
+    <w:p>
+      <w:pPr>
+        <w:pStyle w:val="PrformatHTML"/>
+        <w:spacing w:line="276" w:lineRule="auto"/>
+        <w:rPr>
+          <w:rStyle w:val="CodeHTML"/>
+          <w:rFonts w:ascii="Times New Roman" w:hAnsi="Times New Roman" w:cs="Times New Roman"/>
+          <w:sz w:val="24"/>
+          <w:szCs w:val="24"/>
+        </w:rPr>
+      </w:pPr>
+    </w:p>
+    <w:p>
+      <w:pPr>
+        <w:pStyle w:val="PrformatHTML"/>
+        <w:spacing w:line="276" w:lineRule="auto"/>
+        <w:rPr>
+          <w:rStyle w:val="CodeHTML"/>
+          <w:rFonts w:ascii="Times New Roman" w:hAnsi="Times New Roman" w:cs="Times New Roman"/>
+          <w:sz w:val="24"/>
+          <w:szCs w:val="24"/>
+        </w:rPr>
+      </w:pPr>
+      <w:r>
+        <w:rPr>
+          <w:rStyle w:val="CodeHTML"/>
+          <w:rFonts w:ascii="Times New Roman" w:hAnsi="Times New Roman" w:cs="Times New Roman"/>
+          <w:sz w:val="24"/>
+          <w:szCs w:val="24"/>
+        </w:rPr>
+        <w:t>Contraintes : ne t'appuie que sur les avis fournis, ne rien inventer.</w:t>
+      </w:r>
+    </w:p>
+    <w:p>
+      <w:pPr>
+        <w:pStyle w:val="PrformatHTML"/>
+        <w:spacing w:line="276" w:lineRule="auto"/>
+        <w:rPr>
+          <w:rStyle w:val="CodeHTML"/>
+          <w:rFonts w:ascii="Times New Roman" w:hAnsi="Times New Roman" w:cs="Times New Roman"/>
+          <w:sz w:val="24"/>
+          <w:szCs w:val="24"/>
+        </w:rPr>
+      </w:pPr>
+    </w:p>
+    <w:p>
+      <w:pPr>
+        <w:pStyle w:val="PrformatHTML"/>
+        <w:spacing w:line="276" w:lineRule="auto"/>
+        <w:rPr>
+          <w:rStyle w:val="CodeHTML"/>
+          <w:rFonts w:ascii="Times New Roman" w:hAnsi="Times New Roman" w:cs="Times New Roman"/>
+          <w:sz w:val="24"/>
+          <w:szCs w:val="24"/>
+        </w:rPr>
+      </w:pPr>
+      <w:r>
+        <w:rPr>
+          <w:rStyle w:val="CodeHTML"/>
+          <w:rFonts w:ascii="Times New Roman" w:hAnsi="Times New Roman" w:cs="Times New Roman"/>
+          <w:sz w:val="24"/>
+          <w:szCs w:val="24"/>
+        </w:rPr>
+        <w:t>Format de sortie : liste des problèmes classés par importance, suivie des</w:t>
+      </w:r>
+      <w:r>
+        <w:rPr>
+          <w:rStyle w:val="CodeHTML"/>
+          <w:rFonts w:ascii="Times New Roman" w:hAnsi="Times New Roman" w:cs="Times New Roman"/>
+          <w:sz w:val="24"/>
+          <w:szCs w:val="24"/>
+        </w:rPr>
+        <w:t xml:space="preserve"> </w:t>
+      </w:r>
+      <w:r>
+        <w:rPr>
+          <w:rStyle w:val="CodeHTML"/>
+          <w:rFonts w:ascii="Times New Roman" w:hAnsi="Times New Roman" w:cs="Times New Roman"/>
+          <w:sz w:val="24"/>
+          <w:szCs w:val="24"/>
+        </w:rPr>
+        <w:t>recommandations associées.</w:t>
+      </w:r>
+    </w:p>
+    <w:p>
+      <w:pPr>
+        <w:pStyle w:val="PrformatHTML"/>
+        <w:rPr>
+          <w:rFonts w:ascii="Times New Roman" w:hAnsi="Times New Roman" w:cs="Times New Roman"/>
+          <w:sz w:val="24"/>
+          <w:szCs w:val="24"/>
+        </w:rPr>
+      </w:pPr>
+      <w:r>
+        <w:rPr>
+          <w:rFonts w:ascii="Times New Roman" w:hAnsi="Times New Roman" w:cs="Times New Roman"/>
+          <w:sz w:val="24"/>
+          <w:szCs w:val="24"/>
+        </w:rPr>
+        <w:lastRenderedPageBreak/>
+        <w:drawing>
+          <wp:inline distT="0" distB="0" distL="0" distR="0" wp14:anchorId="6FFD4327" wp14:editId="620614EB">
+            <wp:extent cx="4864350" cy="3988005"/>
+            <wp:effectExtent l="0" t="0" r="0" b="0"/>
+            <wp:docPr id="10" name="Image 10"/>
+            <wp:cNvGraphicFramePr>
+              <a:graphicFrameLocks xmlns:a="http://schemas.openxmlformats.org/drawingml/2006/main" noChangeAspect="1"/>
+            </wp:cNvGraphicFramePr>
+            <a:graphic xmlns:a="http://schemas.openxmlformats.org/drawingml/2006/main">
+              <a:graphicData uri="http://schemas.openxmlformats.org/drawingml/2006/picture">
+                <pic:pic xmlns:pic="http://schemas.openxmlformats.org/drawingml/2006/picture">
+                  <pic:nvPicPr>
+                    <pic:cNvPr id="1" name=""/>
+                    <pic:cNvPicPr/>
+                  </pic:nvPicPr>
+                  <pic:blipFill>
+                    <a:blip r:embed="rId14"/>
+                    <a:stretch>
+                      <a:fillRect/>
+                    </a:stretch>
+                  </pic:blipFill>
+                  <pic:spPr>
+                    <a:xfrm>
+                      <a:off x="0" y="0"/>
+                      <a:ext cx="4864350" cy="3988005"/>
+                    </a:xfrm>
+                    <a:prstGeom prst="rect">
+                      <a:avLst/>
+                    </a:prstGeom>
+                  </pic:spPr>
+                </pic:pic>
+              </a:graphicData>
+            </a:graphic>
+          </wp:inline>
+        </w:drawing>
+      </w:r>
+    </w:p>
+    <w:p>
+      <w:pPr>
+        <w:pStyle w:val="PrformatHTML"/>
+        <w:rPr>
+          <w:rFonts w:ascii="Times New Roman" w:hAnsi="Times New Roman" w:cs="Times New Roman"/>
+          <w:sz w:val="24"/>
+          <w:szCs w:val="24"/>
+        </w:rPr>
+      </w:pPr>
+      <w:r>
+        <w:rPr>
+          <w:rFonts w:ascii="Times New Roman" w:hAnsi="Times New Roman" w:cs="Times New Roman"/>
+          <w:sz w:val="24"/>
+          <w:szCs w:val="24"/>
+        </w:rPr>
+        <w:drawing>
+          <wp:inline distT="0" distB="0" distL="0" distR="0" wp14:anchorId="15F30DA5" wp14:editId="285F22D3">
+            <wp:extent cx="4858000" cy="3359323"/>
+            <wp:effectExtent l="0" t="0" r="0" b="0"/>
+            <wp:docPr id="11" name="Image 11"/>
+            <wp:cNvGraphicFramePr>
+              <a:graphicFrameLocks xmlns:a="http://schemas.openxmlformats.org/drawingml/2006/main" noChangeAspect="1"/>
+            </wp:cNvGraphicFramePr>
+            <a:graphic xmlns:a="http://schemas.openxmlformats.org/drawingml/2006/main">
+              <a:graphicData uri="http://schemas.openxmlformats.org/drawingml/2006/picture">
+                <pic:pic xmlns:pic="http://schemas.openxmlformats.org/drawingml/2006/picture">
+                  <pic:nvPicPr>
+                    <pic:cNvPr id="1" name=""/>
+                    <pic:cNvPicPr/>
+                  </pic:nvPicPr>
+                  <pic:blipFill>
+                    <a:blip r:embed="rId15"/>
+                    <a:stretch>
+                      <a:fillRect/>
+                    </a:stretch>
+                  </pic:blipFill>
+                  <pic:spPr>
+                    <a:xfrm>
+                      <a:off x="0" y="0"/>
+                      <a:ext cx="4858000" cy="3359323"/>
+                    </a:xfrm>
+                    <a:prstGeom prst="rect">
+                      <a:avLst/>
+                    </a:prstGeom>
+                  </pic:spPr>
+                </pic:pic>
+              </a:graphicData>
+            </a:graphic>
+          </wp:inline>
+        </w:drawing>
+      </w:r>
+    </w:p>
     <w:sectPr>
       <w:pgSz w:w="11906" w:h="16838"/>
       <w:pgMar w:top="1418" w:right="1418" w:bottom="1418" w:left="1418" w:header="709" w:footer="709" w:gutter="0"/>
@@ -2678,6 +3211,92 @@
     </w:lvl>
   </w:abstractNum>
   <w:abstractNum w:abstractNumId="1" w15:restartNumberingAfterBreak="0">
+    <w:nsid w:val="19B73A6C"/>
+    <w:multiLevelType w:val="hybridMultilevel"/>
+    <w:tmpl w:val="0244483A"/>
+    <w:lvl w:ilvl="0" w:tplc="040C000F">
+      <w:start w:val="1"/>
+      <w:numFmt w:val="decimal"/>
+      <w:lvlText w:val="%1."/>
+      <w:lvlJc w:val="left"/>
+      <w:pPr>
+        <w:ind w:left="720" w:hanging="360"/>
+      </w:pPr>
+    </w:lvl>
+    <w:lvl w:ilvl="1" w:tplc="040C0019" w:tentative="1">
+      <w:start w:val="1"/>
+      <w:numFmt w:val="lowerLetter"/>
+      <w:lvlText w:val="%2."/>
+      <w:lvlJc w:val="left"/>
+      <w:pPr>
+        <w:ind w:left="1440" w:hanging="360"/>
+      </w:pPr>
+    </w:lvl>
+    <w:lvl w:ilvl="2" w:tplc="040C001B" w:tentative="1">
+      <w:start w:val="1"/>
+      <w:numFmt w:val="lowerRoman"/>
+      <w:lvlText w:val="%3."/>
+      <w:lvlJc w:val="right"/>
+      <w:pPr>
+        <w:ind w:left="2160" w:hanging="180"/>
+      </w:pPr>
+    </w:lvl>
+    <w:lvl w:ilvl="3" w:tplc="040C000F" w:tentative="1">
+      <w:start w:val="1"/>
+      <w:numFmt w:val="decimal"/>
+      <w:lvlText w:val="%4."/>
+      <w:lvlJc w:val="left"/>
+      <w:pPr>
+        <w:ind w:left="2880" w:hanging="360"/>
+      </w:pPr>
+    </w:lvl>
+    <w:lvl w:ilvl="4" w:tplc="040C0019" w:tentative="1">
+      <w:start w:val="1"/>
+      <w:numFmt w:val="lowerLetter"/>
+      <w:lvlText w:val="%5."/>
+      <w:lvlJc w:val="left"/>
+      <w:pPr>
+        <w:ind w:left="3600" w:hanging="360"/>
+      </w:pPr>
+    </w:lvl>
+    <w:lvl w:ilvl="5" w:tplc="040C001B" w:tentative="1">
+      <w:start w:val="1"/>
+      <w:numFmt w:val="lowerRoman"/>
+      <w:lvlText w:val="%6."/>
+      <w:lvlJc w:val="right"/>
+      <w:pPr>
+        <w:ind w:left="4320" w:hanging="180"/>
+      </w:pPr>
+    </w:lvl>
+    <w:lvl w:ilvl="6" w:tplc="040C000F" w:tentative="1">
+      <w:start w:val="1"/>
+      <w:numFmt w:val="decimal"/>
+      <w:lvlText w:val="%7."/>
+      <w:lvlJc w:val="left"/>
+      <w:pPr>
+        <w:ind w:left="5040" w:hanging="360"/>
+      </w:pPr>
+    </w:lvl>
+    <w:lvl w:ilvl="7" w:tplc="040C0019" w:tentative="1">
+      <w:start w:val="1"/>
+      <w:numFmt w:val="lowerLetter"/>
+      <w:lvlText w:val="%8."/>
+      <w:lvlJc w:val="left"/>
+      <w:pPr>
+        <w:ind w:left="5760" w:hanging="360"/>
+      </w:pPr>
+    </w:lvl>
+    <w:lvl w:ilvl="8" w:tplc="040C001B" w:tentative="1">
+      <w:start w:val="1"/>
+      <w:numFmt w:val="lowerRoman"/>
+      <w:lvlText w:val="%9."/>
+      <w:lvlJc w:val="right"/>
+      <w:pPr>
+        <w:ind w:left="6480" w:hanging="180"/>
+      </w:pPr>
+    </w:lvl>
+  </w:abstractNum>
+  <w:abstractNum w:abstractNumId="2" w15:restartNumberingAfterBreak="0">
     <w:nsid w:val="2DE869EE"/>
     <w:multiLevelType w:val="hybridMultilevel"/>
     <w:tmpl w:val="4E94F688"/>
@@ -2763,7 +3382,7 @@
       </w:pPr>
     </w:lvl>
   </w:abstractNum>
-  <w:abstractNum w:abstractNumId="2" w15:restartNumberingAfterBreak="0">
+  <w:abstractNum w:abstractNumId="3" w15:restartNumberingAfterBreak="0">
     <w:nsid w:val="32BC2236"/>
     <w:multiLevelType w:val="hybridMultilevel"/>
     <w:tmpl w:val="30F47246"/>
@@ -2849,7 +3468,93 @@
       </w:pPr>
     </w:lvl>
   </w:abstractNum>
-  <w:abstractNum w:abstractNumId="3" w15:restartNumberingAfterBreak="0">
+  <w:abstractNum w:abstractNumId="4" w15:restartNumberingAfterBreak="0">
+    <w:nsid w:val="5E0B23B2"/>
+    <w:multiLevelType w:val="hybridMultilevel"/>
+    <w:tmpl w:val="42507AA4"/>
+    <w:lvl w:ilvl="0" w:tplc="040C0011">
+      <w:start w:val="1"/>
+      <w:numFmt w:val="decimal"/>
+      <w:lvlText w:val="%1)"/>
+      <w:lvlJc w:val="left"/>
+      <w:pPr>
+        <w:ind w:left="720" w:hanging="360"/>
+      </w:pPr>
+    </w:lvl>
+    <w:lvl w:ilvl="1" w:tplc="040C0019" w:tentative="1">
+      <w:start w:val="1"/>
+      <w:numFmt w:val="lowerLetter"/>
+      <w:lvlText w:val="%2."/>
+      <w:lvlJc w:val="left"/>
+      <w:pPr>
+        <w:ind w:left="1440" w:hanging="360"/>
+      </w:pPr>
+    </w:lvl>
+    <w:lvl w:ilvl="2" w:tplc="040C001B" w:tentative="1">
+      <w:start w:val="1"/>
+      <w:numFmt w:val="lowerRoman"/>
+      <w:lvlText w:val="%3."/>
+      <w:lvlJc w:val="right"/>
+      <w:pPr>
+        <w:ind w:left="2160" w:hanging="180"/>
+      </w:pPr>
+    </w:lvl>
+    <w:lvl w:ilvl="3" w:tplc="040C000F" w:tentative="1">
+      <w:start w:val="1"/>
+      <w:numFmt w:val="decimal"/>
+      <w:lvlText w:val="%4."/>
+      <w:lvlJc w:val="left"/>
+      <w:pPr>
+        <w:ind w:left="2880" w:hanging="360"/>
+      </w:pPr>
+    </w:lvl>
+    <w:lvl w:ilvl="4" w:tplc="040C0019" w:tentative="1">
+      <w:start w:val="1"/>
+      <w:numFmt w:val="lowerLetter"/>
+      <w:lvlText w:val="%5."/>
+      <w:lvlJc w:val="left"/>
+      <w:pPr>
+        <w:ind w:left="3600" w:hanging="360"/>
+      </w:pPr>
+    </w:lvl>
+    <w:lvl w:ilvl="5" w:tplc="040C001B" w:tentative="1">
+      <w:start w:val="1"/>
+      <w:numFmt w:val="lowerRoman"/>
+      <w:lvlText w:val="%6."/>
+      <w:lvlJc w:val="right"/>
+      <w:pPr>
+        <w:ind w:left="4320" w:hanging="180"/>
+      </w:pPr>
+    </w:lvl>
+    <w:lvl w:ilvl="6" w:tplc="040C000F" w:tentative="1">
+      <w:start w:val="1"/>
+      <w:numFmt w:val="decimal"/>
+      <w:lvlText w:val="%7."/>
+      <w:lvlJc w:val="left"/>
+      <w:pPr>
+        <w:ind w:left="5040" w:hanging="360"/>
+      </w:pPr>
+    </w:lvl>
+    <w:lvl w:ilvl="7" w:tplc="040C0019" w:tentative="1">
+      <w:start w:val="1"/>
+      <w:numFmt w:val="lowerLetter"/>
+      <w:lvlText w:val="%8."/>
+      <w:lvlJc w:val="left"/>
+      <w:pPr>
+        <w:ind w:left="5760" w:hanging="360"/>
+      </w:pPr>
+    </w:lvl>
+    <w:lvl w:ilvl="8" w:tplc="040C001B" w:tentative="1">
+      <w:start w:val="1"/>
+      <w:numFmt w:val="lowerRoman"/>
+      <w:lvlText w:val="%9."/>
+      <w:lvlJc w:val="right"/>
+      <w:pPr>
+        <w:ind w:left="6480" w:hanging="180"/>
+      </w:pPr>
+    </w:lvl>
+  </w:abstractNum>
+  <w:abstractNum w:abstractNumId="5" w15:restartNumberingAfterBreak="0">
     <w:nsid w:val="7EC51315"/>
     <w:multiLevelType w:val="hybridMultilevel"/>
     <w:tmpl w:val="7952CE38"/>
@@ -2942,13 +3647,19 @@
     <w:abstractNumId w:val="0"/>
   </w:num>
   <w:num w:numId="2">
+    <w:abstractNumId w:val="3"/>
+  </w:num>
+  <w:num w:numId="3">
     <w:abstractNumId w:val="2"/>
   </w:num>
-  <w:num w:numId="3">
+  <w:num w:numId="4">
+    <w:abstractNumId w:val="5"/>
+  </w:num>
+  <w:num w:numId="5">
     <w:abstractNumId w:val="1"/>
   </w:num>
-  <w:num w:numId="4">
-    <w:abstractNumId w:val="3"/>
+  <w:num w:numId="6">
+    <w:abstractNumId w:val="4"/>
   </w:num>
 </w:numbering>
 </file>
@@ -3390,6 +4101,28 @@
       <w:lang w:eastAsia="fr-FR"/>
     </w:rPr>
   </w:style>
+  <w:style w:type="paragraph" w:styleId="Titre3">
+    <w:name w:val="heading 3"/>
+    <w:basedOn w:val="Normal"/>
+    <w:next w:val="Normal"/>
+    <w:link w:val="Titre3Car"/>
+    <w:uiPriority w:val="9"/>
+    <w:unhideWhenUsed/>
+    <w:qFormat/>
+    <w:rsid w:val="00146D92"/>
+    <w:pPr>
+      <w:keepNext/>
+      <w:keepLines/>
+      <w:spacing w:before="40" w:after="0"/>
+      <w:outlineLvl w:val="2"/>
+    </w:pPr>
+    <w:rPr>
+      <w:rFonts w:asciiTheme="majorHAnsi" w:eastAsiaTheme="majorEastAsia" w:hAnsiTheme="majorHAnsi" w:cstheme="majorBidi"/>
+      <w:color w:val="1F3763" w:themeColor="accent1" w:themeShade="7F"/>
+      <w:sz w:val="24"/>
+      <w:szCs w:val="24"/>
+    </w:rPr>
+  </w:style>
   <w:style w:type="character" w:default="1" w:styleId="Policepardfaut">
     <w:name w:val="Default Paragraph Font"/>
     <w:uiPriority w:val="1"/>
@@ -3463,7 +4196,6 @@
     <w:name w:val="Normal (Web)"/>
     <w:basedOn w:val="Normal"/>
     <w:uiPriority w:val="99"/>
-    <w:semiHidden/>
     <w:unhideWhenUsed/>
     <w:rsid w:val="0064232A"/>
     <w:pPr>
@@ -3481,7 +4213,6 @@
     <w:basedOn w:val="Normal"/>
     <w:link w:val="PrformatHTMLCar"/>
     <w:uiPriority w:val="99"/>
-    <w:semiHidden/>
     <w:unhideWhenUsed/>
     <w:rsid w:val="0064232A"/>
     <w:pPr>
@@ -3517,7 +4248,6 @@
     <w:basedOn w:val="Policepardfaut"/>
     <w:link w:val="PrformatHTML"/>
     <w:uiPriority w:val="99"/>
-    <w:semiHidden/>
     <w:rsid w:val="0064232A"/>
     <w:rPr>
       <w:rFonts w:ascii="Courier New" w:eastAsia="Times New Roman" w:hAnsi="Courier New" w:cs="Courier New"/>
@@ -3559,6 +4289,19 @@
     <w:rPr>
       <w:i/>
       <w:iCs/>
+    </w:rPr>
+  </w:style>
+  <w:style w:type="character" w:customStyle="1" w:styleId="Titre3Car">
+    <w:name w:val="Titre 3 Car"/>
+    <w:basedOn w:val="Policepardfaut"/>
+    <w:link w:val="Titre3"/>
+    <w:uiPriority w:val="9"/>
+    <w:rsid w:val="00146D92"/>
+    <w:rPr>
+      <w:rFonts w:asciiTheme="majorHAnsi" w:eastAsiaTheme="majorEastAsia" w:hAnsiTheme="majorHAnsi" w:cstheme="majorBidi"/>
+      <w:color w:val="1F3763" w:themeColor="accent1" w:themeShade="7F"/>
+      <w:sz w:val="24"/>
+      <w:szCs w:val="24"/>
     </w:rPr>
   </w:style>
 </w:styles>

</xml_diff>

<commit_message>
Partie 3 Auto verification
</commit_message>
<xml_diff>
--- a/ai-business_assistant.docx
+++ b/ai-business_assistant.docx
@@ -3085,6 +3085,1297 @@
         </w:drawing>
       </w:r>
     </w:p>
+    <w:p>
+      <w:pPr>
+        <w:rPr>
+          <w:rFonts w:ascii="Times New Roman" w:hAnsi="Times New Roman" w:cs="Times New Roman"/>
+          <w:b/>
+          <w:bCs/>
+          <w:sz w:val="28"/>
+          <w:szCs w:val="28"/>
+        </w:rPr>
+      </w:pPr>
+    </w:p>
+    <w:p>
+      <w:pPr>
+        <w:pStyle w:val="Paragraphedeliste"/>
+        <w:numPr>
+          <w:ilvl w:val="0"/>
+          <w:numId w:val="6"/>
+        </w:numPr>
+        <w:ind w:left="426"/>
+        <w:rPr>
+          <w:rFonts w:ascii="Times New Roman" w:hAnsi="Times New Roman" w:cs="Times New Roman"/>
+          <w:b/>
+          <w:bCs/>
+          <w:sz w:val="28"/>
+          <w:szCs w:val="28"/>
+        </w:rPr>
+      </w:pPr>
+      <w:r>
+        <w:rPr>
+          <w:rFonts w:ascii="Times New Roman" w:hAnsi="Times New Roman" w:cs="Times New Roman"/>
+          <w:b/>
+          <w:bCs/>
+          <w:sz w:val="28"/>
+          <w:szCs w:val="28"/>
+        </w:rPr>
+        <w:t xml:space="preserve">Auto-vérification </w:t>
+      </w:r>
+    </w:p>
+    <w:p>
+      <w:pPr>
+        <w:pStyle w:val="Paragraphedeliste"/>
+        <w:numPr>
+          <w:ilvl w:val="0"/>
+          <w:numId w:val="8"/>
+        </w:numPr>
+        <w:rPr>
+          <w:rFonts w:ascii="Times New Roman" w:hAnsi="Times New Roman" w:cs="Times New Roman"/>
+          <w:b/>
+          <w:bCs/>
+          <w:sz w:val="24"/>
+          <w:szCs w:val="24"/>
+        </w:rPr>
+      </w:pPr>
+      <w:r>
+        <w:rPr>
+          <w:rFonts w:ascii="Times New Roman" w:hAnsi="Times New Roman" w:cs="Times New Roman"/>
+          <w:b/>
+          <w:bCs/>
+          <w:sz w:val="24"/>
+          <w:szCs w:val="24"/>
+        </w:rPr>
+        <w:t>Premier prompt (analyse initiale avec contraintes)</w:t>
+      </w:r>
+    </w:p>
+    <w:p>
+      <w:pPr>
+        <w:rPr>
+          <w:rStyle w:val="CodeHTML"/>
+          <w:rFonts w:ascii="Times New Roman" w:eastAsiaTheme="minorHAnsi" w:hAnsi="Times New Roman" w:cs="Times New Roman"/>
+          <w:sz w:val="24"/>
+          <w:szCs w:val="24"/>
+        </w:rPr>
+      </w:pPr>
+      <w:r>
+        <w:rPr>
+          <w:rStyle w:val="CodeHTML"/>
+          <w:rFonts w:ascii="Times New Roman" w:eastAsiaTheme="minorHAnsi" w:hAnsi="Times New Roman" w:cs="Times New Roman"/>
+          <w:sz w:val="24"/>
+          <w:szCs w:val="24"/>
+        </w:rPr>
+        <w:t>Analyse le texte suivant et identifie le problème principal du client, sa cause</w:t>
+      </w:r>
+    </w:p>
+    <w:p>
+      <w:pPr>
+        <w:rPr>
+          <w:rStyle w:val="CodeHTML"/>
+          <w:rFonts w:ascii="Times New Roman" w:eastAsiaTheme="minorHAnsi" w:hAnsi="Times New Roman" w:cs="Times New Roman"/>
+          <w:sz w:val="24"/>
+          <w:szCs w:val="24"/>
+        </w:rPr>
+      </w:pPr>
+      <w:r>
+        <w:rPr>
+          <w:rStyle w:val="CodeHTML"/>
+          <w:rFonts w:ascii="Times New Roman" w:eastAsiaTheme="minorHAnsi" w:hAnsi="Times New Roman" w:cs="Times New Roman"/>
+          <w:sz w:val="24"/>
+          <w:szCs w:val="24"/>
+        </w:rPr>
+        <w:t>Probable, et une recommandation.</w:t>
+      </w:r>
+    </w:p>
+    <w:p>
+      <w:pPr>
+        <w:rPr>
+          <w:rStyle w:val="CodeHTML"/>
+          <w:rFonts w:ascii="Times New Roman" w:eastAsiaTheme="minorHAnsi" w:hAnsi="Times New Roman" w:cs="Times New Roman"/>
+          <w:sz w:val="24"/>
+          <w:szCs w:val="24"/>
+        </w:rPr>
+      </w:pPr>
+    </w:p>
+    <w:p>
+      <w:pPr>
+        <w:rPr>
+          <w:rStyle w:val="CodeHTML"/>
+          <w:rFonts w:ascii="Times New Roman" w:eastAsiaTheme="minorHAnsi" w:hAnsi="Times New Roman" w:cs="Times New Roman"/>
+          <w:sz w:val="24"/>
+          <w:szCs w:val="24"/>
+        </w:rPr>
+      </w:pPr>
+      <w:r>
+        <w:rPr>
+          <w:rStyle w:val="CodeHTML"/>
+          <w:rFonts w:ascii="Times New Roman" w:eastAsiaTheme="minorHAnsi" w:hAnsi="Times New Roman" w:cs="Times New Roman"/>
+          <w:sz w:val="24"/>
+          <w:szCs w:val="24"/>
+        </w:rPr>
+        <w:t>Contraintes : réponds uniquement à partir des informations présentes dans le texte</w:t>
+      </w:r>
+      <w:r>
+        <w:rPr>
+          <w:rStyle w:val="CodeHTML"/>
+          <w:rFonts w:ascii="Times New Roman" w:eastAsiaTheme="minorHAnsi" w:hAnsi="Times New Roman" w:cs="Times New Roman"/>
+          <w:sz w:val="24"/>
+          <w:szCs w:val="24"/>
+        </w:rPr>
+        <w:t>.</w:t>
+      </w:r>
+    </w:p>
+    <w:p>
+      <w:pPr>
+        <w:rPr>
+          <w:rStyle w:val="CodeHTML"/>
+          <w:rFonts w:ascii="Times New Roman" w:eastAsiaTheme="minorHAnsi" w:hAnsi="Times New Roman" w:cs="Times New Roman"/>
+          <w:sz w:val="24"/>
+          <w:szCs w:val="24"/>
+        </w:rPr>
+      </w:pPr>
+    </w:p>
+    <w:p>
+      <w:pPr>
+        <w:rPr>
+          <w:rStyle w:val="CodeHTML"/>
+          <w:rFonts w:ascii="Times New Roman" w:eastAsiaTheme="minorHAnsi" w:hAnsi="Times New Roman" w:cs="Times New Roman"/>
+          <w:sz w:val="24"/>
+          <w:szCs w:val="24"/>
+        </w:rPr>
+      </w:pPr>
+      <w:r>
+        <w:rPr>
+          <w:rStyle w:val="CodeHTML"/>
+          <w:rFonts w:ascii="Times New Roman" w:eastAsiaTheme="minorHAnsi" w:hAnsi="Times New Roman" w:cs="Times New Roman"/>
+          <w:b/>
+          <w:bCs/>
+          <w:sz w:val="24"/>
+          <w:szCs w:val="24"/>
+        </w:rPr>
+        <w:t>Texte</w:t>
+      </w:r>
+      <w:r>
+        <w:rPr>
+          <w:rStyle w:val="CodeHTML"/>
+          <w:rFonts w:ascii="Times New Roman" w:eastAsiaTheme="minorHAnsi" w:hAnsi="Times New Roman" w:cs="Times New Roman"/>
+          <w:sz w:val="24"/>
+          <w:szCs w:val="24"/>
+        </w:rPr>
+        <w:t xml:space="preserve"> :</w:t>
+      </w:r>
+      <w:r>
+        <w:rPr>
+          <w:rStyle w:val="CodeHTML"/>
+          <w:rFonts w:ascii="Times New Roman" w:eastAsiaTheme="minorHAnsi" w:hAnsi="Times New Roman" w:cs="Times New Roman"/>
+          <w:sz w:val="24"/>
+          <w:szCs w:val="24"/>
+        </w:rPr>
+        <w:t xml:space="preserve"> </w:t>
+      </w:r>
+      <w:r>
+        <w:rPr>
+          <w:rStyle w:val="CodeHTML"/>
+          <w:rFonts w:ascii="Times New Roman" w:eastAsiaTheme="minorHAnsi" w:hAnsi="Times New Roman" w:cs="Times New Roman"/>
+          <w:sz w:val="24"/>
+          <w:szCs w:val="24"/>
+        </w:rPr>
+        <w:t>J'ai commandé un ordinateur portable il y a une semaine. La livraison était prévue</w:t>
+      </w:r>
+    </w:p>
+    <w:p>
+      <w:pPr>
+        <w:rPr>
+          <w:rStyle w:val="CodeHTML"/>
+          <w:rFonts w:ascii="Times New Roman" w:eastAsiaTheme="minorHAnsi" w:hAnsi="Times New Roman" w:cs="Times New Roman"/>
+          <w:sz w:val="24"/>
+          <w:szCs w:val="24"/>
+        </w:rPr>
+      </w:pPr>
+      <w:proofErr w:type="gramStart"/>
+      <w:r>
+        <w:rPr>
+          <w:rStyle w:val="CodeHTML"/>
+          <w:rFonts w:ascii="Times New Roman" w:eastAsiaTheme="minorHAnsi" w:hAnsi="Times New Roman" w:cs="Times New Roman"/>
+          <w:sz w:val="24"/>
+          <w:szCs w:val="24"/>
+        </w:rPr>
+        <w:t>pour</w:t>
+      </w:r>
+      <w:proofErr w:type="gramEnd"/>
+      <w:r>
+        <w:rPr>
+          <w:rStyle w:val="CodeHTML"/>
+          <w:rFonts w:ascii="Times New Roman" w:eastAsiaTheme="minorHAnsi" w:hAnsi="Times New Roman" w:cs="Times New Roman"/>
+          <w:sz w:val="24"/>
+          <w:szCs w:val="24"/>
+        </w:rPr>
+        <w:t xml:space="preserve"> lundi, mais nous sommes jeudi et je n'ai toujours rien reçu. Le suivi de ma</w:t>
+      </w:r>
+    </w:p>
+    <w:p>
+      <w:pPr>
+        <w:rPr>
+          <w:rStyle w:val="CodeHTML"/>
+          <w:rFonts w:ascii="Times New Roman" w:eastAsiaTheme="minorHAnsi" w:hAnsi="Times New Roman" w:cs="Times New Roman"/>
+          <w:sz w:val="24"/>
+          <w:szCs w:val="24"/>
+        </w:rPr>
+      </w:pPr>
+      <w:proofErr w:type="gramStart"/>
+      <w:r>
+        <w:rPr>
+          <w:rStyle w:val="CodeHTML"/>
+          <w:rFonts w:ascii="Times New Roman" w:eastAsiaTheme="minorHAnsi" w:hAnsi="Times New Roman" w:cs="Times New Roman"/>
+          <w:sz w:val="24"/>
+          <w:szCs w:val="24"/>
+        </w:rPr>
+        <w:t>commande</w:t>
+      </w:r>
+      <w:proofErr w:type="gramEnd"/>
+      <w:r>
+        <w:rPr>
+          <w:rStyle w:val="CodeHTML"/>
+          <w:rFonts w:ascii="Times New Roman" w:eastAsiaTheme="minorHAnsi" w:hAnsi="Times New Roman" w:cs="Times New Roman"/>
+          <w:sz w:val="24"/>
+          <w:szCs w:val="24"/>
+        </w:rPr>
+        <w:t xml:space="preserve"> n'a pas été mis à jour depuis lundi. J'ai également contacté le service</w:t>
+      </w:r>
+    </w:p>
+    <w:p>
+      <w:pPr>
+        <w:rPr>
+          <w:rStyle w:val="CodeHTML"/>
+          <w:rFonts w:ascii="Times New Roman" w:eastAsiaTheme="minorHAnsi" w:hAnsi="Times New Roman" w:cs="Times New Roman"/>
+          <w:sz w:val="24"/>
+          <w:szCs w:val="24"/>
+        </w:rPr>
+      </w:pPr>
+      <w:proofErr w:type="gramStart"/>
+      <w:r>
+        <w:rPr>
+          <w:rStyle w:val="CodeHTML"/>
+          <w:rFonts w:ascii="Times New Roman" w:eastAsiaTheme="minorHAnsi" w:hAnsi="Times New Roman" w:cs="Times New Roman"/>
+          <w:sz w:val="24"/>
+          <w:szCs w:val="24"/>
+        </w:rPr>
+        <w:t>client</w:t>
+      </w:r>
+      <w:proofErr w:type="gramEnd"/>
+      <w:r>
+        <w:rPr>
+          <w:rStyle w:val="CodeHTML"/>
+          <w:rFonts w:ascii="Times New Roman" w:eastAsiaTheme="minorHAnsi" w:hAnsi="Times New Roman" w:cs="Times New Roman"/>
+          <w:sz w:val="24"/>
+          <w:szCs w:val="24"/>
+        </w:rPr>
+        <w:t xml:space="preserve"> mardi, mais je n'ai reçu aucune réponse jusqu'à présent.</w:t>
+      </w:r>
+    </w:p>
+    <w:p>
+      <w:pPr>
+        <w:rPr>
+          <w:rStyle w:val="CodeHTML"/>
+          <w:rFonts w:ascii="Times New Roman" w:eastAsiaTheme="minorHAnsi" w:hAnsi="Times New Roman" w:cs="Times New Roman"/>
+          <w:b/>
+          <w:bCs/>
+          <w:sz w:val="24"/>
+          <w:szCs w:val="24"/>
+        </w:rPr>
+      </w:pPr>
+      <w:r>
+        <w:rPr>
+          <w:rStyle w:val="CodeHTML"/>
+          <w:rFonts w:ascii="Times New Roman" w:eastAsiaTheme="minorHAnsi" w:hAnsi="Times New Roman" w:cs="Times New Roman"/>
+          <w:b/>
+          <w:bCs/>
+          <w:sz w:val="24"/>
+          <w:szCs w:val="24"/>
+        </w:rPr>
+        <w:t>Résultat :</w:t>
+      </w:r>
+    </w:p>
+    <w:p>
+      <w:pPr>
+        <w:rPr>
+          <w:rStyle w:val="CodeHTML"/>
+          <w:rFonts w:ascii="Times New Roman" w:eastAsiaTheme="minorHAnsi" w:hAnsi="Times New Roman" w:cs="Times New Roman"/>
+          <w:sz w:val="24"/>
+          <w:szCs w:val="24"/>
+        </w:rPr>
+      </w:pPr>
+      <w:r>
+        <w:rPr>
+          <w:rStyle w:val="CodeHTML"/>
+          <w:rFonts w:ascii="Times New Roman" w:eastAsiaTheme="minorHAnsi" w:hAnsi="Times New Roman" w:cs="Times New Roman"/>
+          <w:sz w:val="24"/>
+          <w:szCs w:val="24"/>
+        </w:rPr>
+        <w:drawing>
+          <wp:inline distT="0" distB="0" distL="0" distR="0" wp14:anchorId="397008F8" wp14:editId="0E955B5D">
+            <wp:extent cx="5759450" cy="1856740"/>
+            <wp:effectExtent l="0" t="0" r="0" b="0"/>
+            <wp:docPr id="12" name="Image 12"/>
+            <wp:cNvGraphicFramePr>
+              <a:graphicFrameLocks xmlns:a="http://schemas.openxmlformats.org/drawingml/2006/main" noChangeAspect="1"/>
+            </wp:cNvGraphicFramePr>
+            <a:graphic xmlns:a="http://schemas.openxmlformats.org/drawingml/2006/main">
+              <a:graphicData uri="http://schemas.openxmlformats.org/drawingml/2006/picture">
+                <pic:pic xmlns:pic="http://schemas.openxmlformats.org/drawingml/2006/picture">
+                  <pic:nvPicPr>
+                    <pic:cNvPr id="1" name=""/>
+                    <pic:cNvPicPr/>
+                  </pic:nvPicPr>
+                  <pic:blipFill>
+                    <a:blip r:embed="rId16"/>
+                    <a:stretch>
+                      <a:fillRect/>
+                    </a:stretch>
+                  </pic:blipFill>
+                  <pic:spPr>
+                    <a:xfrm>
+                      <a:off x="0" y="0"/>
+                      <a:ext cx="5759450" cy="1856740"/>
+                    </a:xfrm>
+                    <a:prstGeom prst="rect">
+                      <a:avLst/>
+                    </a:prstGeom>
+                  </pic:spPr>
+                </pic:pic>
+              </a:graphicData>
+            </a:graphic>
+          </wp:inline>
+        </w:drawing>
+      </w:r>
+    </w:p>
+    <w:p>
+      <w:pPr>
+        <w:rPr>
+          <w:rStyle w:val="CodeHTML"/>
+          <w:rFonts w:ascii="Times New Roman" w:eastAsiaTheme="minorHAnsi" w:hAnsi="Times New Roman" w:cs="Times New Roman"/>
+          <w:sz w:val="24"/>
+          <w:szCs w:val="24"/>
+        </w:rPr>
+      </w:pPr>
+    </w:p>
+    <w:p>
+      <w:pPr>
+        <w:pStyle w:val="Paragraphedeliste"/>
+        <w:numPr>
+          <w:ilvl w:val="0"/>
+          <w:numId w:val="8"/>
+        </w:numPr>
+        <w:rPr>
+          <w:rFonts w:ascii="Times New Roman" w:hAnsi="Times New Roman" w:cs="Times New Roman"/>
+          <w:b/>
+          <w:bCs/>
+          <w:sz w:val="24"/>
+          <w:szCs w:val="24"/>
+        </w:rPr>
+      </w:pPr>
+      <w:r>
+        <w:rPr>
+          <w:rFonts w:ascii="Times New Roman" w:hAnsi="Times New Roman" w:cs="Times New Roman"/>
+          <w:b/>
+          <w:bCs/>
+          <w:sz w:val="24"/>
+          <w:szCs w:val="24"/>
+        </w:rPr>
+        <w:t xml:space="preserve">Second prompt </w:t>
+      </w:r>
+      <w:r>
+        <w:rPr>
+          <w:rFonts w:ascii="Times New Roman" w:hAnsi="Times New Roman" w:cs="Times New Roman"/>
+          <w:b/>
+          <w:bCs/>
+          <w:sz w:val="24"/>
+          <w:szCs w:val="24"/>
+        </w:rPr>
+        <w:t>(</w:t>
+      </w:r>
+      <w:r>
+        <w:rPr>
+          <w:rFonts w:ascii="Times New Roman" w:hAnsi="Times New Roman" w:cs="Times New Roman"/>
+          <w:b/>
+          <w:bCs/>
+          <w:sz w:val="24"/>
+          <w:szCs w:val="24"/>
+        </w:rPr>
+        <w:t>vérification de la réponse précédente</w:t>
+      </w:r>
+      <w:r>
+        <w:rPr>
+          <w:rFonts w:ascii="Times New Roman" w:hAnsi="Times New Roman" w:cs="Times New Roman"/>
+          <w:b/>
+          <w:bCs/>
+          <w:sz w:val="24"/>
+          <w:szCs w:val="24"/>
+        </w:rPr>
+        <w:t>)</w:t>
+      </w:r>
+    </w:p>
+    <w:p>
+      <w:pPr>
+        <w:rPr>
+          <w:rStyle w:val="CodeHTML"/>
+          <w:rFonts w:ascii="Times New Roman" w:eastAsiaTheme="minorHAnsi" w:hAnsi="Times New Roman" w:cs="Times New Roman"/>
+          <w:sz w:val="24"/>
+          <w:szCs w:val="24"/>
+        </w:rPr>
+      </w:pPr>
+      <w:r>
+        <w:rPr>
+          <w:rStyle w:val="CodeHTML"/>
+          <w:rFonts w:ascii="Times New Roman" w:eastAsiaTheme="minorHAnsi" w:hAnsi="Times New Roman" w:cs="Times New Roman"/>
+          <w:sz w:val="24"/>
+          <w:szCs w:val="24"/>
+        </w:rPr>
+        <w:t>Voici un texte source et une analyse qui en a été produite. Vérifie cette analyse</w:t>
+      </w:r>
+      <w:r>
+        <w:rPr>
+          <w:rStyle w:val="CodeHTML"/>
+          <w:rFonts w:ascii="Times New Roman" w:eastAsiaTheme="minorHAnsi" w:hAnsi="Times New Roman" w:cs="Times New Roman"/>
+          <w:sz w:val="24"/>
+          <w:szCs w:val="24"/>
+        </w:rPr>
+        <w:t xml:space="preserve"> </w:t>
+      </w:r>
+      <w:r>
+        <w:rPr>
+          <w:rStyle w:val="CodeHTML"/>
+          <w:rFonts w:ascii="Times New Roman" w:eastAsiaTheme="minorHAnsi" w:hAnsi="Times New Roman" w:cs="Times New Roman"/>
+          <w:sz w:val="24"/>
+          <w:szCs w:val="24"/>
+        </w:rPr>
+        <w:t>de façon critique.</w:t>
+      </w:r>
+    </w:p>
+    <w:p>
+      <w:pPr>
+        <w:rPr>
+          <w:rStyle w:val="CodeHTML"/>
+          <w:rFonts w:ascii="Times New Roman" w:eastAsiaTheme="minorHAnsi" w:hAnsi="Times New Roman" w:cs="Times New Roman"/>
+          <w:sz w:val="24"/>
+          <w:szCs w:val="24"/>
+        </w:rPr>
+      </w:pPr>
+    </w:p>
+    <w:p>
+      <w:pPr>
+        <w:rPr>
+          <w:rStyle w:val="CodeHTML"/>
+          <w:rFonts w:ascii="Times New Roman" w:eastAsiaTheme="minorHAnsi" w:hAnsi="Times New Roman" w:cs="Times New Roman"/>
+          <w:sz w:val="24"/>
+          <w:szCs w:val="24"/>
+        </w:rPr>
+      </w:pPr>
+      <w:r>
+        <w:rPr>
+          <w:rStyle w:val="CodeHTML"/>
+          <w:rFonts w:ascii="Times New Roman" w:eastAsiaTheme="minorHAnsi" w:hAnsi="Times New Roman" w:cs="Times New Roman"/>
+          <w:b/>
+          <w:bCs/>
+          <w:sz w:val="24"/>
+          <w:szCs w:val="24"/>
+        </w:rPr>
+        <w:t>Texte source :</w:t>
+      </w:r>
+      <w:r>
+        <w:rPr>
+          <w:rStyle w:val="Paragraphedeliste"/>
+          <w:rFonts w:ascii="Times New Roman" w:hAnsi="Times New Roman" w:cs="Times New Roman"/>
+          <w:sz w:val="24"/>
+          <w:szCs w:val="24"/>
+        </w:rPr>
+        <w:t xml:space="preserve"> </w:t>
+      </w:r>
+      <w:r>
+        <w:rPr>
+          <w:rStyle w:val="CodeHTML"/>
+          <w:rFonts w:ascii="Times New Roman" w:eastAsiaTheme="minorHAnsi" w:hAnsi="Times New Roman" w:cs="Times New Roman"/>
+          <w:sz w:val="24"/>
+          <w:szCs w:val="24"/>
+        </w:rPr>
+        <w:t>J'ai commandé un ordinateur portable il y a une semaine. La livraison était prévue</w:t>
+      </w:r>
+      <w:r>
+        <w:rPr>
+          <w:rStyle w:val="CodeHTML"/>
+          <w:rFonts w:ascii="Times New Roman" w:eastAsiaTheme="minorHAnsi" w:hAnsi="Times New Roman" w:cs="Times New Roman"/>
+          <w:sz w:val="24"/>
+          <w:szCs w:val="24"/>
+        </w:rPr>
+        <w:t xml:space="preserve"> </w:t>
+      </w:r>
+      <w:r>
+        <w:rPr>
+          <w:rStyle w:val="CodeHTML"/>
+          <w:rFonts w:ascii="Times New Roman" w:eastAsiaTheme="minorHAnsi" w:hAnsi="Times New Roman" w:cs="Times New Roman"/>
+          <w:sz w:val="24"/>
+          <w:szCs w:val="24"/>
+        </w:rPr>
+        <w:t>pour lundi, mais nous sommes jeudi et je n'ai toujours rien reçu. Le suivi de ma</w:t>
+      </w:r>
+      <w:r>
+        <w:rPr>
+          <w:rStyle w:val="CodeHTML"/>
+          <w:rFonts w:ascii="Times New Roman" w:eastAsiaTheme="minorHAnsi" w:hAnsi="Times New Roman" w:cs="Times New Roman"/>
+          <w:sz w:val="24"/>
+          <w:szCs w:val="24"/>
+        </w:rPr>
+        <w:t xml:space="preserve"> </w:t>
+      </w:r>
+      <w:r>
+        <w:rPr>
+          <w:rStyle w:val="CodeHTML"/>
+          <w:rFonts w:ascii="Times New Roman" w:eastAsiaTheme="minorHAnsi" w:hAnsi="Times New Roman" w:cs="Times New Roman"/>
+          <w:sz w:val="24"/>
+          <w:szCs w:val="24"/>
+        </w:rPr>
+        <w:t>commande n'a pas été mis à jour depuis lundi. J'ai également contacté le service</w:t>
+      </w:r>
+      <w:r>
+        <w:rPr>
+          <w:rStyle w:val="CodeHTML"/>
+          <w:rFonts w:ascii="Times New Roman" w:eastAsiaTheme="minorHAnsi" w:hAnsi="Times New Roman" w:cs="Times New Roman"/>
+          <w:sz w:val="24"/>
+          <w:szCs w:val="24"/>
+        </w:rPr>
+        <w:t xml:space="preserve"> </w:t>
+      </w:r>
+      <w:r>
+        <w:rPr>
+          <w:rStyle w:val="CodeHTML"/>
+          <w:rFonts w:ascii="Times New Roman" w:eastAsiaTheme="minorHAnsi" w:hAnsi="Times New Roman" w:cs="Times New Roman"/>
+          <w:sz w:val="24"/>
+          <w:szCs w:val="24"/>
+        </w:rPr>
+        <w:t>client mardi, mais je n'ai reçu aucune réponse jusqu'à présent.</w:t>
+      </w:r>
+    </w:p>
+    <w:p>
+      <w:pPr>
+        <w:rPr>
+          <w:rStyle w:val="CodeHTML"/>
+          <w:rFonts w:ascii="Times New Roman" w:eastAsiaTheme="minorHAnsi" w:hAnsi="Times New Roman" w:cs="Times New Roman"/>
+          <w:sz w:val="24"/>
+          <w:szCs w:val="24"/>
+        </w:rPr>
+      </w:pPr>
+    </w:p>
+    <w:p>
+      <w:pPr>
+        <w:rPr>
+          <w:rStyle w:val="CodeHTML"/>
+          <w:rFonts w:ascii="Times New Roman" w:eastAsiaTheme="minorHAnsi" w:hAnsi="Times New Roman" w:cs="Times New Roman"/>
+          <w:sz w:val="24"/>
+          <w:szCs w:val="24"/>
+        </w:rPr>
+      </w:pPr>
+      <w:r>
+        <w:rPr>
+          <w:rStyle w:val="CodeHTML"/>
+          <w:rFonts w:ascii="Times New Roman" w:eastAsiaTheme="minorHAnsi" w:hAnsi="Times New Roman" w:cs="Times New Roman"/>
+          <w:sz w:val="24"/>
+          <w:szCs w:val="24"/>
+        </w:rPr>
+        <w:t>Analyse à vérifier :</w:t>
+      </w:r>
+    </w:p>
+    <w:p>
+      <w:pPr>
+        <w:pStyle w:val="pdq2pgselectionanchorcontainer"/>
+        <w:ind w:left="708"/>
+      </w:pPr>
+      <w:r>
+        <w:rPr>
+          <w:rStyle w:val="lev"/>
+        </w:rPr>
+        <w:t>« </w:t>
+      </w:r>
+      <w:r>
+        <w:rPr>
+          <w:rStyle w:val="lev"/>
+        </w:rPr>
+        <w:t>Problème principal :</w:t>
+      </w:r>
+      <w:r>
+        <w:br/>
+        <w:t>Retard de livraison de l'ordinateur portable. La livraison était prévue pour lundi, mais jeudi, le client n'a toujours rien reçu.</w:t>
+      </w:r>
+    </w:p>
+    <w:p>
+      <w:pPr>
+        <w:pStyle w:val="NormalWeb"/>
+        <w:ind w:left="708"/>
+      </w:pPr>
+      <w:r>
+        <w:rPr>
+          <w:rStyle w:val="lev"/>
+        </w:rPr>
+        <w:t>Cause probable :</w:t>
+      </w:r>
+      <w:r>
+        <w:br/>
+        <w:t xml:space="preserve">Le suivi de la commande n'a pas été mis à jour depuis lundi. Cependant, </w:t>
+      </w:r>
+      <w:r>
+        <w:rPr>
+          <w:rStyle w:val="lev"/>
+        </w:rPr>
+        <w:t>la cause exacte du retard n'est pas précisée dans le texte</w:t>
+      </w:r>
+      <w:r>
+        <w:t>.</w:t>
+      </w:r>
+    </w:p>
+    <w:p>
+      <w:pPr>
+        <w:pStyle w:val="NormalWeb"/>
+        <w:ind w:left="708"/>
+      </w:pPr>
+      <w:r>
+        <w:rPr>
+          <w:rStyle w:val="lev"/>
+        </w:rPr>
+        <w:lastRenderedPageBreak/>
+        <w:t>Recommandation :</w:t>
+      </w:r>
+      <w:r>
+        <w:br/>
+        <w:t>Améliorer le suivi des commandes et apporter une réponse au client concernant l'état de sa livraison.</w:t>
+      </w:r>
+      <w:r>
+        <w:t> »</w:t>
+      </w:r>
+    </w:p>
+    <w:p>
+      <w:pPr>
+        <w:rPr>
+          <w:rStyle w:val="CodeHTML"/>
+          <w:rFonts w:ascii="Times New Roman" w:eastAsiaTheme="minorHAnsi" w:hAnsi="Times New Roman" w:cs="Times New Roman"/>
+          <w:sz w:val="24"/>
+          <w:szCs w:val="24"/>
+        </w:rPr>
+      </w:pPr>
+    </w:p>
+    <w:p>
+      <w:pPr>
+        <w:rPr>
+          <w:rStyle w:val="CodeHTML"/>
+          <w:rFonts w:ascii="Times New Roman" w:eastAsiaTheme="minorHAnsi" w:hAnsi="Times New Roman" w:cs="Times New Roman"/>
+          <w:sz w:val="24"/>
+          <w:szCs w:val="24"/>
+        </w:rPr>
+      </w:pPr>
+      <w:r>
+        <w:rPr>
+          <w:rStyle w:val="CodeHTML"/>
+          <w:rFonts w:ascii="Times New Roman" w:eastAsiaTheme="minorHAnsi" w:hAnsi="Times New Roman" w:cs="Times New Roman"/>
+          <w:sz w:val="24"/>
+          <w:szCs w:val="24"/>
+        </w:rPr>
+        <w:t>Tache :</w:t>
+      </w:r>
+    </w:p>
+    <w:p>
+      <w:pPr>
+        <w:rPr>
+          <w:rStyle w:val="CodeHTML"/>
+          <w:rFonts w:ascii="Times New Roman" w:eastAsiaTheme="minorHAnsi" w:hAnsi="Times New Roman" w:cs="Times New Roman"/>
+          <w:sz w:val="24"/>
+          <w:szCs w:val="24"/>
+        </w:rPr>
+      </w:pPr>
+      <w:r>
+        <w:rPr>
+          <w:rStyle w:val="CodeHTML"/>
+          <w:rFonts w:ascii="Times New Roman" w:eastAsiaTheme="minorHAnsi" w:hAnsi="Times New Roman" w:cs="Times New Roman"/>
+          <w:sz w:val="24"/>
+          <w:szCs w:val="24"/>
+        </w:rPr>
+        <w:t>1. Informations non justifiées : y a-t-il des affirmations dans l'analyse qui ne</w:t>
+      </w:r>
+      <w:r>
+        <w:rPr>
+          <w:rStyle w:val="CodeHTML"/>
+          <w:rFonts w:ascii="Times New Roman" w:eastAsiaTheme="minorHAnsi" w:hAnsi="Times New Roman" w:cs="Times New Roman"/>
+          <w:sz w:val="24"/>
+          <w:szCs w:val="24"/>
+        </w:rPr>
+        <w:t xml:space="preserve"> </w:t>
+      </w:r>
+      <w:r>
+        <w:rPr>
+          <w:rStyle w:val="CodeHTML"/>
+          <w:rFonts w:ascii="Times New Roman" w:eastAsiaTheme="minorHAnsi" w:hAnsi="Times New Roman" w:cs="Times New Roman"/>
+          <w:sz w:val="24"/>
+          <w:szCs w:val="24"/>
+        </w:rPr>
+        <w:t>sont pas présentes ou déductibles du texte source ?</w:t>
+      </w:r>
+    </w:p>
+    <w:p>
+      <w:pPr>
+        <w:rPr>
+          <w:rStyle w:val="CodeHTML"/>
+          <w:rFonts w:ascii="Times New Roman" w:eastAsiaTheme="minorHAnsi" w:hAnsi="Times New Roman" w:cs="Times New Roman"/>
+          <w:sz w:val="24"/>
+          <w:szCs w:val="24"/>
+        </w:rPr>
+      </w:pPr>
+      <w:r>
+        <w:rPr>
+          <w:rStyle w:val="CodeHTML"/>
+          <w:rFonts w:ascii="Times New Roman" w:eastAsiaTheme="minorHAnsi" w:hAnsi="Times New Roman" w:cs="Times New Roman"/>
+          <w:sz w:val="24"/>
+          <w:szCs w:val="24"/>
+        </w:rPr>
+        <w:t>2. Contradictions : l'analyse se contredit-elle elle-même ou contredit-elle le texte ?</w:t>
+      </w:r>
+    </w:p>
+    <w:p>
+      <w:pPr>
+        <w:rPr>
+          <w:rStyle w:val="CodeHTML"/>
+          <w:rFonts w:ascii="Times New Roman" w:eastAsiaTheme="minorHAnsi" w:hAnsi="Times New Roman" w:cs="Times New Roman"/>
+          <w:sz w:val="24"/>
+          <w:szCs w:val="24"/>
+        </w:rPr>
+      </w:pPr>
+      <w:r>
+        <w:rPr>
+          <w:rStyle w:val="CodeHTML"/>
+          <w:rFonts w:ascii="Times New Roman" w:eastAsiaTheme="minorHAnsi" w:hAnsi="Times New Roman" w:cs="Times New Roman"/>
+          <w:sz w:val="24"/>
+          <w:szCs w:val="24"/>
+        </w:rPr>
+        <w:t>3. Informations absentes : l'analyse omet-elle un élément important du texte source ?</w:t>
+      </w:r>
+    </w:p>
+    <w:p>
+      <w:pPr>
+        <w:rPr>
+          <w:rStyle w:val="CodeHTML"/>
+          <w:rFonts w:ascii="Times New Roman" w:eastAsiaTheme="minorHAnsi" w:hAnsi="Times New Roman" w:cs="Times New Roman"/>
+          <w:sz w:val="24"/>
+          <w:szCs w:val="24"/>
+        </w:rPr>
+      </w:pPr>
+      <w:r>
+        <w:rPr>
+          <w:rStyle w:val="CodeHTML"/>
+          <w:rFonts w:ascii="Times New Roman" w:eastAsiaTheme="minorHAnsi" w:hAnsi="Times New Roman" w:cs="Times New Roman"/>
+          <w:sz w:val="24"/>
+          <w:szCs w:val="24"/>
+        </w:rPr>
+        <w:t>4. Hallucinations : l'analyse invente-t-elle des faits, chiffres ou détails absents du texte ?</w:t>
+      </w:r>
+    </w:p>
+    <w:p>
+      <w:pPr>
+        <w:rPr>
+          <w:rStyle w:val="CodeHTML"/>
+          <w:rFonts w:ascii="Times New Roman" w:eastAsiaTheme="minorHAnsi" w:hAnsi="Times New Roman" w:cs="Times New Roman"/>
+          <w:sz w:val="24"/>
+          <w:szCs w:val="24"/>
+        </w:rPr>
+      </w:pPr>
+      <w:r>
+        <w:rPr>
+          <w:rStyle w:val="CodeHTML"/>
+          <w:rFonts w:ascii="Times New Roman" w:eastAsiaTheme="minorHAnsi" w:hAnsi="Times New Roman" w:cs="Times New Roman"/>
+          <w:sz w:val="24"/>
+          <w:szCs w:val="24"/>
+        </w:rPr>
+        <w:t>5. Respect des contraintes : les contraintes du premier prompt ont-elles été respectées ?</w:t>
+      </w:r>
+    </w:p>
+    <w:p>
+      <w:pPr>
+        <w:rPr>
+          <w:rStyle w:val="CodeHTML"/>
+          <w:rFonts w:ascii="Times New Roman" w:eastAsiaTheme="minorHAnsi" w:hAnsi="Times New Roman" w:cs="Times New Roman"/>
+          <w:sz w:val="24"/>
+          <w:szCs w:val="24"/>
+        </w:rPr>
+      </w:pPr>
+    </w:p>
+    <w:p>
+      <w:pPr>
+        <w:rPr>
+          <w:rStyle w:val="CodeHTML"/>
+          <w:rFonts w:ascii="Times New Roman" w:eastAsiaTheme="minorHAnsi" w:hAnsi="Times New Roman" w:cs="Times New Roman"/>
+          <w:sz w:val="24"/>
+          <w:szCs w:val="24"/>
+        </w:rPr>
+      </w:pPr>
+      <w:r>
+        <w:rPr>
+          <w:rStyle w:val="CodeHTML"/>
+          <w:rFonts w:ascii="Times New Roman" w:eastAsiaTheme="minorHAnsi" w:hAnsi="Times New Roman" w:cs="Times New Roman"/>
+          <w:sz w:val="24"/>
+          <w:szCs w:val="24"/>
+        </w:rPr>
+        <w:t>Format de sortie :</w:t>
+      </w:r>
+    </w:p>
+    <w:p>
+      <w:pPr>
+        <w:rPr>
+          <w:rStyle w:val="CodeHTML"/>
+          <w:rFonts w:ascii="Times New Roman" w:eastAsiaTheme="minorHAnsi" w:hAnsi="Times New Roman" w:cs="Times New Roman"/>
+          <w:sz w:val="24"/>
+          <w:szCs w:val="24"/>
+        </w:rPr>
+      </w:pPr>
+      <w:r>
+        <w:rPr>
+          <w:rStyle w:val="CodeHTML"/>
+          <w:rFonts w:ascii="Times New Roman" w:eastAsiaTheme="minorHAnsi" w:hAnsi="Times New Roman" w:cs="Times New Roman"/>
+          <w:sz w:val="24"/>
+          <w:szCs w:val="24"/>
+        </w:rPr>
+        <w:t>{</w:t>
+      </w:r>
+    </w:p>
+    <w:p>
+      <w:pPr>
+        <w:rPr>
+          <w:rStyle w:val="CodeHTML"/>
+          <w:rFonts w:ascii="Times New Roman" w:eastAsiaTheme="minorHAnsi" w:hAnsi="Times New Roman" w:cs="Times New Roman"/>
+          <w:sz w:val="24"/>
+          <w:szCs w:val="24"/>
+        </w:rPr>
+      </w:pPr>
+      <w:r>
+        <w:rPr>
+          <w:rStyle w:val="CodeHTML"/>
+          <w:rFonts w:ascii="Times New Roman" w:eastAsiaTheme="minorHAnsi" w:hAnsi="Times New Roman" w:cs="Times New Roman"/>
+          <w:sz w:val="24"/>
+          <w:szCs w:val="24"/>
+        </w:rPr>
+        <w:t xml:space="preserve">  "</w:t>
+      </w:r>
+      <w:proofErr w:type="spellStart"/>
+      <w:r>
+        <w:rPr>
+          <w:rStyle w:val="CodeHTML"/>
+          <w:rFonts w:ascii="Times New Roman" w:eastAsiaTheme="minorHAnsi" w:hAnsi="Times New Roman" w:cs="Times New Roman"/>
+          <w:sz w:val="24"/>
+          <w:szCs w:val="24"/>
+        </w:rPr>
+        <w:t>informations_non_justifiees</w:t>
+      </w:r>
+      <w:proofErr w:type="spellEnd"/>
+      <w:proofErr w:type="gramStart"/>
+      <w:r>
+        <w:rPr>
+          <w:rStyle w:val="CodeHTML"/>
+          <w:rFonts w:ascii="Times New Roman" w:eastAsiaTheme="minorHAnsi" w:hAnsi="Times New Roman" w:cs="Times New Roman"/>
+          <w:sz w:val="24"/>
+          <w:szCs w:val="24"/>
+        </w:rPr>
+        <w:t>":</w:t>
+      </w:r>
+      <w:proofErr w:type="gramEnd"/>
+      <w:r>
+        <w:rPr>
+          <w:rStyle w:val="CodeHTML"/>
+          <w:rFonts w:ascii="Times New Roman" w:eastAsiaTheme="minorHAnsi" w:hAnsi="Times New Roman" w:cs="Times New Roman"/>
+          <w:sz w:val="24"/>
+          <w:szCs w:val="24"/>
+        </w:rPr>
+        <w:t xml:space="preserve"> [...],</w:t>
+      </w:r>
+    </w:p>
+    <w:p>
+      <w:pPr>
+        <w:rPr>
+          <w:rStyle w:val="CodeHTML"/>
+          <w:rFonts w:ascii="Times New Roman" w:eastAsiaTheme="minorHAnsi" w:hAnsi="Times New Roman" w:cs="Times New Roman"/>
+          <w:sz w:val="24"/>
+          <w:szCs w:val="24"/>
+        </w:rPr>
+      </w:pPr>
+      <w:r>
+        <w:rPr>
+          <w:rStyle w:val="CodeHTML"/>
+          <w:rFonts w:ascii="Times New Roman" w:eastAsiaTheme="minorHAnsi" w:hAnsi="Times New Roman" w:cs="Times New Roman"/>
+          <w:sz w:val="24"/>
+          <w:szCs w:val="24"/>
+        </w:rPr>
+        <w:t xml:space="preserve">  "contradictions</w:t>
+      </w:r>
+      <w:proofErr w:type="gramStart"/>
+      <w:r>
+        <w:rPr>
+          <w:rStyle w:val="CodeHTML"/>
+          <w:rFonts w:ascii="Times New Roman" w:eastAsiaTheme="minorHAnsi" w:hAnsi="Times New Roman" w:cs="Times New Roman"/>
+          <w:sz w:val="24"/>
+          <w:szCs w:val="24"/>
+        </w:rPr>
+        <w:t>":</w:t>
+      </w:r>
+      <w:proofErr w:type="gramEnd"/>
+      <w:r>
+        <w:rPr>
+          <w:rStyle w:val="CodeHTML"/>
+          <w:rFonts w:ascii="Times New Roman" w:eastAsiaTheme="minorHAnsi" w:hAnsi="Times New Roman" w:cs="Times New Roman"/>
+          <w:sz w:val="24"/>
+          <w:szCs w:val="24"/>
+        </w:rPr>
+        <w:t xml:space="preserve"> [...],</w:t>
+      </w:r>
+    </w:p>
+    <w:p>
+      <w:pPr>
+        <w:rPr>
+          <w:rStyle w:val="CodeHTML"/>
+          <w:rFonts w:ascii="Times New Roman" w:eastAsiaTheme="minorHAnsi" w:hAnsi="Times New Roman" w:cs="Times New Roman"/>
+          <w:sz w:val="24"/>
+          <w:szCs w:val="24"/>
+        </w:rPr>
+      </w:pPr>
+      <w:r>
+        <w:rPr>
+          <w:rStyle w:val="CodeHTML"/>
+          <w:rFonts w:ascii="Times New Roman" w:eastAsiaTheme="minorHAnsi" w:hAnsi="Times New Roman" w:cs="Times New Roman"/>
+          <w:sz w:val="24"/>
+          <w:szCs w:val="24"/>
+        </w:rPr>
+        <w:t xml:space="preserve">  "</w:t>
+      </w:r>
+      <w:proofErr w:type="spellStart"/>
+      <w:r>
+        <w:rPr>
+          <w:rStyle w:val="CodeHTML"/>
+          <w:rFonts w:ascii="Times New Roman" w:eastAsiaTheme="minorHAnsi" w:hAnsi="Times New Roman" w:cs="Times New Roman"/>
+          <w:sz w:val="24"/>
+          <w:szCs w:val="24"/>
+        </w:rPr>
+        <w:t>informations_absentes</w:t>
+      </w:r>
+      <w:proofErr w:type="spellEnd"/>
+      <w:proofErr w:type="gramStart"/>
+      <w:r>
+        <w:rPr>
+          <w:rStyle w:val="CodeHTML"/>
+          <w:rFonts w:ascii="Times New Roman" w:eastAsiaTheme="minorHAnsi" w:hAnsi="Times New Roman" w:cs="Times New Roman"/>
+          <w:sz w:val="24"/>
+          <w:szCs w:val="24"/>
+        </w:rPr>
+        <w:t>":</w:t>
+      </w:r>
+      <w:proofErr w:type="gramEnd"/>
+      <w:r>
+        <w:rPr>
+          <w:rStyle w:val="CodeHTML"/>
+          <w:rFonts w:ascii="Times New Roman" w:eastAsiaTheme="minorHAnsi" w:hAnsi="Times New Roman" w:cs="Times New Roman"/>
+          <w:sz w:val="24"/>
+          <w:szCs w:val="24"/>
+        </w:rPr>
+        <w:t xml:space="preserve"> [...],</w:t>
+      </w:r>
+    </w:p>
+    <w:p>
+      <w:pPr>
+        <w:rPr>
+          <w:rStyle w:val="CodeHTML"/>
+          <w:rFonts w:ascii="Times New Roman" w:eastAsiaTheme="minorHAnsi" w:hAnsi="Times New Roman" w:cs="Times New Roman"/>
+          <w:sz w:val="24"/>
+          <w:szCs w:val="24"/>
+        </w:rPr>
+      </w:pPr>
+      <w:r>
+        <w:rPr>
+          <w:rStyle w:val="CodeHTML"/>
+          <w:rFonts w:ascii="Times New Roman" w:eastAsiaTheme="minorHAnsi" w:hAnsi="Times New Roman" w:cs="Times New Roman"/>
+          <w:sz w:val="24"/>
+          <w:szCs w:val="24"/>
+        </w:rPr>
+        <w:t xml:space="preserve">  "hallucinations</w:t>
+      </w:r>
+      <w:proofErr w:type="gramStart"/>
+      <w:r>
+        <w:rPr>
+          <w:rStyle w:val="CodeHTML"/>
+          <w:rFonts w:ascii="Times New Roman" w:eastAsiaTheme="minorHAnsi" w:hAnsi="Times New Roman" w:cs="Times New Roman"/>
+          <w:sz w:val="24"/>
+          <w:szCs w:val="24"/>
+        </w:rPr>
+        <w:t>":</w:t>
+      </w:r>
+      <w:proofErr w:type="gramEnd"/>
+      <w:r>
+        <w:rPr>
+          <w:rStyle w:val="CodeHTML"/>
+          <w:rFonts w:ascii="Times New Roman" w:eastAsiaTheme="minorHAnsi" w:hAnsi="Times New Roman" w:cs="Times New Roman"/>
+          <w:sz w:val="24"/>
+          <w:szCs w:val="24"/>
+        </w:rPr>
+        <w:t xml:space="preserve"> [...],</w:t>
+      </w:r>
+    </w:p>
+    <w:p>
+      <w:pPr>
+        <w:rPr>
+          <w:rStyle w:val="CodeHTML"/>
+          <w:rFonts w:ascii="Times New Roman" w:eastAsiaTheme="minorHAnsi" w:hAnsi="Times New Roman" w:cs="Times New Roman"/>
+          <w:sz w:val="24"/>
+          <w:szCs w:val="24"/>
+        </w:rPr>
+      </w:pPr>
+      <w:r>
+        <w:rPr>
+          <w:rStyle w:val="CodeHTML"/>
+          <w:rFonts w:ascii="Times New Roman" w:eastAsiaTheme="minorHAnsi" w:hAnsi="Times New Roman" w:cs="Times New Roman"/>
+          <w:sz w:val="24"/>
+          <w:szCs w:val="24"/>
+        </w:rPr>
+        <w:t xml:space="preserve">  "</w:t>
+      </w:r>
+      <w:proofErr w:type="spellStart"/>
+      <w:r>
+        <w:rPr>
+          <w:rStyle w:val="CodeHTML"/>
+          <w:rFonts w:ascii="Times New Roman" w:eastAsiaTheme="minorHAnsi" w:hAnsi="Times New Roman" w:cs="Times New Roman"/>
+          <w:sz w:val="24"/>
+          <w:szCs w:val="24"/>
+        </w:rPr>
+        <w:t>contraintes_respectees</w:t>
+      </w:r>
+      <w:proofErr w:type="spellEnd"/>
+      <w:proofErr w:type="gramStart"/>
+      <w:r>
+        <w:rPr>
+          <w:rStyle w:val="CodeHTML"/>
+          <w:rFonts w:ascii="Times New Roman" w:eastAsiaTheme="minorHAnsi" w:hAnsi="Times New Roman" w:cs="Times New Roman"/>
+          <w:sz w:val="24"/>
+          <w:szCs w:val="24"/>
+        </w:rPr>
+        <w:t>":</w:t>
+      </w:r>
+      <w:proofErr w:type="gramEnd"/>
+      <w:r>
+        <w:rPr>
+          <w:rStyle w:val="CodeHTML"/>
+          <w:rFonts w:ascii="Times New Roman" w:eastAsiaTheme="minorHAnsi" w:hAnsi="Times New Roman" w:cs="Times New Roman"/>
+          <w:sz w:val="24"/>
+          <w:szCs w:val="24"/>
+        </w:rPr>
+        <w:t xml:space="preserve"> </w:t>
+      </w:r>
+      <w:proofErr w:type="spellStart"/>
+      <w:r>
+        <w:rPr>
+          <w:rStyle w:val="CodeHTML"/>
+          <w:rFonts w:ascii="Times New Roman" w:eastAsiaTheme="minorHAnsi" w:hAnsi="Times New Roman" w:cs="Times New Roman"/>
+          <w:sz w:val="24"/>
+          <w:szCs w:val="24"/>
+        </w:rPr>
+        <w:t>true</w:t>
+      </w:r>
+      <w:proofErr w:type="spellEnd"/>
+      <w:r>
+        <w:rPr>
+          <w:rStyle w:val="CodeHTML"/>
+          <w:rFonts w:ascii="Times New Roman" w:eastAsiaTheme="minorHAnsi" w:hAnsi="Times New Roman" w:cs="Times New Roman"/>
+          <w:sz w:val="24"/>
+          <w:szCs w:val="24"/>
+        </w:rPr>
+        <w:t>/false,</w:t>
+      </w:r>
+    </w:p>
+    <w:p>
+      <w:pPr>
+        <w:rPr>
+          <w:rStyle w:val="CodeHTML"/>
+          <w:rFonts w:ascii="Times New Roman" w:eastAsiaTheme="minorHAnsi" w:hAnsi="Times New Roman" w:cs="Times New Roman"/>
+          <w:sz w:val="24"/>
+          <w:szCs w:val="24"/>
+        </w:rPr>
+      </w:pPr>
+      <w:r>
+        <w:rPr>
+          <w:rStyle w:val="CodeHTML"/>
+          <w:rFonts w:ascii="Times New Roman" w:eastAsiaTheme="minorHAnsi" w:hAnsi="Times New Roman" w:cs="Times New Roman"/>
+          <w:sz w:val="24"/>
+          <w:szCs w:val="24"/>
+        </w:rPr>
+        <w:t xml:space="preserve">  "</w:t>
+      </w:r>
+      <w:proofErr w:type="spellStart"/>
+      <w:r>
+        <w:rPr>
+          <w:rStyle w:val="CodeHTML"/>
+          <w:rFonts w:ascii="Times New Roman" w:eastAsiaTheme="minorHAnsi" w:hAnsi="Times New Roman" w:cs="Times New Roman"/>
+          <w:sz w:val="24"/>
+          <w:szCs w:val="24"/>
+        </w:rPr>
+        <w:t>verdict_global</w:t>
+      </w:r>
+      <w:proofErr w:type="spellEnd"/>
+      <w:proofErr w:type="gramStart"/>
+      <w:r>
+        <w:rPr>
+          <w:rStyle w:val="CodeHTML"/>
+          <w:rFonts w:ascii="Times New Roman" w:eastAsiaTheme="minorHAnsi" w:hAnsi="Times New Roman" w:cs="Times New Roman"/>
+          <w:sz w:val="24"/>
+          <w:szCs w:val="24"/>
+        </w:rPr>
+        <w:t>":</w:t>
+      </w:r>
+      <w:proofErr w:type="gramEnd"/>
+      <w:r>
+        <w:rPr>
+          <w:rStyle w:val="CodeHTML"/>
+          <w:rFonts w:ascii="Times New Roman" w:eastAsiaTheme="minorHAnsi" w:hAnsi="Times New Roman" w:cs="Times New Roman"/>
+          <w:sz w:val="24"/>
+          <w:szCs w:val="24"/>
+        </w:rPr>
+        <w:t xml:space="preserve"> "..."</w:t>
+      </w:r>
+    </w:p>
+    <w:p>
+      <w:pPr>
+        <w:rPr>
+          <w:rStyle w:val="CodeHTML"/>
+          <w:rFonts w:ascii="Times New Roman" w:eastAsiaTheme="minorHAnsi" w:hAnsi="Times New Roman" w:cs="Times New Roman"/>
+          <w:sz w:val="24"/>
+          <w:szCs w:val="24"/>
+        </w:rPr>
+      </w:pPr>
+      <w:r>
+        <w:rPr>
+          <w:rStyle w:val="CodeHTML"/>
+          <w:rFonts w:ascii="Times New Roman" w:eastAsiaTheme="minorHAnsi" w:hAnsi="Times New Roman" w:cs="Times New Roman"/>
+          <w:sz w:val="24"/>
+          <w:szCs w:val="24"/>
+        </w:rPr>
+        <w:t>}</w:t>
+      </w:r>
+    </w:p>
+    <w:p>
+      <w:pPr>
+        <w:rPr>
+          <w:rStyle w:val="CodeHTML"/>
+          <w:rFonts w:ascii="Times New Roman" w:eastAsiaTheme="minorHAnsi" w:hAnsi="Times New Roman" w:cs="Times New Roman"/>
+          <w:sz w:val="24"/>
+          <w:szCs w:val="24"/>
+        </w:rPr>
+      </w:pPr>
+    </w:p>
+    <w:p>
+      <w:pPr>
+        <w:rPr>
+          <w:rStyle w:val="CodeHTML"/>
+          <w:rFonts w:ascii="Times New Roman" w:eastAsiaTheme="minorHAnsi" w:hAnsi="Times New Roman" w:cs="Times New Roman"/>
+          <w:b/>
+          <w:bCs/>
+          <w:sz w:val="24"/>
+          <w:szCs w:val="24"/>
+        </w:rPr>
+      </w:pPr>
+      <w:r>
+        <w:rPr>
+          <w:rStyle w:val="CodeHTML"/>
+          <w:rFonts w:ascii="Times New Roman" w:eastAsiaTheme="minorHAnsi" w:hAnsi="Times New Roman" w:cs="Times New Roman"/>
+          <w:b/>
+          <w:bCs/>
+          <w:sz w:val="24"/>
+          <w:szCs w:val="24"/>
+        </w:rPr>
+        <w:t>Résultat</w:t>
+      </w:r>
+      <w:r>
+        <w:rPr>
+          <w:rStyle w:val="CodeHTML"/>
+          <w:rFonts w:ascii="Times New Roman" w:eastAsiaTheme="minorHAnsi" w:hAnsi="Times New Roman" w:cs="Times New Roman"/>
+          <w:b/>
+          <w:bCs/>
+          <w:sz w:val="24"/>
+          <w:szCs w:val="24"/>
+        </w:rPr>
+        <w:t xml:space="preserve"> : </w:t>
+      </w:r>
+    </w:p>
+    <w:p>
+      <w:pPr>
+        <w:rPr>
+          <w:rFonts w:ascii="Times New Roman" w:hAnsi="Times New Roman" w:cs="Times New Roman"/>
+          <w:b/>
+          <w:bCs/>
+          <w:sz w:val="24"/>
+          <w:szCs w:val="24"/>
+        </w:rPr>
+      </w:pPr>
+      <w:r>
+        <w:rPr>
+          <w:rFonts w:ascii="Times New Roman" w:hAnsi="Times New Roman" w:cs="Times New Roman"/>
+          <w:b/>
+          <w:bCs/>
+          <w:sz w:val="24"/>
+          <w:szCs w:val="24"/>
+        </w:rPr>
+        <w:drawing>
+          <wp:inline distT="0" distB="0" distL="0" distR="0" wp14:anchorId="4DD2B101" wp14:editId="7A170BD3">
+            <wp:extent cx="5759450" cy="2115185"/>
+            <wp:effectExtent l="0" t="0" r="0" b="0"/>
+            <wp:docPr id="13" name="Image 13"/>
+            <wp:cNvGraphicFramePr>
+              <a:graphicFrameLocks xmlns:a="http://schemas.openxmlformats.org/drawingml/2006/main" noChangeAspect="1"/>
+            </wp:cNvGraphicFramePr>
+            <a:graphic xmlns:a="http://schemas.openxmlformats.org/drawingml/2006/main">
+              <a:graphicData uri="http://schemas.openxmlformats.org/drawingml/2006/picture">
+                <pic:pic xmlns:pic="http://schemas.openxmlformats.org/drawingml/2006/picture">
+                  <pic:nvPicPr>
+                    <pic:cNvPr id="1" name=""/>
+                    <pic:cNvPicPr/>
+                  </pic:nvPicPr>
+                  <pic:blipFill>
+                    <a:blip r:embed="rId17"/>
+                    <a:stretch>
+                      <a:fillRect/>
+                    </a:stretch>
+                  </pic:blipFill>
+                  <pic:spPr>
+                    <a:xfrm>
+                      <a:off x="0" y="0"/>
+                      <a:ext cx="5759450" cy="2115185"/>
+                    </a:xfrm>
+                    <a:prstGeom prst="rect">
+                      <a:avLst/>
+                    </a:prstGeom>
+                  </pic:spPr>
+                </pic:pic>
+              </a:graphicData>
+            </a:graphic>
+          </wp:inline>
+        </w:drawing>
+      </w:r>
+    </w:p>
+    <w:p>
+      <w:pPr>
+        <w:rPr>
+          <w:rFonts w:ascii="Times New Roman" w:hAnsi="Times New Roman" w:cs="Times New Roman"/>
+          <w:sz w:val="24"/>
+          <w:szCs w:val="24"/>
+        </w:rPr>
+      </w:pPr>
+    </w:p>
+    <w:p>
+      <w:pPr>
+        <w:pStyle w:val="PrformatHTML"/>
+        <w:rPr>
+          <w:rFonts w:ascii="Times New Roman" w:hAnsi="Times New Roman" w:cs="Times New Roman"/>
+          <w:sz w:val="24"/>
+          <w:szCs w:val="24"/>
+        </w:rPr>
+      </w:pPr>
+    </w:p>
     <w:sectPr>
       <w:pgSz w:w="11906" w:h="16838"/>
       <w:pgMar w:top="1418" w:right="1418" w:bottom="1418" w:left="1418" w:header="709" w:footer="709" w:gutter="0"/>
@@ -3098,6 +4389,205 @@
 <file path=word/numbering.xml><?xml version="1.0" encoding="utf-8"?>
 <w:numbering xmlns:wpc="http://schemas.microsoft.com/office/word/2010/wordprocessingCanvas" xmlns:cx="http://schemas.microsoft.com/office/drawing/2014/chartex" xmlns:cx1="http://schemas.microsoft.com/office/drawing/2015/9/8/chartex" xmlns:cx2="http://schemas.microsoft.com/office/drawing/2015/10/21/chartex" xmlns:cx3="http://schemas.microsoft.com/office/drawing/2016/5/9/chartex" xmlns:cx4="http://schemas.microsoft.com/office/drawing/2016/5/10/chartex" xmlns:cx5="http://schemas.microsoft.com/office/drawing/2016/5/11/chartex" xmlns:cx6="http://schemas.microsoft.com/office/drawing/2016/5/12/chartex" xmlns:cx7="http://schemas.microsoft.com/office/drawing/2016/5/13/chartex" xmlns:cx8="http://schemas.microsoft.com/office/drawing/2016/5/14/chartex" xmlns:mc="http://schemas.openxmlformats.org/markup-compatibility/2006" xmlns:aink="http://schemas.microsoft.com/office/drawing/2016/ink" xmlns:am3d="http://schemas.microsoft.com/office/drawing/2017/model3d" xmlns:o="urn:schemas-microsoft-com:office:office" xmlns:r="http://schemas.openxmlformats.org/officeDocument/2006/relationships" xmlns:m="http://schemas.openxmlformats.org/officeDocument/2006/math" xmlns:v="urn:schemas-microsoft-com:vml" xmlns:wp14="http://schemas.microsoft.com/office/word/2010/wordprocessingDrawing" xmlns:wp="http://schemas.openxmlformats.org/drawingml/2006/wordprocessingDrawing" xmlns:w10="urn:schemas-microsoft-com:office:word" xmlns:w="http://schemas.openxmlformats.org/wordprocessingml/2006/main" xmlns:w14="http://schemas.microsoft.com/office/word/2010/wordml" xmlns:w15="http://schemas.microsoft.com/office/word/2012/wordml" xmlns:w16cex="http://schemas.microsoft.com/office/word/2018/wordml/cex" xmlns:w16cid="http://schemas.microsoft.com/office/word/2016/wordml/cid" xmlns:w16="http://schemas.microsoft.com/office/word/2018/wordml" xmlns:w16sdtdh="http://schemas.microsoft.com/office/word/2020/wordml/sdtdatahash" xmlns:w16se="http://schemas.microsoft.com/office/word/2015/wordml/symex" xmlns:wpg="http://schemas.microsoft.com/office/word/2010/wordprocessingGroup" xmlns:wpi="http://schemas.microsoft.com/office/word/2010/wordprocessingInk" xmlns:wne="http://schemas.microsoft.com/office/word/2006/wordml" xmlns:wps="http://schemas.microsoft.com/office/word/2010/wordprocessingShape" mc:Ignorable="w14 w15 w16se w16cid w16 w16cex w16sdtdh wp14">
   <w:abstractNum w:abstractNumId="0" w15:restartNumberingAfterBreak="0">
+    <w:nsid w:val="04FF5F91"/>
+    <w:multiLevelType w:val="hybridMultilevel"/>
+    <w:tmpl w:val="42507AA4"/>
+    <w:lvl w:ilvl="0" w:tplc="040C0011">
+      <w:start w:val="1"/>
+      <w:numFmt w:val="decimal"/>
+      <w:lvlText w:val="%1)"/>
+      <w:lvlJc w:val="left"/>
+      <w:pPr>
+        <w:ind w:left="720" w:hanging="360"/>
+      </w:pPr>
+    </w:lvl>
+    <w:lvl w:ilvl="1" w:tplc="040C0019" w:tentative="1">
+      <w:start w:val="1"/>
+      <w:numFmt w:val="lowerLetter"/>
+      <w:lvlText w:val="%2."/>
+      <w:lvlJc w:val="left"/>
+      <w:pPr>
+        <w:ind w:left="1440" w:hanging="360"/>
+      </w:pPr>
+    </w:lvl>
+    <w:lvl w:ilvl="2" w:tplc="040C001B" w:tentative="1">
+      <w:start w:val="1"/>
+      <w:numFmt w:val="lowerRoman"/>
+      <w:lvlText w:val="%3."/>
+      <w:lvlJc w:val="right"/>
+      <w:pPr>
+        <w:ind w:left="2160" w:hanging="180"/>
+      </w:pPr>
+    </w:lvl>
+    <w:lvl w:ilvl="3" w:tplc="040C000F" w:tentative="1">
+      <w:start w:val="1"/>
+      <w:numFmt w:val="decimal"/>
+      <w:lvlText w:val="%4."/>
+      <w:lvlJc w:val="left"/>
+      <w:pPr>
+        <w:ind w:left="2880" w:hanging="360"/>
+      </w:pPr>
+    </w:lvl>
+    <w:lvl w:ilvl="4" w:tplc="040C0019" w:tentative="1">
+      <w:start w:val="1"/>
+      <w:numFmt w:val="lowerLetter"/>
+      <w:lvlText w:val="%5."/>
+      <w:lvlJc w:val="left"/>
+      <w:pPr>
+        <w:ind w:left="3600" w:hanging="360"/>
+      </w:pPr>
+    </w:lvl>
+    <w:lvl w:ilvl="5" w:tplc="040C001B" w:tentative="1">
+      <w:start w:val="1"/>
+      <w:numFmt w:val="lowerRoman"/>
+      <w:lvlText w:val="%6."/>
+      <w:lvlJc w:val="right"/>
+      <w:pPr>
+        <w:ind w:left="4320" w:hanging="180"/>
+      </w:pPr>
+    </w:lvl>
+    <w:lvl w:ilvl="6" w:tplc="040C000F" w:tentative="1">
+      <w:start w:val="1"/>
+      <w:numFmt w:val="decimal"/>
+      <w:lvlText w:val="%7."/>
+      <w:lvlJc w:val="left"/>
+      <w:pPr>
+        <w:ind w:left="5040" w:hanging="360"/>
+      </w:pPr>
+    </w:lvl>
+    <w:lvl w:ilvl="7" w:tplc="040C0019" w:tentative="1">
+      <w:start w:val="1"/>
+      <w:numFmt w:val="lowerLetter"/>
+      <w:lvlText w:val="%8."/>
+      <w:lvlJc w:val="left"/>
+      <w:pPr>
+        <w:ind w:left="5760" w:hanging="360"/>
+      </w:pPr>
+    </w:lvl>
+    <w:lvl w:ilvl="8" w:tplc="040C001B" w:tentative="1">
+      <w:start w:val="1"/>
+      <w:numFmt w:val="lowerRoman"/>
+      <w:lvlText w:val="%9."/>
+      <w:lvlJc w:val="right"/>
+      <w:pPr>
+        <w:ind w:left="6480" w:hanging="180"/>
+      </w:pPr>
+    </w:lvl>
+  </w:abstractNum>
+  <w:abstractNum w:abstractNumId="1" w15:restartNumberingAfterBreak="0">
+    <w:nsid w:val="051945AE"/>
+    <w:multiLevelType w:val="hybridMultilevel"/>
+    <w:tmpl w:val="B830B332"/>
+    <w:lvl w:ilvl="0" w:tplc="040C000B">
+      <w:start w:val="1"/>
+      <w:numFmt w:val="bullet"/>
+      <w:lvlText w:val=""/>
+      <w:lvlJc w:val="left"/>
+      <w:pPr>
+        <w:ind w:left="720" w:hanging="360"/>
+      </w:pPr>
+      <w:rPr>
+        <w:rFonts w:ascii="Wingdings" w:hAnsi="Wingdings" w:hint="default"/>
+      </w:rPr>
+    </w:lvl>
+    <w:lvl w:ilvl="1" w:tplc="040C0003" w:tentative="1">
+      <w:start w:val="1"/>
+      <w:numFmt w:val="bullet"/>
+      <w:lvlText w:val="o"/>
+      <w:lvlJc w:val="left"/>
+      <w:pPr>
+        <w:ind w:left="1440" w:hanging="360"/>
+      </w:pPr>
+      <w:rPr>
+        <w:rFonts w:ascii="Courier New" w:hAnsi="Courier New" w:cs="Courier New" w:hint="default"/>
+      </w:rPr>
+    </w:lvl>
+    <w:lvl w:ilvl="2" w:tplc="040C0005" w:tentative="1">
+      <w:start w:val="1"/>
+      <w:numFmt w:val="bullet"/>
+      <w:lvlText w:val=""/>
+      <w:lvlJc w:val="left"/>
+      <w:pPr>
+        <w:ind w:left="2160" w:hanging="360"/>
+      </w:pPr>
+      <w:rPr>
+        <w:rFonts w:ascii="Wingdings" w:hAnsi="Wingdings" w:hint="default"/>
+      </w:rPr>
+    </w:lvl>
+    <w:lvl w:ilvl="3" w:tplc="040C0001" w:tentative="1">
+      <w:start w:val="1"/>
+      <w:numFmt w:val="bullet"/>
+      <w:lvlText w:val=""/>
+      <w:lvlJc w:val="left"/>
+      <w:pPr>
+        <w:ind w:left="2880" w:hanging="360"/>
+      </w:pPr>
+      <w:rPr>
+        <w:rFonts w:ascii="Symbol" w:hAnsi="Symbol" w:hint="default"/>
+      </w:rPr>
+    </w:lvl>
+    <w:lvl w:ilvl="4" w:tplc="040C0003" w:tentative="1">
+      <w:start w:val="1"/>
+      <w:numFmt w:val="bullet"/>
+      <w:lvlText w:val="o"/>
+      <w:lvlJc w:val="left"/>
+      <w:pPr>
+        <w:ind w:left="3600" w:hanging="360"/>
+      </w:pPr>
+      <w:rPr>
+        <w:rFonts w:ascii="Courier New" w:hAnsi="Courier New" w:cs="Courier New" w:hint="default"/>
+      </w:rPr>
+    </w:lvl>
+    <w:lvl w:ilvl="5" w:tplc="040C0005" w:tentative="1">
+      <w:start w:val="1"/>
+      <w:numFmt w:val="bullet"/>
+      <w:lvlText w:val=""/>
+      <w:lvlJc w:val="left"/>
+      <w:pPr>
+        <w:ind w:left="4320" w:hanging="360"/>
+      </w:pPr>
+      <w:rPr>
+        <w:rFonts w:ascii="Wingdings" w:hAnsi="Wingdings" w:hint="default"/>
+      </w:rPr>
+    </w:lvl>
+    <w:lvl w:ilvl="6" w:tplc="040C0001" w:tentative="1">
+      <w:start w:val="1"/>
+      <w:numFmt w:val="bullet"/>
+      <w:lvlText w:val=""/>
+      <w:lvlJc w:val="left"/>
+      <w:pPr>
+        <w:ind w:left="5040" w:hanging="360"/>
+      </w:pPr>
+      <w:rPr>
+        <w:rFonts w:ascii="Symbol" w:hAnsi="Symbol" w:hint="default"/>
+      </w:rPr>
+    </w:lvl>
+    <w:lvl w:ilvl="7" w:tplc="040C0003" w:tentative="1">
+      <w:start w:val="1"/>
+      <w:numFmt w:val="bullet"/>
+      <w:lvlText w:val="o"/>
+      <w:lvlJc w:val="left"/>
+      <w:pPr>
+        <w:ind w:left="5760" w:hanging="360"/>
+      </w:pPr>
+      <w:rPr>
+        <w:rFonts w:ascii="Courier New" w:hAnsi="Courier New" w:cs="Courier New" w:hint="default"/>
+      </w:rPr>
+    </w:lvl>
+    <w:lvl w:ilvl="8" w:tplc="040C0005" w:tentative="1">
+      <w:start w:val="1"/>
+      <w:numFmt w:val="bullet"/>
+      <w:lvlText w:val=""/>
+      <w:lvlJc w:val="left"/>
+      <w:pPr>
+        <w:ind w:left="6480" w:hanging="360"/>
+      </w:pPr>
+      <w:rPr>
+        <w:rFonts w:ascii="Wingdings" w:hAnsi="Wingdings" w:hint="default"/>
+      </w:rPr>
+    </w:lvl>
+  </w:abstractNum>
+  <w:abstractNum w:abstractNumId="2" w15:restartNumberingAfterBreak="0">
     <w:nsid w:val="08A5551D"/>
     <w:multiLevelType w:val="hybridMultilevel"/>
     <w:tmpl w:val="F084B34A"/>
@@ -3210,7 +4700,7 @@
       </w:rPr>
     </w:lvl>
   </w:abstractNum>
-  <w:abstractNum w:abstractNumId="1" w15:restartNumberingAfterBreak="0">
+  <w:abstractNum w:abstractNumId="3" w15:restartNumberingAfterBreak="0">
     <w:nsid w:val="19B73A6C"/>
     <w:multiLevelType w:val="hybridMultilevel"/>
     <w:tmpl w:val="0244483A"/>
@@ -3296,7 +4786,7 @@
       </w:pPr>
     </w:lvl>
   </w:abstractNum>
-  <w:abstractNum w:abstractNumId="2" w15:restartNumberingAfterBreak="0">
+  <w:abstractNum w:abstractNumId="4" w15:restartNumberingAfterBreak="0">
     <w:nsid w:val="2DE869EE"/>
     <w:multiLevelType w:val="hybridMultilevel"/>
     <w:tmpl w:val="4E94F688"/>
@@ -3382,7 +4872,7 @@
       </w:pPr>
     </w:lvl>
   </w:abstractNum>
-  <w:abstractNum w:abstractNumId="3" w15:restartNumberingAfterBreak="0">
+  <w:abstractNum w:abstractNumId="5" w15:restartNumberingAfterBreak="0">
     <w:nsid w:val="32BC2236"/>
     <w:multiLevelType w:val="hybridMultilevel"/>
     <w:tmpl w:val="30F47246"/>
@@ -3468,7 +4958,7 @@
       </w:pPr>
     </w:lvl>
   </w:abstractNum>
-  <w:abstractNum w:abstractNumId="4" w15:restartNumberingAfterBreak="0">
+  <w:abstractNum w:abstractNumId="6" w15:restartNumberingAfterBreak="0">
     <w:nsid w:val="5E0B23B2"/>
     <w:multiLevelType w:val="hybridMultilevel"/>
     <w:tmpl w:val="42507AA4"/>
@@ -3554,7 +5044,7 @@
       </w:pPr>
     </w:lvl>
   </w:abstractNum>
-  <w:abstractNum w:abstractNumId="5" w15:restartNumberingAfterBreak="0">
+  <w:abstractNum w:abstractNumId="7" w15:restartNumberingAfterBreak="0">
     <w:nsid w:val="7EC51315"/>
     <w:multiLevelType w:val="hybridMultilevel"/>
     <w:tmpl w:val="7952CE38"/>
@@ -3644,22 +5134,28 @@
     </w:lvl>
   </w:abstractNum>
   <w:num w:numId="1">
+    <w:abstractNumId w:val="2"/>
+  </w:num>
+  <w:num w:numId="2">
+    <w:abstractNumId w:val="5"/>
+  </w:num>
+  <w:num w:numId="3">
+    <w:abstractNumId w:val="4"/>
+  </w:num>
+  <w:num w:numId="4">
+    <w:abstractNumId w:val="7"/>
+  </w:num>
+  <w:num w:numId="5">
+    <w:abstractNumId w:val="3"/>
+  </w:num>
+  <w:num w:numId="6">
+    <w:abstractNumId w:val="6"/>
+  </w:num>
+  <w:num w:numId="7">
     <w:abstractNumId w:val="0"/>
   </w:num>
-  <w:num w:numId="2">
-    <w:abstractNumId w:val="3"/>
-  </w:num>
-  <w:num w:numId="3">
-    <w:abstractNumId w:val="2"/>
-  </w:num>
-  <w:num w:numId="4">
-    <w:abstractNumId w:val="5"/>
-  </w:num>
-  <w:num w:numId="5">
+  <w:num w:numId="8">
     <w:abstractNumId w:val="1"/>
-  </w:num>
-  <w:num w:numId="6">
-    <w:abstractNumId w:val="4"/>
   </w:num>
 </w:numbering>
 </file>
@@ -4304,6 +5800,20 @@
       <w:szCs w:val="24"/>
     </w:rPr>
   </w:style>
+  <w:style w:type="paragraph" w:customStyle="1" w:styleId="pdq2pgselectionanchorcontainer">
+    <w:name w:val="pdq2pg_selectionanchorcontainer"/>
+    <w:basedOn w:val="Normal"/>
+    <w:rsid w:val="00E716FF"/>
+    <w:pPr>
+      <w:spacing w:before="100" w:beforeAutospacing="1" w:after="100" w:afterAutospacing="1" w:line="240" w:lineRule="auto"/>
+    </w:pPr>
+    <w:rPr>
+      <w:rFonts w:ascii="Times New Roman" w:eastAsia="Times New Roman" w:hAnsi="Times New Roman" w:cs="Times New Roman"/>
+      <w:sz w:val="24"/>
+      <w:szCs w:val="24"/>
+      <w:lang w:eastAsia="fr-FR"/>
+    </w:rPr>
+  </w:style>
 </w:styles>
 </file>
 

</xml_diff>

<commit_message>
Partie 4 question 1
</commit_message>
<xml_diff>
--- a/ai-business_assistant.docx
+++ b/ai-business_assistant.docx
@@ -4368,9 +4368,880 @@
     </w:p>
     <w:p>
       <w:pPr>
-        <w:pStyle w:val="PrformatHTML"/>
-        <w:rPr>
-          <w:rFonts w:ascii="Times New Roman" w:hAnsi="Times New Roman" w:cs="Times New Roman"/>
+        <w:rPr>
+          <w:rFonts w:ascii="Times New Roman" w:hAnsi="Times New Roman" w:cs="Times New Roman"/>
+          <w:sz w:val="36"/>
+          <w:szCs w:val="36"/>
+        </w:rPr>
+      </w:pPr>
+      <w:r>
+        <w:rPr>
+          <w:rFonts w:ascii="Times New Roman" w:hAnsi="Times New Roman" w:cs="Times New Roman"/>
+          <w:sz w:val="36"/>
+          <w:szCs w:val="36"/>
+        </w:rPr>
+        <w:lastRenderedPageBreak/>
+        <w:t>Partie 4</w:t>
+      </w:r>
+      <w:r>
+        <w:rPr>
+          <w:rFonts w:ascii="Times New Roman" w:hAnsi="Times New Roman" w:cs="Times New Roman"/>
+          <w:sz w:val="36"/>
+          <w:szCs w:val="36"/>
+        </w:rPr>
+        <w:t xml:space="preserve"> : </w:t>
+      </w:r>
+      <w:r>
+        <w:rPr>
+          <w:rFonts w:ascii="Times New Roman" w:hAnsi="Times New Roman" w:cs="Times New Roman"/>
+          <w:sz w:val="36"/>
+          <w:szCs w:val="36"/>
+        </w:rPr>
+        <w:t>Sorties structurées</w:t>
+      </w:r>
+    </w:p>
+    <w:p>
+      <w:pPr>
+        <w:autoSpaceDE w:val="0"/>
+        <w:autoSpaceDN w:val="0"/>
+        <w:adjustRightInd w:val="0"/>
+        <w:spacing w:after="0" w:line="240" w:lineRule="auto"/>
+        <w:rPr>
+          <w:rFonts w:ascii="Times New Roman" w:hAnsi="Times New Roman" w:cs="Times New Roman"/>
+          <w:sz w:val="24"/>
+          <w:szCs w:val="24"/>
+        </w:rPr>
+      </w:pPr>
+      <w:r>
+        <w:rPr>
+          <w:rFonts w:ascii="Times New Roman" w:hAnsi="Times New Roman" w:cs="Times New Roman"/>
+          <w:sz w:val="24"/>
+          <w:szCs w:val="24"/>
+        </w:rPr>
+        <w:t>Le LLM retourne :</w:t>
+      </w:r>
+    </w:p>
+    <w:p>
+      <w:pPr>
+        <w:rPr>
+          <w:rFonts w:ascii="Times New Roman" w:hAnsi="Times New Roman" w:cs="Times New Roman"/>
+          <w:sz w:val="24"/>
+          <w:szCs w:val="24"/>
+        </w:rPr>
+      </w:pPr>
+      <w:r>
+        <w:rPr>
+          <w:rFonts w:ascii="Times New Roman" w:hAnsi="Times New Roman" w:cs="Times New Roman"/>
+          <w:sz w:val="24"/>
+          <w:szCs w:val="24"/>
+        </w:rPr>
+        <w:t xml:space="preserve">« Le commentaire semble plutôt négatif. Le client est mécontent du délai de livraison... </w:t>
+      </w:r>
+    </w:p>
+    <w:p>
+      <w:pPr>
+        <w:rPr>
+          <w:rFonts w:ascii="Times New Roman" w:hAnsi="Times New Roman" w:cs="Times New Roman"/>
+          <w:b/>
+          <w:bCs/>
+          <w:sz w:val="28"/>
+          <w:szCs w:val="28"/>
+        </w:rPr>
+      </w:pPr>
+      <w:r>
+        <w:rPr>
+          <w:rFonts w:ascii="Times New Roman" w:hAnsi="Times New Roman" w:cs="Times New Roman"/>
+          <w:b/>
+          <w:bCs/>
+          <w:sz w:val="28"/>
+          <w:szCs w:val="28"/>
+        </w:rPr>
+        <w:t>Prompt</w:t>
+      </w:r>
+    </w:p>
+    <w:p>
+      <w:pPr>
+        <w:spacing w:after="0"/>
+        <w:rPr>
+          <w:rFonts w:ascii="Times New Roman" w:hAnsi="Times New Roman" w:cs="Times New Roman"/>
+          <w:sz w:val="24"/>
+          <w:szCs w:val="24"/>
+        </w:rPr>
+      </w:pPr>
+      <w:r>
+        <w:rPr>
+          <w:rFonts w:ascii="Times New Roman" w:hAnsi="Times New Roman" w:cs="Times New Roman"/>
+          <w:sz w:val="24"/>
+          <w:szCs w:val="24"/>
+        </w:rPr>
+        <w:t>Tu</w:t>
+      </w:r>
+      <w:r>
+        <w:rPr>
+          <w:rFonts w:ascii="Times New Roman" w:hAnsi="Times New Roman" w:cs="Times New Roman"/>
+          <w:sz w:val="24"/>
+          <w:szCs w:val="24"/>
+        </w:rPr>
+        <w:t xml:space="preserve"> es un système d'analyse de commentaires clients. Analyse le commentaire fourni</w:t>
+      </w:r>
+      <w:r>
+        <w:rPr>
+          <w:rFonts w:ascii="Times New Roman" w:hAnsi="Times New Roman" w:cs="Times New Roman"/>
+          <w:sz w:val="24"/>
+          <w:szCs w:val="24"/>
+        </w:rPr>
+        <w:t xml:space="preserve"> </w:t>
+      </w:r>
+      <w:r>
+        <w:rPr>
+          <w:rFonts w:ascii="Times New Roman" w:hAnsi="Times New Roman" w:cs="Times New Roman"/>
+          <w:sz w:val="24"/>
+          <w:szCs w:val="24"/>
+        </w:rPr>
+        <w:t>et retourne UNIQUEMENT un objet JSON valide, sans texte avant ou après, avec</w:t>
+      </w:r>
+      <w:r>
+        <w:rPr>
+          <w:rFonts w:ascii="Times New Roman" w:hAnsi="Times New Roman" w:cs="Times New Roman"/>
+          <w:sz w:val="24"/>
+          <w:szCs w:val="24"/>
+        </w:rPr>
+        <w:t xml:space="preserve"> </w:t>
+      </w:r>
+      <w:r>
+        <w:rPr>
+          <w:rFonts w:ascii="Times New Roman" w:hAnsi="Times New Roman" w:cs="Times New Roman"/>
+          <w:sz w:val="24"/>
+          <w:szCs w:val="24"/>
+        </w:rPr>
+        <w:t>exactement les champs suivants :</w:t>
+      </w:r>
+    </w:p>
+    <w:p>
+      <w:pPr>
+        <w:spacing w:after="0"/>
+        <w:rPr>
+          <w:rFonts w:ascii="Times New Roman" w:hAnsi="Times New Roman" w:cs="Times New Roman"/>
+          <w:sz w:val="24"/>
+          <w:szCs w:val="24"/>
+        </w:rPr>
+      </w:pPr>
+    </w:p>
+    <w:p>
+      <w:pPr>
+        <w:spacing w:after="0"/>
+        <w:rPr>
+          <w:rFonts w:ascii="Times New Roman" w:hAnsi="Times New Roman" w:cs="Times New Roman"/>
+          <w:sz w:val="24"/>
+          <w:szCs w:val="24"/>
+        </w:rPr>
+      </w:pPr>
+      <w:r>
+        <w:rPr>
+          <w:rFonts w:ascii="Times New Roman" w:hAnsi="Times New Roman" w:cs="Times New Roman"/>
+          <w:sz w:val="24"/>
+          <w:szCs w:val="24"/>
+        </w:rPr>
+        <w:t>- "sentiment" (string) : une valeur parmi "positif", "</w:t>
+      </w:r>
+      <w:proofErr w:type="spellStart"/>
+      <w:r>
+        <w:rPr>
+          <w:rFonts w:ascii="Times New Roman" w:hAnsi="Times New Roman" w:cs="Times New Roman"/>
+          <w:sz w:val="24"/>
+          <w:szCs w:val="24"/>
+        </w:rPr>
+        <w:t>negatif</w:t>
+      </w:r>
+      <w:proofErr w:type="spellEnd"/>
+      <w:r>
+        <w:rPr>
+          <w:rFonts w:ascii="Times New Roman" w:hAnsi="Times New Roman" w:cs="Times New Roman"/>
+          <w:sz w:val="24"/>
+          <w:szCs w:val="24"/>
+        </w:rPr>
+        <w:t>", "neutre"</w:t>
+      </w:r>
+    </w:p>
+    <w:p>
+      <w:pPr>
+        <w:spacing w:after="0"/>
+        <w:rPr>
+          <w:rFonts w:ascii="Times New Roman" w:hAnsi="Times New Roman" w:cs="Times New Roman"/>
+          <w:sz w:val="24"/>
+          <w:szCs w:val="24"/>
+        </w:rPr>
+      </w:pPr>
+      <w:r>
+        <w:rPr>
+          <w:rFonts w:ascii="Times New Roman" w:hAnsi="Times New Roman" w:cs="Times New Roman"/>
+          <w:sz w:val="24"/>
+          <w:szCs w:val="24"/>
+        </w:rPr>
+        <w:t>- "</w:t>
+      </w:r>
+      <w:proofErr w:type="spellStart"/>
+      <w:r>
+        <w:rPr>
+          <w:rFonts w:ascii="Times New Roman" w:hAnsi="Times New Roman" w:cs="Times New Roman"/>
+          <w:sz w:val="24"/>
+          <w:szCs w:val="24"/>
+        </w:rPr>
+        <w:t>categorie</w:t>
+      </w:r>
+      <w:proofErr w:type="spellEnd"/>
+      <w:r>
+        <w:rPr>
+          <w:rFonts w:ascii="Times New Roman" w:hAnsi="Times New Roman" w:cs="Times New Roman"/>
+          <w:sz w:val="24"/>
+          <w:szCs w:val="24"/>
+        </w:rPr>
+        <w:t>" (string) : le thème principal du commentaire (ex. "livraison",</w:t>
+      </w:r>
+    </w:p>
+    <w:p>
+      <w:pPr>
+        <w:spacing w:after="0"/>
+        <w:rPr>
+          <w:rFonts w:ascii="Times New Roman" w:hAnsi="Times New Roman" w:cs="Times New Roman"/>
+          <w:sz w:val="24"/>
+          <w:szCs w:val="24"/>
+        </w:rPr>
+      </w:pPr>
+      <w:r>
+        <w:rPr>
+          <w:rFonts w:ascii="Times New Roman" w:hAnsi="Times New Roman" w:cs="Times New Roman"/>
+          <w:sz w:val="24"/>
+          <w:szCs w:val="24"/>
+        </w:rPr>
+        <w:t xml:space="preserve">  "produit", "support", "prix", "application")</w:t>
+      </w:r>
+    </w:p>
+    <w:p>
+      <w:pPr>
+        <w:spacing w:after="0"/>
+        <w:rPr>
+          <w:rFonts w:ascii="Times New Roman" w:hAnsi="Times New Roman" w:cs="Times New Roman"/>
+          <w:sz w:val="24"/>
+          <w:szCs w:val="24"/>
+        </w:rPr>
+      </w:pPr>
+      <w:r>
+        <w:rPr>
+          <w:rFonts w:ascii="Times New Roman" w:hAnsi="Times New Roman" w:cs="Times New Roman"/>
+          <w:sz w:val="24"/>
+          <w:szCs w:val="24"/>
+        </w:rPr>
+        <w:t>- "urgence" (string) : une valeur parmi "faible", "moyenne", "élevée"</w:t>
+      </w:r>
+    </w:p>
+    <w:p>
+      <w:pPr>
+        <w:spacing w:after="0"/>
+        <w:rPr>
+          <w:rFonts w:ascii="Times New Roman" w:hAnsi="Times New Roman" w:cs="Times New Roman"/>
+          <w:sz w:val="24"/>
+          <w:szCs w:val="24"/>
+        </w:rPr>
+      </w:pPr>
+      <w:r>
+        <w:rPr>
+          <w:rFonts w:ascii="Times New Roman" w:hAnsi="Times New Roman" w:cs="Times New Roman"/>
+          <w:sz w:val="24"/>
+          <w:szCs w:val="24"/>
+        </w:rPr>
+        <w:t>- "</w:t>
+      </w:r>
+      <w:proofErr w:type="spellStart"/>
+      <w:r>
+        <w:rPr>
+          <w:rFonts w:ascii="Times New Roman" w:hAnsi="Times New Roman" w:cs="Times New Roman"/>
+          <w:sz w:val="24"/>
+          <w:szCs w:val="24"/>
+        </w:rPr>
+        <w:t>probleme</w:t>
+      </w:r>
+      <w:proofErr w:type="spellEnd"/>
+      <w:r>
+        <w:rPr>
+          <w:rFonts w:ascii="Times New Roman" w:hAnsi="Times New Roman" w:cs="Times New Roman"/>
+          <w:sz w:val="24"/>
+          <w:szCs w:val="24"/>
+        </w:rPr>
+        <w:t>" (string) : description courte et factuelle du problème mentionné</w:t>
+      </w:r>
+    </w:p>
+    <w:p>
+      <w:pPr>
+        <w:spacing w:after="0"/>
+        <w:rPr>
+          <w:rFonts w:ascii="Times New Roman" w:hAnsi="Times New Roman" w:cs="Times New Roman"/>
+          <w:sz w:val="24"/>
+          <w:szCs w:val="24"/>
+        </w:rPr>
+      </w:pPr>
+      <w:r>
+        <w:rPr>
+          <w:rFonts w:ascii="Times New Roman" w:hAnsi="Times New Roman" w:cs="Times New Roman"/>
+          <w:sz w:val="24"/>
+          <w:szCs w:val="24"/>
+        </w:rPr>
+        <w:t xml:space="preserve">  (</w:t>
+      </w:r>
+      <w:proofErr w:type="gramStart"/>
+      <w:r>
+        <w:rPr>
+          <w:rFonts w:ascii="Times New Roman" w:hAnsi="Times New Roman" w:cs="Times New Roman"/>
+          <w:sz w:val="24"/>
+          <w:szCs w:val="24"/>
+        </w:rPr>
+        <w:t>chaîne</w:t>
+      </w:r>
+      <w:proofErr w:type="gramEnd"/>
+      <w:r>
+        <w:rPr>
+          <w:rFonts w:ascii="Times New Roman" w:hAnsi="Times New Roman" w:cs="Times New Roman"/>
+          <w:sz w:val="24"/>
+          <w:szCs w:val="24"/>
+        </w:rPr>
+        <w:t xml:space="preserve"> vide "" si aucun problème)</w:t>
+      </w:r>
+    </w:p>
+    <w:p>
+      <w:pPr>
+        <w:spacing w:after="0"/>
+        <w:rPr>
+          <w:rFonts w:ascii="Times New Roman" w:hAnsi="Times New Roman" w:cs="Times New Roman"/>
+          <w:sz w:val="24"/>
+          <w:szCs w:val="24"/>
+        </w:rPr>
+      </w:pPr>
+      <w:r>
+        <w:rPr>
+          <w:rFonts w:ascii="Times New Roman" w:hAnsi="Times New Roman" w:cs="Times New Roman"/>
+          <w:sz w:val="24"/>
+          <w:szCs w:val="24"/>
+        </w:rPr>
+        <w:t>- "confiance" (</w:t>
+      </w:r>
+      <w:proofErr w:type="spellStart"/>
+      <w:r>
+        <w:rPr>
+          <w:rFonts w:ascii="Times New Roman" w:hAnsi="Times New Roman" w:cs="Times New Roman"/>
+          <w:sz w:val="24"/>
+          <w:szCs w:val="24"/>
+        </w:rPr>
+        <w:t>number</w:t>
+      </w:r>
+      <w:proofErr w:type="spellEnd"/>
+      <w:r>
+        <w:rPr>
+          <w:rFonts w:ascii="Times New Roman" w:hAnsi="Times New Roman" w:cs="Times New Roman"/>
+          <w:sz w:val="24"/>
+          <w:szCs w:val="24"/>
+        </w:rPr>
+        <w:t>) : score entre 0 et 1 représentant ta confiance dans</w:t>
+      </w:r>
+    </w:p>
+    <w:p>
+      <w:pPr>
+        <w:spacing w:after="0"/>
+        <w:rPr>
+          <w:rFonts w:ascii="Times New Roman" w:hAnsi="Times New Roman" w:cs="Times New Roman"/>
+          <w:sz w:val="24"/>
+          <w:szCs w:val="24"/>
+        </w:rPr>
+      </w:pPr>
+      <w:r>
+        <w:rPr>
+          <w:rFonts w:ascii="Times New Roman" w:hAnsi="Times New Roman" w:cs="Times New Roman"/>
+          <w:sz w:val="24"/>
+          <w:szCs w:val="24"/>
+        </w:rPr>
+        <w:t xml:space="preserve">  </w:t>
+      </w:r>
+      <w:proofErr w:type="gramStart"/>
+      <w:r>
+        <w:rPr>
+          <w:rFonts w:ascii="Times New Roman" w:hAnsi="Times New Roman" w:cs="Times New Roman"/>
+          <w:sz w:val="24"/>
+          <w:szCs w:val="24"/>
+        </w:rPr>
+        <w:t>l'analyse</w:t>
+      </w:r>
+      <w:proofErr w:type="gramEnd"/>
+    </w:p>
+    <w:p>
+      <w:pPr>
+        <w:spacing w:after="0"/>
+        <w:rPr>
+          <w:rFonts w:ascii="Times New Roman" w:hAnsi="Times New Roman" w:cs="Times New Roman"/>
+          <w:sz w:val="24"/>
+          <w:szCs w:val="24"/>
+        </w:rPr>
+      </w:pPr>
+    </w:p>
+    <w:p>
+      <w:pPr>
+        <w:spacing w:after="0"/>
+        <w:rPr>
+          <w:rFonts w:ascii="Times New Roman" w:hAnsi="Times New Roman" w:cs="Times New Roman"/>
+          <w:sz w:val="24"/>
+          <w:szCs w:val="24"/>
+        </w:rPr>
+      </w:pPr>
+      <w:r>
+        <w:rPr>
+          <w:rFonts w:ascii="Times New Roman" w:hAnsi="Times New Roman" w:cs="Times New Roman"/>
+          <w:sz w:val="24"/>
+          <w:szCs w:val="24"/>
+        </w:rPr>
+        <w:t>Commentaire à analyser :</w:t>
+      </w:r>
+    </w:p>
+    <w:p>
+      <w:pPr>
+        <w:spacing w:after="0"/>
+        <w:rPr>
+          <w:rFonts w:ascii="Times New Roman" w:hAnsi="Times New Roman" w:cs="Times New Roman"/>
+          <w:sz w:val="24"/>
+          <w:szCs w:val="24"/>
+        </w:rPr>
+      </w:pPr>
+      <w:r>
+        <w:rPr>
+          <w:rFonts w:ascii="Times New Roman" w:hAnsi="Times New Roman" w:cs="Times New Roman"/>
+          <w:sz w:val="24"/>
+          <w:szCs w:val="24"/>
+        </w:rPr>
+        <w:t>"""</w:t>
+      </w:r>
+    </w:p>
+    <w:p>
+      <w:pPr>
+        <w:spacing w:after="0"/>
+        <w:rPr>
+          <w:rFonts w:ascii="Times New Roman" w:hAnsi="Times New Roman" w:cs="Times New Roman"/>
+          <w:sz w:val="24"/>
+          <w:szCs w:val="24"/>
+        </w:rPr>
+      </w:pPr>
+      <w:r>
+        <w:rPr>
+          <w:rFonts w:ascii="Times New Roman" w:hAnsi="Times New Roman" w:cs="Times New Roman"/>
+          <w:sz w:val="24"/>
+          <w:szCs w:val="24"/>
+        </w:rPr>
+        <w:t>Le commentaire semble plutôt négatif. Le client est mécontent du délai de livraison.</w:t>
+      </w:r>
+    </w:p>
+    <w:p>
+      <w:pPr>
+        <w:spacing w:after="0"/>
+        <w:rPr>
+          <w:rFonts w:ascii="Times New Roman" w:hAnsi="Times New Roman" w:cs="Times New Roman"/>
+          <w:sz w:val="24"/>
+          <w:szCs w:val="24"/>
+        </w:rPr>
+      </w:pPr>
+      <w:r>
+        <w:rPr>
+          <w:rFonts w:ascii="Times New Roman" w:hAnsi="Times New Roman" w:cs="Times New Roman"/>
+          <w:sz w:val="24"/>
+          <w:szCs w:val="24"/>
+        </w:rPr>
+        <w:t>"""</w:t>
+      </w:r>
+    </w:p>
+    <w:p>
+      <w:pPr>
+        <w:spacing w:after="0"/>
+        <w:rPr>
+          <w:rFonts w:ascii="Times New Roman" w:hAnsi="Times New Roman" w:cs="Times New Roman"/>
+          <w:sz w:val="24"/>
+          <w:szCs w:val="24"/>
+        </w:rPr>
+      </w:pPr>
+    </w:p>
+    <w:p>
+      <w:pPr>
+        <w:spacing w:after="0"/>
+        <w:rPr>
+          <w:rFonts w:ascii="Times New Roman" w:hAnsi="Times New Roman" w:cs="Times New Roman"/>
+          <w:sz w:val="24"/>
+          <w:szCs w:val="24"/>
+        </w:rPr>
+      </w:pPr>
+      <w:r>
+        <w:rPr>
+          <w:rFonts w:ascii="Times New Roman" w:hAnsi="Times New Roman" w:cs="Times New Roman"/>
+          <w:sz w:val="24"/>
+          <w:szCs w:val="24"/>
+        </w:rPr>
+        <w:t>Exemple de format attendu :</w:t>
+      </w:r>
+    </w:p>
+    <w:p>
+      <w:pPr>
+        <w:spacing w:after="0"/>
+        <w:rPr>
+          <w:rFonts w:ascii="Times New Roman" w:hAnsi="Times New Roman" w:cs="Times New Roman"/>
+          <w:sz w:val="24"/>
+          <w:szCs w:val="24"/>
+        </w:rPr>
+      </w:pPr>
+      <w:r>
+        <w:rPr>
+          <w:rFonts w:ascii="Times New Roman" w:hAnsi="Times New Roman" w:cs="Times New Roman"/>
+          <w:sz w:val="24"/>
+          <w:szCs w:val="24"/>
+        </w:rPr>
+        <w:t>{</w:t>
+      </w:r>
+    </w:p>
+    <w:p>
+      <w:pPr>
+        <w:spacing w:after="0"/>
+        <w:rPr>
+          <w:rFonts w:ascii="Times New Roman" w:hAnsi="Times New Roman" w:cs="Times New Roman"/>
+          <w:sz w:val="24"/>
+          <w:szCs w:val="24"/>
+        </w:rPr>
+      </w:pPr>
+      <w:r>
+        <w:rPr>
+          <w:rFonts w:ascii="Times New Roman" w:hAnsi="Times New Roman" w:cs="Times New Roman"/>
+          <w:sz w:val="24"/>
+          <w:szCs w:val="24"/>
+        </w:rPr>
+        <w:t xml:space="preserve">  "sentiment</w:t>
+      </w:r>
+      <w:proofErr w:type="gramStart"/>
+      <w:r>
+        <w:rPr>
+          <w:rFonts w:ascii="Times New Roman" w:hAnsi="Times New Roman" w:cs="Times New Roman"/>
+          <w:sz w:val="24"/>
+          <w:szCs w:val="24"/>
+        </w:rPr>
+        <w:t>":</w:t>
+      </w:r>
+      <w:proofErr w:type="gramEnd"/>
+      <w:r>
+        <w:rPr>
+          <w:rFonts w:ascii="Times New Roman" w:hAnsi="Times New Roman" w:cs="Times New Roman"/>
+          <w:sz w:val="24"/>
+          <w:szCs w:val="24"/>
+        </w:rPr>
+        <w:t xml:space="preserve"> "</w:t>
+      </w:r>
+      <w:proofErr w:type="spellStart"/>
+      <w:r>
+        <w:rPr>
+          <w:rFonts w:ascii="Times New Roman" w:hAnsi="Times New Roman" w:cs="Times New Roman"/>
+          <w:sz w:val="24"/>
+          <w:szCs w:val="24"/>
+        </w:rPr>
+        <w:t>negatif</w:t>
+      </w:r>
+      <w:proofErr w:type="spellEnd"/>
+      <w:r>
+        <w:rPr>
+          <w:rFonts w:ascii="Times New Roman" w:hAnsi="Times New Roman" w:cs="Times New Roman"/>
+          <w:sz w:val="24"/>
+          <w:szCs w:val="24"/>
+        </w:rPr>
+        <w:t>",</w:t>
+      </w:r>
+    </w:p>
+    <w:p>
+      <w:pPr>
+        <w:spacing w:after="0"/>
+        <w:rPr>
+          <w:rFonts w:ascii="Times New Roman" w:hAnsi="Times New Roman" w:cs="Times New Roman"/>
+          <w:sz w:val="24"/>
+          <w:szCs w:val="24"/>
+        </w:rPr>
+      </w:pPr>
+      <w:r>
+        <w:rPr>
+          <w:rFonts w:ascii="Times New Roman" w:hAnsi="Times New Roman" w:cs="Times New Roman"/>
+          <w:sz w:val="24"/>
+          <w:szCs w:val="24"/>
+        </w:rPr>
+        <w:t xml:space="preserve">  "</w:t>
+      </w:r>
+      <w:proofErr w:type="spellStart"/>
+      <w:r>
+        <w:rPr>
+          <w:rFonts w:ascii="Times New Roman" w:hAnsi="Times New Roman" w:cs="Times New Roman"/>
+          <w:sz w:val="24"/>
+          <w:szCs w:val="24"/>
+        </w:rPr>
+        <w:t>categorie</w:t>
+      </w:r>
+      <w:proofErr w:type="spellEnd"/>
+      <w:proofErr w:type="gramStart"/>
+      <w:r>
+        <w:rPr>
+          <w:rFonts w:ascii="Times New Roman" w:hAnsi="Times New Roman" w:cs="Times New Roman"/>
+          <w:sz w:val="24"/>
+          <w:szCs w:val="24"/>
+        </w:rPr>
+        <w:t>":</w:t>
+      </w:r>
+      <w:proofErr w:type="gramEnd"/>
+      <w:r>
+        <w:rPr>
+          <w:rFonts w:ascii="Times New Roman" w:hAnsi="Times New Roman" w:cs="Times New Roman"/>
+          <w:sz w:val="24"/>
+          <w:szCs w:val="24"/>
+        </w:rPr>
+        <w:t xml:space="preserve"> "livraison",</w:t>
+      </w:r>
+    </w:p>
+    <w:p>
+      <w:pPr>
+        <w:spacing w:after="0"/>
+        <w:rPr>
+          <w:rFonts w:ascii="Times New Roman" w:hAnsi="Times New Roman" w:cs="Times New Roman"/>
+          <w:sz w:val="24"/>
+          <w:szCs w:val="24"/>
+        </w:rPr>
+      </w:pPr>
+      <w:r>
+        <w:rPr>
+          <w:rFonts w:ascii="Times New Roman" w:hAnsi="Times New Roman" w:cs="Times New Roman"/>
+          <w:sz w:val="24"/>
+          <w:szCs w:val="24"/>
+        </w:rPr>
+        <w:t xml:space="preserve">  "urgence</w:t>
+      </w:r>
+      <w:proofErr w:type="gramStart"/>
+      <w:r>
+        <w:rPr>
+          <w:rFonts w:ascii="Times New Roman" w:hAnsi="Times New Roman" w:cs="Times New Roman"/>
+          <w:sz w:val="24"/>
+          <w:szCs w:val="24"/>
+        </w:rPr>
+        <w:t>":</w:t>
+      </w:r>
+      <w:proofErr w:type="gramEnd"/>
+      <w:r>
+        <w:rPr>
+          <w:rFonts w:ascii="Times New Roman" w:hAnsi="Times New Roman" w:cs="Times New Roman"/>
+          <w:sz w:val="24"/>
+          <w:szCs w:val="24"/>
+        </w:rPr>
+        <w:t xml:space="preserve"> "moyenne",</w:t>
+      </w:r>
+    </w:p>
+    <w:p>
+      <w:pPr>
+        <w:spacing w:after="0"/>
+        <w:rPr>
+          <w:rFonts w:ascii="Times New Roman" w:hAnsi="Times New Roman" w:cs="Times New Roman"/>
+          <w:sz w:val="24"/>
+          <w:szCs w:val="24"/>
+        </w:rPr>
+      </w:pPr>
+      <w:r>
+        <w:rPr>
+          <w:rFonts w:ascii="Times New Roman" w:hAnsi="Times New Roman" w:cs="Times New Roman"/>
+          <w:sz w:val="24"/>
+          <w:szCs w:val="24"/>
+        </w:rPr>
+        <w:t xml:space="preserve">  "</w:t>
+      </w:r>
+      <w:proofErr w:type="spellStart"/>
+      <w:r>
+        <w:rPr>
+          <w:rFonts w:ascii="Times New Roman" w:hAnsi="Times New Roman" w:cs="Times New Roman"/>
+          <w:sz w:val="24"/>
+          <w:szCs w:val="24"/>
+        </w:rPr>
+        <w:t>probleme</w:t>
+      </w:r>
+      <w:proofErr w:type="spellEnd"/>
+      <w:proofErr w:type="gramStart"/>
+      <w:r>
+        <w:rPr>
+          <w:rFonts w:ascii="Times New Roman" w:hAnsi="Times New Roman" w:cs="Times New Roman"/>
+          <w:sz w:val="24"/>
+          <w:szCs w:val="24"/>
+        </w:rPr>
+        <w:t>":</w:t>
+      </w:r>
+      <w:proofErr w:type="gramEnd"/>
+      <w:r>
+        <w:rPr>
+          <w:rFonts w:ascii="Times New Roman" w:hAnsi="Times New Roman" w:cs="Times New Roman"/>
+          <w:sz w:val="24"/>
+          <w:szCs w:val="24"/>
+        </w:rPr>
+        <w:t xml:space="preserve"> "Retard de livraison",</w:t>
+      </w:r>
+    </w:p>
+    <w:p>
+      <w:pPr>
+        <w:spacing w:after="0"/>
+        <w:rPr>
+          <w:rFonts w:ascii="Times New Roman" w:hAnsi="Times New Roman" w:cs="Times New Roman"/>
+          <w:sz w:val="24"/>
+          <w:szCs w:val="24"/>
+        </w:rPr>
+      </w:pPr>
+      <w:r>
+        <w:rPr>
+          <w:rFonts w:ascii="Times New Roman" w:hAnsi="Times New Roman" w:cs="Times New Roman"/>
+          <w:sz w:val="24"/>
+          <w:szCs w:val="24"/>
+        </w:rPr>
+        <w:t xml:space="preserve">  "confiance</w:t>
+      </w:r>
+      <w:proofErr w:type="gramStart"/>
+      <w:r>
+        <w:rPr>
+          <w:rFonts w:ascii="Times New Roman" w:hAnsi="Times New Roman" w:cs="Times New Roman"/>
+          <w:sz w:val="24"/>
+          <w:szCs w:val="24"/>
+        </w:rPr>
+        <w:t>":</w:t>
+      </w:r>
+      <w:proofErr w:type="gramEnd"/>
+      <w:r>
+        <w:rPr>
+          <w:rFonts w:ascii="Times New Roman" w:hAnsi="Times New Roman" w:cs="Times New Roman"/>
+          <w:sz w:val="24"/>
+          <w:szCs w:val="24"/>
+        </w:rPr>
+        <w:t xml:space="preserve"> 0.91</w:t>
+      </w:r>
+    </w:p>
+    <w:p>
+      <w:pPr>
+        <w:spacing w:after="0"/>
+        <w:rPr>
+          <w:rFonts w:ascii="Times New Roman" w:hAnsi="Times New Roman" w:cs="Times New Roman"/>
+          <w:sz w:val="24"/>
+          <w:szCs w:val="24"/>
+        </w:rPr>
+      </w:pPr>
+      <w:r>
+        <w:rPr>
+          <w:rFonts w:ascii="Times New Roman" w:hAnsi="Times New Roman" w:cs="Times New Roman"/>
+          <w:sz w:val="24"/>
+          <w:szCs w:val="24"/>
+        </w:rPr>
+        <w:t>}</w:t>
+      </w:r>
+    </w:p>
+    <w:p>
+      <w:pPr>
+        <w:spacing w:after="0"/>
+        <w:rPr>
+          <w:rFonts w:ascii="Times New Roman" w:hAnsi="Times New Roman" w:cs="Times New Roman"/>
+          <w:sz w:val="24"/>
+          <w:szCs w:val="24"/>
+        </w:rPr>
+      </w:pPr>
+    </w:p>
+    <w:p>
+      <w:pPr>
+        <w:spacing w:after="0"/>
+        <w:rPr>
+          <w:rFonts w:ascii="Times New Roman" w:hAnsi="Times New Roman" w:cs="Times New Roman"/>
+          <w:b/>
+          <w:bCs/>
+          <w:sz w:val="24"/>
+          <w:szCs w:val="24"/>
+        </w:rPr>
+      </w:pPr>
+      <w:r>
+        <w:rPr>
+          <w:rFonts w:ascii="Times New Roman" w:hAnsi="Times New Roman" w:cs="Times New Roman"/>
+          <w:b/>
+          <w:bCs/>
+          <w:sz w:val="24"/>
+          <w:szCs w:val="24"/>
+        </w:rPr>
+        <w:t>Résultat</w:t>
+      </w:r>
+    </w:p>
+    <w:p>
+      <w:pPr>
+        <w:spacing w:after="0"/>
+        <w:rPr>
+          <w:rFonts w:ascii="Times New Roman" w:hAnsi="Times New Roman" w:cs="Times New Roman"/>
+          <w:b/>
+          <w:bCs/>
+          <w:sz w:val="24"/>
+          <w:szCs w:val="24"/>
+        </w:rPr>
+      </w:pPr>
+      <w:r>
+        <w:rPr>
+          <w:rFonts w:ascii="Times New Roman" w:hAnsi="Times New Roman" w:cs="Times New Roman"/>
+          <w:b/>
+          <w:bCs/>
+          <w:sz w:val="24"/>
+          <w:szCs w:val="24"/>
+        </w:rPr>
+        <w:drawing>
+          <wp:inline distT="0" distB="0" distL="0" distR="0" wp14:anchorId="1BE940F9" wp14:editId="5E6E50BE">
+            <wp:extent cx="5054860" cy="1358970"/>
+            <wp:effectExtent l="0" t="0" r="0" b="0"/>
+            <wp:docPr id="14" name="Image 14"/>
+            <wp:cNvGraphicFramePr>
+              <a:graphicFrameLocks xmlns:a="http://schemas.openxmlformats.org/drawingml/2006/main" noChangeAspect="1"/>
+            </wp:cNvGraphicFramePr>
+            <a:graphic xmlns:a="http://schemas.openxmlformats.org/drawingml/2006/main">
+              <a:graphicData uri="http://schemas.openxmlformats.org/drawingml/2006/picture">
+                <pic:pic xmlns:pic="http://schemas.openxmlformats.org/drawingml/2006/picture">
+                  <pic:nvPicPr>
+                    <pic:cNvPr id="1" name=""/>
+                    <pic:cNvPicPr/>
+                  </pic:nvPicPr>
+                  <pic:blipFill>
+                    <a:blip r:embed="rId18"/>
+                    <a:stretch>
+                      <a:fillRect/>
+                    </a:stretch>
+                  </pic:blipFill>
+                  <pic:spPr>
+                    <a:xfrm>
+                      <a:off x="0" y="0"/>
+                      <a:ext cx="5054860" cy="1358970"/>
+                    </a:xfrm>
+                    <a:prstGeom prst="rect">
+                      <a:avLst/>
+                    </a:prstGeom>
+                  </pic:spPr>
+                </pic:pic>
+              </a:graphicData>
+            </a:graphic>
+          </wp:inline>
+        </w:drawing>
+      </w:r>
+    </w:p>
+    <w:p>
+      <w:pPr>
+        <w:spacing w:after="0"/>
+        <w:rPr>
+          <w:rFonts w:ascii="Times New Roman" w:hAnsi="Times New Roman" w:cs="Times New Roman"/>
+          <w:b/>
+          <w:bCs/>
+          <w:sz w:val="24"/>
+          <w:szCs w:val="24"/>
+        </w:rPr>
+      </w:pPr>
+    </w:p>
+    <w:p>
+      <w:pPr>
+        <w:spacing w:after="0"/>
+        <w:rPr>
+          <w:rFonts w:ascii="Times New Roman" w:hAnsi="Times New Roman" w:cs="Times New Roman"/>
+          <w:b/>
+          <w:bCs/>
           <w:sz w:val="24"/>
           <w:szCs w:val="24"/>
         </w:rPr>

</xml_diff>

<commit_message>
Partie 4 question 2
</commit_message>
<xml_diff>
--- a/ai-business_assistant.docx
+++ b/ai-business_assistant.docx
@@ -4402,6 +4402,32 @@
     </w:p>
     <w:p>
       <w:pPr>
+        <w:pStyle w:val="Paragraphedeliste"/>
+        <w:numPr>
+          <w:ilvl w:val="0"/>
+          <w:numId w:val="9"/>
+        </w:numPr>
+        <w:rPr>
+          <w:rFonts w:ascii="Times New Roman" w:hAnsi="Times New Roman" w:cs="Times New Roman"/>
+          <w:b/>
+          <w:bCs/>
+          <w:sz w:val="24"/>
+          <w:szCs w:val="24"/>
+        </w:rPr>
+      </w:pPr>
+      <w:r>
+        <w:rPr>
+          <w:rFonts w:ascii="Times New Roman" w:hAnsi="Times New Roman" w:cs="Times New Roman"/>
+          <w:b/>
+          <w:bCs/>
+          <w:sz w:val="24"/>
+          <w:szCs w:val="24"/>
+        </w:rPr>
+        <w:t>Prompt JSON avec champs typés</w:t>
+      </w:r>
+    </w:p>
+    <w:p>
+      <w:pPr>
         <w:autoSpaceDE w:val="0"/>
         <w:autoSpaceDN w:val="0"/>
         <w:adjustRightInd w:val="0"/>
@@ -4542,7 +4568,7 @@
           <w:sz w:val="24"/>
           <w:szCs w:val="24"/>
         </w:rPr>
-        <w:t>- "sentiment" (string) : une valeur parmi "positif", "</w:t>
+        <w:t xml:space="preserve"> "sentiment" (string) : une valeur parmi "positif", "</w:t>
       </w:r>
       <w:proofErr w:type="spellStart"/>
       <w:r>
@@ -4578,7 +4604,7 @@
           <w:sz w:val="24"/>
           <w:szCs w:val="24"/>
         </w:rPr>
-        <w:t>- "</w:t>
+        <w:t>"</w:t>
       </w:r>
       <w:proofErr w:type="spellStart"/>
       <w:r>
@@ -4598,6 +4624,22 @@
         </w:rPr>
         <w:t>" (string) : le thème principal du commentaire (ex. "livraison",</w:t>
       </w:r>
+      <w:r>
+        <w:rPr>
+          <w:rFonts w:ascii="Times New Roman" w:hAnsi="Times New Roman" w:cs="Times New Roman"/>
+          <w:sz w:val="24"/>
+          <w:szCs w:val="24"/>
+        </w:rPr>
+        <w:t xml:space="preserve"> </w:t>
+      </w:r>
+      <w:r>
+        <w:rPr>
+          <w:rFonts w:ascii="Times New Roman" w:hAnsi="Times New Roman" w:cs="Times New Roman"/>
+          <w:sz w:val="24"/>
+          <w:szCs w:val="24"/>
+        </w:rPr>
+        <w:t>"produit", "support", "prix", "application")</w:t>
+      </w:r>
     </w:p>
     <w:p>
       <w:pPr>
@@ -4614,7 +4656,7 @@
           <w:sz w:val="24"/>
           <w:szCs w:val="24"/>
         </w:rPr>
-        <w:t xml:space="preserve">  "produit", "support", "prix", "application")</w:t>
+        <w:t>"urgence" (string) : une valeur parmi "faible", "moyenne", "élevée"</w:t>
       </w:r>
     </w:p>
     <w:p>
@@ -4632,7 +4674,41 @@
           <w:sz w:val="24"/>
           <w:szCs w:val="24"/>
         </w:rPr>
-        <w:t>- "urgence" (string) : une valeur parmi "faible", "moyenne", "élevée"</w:t>
+        <w:t>"</w:t>
+      </w:r>
+      <w:proofErr w:type="spellStart"/>
+      <w:r>
+        <w:rPr>
+          <w:rFonts w:ascii="Times New Roman" w:hAnsi="Times New Roman" w:cs="Times New Roman"/>
+          <w:sz w:val="24"/>
+          <w:szCs w:val="24"/>
+        </w:rPr>
+        <w:t>probleme</w:t>
+      </w:r>
+      <w:proofErr w:type="spellEnd"/>
+      <w:r>
+        <w:rPr>
+          <w:rFonts w:ascii="Times New Roman" w:hAnsi="Times New Roman" w:cs="Times New Roman"/>
+          <w:sz w:val="24"/>
+          <w:szCs w:val="24"/>
+        </w:rPr>
+        <w:t>" (string) : description courte et factuelle du problème mentionné</w:t>
+      </w:r>
+      <w:r>
+        <w:rPr>
+          <w:rFonts w:ascii="Times New Roman" w:hAnsi="Times New Roman" w:cs="Times New Roman"/>
+          <w:sz w:val="24"/>
+          <w:szCs w:val="24"/>
+        </w:rPr>
+        <w:t xml:space="preserve"> </w:t>
+      </w:r>
+      <w:r>
+        <w:rPr>
+          <w:rFonts w:ascii="Times New Roman" w:hAnsi="Times New Roman" w:cs="Times New Roman"/>
+          <w:sz w:val="24"/>
+          <w:szCs w:val="24"/>
+        </w:rPr>
+        <w:t>(chaîne vide "" si aucun problème)</w:t>
       </w:r>
     </w:p>
     <w:p>
@@ -4650,7 +4726,7 @@
           <w:sz w:val="24"/>
           <w:szCs w:val="24"/>
         </w:rPr>
-        <w:t>- "</w:t>
+        <w:t>"confiance" (</w:t>
       </w:r>
       <w:proofErr w:type="spellStart"/>
       <w:r>
@@ -4659,7 +4735,7 @@
           <w:sz w:val="24"/>
           <w:szCs w:val="24"/>
         </w:rPr>
-        <w:t>probleme</w:t>
+        <w:t>number</w:t>
       </w:r>
       <w:proofErr w:type="spellEnd"/>
       <w:r>
@@ -4668,99 +4744,16 @@
           <w:sz w:val="24"/>
           <w:szCs w:val="24"/>
         </w:rPr>
-        <w:t>" (string) : description courte et factuelle du problème mentionné</w:t>
-      </w:r>
-    </w:p>
-    <w:p>
-      <w:pPr>
-        <w:spacing w:after="0"/>
-        <w:rPr>
-          <w:rFonts w:ascii="Times New Roman" w:hAnsi="Times New Roman" w:cs="Times New Roman"/>
-          <w:sz w:val="24"/>
-          <w:szCs w:val="24"/>
-        </w:rPr>
-      </w:pPr>
-      <w:r>
-        <w:rPr>
-          <w:rFonts w:ascii="Times New Roman" w:hAnsi="Times New Roman" w:cs="Times New Roman"/>
-          <w:sz w:val="24"/>
-          <w:szCs w:val="24"/>
-        </w:rPr>
-        <w:t xml:space="preserve">  (</w:t>
-      </w:r>
-      <w:proofErr w:type="gramStart"/>
-      <w:r>
-        <w:rPr>
-          <w:rFonts w:ascii="Times New Roman" w:hAnsi="Times New Roman" w:cs="Times New Roman"/>
-          <w:sz w:val="24"/>
-          <w:szCs w:val="24"/>
-        </w:rPr>
-        <w:t>chaîne</w:t>
-      </w:r>
-      <w:proofErr w:type="gramEnd"/>
-      <w:r>
-        <w:rPr>
-          <w:rFonts w:ascii="Times New Roman" w:hAnsi="Times New Roman" w:cs="Times New Roman"/>
-          <w:sz w:val="24"/>
-          <w:szCs w:val="24"/>
-        </w:rPr>
-        <w:t xml:space="preserve"> vide "" si aucun problème)</w:t>
-      </w:r>
-    </w:p>
-    <w:p>
-      <w:pPr>
-        <w:spacing w:after="0"/>
-        <w:rPr>
-          <w:rFonts w:ascii="Times New Roman" w:hAnsi="Times New Roman" w:cs="Times New Roman"/>
-          <w:sz w:val="24"/>
-          <w:szCs w:val="24"/>
-        </w:rPr>
-      </w:pPr>
-      <w:r>
-        <w:rPr>
-          <w:rFonts w:ascii="Times New Roman" w:hAnsi="Times New Roman" w:cs="Times New Roman"/>
-          <w:sz w:val="24"/>
-          <w:szCs w:val="24"/>
-        </w:rPr>
-        <w:t>- "confiance" (</w:t>
-      </w:r>
-      <w:proofErr w:type="spellStart"/>
-      <w:r>
-        <w:rPr>
-          <w:rFonts w:ascii="Times New Roman" w:hAnsi="Times New Roman" w:cs="Times New Roman"/>
-          <w:sz w:val="24"/>
-          <w:szCs w:val="24"/>
-        </w:rPr>
-        <w:t>number</w:t>
-      </w:r>
-      <w:proofErr w:type="spellEnd"/>
-      <w:r>
-        <w:rPr>
-          <w:rFonts w:ascii="Times New Roman" w:hAnsi="Times New Roman" w:cs="Times New Roman"/>
-          <w:sz w:val="24"/>
-          <w:szCs w:val="24"/>
-        </w:rPr>
         <w:t>) : score entre 0 et 1 représentant ta confiance dans</w:t>
       </w:r>
-    </w:p>
-    <w:p>
-      <w:pPr>
-        <w:spacing w:after="0"/>
-        <w:rPr>
-          <w:rFonts w:ascii="Times New Roman" w:hAnsi="Times New Roman" w:cs="Times New Roman"/>
-          <w:sz w:val="24"/>
-          <w:szCs w:val="24"/>
-        </w:rPr>
-      </w:pPr>
-      <w:r>
-        <w:rPr>
-          <w:rFonts w:ascii="Times New Roman" w:hAnsi="Times New Roman" w:cs="Times New Roman"/>
-          <w:sz w:val="24"/>
-          <w:szCs w:val="24"/>
-        </w:rPr>
-        <w:t xml:space="preserve">  </w:t>
-      </w:r>
-      <w:proofErr w:type="gramStart"/>
+      <w:r>
+        <w:rPr>
+          <w:rFonts w:ascii="Times New Roman" w:hAnsi="Times New Roman" w:cs="Times New Roman"/>
+          <w:sz w:val="24"/>
+          <w:szCs w:val="24"/>
+        </w:rPr>
+        <w:t xml:space="preserve"> </w:t>
+      </w:r>
       <w:r>
         <w:rPr>
           <w:rFonts w:ascii="Times New Roman" w:hAnsi="Times New Roman" w:cs="Times New Roman"/>
@@ -4769,7 +4762,6 @@
         </w:rPr>
         <w:t>l'analyse</w:t>
       </w:r>
-      <w:proofErr w:type="gramEnd"/>
     </w:p>
     <w:p>
       <w:pPr>
@@ -5237,6 +5229,11 @@
     </w:p>
     <w:p>
       <w:pPr>
+        <w:pStyle w:val="Paragraphedeliste"/>
+        <w:numPr>
+          <w:ilvl w:val="0"/>
+          <w:numId w:val="6"/>
+        </w:numPr>
         <w:spacing w:after="0"/>
         <w:rPr>
           <w:rFonts w:ascii="Times New Roman" w:hAnsi="Times New Roman" w:cs="Times New Roman"/>
@@ -5246,6 +5243,512 @@
           <w:szCs w:val="24"/>
         </w:rPr>
       </w:pPr>
+      <w:r>
+        <w:rPr>
+          <w:rFonts w:ascii="Times New Roman" w:hAnsi="Times New Roman" w:cs="Times New Roman"/>
+          <w:b/>
+          <w:bCs/>
+          <w:sz w:val="24"/>
+          <w:szCs w:val="24"/>
+        </w:rPr>
+        <w:t>Ajout de la validation</w:t>
+      </w:r>
+    </w:p>
+    <w:p>
+      <w:pPr>
+        <w:rPr>
+          <w:rFonts w:ascii="Times New Roman" w:hAnsi="Times New Roman" w:cs="Times New Roman"/>
+          <w:sz w:val="24"/>
+          <w:szCs w:val="24"/>
+        </w:rPr>
+      </w:pPr>
+      <w:r>
+        <w:rPr>
+          <w:rFonts w:ascii="Times New Roman" w:hAnsi="Times New Roman" w:cs="Times New Roman"/>
+          <w:sz w:val="24"/>
+          <w:szCs w:val="24"/>
+        </w:rPr>
+        <w:t>Tu es un système d'analyse de commentaires clients. Analyse le commentaire fourni</w:t>
+      </w:r>
+      <w:r>
+        <w:rPr>
+          <w:rFonts w:ascii="Times New Roman" w:hAnsi="Times New Roman" w:cs="Times New Roman"/>
+          <w:sz w:val="24"/>
+          <w:szCs w:val="24"/>
+        </w:rPr>
+        <w:t xml:space="preserve"> </w:t>
+      </w:r>
+      <w:r>
+        <w:rPr>
+          <w:rFonts w:ascii="Times New Roman" w:hAnsi="Times New Roman" w:cs="Times New Roman"/>
+          <w:sz w:val="24"/>
+          <w:szCs w:val="24"/>
+        </w:rPr>
+        <w:t>et retourne UNIQUEMENT un objet JSON valide respectant STRICTEMENT les règles</w:t>
+      </w:r>
+    </w:p>
+    <w:p>
+      <w:pPr>
+        <w:rPr>
+          <w:rFonts w:ascii="Times New Roman" w:hAnsi="Times New Roman" w:cs="Times New Roman"/>
+          <w:sz w:val="24"/>
+          <w:szCs w:val="24"/>
+        </w:rPr>
+      </w:pPr>
+      <w:r>
+        <w:rPr>
+          <w:rFonts w:ascii="Times New Roman" w:hAnsi="Times New Roman" w:cs="Times New Roman"/>
+          <w:sz w:val="24"/>
+          <w:szCs w:val="24"/>
+        </w:rPr>
+        <w:lastRenderedPageBreak/>
+        <w:t>S</w:t>
+      </w:r>
+      <w:r>
+        <w:rPr>
+          <w:rFonts w:ascii="Times New Roman" w:hAnsi="Times New Roman" w:cs="Times New Roman"/>
+          <w:sz w:val="24"/>
+          <w:szCs w:val="24"/>
+        </w:rPr>
+        <w:t>uivantes :</w:t>
+      </w:r>
+    </w:p>
+    <w:p>
+      <w:pPr>
+        <w:pStyle w:val="Paragraphedeliste"/>
+        <w:numPr>
+          <w:ilvl w:val="0"/>
+          <w:numId w:val="10"/>
+        </w:numPr>
+        <w:rPr>
+          <w:rFonts w:ascii="Times New Roman" w:hAnsi="Times New Roman" w:cs="Times New Roman"/>
+          <w:sz w:val="24"/>
+          <w:szCs w:val="24"/>
+        </w:rPr>
+      </w:pPr>
+      <w:r>
+        <w:rPr>
+          <w:rFonts w:ascii="Times New Roman" w:hAnsi="Times New Roman" w:cs="Times New Roman"/>
+          <w:sz w:val="24"/>
+          <w:szCs w:val="24"/>
+        </w:rPr>
+        <w:t>Règles de sortie :</w:t>
+      </w:r>
+    </w:p>
+    <w:p>
+      <w:pPr>
+        <w:pStyle w:val="Paragraphedeliste"/>
+        <w:numPr>
+          <w:ilvl w:val="0"/>
+          <w:numId w:val="10"/>
+        </w:numPr>
+        <w:rPr>
+          <w:rFonts w:ascii="Times New Roman" w:hAnsi="Times New Roman" w:cs="Times New Roman"/>
+          <w:sz w:val="24"/>
+          <w:szCs w:val="24"/>
+        </w:rPr>
+      </w:pPr>
+      <w:r>
+        <w:rPr>
+          <w:rFonts w:ascii="Times New Roman" w:hAnsi="Times New Roman" w:cs="Times New Roman"/>
+          <w:sz w:val="24"/>
+          <w:szCs w:val="24"/>
+        </w:rPr>
+        <w:t>Le JSON doit être valide (syntaxe correcte, pas de texte hors du JSON).</w:t>
+      </w:r>
+    </w:p>
+    <w:p>
+      <w:pPr>
+        <w:pStyle w:val="Paragraphedeliste"/>
+        <w:numPr>
+          <w:ilvl w:val="0"/>
+          <w:numId w:val="10"/>
+        </w:numPr>
+        <w:rPr>
+          <w:rFonts w:ascii="Times New Roman" w:hAnsi="Times New Roman" w:cs="Times New Roman"/>
+          <w:sz w:val="24"/>
+          <w:szCs w:val="24"/>
+        </w:rPr>
+      </w:pPr>
+      <w:r>
+        <w:rPr>
+          <w:rFonts w:ascii="Times New Roman" w:hAnsi="Times New Roman" w:cs="Times New Roman"/>
+          <w:sz w:val="24"/>
+          <w:szCs w:val="24"/>
+        </w:rPr>
+        <w:t xml:space="preserve">Aucune propriété supplémentaire n'est autorisée au-delà de : sentiment, </w:t>
+      </w:r>
+      <w:proofErr w:type="spellStart"/>
+      <w:r>
+        <w:rPr>
+          <w:rFonts w:ascii="Times New Roman" w:hAnsi="Times New Roman" w:cs="Times New Roman"/>
+          <w:sz w:val="24"/>
+          <w:szCs w:val="24"/>
+        </w:rPr>
+        <w:t>categorie</w:t>
+      </w:r>
+      <w:proofErr w:type="spellEnd"/>
+      <w:r>
+        <w:rPr>
+          <w:rFonts w:ascii="Times New Roman" w:hAnsi="Times New Roman" w:cs="Times New Roman"/>
+          <w:sz w:val="24"/>
+          <w:szCs w:val="24"/>
+        </w:rPr>
+        <w:t>,</w:t>
+      </w:r>
+    </w:p>
+    <w:p>
+      <w:pPr>
+        <w:pStyle w:val="Paragraphedeliste"/>
+        <w:numPr>
+          <w:ilvl w:val="0"/>
+          <w:numId w:val="10"/>
+        </w:numPr>
+        <w:rPr>
+          <w:rFonts w:ascii="Times New Roman" w:hAnsi="Times New Roman" w:cs="Times New Roman"/>
+          <w:sz w:val="24"/>
+          <w:szCs w:val="24"/>
+        </w:rPr>
+      </w:pPr>
+      <w:r>
+        <w:rPr>
+          <w:rFonts w:ascii="Times New Roman" w:hAnsi="Times New Roman" w:cs="Times New Roman"/>
+          <w:sz w:val="24"/>
+          <w:szCs w:val="24"/>
+        </w:rPr>
+        <w:t>Urgence</w:t>
+      </w:r>
+      <w:r>
+        <w:rPr>
+          <w:rFonts w:ascii="Times New Roman" w:hAnsi="Times New Roman" w:cs="Times New Roman"/>
+          <w:sz w:val="24"/>
+          <w:szCs w:val="24"/>
+        </w:rPr>
+        <w:t xml:space="preserve">, </w:t>
+      </w:r>
+      <w:r>
+        <w:rPr>
+          <w:rFonts w:ascii="Times New Roman" w:hAnsi="Times New Roman" w:cs="Times New Roman"/>
+          <w:sz w:val="24"/>
+          <w:szCs w:val="24"/>
+        </w:rPr>
+        <w:t>problème</w:t>
+      </w:r>
+      <w:r>
+        <w:rPr>
+          <w:rFonts w:ascii="Times New Roman" w:hAnsi="Times New Roman" w:cs="Times New Roman"/>
+          <w:sz w:val="24"/>
+          <w:szCs w:val="24"/>
+        </w:rPr>
+        <w:t>, confiance.</w:t>
+      </w:r>
+    </w:p>
+    <w:p>
+      <w:pPr>
+        <w:pStyle w:val="Paragraphedeliste"/>
+        <w:numPr>
+          <w:ilvl w:val="0"/>
+          <w:numId w:val="10"/>
+        </w:numPr>
+        <w:rPr>
+          <w:rFonts w:ascii="Times New Roman" w:hAnsi="Times New Roman" w:cs="Times New Roman"/>
+          <w:sz w:val="24"/>
+          <w:szCs w:val="24"/>
+        </w:rPr>
+      </w:pPr>
+      <w:r>
+        <w:rPr>
+          <w:rFonts w:ascii="Times New Roman" w:hAnsi="Times New Roman" w:cs="Times New Roman"/>
+          <w:sz w:val="24"/>
+          <w:szCs w:val="24"/>
+        </w:rPr>
+        <w:t>"sentiment" doit valoir exactement "positif", "</w:t>
+      </w:r>
+      <w:proofErr w:type="spellStart"/>
+      <w:r>
+        <w:rPr>
+          <w:rFonts w:ascii="Times New Roman" w:hAnsi="Times New Roman" w:cs="Times New Roman"/>
+          <w:sz w:val="24"/>
+          <w:szCs w:val="24"/>
+        </w:rPr>
+        <w:t>negatif</w:t>
+      </w:r>
+      <w:proofErr w:type="spellEnd"/>
+      <w:r>
+        <w:rPr>
+          <w:rFonts w:ascii="Times New Roman" w:hAnsi="Times New Roman" w:cs="Times New Roman"/>
+          <w:sz w:val="24"/>
+          <w:szCs w:val="24"/>
+        </w:rPr>
+        <w:t>" ou "neutre".</w:t>
+      </w:r>
+    </w:p>
+    <w:p>
+      <w:pPr>
+        <w:pStyle w:val="Paragraphedeliste"/>
+        <w:numPr>
+          <w:ilvl w:val="0"/>
+          <w:numId w:val="10"/>
+        </w:numPr>
+        <w:rPr>
+          <w:rFonts w:ascii="Times New Roman" w:hAnsi="Times New Roman" w:cs="Times New Roman"/>
+          <w:sz w:val="24"/>
+          <w:szCs w:val="24"/>
+        </w:rPr>
+      </w:pPr>
+      <w:r>
+        <w:rPr>
+          <w:rFonts w:ascii="Times New Roman" w:hAnsi="Times New Roman" w:cs="Times New Roman"/>
+          <w:sz w:val="24"/>
+          <w:szCs w:val="24"/>
+        </w:rPr>
+        <w:t>"urgence" doit valoir exactement "faible", "moyenne" ou "élevée".</w:t>
+      </w:r>
+    </w:p>
+    <w:p>
+      <w:pPr>
+        <w:pStyle w:val="Paragraphedeliste"/>
+        <w:numPr>
+          <w:ilvl w:val="0"/>
+          <w:numId w:val="10"/>
+        </w:numPr>
+        <w:rPr>
+          <w:rFonts w:ascii="Times New Roman" w:hAnsi="Times New Roman" w:cs="Times New Roman"/>
+          <w:sz w:val="24"/>
+          <w:szCs w:val="24"/>
+        </w:rPr>
+      </w:pPr>
+      <w:r>
+        <w:rPr>
+          <w:rFonts w:ascii="Times New Roman" w:hAnsi="Times New Roman" w:cs="Times New Roman"/>
+          <w:sz w:val="24"/>
+          <w:szCs w:val="24"/>
+        </w:rPr>
+        <w:t>"confiance" doit être un nombre compris entre 0 et 1 (inclus).</w:t>
+      </w:r>
+    </w:p>
+    <w:p>
+      <w:pPr>
+        <w:pStyle w:val="Paragraphedeliste"/>
+        <w:numPr>
+          <w:ilvl w:val="0"/>
+          <w:numId w:val="10"/>
+        </w:numPr>
+        <w:rPr>
+          <w:rFonts w:ascii="Times New Roman" w:hAnsi="Times New Roman" w:cs="Times New Roman"/>
+          <w:sz w:val="24"/>
+          <w:szCs w:val="24"/>
+        </w:rPr>
+      </w:pPr>
+      <w:r>
+        <w:rPr>
+          <w:rFonts w:ascii="Times New Roman" w:hAnsi="Times New Roman" w:cs="Times New Roman"/>
+          <w:sz w:val="24"/>
+          <w:szCs w:val="24"/>
+        </w:rPr>
+        <w:t xml:space="preserve">Si une valeur ne peut pas être déterminée avec certitude, choisis la valeur </w:t>
+      </w:r>
+      <w:proofErr w:type="gramStart"/>
+      <w:r>
+        <w:rPr>
+          <w:rFonts w:ascii="Times New Roman" w:hAnsi="Times New Roman" w:cs="Times New Roman"/>
+          <w:sz w:val="24"/>
+          <w:szCs w:val="24"/>
+        </w:rPr>
+        <w:t>la</w:t>
+      </w:r>
+      <w:proofErr w:type="gramEnd"/>
+    </w:p>
+    <w:p>
+      <w:pPr>
+        <w:pStyle w:val="Paragraphedeliste"/>
+        <w:numPr>
+          <w:ilvl w:val="0"/>
+          <w:numId w:val="10"/>
+        </w:numPr>
+        <w:rPr>
+          <w:rFonts w:ascii="Times New Roman" w:hAnsi="Times New Roman" w:cs="Times New Roman"/>
+          <w:sz w:val="24"/>
+          <w:szCs w:val="24"/>
+        </w:rPr>
+      </w:pPr>
+      <w:r>
+        <w:rPr>
+          <w:rFonts w:ascii="Times New Roman" w:hAnsi="Times New Roman" w:cs="Times New Roman"/>
+          <w:sz w:val="24"/>
+          <w:szCs w:val="24"/>
+        </w:rPr>
+        <w:t>Plus</w:t>
+      </w:r>
+      <w:r>
+        <w:rPr>
+          <w:rFonts w:ascii="Times New Roman" w:hAnsi="Times New Roman" w:cs="Times New Roman"/>
+          <w:sz w:val="24"/>
+          <w:szCs w:val="24"/>
+        </w:rPr>
+        <w:t xml:space="preserve"> prudente plutôt que d'inventer.</w:t>
+      </w:r>
+    </w:p>
+    <w:p>
+      <w:pPr>
+        <w:rPr>
+          <w:rFonts w:ascii="Times New Roman" w:hAnsi="Times New Roman" w:cs="Times New Roman"/>
+          <w:sz w:val="24"/>
+          <w:szCs w:val="24"/>
+        </w:rPr>
+      </w:pPr>
+      <w:r>
+        <w:rPr>
+          <w:rFonts w:ascii="Times New Roman" w:hAnsi="Times New Roman" w:cs="Times New Roman"/>
+          <w:sz w:val="24"/>
+          <w:szCs w:val="24"/>
+        </w:rPr>
+        <w:t>Avant de répondre, vérifie mentalement que ton JSON respecte toutes ces règles.</w:t>
+      </w:r>
+    </w:p>
+    <w:p>
+      <w:pPr>
+        <w:rPr>
+          <w:rFonts w:ascii="Times New Roman" w:hAnsi="Times New Roman" w:cs="Times New Roman"/>
+          <w:sz w:val="24"/>
+          <w:szCs w:val="24"/>
+        </w:rPr>
+      </w:pPr>
+      <w:r>
+        <w:rPr>
+          <w:rFonts w:ascii="Times New Roman" w:hAnsi="Times New Roman" w:cs="Times New Roman"/>
+          <w:sz w:val="24"/>
+          <w:szCs w:val="24"/>
+        </w:rPr>
+        <w:t>Commentaire à analyser :</w:t>
+      </w:r>
+    </w:p>
+    <w:p>
+      <w:pPr>
+        <w:rPr>
+          <w:rFonts w:ascii="Times New Roman" w:hAnsi="Times New Roman" w:cs="Times New Roman"/>
+          <w:sz w:val="24"/>
+          <w:szCs w:val="24"/>
+        </w:rPr>
+      </w:pPr>
+      <w:r>
+        <w:rPr>
+          <w:rFonts w:ascii="Times New Roman" w:hAnsi="Times New Roman" w:cs="Times New Roman"/>
+          <w:sz w:val="24"/>
+          <w:szCs w:val="24"/>
+        </w:rPr>
+        <w:t>"""</w:t>
+      </w:r>
+    </w:p>
+    <w:p>
+      <w:pPr>
+        <w:rPr>
+          <w:rFonts w:ascii="Times New Roman" w:hAnsi="Times New Roman" w:cs="Times New Roman"/>
+          <w:sz w:val="24"/>
+          <w:szCs w:val="24"/>
+        </w:rPr>
+      </w:pPr>
+      <w:r>
+        <w:rPr>
+          <w:rFonts w:ascii="Times New Roman" w:hAnsi="Times New Roman" w:cs="Times New Roman"/>
+          <w:sz w:val="24"/>
+          <w:szCs w:val="24"/>
+        </w:rPr>
+        <w:t>Le commentaire semble plutôt négatif. Le client est mécontent du délai de livraison.</w:t>
+      </w:r>
+    </w:p>
+    <w:p>
+      <w:pPr>
+        <w:rPr>
+          <w:rFonts w:ascii="Times New Roman" w:hAnsi="Times New Roman" w:cs="Times New Roman"/>
+          <w:sz w:val="24"/>
+          <w:szCs w:val="24"/>
+        </w:rPr>
+      </w:pPr>
+      <w:r>
+        <w:rPr>
+          <w:rFonts w:ascii="Times New Roman" w:hAnsi="Times New Roman" w:cs="Times New Roman"/>
+          <w:sz w:val="24"/>
+          <w:szCs w:val="24"/>
+        </w:rPr>
+        <w:t>"""</w:t>
+      </w:r>
+    </w:p>
+    <w:p>
+      <w:pPr>
+        <w:rPr>
+          <w:rFonts w:ascii="Times New Roman" w:hAnsi="Times New Roman" w:cs="Times New Roman"/>
+          <w:b/>
+          <w:bCs/>
+          <w:sz w:val="24"/>
+          <w:szCs w:val="24"/>
+        </w:rPr>
+      </w:pPr>
+      <w:r>
+        <w:rPr>
+          <w:rFonts w:ascii="Times New Roman" w:hAnsi="Times New Roman" w:cs="Times New Roman"/>
+          <w:b/>
+          <w:bCs/>
+          <w:sz w:val="24"/>
+          <w:szCs w:val="24"/>
+        </w:rPr>
+        <w:t>Résultat</w:t>
+      </w:r>
+    </w:p>
+    <w:p>
+      <w:pPr>
+        <w:rPr>
+          <w:rFonts w:ascii="Times New Roman" w:hAnsi="Times New Roman" w:cs="Times New Roman"/>
+          <w:b/>
+          <w:bCs/>
+          <w:sz w:val="24"/>
+          <w:szCs w:val="24"/>
+        </w:rPr>
+      </w:pPr>
+      <w:r>
+        <w:rPr>
+          <w:rFonts w:ascii="Times New Roman" w:hAnsi="Times New Roman" w:cs="Times New Roman"/>
+          <w:b/>
+          <w:bCs/>
+          <w:sz w:val="24"/>
+          <w:szCs w:val="24"/>
+        </w:rPr>
+        <w:drawing>
+          <wp:inline distT="0" distB="0" distL="0" distR="0" wp14:anchorId="0ACC6143" wp14:editId="5DBC01EF">
+            <wp:extent cx="4940554" cy="1378021"/>
+            <wp:effectExtent l="0" t="0" r="0" b="0"/>
+            <wp:docPr id="15" name="Image 15"/>
+            <wp:cNvGraphicFramePr>
+              <a:graphicFrameLocks xmlns:a="http://schemas.openxmlformats.org/drawingml/2006/main" noChangeAspect="1"/>
+            </wp:cNvGraphicFramePr>
+            <a:graphic xmlns:a="http://schemas.openxmlformats.org/drawingml/2006/main">
+              <a:graphicData uri="http://schemas.openxmlformats.org/drawingml/2006/picture">
+                <pic:pic xmlns:pic="http://schemas.openxmlformats.org/drawingml/2006/picture">
+                  <pic:nvPicPr>
+                    <pic:cNvPr id="1" name=""/>
+                    <pic:cNvPicPr/>
+                  </pic:nvPicPr>
+                  <pic:blipFill>
+                    <a:blip r:embed="rId19"/>
+                    <a:stretch>
+                      <a:fillRect/>
+                    </a:stretch>
+                  </pic:blipFill>
+                  <pic:spPr>
+                    <a:xfrm>
+                      <a:off x="0" y="0"/>
+                      <a:ext cx="4940554" cy="1378021"/>
+                    </a:xfrm>
+                    <a:prstGeom prst="rect">
+                      <a:avLst/>
+                    </a:prstGeom>
+                  </pic:spPr>
+                </pic:pic>
+              </a:graphicData>
+            </a:graphic>
+          </wp:inline>
+        </w:drawing>
+      </w:r>
     </w:p>
     <w:sectPr>
       <w:pgSz w:w="11906" w:h="16838"/>
@@ -5348,7 +5851,7 @@
   <w:abstractNum w:abstractNumId="1" w15:restartNumberingAfterBreak="0">
     <w:nsid w:val="051945AE"/>
     <w:multiLevelType w:val="hybridMultilevel"/>
-    <w:tmpl w:val="B830B332"/>
+    <w:tmpl w:val="653643A8"/>
     <w:lvl w:ilvl="0" w:tplc="040C000B">
       <w:start w:val="1"/>
       <w:numFmt w:val="bullet"/>
@@ -5572,6 +6075,119 @@
     </w:lvl>
   </w:abstractNum>
   <w:abstractNum w:abstractNumId="3" w15:restartNumberingAfterBreak="0">
+    <w:nsid w:val="10E26963"/>
+    <w:multiLevelType w:val="hybridMultilevel"/>
+    <w:tmpl w:val="A6FCBF36"/>
+    <w:lvl w:ilvl="0" w:tplc="040C0001">
+      <w:start w:val="1"/>
+      <w:numFmt w:val="bullet"/>
+      <w:lvlText w:val=""/>
+      <w:lvlJc w:val="left"/>
+      <w:pPr>
+        <w:ind w:left="720" w:hanging="360"/>
+      </w:pPr>
+      <w:rPr>
+        <w:rFonts w:ascii="Symbol" w:hAnsi="Symbol" w:hint="default"/>
+      </w:rPr>
+    </w:lvl>
+    <w:lvl w:ilvl="1" w:tplc="040C0003" w:tentative="1">
+      <w:start w:val="1"/>
+      <w:numFmt w:val="bullet"/>
+      <w:lvlText w:val="o"/>
+      <w:lvlJc w:val="left"/>
+      <w:pPr>
+        <w:ind w:left="1440" w:hanging="360"/>
+      </w:pPr>
+      <w:rPr>
+        <w:rFonts w:ascii="Courier New" w:hAnsi="Courier New" w:cs="Courier New" w:hint="default"/>
+      </w:rPr>
+    </w:lvl>
+    <w:lvl w:ilvl="2" w:tplc="040C0005" w:tentative="1">
+      <w:start w:val="1"/>
+      <w:numFmt w:val="bullet"/>
+      <w:lvlText w:val=""/>
+      <w:lvlJc w:val="left"/>
+      <w:pPr>
+        <w:ind w:left="2160" w:hanging="360"/>
+      </w:pPr>
+      <w:rPr>
+        <w:rFonts w:ascii="Wingdings" w:hAnsi="Wingdings" w:hint="default"/>
+      </w:rPr>
+    </w:lvl>
+    <w:lvl w:ilvl="3" w:tplc="040C0001" w:tentative="1">
+      <w:start w:val="1"/>
+      <w:numFmt w:val="bullet"/>
+      <w:lvlText w:val=""/>
+      <w:lvlJc w:val="left"/>
+      <w:pPr>
+        <w:ind w:left="2880" w:hanging="360"/>
+      </w:pPr>
+      <w:rPr>
+        <w:rFonts w:ascii="Symbol" w:hAnsi="Symbol" w:hint="default"/>
+      </w:rPr>
+    </w:lvl>
+    <w:lvl w:ilvl="4" w:tplc="040C0003" w:tentative="1">
+      <w:start w:val="1"/>
+      <w:numFmt w:val="bullet"/>
+      <w:lvlText w:val="o"/>
+      <w:lvlJc w:val="left"/>
+      <w:pPr>
+        <w:ind w:left="3600" w:hanging="360"/>
+      </w:pPr>
+      <w:rPr>
+        <w:rFonts w:ascii="Courier New" w:hAnsi="Courier New" w:cs="Courier New" w:hint="default"/>
+      </w:rPr>
+    </w:lvl>
+    <w:lvl w:ilvl="5" w:tplc="040C0005" w:tentative="1">
+      <w:start w:val="1"/>
+      <w:numFmt w:val="bullet"/>
+      <w:lvlText w:val=""/>
+      <w:lvlJc w:val="left"/>
+      <w:pPr>
+        <w:ind w:left="4320" w:hanging="360"/>
+      </w:pPr>
+      <w:rPr>
+        <w:rFonts w:ascii="Wingdings" w:hAnsi="Wingdings" w:hint="default"/>
+      </w:rPr>
+    </w:lvl>
+    <w:lvl w:ilvl="6" w:tplc="040C0001" w:tentative="1">
+      <w:start w:val="1"/>
+      <w:numFmt w:val="bullet"/>
+      <w:lvlText w:val=""/>
+      <w:lvlJc w:val="left"/>
+      <w:pPr>
+        <w:ind w:left="5040" w:hanging="360"/>
+      </w:pPr>
+      <w:rPr>
+        <w:rFonts w:ascii="Symbol" w:hAnsi="Symbol" w:hint="default"/>
+      </w:rPr>
+    </w:lvl>
+    <w:lvl w:ilvl="7" w:tplc="040C0003" w:tentative="1">
+      <w:start w:val="1"/>
+      <w:numFmt w:val="bullet"/>
+      <w:lvlText w:val="o"/>
+      <w:lvlJc w:val="left"/>
+      <w:pPr>
+        <w:ind w:left="5760" w:hanging="360"/>
+      </w:pPr>
+      <w:rPr>
+        <w:rFonts w:ascii="Courier New" w:hAnsi="Courier New" w:cs="Courier New" w:hint="default"/>
+      </w:rPr>
+    </w:lvl>
+    <w:lvl w:ilvl="8" w:tplc="040C0005" w:tentative="1">
+      <w:start w:val="1"/>
+      <w:numFmt w:val="bullet"/>
+      <w:lvlText w:val=""/>
+      <w:lvlJc w:val="left"/>
+      <w:pPr>
+        <w:ind w:left="6480" w:hanging="360"/>
+      </w:pPr>
+      <w:rPr>
+        <w:rFonts w:ascii="Wingdings" w:hAnsi="Wingdings" w:hint="default"/>
+      </w:rPr>
+    </w:lvl>
+  </w:abstractNum>
+  <w:abstractNum w:abstractNumId="4" w15:restartNumberingAfterBreak="0">
     <w:nsid w:val="19B73A6C"/>
     <w:multiLevelType w:val="hybridMultilevel"/>
     <w:tmpl w:val="0244483A"/>
@@ -5657,7 +6273,7 @@
       </w:pPr>
     </w:lvl>
   </w:abstractNum>
-  <w:abstractNum w:abstractNumId="4" w15:restartNumberingAfterBreak="0">
+  <w:abstractNum w:abstractNumId="5" w15:restartNumberingAfterBreak="0">
     <w:nsid w:val="2DE869EE"/>
     <w:multiLevelType w:val="hybridMultilevel"/>
     <w:tmpl w:val="4E94F688"/>
@@ -5743,7 +6359,7 @@
       </w:pPr>
     </w:lvl>
   </w:abstractNum>
-  <w:abstractNum w:abstractNumId="5" w15:restartNumberingAfterBreak="0">
+  <w:abstractNum w:abstractNumId="6" w15:restartNumberingAfterBreak="0">
     <w:nsid w:val="32BC2236"/>
     <w:multiLevelType w:val="hybridMultilevel"/>
     <w:tmpl w:val="30F47246"/>
@@ -5829,7 +6445,96 @@
       </w:pPr>
     </w:lvl>
   </w:abstractNum>
-  <w:abstractNum w:abstractNumId="6" w15:restartNumberingAfterBreak="0">
+  <w:abstractNum w:abstractNumId="7" w15:restartNumberingAfterBreak="0">
+    <w:nsid w:val="5CE201C5"/>
+    <w:multiLevelType w:val="hybridMultilevel"/>
+    <w:tmpl w:val="849848D8"/>
+    <w:lvl w:ilvl="0" w:tplc="040C0011">
+      <w:start w:val="1"/>
+      <w:numFmt w:val="decimal"/>
+      <w:lvlText w:val="%1)"/>
+      <w:lvlJc w:val="left"/>
+      <w:pPr>
+        <w:ind w:left="720" w:hanging="360"/>
+      </w:pPr>
+      <w:rPr>
+        <w:rFonts w:hint="default"/>
+      </w:rPr>
+    </w:lvl>
+    <w:lvl w:ilvl="1" w:tplc="040C0019" w:tentative="1">
+      <w:start w:val="1"/>
+      <w:numFmt w:val="lowerLetter"/>
+      <w:lvlText w:val="%2."/>
+      <w:lvlJc w:val="left"/>
+      <w:pPr>
+        <w:ind w:left="1440" w:hanging="360"/>
+      </w:pPr>
+    </w:lvl>
+    <w:lvl w:ilvl="2" w:tplc="040C001B" w:tentative="1">
+      <w:start w:val="1"/>
+      <w:numFmt w:val="lowerRoman"/>
+      <w:lvlText w:val="%3."/>
+      <w:lvlJc w:val="right"/>
+      <w:pPr>
+        <w:ind w:left="2160" w:hanging="180"/>
+      </w:pPr>
+    </w:lvl>
+    <w:lvl w:ilvl="3" w:tplc="040C000F" w:tentative="1">
+      <w:start w:val="1"/>
+      <w:numFmt w:val="decimal"/>
+      <w:lvlText w:val="%4."/>
+      <w:lvlJc w:val="left"/>
+      <w:pPr>
+        <w:ind w:left="2880" w:hanging="360"/>
+      </w:pPr>
+    </w:lvl>
+    <w:lvl w:ilvl="4" w:tplc="040C0019" w:tentative="1">
+      <w:start w:val="1"/>
+      <w:numFmt w:val="lowerLetter"/>
+      <w:lvlText w:val="%5."/>
+      <w:lvlJc w:val="left"/>
+      <w:pPr>
+        <w:ind w:left="3600" w:hanging="360"/>
+      </w:pPr>
+    </w:lvl>
+    <w:lvl w:ilvl="5" w:tplc="040C001B" w:tentative="1">
+      <w:start w:val="1"/>
+      <w:numFmt w:val="lowerRoman"/>
+      <w:lvlText w:val="%6."/>
+      <w:lvlJc w:val="right"/>
+      <w:pPr>
+        <w:ind w:left="4320" w:hanging="180"/>
+      </w:pPr>
+    </w:lvl>
+    <w:lvl w:ilvl="6" w:tplc="040C000F" w:tentative="1">
+      <w:start w:val="1"/>
+      <w:numFmt w:val="decimal"/>
+      <w:lvlText w:val="%7."/>
+      <w:lvlJc w:val="left"/>
+      <w:pPr>
+        <w:ind w:left="5040" w:hanging="360"/>
+      </w:pPr>
+    </w:lvl>
+    <w:lvl w:ilvl="7" w:tplc="040C0019" w:tentative="1">
+      <w:start w:val="1"/>
+      <w:numFmt w:val="lowerLetter"/>
+      <w:lvlText w:val="%8."/>
+      <w:lvlJc w:val="left"/>
+      <w:pPr>
+        <w:ind w:left="5760" w:hanging="360"/>
+      </w:pPr>
+    </w:lvl>
+    <w:lvl w:ilvl="8" w:tplc="040C001B" w:tentative="1">
+      <w:start w:val="1"/>
+      <w:numFmt w:val="lowerRoman"/>
+      <w:lvlText w:val="%9."/>
+      <w:lvlJc w:val="right"/>
+      <w:pPr>
+        <w:ind w:left="6480" w:hanging="180"/>
+      </w:pPr>
+    </w:lvl>
+  </w:abstractNum>
+  <w:abstractNum w:abstractNumId="8" w15:restartNumberingAfterBreak="0">
     <w:nsid w:val="5E0B23B2"/>
     <w:multiLevelType w:val="hybridMultilevel"/>
     <w:tmpl w:val="42507AA4"/>
@@ -5915,7 +6620,7 @@
       </w:pPr>
     </w:lvl>
   </w:abstractNum>
-  <w:abstractNum w:abstractNumId="7" w15:restartNumberingAfterBreak="0">
+  <w:abstractNum w:abstractNumId="9" w15:restartNumberingAfterBreak="0">
     <w:nsid w:val="7EC51315"/>
     <w:multiLevelType w:val="hybridMultilevel"/>
     <w:tmpl w:val="7952CE38"/>
@@ -6008,25 +6713,31 @@
     <w:abstractNumId w:val="2"/>
   </w:num>
   <w:num w:numId="2">
+    <w:abstractNumId w:val="6"/>
+  </w:num>
+  <w:num w:numId="3">
     <w:abstractNumId w:val="5"/>
   </w:num>
-  <w:num w:numId="3">
+  <w:num w:numId="4">
+    <w:abstractNumId w:val="9"/>
+  </w:num>
+  <w:num w:numId="5">
     <w:abstractNumId w:val="4"/>
   </w:num>
-  <w:num w:numId="4">
-    <w:abstractNumId w:val="7"/>
-  </w:num>
-  <w:num w:numId="5">
-    <w:abstractNumId w:val="3"/>
-  </w:num>
   <w:num w:numId="6">
-    <w:abstractNumId w:val="6"/>
+    <w:abstractNumId w:val="8"/>
   </w:num>
   <w:num w:numId="7">
     <w:abstractNumId w:val="0"/>
   </w:num>
   <w:num w:numId="8">
     <w:abstractNumId w:val="1"/>
+  </w:num>
+  <w:num w:numId="9">
+    <w:abstractNumId w:val="7"/>
+  </w:num>
+  <w:num w:numId="10">
+    <w:abstractNumId w:val="3"/>
   </w:num>
 </w:numbering>
 </file>
@@ -6425,7 +7136,7 @@
   <w:style w:type="paragraph" w:default="1" w:styleId="Normal">
     <w:name w:val="Normal"/>
     <w:qFormat/>
-    <w:rsid w:val="003C40FE"/>
+    <w:rsid w:val="00B7184A"/>
   </w:style>
   <w:style w:type="paragraph" w:styleId="Titre1">
     <w:name w:val="heading 1"/>

</xml_diff>

<commit_message>
Partie 5 question 1
</commit_message>
<xml_diff>
--- a/ai-business_assistant.docx
+++ b/ai-business_assistant.docx
@@ -1569,27 +1569,7 @@
           <w:sz w:val="24"/>
           <w:szCs w:val="24"/>
         </w:rPr>
-        <w:t xml:space="preserve">Commentaire : "Le produit est arrivé </w:t>
-      </w:r>
-      <w:proofErr w:type="gramStart"/>
-      <w:r>
-        <w:rPr>
-          <w:rStyle w:val="CodeHTML"/>
-          <w:rFonts w:ascii="Times New Roman" w:eastAsiaTheme="minorHAnsi" w:hAnsi="Times New Roman" w:cs="Times New Roman"/>
-          <w:sz w:val="24"/>
-          <w:szCs w:val="24"/>
-        </w:rPr>
-        <w:t>cassé</w:t>
-      </w:r>
-      <w:proofErr w:type="gramEnd"/>
-      <w:r>
-        <w:rPr>
-          <w:rStyle w:val="CodeHTML"/>
-          <w:rFonts w:ascii="Times New Roman" w:eastAsiaTheme="minorHAnsi" w:hAnsi="Times New Roman" w:cs="Times New Roman"/>
-          <w:sz w:val="24"/>
-          <w:szCs w:val="24"/>
-        </w:rPr>
-        <w:t xml:space="preserve"> et le support ne répond pas."</w:t>
+        <w:t>Commentaire : "Le produit est arrivé cassé et le support ne répond pas."</w:t>
       </w:r>
     </w:p>
     <w:p>
@@ -2072,27 +2052,7 @@
           <w:sz w:val="24"/>
           <w:szCs w:val="24"/>
         </w:rPr>
-        <w:t xml:space="preserve">   (</w:t>
-      </w:r>
-      <w:proofErr w:type="gramStart"/>
-      <w:r>
-        <w:rPr>
-          <w:rStyle w:val="CodeHTML"/>
-          <w:rFonts w:ascii="Times New Roman" w:hAnsi="Times New Roman" w:cs="Times New Roman"/>
-          <w:sz w:val="24"/>
-          <w:szCs w:val="24"/>
-        </w:rPr>
-        <w:t>un</w:t>
-      </w:r>
-      <w:proofErr w:type="gramEnd"/>
-      <w:r>
-        <w:rPr>
-          <w:rStyle w:val="CodeHTML"/>
-          <w:rFonts w:ascii="Times New Roman" w:hAnsi="Times New Roman" w:cs="Times New Roman"/>
-          <w:sz w:val="24"/>
-          <w:szCs w:val="24"/>
-        </w:rPr>
-        <w:t xml:space="preserve"> commentaire mixte penche généralement vers négatif si le problème</w:t>
+        <w:t xml:space="preserve">   (un commentaire mixte penche généralement vers négatif si le problème</w:t>
       </w:r>
     </w:p>
     <w:p>
@@ -2113,27 +2073,7 @@
           <w:sz w:val="24"/>
           <w:szCs w:val="24"/>
         </w:rPr>
-        <w:t xml:space="preserve">   </w:t>
-      </w:r>
-      <w:proofErr w:type="gramStart"/>
-      <w:r>
-        <w:rPr>
-          <w:rStyle w:val="CodeHTML"/>
-          <w:rFonts w:ascii="Times New Roman" w:hAnsi="Times New Roman" w:cs="Times New Roman"/>
-          <w:sz w:val="24"/>
-          <w:szCs w:val="24"/>
-        </w:rPr>
-        <w:t>mentionné</w:t>
-      </w:r>
-      <w:proofErr w:type="gramEnd"/>
-      <w:r>
-        <w:rPr>
-          <w:rStyle w:val="CodeHTML"/>
-          <w:rFonts w:ascii="Times New Roman" w:hAnsi="Times New Roman" w:cs="Times New Roman"/>
-          <w:sz w:val="24"/>
-          <w:szCs w:val="24"/>
-        </w:rPr>
-        <w:t xml:space="preserve"> affecte l'usage du produit).</w:t>
+        <w:t xml:space="preserve">   mentionné affecte l'usage du produit).</w:t>
       </w:r>
     </w:p>
     <w:p>
@@ -2287,25 +2227,14 @@
         <w:t>elements_positifs</w:t>
       </w:r>
       <w:proofErr w:type="spellEnd"/>
-      <w:proofErr w:type="gramStart"/>
-      <w:r>
-        <w:rPr>
-          <w:rStyle w:val="CodeHTML"/>
-          <w:rFonts w:ascii="Times New Roman" w:hAnsi="Times New Roman" w:cs="Times New Roman"/>
-          <w:sz w:val="24"/>
-          <w:szCs w:val="24"/>
-        </w:rPr>
-        <w:t>":</w:t>
-      </w:r>
-      <w:proofErr w:type="gramEnd"/>
-      <w:r>
-        <w:rPr>
-          <w:rStyle w:val="CodeHTML"/>
-          <w:rFonts w:ascii="Times New Roman" w:hAnsi="Times New Roman" w:cs="Times New Roman"/>
-          <w:sz w:val="24"/>
-          <w:szCs w:val="24"/>
-        </w:rPr>
-        <w:t xml:space="preserve"> [...],</w:t>
+      <w:r>
+        <w:rPr>
+          <w:rStyle w:val="CodeHTML"/>
+          <w:rFonts w:ascii="Times New Roman" w:hAnsi="Times New Roman" w:cs="Times New Roman"/>
+          <w:sz w:val="24"/>
+          <w:szCs w:val="24"/>
+        </w:rPr>
+        <w:t>": [...],</w:t>
       </w:r>
     </w:p>
     <w:p>
@@ -2339,25 +2268,14 @@
         <w:t>elements_negatifs</w:t>
       </w:r>
       <w:proofErr w:type="spellEnd"/>
-      <w:proofErr w:type="gramStart"/>
-      <w:r>
-        <w:rPr>
-          <w:rStyle w:val="CodeHTML"/>
-          <w:rFonts w:ascii="Times New Roman" w:hAnsi="Times New Roman" w:cs="Times New Roman"/>
-          <w:sz w:val="24"/>
-          <w:szCs w:val="24"/>
-        </w:rPr>
-        <w:t>":</w:t>
-      </w:r>
-      <w:proofErr w:type="gramEnd"/>
-      <w:r>
-        <w:rPr>
-          <w:rStyle w:val="CodeHTML"/>
-          <w:rFonts w:ascii="Times New Roman" w:hAnsi="Times New Roman" w:cs="Times New Roman"/>
-          <w:sz w:val="24"/>
-          <w:szCs w:val="24"/>
-        </w:rPr>
-        <w:t xml:space="preserve"> [...],</w:t>
+      <w:r>
+        <w:rPr>
+          <w:rStyle w:val="CodeHTML"/>
+          <w:rFonts w:ascii="Times New Roman" w:hAnsi="Times New Roman" w:cs="Times New Roman"/>
+          <w:sz w:val="24"/>
+          <w:szCs w:val="24"/>
+        </w:rPr>
+        <w:t>": [...],</w:t>
       </w:r>
     </w:p>
     <w:p>
@@ -2378,27 +2296,7 @@
           <w:sz w:val="24"/>
           <w:szCs w:val="24"/>
         </w:rPr>
-        <w:t xml:space="preserve">  "classe</w:t>
-      </w:r>
-      <w:proofErr w:type="gramStart"/>
-      <w:r>
-        <w:rPr>
-          <w:rStyle w:val="CodeHTML"/>
-          <w:rFonts w:ascii="Times New Roman" w:hAnsi="Times New Roman" w:cs="Times New Roman"/>
-          <w:sz w:val="24"/>
-          <w:szCs w:val="24"/>
-        </w:rPr>
-        <w:t>":</w:t>
-      </w:r>
-      <w:proofErr w:type="gramEnd"/>
-      <w:r>
-        <w:rPr>
-          <w:rStyle w:val="CodeHTML"/>
-          <w:rFonts w:ascii="Times New Roman" w:hAnsi="Times New Roman" w:cs="Times New Roman"/>
-          <w:sz w:val="24"/>
-          <w:szCs w:val="24"/>
-        </w:rPr>
-        <w:t xml:space="preserve"> "positif | négatif | neutre",</w:t>
+        <w:t xml:space="preserve">  "classe": "positif | négatif | neutre",</w:t>
       </w:r>
     </w:p>
     <w:p>
@@ -2419,27 +2317,7 @@
           <w:sz w:val="24"/>
           <w:szCs w:val="24"/>
         </w:rPr>
-        <w:t xml:space="preserve">  "justification</w:t>
-      </w:r>
-      <w:proofErr w:type="gramStart"/>
-      <w:r>
-        <w:rPr>
-          <w:rStyle w:val="CodeHTML"/>
-          <w:rFonts w:ascii="Times New Roman" w:hAnsi="Times New Roman" w:cs="Times New Roman"/>
-          <w:sz w:val="24"/>
-          <w:szCs w:val="24"/>
-        </w:rPr>
-        <w:t>":</w:t>
-      </w:r>
-      <w:proofErr w:type="gramEnd"/>
-      <w:r>
-        <w:rPr>
-          <w:rStyle w:val="CodeHTML"/>
-          <w:rFonts w:ascii="Times New Roman" w:hAnsi="Times New Roman" w:cs="Times New Roman"/>
-          <w:sz w:val="24"/>
-          <w:szCs w:val="24"/>
-        </w:rPr>
-        <w:t xml:space="preserve"> "..."</w:t>
+        <w:t xml:space="preserve">  "justification": "..."</w:t>
       </w:r>
     </w:p>
     <w:p>
@@ -3292,85 +3170,52 @@
           <w:szCs w:val="24"/>
         </w:rPr>
       </w:pPr>
-      <w:proofErr w:type="gramStart"/>
-      <w:r>
-        <w:rPr>
-          <w:rStyle w:val="CodeHTML"/>
-          <w:rFonts w:ascii="Times New Roman" w:eastAsiaTheme="minorHAnsi" w:hAnsi="Times New Roman" w:cs="Times New Roman"/>
-          <w:sz w:val="24"/>
-          <w:szCs w:val="24"/>
-        </w:rPr>
-        <w:t>pour</w:t>
-      </w:r>
-      <w:proofErr w:type="gramEnd"/>
-      <w:r>
-        <w:rPr>
-          <w:rStyle w:val="CodeHTML"/>
-          <w:rFonts w:ascii="Times New Roman" w:eastAsiaTheme="minorHAnsi" w:hAnsi="Times New Roman" w:cs="Times New Roman"/>
-          <w:sz w:val="24"/>
-          <w:szCs w:val="24"/>
-        </w:rPr>
-        <w:t xml:space="preserve"> lundi, mais nous sommes jeudi et je n'ai toujours rien reçu. Le suivi de ma</w:t>
-      </w:r>
-    </w:p>
-    <w:p>
-      <w:pPr>
-        <w:rPr>
-          <w:rStyle w:val="CodeHTML"/>
-          <w:rFonts w:ascii="Times New Roman" w:eastAsiaTheme="minorHAnsi" w:hAnsi="Times New Roman" w:cs="Times New Roman"/>
-          <w:sz w:val="24"/>
-          <w:szCs w:val="24"/>
-        </w:rPr>
-      </w:pPr>
-      <w:proofErr w:type="gramStart"/>
-      <w:r>
-        <w:rPr>
-          <w:rStyle w:val="CodeHTML"/>
-          <w:rFonts w:ascii="Times New Roman" w:eastAsiaTheme="minorHAnsi" w:hAnsi="Times New Roman" w:cs="Times New Roman"/>
-          <w:sz w:val="24"/>
-          <w:szCs w:val="24"/>
-        </w:rPr>
-        <w:t>commande</w:t>
-      </w:r>
-      <w:proofErr w:type="gramEnd"/>
-      <w:r>
-        <w:rPr>
-          <w:rStyle w:val="CodeHTML"/>
-          <w:rFonts w:ascii="Times New Roman" w:eastAsiaTheme="minorHAnsi" w:hAnsi="Times New Roman" w:cs="Times New Roman"/>
-          <w:sz w:val="24"/>
-          <w:szCs w:val="24"/>
-        </w:rPr>
-        <w:t xml:space="preserve"> n'a pas été mis à jour depuis lundi. J'ai également contacté le service</w:t>
-      </w:r>
-    </w:p>
-    <w:p>
-      <w:pPr>
-        <w:rPr>
-          <w:rStyle w:val="CodeHTML"/>
-          <w:rFonts w:ascii="Times New Roman" w:eastAsiaTheme="minorHAnsi" w:hAnsi="Times New Roman" w:cs="Times New Roman"/>
-          <w:sz w:val="24"/>
-          <w:szCs w:val="24"/>
-        </w:rPr>
-      </w:pPr>
-      <w:proofErr w:type="gramStart"/>
-      <w:r>
-        <w:rPr>
-          <w:rStyle w:val="CodeHTML"/>
-          <w:rFonts w:ascii="Times New Roman" w:eastAsiaTheme="minorHAnsi" w:hAnsi="Times New Roman" w:cs="Times New Roman"/>
-          <w:sz w:val="24"/>
-          <w:szCs w:val="24"/>
-        </w:rPr>
-        <w:t>client</w:t>
-      </w:r>
-      <w:proofErr w:type="gramEnd"/>
-      <w:r>
-        <w:rPr>
-          <w:rStyle w:val="CodeHTML"/>
-          <w:rFonts w:ascii="Times New Roman" w:eastAsiaTheme="minorHAnsi" w:hAnsi="Times New Roman" w:cs="Times New Roman"/>
-          <w:sz w:val="24"/>
-          <w:szCs w:val="24"/>
-        </w:rPr>
-        <w:t xml:space="preserve"> mardi, mais je n'ai reçu aucune réponse jusqu'à présent.</w:t>
+      <w:r>
+        <w:rPr>
+          <w:rStyle w:val="CodeHTML"/>
+          <w:rFonts w:ascii="Times New Roman" w:eastAsiaTheme="minorHAnsi" w:hAnsi="Times New Roman" w:cs="Times New Roman"/>
+          <w:sz w:val="24"/>
+          <w:szCs w:val="24"/>
+        </w:rPr>
+        <w:t>pour lundi, mais nous sommes jeudi et je n'ai toujours rien reçu. Le suivi de ma</w:t>
+      </w:r>
+    </w:p>
+    <w:p>
+      <w:pPr>
+        <w:rPr>
+          <w:rStyle w:val="CodeHTML"/>
+          <w:rFonts w:ascii="Times New Roman" w:eastAsiaTheme="minorHAnsi" w:hAnsi="Times New Roman" w:cs="Times New Roman"/>
+          <w:sz w:val="24"/>
+          <w:szCs w:val="24"/>
+        </w:rPr>
+      </w:pPr>
+      <w:r>
+        <w:rPr>
+          <w:rStyle w:val="CodeHTML"/>
+          <w:rFonts w:ascii="Times New Roman" w:eastAsiaTheme="minorHAnsi" w:hAnsi="Times New Roman" w:cs="Times New Roman"/>
+          <w:sz w:val="24"/>
+          <w:szCs w:val="24"/>
+        </w:rPr>
+        <w:t>commande n'a pas été mis à jour depuis lundi. J'ai également contacté le service</w:t>
+      </w:r>
+    </w:p>
+    <w:p>
+      <w:pPr>
+        <w:rPr>
+          <w:rStyle w:val="CodeHTML"/>
+          <w:rFonts w:ascii="Times New Roman" w:eastAsiaTheme="minorHAnsi" w:hAnsi="Times New Roman" w:cs="Times New Roman"/>
+          <w:sz w:val="24"/>
+          <w:szCs w:val="24"/>
+        </w:rPr>
+      </w:pPr>
+      <w:r>
+        <w:rPr>
+          <w:rStyle w:val="CodeHTML"/>
+          <w:rFonts w:ascii="Times New Roman" w:eastAsiaTheme="minorHAnsi" w:hAnsi="Times New Roman" w:cs="Times New Roman"/>
+          <w:sz w:val="24"/>
+          <w:szCs w:val="24"/>
+        </w:rPr>
+        <w:t>client mardi, mais je n'ai reçu aucune réponse jusqu'à présent.</w:t>
       </w:r>
     </w:p>
     <w:p>
@@ -3970,64 +3815,33 @@
         <w:t>informations_non_justifiees</w:t>
       </w:r>
       <w:proofErr w:type="spellEnd"/>
-      <w:proofErr w:type="gramStart"/>
-      <w:r>
-        <w:rPr>
-          <w:rStyle w:val="CodeHTML"/>
-          <w:rFonts w:ascii="Times New Roman" w:eastAsiaTheme="minorHAnsi" w:hAnsi="Times New Roman" w:cs="Times New Roman"/>
-          <w:sz w:val="24"/>
-          <w:szCs w:val="24"/>
-        </w:rPr>
-        <w:t>":</w:t>
-      </w:r>
-      <w:proofErr w:type="gramEnd"/>
-      <w:r>
-        <w:rPr>
-          <w:rStyle w:val="CodeHTML"/>
-          <w:rFonts w:ascii="Times New Roman" w:eastAsiaTheme="minorHAnsi" w:hAnsi="Times New Roman" w:cs="Times New Roman"/>
-          <w:sz w:val="24"/>
-          <w:szCs w:val="24"/>
-        </w:rPr>
-        <w:t xml:space="preserve"> [...],</w:t>
-      </w:r>
-    </w:p>
-    <w:p>
-      <w:pPr>
-        <w:rPr>
-          <w:rStyle w:val="CodeHTML"/>
-          <w:rFonts w:ascii="Times New Roman" w:eastAsiaTheme="minorHAnsi" w:hAnsi="Times New Roman" w:cs="Times New Roman"/>
-          <w:sz w:val="24"/>
-          <w:szCs w:val="24"/>
-        </w:rPr>
-      </w:pPr>
-      <w:r>
-        <w:rPr>
-          <w:rStyle w:val="CodeHTML"/>
-          <w:rFonts w:ascii="Times New Roman" w:eastAsiaTheme="minorHAnsi" w:hAnsi="Times New Roman" w:cs="Times New Roman"/>
-          <w:sz w:val="24"/>
-          <w:szCs w:val="24"/>
-        </w:rPr>
-        <w:t xml:space="preserve">  "contradictions</w:t>
-      </w:r>
-      <w:proofErr w:type="gramStart"/>
-      <w:r>
-        <w:rPr>
-          <w:rStyle w:val="CodeHTML"/>
-          <w:rFonts w:ascii="Times New Roman" w:eastAsiaTheme="minorHAnsi" w:hAnsi="Times New Roman" w:cs="Times New Roman"/>
-          <w:sz w:val="24"/>
-          <w:szCs w:val="24"/>
-        </w:rPr>
-        <w:t>":</w:t>
-      </w:r>
-      <w:proofErr w:type="gramEnd"/>
-      <w:r>
-        <w:rPr>
-          <w:rStyle w:val="CodeHTML"/>
-          <w:rFonts w:ascii="Times New Roman" w:eastAsiaTheme="minorHAnsi" w:hAnsi="Times New Roman" w:cs="Times New Roman"/>
-          <w:sz w:val="24"/>
-          <w:szCs w:val="24"/>
-        </w:rPr>
-        <w:t xml:space="preserve"> [...],</w:t>
+      <w:r>
+        <w:rPr>
+          <w:rStyle w:val="CodeHTML"/>
+          <w:rFonts w:ascii="Times New Roman" w:eastAsiaTheme="minorHAnsi" w:hAnsi="Times New Roman" w:cs="Times New Roman"/>
+          <w:sz w:val="24"/>
+          <w:szCs w:val="24"/>
+        </w:rPr>
+        <w:t>": [...],</w:t>
+      </w:r>
+    </w:p>
+    <w:p>
+      <w:pPr>
+        <w:rPr>
+          <w:rStyle w:val="CodeHTML"/>
+          <w:rFonts w:ascii="Times New Roman" w:eastAsiaTheme="minorHAnsi" w:hAnsi="Times New Roman" w:cs="Times New Roman"/>
+          <w:sz w:val="24"/>
+          <w:szCs w:val="24"/>
+        </w:rPr>
+      </w:pPr>
+      <w:r>
+        <w:rPr>
+          <w:rStyle w:val="CodeHTML"/>
+          <w:rFonts w:ascii="Times New Roman" w:eastAsiaTheme="minorHAnsi" w:hAnsi="Times New Roman" w:cs="Times New Roman"/>
+          <w:sz w:val="24"/>
+          <w:szCs w:val="24"/>
+        </w:rPr>
+        <w:t xml:space="preserve">  "contradictions": [...],</w:t>
       </w:r>
     </w:p>
     <w:p>
@@ -4059,64 +3873,33 @@
         <w:t>informations_absentes</w:t>
       </w:r>
       <w:proofErr w:type="spellEnd"/>
-      <w:proofErr w:type="gramStart"/>
-      <w:r>
-        <w:rPr>
-          <w:rStyle w:val="CodeHTML"/>
-          <w:rFonts w:ascii="Times New Roman" w:eastAsiaTheme="minorHAnsi" w:hAnsi="Times New Roman" w:cs="Times New Roman"/>
-          <w:sz w:val="24"/>
-          <w:szCs w:val="24"/>
-        </w:rPr>
-        <w:t>":</w:t>
-      </w:r>
-      <w:proofErr w:type="gramEnd"/>
-      <w:r>
-        <w:rPr>
-          <w:rStyle w:val="CodeHTML"/>
-          <w:rFonts w:ascii="Times New Roman" w:eastAsiaTheme="minorHAnsi" w:hAnsi="Times New Roman" w:cs="Times New Roman"/>
-          <w:sz w:val="24"/>
-          <w:szCs w:val="24"/>
-        </w:rPr>
-        <w:t xml:space="preserve"> [...],</w:t>
-      </w:r>
-    </w:p>
-    <w:p>
-      <w:pPr>
-        <w:rPr>
-          <w:rStyle w:val="CodeHTML"/>
-          <w:rFonts w:ascii="Times New Roman" w:eastAsiaTheme="minorHAnsi" w:hAnsi="Times New Roman" w:cs="Times New Roman"/>
-          <w:sz w:val="24"/>
-          <w:szCs w:val="24"/>
-        </w:rPr>
-      </w:pPr>
-      <w:r>
-        <w:rPr>
-          <w:rStyle w:val="CodeHTML"/>
-          <w:rFonts w:ascii="Times New Roman" w:eastAsiaTheme="minorHAnsi" w:hAnsi="Times New Roman" w:cs="Times New Roman"/>
-          <w:sz w:val="24"/>
-          <w:szCs w:val="24"/>
-        </w:rPr>
-        <w:t xml:space="preserve">  "hallucinations</w:t>
-      </w:r>
-      <w:proofErr w:type="gramStart"/>
-      <w:r>
-        <w:rPr>
-          <w:rStyle w:val="CodeHTML"/>
-          <w:rFonts w:ascii="Times New Roman" w:eastAsiaTheme="minorHAnsi" w:hAnsi="Times New Roman" w:cs="Times New Roman"/>
-          <w:sz w:val="24"/>
-          <w:szCs w:val="24"/>
-        </w:rPr>
-        <w:t>":</w:t>
-      </w:r>
-      <w:proofErr w:type="gramEnd"/>
-      <w:r>
-        <w:rPr>
-          <w:rStyle w:val="CodeHTML"/>
-          <w:rFonts w:ascii="Times New Roman" w:eastAsiaTheme="minorHAnsi" w:hAnsi="Times New Roman" w:cs="Times New Roman"/>
-          <w:sz w:val="24"/>
-          <w:szCs w:val="24"/>
-        </w:rPr>
-        <w:t xml:space="preserve"> [...],</w:t>
+      <w:r>
+        <w:rPr>
+          <w:rStyle w:val="CodeHTML"/>
+          <w:rFonts w:ascii="Times New Roman" w:eastAsiaTheme="minorHAnsi" w:hAnsi="Times New Roman" w:cs="Times New Roman"/>
+          <w:sz w:val="24"/>
+          <w:szCs w:val="24"/>
+        </w:rPr>
+        <w:t>": [...],</w:t>
+      </w:r>
+    </w:p>
+    <w:p>
+      <w:pPr>
+        <w:rPr>
+          <w:rStyle w:val="CodeHTML"/>
+          <w:rFonts w:ascii="Times New Roman" w:eastAsiaTheme="minorHAnsi" w:hAnsi="Times New Roman" w:cs="Times New Roman"/>
+          <w:sz w:val="24"/>
+          <w:szCs w:val="24"/>
+        </w:rPr>
+      </w:pPr>
+      <w:r>
+        <w:rPr>
+          <w:rStyle w:val="CodeHTML"/>
+          <w:rFonts w:ascii="Times New Roman" w:eastAsiaTheme="minorHAnsi" w:hAnsi="Times New Roman" w:cs="Times New Roman"/>
+          <w:sz w:val="24"/>
+          <w:szCs w:val="24"/>
+        </w:rPr>
+        <w:t xml:space="preserve">  "hallucinations": [...],</w:t>
       </w:r>
     </w:p>
     <w:p>
@@ -4148,25 +3931,14 @@
         <w:t>contraintes_respectees</w:t>
       </w:r>
       <w:proofErr w:type="spellEnd"/>
-      <w:proofErr w:type="gramStart"/>
-      <w:r>
-        <w:rPr>
-          <w:rStyle w:val="CodeHTML"/>
-          <w:rFonts w:ascii="Times New Roman" w:eastAsiaTheme="minorHAnsi" w:hAnsi="Times New Roman" w:cs="Times New Roman"/>
-          <w:sz w:val="24"/>
-          <w:szCs w:val="24"/>
-        </w:rPr>
-        <w:t>":</w:t>
-      </w:r>
-      <w:proofErr w:type="gramEnd"/>
-      <w:r>
-        <w:rPr>
-          <w:rStyle w:val="CodeHTML"/>
-          <w:rFonts w:ascii="Times New Roman" w:eastAsiaTheme="minorHAnsi" w:hAnsi="Times New Roman" w:cs="Times New Roman"/>
-          <w:sz w:val="24"/>
-          <w:szCs w:val="24"/>
-        </w:rPr>
-        <w:t xml:space="preserve"> </w:t>
+      <w:r>
+        <w:rPr>
+          <w:rStyle w:val="CodeHTML"/>
+          <w:rFonts w:ascii="Times New Roman" w:eastAsiaTheme="minorHAnsi" w:hAnsi="Times New Roman" w:cs="Times New Roman"/>
+          <w:sz w:val="24"/>
+          <w:szCs w:val="24"/>
+        </w:rPr>
+        <w:t xml:space="preserve">": </w:t>
       </w:r>
       <w:proofErr w:type="spellStart"/>
       <w:r>
@@ -4218,25 +3990,14 @@
         <w:t>verdict_global</w:t>
       </w:r>
       <w:proofErr w:type="spellEnd"/>
-      <w:proofErr w:type="gramStart"/>
-      <w:r>
-        <w:rPr>
-          <w:rStyle w:val="CodeHTML"/>
-          <w:rFonts w:ascii="Times New Roman" w:eastAsiaTheme="minorHAnsi" w:hAnsi="Times New Roman" w:cs="Times New Roman"/>
-          <w:sz w:val="24"/>
-          <w:szCs w:val="24"/>
-        </w:rPr>
-        <w:t>":</w:t>
-      </w:r>
-      <w:proofErr w:type="gramEnd"/>
-      <w:r>
-        <w:rPr>
-          <w:rStyle w:val="CodeHTML"/>
-          <w:rFonts w:ascii="Times New Roman" w:eastAsiaTheme="minorHAnsi" w:hAnsi="Times New Roman" w:cs="Times New Roman"/>
-          <w:sz w:val="24"/>
-          <w:szCs w:val="24"/>
-        </w:rPr>
-        <w:t xml:space="preserve"> "..."</w:t>
+      <w:r>
+        <w:rPr>
+          <w:rStyle w:val="CodeHTML"/>
+          <w:rFonts w:ascii="Times New Roman" w:eastAsiaTheme="minorHAnsi" w:hAnsi="Times New Roman" w:cs="Times New Roman"/>
+          <w:sz w:val="24"/>
+          <w:szCs w:val="24"/>
+        </w:rPr>
+        <w:t>": "..."</w:t>
       </w:r>
     </w:p>
     <w:p>
@@ -4906,25 +4667,7 @@
           <w:sz w:val="24"/>
           <w:szCs w:val="24"/>
         </w:rPr>
-        <w:t xml:space="preserve">  "sentiment</w:t>
-      </w:r>
-      <w:proofErr w:type="gramStart"/>
-      <w:r>
-        <w:rPr>
-          <w:rFonts w:ascii="Times New Roman" w:hAnsi="Times New Roman" w:cs="Times New Roman"/>
-          <w:sz w:val="24"/>
-          <w:szCs w:val="24"/>
-        </w:rPr>
-        <w:t>":</w:t>
-      </w:r>
-      <w:proofErr w:type="gramEnd"/>
-      <w:r>
-        <w:rPr>
-          <w:rFonts w:ascii="Times New Roman" w:hAnsi="Times New Roman" w:cs="Times New Roman"/>
-          <w:sz w:val="24"/>
-          <w:szCs w:val="24"/>
-        </w:rPr>
-        <w:t xml:space="preserve"> "</w:t>
+        <w:t xml:space="preserve">  "sentiment": "</w:t>
       </w:r>
       <w:proofErr w:type="spellStart"/>
       <w:r>
@@ -4972,23 +4715,13 @@
         <w:t>categorie</w:t>
       </w:r>
       <w:proofErr w:type="spellEnd"/>
-      <w:proofErr w:type="gramStart"/>
-      <w:r>
-        <w:rPr>
-          <w:rFonts w:ascii="Times New Roman" w:hAnsi="Times New Roman" w:cs="Times New Roman"/>
-          <w:sz w:val="24"/>
-          <w:szCs w:val="24"/>
-        </w:rPr>
-        <w:t>":</w:t>
-      </w:r>
-      <w:proofErr w:type="gramEnd"/>
-      <w:r>
-        <w:rPr>
-          <w:rFonts w:ascii="Times New Roman" w:hAnsi="Times New Roman" w:cs="Times New Roman"/>
-          <w:sz w:val="24"/>
-          <w:szCs w:val="24"/>
-        </w:rPr>
-        <w:t xml:space="preserve"> "livraison",</w:t>
+      <w:r>
+        <w:rPr>
+          <w:rFonts w:ascii="Times New Roman" w:hAnsi="Times New Roman" w:cs="Times New Roman"/>
+          <w:sz w:val="24"/>
+          <w:szCs w:val="24"/>
+        </w:rPr>
+        <w:t>": "livraison",</w:t>
       </w:r>
     </w:p>
     <w:p>
@@ -5006,25 +4739,7 @@
           <w:sz w:val="24"/>
           <w:szCs w:val="24"/>
         </w:rPr>
-        <w:t xml:space="preserve">  "urgence</w:t>
-      </w:r>
-      <w:proofErr w:type="gramStart"/>
-      <w:r>
-        <w:rPr>
-          <w:rFonts w:ascii="Times New Roman" w:hAnsi="Times New Roman" w:cs="Times New Roman"/>
-          <w:sz w:val="24"/>
-          <w:szCs w:val="24"/>
-        </w:rPr>
-        <w:t>":</w:t>
-      </w:r>
-      <w:proofErr w:type="gramEnd"/>
-      <w:r>
-        <w:rPr>
-          <w:rFonts w:ascii="Times New Roman" w:hAnsi="Times New Roman" w:cs="Times New Roman"/>
-          <w:sz w:val="24"/>
-          <w:szCs w:val="24"/>
-        </w:rPr>
-        <w:t xml:space="preserve"> "moyenne",</w:t>
+        <w:t xml:space="preserve">  "urgence": "moyenne",</w:t>
       </w:r>
     </w:p>
     <w:p>
@@ -5054,23 +4769,13 @@
         <w:t>probleme</w:t>
       </w:r>
       <w:proofErr w:type="spellEnd"/>
-      <w:proofErr w:type="gramStart"/>
-      <w:r>
-        <w:rPr>
-          <w:rFonts w:ascii="Times New Roman" w:hAnsi="Times New Roman" w:cs="Times New Roman"/>
-          <w:sz w:val="24"/>
-          <w:szCs w:val="24"/>
-        </w:rPr>
-        <w:t>":</w:t>
-      </w:r>
-      <w:proofErr w:type="gramEnd"/>
-      <w:r>
-        <w:rPr>
-          <w:rFonts w:ascii="Times New Roman" w:hAnsi="Times New Roman" w:cs="Times New Roman"/>
-          <w:sz w:val="24"/>
-          <w:szCs w:val="24"/>
-        </w:rPr>
-        <w:t xml:space="preserve"> "Retard de livraison",</w:t>
+      <w:r>
+        <w:rPr>
+          <w:rFonts w:ascii="Times New Roman" w:hAnsi="Times New Roman" w:cs="Times New Roman"/>
+          <w:sz w:val="24"/>
+          <w:szCs w:val="24"/>
+        </w:rPr>
+        <w:t>": "Retard de livraison",</w:t>
       </w:r>
     </w:p>
     <w:p>
@@ -5088,25 +4793,7 @@
           <w:sz w:val="24"/>
           <w:szCs w:val="24"/>
         </w:rPr>
-        <w:t xml:space="preserve">  "confiance</w:t>
-      </w:r>
-      <w:proofErr w:type="gramStart"/>
-      <w:r>
-        <w:rPr>
-          <w:rFonts w:ascii="Times New Roman" w:hAnsi="Times New Roman" w:cs="Times New Roman"/>
-          <w:sz w:val="24"/>
-          <w:szCs w:val="24"/>
-        </w:rPr>
-        <w:t>":</w:t>
-      </w:r>
-      <w:proofErr w:type="gramEnd"/>
-      <w:r>
-        <w:rPr>
-          <w:rFonts w:ascii="Times New Roman" w:hAnsi="Times New Roman" w:cs="Times New Roman"/>
-          <w:sz w:val="24"/>
-          <w:szCs w:val="24"/>
-        </w:rPr>
-        <w:t xml:space="preserve"> 0.91</w:t>
+        <w:t xml:space="preserve">  "confiance": 0.91</w:t>
       </w:r>
     </w:p>
     <w:p>
@@ -5546,18 +5233,8 @@
           <w:sz w:val="24"/>
           <w:szCs w:val="24"/>
         </w:rPr>
-        <w:t xml:space="preserve">Si une valeur ne peut pas être déterminée avec certitude, choisis la valeur </w:t>
-      </w:r>
-      <w:proofErr w:type="gramStart"/>
-      <w:r>
-        <w:rPr>
-          <w:rFonts w:ascii="Times New Roman" w:hAnsi="Times New Roman" w:cs="Times New Roman"/>
-          <w:sz w:val="24"/>
-          <w:szCs w:val="24"/>
-        </w:rPr>
-        <w:t>la</w:t>
-      </w:r>
-      <w:proofErr w:type="gramEnd"/>
+        <w:t>Si une valeur ne peut pas être déterminée avec certitude, choisis la valeur la</w:t>
+      </w:r>
     </w:p>
     <w:p>
       <w:pPr>
@@ -5750,6 +5427,658 @@
         </w:drawing>
       </w:r>
     </w:p>
+    <w:p>
+      <w:pPr>
+        <w:rPr>
+          <w:rFonts w:ascii="Times New Roman" w:hAnsi="Times New Roman" w:cs="Times New Roman"/>
+          <w:b/>
+          <w:bCs/>
+          <w:sz w:val="24"/>
+          <w:szCs w:val="24"/>
+        </w:rPr>
+      </w:pPr>
+    </w:p>
+    <w:p>
+      <w:pPr>
+        <w:rPr>
+          <w:rFonts w:ascii="Times New Roman" w:hAnsi="Times New Roman" w:cs="Times New Roman"/>
+          <w:sz w:val="36"/>
+          <w:szCs w:val="36"/>
+        </w:rPr>
+      </w:pPr>
+      <w:r>
+        <w:rPr>
+          <w:rFonts w:ascii="Times New Roman" w:hAnsi="Times New Roman" w:cs="Times New Roman"/>
+          <w:sz w:val="36"/>
+          <w:szCs w:val="36"/>
+        </w:rPr>
+        <w:t>Partie 5</w:t>
+      </w:r>
+      <w:r>
+        <w:rPr>
+          <w:rFonts w:ascii="Times New Roman" w:hAnsi="Times New Roman" w:cs="Times New Roman"/>
+          <w:sz w:val="36"/>
+          <w:szCs w:val="36"/>
+        </w:rPr>
+        <w:t xml:space="preserve"> : </w:t>
+      </w:r>
+      <w:r>
+        <w:rPr>
+          <w:rFonts w:ascii="Times New Roman" w:hAnsi="Times New Roman" w:cs="Times New Roman"/>
+          <w:sz w:val="36"/>
+          <w:szCs w:val="36"/>
+        </w:rPr>
+        <w:t>Prompts pour les applications métier</w:t>
+      </w:r>
+    </w:p>
+    <w:p>
+      <w:pPr>
+        <w:pStyle w:val="Titre2"/>
+        <w:rPr>
+          <w:sz w:val="28"/>
+          <w:szCs w:val="28"/>
+        </w:rPr>
+      </w:pPr>
+      <w:r>
+        <w:rPr>
+          <w:sz w:val="28"/>
+          <w:szCs w:val="28"/>
+        </w:rPr>
+        <w:t>1) Résumé de document (≤ 250 mots)</w:t>
+      </w:r>
+    </w:p>
+    <w:p>
+      <w:pPr>
+        <w:pStyle w:val="PrformatHTML"/>
+        <w:rPr>
+          <w:rStyle w:val="CodeHTML"/>
+          <w:rFonts w:ascii="Times New Roman" w:hAnsi="Times New Roman" w:cs="Times New Roman"/>
+          <w:sz w:val="24"/>
+          <w:szCs w:val="24"/>
+        </w:rPr>
+      </w:pPr>
+      <w:r>
+        <w:rPr>
+          <w:rStyle w:val="CodeHTML"/>
+          <w:rFonts w:ascii="Times New Roman" w:hAnsi="Times New Roman" w:cs="Times New Roman"/>
+          <w:b/>
+          <w:bCs/>
+          <w:sz w:val="24"/>
+          <w:szCs w:val="24"/>
+        </w:rPr>
+        <w:t>Rôle</w:t>
+      </w:r>
+      <w:r>
+        <w:rPr>
+          <w:rStyle w:val="CodeHTML"/>
+          <w:rFonts w:ascii="Times New Roman" w:hAnsi="Times New Roman" w:cs="Times New Roman"/>
+          <w:sz w:val="24"/>
+          <w:szCs w:val="24"/>
+        </w:rPr>
+        <w:t xml:space="preserve"> : </w:t>
+      </w:r>
+      <w:r>
+        <w:rPr>
+          <w:rStyle w:val="CodeHTML"/>
+          <w:rFonts w:ascii="Times New Roman" w:hAnsi="Times New Roman" w:cs="Times New Roman"/>
+          <w:sz w:val="24"/>
+          <w:szCs w:val="24"/>
+        </w:rPr>
+        <w:t>Tu es un assistant de synthèse documentaire professionnel.</w:t>
+      </w:r>
+    </w:p>
+    <w:p>
+      <w:pPr>
+        <w:pStyle w:val="PrformatHTML"/>
+        <w:rPr>
+          <w:rStyle w:val="CodeHTML"/>
+          <w:rFonts w:ascii="Times New Roman" w:hAnsi="Times New Roman" w:cs="Times New Roman"/>
+          <w:sz w:val="24"/>
+          <w:szCs w:val="24"/>
+        </w:rPr>
+      </w:pPr>
+    </w:p>
+    <w:p>
+      <w:pPr>
+        <w:pStyle w:val="PrformatHTML"/>
+        <w:rPr>
+          <w:rStyle w:val="CodeHTML"/>
+          <w:rFonts w:ascii="Times New Roman" w:hAnsi="Times New Roman" w:cs="Times New Roman"/>
+          <w:sz w:val="24"/>
+          <w:szCs w:val="24"/>
+        </w:rPr>
+      </w:pPr>
+      <w:r>
+        <w:rPr>
+          <w:rStyle w:val="CodeHTML"/>
+          <w:rFonts w:ascii="Times New Roman" w:hAnsi="Times New Roman" w:cs="Times New Roman"/>
+          <w:b/>
+          <w:bCs/>
+          <w:sz w:val="24"/>
+          <w:szCs w:val="24"/>
+        </w:rPr>
+        <w:t>Tâche</w:t>
+      </w:r>
+      <w:r>
+        <w:rPr>
+          <w:rStyle w:val="CodeHTML"/>
+          <w:rFonts w:ascii="Times New Roman" w:hAnsi="Times New Roman" w:cs="Times New Roman"/>
+          <w:sz w:val="24"/>
+          <w:szCs w:val="24"/>
+        </w:rPr>
+        <w:t xml:space="preserve"> : Résume le document ci-dessous en respectant STRICTEMENT  </w:t>
+      </w:r>
+    </w:p>
+    <w:p>
+      <w:pPr>
+        <w:pStyle w:val="PrformatHTML"/>
+        <w:rPr>
+          <w:rStyle w:val="CodeHTML"/>
+          <w:rFonts w:ascii="Times New Roman" w:hAnsi="Times New Roman" w:cs="Times New Roman"/>
+          <w:sz w:val="24"/>
+          <w:szCs w:val="24"/>
+        </w:rPr>
+      </w:pPr>
+      <w:r>
+        <w:rPr>
+          <w:rStyle w:val="CodeHTML"/>
+          <w:rFonts w:ascii="Times New Roman" w:hAnsi="Times New Roman" w:cs="Times New Roman"/>
+          <w:sz w:val="24"/>
+          <w:szCs w:val="24"/>
+        </w:rPr>
+        <w:t>C</w:t>
+      </w:r>
+      <w:r>
+        <w:rPr>
+          <w:rStyle w:val="CodeHTML"/>
+          <w:rFonts w:ascii="Times New Roman" w:hAnsi="Times New Roman" w:cs="Times New Roman"/>
+          <w:sz w:val="24"/>
+          <w:szCs w:val="24"/>
+        </w:rPr>
+        <w:t>ontraintes</w:t>
+      </w:r>
+      <w:r>
+        <w:rPr>
+          <w:rStyle w:val="CodeHTML"/>
+          <w:rFonts w:ascii="Times New Roman" w:hAnsi="Times New Roman" w:cs="Times New Roman"/>
+          <w:sz w:val="24"/>
+          <w:szCs w:val="24"/>
+        </w:rPr>
+        <w:t> :</w:t>
+      </w:r>
+    </w:p>
+    <w:p>
+      <w:pPr>
+        <w:pStyle w:val="PrformatHTML"/>
+        <w:numPr>
+          <w:ilvl w:val="0"/>
+          <w:numId w:val="11"/>
+        </w:numPr>
+        <w:rPr>
+          <w:rStyle w:val="CodeHTML"/>
+          <w:rFonts w:ascii="Times New Roman" w:hAnsi="Times New Roman" w:cs="Times New Roman"/>
+          <w:sz w:val="24"/>
+          <w:szCs w:val="24"/>
+        </w:rPr>
+      </w:pPr>
+      <w:r>
+        <w:rPr>
+          <w:rStyle w:val="CodeHTML"/>
+          <w:rFonts w:ascii="Times New Roman" w:hAnsi="Times New Roman" w:cs="Times New Roman"/>
+          <w:sz w:val="24"/>
+          <w:szCs w:val="24"/>
+        </w:rPr>
+        <w:t>Maximum 250 mots.</w:t>
+      </w:r>
+    </w:p>
+    <w:p>
+      <w:pPr>
+        <w:pStyle w:val="PrformatHTML"/>
+        <w:numPr>
+          <w:ilvl w:val="0"/>
+          <w:numId w:val="11"/>
+        </w:numPr>
+        <w:rPr>
+          <w:rStyle w:val="CodeHTML"/>
+          <w:rFonts w:ascii="Times New Roman" w:hAnsi="Times New Roman" w:cs="Times New Roman"/>
+          <w:sz w:val="24"/>
+          <w:szCs w:val="24"/>
+        </w:rPr>
+      </w:pPr>
+      <w:r>
+        <w:rPr>
+          <w:rStyle w:val="CodeHTML"/>
+          <w:rFonts w:ascii="Times New Roman" w:hAnsi="Times New Roman" w:cs="Times New Roman"/>
+          <w:sz w:val="24"/>
+          <w:szCs w:val="24"/>
+        </w:rPr>
+        <w:t>Conserve uniquement les informations factuelles présentes dans le document.</w:t>
+      </w:r>
+    </w:p>
+    <w:p>
+      <w:pPr>
+        <w:pStyle w:val="PrformatHTML"/>
+        <w:numPr>
+          <w:ilvl w:val="0"/>
+          <w:numId w:val="11"/>
+        </w:numPr>
+        <w:rPr>
+          <w:rStyle w:val="CodeHTML"/>
+          <w:rFonts w:ascii="Times New Roman" w:hAnsi="Times New Roman" w:cs="Times New Roman"/>
+          <w:sz w:val="24"/>
+          <w:szCs w:val="24"/>
+        </w:rPr>
+      </w:pPr>
+      <w:r>
+        <w:rPr>
+          <w:rStyle w:val="CodeHTML"/>
+          <w:rFonts w:ascii="Times New Roman" w:hAnsi="Times New Roman" w:cs="Times New Roman"/>
+          <w:sz w:val="24"/>
+          <w:szCs w:val="24"/>
+        </w:rPr>
+        <w:t>Identifie clairement les objectifs du document.</w:t>
+      </w:r>
+    </w:p>
+    <w:p>
+      <w:pPr>
+        <w:pStyle w:val="PrformatHTML"/>
+        <w:numPr>
+          <w:ilvl w:val="0"/>
+          <w:numId w:val="11"/>
+        </w:numPr>
+        <w:rPr>
+          <w:rStyle w:val="CodeHTML"/>
+          <w:rFonts w:ascii="Times New Roman" w:hAnsi="Times New Roman" w:cs="Times New Roman"/>
+          <w:sz w:val="24"/>
+          <w:szCs w:val="24"/>
+        </w:rPr>
+      </w:pPr>
+      <w:r>
+        <w:rPr>
+          <w:rStyle w:val="CodeHTML"/>
+          <w:rFonts w:ascii="Times New Roman" w:hAnsi="Times New Roman" w:cs="Times New Roman"/>
+          <w:sz w:val="24"/>
+          <w:szCs w:val="24"/>
+        </w:rPr>
+        <w:t>Identifie clairement les résultats présentés.</w:t>
+      </w:r>
+    </w:p>
+    <w:p>
+      <w:pPr>
+        <w:pStyle w:val="PrformatHTML"/>
+        <w:numPr>
+          <w:ilvl w:val="0"/>
+          <w:numId w:val="11"/>
+        </w:numPr>
+        <w:rPr>
+          <w:rStyle w:val="CodeHTML"/>
+          <w:rFonts w:ascii="Times New Roman" w:hAnsi="Times New Roman" w:cs="Times New Roman"/>
+          <w:sz w:val="24"/>
+          <w:szCs w:val="24"/>
+        </w:rPr>
+      </w:pPr>
+      <w:r>
+        <w:rPr>
+          <w:rStyle w:val="CodeHTML"/>
+          <w:rFonts w:ascii="Times New Roman" w:hAnsi="Times New Roman" w:cs="Times New Roman"/>
+          <w:sz w:val="24"/>
+          <w:szCs w:val="24"/>
+        </w:rPr>
+        <w:t>Identifie clairement les recommandations, si elles existent.</w:t>
+      </w:r>
+    </w:p>
+    <w:p>
+      <w:pPr>
+        <w:pStyle w:val="PrformatHTML"/>
+        <w:numPr>
+          <w:ilvl w:val="0"/>
+          <w:numId w:val="11"/>
+        </w:numPr>
+        <w:rPr>
+          <w:rStyle w:val="CodeHTML"/>
+          <w:rFonts w:ascii="Times New Roman" w:hAnsi="Times New Roman" w:cs="Times New Roman"/>
+          <w:sz w:val="24"/>
+          <w:szCs w:val="24"/>
+        </w:rPr>
+      </w:pPr>
+      <w:r>
+        <w:rPr>
+          <w:rStyle w:val="CodeHTML"/>
+          <w:rFonts w:ascii="Times New Roman" w:hAnsi="Times New Roman" w:cs="Times New Roman"/>
+          <w:sz w:val="24"/>
+          <w:szCs w:val="24"/>
+        </w:rPr>
+        <w:t>N'invente aucune information absente du document.</w:t>
+      </w:r>
+    </w:p>
+    <w:p>
+      <w:pPr>
+        <w:pStyle w:val="PrformatHTML"/>
+        <w:rPr>
+          <w:rStyle w:val="CodeHTML"/>
+          <w:rFonts w:ascii="Times New Roman" w:hAnsi="Times New Roman" w:cs="Times New Roman"/>
+          <w:sz w:val="24"/>
+          <w:szCs w:val="24"/>
+        </w:rPr>
+      </w:pPr>
+    </w:p>
+    <w:p>
+      <w:pPr>
+        <w:pStyle w:val="PrformatHTML"/>
+        <w:rPr>
+          <w:rStyle w:val="CodeHTML"/>
+          <w:rFonts w:ascii="Times New Roman" w:hAnsi="Times New Roman" w:cs="Times New Roman"/>
+          <w:b/>
+          <w:bCs/>
+          <w:sz w:val="24"/>
+          <w:szCs w:val="24"/>
+        </w:rPr>
+      </w:pPr>
+      <w:r>
+        <w:rPr>
+          <w:rStyle w:val="CodeHTML"/>
+          <w:rFonts w:ascii="Times New Roman" w:hAnsi="Times New Roman" w:cs="Times New Roman"/>
+          <w:b/>
+          <w:bCs/>
+          <w:sz w:val="24"/>
+          <w:szCs w:val="24"/>
+        </w:rPr>
+        <w:t>Format de sortie :</w:t>
+      </w:r>
+    </w:p>
+    <w:p>
+      <w:pPr>
+        <w:pStyle w:val="PrformatHTML"/>
+        <w:numPr>
+          <w:ilvl w:val="0"/>
+          <w:numId w:val="11"/>
+        </w:numPr>
+        <w:rPr>
+          <w:rStyle w:val="CodeHTML"/>
+          <w:rFonts w:ascii="Times New Roman" w:hAnsi="Times New Roman" w:cs="Times New Roman"/>
+          <w:sz w:val="24"/>
+          <w:szCs w:val="24"/>
+        </w:rPr>
+      </w:pPr>
+      <w:r>
+        <w:rPr>
+          <w:rStyle w:val="CodeHTML"/>
+          <w:rFonts w:ascii="Times New Roman" w:hAnsi="Times New Roman" w:cs="Times New Roman"/>
+          <w:sz w:val="24"/>
+          <w:szCs w:val="24"/>
+        </w:rPr>
+        <w:lastRenderedPageBreak/>
+        <w:t>Objectifs : ...</w:t>
+      </w:r>
+    </w:p>
+    <w:p>
+      <w:pPr>
+        <w:pStyle w:val="PrformatHTML"/>
+        <w:numPr>
+          <w:ilvl w:val="0"/>
+          <w:numId w:val="11"/>
+        </w:numPr>
+        <w:rPr>
+          <w:rStyle w:val="CodeHTML"/>
+          <w:rFonts w:ascii="Times New Roman" w:hAnsi="Times New Roman" w:cs="Times New Roman"/>
+          <w:sz w:val="24"/>
+          <w:szCs w:val="24"/>
+        </w:rPr>
+      </w:pPr>
+      <w:r>
+        <w:rPr>
+          <w:rStyle w:val="CodeHTML"/>
+          <w:rFonts w:ascii="Times New Roman" w:hAnsi="Times New Roman" w:cs="Times New Roman"/>
+          <w:sz w:val="24"/>
+          <w:szCs w:val="24"/>
+        </w:rPr>
+        <w:t>Résultats : ...</w:t>
+      </w:r>
+    </w:p>
+    <w:p>
+      <w:pPr>
+        <w:pStyle w:val="PrformatHTML"/>
+        <w:numPr>
+          <w:ilvl w:val="0"/>
+          <w:numId w:val="11"/>
+        </w:numPr>
+        <w:rPr>
+          <w:rStyle w:val="CodeHTML"/>
+          <w:rFonts w:ascii="Times New Roman" w:hAnsi="Times New Roman" w:cs="Times New Roman"/>
+          <w:sz w:val="24"/>
+          <w:szCs w:val="24"/>
+        </w:rPr>
+      </w:pPr>
+      <w:r>
+        <w:rPr>
+          <w:rStyle w:val="CodeHTML"/>
+          <w:rFonts w:ascii="Times New Roman" w:hAnsi="Times New Roman" w:cs="Times New Roman"/>
+          <w:sz w:val="24"/>
+          <w:szCs w:val="24"/>
+        </w:rPr>
+        <w:t>Recommandations : ...</w:t>
+      </w:r>
+    </w:p>
+    <w:p>
+      <w:pPr>
+        <w:pStyle w:val="PrformatHTML"/>
+        <w:numPr>
+          <w:ilvl w:val="0"/>
+          <w:numId w:val="11"/>
+        </w:numPr>
+        <w:rPr>
+          <w:rStyle w:val="CodeHTML"/>
+          <w:rFonts w:ascii="Times New Roman" w:hAnsi="Times New Roman" w:cs="Times New Roman"/>
+          <w:sz w:val="24"/>
+          <w:szCs w:val="24"/>
+        </w:rPr>
+      </w:pPr>
+      <w:r>
+        <w:rPr>
+          <w:rStyle w:val="CodeHTML"/>
+          <w:rFonts w:ascii="Times New Roman" w:hAnsi="Times New Roman" w:cs="Times New Roman"/>
+          <w:sz w:val="24"/>
+          <w:szCs w:val="24"/>
+        </w:rPr>
+        <w:t>Résumé libre (le reste, dans la limite des 250 mots)</w:t>
+      </w:r>
+    </w:p>
+    <w:p>
+      <w:pPr>
+        <w:pStyle w:val="PrformatHTML"/>
+        <w:ind w:left="360"/>
+        <w:rPr>
+          <w:rStyle w:val="CodeHTML"/>
+          <w:rFonts w:ascii="Times New Roman" w:hAnsi="Times New Roman" w:cs="Times New Roman"/>
+          <w:sz w:val="24"/>
+          <w:szCs w:val="24"/>
+        </w:rPr>
+      </w:pPr>
+    </w:p>
+    <w:p>
+      <w:pPr>
+        <w:pStyle w:val="PrformatHTML"/>
+        <w:ind w:left="360"/>
+        <w:rPr>
+          <w:rStyle w:val="CodeHTML"/>
+          <w:rFonts w:ascii="Times New Roman" w:hAnsi="Times New Roman" w:cs="Times New Roman"/>
+          <w:b/>
+          <w:bCs/>
+          <w:sz w:val="24"/>
+          <w:szCs w:val="24"/>
+        </w:rPr>
+      </w:pPr>
+      <w:r>
+        <w:rPr>
+          <w:rStyle w:val="CodeHTML"/>
+          <w:rFonts w:ascii="Times New Roman" w:hAnsi="Times New Roman" w:cs="Times New Roman"/>
+          <w:b/>
+          <w:bCs/>
+          <w:sz w:val="24"/>
+          <w:szCs w:val="24"/>
+        </w:rPr>
+        <w:t>Résultat</w:t>
+      </w:r>
+      <w:r>
+        <w:rPr>
+          <w:rStyle w:val="CodeHTML"/>
+          <w:rFonts w:ascii="Times New Roman" w:hAnsi="Times New Roman" w:cs="Times New Roman"/>
+          <w:b/>
+          <w:bCs/>
+          <w:sz w:val="24"/>
+          <w:szCs w:val="24"/>
+        </w:rPr>
+        <w:t> :</w:t>
+      </w:r>
+    </w:p>
+    <w:p>
+      <w:pPr>
+        <w:pStyle w:val="PrformatHTML"/>
+        <w:ind w:left="360"/>
+        <w:rPr>
+          <w:rFonts w:ascii="Times New Roman" w:hAnsi="Times New Roman" w:cs="Times New Roman"/>
+          <w:b/>
+          <w:bCs/>
+          <w:sz w:val="24"/>
+          <w:szCs w:val="24"/>
+        </w:rPr>
+      </w:pPr>
+      <w:r>
+        <w:rPr>
+          <w:rFonts w:ascii="Times New Roman" w:hAnsi="Times New Roman" w:cs="Times New Roman"/>
+          <w:b/>
+          <w:bCs/>
+          <w:sz w:val="24"/>
+          <w:szCs w:val="24"/>
+        </w:rPr>
+        <w:drawing>
+          <wp:inline distT="0" distB="0" distL="0" distR="0" wp14:anchorId="4DD9682A" wp14:editId="287DE6E1">
+            <wp:extent cx="4978656" cy="3124361"/>
+            <wp:effectExtent l="0" t="0" r="0" b="0"/>
+            <wp:docPr id="16" name="Image 16"/>
+            <wp:cNvGraphicFramePr>
+              <a:graphicFrameLocks xmlns:a="http://schemas.openxmlformats.org/drawingml/2006/main" noChangeAspect="1"/>
+            </wp:cNvGraphicFramePr>
+            <a:graphic xmlns:a="http://schemas.openxmlformats.org/drawingml/2006/main">
+              <a:graphicData uri="http://schemas.openxmlformats.org/drawingml/2006/picture">
+                <pic:pic xmlns:pic="http://schemas.openxmlformats.org/drawingml/2006/picture">
+                  <pic:nvPicPr>
+                    <pic:cNvPr id="1" name=""/>
+                    <pic:cNvPicPr/>
+                  </pic:nvPicPr>
+                  <pic:blipFill>
+                    <a:blip r:embed="rId20"/>
+                    <a:stretch>
+                      <a:fillRect/>
+                    </a:stretch>
+                  </pic:blipFill>
+                  <pic:spPr>
+                    <a:xfrm>
+                      <a:off x="0" y="0"/>
+                      <a:ext cx="4978656" cy="3124361"/>
+                    </a:xfrm>
+                    <a:prstGeom prst="rect">
+                      <a:avLst/>
+                    </a:prstGeom>
+                  </pic:spPr>
+                </pic:pic>
+              </a:graphicData>
+            </a:graphic>
+          </wp:inline>
+        </w:drawing>
+      </w:r>
+    </w:p>
+    <w:p>
+      <w:pPr>
+        <w:pStyle w:val="PrformatHTML"/>
+        <w:ind w:left="360"/>
+        <w:rPr>
+          <w:rFonts w:ascii="Times New Roman" w:hAnsi="Times New Roman" w:cs="Times New Roman"/>
+          <w:b/>
+          <w:bCs/>
+          <w:sz w:val="24"/>
+          <w:szCs w:val="24"/>
+        </w:rPr>
+      </w:pPr>
+    </w:p>
+    <w:p>
+      <w:pPr>
+        <w:pStyle w:val="PrformatHTML"/>
+        <w:ind w:left="360"/>
+        <w:rPr>
+          <w:rFonts w:ascii="Times New Roman" w:hAnsi="Times New Roman" w:cs="Times New Roman"/>
+          <w:sz w:val="24"/>
+          <w:szCs w:val="24"/>
+        </w:rPr>
+      </w:pPr>
+      <w:r>
+        <w:rPr>
+          <w:rFonts w:ascii="Times New Roman" w:hAnsi="Times New Roman" w:cs="Times New Roman"/>
+          <w:sz w:val="24"/>
+          <w:szCs w:val="24"/>
+        </w:rPr>
+        <w:t>Le document</w:t>
+      </w:r>
+      <w:r>
+        <w:rPr>
+          <w:rFonts w:ascii="Times New Roman" w:hAnsi="Times New Roman" w:cs="Times New Roman"/>
+          <w:sz w:val="24"/>
+          <w:szCs w:val="24"/>
+        </w:rPr>
+        <w:t xml:space="preserve"> </w:t>
+      </w:r>
+      <w:r>
+        <w:rPr>
+          <w:rFonts w:ascii="Times New Roman" w:hAnsi="Times New Roman" w:cs="Times New Roman"/>
+          <w:sz w:val="24"/>
+          <w:szCs w:val="24"/>
+        </w:rPr>
+        <w:t>PDF que j’ai résumer je le pusherai pour que vous puisse voir</w:t>
+      </w:r>
+      <w:r>
+        <w:rPr>
+          <w:rFonts w:ascii="Times New Roman" w:hAnsi="Times New Roman" w:cs="Times New Roman"/>
+          <w:sz w:val="24"/>
+          <w:szCs w:val="24"/>
+        </w:rPr>
+        <w:t xml:space="preserve"> </w:t>
+      </w:r>
+    </w:p>
+    <w:p>
+      <w:pPr>
+        <w:pStyle w:val="PrformatHTML"/>
+        <w:ind w:left="360"/>
+        <w:rPr>
+          <w:rFonts w:ascii="Times New Roman" w:hAnsi="Times New Roman" w:cs="Times New Roman"/>
+          <w:sz w:val="24"/>
+          <w:szCs w:val="24"/>
+        </w:rPr>
+      </w:pPr>
+    </w:p>
+    <w:p>
+      <w:pPr>
+        <w:pStyle w:val="PrformatHTML"/>
+        <w:ind w:left="360"/>
+        <w:rPr>
+          <w:rStyle w:val="CodeHTML"/>
+          <w:rFonts w:ascii="Times New Roman" w:hAnsi="Times New Roman" w:cs="Times New Roman"/>
+          <w:sz w:val="24"/>
+          <w:szCs w:val="24"/>
+        </w:rPr>
+      </w:pPr>
+    </w:p>
+    <w:p>
+      <w:pPr>
+        <w:pStyle w:val="PrformatHTML"/>
+        <w:ind w:left="360"/>
+        <w:rPr>
+          <w:rStyle w:val="CodeHTML"/>
+          <w:rFonts w:ascii="Times New Roman" w:hAnsi="Times New Roman" w:cs="Times New Roman"/>
+          <w:sz w:val="24"/>
+          <w:szCs w:val="24"/>
+        </w:rPr>
+      </w:pPr>
+    </w:p>
     <w:sectPr>
       <w:pgSz w:w="11906" w:h="16838"/>
       <w:pgMar w:top="1418" w:right="1418" w:bottom="1418" w:left="1418" w:header="709" w:footer="709" w:gutter="0"/>
@@ -6446,6 +6775,119 @@
     </w:lvl>
   </w:abstractNum>
   <w:abstractNum w:abstractNumId="7" w15:restartNumberingAfterBreak="0">
+    <w:nsid w:val="4845549C"/>
+    <w:multiLevelType w:val="hybridMultilevel"/>
+    <w:tmpl w:val="81762F32"/>
+    <w:lvl w:ilvl="0" w:tplc="040C0001">
+      <w:start w:val="1"/>
+      <w:numFmt w:val="bullet"/>
+      <w:lvlText w:val=""/>
+      <w:lvlJc w:val="left"/>
+      <w:pPr>
+        <w:ind w:left="720" w:hanging="360"/>
+      </w:pPr>
+      <w:rPr>
+        <w:rFonts w:ascii="Symbol" w:hAnsi="Symbol" w:hint="default"/>
+      </w:rPr>
+    </w:lvl>
+    <w:lvl w:ilvl="1" w:tplc="040C0003" w:tentative="1">
+      <w:start w:val="1"/>
+      <w:numFmt w:val="bullet"/>
+      <w:lvlText w:val="o"/>
+      <w:lvlJc w:val="left"/>
+      <w:pPr>
+        <w:ind w:left="1440" w:hanging="360"/>
+      </w:pPr>
+      <w:rPr>
+        <w:rFonts w:ascii="Courier New" w:hAnsi="Courier New" w:cs="Courier New" w:hint="default"/>
+      </w:rPr>
+    </w:lvl>
+    <w:lvl w:ilvl="2" w:tplc="040C0005" w:tentative="1">
+      <w:start w:val="1"/>
+      <w:numFmt w:val="bullet"/>
+      <w:lvlText w:val=""/>
+      <w:lvlJc w:val="left"/>
+      <w:pPr>
+        <w:ind w:left="2160" w:hanging="360"/>
+      </w:pPr>
+      <w:rPr>
+        <w:rFonts w:ascii="Wingdings" w:hAnsi="Wingdings" w:hint="default"/>
+      </w:rPr>
+    </w:lvl>
+    <w:lvl w:ilvl="3" w:tplc="040C0001" w:tentative="1">
+      <w:start w:val="1"/>
+      <w:numFmt w:val="bullet"/>
+      <w:lvlText w:val=""/>
+      <w:lvlJc w:val="left"/>
+      <w:pPr>
+        <w:ind w:left="2880" w:hanging="360"/>
+      </w:pPr>
+      <w:rPr>
+        <w:rFonts w:ascii="Symbol" w:hAnsi="Symbol" w:hint="default"/>
+      </w:rPr>
+    </w:lvl>
+    <w:lvl w:ilvl="4" w:tplc="040C0003" w:tentative="1">
+      <w:start w:val="1"/>
+      <w:numFmt w:val="bullet"/>
+      <w:lvlText w:val="o"/>
+      <w:lvlJc w:val="left"/>
+      <w:pPr>
+        <w:ind w:left="3600" w:hanging="360"/>
+      </w:pPr>
+      <w:rPr>
+        <w:rFonts w:ascii="Courier New" w:hAnsi="Courier New" w:cs="Courier New" w:hint="default"/>
+      </w:rPr>
+    </w:lvl>
+    <w:lvl w:ilvl="5" w:tplc="040C0005" w:tentative="1">
+      <w:start w:val="1"/>
+      <w:numFmt w:val="bullet"/>
+      <w:lvlText w:val=""/>
+      <w:lvlJc w:val="left"/>
+      <w:pPr>
+        <w:ind w:left="4320" w:hanging="360"/>
+      </w:pPr>
+      <w:rPr>
+        <w:rFonts w:ascii="Wingdings" w:hAnsi="Wingdings" w:hint="default"/>
+      </w:rPr>
+    </w:lvl>
+    <w:lvl w:ilvl="6" w:tplc="040C0001" w:tentative="1">
+      <w:start w:val="1"/>
+      <w:numFmt w:val="bullet"/>
+      <w:lvlText w:val=""/>
+      <w:lvlJc w:val="left"/>
+      <w:pPr>
+        <w:ind w:left="5040" w:hanging="360"/>
+      </w:pPr>
+      <w:rPr>
+        <w:rFonts w:ascii="Symbol" w:hAnsi="Symbol" w:hint="default"/>
+      </w:rPr>
+    </w:lvl>
+    <w:lvl w:ilvl="7" w:tplc="040C0003" w:tentative="1">
+      <w:start w:val="1"/>
+      <w:numFmt w:val="bullet"/>
+      <w:lvlText w:val="o"/>
+      <w:lvlJc w:val="left"/>
+      <w:pPr>
+        <w:ind w:left="5760" w:hanging="360"/>
+      </w:pPr>
+      <w:rPr>
+        <w:rFonts w:ascii="Courier New" w:hAnsi="Courier New" w:cs="Courier New" w:hint="default"/>
+      </w:rPr>
+    </w:lvl>
+    <w:lvl w:ilvl="8" w:tplc="040C0005" w:tentative="1">
+      <w:start w:val="1"/>
+      <w:numFmt w:val="bullet"/>
+      <w:lvlText w:val=""/>
+      <w:lvlJc w:val="left"/>
+      <w:pPr>
+        <w:ind w:left="6480" w:hanging="360"/>
+      </w:pPr>
+      <w:rPr>
+        <w:rFonts w:ascii="Wingdings" w:hAnsi="Wingdings" w:hint="default"/>
+      </w:rPr>
+    </w:lvl>
+  </w:abstractNum>
+  <w:abstractNum w:abstractNumId="8" w15:restartNumberingAfterBreak="0">
     <w:nsid w:val="5CE201C5"/>
     <w:multiLevelType w:val="hybridMultilevel"/>
     <w:tmpl w:val="849848D8"/>
@@ -6534,7 +6976,7 @@
       </w:pPr>
     </w:lvl>
   </w:abstractNum>
-  <w:abstractNum w:abstractNumId="8" w15:restartNumberingAfterBreak="0">
+  <w:abstractNum w:abstractNumId="9" w15:restartNumberingAfterBreak="0">
     <w:nsid w:val="5E0B23B2"/>
     <w:multiLevelType w:val="hybridMultilevel"/>
     <w:tmpl w:val="42507AA4"/>
@@ -6620,7 +7062,7 @@
       </w:pPr>
     </w:lvl>
   </w:abstractNum>
-  <w:abstractNum w:abstractNumId="9" w15:restartNumberingAfterBreak="0">
+  <w:abstractNum w:abstractNumId="10" w15:restartNumberingAfterBreak="0">
     <w:nsid w:val="7EC51315"/>
     <w:multiLevelType w:val="hybridMultilevel"/>
     <w:tmpl w:val="7952CE38"/>
@@ -6719,13 +7161,13 @@
     <w:abstractNumId w:val="5"/>
   </w:num>
   <w:num w:numId="4">
-    <w:abstractNumId w:val="9"/>
+    <w:abstractNumId w:val="10"/>
   </w:num>
   <w:num w:numId="5">
     <w:abstractNumId w:val="4"/>
   </w:num>
   <w:num w:numId="6">
-    <w:abstractNumId w:val="8"/>
+    <w:abstractNumId w:val="9"/>
   </w:num>
   <w:num w:numId="7">
     <w:abstractNumId w:val="0"/>
@@ -6734,10 +7176,13 @@
     <w:abstractNumId w:val="1"/>
   </w:num>
   <w:num w:numId="9">
-    <w:abstractNumId w:val="7"/>
+    <w:abstractNumId w:val="8"/>
   </w:num>
   <w:num w:numId="10">
     <w:abstractNumId w:val="3"/>
+  </w:num>
+  <w:num w:numId="11">
+    <w:abstractNumId w:val="7"/>
   </w:num>
 </w:numbering>
 </file>

</xml_diff>

<commit_message>
Partie 5 question 2
</commit_message>
<xml_diff>
--- a/ai-business_assistant.docx
+++ b/ai-business_assistant.docx
@@ -1569,7 +1569,27 @@
           <w:sz w:val="24"/>
           <w:szCs w:val="24"/>
         </w:rPr>
-        <w:t>Commentaire : "Le produit est arrivé cassé et le support ne répond pas."</w:t>
+        <w:t xml:space="preserve">Commentaire : "Le produit est arrivé </w:t>
+      </w:r>
+      <w:proofErr w:type="gramStart"/>
+      <w:r>
+        <w:rPr>
+          <w:rStyle w:val="CodeHTML"/>
+          <w:rFonts w:ascii="Times New Roman" w:eastAsiaTheme="minorHAnsi" w:hAnsi="Times New Roman" w:cs="Times New Roman"/>
+          <w:sz w:val="24"/>
+          <w:szCs w:val="24"/>
+        </w:rPr>
+        <w:t>cassé</w:t>
+      </w:r>
+      <w:proofErr w:type="gramEnd"/>
+      <w:r>
+        <w:rPr>
+          <w:rStyle w:val="CodeHTML"/>
+          <w:rFonts w:ascii="Times New Roman" w:eastAsiaTheme="minorHAnsi" w:hAnsi="Times New Roman" w:cs="Times New Roman"/>
+          <w:sz w:val="24"/>
+          <w:szCs w:val="24"/>
+        </w:rPr>
+        <w:t xml:space="preserve"> et le support ne répond pas."</w:t>
       </w:r>
     </w:p>
     <w:p>
@@ -2052,7 +2072,27 @@
           <w:sz w:val="24"/>
           <w:szCs w:val="24"/>
         </w:rPr>
-        <w:t xml:space="preserve">   (un commentaire mixte penche généralement vers négatif si le problème</w:t>
+        <w:t xml:space="preserve">   (</w:t>
+      </w:r>
+      <w:proofErr w:type="gramStart"/>
+      <w:r>
+        <w:rPr>
+          <w:rStyle w:val="CodeHTML"/>
+          <w:rFonts w:ascii="Times New Roman" w:hAnsi="Times New Roman" w:cs="Times New Roman"/>
+          <w:sz w:val="24"/>
+          <w:szCs w:val="24"/>
+        </w:rPr>
+        <w:t>un</w:t>
+      </w:r>
+      <w:proofErr w:type="gramEnd"/>
+      <w:r>
+        <w:rPr>
+          <w:rStyle w:val="CodeHTML"/>
+          <w:rFonts w:ascii="Times New Roman" w:hAnsi="Times New Roman" w:cs="Times New Roman"/>
+          <w:sz w:val="24"/>
+          <w:szCs w:val="24"/>
+        </w:rPr>
+        <w:t xml:space="preserve"> commentaire mixte penche généralement vers négatif si le problème</w:t>
       </w:r>
     </w:p>
     <w:p>
@@ -2073,7 +2113,27 @@
           <w:sz w:val="24"/>
           <w:szCs w:val="24"/>
         </w:rPr>
-        <w:t xml:space="preserve">   mentionné affecte l'usage du produit).</w:t>
+        <w:t xml:space="preserve">   </w:t>
+      </w:r>
+      <w:proofErr w:type="gramStart"/>
+      <w:r>
+        <w:rPr>
+          <w:rStyle w:val="CodeHTML"/>
+          <w:rFonts w:ascii="Times New Roman" w:hAnsi="Times New Roman" w:cs="Times New Roman"/>
+          <w:sz w:val="24"/>
+          <w:szCs w:val="24"/>
+        </w:rPr>
+        <w:t>mentionné</w:t>
+      </w:r>
+      <w:proofErr w:type="gramEnd"/>
+      <w:r>
+        <w:rPr>
+          <w:rStyle w:val="CodeHTML"/>
+          <w:rFonts w:ascii="Times New Roman" w:hAnsi="Times New Roman" w:cs="Times New Roman"/>
+          <w:sz w:val="24"/>
+          <w:szCs w:val="24"/>
+        </w:rPr>
+        <w:t xml:space="preserve"> affecte l'usage du produit).</w:t>
       </w:r>
     </w:p>
     <w:p>
@@ -2227,14 +2287,25 @@
         <w:t>elements_positifs</w:t>
       </w:r>
       <w:proofErr w:type="spellEnd"/>
-      <w:r>
-        <w:rPr>
-          <w:rStyle w:val="CodeHTML"/>
-          <w:rFonts w:ascii="Times New Roman" w:hAnsi="Times New Roman" w:cs="Times New Roman"/>
-          <w:sz w:val="24"/>
-          <w:szCs w:val="24"/>
-        </w:rPr>
-        <w:t>": [...],</w:t>
+      <w:proofErr w:type="gramStart"/>
+      <w:r>
+        <w:rPr>
+          <w:rStyle w:val="CodeHTML"/>
+          <w:rFonts w:ascii="Times New Roman" w:hAnsi="Times New Roman" w:cs="Times New Roman"/>
+          <w:sz w:val="24"/>
+          <w:szCs w:val="24"/>
+        </w:rPr>
+        <w:t>":</w:t>
+      </w:r>
+      <w:proofErr w:type="gramEnd"/>
+      <w:r>
+        <w:rPr>
+          <w:rStyle w:val="CodeHTML"/>
+          <w:rFonts w:ascii="Times New Roman" w:hAnsi="Times New Roman" w:cs="Times New Roman"/>
+          <w:sz w:val="24"/>
+          <w:szCs w:val="24"/>
+        </w:rPr>
+        <w:t xml:space="preserve"> [...],</w:t>
       </w:r>
     </w:p>
     <w:p>
@@ -2268,14 +2339,25 @@
         <w:t>elements_negatifs</w:t>
       </w:r>
       <w:proofErr w:type="spellEnd"/>
-      <w:r>
-        <w:rPr>
-          <w:rStyle w:val="CodeHTML"/>
-          <w:rFonts w:ascii="Times New Roman" w:hAnsi="Times New Roman" w:cs="Times New Roman"/>
-          <w:sz w:val="24"/>
-          <w:szCs w:val="24"/>
-        </w:rPr>
-        <w:t>": [...],</w:t>
+      <w:proofErr w:type="gramStart"/>
+      <w:r>
+        <w:rPr>
+          <w:rStyle w:val="CodeHTML"/>
+          <w:rFonts w:ascii="Times New Roman" w:hAnsi="Times New Roman" w:cs="Times New Roman"/>
+          <w:sz w:val="24"/>
+          <w:szCs w:val="24"/>
+        </w:rPr>
+        <w:t>":</w:t>
+      </w:r>
+      <w:proofErr w:type="gramEnd"/>
+      <w:r>
+        <w:rPr>
+          <w:rStyle w:val="CodeHTML"/>
+          <w:rFonts w:ascii="Times New Roman" w:hAnsi="Times New Roman" w:cs="Times New Roman"/>
+          <w:sz w:val="24"/>
+          <w:szCs w:val="24"/>
+        </w:rPr>
+        <w:t xml:space="preserve"> [...],</w:t>
       </w:r>
     </w:p>
     <w:p>
@@ -2296,7 +2378,27 @@
           <w:sz w:val="24"/>
           <w:szCs w:val="24"/>
         </w:rPr>
-        <w:t xml:space="preserve">  "classe": "positif | négatif | neutre",</w:t>
+        <w:t xml:space="preserve">  "classe</w:t>
+      </w:r>
+      <w:proofErr w:type="gramStart"/>
+      <w:r>
+        <w:rPr>
+          <w:rStyle w:val="CodeHTML"/>
+          <w:rFonts w:ascii="Times New Roman" w:hAnsi="Times New Roman" w:cs="Times New Roman"/>
+          <w:sz w:val="24"/>
+          <w:szCs w:val="24"/>
+        </w:rPr>
+        <w:t>":</w:t>
+      </w:r>
+      <w:proofErr w:type="gramEnd"/>
+      <w:r>
+        <w:rPr>
+          <w:rStyle w:val="CodeHTML"/>
+          <w:rFonts w:ascii="Times New Roman" w:hAnsi="Times New Roman" w:cs="Times New Roman"/>
+          <w:sz w:val="24"/>
+          <w:szCs w:val="24"/>
+        </w:rPr>
+        <w:t xml:space="preserve"> "positif | négatif | neutre",</w:t>
       </w:r>
     </w:p>
     <w:p>
@@ -2317,7 +2419,27 @@
           <w:sz w:val="24"/>
           <w:szCs w:val="24"/>
         </w:rPr>
-        <w:t xml:space="preserve">  "justification": "..."</w:t>
+        <w:t xml:space="preserve">  "justification</w:t>
+      </w:r>
+      <w:proofErr w:type="gramStart"/>
+      <w:r>
+        <w:rPr>
+          <w:rStyle w:val="CodeHTML"/>
+          <w:rFonts w:ascii="Times New Roman" w:hAnsi="Times New Roman" w:cs="Times New Roman"/>
+          <w:sz w:val="24"/>
+          <w:szCs w:val="24"/>
+        </w:rPr>
+        <w:t>":</w:t>
+      </w:r>
+      <w:proofErr w:type="gramEnd"/>
+      <w:r>
+        <w:rPr>
+          <w:rStyle w:val="CodeHTML"/>
+          <w:rFonts w:ascii="Times New Roman" w:hAnsi="Times New Roman" w:cs="Times New Roman"/>
+          <w:sz w:val="24"/>
+          <w:szCs w:val="24"/>
+        </w:rPr>
+        <w:t xml:space="preserve"> "..."</w:t>
       </w:r>
     </w:p>
     <w:p>
@@ -3170,52 +3292,85 @@
           <w:szCs w:val="24"/>
         </w:rPr>
       </w:pPr>
-      <w:r>
-        <w:rPr>
-          <w:rStyle w:val="CodeHTML"/>
-          <w:rFonts w:ascii="Times New Roman" w:eastAsiaTheme="minorHAnsi" w:hAnsi="Times New Roman" w:cs="Times New Roman"/>
-          <w:sz w:val="24"/>
-          <w:szCs w:val="24"/>
-        </w:rPr>
-        <w:t>pour lundi, mais nous sommes jeudi et je n'ai toujours rien reçu. Le suivi de ma</w:t>
-      </w:r>
-    </w:p>
-    <w:p>
-      <w:pPr>
-        <w:rPr>
-          <w:rStyle w:val="CodeHTML"/>
-          <w:rFonts w:ascii="Times New Roman" w:eastAsiaTheme="minorHAnsi" w:hAnsi="Times New Roman" w:cs="Times New Roman"/>
-          <w:sz w:val="24"/>
-          <w:szCs w:val="24"/>
-        </w:rPr>
-      </w:pPr>
-      <w:r>
-        <w:rPr>
-          <w:rStyle w:val="CodeHTML"/>
-          <w:rFonts w:ascii="Times New Roman" w:eastAsiaTheme="minorHAnsi" w:hAnsi="Times New Roman" w:cs="Times New Roman"/>
-          <w:sz w:val="24"/>
-          <w:szCs w:val="24"/>
-        </w:rPr>
-        <w:t>commande n'a pas été mis à jour depuis lundi. J'ai également contacté le service</w:t>
-      </w:r>
-    </w:p>
-    <w:p>
-      <w:pPr>
-        <w:rPr>
-          <w:rStyle w:val="CodeHTML"/>
-          <w:rFonts w:ascii="Times New Roman" w:eastAsiaTheme="minorHAnsi" w:hAnsi="Times New Roman" w:cs="Times New Roman"/>
-          <w:sz w:val="24"/>
-          <w:szCs w:val="24"/>
-        </w:rPr>
-      </w:pPr>
-      <w:r>
-        <w:rPr>
-          <w:rStyle w:val="CodeHTML"/>
-          <w:rFonts w:ascii="Times New Roman" w:eastAsiaTheme="minorHAnsi" w:hAnsi="Times New Roman" w:cs="Times New Roman"/>
-          <w:sz w:val="24"/>
-          <w:szCs w:val="24"/>
-        </w:rPr>
-        <w:t>client mardi, mais je n'ai reçu aucune réponse jusqu'à présent.</w:t>
+      <w:proofErr w:type="gramStart"/>
+      <w:r>
+        <w:rPr>
+          <w:rStyle w:val="CodeHTML"/>
+          <w:rFonts w:ascii="Times New Roman" w:eastAsiaTheme="minorHAnsi" w:hAnsi="Times New Roman" w:cs="Times New Roman"/>
+          <w:sz w:val="24"/>
+          <w:szCs w:val="24"/>
+        </w:rPr>
+        <w:t>pour</w:t>
+      </w:r>
+      <w:proofErr w:type="gramEnd"/>
+      <w:r>
+        <w:rPr>
+          <w:rStyle w:val="CodeHTML"/>
+          <w:rFonts w:ascii="Times New Roman" w:eastAsiaTheme="minorHAnsi" w:hAnsi="Times New Roman" w:cs="Times New Roman"/>
+          <w:sz w:val="24"/>
+          <w:szCs w:val="24"/>
+        </w:rPr>
+        <w:t xml:space="preserve"> lundi, mais nous sommes jeudi et je n'ai toujours rien reçu. Le suivi de ma</w:t>
+      </w:r>
+    </w:p>
+    <w:p>
+      <w:pPr>
+        <w:rPr>
+          <w:rStyle w:val="CodeHTML"/>
+          <w:rFonts w:ascii="Times New Roman" w:eastAsiaTheme="minorHAnsi" w:hAnsi="Times New Roman" w:cs="Times New Roman"/>
+          <w:sz w:val="24"/>
+          <w:szCs w:val="24"/>
+        </w:rPr>
+      </w:pPr>
+      <w:proofErr w:type="gramStart"/>
+      <w:r>
+        <w:rPr>
+          <w:rStyle w:val="CodeHTML"/>
+          <w:rFonts w:ascii="Times New Roman" w:eastAsiaTheme="minorHAnsi" w:hAnsi="Times New Roman" w:cs="Times New Roman"/>
+          <w:sz w:val="24"/>
+          <w:szCs w:val="24"/>
+        </w:rPr>
+        <w:t>commande</w:t>
+      </w:r>
+      <w:proofErr w:type="gramEnd"/>
+      <w:r>
+        <w:rPr>
+          <w:rStyle w:val="CodeHTML"/>
+          <w:rFonts w:ascii="Times New Roman" w:eastAsiaTheme="minorHAnsi" w:hAnsi="Times New Roman" w:cs="Times New Roman"/>
+          <w:sz w:val="24"/>
+          <w:szCs w:val="24"/>
+        </w:rPr>
+        <w:t xml:space="preserve"> n'a pas été mis à jour depuis lundi. J'ai également contacté le service</w:t>
+      </w:r>
+    </w:p>
+    <w:p>
+      <w:pPr>
+        <w:rPr>
+          <w:rStyle w:val="CodeHTML"/>
+          <w:rFonts w:ascii="Times New Roman" w:eastAsiaTheme="minorHAnsi" w:hAnsi="Times New Roman" w:cs="Times New Roman"/>
+          <w:sz w:val="24"/>
+          <w:szCs w:val="24"/>
+        </w:rPr>
+      </w:pPr>
+      <w:proofErr w:type="gramStart"/>
+      <w:r>
+        <w:rPr>
+          <w:rStyle w:val="CodeHTML"/>
+          <w:rFonts w:ascii="Times New Roman" w:eastAsiaTheme="minorHAnsi" w:hAnsi="Times New Roman" w:cs="Times New Roman"/>
+          <w:sz w:val="24"/>
+          <w:szCs w:val="24"/>
+        </w:rPr>
+        <w:t>client</w:t>
+      </w:r>
+      <w:proofErr w:type="gramEnd"/>
+      <w:r>
+        <w:rPr>
+          <w:rStyle w:val="CodeHTML"/>
+          <w:rFonts w:ascii="Times New Roman" w:eastAsiaTheme="minorHAnsi" w:hAnsi="Times New Roman" w:cs="Times New Roman"/>
+          <w:sz w:val="24"/>
+          <w:szCs w:val="24"/>
+        </w:rPr>
+        <w:t xml:space="preserve"> mardi, mais je n'ai reçu aucune réponse jusqu'à présent.</w:t>
       </w:r>
     </w:p>
     <w:p>
@@ -3815,33 +3970,64 @@
         <w:t>informations_non_justifiees</w:t>
       </w:r>
       <w:proofErr w:type="spellEnd"/>
-      <w:r>
-        <w:rPr>
-          <w:rStyle w:val="CodeHTML"/>
-          <w:rFonts w:ascii="Times New Roman" w:eastAsiaTheme="minorHAnsi" w:hAnsi="Times New Roman" w:cs="Times New Roman"/>
-          <w:sz w:val="24"/>
-          <w:szCs w:val="24"/>
-        </w:rPr>
-        <w:t>": [...],</w:t>
-      </w:r>
-    </w:p>
-    <w:p>
-      <w:pPr>
-        <w:rPr>
-          <w:rStyle w:val="CodeHTML"/>
-          <w:rFonts w:ascii="Times New Roman" w:eastAsiaTheme="minorHAnsi" w:hAnsi="Times New Roman" w:cs="Times New Roman"/>
-          <w:sz w:val="24"/>
-          <w:szCs w:val="24"/>
-        </w:rPr>
-      </w:pPr>
-      <w:r>
-        <w:rPr>
-          <w:rStyle w:val="CodeHTML"/>
-          <w:rFonts w:ascii="Times New Roman" w:eastAsiaTheme="minorHAnsi" w:hAnsi="Times New Roman" w:cs="Times New Roman"/>
-          <w:sz w:val="24"/>
-          <w:szCs w:val="24"/>
-        </w:rPr>
-        <w:t xml:space="preserve">  "contradictions": [...],</w:t>
+      <w:proofErr w:type="gramStart"/>
+      <w:r>
+        <w:rPr>
+          <w:rStyle w:val="CodeHTML"/>
+          <w:rFonts w:ascii="Times New Roman" w:eastAsiaTheme="minorHAnsi" w:hAnsi="Times New Roman" w:cs="Times New Roman"/>
+          <w:sz w:val="24"/>
+          <w:szCs w:val="24"/>
+        </w:rPr>
+        <w:t>":</w:t>
+      </w:r>
+      <w:proofErr w:type="gramEnd"/>
+      <w:r>
+        <w:rPr>
+          <w:rStyle w:val="CodeHTML"/>
+          <w:rFonts w:ascii="Times New Roman" w:eastAsiaTheme="minorHAnsi" w:hAnsi="Times New Roman" w:cs="Times New Roman"/>
+          <w:sz w:val="24"/>
+          <w:szCs w:val="24"/>
+        </w:rPr>
+        <w:t xml:space="preserve"> [...],</w:t>
+      </w:r>
+    </w:p>
+    <w:p>
+      <w:pPr>
+        <w:rPr>
+          <w:rStyle w:val="CodeHTML"/>
+          <w:rFonts w:ascii="Times New Roman" w:eastAsiaTheme="minorHAnsi" w:hAnsi="Times New Roman" w:cs="Times New Roman"/>
+          <w:sz w:val="24"/>
+          <w:szCs w:val="24"/>
+        </w:rPr>
+      </w:pPr>
+      <w:r>
+        <w:rPr>
+          <w:rStyle w:val="CodeHTML"/>
+          <w:rFonts w:ascii="Times New Roman" w:eastAsiaTheme="minorHAnsi" w:hAnsi="Times New Roman" w:cs="Times New Roman"/>
+          <w:sz w:val="24"/>
+          <w:szCs w:val="24"/>
+        </w:rPr>
+        <w:t xml:space="preserve">  "contradictions</w:t>
+      </w:r>
+      <w:proofErr w:type="gramStart"/>
+      <w:r>
+        <w:rPr>
+          <w:rStyle w:val="CodeHTML"/>
+          <w:rFonts w:ascii="Times New Roman" w:eastAsiaTheme="minorHAnsi" w:hAnsi="Times New Roman" w:cs="Times New Roman"/>
+          <w:sz w:val="24"/>
+          <w:szCs w:val="24"/>
+        </w:rPr>
+        <w:t>":</w:t>
+      </w:r>
+      <w:proofErr w:type="gramEnd"/>
+      <w:r>
+        <w:rPr>
+          <w:rStyle w:val="CodeHTML"/>
+          <w:rFonts w:ascii="Times New Roman" w:eastAsiaTheme="minorHAnsi" w:hAnsi="Times New Roman" w:cs="Times New Roman"/>
+          <w:sz w:val="24"/>
+          <w:szCs w:val="24"/>
+        </w:rPr>
+        <w:t xml:space="preserve"> [...],</w:t>
       </w:r>
     </w:p>
     <w:p>
@@ -3873,33 +4059,64 @@
         <w:t>informations_absentes</w:t>
       </w:r>
       <w:proofErr w:type="spellEnd"/>
-      <w:r>
-        <w:rPr>
-          <w:rStyle w:val="CodeHTML"/>
-          <w:rFonts w:ascii="Times New Roman" w:eastAsiaTheme="minorHAnsi" w:hAnsi="Times New Roman" w:cs="Times New Roman"/>
-          <w:sz w:val="24"/>
-          <w:szCs w:val="24"/>
-        </w:rPr>
-        <w:t>": [...],</w:t>
-      </w:r>
-    </w:p>
-    <w:p>
-      <w:pPr>
-        <w:rPr>
-          <w:rStyle w:val="CodeHTML"/>
-          <w:rFonts w:ascii="Times New Roman" w:eastAsiaTheme="minorHAnsi" w:hAnsi="Times New Roman" w:cs="Times New Roman"/>
-          <w:sz w:val="24"/>
-          <w:szCs w:val="24"/>
-        </w:rPr>
-      </w:pPr>
-      <w:r>
-        <w:rPr>
-          <w:rStyle w:val="CodeHTML"/>
-          <w:rFonts w:ascii="Times New Roman" w:eastAsiaTheme="minorHAnsi" w:hAnsi="Times New Roman" w:cs="Times New Roman"/>
-          <w:sz w:val="24"/>
-          <w:szCs w:val="24"/>
-        </w:rPr>
-        <w:t xml:space="preserve">  "hallucinations": [...],</w:t>
+      <w:proofErr w:type="gramStart"/>
+      <w:r>
+        <w:rPr>
+          <w:rStyle w:val="CodeHTML"/>
+          <w:rFonts w:ascii="Times New Roman" w:eastAsiaTheme="minorHAnsi" w:hAnsi="Times New Roman" w:cs="Times New Roman"/>
+          <w:sz w:val="24"/>
+          <w:szCs w:val="24"/>
+        </w:rPr>
+        <w:t>":</w:t>
+      </w:r>
+      <w:proofErr w:type="gramEnd"/>
+      <w:r>
+        <w:rPr>
+          <w:rStyle w:val="CodeHTML"/>
+          <w:rFonts w:ascii="Times New Roman" w:eastAsiaTheme="minorHAnsi" w:hAnsi="Times New Roman" w:cs="Times New Roman"/>
+          <w:sz w:val="24"/>
+          <w:szCs w:val="24"/>
+        </w:rPr>
+        <w:t xml:space="preserve"> [...],</w:t>
+      </w:r>
+    </w:p>
+    <w:p>
+      <w:pPr>
+        <w:rPr>
+          <w:rStyle w:val="CodeHTML"/>
+          <w:rFonts w:ascii="Times New Roman" w:eastAsiaTheme="minorHAnsi" w:hAnsi="Times New Roman" w:cs="Times New Roman"/>
+          <w:sz w:val="24"/>
+          <w:szCs w:val="24"/>
+        </w:rPr>
+      </w:pPr>
+      <w:r>
+        <w:rPr>
+          <w:rStyle w:val="CodeHTML"/>
+          <w:rFonts w:ascii="Times New Roman" w:eastAsiaTheme="minorHAnsi" w:hAnsi="Times New Roman" w:cs="Times New Roman"/>
+          <w:sz w:val="24"/>
+          <w:szCs w:val="24"/>
+        </w:rPr>
+        <w:t xml:space="preserve">  "hallucinations</w:t>
+      </w:r>
+      <w:proofErr w:type="gramStart"/>
+      <w:r>
+        <w:rPr>
+          <w:rStyle w:val="CodeHTML"/>
+          <w:rFonts w:ascii="Times New Roman" w:eastAsiaTheme="minorHAnsi" w:hAnsi="Times New Roman" w:cs="Times New Roman"/>
+          <w:sz w:val="24"/>
+          <w:szCs w:val="24"/>
+        </w:rPr>
+        <w:t>":</w:t>
+      </w:r>
+      <w:proofErr w:type="gramEnd"/>
+      <w:r>
+        <w:rPr>
+          <w:rStyle w:val="CodeHTML"/>
+          <w:rFonts w:ascii="Times New Roman" w:eastAsiaTheme="minorHAnsi" w:hAnsi="Times New Roman" w:cs="Times New Roman"/>
+          <w:sz w:val="24"/>
+          <w:szCs w:val="24"/>
+        </w:rPr>
+        <w:t xml:space="preserve"> [...],</w:t>
       </w:r>
     </w:p>
     <w:p>
@@ -3931,14 +4148,25 @@
         <w:t>contraintes_respectees</w:t>
       </w:r>
       <w:proofErr w:type="spellEnd"/>
-      <w:r>
-        <w:rPr>
-          <w:rStyle w:val="CodeHTML"/>
-          <w:rFonts w:ascii="Times New Roman" w:eastAsiaTheme="minorHAnsi" w:hAnsi="Times New Roman" w:cs="Times New Roman"/>
-          <w:sz w:val="24"/>
-          <w:szCs w:val="24"/>
-        </w:rPr>
-        <w:t xml:space="preserve">": </w:t>
+      <w:proofErr w:type="gramStart"/>
+      <w:r>
+        <w:rPr>
+          <w:rStyle w:val="CodeHTML"/>
+          <w:rFonts w:ascii="Times New Roman" w:eastAsiaTheme="minorHAnsi" w:hAnsi="Times New Roman" w:cs="Times New Roman"/>
+          <w:sz w:val="24"/>
+          <w:szCs w:val="24"/>
+        </w:rPr>
+        <w:t>":</w:t>
+      </w:r>
+      <w:proofErr w:type="gramEnd"/>
+      <w:r>
+        <w:rPr>
+          <w:rStyle w:val="CodeHTML"/>
+          <w:rFonts w:ascii="Times New Roman" w:eastAsiaTheme="minorHAnsi" w:hAnsi="Times New Roman" w:cs="Times New Roman"/>
+          <w:sz w:val="24"/>
+          <w:szCs w:val="24"/>
+        </w:rPr>
+        <w:t xml:space="preserve"> </w:t>
       </w:r>
       <w:proofErr w:type="spellStart"/>
       <w:r>
@@ -3990,14 +4218,25 @@
         <w:t>verdict_global</w:t>
       </w:r>
       <w:proofErr w:type="spellEnd"/>
-      <w:r>
-        <w:rPr>
-          <w:rStyle w:val="CodeHTML"/>
-          <w:rFonts w:ascii="Times New Roman" w:eastAsiaTheme="minorHAnsi" w:hAnsi="Times New Roman" w:cs="Times New Roman"/>
-          <w:sz w:val="24"/>
-          <w:szCs w:val="24"/>
-        </w:rPr>
-        <w:t>": "..."</w:t>
+      <w:proofErr w:type="gramStart"/>
+      <w:r>
+        <w:rPr>
+          <w:rStyle w:val="CodeHTML"/>
+          <w:rFonts w:ascii="Times New Roman" w:eastAsiaTheme="minorHAnsi" w:hAnsi="Times New Roman" w:cs="Times New Roman"/>
+          <w:sz w:val="24"/>
+          <w:szCs w:val="24"/>
+        </w:rPr>
+        <w:t>":</w:t>
+      </w:r>
+      <w:proofErr w:type="gramEnd"/>
+      <w:r>
+        <w:rPr>
+          <w:rStyle w:val="CodeHTML"/>
+          <w:rFonts w:ascii="Times New Roman" w:eastAsiaTheme="minorHAnsi" w:hAnsi="Times New Roman" w:cs="Times New Roman"/>
+          <w:sz w:val="24"/>
+          <w:szCs w:val="24"/>
+        </w:rPr>
+        <w:t xml:space="preserve"> "..."</w:t>
       </w:r>
     </w:p>
     <w:p>
@@ -4667,7 +4906,25 @@
           <w:sz w:val="24"/>
           <w:szCs w:val="24"/>
         </w:rPr>
-        <w:t xml:space="preserve">  "sentiment": "</w:t>
+        <w:t xml:space="preserve">  "sentiment</w:t>
+      </w:r>
+      <w:proofErr w:type="gramStart"/>
+      <w:r>
+        <w:rPr>
+          <w:rFonts w:ascii="Times New Roman" w:hAnsi="Times New Roman" w:cs="Times New Roman"/>
+          <w:sz w:val="24"/>
+          <w:szCs w:val="24"/>
+        </w:rPr>
+        <w:t>":</w:t>
+      </w:r>
+      <w:proofErr w:type="gramEnd"/>
+      <w:r>
+        <w:rPr>
+          <w:rFonts w:ascii="Times New Roman" w:hAnsi="Times New Roman" w:cs="Times New Roman"/>
+          <w:sz w:val="24"/>
+          <w:szCs w:val="24"/>
+        </w:rPr>
+        <w:t xml:space="preserve"> "</w:t>
       </w:r>
       <w:proofErr w:type="spellStart"/>
       <w:r>
@@ -4715,13 +4972,23 @@
         <w:t>categorie</w:t>
       </w:r>
       <w:proofErr w:type="spellEnd"/>
-      <w:r>
-        <w:rPr>
-          <w:rFonts w:ascii="Times New Roman" w:hAnsi="Times New Roman" w:cs="Times New Roman"/>
-          <w:sz w:val="24"/>
-          <w:szCs w:val="24"/>
-        </w:rPr>
-        <w:t>": "livraison",</w:t>
+      <w:proofErr w:type="gramStart"/>
+      <w:r>
+        <w:rPr>
+          <w:rFonts w:ascii="Times New Roman" w:hAnsi="Times New Roman" w:cs="Times New Roman"/>
+          <w:sz w:val="24"/>
+          <w:szCs w:val="24"/>
+        </w:rPr>
+        <w:t>":</w:t>
+      </w:r>
+      <w:proofErr w:type="gramEnd"/>
+      <w:r>
+        <w:rPr>
+          <w:rFonts w:ascii="Times New Roman" w:hAnsi="Times New Roman" w:cs="Times New Roman"/>
+          <w:sz w:val="24"/>
+          <w:szCs w:val="24"/>
+        </w:rPr>
+        <w:t xml:space="preserve"> "livraison",</w:t>
       </w:r>
     </w:p>
     <w:p>
@@ -4739,7 +5006,25 @@
           <w:sz w:val="24"/>
           <w:szCs w:val="24"/>
         </w:rPr>
-        <w:t xml:space="preserve">  "urgence": "moyenne",</w:t>
+        <w:t xml:space="preserve">  "urgence</w:t>
+      </w:r>
+      <w:proofErr w:type="gramStart"/>
+      <w:r>
+        <w:rPr>
+          <w:rFonts w:ascii="Times New Roman" w:hAnsi="Times New Roman" w:cs="Times New Roman"/>
+          <w:sz w:val="24"/>
+          <w:szCs w:val="24"/>
+        </w:rPr>
+        <w:t>":</w:t>
+      </w:r>
+      <w:proofErr w:type="gramEnd"/>
+      <w:r>
+        <w:rPr>
+          <w:rFonts w:ascii="Times New Roman" w:hAnsi="Times New Roman" w:cs="Times New Roman"/>
+          <w:sz w:val="24"/>
+          <w:szCs w:val="24"/>
+        </w:rPr>
+        <w:t xml:space="preserve"> "moyenne",</w:t>
       </w:r>
     </w:p>
     <w:p>
@@ -4769,13 +5054,23 @@
         <w:t>probleme</w:t>
       </w:r>
       <w:proofErr w:type="spellEnd"/>
-      <w:r>
-        <w:rPr>
-          <w:rFonts w:ascii="Times New Roman" w:hAnsi="Times New Roman" w:cs="Times New Roman"/>
-          <w:sz w:val="24"/>
-          <w:szCs w:val="24"/>
-        </w:rPr>
-        <w:t>": "Retard de livraison",</w:t>
+      <w:proofErr w:type="gramStart"/>
+      <w:r>
+        <w:rPr>
+          <w:rFonts w:ascii="Times New Roman" w:hAnsi="Times New Roman" w:cs="Times New Roman"/>
+          <w:sz w:val="24"/>
+          <w:szCs w:val="24"/>
+        </w:rPr>
+        <w:t>":</w:t>
+      </w:r>
+      <w:proofErr w:type="gramEnd"/>
+      <w:r>
+        <w:rPr>
+          <w:rFonts w:ascii="Times New Roman" w:hAnsi="Times New Roman" w:cs="Times New Roman"/>
+          <w:sz w:val="24"/>
+          <w:szCs w:val="24"/>
+        </w:rPr>
+        <w:t xml:space="preserve"> "Retard de livraison",</w:t>
       </w:r>
     </w:p>
     <w:p>
@@ -4793,7 +5088,25 @@
           <w:sz w:val="24"/>
           <w:szCs w:val="24"/>
         </w:rPr>
-        <w:t xml:space="preserve">  "confiance": 0.91</w:t>
+        <w:t xml:space="preserve">  "confiance</w:t>
+      </w:r>
+      <w:proofErr w:type="gramStart"/>
+      <w:r>
+        <w:rPr>
+          <w:rFonts w:ascii="Times New Roman" w:hAnsi="Times New Roman" w:cs="Times New Roman"/>
+          <w:sz w:val="24"/>
+          <w:szCs w:val="24"/>
+        </w:rPr>
+        <w:t>":</w:t>
+      </w:r>
+      <w:proofErr w:type="gramEnd"/>
+      <w:r>
+        <w:rPr>
+          <w:rFonts w:ascii="Times New Roman" w:hAnsi="Times New Roman" w:cs="Times New Roman"/>
+          <w:sz w:val="24"/>
+          <w:szCs w:val="24"/>
+        </w:rPr>
+        <w:t xml:space="preserve"> 0.91</w:t>
       </w:r>
     </w:p>
     <w:p>
@@ -5233,8 +5546,18 @@
           <w:sz w:val="24"/>
           <w:szCs w:val="24"/>
         </w:rPr>
-        <w:t>Si une valeur ne peut pas être déterminée avec certitude, choisis la valeur la</w:t>
-      </w:r>
+        <w:t xml:space="preserve">Si une valeur ne peut pas être déterminée avec certitude, choisis la valeur </w:t>
+      </w:r>
+      <w:proofErr w:type="gramStart"/>
+      <w:r>
+        <w:rPr>
+          <w:rFonts w:ascii="Times New Roman" w:hAnsi="Times New Roman" w:cs="Times New Roman"/>
+          <w:sz w:val="24"/>
+          <w:szCs w:val="24"/>
+        </w:rPr>
+        <w:t>la</w:t>
+      </w:r>
+      <w:proofErr w:type="gramEnd"/>
     </w:p>
     <w:p>
       <w:pPr>
@@ -6033,7 +6356,23 @@
           <w:sz w:val="24"/>
           <w:szCs w:val="24"/>
         </w:rPr>
-        <w:t>PDF que j’ai résumer je le pusherai pour que vous puisse voir</w:t>
+        <w:t xml:space="preserve">PDF que j’ai </w:t>
+      </w:r>
+      <w:r>
+        <w:rPr>
+          <w:rFonts w:ascii="Times New Roman" w:hAnsi="Times New Roman" w:cs="Times New Roman"/>
+          <w:sz w:val="24"/>
+          <w:szCs w:val="24"/>
+        </w:rPr>
+        <w:t>résumé</w:t>
+      </w:r>
+      <w:r>
+        <w:rPr>
+          <w:rFonts w:ascii="Times New Roman" w:hAnsi="Times New Roman" w:cs="Times New Roman"/>
+          <w:sz w:val="24"/>
+          <w:szCs w:val="24"/>
+        </w:rPr>
+        <w:t xml:space="preserve"> je le pusherai pour que vous puisse voir</w:t>
       </w:r>
       <w:r>
         <w:rPr>
@@ -6054,6 +6393,526 @@
           <w:szCs w:val="24"/>
         </w:rPr>
       </w:pPr>
+    </w:p>
+    <w:p>
+      <w:pPr>
+        <w:pStyle w:val="Titre2"/>
+        <w:rPr>
+          <w:sz w:val="28"/>
+          <w:szCs w:val="28"/>
+        </w:rPr>
+      </w:pPr>
+      <w:r>
+        <w:rPr>
+          <w:sz w:val="28"/>
+          <w:szCs w:val="28"/>
+        </w:rPr>
+        <w:t>2) Traduction FR → EN (fidèle, sans résumé)</w:t>
+      </w:r>
+    </w:p>
+    <w:p>
+      <w:pPr>
+        <w:pStyle w:val="PrformatHTML"/>
+        <w:rPr>
+          <w:rStyle w:val="CodeHTML"/>
+          <w:rFonts w:ascii="Times New Roman" w:hAnsi="Times New Roman" w:cs="Times New Roman"/>
+          <w:sz w:val="24"/>
+          <w:szCs w:val="24"/>
+        </w:rPr>
+      </w:pPr>
+      <w:r>
+        <w:rPr>
+          <w:rStyle w:val="CodeHTML"/>
+          <w:rFonts w:ascii="Times New Roman" w:hAnsi="Times New Roman" w:cs="Times New Roman"/>
+          <w:b/>
+          <w:bCs/>
+          <w:sz w:val="24"/>
+          <w:szCs w:val="24"/>
+        </w:rPr>
+        <w:t>Rôle</w:t>
+      </w:r>
+      <w:r>
+        <w:rPr>
+          <w:rStyle w:val="CodeHTML"/>
+          <w:rFonts w:ascii="Times New Roman" w:hAnsi="Times New Roman" w:cs="Times New Roman"/>
+          <w:sz w:val="24"/>
+          <w:szCs w:val="24"/>
+        </w:rPr>
+        <w:t xml:space="preserve"> : </w:t>
+      </w:r>
+      <w:r>
+        <w:rPr>
+          <w:rStyle w:val="CodeHTML"/>
+          <w:rFonts w:ascii="Times New Roman" w:hAnsi="Times New Roman" w:cs="Times New Roman"/>
+          <w:sz w:val="24"/>
+          <w:szCs w:val="24"/>
+        </w:rPr>
+        <w:t>Tu es un traducteur professionnel spécialisé dans les documents techniques.</w:t>
+      </w:r>
+    </w:p>
+    <w:p>
+      <w:pPr>
+        <w:pStyle w:val="PrformatHTML"/>
+        <w:rPr>
+          <w:rStyle w:val="CodeHTML"/>
+          <w:rFonts w:ascii="Times New Roman" w:hAnsi="Times New Roman" w:cs="Times New Roman"/>
+          <w:sz w:val="24"/>
+          <w:szCs w:val="24"/>
+        </w:rPr>
+      </w:pPr>
+    </w:p>
+    <w:p>
+      <w:pPr>
+        <w:pStyle w:val="PrformatHTML"/>
+        <w:rPr>
+          <w:rStyle w:val="CodeHTML"/>
+          <w:rFonts w:ascii="Times New Roman" w:hAnsi="Times New Roman" w:cs="Times New Roman"/>
+          <w:sz w:val="24"/>
+          <w:szCs w:val="24"/>
+        </w:rPr>
+      </w:pPr>
+      <w:r>
+        <w:rPr>
+          <w:rStyle w:val="CodeHTML"/>
+          <w:rFonts w:ascii="Times New Roman" w:hAnsi="Times New Roman" w:cs="Times New Roman"/>
+          <w:b/>
+          <w:bCs/>
+          <w:sz w:val="24"/>
+          <w:szCs w:val="24"/>
+        </w:rPr>
+        <w:t>Tâche</w:t>
+      </w:r>
+      <w:r>
+        <w:rPr>
+          <w:rStyle w:val="CodeHTML"/>
+          <w:rFonts w:ascii="Times New Roman" w:hAnsi="Times New Roman" w:cs="Times New Roman"/>
+          <w:sz w:val="24"/>
+          <w:szCs w:val="24"/>
+        </w:rPr>
+        <w:t xml:space="preserve"> : Traduis le document suivant du français vers l'anglais.</w:t>
+      </w:r>
+    </w:p>
+    <w:p>
+      <w:pPr>
+        <w:pStyle w:val="PrformatHTML"/>
+        <w:rPr>
+          <w:rStyle w:val="CodeHTML"/>
+          <w:rFonts w:ascii="Times New Roman" w:hAnsi="Times New Roman" w:cs="Times New Roman"/>
+          <w:sz w:val="24"/>
+          <w:szCs w:val="24"/>
+        </w:rPr>
+      </w:pPr>
+    </w:p>
+    <w:p>
+      <w:pPr>
+        <w:pStyle w:val="PrformatHTML"/>
+        <w:rPr>
+          <w:rStyle w:val="CodeHTML"/>
+          <w:rFonts w:ascii="Times New Roman" w:hAnsi="Times New Roman" w:cs="Times New Roman"/>
+          <w:sz w:val="24"/>
+          <w:szCs w:val="24"/>
+        </w:rPr>
+      </w:pPr>
+      <w:r>
+        <w:rPr>
+          <w:rStyle w:val="CodeHTML"/>
+          <w:rFonts w:ascii="Times New Roman" w:hAnsi="Times New Roman" w:cs="Times New Roman"/>
+          <w:b/>
+          <w:bCs/>
+          <w:sz w:val="24"/>
+          <w:szCs w:val="24"/>
+        </w:rPr>
+        <w:t>Contraintes</w:t>
+      </w:r>
+      <w:r>
+        <w:rPr>
+          <w:rStyle w:val="CodeHTML"/>
+          <w:rFonts w:ascii="Times New Roman" w:hAnsi="Times New Roman" w:cs="Times New Roman"/>
+          <w:sz w:val="24"/>
+          <w:szCs w:val="24"/>
+        </w:rPr>
+        <w:t xml:space="preserve"> :</w:t>
+      </w:r>
+    </w:p>
+    <w:p>
+      <w:pPr>
+        <w:pStyle w:val="PrformatHTML"/>
+        <w:rPr>
+          <w:rStyle w:val="CodeHTML"/>
+          <w:rFonts w:ascii="Times New Roman" w:hAnsi="Times New Roman" w:cs="Times New Roman"/>
+          <w:sz w:val="24"/>
+          <w:szCs w:val="24"/>
+        </w:rPr>
+      </w:pPr>
+      <w:r>
+        <w:rPr>
+          <w:rStyle w:val="CodeHTML"/>
+          <w:rFonts w:ascii="Times New Roman" w:hAnsi="Times New Roman" w:cs="Times New Roman"/>
+          <w:sz w:val="24"/>
+          <w:szCs w:val="24"/>
+        </w:rPr>
+        <w:t>- Conserve intégralement le sens du texte source, sans en changer la portée.</w:t>
+      </w:r>
+    </w:p>
+    <w:p>
+      <w:pPr>
+        <w:pStyle w:val="PrformatHTML"/>
+        <w:rPr>
+          <w:rStyle w:val="CodeHTML"/>
+          <w:rFonts w:ascii="Times New Roman" w:hAnsi="Times New Roman" w:cs="Times New Roman"/>
+          <w:sz w:val="24"/>
+          <w:szCs w:val="24"/>
+        </w:rPr>
+      </w:pPr>
+      <w:r>
+        <w:rPr>
+          <w:rStyle w:val="CodeHTML"/>
+          <w:rFonts w:ascii="Times New Roman" w:hAnsi="Times New Roman" w:cs="Times New Roman"/>
+          <w:sz w:val="24"/>
+          <w:szCs w:val="24"/>
+        </w:rPr>
+        <w:t>- Conserve la structure du document (titres, paragraphes, listes, ordre des</w:t>
+      </w:r>
+    </w:p>
+    <w:p>
+      <w:pPr>
+        <w:pStyle w:val="PrformatHTML"/>
+        <w:rPr>
+          <w:rStyle w:val="CodeHTML"/>
+          <w:rFonts w:ascii="Times New Roman" w:hAnsi="Times New Roman" w:cs="Times New Roman"/>
+          <w:sz w:val="24"/>
+          <w:szCs w:val="24"/>
+        </w:rPr>
+      </w:pPr>
+      <w:r>
+        <w:rPr>
+          <w:rStyle w:val="CodeHTML"/>
+          <w:rFonts w:ascii="Times New Roman" w:hAnsi="Times New Roman" w:cs="Times New Roman"/>
+          <w:sz w:val="24"/>
+          <w:szCs w:val="24"/>
+        </w:rPr>
+        <w:t xml:space="preserve">  </w:t>
+      </w:r>
+      <w:proofErr w:type="gramStart"/>
+      <w:r>
+        <w:rPr>
+          <w:rStyle w:val="CodeHTML"/>
+          <w:rFonts w:ascii="Times New Roman" w:hAnsi="Times New Roman" w:cs="Times New Roman"/>
+          <w:sz w:val="24"/>
+          <w:szCs w:val="24"/>
+        </w:rPr>
+        <w:t>sections</w:t>
+      </w:r>
+      <w:proofErr w:type="gramEnd"/>
+      <w:r>
+        <w:rPr>
+          <w:rStyle w:val="CodeHTML"/>
+          <w:rFonts w:ascii="Times New Roman" w:hAnsi="Times New Roman" w:cs="Times New Roman"/>
+          <w:sz w:val="24"/>
+          <w:szCs w:val="24"/>
+        </w:rPr>
+        <w:t>).</w:t>
+      </w:r>
+    </w:p>
+    <w:p>
+      <w:pPr>
+        <w:pStyle w:val="PrformatHTML"/>
+        <w:rPr>
+          <w:rStyle w:val="CodeHTML"/>
+          <w:rFonts w:ascii="Times New Roman" w:hAnsi="Times New Roman" w:cs="Times New Roman"/>
+          <w:sz w:val="24"/>
+          <w:szCs w:val="24"/>
+        </w:rPr>
+      </w:pPr>
+      <w:r>
+        <w:rPr>
+          <w:rStyle w:val="CodeHTML"/>
+          <w:rFonts w:ascii="Times New Roman" w:hAnsi="Times New Roman" w:cs="Times New Roman"/>
+          <w:sz w:val="24"/>
+          <w:szCs w:val="24"/>
+        </w:rPr>
+        <w:t>- Conserve les termes techniques dans leur forme standard en anglais (ne les</w:t>
+      </w:r>
+    </w:p>
+    <w:p>
+      <w:pPr>
+        <w:pStyle w:val="PrformatHTML"/>
+        <w:rPr>
+          <w:rStyle w:val="CodeHTML"/>
+          <w:rFonts w:ascii="Times New Roman" w:hAnsi="Times New Roman" w:cs="Times New Roman"/>
+          <w:sz w:val="24"/>
+          <w:szCs w:val="24"/>
+        </w:rPr>
+      </w:pPr>
+      <w:r>
+        <w:rPr>
+          <w:rStyle w:val="CodeHTML"/>
+          <w:rFonts w:ascii="Times New Roman" w:hAnsi="Times New Roman" w:cs="Times New Roman"/>
+          <w:sz w:val="24"/>
+          <w:szCs w:val="24"/>
+        </w:rPr>
+        <w:t xml:space="preserve">  </w:t>
+      </w:r>
+      <w:proofErr w:type="gramStart"/>
+      <w:r>
+        <w:rPr>
+          <w:rStyle w:val="CodeHTML"/>
+          <w:rFonts w:ascii="Times New Roman" w:hAnsi="Times New Roman" w:cs="Times New Roman"/>
+          <w:sz w:val="24"/>
+          <w:szCs w:val="24"/>
+        </w:rPr>
+        <w:t>francise</w:t>
+      </w:r>
+      <w:proofErr w:type="gramEnd"/>
+      <w:r>
+        <w:rPr>
+          <w:rStyle w:val="CodeHTML"/>
+          <w:rFonts w:ascii="Times New Roman" w:hAnsi="Times New Roman" w:cs="Times New Roman"/>
+          <w:sz w:val="24"/>
+          <w:szCs w:val="24"/>
+        </w:rPr>
+        <w:t xml:space="preserve"> pas, ne les simplifie pas).</w:t>
+      </w:r>
+    </w:p>
+    <w:p>
+      <w:pPr>
+        <w:pStyle w:val="PrformatHTML"/>
+        <w:rPr>
+          <w:rStyle w:val="CodeHTML"/>
+          <w:rFonts w:ascii="Times New Roman" w:hAnsi="Times New Roman" w:cs="Times New Roman"/>
+          <w:sz w:val="24"/>
+          <w:szCs w:val="24"/>
+        </w:rPr>
+      </w:pPr>
+      <w:r>
+        <w:rPr>
+          <w:rStyle w:val="CodeHTML"/>
+          <w:rFonts w:ascii="Times New Roman" w:hAnsi="Times New Roman" w:cs="Times New Roman"/>
+          <w:sz w:val="24"/>
+          <w:szCs w:val="24"/>
+        </w:rPr>
+        <w:t>- Ne résume rien : traduis l'intégralité du contenu, phrase par phrase.</w:t>
+      </w:r>
+    </w:p>
+    <w:p>
+      <w:pPr>
+        <w:pStyle w:val="PrformatHTML"/>
+        <w:rPr>
+          <w:rStyle w:val="CodeHTML"/>
+          <w:rFonts w:ascii="Times New Roman" w:hAnsi="Times New Roman" w:cs="Times New Roman"/>
+          <w:sz w:val="24"/>
+          <w:szCs w:val="24"/>
+        </w:rPr>
+      </w:pPr>
+      <w:r>
+        <w:rPr>
+          <w:rStyle w:val="CodeHTML"/>
+          <w:rFonts w:ascii="Times New Roman" w:hAnsi="Times New Roman" w:cs="Times New Roman"/>
+          <w:sz w:val="24"/>
+          <w:szCs w:val="24"/>
+        </w:rPr>
+        <w:t>- N'ajoute aucune information, aucun commentaire, aucune note de traducteur.</w:t>
+      </w:r>
+    </w:p>
+    <w:p>
+      <w:pPr>
+        <w:pStyle w:val="PrformatHTML"/>
+        <w:rPr>
+          <w:rFonts w:ascii="Times New Roman" w:hAnsi="Times New Roman" w:cs="Times New Roman"/>
+          <w:sz w:val="24"/>
+          <w:szCs w:val="24"/>
+        </w:rPr>
+      </w:pPr>
+    </w:p>
+    <w:p>
+      <w:pPr>
+        <w:pStyle w:val="PrformatHTML"/>
+        <w:ind w:left="360"/>
+        <w:rPr>
+          <w:rStyle w:val="CodeHTML"/>
+          <w:rFonts w:ascii="Times New Roman" w:hAnsi="Times New Roman" w:cs="Times New Roman"/>
+          <w:b/>
+          <w:bCs/>
+          <w:sz w:val="24"/>
+          <w:szCs w:val="24"/>
+        </w:rPr>
+      </w:pPr>
+      <w:r>
+        <w:rPr>
+          <w:rStyle w:val="CodeHTML"/>
+          <w:rFonts w:ascii="Times New Roman" w:hAnsi="Times New Roman" w:cs="Times New Roman"/>
+          <w:b/>
+          <w:bCs/>
+          <w:sz w:val="28"/>
+          <w:szCs w:val="28"/>
+        </w:rPr>
+        <w:t>Résultat</w:t>
+      </w:r>
+      <w:r>
+        <w:rPr>
+          <w:rStyle w:val="CodeHTML"/>
+          <w:rFonts w:ascii="Times New Roman" w:hAnsi="Times New Roman" w:cs="Times New Roman"/>
+          <w:b/>
+          <w:bCs/>
+          <w:sz w:val="24"/>
+          <w:szCs w:val="24"/>
+        </w:rPr>
+        <w:t> :</w:t>
+      </w:r>
+    </w:p>
+    <w:p>
+      <w:pPr>
+        <w:pStyle w:val="PrformatHTML"/>
+        <w:ind w:left="360"/>
+        <w:rPr>
+          <w:rStyle w:val="CodeHTML"/>
+          <w:rFonts w:ascii="Times New Roman" w:hAnsi="Times New Roman" w:cs="Times New Roman"/>
+          <w:b/>
+          <w:bCs/>
+          <w:sz w:val="24"/>
+          <w:szCs w:val="24"/>
+        </w:rPr>
+      </w:pPr>
+      <w:r>
+        <w:rPr>
+          <w:rStyle w:val="CodeHTML"/>
+          <w:rFonts w:ascii="Times New Roman" w:hAnsi="Times New Roman" w:cs="Times New Roman"/>
+          <w:b/>
+          <w:bCs/>
+          <w:sz w:val="24"/>
+          <w:szCs w:val="24"/>
+        </w:rPr>
+        <w:lastRenderedPageBreak/>
+        <w:drawing>
+          <wp:inline distT="0" distB="0" distL="0" distR="0" wp14:anchorId="5F215F3D" wp14:editId="498DA6CB">
+            <wp:extent cx="5759450" cy="3850640"/>
+            <wp:effectExtent l="0" t="0" r="0" b="0"/>
+            <wp:docPr id="17" name="Image 17"/>
+            <wp:cNvGraphicFramePr>
+              <a:graphicFrameLocks xmlns:a="http://schemas.openxmlformats.org/drawingml/2006/main" noChangeAspect="1"/>
+            </wp:cNvGraphicFramePr>
+            <a:graphic xmlns:a="http://schemas.openxmlformats.org/drawingml/2006/main">
+              <a:graphicData uri="http://schemas.openxmlformats.org/drawingml/2006/picture">
+                <pic:pic xmlns:pic="http://schemas.openxmlformats.org/drawingml/2006/picture">
+                  <pic:nvPicPr>
+                    <pic:cNvPr id="1" name=""/>
+                    <pic:cNvPicPr/>
+                  </pic:nvPicPr>
+                  <pic:blipFill>
+                    <a:blip r:embed="rId21"/>
+                    <a:stretch>
+                      <a:fillRect/>
+                    </a:stretch>
+                  </pic:blipFill>
+                  <pic:spPr>
+                    <a:xfrm>
+                      <a:off x="0" y="0"/>
+                      <a:ext cx="5759450" cy="3850640"/>
+                    </a:xfrm>
+                    <a:prstGeom prst="rect">
+                      <a:avLst/>
+                    </a:prstGeom>
+                  </pic:spPr>
+                </pic:pic>
+              </a:graphicData>
+            </a:graphic>
+          </wp:inline>
+        </w:drawing>
+      </w:r>
+    </w:p>
+    <w:p>
+      <w:pPr>
+        <w:pStyle w:val="PrformatHTML"/>
+        <w:ind w:left="360"/>
+        <w:rPr>
+          <w:rStyle w:val="CodeHTML"/>
+          <w:rFonts w:ascii="Times New Roman" w:hAnsi="Times New Roman" w:cs="Times New Roman"/>
+          <w:b/>
+          <w:bCs/>
+          <w:sz w:val="24"/>
+          <w:szCs w:val="24"/>
+        </w:rPr>
+      </w:pPr>
+    </w:p>
+    <w:p>
+      <w:pPr>
+        <w:pStyle w:val="PrformatHTML"/>
+        <w:ind w:left="360"/>
+        <w:rPr>
+          <w:rStyle w:val="CodeHTML"/>
+          <w:rFonts w:ascii="Times New Roman" w:hAnsi="Times New Roman" w:cs="Times New Roman"/>
+          <w:b/>
+          <w:bCs/>
+          <w:sz w:val="24"/>
+          <w:szCs w:val="24"/>
+        </w:rPr>
+      </w:pPr>
+      <w:r>
+        <w:rPr>
+          <w:rStyle w:val="CodeHTML"/>
+          <w:rFonts w:ascii="Times New Roman" w:hAnsi="Times New Roman" w:cs="Times New Roman"/>
+          <w:b/>
+          <w:bCs/>
+          <w:sz w:val="24"/>
+          <w:szCs w:val="24"/>
+        </w:rPr>
+        <w:drawing>
+          <wp:inline distT="0" distB="0" distL="0" distR="0" wp14:anchorId="782F8914" wp14:editId="1DAD3815">
+            <wp:extent cx="4406900" cy="4476860"/>
+            <wp:effectExtent l="0" t="0" r="0" b="0"/>
+            <wp:docPr id="18" name="Image 18"/>
+            <wp:cNvGraphicFramePr>
+              <a:graphicFrameLocks xmlns:a="http://schemas.openxmlformats.org/drawingml/2006/main" noChangeAspect="1"/>
+            </wp:cNvGraphicFramePr>
+            <a:graphic xmlns:a="http://schemas.openxmlformats.org/drawingml/2006/main">
+              <a:graphicData uri="http://schemas.openxmlformats.org/drawingml/2006/picture">
+                <pic:pic xmlns:pic="http://schemas.openxmlformats.org/drawingml/2006/picture">
+                  <pic:nvPicPr>
+                    <pic:cNvPr id="1" name=""/>
+                    <pic:cNvPicPr/>
+                  </pic:nvPicPr>
+                  <pic:blipFill>
+                    <a:blip r:embed="rId22"/>
+                    <a:stretch>
+                      <a:fillRect/>
+                    </a:stretch>
+                  </pic:blipFill>
+                  <pic:spPr>
+                    <a:xfrm>
+                      <a:off x="0" y="0"/>
+                      <a:ext cx="4409037" cy="4479031"/>
+                    </a:xfrm>
+                    <a:prstGeom prst="rect">
+                      <a:avLst/>
+                    </a:prstGeom>
+                  </pic:spPr>
+                </pic:pic>
+              </a:graphicData>
+            </a:graphic>
+          </wp:inline>
+        </w:drawing>
+      </w:r>
+    </w:p>
+    <w:p>
+      <w:pPr>
+        <w:pStyle w:val="PrformatHTML"/>
+        <w:ind w:left="360"/>
+        <w:rPr>
+          <w:rStyle w:val="CodeHTML"/>
+          <w:rFonts w:ascii="Times New Roman" w:hAnsi="Times New Roman" w:cs="Times New Roman"/>
+          <w:sz w:val="24"/>
+          <w:szCs w:val="24"/>
+        </w:rPr>
+      </w:pPr>
+      <w:r>
+        <w:rPr>
+          <w:rStyle w:val="CodeHTML"/>
+          <w:rFonts w:ascii="Times New Roman" w:hAnsi="Times New Roman" w:cs="Times New Roman"/>
+          <w:sz w:val="24"/>
+          <w:szCs w:val="24"/>
+        </w:rPr>
+        <w:t>Je l’ai données le même document du résumer</w:t>
+      </w:r>
     </w:p>
     <w:p>
       <w:pPr>

</xml_diff>

<commit_message>
Partie 5 question 3
</commit_message>
<xml_diff>
--- a/ai-business_assistant.docx
+++ b/ai-business_assistant.docx
@@ -6407,7 +6407,21 @@
           <w:sz w:val="28"/>
           <w:szCs w:val="28"/>
         </w:rPr>
-        <w:t>2) Traduction FR → EN (fidèle, sans résumé)</w:t>
+        <w:t xml:space="preserve">2) Traduction FR </w:t>
+      </w:r>
+      <w:r>
+        <w:rPr>
+          <w:sz w:val="28"/>
+          <w:szCs w:val="28"/>
+        </w:rPr>
+        <w:t>et</w:t>
+      </w:r>
+      <w:r>
+        <w:rPr>
+          <w:sz w:val="28"/>
+          <w:szCs w:val="28"/>
+        </w:rPr>
+        <w:t xml:space="preserve"> EN (fidèle, sans résumé)</w:t>
       </w:r>
     </w:p>
     <w:p>
@@ -6537,181 +6551,157 @@
     <w:p>
       <w:pPr>
         <w:pStyle w:val="PrformatHTML"/>
-        <w:rPr>
-          <w:rStyle w:val="CodeHTML"/>
-          <w:rFonts w:ascii="Times New Roman" w:hAnsi="Times New Roman" w:cs="Times New Roman"/>
-          <w:sz w:val="24"/>
-          <w:szCs w:val="24"/>
-        </w:rPr>
-      </w:pPr>
-      <w:r>
-        <w:rPr>
-          <w:rStyle w:val="CodeHTML"/>
-          <w:rFonts w:ascii="Times New Roman" w:hAnsi="Times New Roman" w:cs="Times New Roman"/>
-          <w:sz w:val="24"/>
-          <w:szCs w:val="24"/>
-        </w:rPr>
-        <w:t>- Conserve intégralement le sens du texte source, sans en changer la portée.</w:t>
+        <w:numPr>
+          <w:ilvl w:val="0"/>
+          <w:numId w:val="13"/>
+        </w:numPr>
+        <w:rPr>
+          <w:rStyle w:val="CodeHTML"/>
+          <w:rFonts w:ascii="Times New Roman" w:hAnsi="Times New Roman" w:cs="Times New Roman"/>
+          <w:sz w:val="24"/>
+          <w:szCs w:val="24"/>
+        </w:rPr>
+      </w:pPr>
+      <w:r>
+        <w:rPr>
+          <w:rStyle w:val="CodeHTML"/>
+          <w:rFonts w:ascii="Times New Roman" w:hAnsi="Times New Roman" w:cs="Times New Roman"/>
+          <w:sz w:val="24"/>
+          <w:szCs w:val="24"/>
+        </w:rPr>
+        <w:t>Conserve intégralement le sens du texte source, sans en changer la portée.</w:t>
       </w:r>
     </w:p>
     <w:p>
       <w:pPr>
         <w:pStyle w:val="PrformatHTML"/>
-        <w:rPr>
-          <w:rStyle w:val="CodeHTML"/>
-          <w:rFonts w:ascii="Times New Roman" w:hAnsi="Times New Roman" w:cs="Times New Roman"/>
-          <w:sz w:val="24"/>
-          <w:szCs w:val="24"/>
-        </w:rPr>
-      </w:pPr>
-      <w:r>
-        <w:rPr>
-          <w:rStyle w:val="CodeHTML"/>
-          <w:rFonts w:ascii="Times New Roman" w:hAnsi="Times New Roman" w:cs="Times New Roman"/>
-          <w:sz w:val="24"/>
-          <w:szCs w:val="24"/>
-        </w:rPr>
-        <w:t>- Conserve la structure du document (titres, paragraphes, listes, ordre des</w:t>
+        <w:numPr>
+          <w:ilvl w:val="0"/>
+          <w:numId w:val="13"/>
+        </w:numPr>
+        <w:rPr>
+          <w:rStyle w:val="CodeHTML"/>
+          <w:rFonts w:ascii="Times New Roman" w:hAnsi="Times New Roman" w:cs="Times New Roman"/>
+          <w:sz w:val="24"/>
+          <w:szCs w:val="24"/>
+        </w:rPr>
+      </w:pPr>
+      <w:r>
+        <w:rPr>
+          <w:rStyle w:val="CodeHTML"/>
+          <w:rFonts w:ascii="Times New Roman" w:hAnsi="Times New Roman" w:cs="Times New Roman"/>
+          <w:sz w:val="24"/>
+          <w:szCs w:val="24"/>
+        </w:rPr>
+        <w:t>Conserve la structure du document (titres, paragraphes, listes, ordre des</w:t>
+      </w:r>
+      <w:r>
+        <w:rPr>
+          <w:rStyle w:val="CodeHTML"/>
+          <w:rFonts w:ascii="Times New Roman" w:hAnsi="Times New Roman" w:cs="Times New Roman"/>
+          <w:sz w:val="24"/>
+          <w:szCs w:val="24"/>
+        </w:rPr>
+        <w:t xml:space="preserve"> </w:t>
+      </w:r>
+      <w:r>
+        <w:rPr>
+          <w:rStyle w:val="CodeHTML"/>
+          <w:rFonts w:ascii="Times New Roman" w:hAnsi="Times New Roman" w:cs="Times New Roman"/>
+          <w:sz w:val="24"/>
+          <w:szCs w:val="24"/>
+        </w:rPr>
+        <w:t>sections).</w:t>
       </w:r>
     </w:p>
     <w:p>
       <w:pPr>
         <w:pStyle w:val="PrformatHTML"/>
-        <w:rPr>
-          <w:rStyle w:val="CodeHTML"/>
-          <w:rFonts w:ascii="Times New Roman" w:hAnsi="Times New Roman" w:cs="Times New Roman"/>
-          <w:sz w:val="24"/>
-          <w:szCs w:val="24"/>
-        </w:rPr>
-      </w:pPr>
-      <w:r>
-        <w:rPr>
-          <w:rStyle w:val="CodeHTML"/>
-          <w:rFonts w:ascii="Times New Roman" w:hAnsi="Times New Roman" w:cs="Times New Roman"/>
-          <w:sz w:val="24"/>
-          <w:szCs w:val="24"/>
-        </w:rPr>
-        <w:t xml:space="preserve">  </w:t>
-      </w:r>
-      <w:proofErr w:type="gramStart"/>
-      <w:r>
-        <w:rPr>
-          <w:rStyle w:val="CodeHTML"/>
-          <w:rFonts w:ascii="Times New Roman" w:hAnsi="Times New Roman" w:cs="Times New Roman"/>
-          <w:sz w:val="24"/>
-          <w:szCs w:val="24"/>
-        </w:rPr>
-        <w:t>sections</w:t>
-      </w:r>
-      <w:proofErr w:type="gramEnd"/>
-      <w:r>
-        <w:rPr>
-          <w:rStyle w:val="CodeHTML"/>
-          <w:rFonts w:ascii="Times New Roman" w:hAnsi="Times New Roman" w:cs="Times New Roman"/>
-          <w:sz w:val="24"/>
-          <w:szCs w:val="24"/>
-        </w:rPr>
-        <w:t>).</w:t>
+        <w:numPr>
+          <w:ilvl w:val="0"/>
+          <w:numId w:val="13"/>
+        </w:numPr>
+        <w:rPr>
+          <w:rStyle w:val="CodeHTML"/>
+          <w:rFonts w:ascii="Times New Roman" w:hAnsi="Times New Roman" w:cs="Times New Roman"/>
+          <w:sz w:val="24"/>
+          <w:szCs w:val="24"/>
+        </w:rPr>
+      </w:pPr>
+      <w:r>
+        <w:rPr>
+          <w:rStyle w:val="CodeHTML"/>
+          <w:rFonts w:ascii="Times New Roman" w:hAnsi="Times New Roman" w:cs="Times New Roman"/>
+          <w:sz w:val="24"/>
+          <w:szCs w:val="24"/>
+        </w:rPr>
+        <w:t>Conserve les termes techniques dans leur forme standard en anglais (ne les</w:t>
+      </w:r>
+      <w:r>
+        <w:rPr>
+          <w:rStyle w:val="CodeHTML"/>
+          <w:rFonts w:ascii="Times New Roman" w:hAnsi="Times New Roman" w:cs="Times New Roman"/>
+          <w:sz w:val="24"/>
+          <w:szCs w:val="24"/>
+        </w:rPr>
+        <w:t xml:space="preserve"> </w:t>
+      </w:r>
+      <w:r>
+        <w:rPr>
+          <w:rStyle w:val="CodeHTML"/>
+          <w:rFonts w:ascii="Times New Roman" w:hAnsi="Times New Roman" w:cs="Times New Roman"/>
+          <w:sz w:val="24"/>
+          <w:szCs w:val="24"/>
+        </w:rPr>
+        <w:t>francise pas, ne les simplifie pas).</w:t>
       </w:r>
     </w:p>
     <w:p>
       <w:pPr>
         <w:pStyle w:val="PrformatHTML"/>
-        <w:rPr>
-          <w:rStyle w:val="CodeHTML"/>
-          <w:rFonts w:ascii="Times New Roman" w:hAnsi="Times New Roman" w:cs="Times New Roman"/>
-          <w:sz w:val="24"/>
-          <w:szCs w:val="24"/>
-        </w:rPr>
-      </w:pPr>
-      <w:r>
-        <w:rPr>
-          <w:rStyle w:val="CodeHTML"/>
-          <w:rFonts w:ascii="Times New Roman" w:hAnsi="Times New Roman" w:cs="Times New Roman"/>
-          <w:sz w:val="24"/>
-          <w:szCs w:val="24"/>
-        </w:rPr>
-        <w:t>- Conserve les termes techniques dans leur forme standard en anglais (ne les</w:t>
+        <w:numPr>
+          <w:ilvl w:val="0"/>
+          <w:numId w:val="13"/>
+        </w:numPr>
+        <w:rPr>
+          <w:rStyle w:val="CodeHTML"/>
+          <w:rFonts w:ascii="Times New Roman" w:hAnsi="Times New Roman" w:cs="Times New Roman"/>
+          <w:sz w:val="24"/>
+          <w:szCs w:val="24"/>
+        </w:rPr>
+      </w:pPr>
+      <w:r>
+        <w:rPr>
+          <w:rStyle w:val="CodeHTML"/>
+          <w:rFonts w:ascii="Times New Roman" w:hAnsi="Times New Roman" w:cs="Times New Roman"/>
+          <w:sz w:val="24"/>
+          <w:szCs w:val="24"/>
+        </w:rPr>
+        <w:t>Ne résume rien : traduis l'intégralité du contenu, phrase par phrase.</w:t>
       </w:r>
     </w:p>
     <w:p>
       <w:pPr>
         <w:pStyle w:val="PrformatHTML"/>
-        <w:rPr>
-          <w:rStyle w:val="CodeHTML"/>
-          <w:rFonts w:ascii="Times New Roman" w:hAnsi="Times New Roman" w:cs="Times New Roman"/>
-          <w:sz w:val="24"/>
-          <w:szCs w:val="24"/>
-        </w:rPr>
-      </w:pPr>
-      <w:r>
-        <w:rPr>
-          <w:rStyle w:val="CodeHTML"/>
-          <w:rFonts w:ascii="Times New Roman" w:hAnsi="Times New Roman" w:cs="Times New Roman"/>
-          <w:sz w:val="24"/>
-          <w:szCs w:val="24"/>
-        </w:rPr>
-        <w:t xml:space="preserve">  </w:t>
-      </w:r>
-      <w:proofErr w:type="gramStart"/>
-      <w:r>
-        <w:rPr>
-          <w:rStyle w:val="CodeHTML"/>
-          <w:rFonts w:ascii="Times New Roman" w:hAnsi="Times New Roman" w:cs="Times New Roman"/>
-          <w:sz w:val="24"/>
-          <w:szCs w:val="24"/>
-        </w:rPr>
-        <w:t>francise</w:t>
-      </w:r>
-      <w:proofErr w:type="gramEnd"/>
-      <w:r>
-        <w:rPr>
-          <w:rStyle w:val="CodeHTML"/>
-          <w:rFonts w:ascii="Times New Roman" w:hAnsi="Times New Roman" w:cs="Times New Roman"/>
-          <w:sz w:val="24"/>
-          <w:szCs w:val="24"/>
-        </w:rPr>
-        <w:t xml:space="preserve"> pas, ne les simplifie pas).</w:t>
-      </w:r>
-    </w:p>
-    <w:p>
-      <w:pPr>
-        <w:pStyle w:val="PrformatHTML"/>
-        <w:rPr>
-          <w:rStyle w:val="CodeHTML"/>
-          <w:rFonts w:ascii="Times New Roman" w:hAnsi="Times New Roman" w:cs="Times New Roman"/>
-          <w:sz w:val="24"/>
-          <w:szCs w:val="24"/>
-        </w:rPr>
-      </w:pPr>
-      <w:r>
-        <w:rPr>
-          <w:rStyle w:val="CodeHTML"/>
-          <w:rFonts w:ascii="Times New Roman" w:hAnsi="Times New Roman" w:cs="Times New Roman"/>
-          <w:sz w:val="24"/>
-          <w:szCs w:val="24"/>
-        </w:rPr>
-        <w:t>- Ne résume rien : traduis l'intégralité du contenu, phrase par phrase.</w:t>
-      </w:r>
-    </w:p>
-    <w:p>
-      <w:pPr>
-        <w:pStyle w:val="PrformatHTML"/>
-        <w:rPr>
-          <w:rStyle w:val="CodeHTML"/>
-          <w:rFonts w:ascii="Times New Roman" w:hAnsi="Times New Roman" w:cs="Times New Roman"/>
-          <w:sz w:val="24"/>
-          <w:szCs w:val="24"/>
-        </w:rPr>
-      </w:pPr>
-      <w:r>
-        <w:rPr>
-          <w:rStyle w:val="CodeHTML"/>
-          <w:rFonts w:ascii="Times New Roman" w:hAnsi="Times New Roman" w:cs="Times New Roman"/>
-          <w:sz w:val="24"/>
-          <w:szCs w:val="24"/>
-        </w:rPr>
-        <w:t>- N'ajoute aucune information, aucun commentaire, aucune note de traducteur.</w:t>
+        <w:numPr>
+          <w:ilvl w:val="0"/>
+          <w:numId w:val="13"/>
+        </w:numPr>
+        <w:rPr>
+          <w:rStyle w:val="CodeHTML"/>
+          <w:rFonts w:ascii="Times New Roman" w:hAnsi="Times New Roman" w:cs="Times New Roman"/>
+          <w:sz w:val="24"/>
+          <w:szCs w:val="24"/>
+        </w:rPr>
+      </w:pPr>
+      <w:r>
+        <w:rPr>
+          <w:rStyle w:val="CodeHTML"/>
+          <w:rFonts w:ascii="Times New Roman" w:hAnsi="Times New Roman" w:cs="Times New Roman"/>
+          <w:sz w:val="24"/>
+          <w:szCs w:val="24"/>
+        </w:rPr>
+        <w:t>N'ajoute aucune information, aucun commentaire, aucune note de traducteur.</w:t>
       </w:r>
     </w:p>
     <w:p>
@@ -6928,6 +6918,516 @@
     </w:p>
     <w:p>
       <w:pPr>
+        <w:pStyle w:val="Titre2"/>
+        <w:rPr>
+          <w:sz w:val="28"/>
+          <w:szCs w:val="28"/>
+        </w:rPr>
+      </w:pPr>
+      <w:r>
+        <w:rPr>
+          <w:sz w:val="28"/>
+          <w:szCs w:val="28"/>
+        </w:rPr>
+        <w:lastRenderedPageBreak/>
+        <w:t>3) Classification de ticket informatique</w:t>
+      </w:r>
+    </w:p>
+    <w:p>
+      <w:pPr>
+        <w:pStyle w:val="PrformatHTML"/>
+        <w:rPr>
+          <w:rStyle w:val="CodeHTML"/>
+          <w:rFonts w:ascii="Times New Roman" w:hAnsi="Times New Roman" w:cs="Times New Roman"/>
+          <w:sz w:val="24"/>
+          <w:szCs w:val="24"/>
+        </w:rPr>
+      </w:pPr>
+      <w:r>
+        <w:rPr>
+          <w:rStyle w:val="CodeHTML"/>
+          <w:rFonts w:ascii="Times New Roman" w:hAnsi="Times New Roman" w:cs="Times New Roman"/>
+          <w:sz w:val="24"/>
+          <w:szCs w:val="24"/>
+        </w:rPr>
+        <w:t xml:space="preserve">Rôle : </w:t>
+      </w:r>
+      <w:r>
+        <w:rPr>
+          <w:rStyle w:val="CodeHTML"/>
+          <w:rFonts w:ascii="Times New Roman" w:hAnsi="Times New Roman" w:cs="Times New Roman"/>
+          <w:sz w:val="24"/>
+          <w:szCs w:val="24"/>
+        </w:rPr>
+        <w:t>Tu es un système de triage de tickets support informatique.</w:t>
+      </w:r>
+    </w:p>
+    <w:p>
+      <w:pPr>
+        <w:pStyle w:val="PrformatHTML"/>
+        <w:rPr>
+          <w:rStyle w:val="CodeHTML"/>
+          <w:rFonts w:ascii="Times New Roman" w:hAnsi="Times New Roman" w:cs="Times New Roman"/>
+          <w:sz w:val="24"/>
+          <w:szCs w:val="24"/>
+        </w:rPr>
+      </w:pPr>
+    </w:p>
+    <w:p>
+      <w:pPr>
+        <w:pStyle w:val="PrformatHTML"/>
+        <w:rPr>
+          <w:rStyle w:val="CodeHTML"/>
+          <w:rFonts w:ascii="Times New Roman" w:hAnsi="Times New Roman" w:cs="Times New Roman"/>
+          <w:sz w:val="24"/>
+          <w:szCs w:val="24"/>
+        </w:rPr>
+      </w:pPr>
+      <w:r>
+        <w:rPr>
+          <w:rStyle w:val="CodeHTML"/>
+          <w:rFonts w:ascii="Times New Roman" w:hAnsi="Times New Roman" w:cs="Times New Roman"/>
+          <w:sz w:val="24"/>
+          <w:szCs w:val="24"/>
+        </w:rPr>
+        <w:t>Tâche : Classe le ticket suivant dans une des catégories : réseau, logiciel,</w:t>
+      </w:r>
+      <w:r>
+        <w:rPr>
+          <w:rStyle w:val="CodeHTML"/>
+          <w:rFonts w:ascii="Times New Roman" w:hAnsi="Times New Roman" w:cs="Times New Roman"/>
+          <w:sz w:val="24"/>
+          <w:szCs w:val="24"/>
+        </w:rPr>
+        <w:t xml:space="preserve"> </w:t>
+      </w:r>
+      <w:r>
+        <w:rPr>
+          <w:rStyle w:val="CodeHTML"/>
+          <w:rFonts w:ascii="Times New Roman" w:hAnsi="Times New Roman" w:cs="Times New Roman"/>
+          <w:sz w:val="24"/>
+          <w:szCs w:val="24"/>
+        </w:rPr>
+        <w:t>matériel, sécurité, accès, autre.</w:t>
+      </w:r>
+    </w:p>
+    <w:p>
+      <w:pPr>
+        <w:pStyle w:val="PrformatHTML"/>
+        <w:rPr>
+          <w:rStyle w:val="CodeHTML"/>
+          <w:rFonts w:ascii="Times New Roman" w:hAnsi="Times New Roman" w:cs="Times New Roman"/>
+          <w:sz w:val="24"/>
+          <w:szCs w:val="24"/>
+        </w:rPr>
+      </w:pPr>
+    </w:p>
+    <w:p>
+      <w:pPr>
+        <w:pStyle w:val="PrformatHTML"/>
+        <w:rPr>
+          <w:rStyle w:val="CodeHTML"/>
+          <w:rFonts w:ascii="Times New Roman" w:hAnsi="Times New Roman" w:cs="Times New Roman"/>
+          <w:sz w:val="24"/>
+          <w:szCs w:val="24"/>
+        </w:rPr>
+      </w:pPr>
+      <w:r>
+        <w:rPr>
+          <w:rStyle w:val="CodeHTML"/>
+          <w:rFonts w:ascii="Times New Roman" w:hAnsi="Times New Roman" w:cs="Times New Roman"/>
+          <w:sz w:val="24"/>
+          <w:szCs w:val="24"/>
+        </w:rPr>
+        <w:t>Contraintes :</w:t>
+      </w:r>
+    </w:p>
+    <w:p>
+      <w:pPr>
+        <w:pStyle w:val="PrformatHTML"/>
+        <w:numPr>
+          <w:ilvl w:val="0"/>
+          <w:numId w:val="12"/>
+        </w:numPr>
+        <w:rPr>
+          <w:rStyle w:val="CodeHTML"/>
+          <w:rFonts w:ascii="Times New Roman" w:hAnsi="Times New Roman" w:cs="Times New Roman"/>
+          <w:sz w:val="24"/>
+          <w:szCs w:val="24"/>
+        </w:rPr>
+      </w:pPr>
+      <w:r>
+        <w:rPr>
+          <w:rStyle w:val="CodeHTML"/>
+          <w:rFonts w:ascii="Times New Roman" w:hAnsi="Times New Roman" w:cs="Times New Roman"/>
+          <w:sz w:val="24"/>
+          <w:szCs w:val="24"/>
+        </w:rPr>
+        <w:t>Choisis une seule catégorie, la plus pertinente.</w:t>
+      </w:r>
+    </w:p>
+    <w:p>
+      <w:pPr>
+        <w:pStyle w:val="PrformatHTML"/>
+        <w:numPr>
+          <w:ilvl w:val="0"/>
+          <w:numId w:val="12"/>
+        </w:numPr>
+        <w:rPr>
+          <w:rStyle w:val="CodeHTML"/>
+          <w:rFonts w:ascii="Times New Roman" w:hAnsi="Times New Roman" w:cs="Times New Roman"/>
+          <w:sz w:val="24"/>
+          <w:szCs w:val="24"/>
+        </w:rPr>
+      </w:pPr>
+      <w:r>
+        <w:rPr>
+          <w:rStyle w:val="CodeHTML"/>
+          <w:rFonts w:ascii="Times New Roman" w:hAnsi="Times New Roman" w:cs="Times New Roman"/>
+          <w:sz w:val="24"/>
+          <w:szCs w:val="24"/>
+        </w:rPr>
+        <w:t>Justifie ton choix en une phrase, en te basant uniquement sur le contenu du ticket.</w:t>
+      </w:r>
+    </w:p>
+    <w:p>
+      <w:pPr>
+        <w:pStyle w:val="PrformatHTML"/>
+        <w:rPr>
+          <w:rStyle w:val="CodeHTML"/>
+          <w:rFonts w:ascii="Times New Roman" w:hAnsi="Times New Roman" w:cs="Times New Roman"/>
+          <w:sz w:val="24"/>
+          <w:szCs w:val="24"/>
+        </w:rPr>
+      </w:pPr>
+    </w:p>
+    <w:p>
+      <w:pPr>
+        <w:pStyle w:val="PrformatHTML"/>
+        <w:rPr>
+          <w:rStyle w:val="CodeHTML"/>
+          <w:rFonts w:ascii="Times New Roman" w:hAnsi="Times New Roman" w:cs="Times New Roman"/>
+          <w:sz w:val="24"/>
+          <w:szCs w:val="24"/>
+        </w:rPr>
+      </w:pPr>
+      <w:r>
+        <w:rPr>
+          <w:rStyle w:val="CodeHTML"/>
+          <w:rFonts w:ascii="Times New Roman" w:hAnsi="Times New Roman" w:cs="Times New Roman"/>
+          <w:sz w:val="24"/>
+          <w:szCs w:val="24"/>
+        </w:rPr>
+        <w:t xml:space="preserve">Ticket </w:t>
+      </w:r>
+      <w:r>
+        <w:rPr>
+          <w:rStyle w:val="CodeHTML"/>
+          <w:rFonts w:ascii="Times New Roman" w:hAnsi="Times New Roman" w:cs="Times New Roman"/>
+          <w:sz w:val="24"/>
+          <w:szCs w:val="24"/>
+        </w:rPr>
+        <w:t>:</w:t>
+      </w:r>
+      <w:r>
+        <w:rPr>
+          <w:rStyle w:val="CodeHTML"/>
+          <w:rFonts w:ascii="Times New Roman" w:hAnsi="Times New Roman" w:cs="Times New Roman"/>
+          <w:sz w:val="24"/>
+          <w:szCs w:val="24"/>
+        </w:rPr>
+        <w:t xml:space="preserve"> «</w:t>
+      </w:r>
+      <w:r>
+        <w:rPr>
+          <w:rFonts w:ascii="Times New Roman" w:hAnsi="Times New Roman" w:cs="Times New Roman"/>
+          <w:sz w:val="24"/>
+          <w:szCs w:val="24"/>
+        </w:rPr>
+        <w:t xml:space="preserve"> Mon ordinateur est connecté au câble Ethernet, mais aucune connexion réseau n'est détectée. J'ai essayé un autre câble sans succès. »</w:t>
+      </w:r>
+    </w:p>
+    <w:p>
+      <w:pPr>
+        <w:pStyle w:val="PrformatHTML"/>
+        <w:rPr>
+          <w:rStyle w:val="CodeHTML"/>
+          <w:rFonts w:ascii="Times New Roman" w:hAnsi="Times New Roman" w:cs="Times New Roman"/>
+          <w:sz w:val="24"/>
+          <w:szCs w:val="24"/>
+        </w:rPr>
+      </w:pPr>
+    </w:p>
+    <w:p>
+      <w:pPr>
+        <w:pStyle w:val="PrformatHTML"/>
+        <w:rPr>
+          <w:rStyle w:val="CodeHTML"/>
+          <w:rFonts w:ascii="Times New Roman" w:hAnsi="Times New Roman" w:cs="Times New Roman"/>
+          <w:sz w:val="24"/>
+          <w:szCs w:val="24"/>
+        </w:rPr>
+      </w:pPr>
+      <w:r>
+        <w:rPr>
+          <w:rStyle w:val="CodeHTML"/>
+          <w:rFonts w:ascii="Times New Roman" w:hAnsi="Times New Roman" w:cs="Times New Roman"/>
+          <w:sz w:val="24"/>
+          <w:szCs w:val="24"/>
+        </w:rPr>
+        <w:t>Retourne UNIQUEMENT un JSON valide au format :</w:t>
+      </w:r>
+    </w:p>
+    <w:p>
+      <w:pPr>
+        <w:pStyle w:val="PrformatHTML"/>
+        <w:rPr>
+          <w:rStyle w:val="CodeHTML"/>
+          <w:rFonts w:ascii="Times New Roman" w:hAnsi="Times New Roman" w:cs="Times New Roman"/>
+          <w:sz w:val="24"/>
+          <w:szCs w:val="24"/>
+        </w:rPr>
+      </w:pPr>
+      <w:r>
+        <w:rPr>
+          <w:rStyle w:val="CodeHTML"/>
+          <w:rFonts w:ascii="Times New Roman" w:hAnsi="Times New Roman" w:cs="Times New Roman"/>
+          <w:sz w:val="24"/>
+          <w:szCs w:val="24"/>
+        </w:rPr>
+        <w:t>{</w:t>
+      </w:r>
+    </w:p>
+    <w:p>
+      <w:pPr>
+        <w:pStyle w:val="PrformatHTML"/>
+        <w:rPr>
+          <w:rStyle w:val="CodeHTML"/>
+          <w:rFonts w:ascii="Times New Roman" w:hAnsi="Times New Roman" w:cs="Times New Roman"/>
+          <w:sz w:val="24"/>
+          <w:szCs w:val="24"/>
+        </w:rPr>
+      </w:pPr>
+      <w:r>
+        <w:rPr>
+          <w:rStyle w:val="CodeHTML"/>
+          <w:rFonts w:ascii="Times New Roman" w:hAnsi="Times New Roman" w:cs="Times New Roman"/>
+          <w:sz w:val="24"/>
+          <w:szCs w:val="24"/>
+        </w:rPr>
+        <w:t xml:space="preserve">  "</w:t>
+      </w:r>
+      <w:proofErr w:type="spellStart"/>
+      <w:r>
+        <w:rPr>
+          <w:rStyle w:val="CodeHTML"/>
+          <w:rFonts w:ascii="Times New Roman" w:hAnsi="Times New Roman" w:cs="Times New Roman"/>
+          <w:sz w:val="24"/>
+          <w:szCs w:val="24"/>
+        </w:rPr>
+        <w:t>categorie</w:t>
+      </w:r>
+      <w:proofErr w:type="spellEnd"/>
+      <w:proofErr w:type="gramStart"/>
+      <w:r>
+        <w:rPr>
+          <w:rStyle w:val="CodeHTML"/>
+          <w:rFonts w:ascii="Times New Roman" w:hAnsi="Times New Roman" w:cs="Times New Roman"/>
+          <w:sz w:val="24"/>
+          <w:szCs w:val="24"/>
+        </w:rPr>
+        <w:t>":</w:t>
+      </w:r>
+      <w:proofErr w:type="gramEnd"/>
+      <w:r>
+        <w:rPr>
+          <w:rStyle w:val="CodeHTML"/>
+          <w:rFonts w:ascii="Times New Roman" w:hAnsi="Times New Roman" w:cs="Times New Roman"/>
+          <w:sz w:val="24"/>
+          <w:szCs w:val="24"/>
+        </w:rPr>
+        <w:t xml:space="preserve"> "réseau | logiciel | matériel | sécurité | accès | autre",</w:t>
+      </w:r>
+    </w:p>
+    <w:p>
+      <w:pPr>
+        <w:pStyle w:val="PrformatHTML"/>
+        <w:rPr>
+          <w:rStyle w:val="CodeHTML"/>
+          <w:rFonts w:ascii="Times New Roman" w:hAnsi="Times New Roman" w:cs="Times New Roman"/>
+          <w:sz w:val="24"/>
+          <w:szCs w:val="24"/>
+        </w:rPr>
+      </w:pPr>
+      <w:r>
+        <w:rPr>
+          <w:rStyle w:val="CodeHTML"/>
+          <w:rFonts w:ascii="Times New Roman" w:hAnsi="Times New Roman" w:cs="Times New Roman"/>
+          <w:sz w:val="24"/>
+          <w:szCs w:val="24"/>
+        </w:rPr>
+        <w:t xml:space="preserve">  "justification</w:t>
+      </w:r>
+      <w:proofErr w:type="gramStart"/>
+      <w:r>
+        <w:rPr>
+          <w:rStyle w:val="CodeHTML"/>
+          <w:rFonts w:ascii="Times New Roman" w:hAnsi="Times New Roman" w:cs="Times New Roman"/>
+          <w:sz w:val="24"/>
+          <w:szCs w:val="24"/>
+        </w:rPr>
+        <w:t>":</w:t>
+      </w:r>
+      <w:proofErr w:type="gramEnd"/>
+      <w:r>
+        <w:rPr>
+          <w:rStyle w:val="CodeHTML"/>
+          <w:rFonts w:ascii="Times New Roman" w:hAnsi="Times New Roman" w:cs="Times New Roman"/>
+          <w:sz w:val="24"/>
+          <w:szCs w:val="24"/>
+        </w:rPr>
+        <w:t xml:space="preserve"> "..."</w:t>
+      </w:r>
+    </w:p>
+    <w:p>
+      <w:pPr>
+        <w:pStyle w:val="PrformatHTML"/>
+        <w:rPr>
+          <w:rFonts w:ascii="Times New Roman" w:hAnsi="Times New Roman" w:cs="Times New Roman"/>
+          <w:sz w:val="24"/>
+          <w:szCs w:val="24"/>
+        </w:rPr>
+      </w:pPr>
+      <w:r>
+        <w:rPr>
+          <w:rStyle w:val="CodeHTML"/>
+          <w:rFonts w:ascii="Times New Roman" w:hAnsi="Times New Roman" w:cs="Times New Roman"/>
+          <w:sz w:val="24"/>
+          <w:szCs w:val="24"/>
+        </w:rPr>
+        <w:t>}</w:t>
+      </w:r>
+    </w:p>
+    <w:p>
+      <w:pPr>
+        <w:pStyle w:val="PrformatHTML"/>
+        <w:rPr>
+          <w:rStyle w:val="CodeHTML"/>
+          <w:rFonts w:ascii="Times New Roman" w:hAnsi="Times New Roman" w:cs="Times New Roman"/>
+          <w:sz w:val="28"/>
+          <w:szCs w:val="28"/>
+        </w:rPr>
+      </w:pPr>
+    </w:p>
+    <w:p>
+      <w:pPr>
+        <w:pStyle w:val="PrformatHTML"/>
+        <w:rPr>
+          <w:rStyle w:val="CodeHTML"/>
+          <w:rFonts w:ascii="Times New Roman" w:hAnsi="Times New Roman" w:cs="Times New Roman"/>
+          <w:b/>
+          <w:bCs/>
+          <w:sz w:val="28"/>
+          <w:szCs w:val="28"/>
+        </w:rPr>
+      </w:pPr>
+      <w:r>
+        <w:rPr>
+          <w:rStyle w:val="CodeHTML"/>
+          <w:rFonts w:ascii="Times New Roman" w:hAnsi="Times New Roman" w:cs="Times New Roman"/>
+          <w:b/>
+          <w:bCs/>
+          <w:sz w:val="28"/>
+          <w:szCs w:val="28"/>
+        </w:rPr>
+        <w:t xml:space="preserve">Résultat : </w:t>
+      </w:r>
+    </w:p>
+    <w:p>
+      <w:pPr>
+        <w:pStyle w:val="PrformatHTML"/>
+        <w:rPr>
+          <w:rStyle w:val="CodeHTML"/>
+          <w:rFonts w:ascii="Times New Roman" w:hAnsi="Times New Roman" w:cs="Times New Roman"/>
+          <w:b/>
+          <w:bCs/>
+          <w:sz w:val="28"/>
+          <w:szCs w:val="28"/>
+        </w:rPr>
+      </w:pPr>
+      <w:r>
+        <w:rPr>
+          <w:rStyle w:val="CodeHTML"/>
+          <w:rFonts w:ascii="Times New Roman" w:hAnsi="Times New Roman" w:cs="Times New Roman"/>
+          <w:b/>
+          <w:bCs/>
+          <w:sz w:val="28"/>
+          <w:szCs w:val="28"/>
+        </w:rPr>
+        <w:drawing>
+          <wp:inline distT="0" distB="0" distL="0" distR="0" wp14:anchorId="039F62C6" wp14:editId="149CF8F5">
+            <wp:extent cx="5296172" cy="1111307"/>
+            <wp:effectExtent l="0" t="0" r="0" b="0"/>
+            <wp:docPr id="19" name="Image 19"/>
+            <wp:cNvGraphicFramePr>
+              <a:graphicFrameLocks xmlns:a="http://schemas.openxmlformats.org/drawingml/2006/main" noChangeAspect="1"/>
+            </wp:cNvGraphicFramePr>
+            <a:graphic xmlns:a="http://schemas.openxmlformats.org/drawingml/2006/main">
+              <a:graphicData uri="http://schemas.openxmlformats.org/drawingml/2006/picture">
+                <pic:pic xmlns:pic="http://schemas.openxmlformats.org/drawingml/2006/picture">
+                  <pic:nvPicPr>
+                    <pic:cNvPr id="1" name=""/>
+                    <pic:cNvPicPr/>
+                  </pic:nvPicPr>
+                  <pic:blipFill>
+                    <a:blip r:embed="rId23"/>
+                    <a:stretch>
+                      <a:fillRect/>
+                    </a:stretch>
+                  </pic:blipFill>
+                  <pic:spPr>
+                    <a:xfrm>
+                      <a:off x="0" y="0"/>
+                      <a:ext cx="5296172" cy="1111307"/>
+                    </a:xfrm>
+                    <a:prstGeom prst="rect">
+                      <a:avLst/>
+                    </a:prstGeom>
+                  </pic:spPr>
+                </pic:pic>
+              </a:graphicData>
+            </a:graphic>
+          </wp:inline>
+        </w:drawing>
+      </w:r>
+    </w:p>
+    <w:p>
+      <w:pPr>
+        <w:pStyle w:val="PrformatHTML"/>
+        <w:rPr>
+          <w:rStyle w:val="CodeHTML"/>
+          <w:rFonts w:ascii="Times New Roman" w:hAnsi="Times New Roman" w:cs="Times New Roman"/>
+          <w:b/>
+          <w:bCs/>
+          <w:sz w:val="28"/>
+          <w:szCs w:val="28"/>
+        </w:rPr>
+      </w:pPr>
+    </w:p>
+    <w:p>
+      <w:pPr>
+        <w:pStyle w:val="PrformatHTML"/>
+        <w:ind w:left="360"/>
+        <w:rPr>
+          <w:rStyle w:val="CodeHTML"/>
+          <w:rFonts w:ascii="Times New Roman" w:hAnsi="Times New Roman" w:cs="Times New Roman"/>
+          <w:sz w:val="24"/>
+          <w:szCs w:val="24"/>
+        </w:rPr>
+      </w:pPr>
+    </w:p>
+    <w:p>
+      <w:pPr>
         <w:pStyle w:val="PrformatHTML"/>
         <w:ind w:left="360"/>
         <w:rPr>
@@ -7150,6 +7650,119 @@
     </w:lvl>
   </w:abstractNum>
   <w:abstractNum w:abstractNumId="2" w15:restartNumberingAfterBreak="0">
+    <w:nsid w:val="089331BD"/>
+    <w:multiLevelType w:val="hybridMultilevel"/>
+    <w:tmpl w:val="B3706648"/>
+    <w:lvl w:ilvl="0" w:tplc="040C0001">
+      <w:start w:val="1"/>
+      <w:numFmt w:val="bullet"/>
+      <w:lvlText w:val=""/>
+      <w:lvlJc w:val="left"/>
+      <w:pPr>
+        <w:ind w:left="720" w:hanging="360"/>
+      </w:pPr>
+      <w:rPr>
+        <w:rFonts w:ascii="Symbol" w:hAnsi="Symbol" w:hint="default"/>
+      </w:rPr>
+    </w:lvl>
+    <w:lvl w:ilvl="1" w:tplc="040C0003" w:tentative="1">
+      <w:start w:val="1"/>
+      <w:numFmt w:val="bullet"/>
+      <w:lvlText w:val="o"/>
+      <w:lvlJc w:val="left"/>
+      <w:pPr>
+        <w:ind w:left="1440" w:hanging="360"/>
+      </w:pPr>
+      <w:rPr>
+        <w:rFonts w:ascii="Courier New" w:hAnsi="Courier New" w:cs="Courier New" w:hint="default"/>
+      </w:rPr>
+    </w:lvl>
+    <w:lvl w:ilvl="2" w:tplc="040C0005" w:tentative="1">
+      <w:start w:val="1"/>
+      <w:numFmt w:val="bullet"/>
+      <w:lvlText w:val=""/>
+      <w:lvlJc w:val="left"/>
+      <w:pPr>
+        <w:ind w:left="2160" w:hanging="360"/>
+      </w:pPr>
+      <w:rPr>
+        <w:rFonts w:ascii="Wingdings" w:hAnsi="Wingdings" w:hint="default"/>
+      </w:rPr>
+    </w:lvl>
+    <w:lvl w:ilvl="3" w:tplc="040C0001" w:tentative="1">
+      <w:start w:val="1"/>
+      <w:numFmt w:val="bullet"/>
+      <w:lvlText w:val=""/>
+      <w:lvlJc w:val="left"/>
+      <w:pPr>
+        <w:ind w:left="2880" w:hanging="360"/>
+      </w:pPr>
+      <w:rPr>
+        <w:rFonts w:ascii="Symbol" w:hAnsi="Symbol" w:hint="default"/>
+      </w:rPr>
+    </w:lvl>
+    <w:lvl w:ilvl="4" w:tplc="040C0003" w:tentative="1">
+      <w:start w:val="1"/>
+      <w:numFmt w:val="bullet"/>
+      <w:lvlText w:val="o"/>
+      <w:lvlJc w:val="left"/>
+      <w:pPr>
+        <w:ind w:left="3600" w:hanging="360"/>
+      </w:pPr>
+      <w:rPr>
+        <w:rFonts w:ascii="Courier New" w:hAnsi="Courier New" w:cs="Courier New" w:hint="default"/>
+      </w:rPr>
+    </w:lvl>
+    <w:lvl w:ilvl="5" w:tplc="040C0005" w:tentative="1">
+      <w:start w:val="1"/>
+      <w:numFmt w:val="bullet"/>
+      <w:lvlText w:val=""/>
+      <w:lvlJc w:val="left"/>
+      <w:pPr>
+        <w:ind w:left="4320" w:hanging="360"/>
+      </w:pPr>
+      <w:rPr>
+        <w:rFonts w:ascii="Wingdings" w:hAnsi="Wingdings" w:hint="default"/>
+      </w:rPr>
+    </w:lvl>
+    <w:lvl w:ilvl="6" w:tplc="040C0001" w:tentative="1">
+      <w:start w:val="1"/>
+      <w:numFmt w:val="bullet"/>
+      <w:lvlText w:val=""/>
+      <w:lvlJc w:val="left"/>
+      <w:pPr>
+        <w:ind w:left="5040" w:hanging="360"/>
+      </w:pPr>
+      <w:rPr>
+        <w:rFonts w:ascii="Symbol" w:hAnsi="Symbol" w:hint="default"/>
+      </w:rPr>
+    </w:lvl>
+    <w:lvl w:ilvl="7" w:tplc="040C0003" w:tentative="1">
+      <w:start w:val="1"/>
+      <w:numFmt w:val="bullet"/>
+      <w:lvlText w:val="o"/>
+      <w:lvlJc w:val="left"/>
+      <w:pPr>
+        <w:ind w:left="5760" w:hanging="360"/>
+      </w:pPr>
+      <w:rPr>
+        <w:rFonts w:ascii="Courier New" w:hAnsi="Courier New" w:cs="Courier New" w:hint="default"/>
+      </w:rPr>
+    </w:lvl>
+    <w:lvl w:ilvl="8" w:tplc="040C0005" w:tentative="1">
+      <w:start w:val="1"/>
+      <w:numFmt w:val="bullet"/>
+      <w:lvlText w:val=""/>
+      <w:lvlJc w:val="left"/>
+      <w:pPr>
+        <w:ind w:left="6480" w:hanging="360"/>
+      </w:pPr>
+      <w:rPr>
+        <w:rFonts w:ascii="Wingdings" w:hAnsi="Wingdings" w:hint="default"/>
+      </w:rPr>
+    </w:lvl>
+  </w:abstractNum>
+  <w:abstractNum w:abstractNumId="3" w15:restartNumberingAfterBreak="0">
     <w:nsid w:val="08A5551D"/>
     <w:multiLevelType w:val="hybridMultilevel"/>
     <w:tmpl w:val="F084B34A"/>
@@ -7262,7 +7875,7 @@
       </w:rPr>
     </w:lvl>
   </w:abstractNum>
-  <w:abstractNum w:abstractNumId="3" w15:restartNumberingAfterBreak="0">
+  <w:abstractNum w:abstractNumId="4" w15:restartNumberingAfterBreak="0">
     <w:nsid w:val="10E26963"/>
     <w:multiLevelType w:val="hybridMultilevel"/>
     <w:tmpl w:val="A6FCBF36"/>
@@ -7375,7 +7988,120 @@
       </w:rPr>
     </w:lvl>
   </w:abstractNum>
-  <w:abstractNum w:abstractNumId="4" w15:restartNumberingAfterBreak="0">
+  <w:abstractNum w:abstractNumId="5" w15:restartNumberingAfterBreak="0">
+    <w:nsid w:val="165D2EC3"/>
+    <w:multiLevelType w:val="hybridMultilevel"/>
+    <w:tmpl w:val="3490CFEC"/>
+    <w:lvl w:ilvl="0" w:tplc="040C0001">
+      <w:start w:val="1"/>
+      <w:numFmt w:val="bullet"/>
+      <w:lvlText w:val=""/>
+      <w:lvlJc w:val="left"/>
+      <w:pPr>
+        <w:ind w:left="720" w:hanging="360"/>
+      </w:pPr>
+      <w:rPr>
+        <w:rFonts w:ascii="Symbol" w:hAnsi="Symbol" w:hint="default"/>
+      </w:rPr>
+    </w:lvl>
+    <w:lvl w:ilvl="1" w:tplc="040C0003" w:tentative="1">
+      <w:start w:val="1"/>
+      <w:numFmt w:val="bullet"/>
+      <w:lvlText w:val="o"/>
+      <w:lvlJc w:val="left"/>
+      <w:pPr>
+        <w:ind w:left="1440" w:hanging="360"/>
+      </w:pPr>
+      <w:rPr>
+        <w:rFonts w:ascii="Courier New" w:hAnsi="Courier New" w:cs="Courier New" w:hint="default"/>
+      </w:rPr>
+    </w:lvl>
+    <w:lvl w:ilvl="2" w:tplc="040C0005" w:tentative="1">
+      <w:start w:val="1"/>
+      <w:numFmt w:val="bullet"/>
+      <w:lvlText w:val=""/>
+      <w:lvlJc w:val="left"/>
+      <w:pPr>
+        <w:ind w:left="2160" w:hanging="360"/>
+      </w:pPr>
+      <w:rPr>
+        <w:rFonts w:ascii="Wingdings" w:hAnsi="Wingdings" w:hint="default"/>
+      </w:rPr>
+    </w:lvl>
+    <w:lvl w:ilvl="3" w:tplc="040C0001" w:tentative="1">
+      <w:start w:val="1"/>
+      <w:numFmt w:val="bullet"/>
+      <w:lvlText w:val=""/>
+      <w:lvlJc w:val="left"/>
+      <w:pPr>
+        <w:ind w:left="2880" w:hanging="360"/>
+      </w:pPr>
+      <w:rPr>
+        <w:rFonts w:ascii="Symbol" w:hAnsi="Symbol" w:hint="default"/>
+      </w:rPr>
+    </w:lvl>
+    <w:lvl w:ilvl="4" w:tplc="040C0003" w:tentative="1">
+      <w:start w:val="1"/>
+      <w:numFmt w:val="bullet"/>
+      <w:lvlText w:val="o"/>
+      <w:lvlJc w:val="left"/>
+      <w:pPr>
+        <w:ind w:left="3600" w:hanging="360"/>
+      </w:pPr>
+      <w:rPr>
+        <w:rFonts w:ascii="Courier New" w:hAnsi="Courier New" w:cs="Courier New" w:hint="default"/>
+      </w:rPr>
+    </w:lvl>
+    <w:lvl w:ilvl="5" w:tplc="040C0005" w:tentative="1">
+      <w:start w:val="1"/>
+      <w:numFmt w:val="bullet"/>
+      <w:lvlText w:val=""/>
+      <w:lvlJc w:val="left"/>
+      <w:pPr>
+        <w:ind w:left="4320" w:hanging="360"/>
+      </w:pPr>
+      <w:rPr>
+        <w:rFonts w:ascii="Wingdings" w:hAnsi="Wingdings" w:hint="default"/>
+      </w:rPr>
+    </w:lvl>
+    <w:lvl w:ilvl="6" w:tplc="040C0001" w:tentative="1">
+      <w:start w:val="1"/>
+      <w:numFmt w:val="bullet"/>
+      <w:lvlText w:val=""/>
+      <w:lvlJc w:val="left"/>
+      <w:pPr>
+        <w:ind w:left="5040" w:hanging="360"/>
+      </w:pPr>
+      <w:rPr>
+        <w:rFonts w:ascii="Symbol" w:hAnsi="Symbol" w:hint="default"/>
+      </w:rPr>
+    </w:lvl>
+    <w:lvl w:ilvl="7" w:tplc="040C0003" w:tentative="1">
+      <w:start w:val="1"/>
+      <w:numFmt w:val="bullet"/>
+      <w:lvlText w:val="o"/>
+      <w:lvlJc w:val="left"/>
+      <w:pPr>
+        <w:ind w:left="5760" w:hanging="360"/>
+      </w:pPr>
+      <w:rPr>
+        <w:rFonts w:ascii="Courier New" w:hAnsi="Courier New" w:cs="Courier New" w:hint="default"/>
+      </w:rPr>
+    </w:lvl>
+    <w:lvl w:ilvl="8" w:tplc="040C0005" w:tentative="1">
+      <w:start w:val="1"/>
+      <w:numFmt w:val="bullet"/>
+      <w:lvlText w:val=""/>
+      <w:lvlJc w:val="left"/>
+      <w:pPr>
+        <w:ind w:left="6480" w:hanging="360"/>
+      </w:pPr>
+      <w:rPr>
+        <w:rFonts w:ascii="Wingdings" w:hAnsi="Wingdings" w:hint="default"/>
+      </w:rPr>
+    </w:lvl>
+  </w:abstractNum>
+  <w:abstractNum w:abstractNumId="6" w15:restartNumberingAfterBreak="0">
     <w:nsid w:val="19B73A6C"/>
     <w:multiLevelType w:val="hybridMultilevel"/>
     <w:tmpl w:val="0244483A"/>
@@ -7461,7 +8187,7 @@
       </w:pPr>
     </w:lvl>
   </w:abstractNum>
-  <w:abstractNum w:abstractNumId="5" w15:restartNumberingAfterBreak="0">
+  <w:abstractNum w:abstractNumId="7" w15:restartNumberingAfterBreak="0">
     <w:nsid w:val="2DE869EE"/>
     <w:multiLevelType w:val="hybridMultilevel"/>
     <w:tmpl w:val="4E94F688"/>
@@ -7547,7 +8273,7 @@
       </w:pPr>
     </w:lvl>
   </w:abstractNum>
-  <w:abstractNum w:abstractNumId="6" w15:restartNumberingAfterBreak="0">
+  <w:abstractNum w:abstractNumId="8" w15:restartNumberingAfterBreak="0">
     <w:nsid w:val="32BC2236"/>
     <w:multiLevelType w:val="hybridMultilevel"/>
     <w:tmpl w:val="30F47246"/>
@@ -7633,7 +8359,7 @@
       </w:pPr>
     </w:lvl>
   </w:abstractNum>
-  <w:abstractNum w:abstractNumId="7" w15:restartNumberingAfterBreak="0">
+  <w:abstractNum w:abstractNumId="9" w15:restartNumberingAfterBreak="0">
     <w:nsid w:val="4845549C"/>
     <w:multiLevelType w:val="hybridMultilevel"/>
     <w:tmpl w:val="81762F32"/>
@@ -7746,7 +8472,7 @@
       </w:rPr>
     </w:lvl>
   </w:abstractNum>
-  <w:abstractNum w:abstractNumId="8" w15:restartNumberingAfterBreak="0">
+  <w:abstractNum w:abstractNumId="10" w15:restartNumberingAfterBreak="0">
     <w:nsid w:val="5CE201C5"/>
     <w:multiLevelType w:val="hybridMultilevel"/>
     <w:tmpl w:val="849848D8"/>
@@ -7835,7 +8561,7 @@
       </w:pPr>
     </w:lvl>
   </w:abstractNum>
-  <w:abstractNum w:abstractNumId="9" w15:restartNumberingAfterBreak="0">
+  <w:abstractNum w:abstractNumId="11" w15:restartNumberingAfterBreak="0">
     <w:nsid w:val="5E0B23B2"/>
     <w:multiLevelType w:val="hybridMultilevel"/>
     <w:tmpl w:val="42507AA4"/>
@@ -7921,7 +8647,7 @@
       </w:pPr>
     </w:lvl>
   </w:abstractNum>
-  <w:abstractNum w:abstractNumId="10" w15:restartNumberingAfterBreak="0">
+  <w:abstractNum w:abstractNumId="12" w15:restartNumberingAfterBreak="0">
     <w:nsid w:val="7EC51315"/>
     <w:multiLevelType w:val="hybridMultilevel"/>
     <w:tmpl w:val="7952CE38"/>
@@ -8011,22 +8737,22 @@
     </w:lvl>
   </w:abstractNum>
   <w:num w:numId="1">
-    <w:abstractNumId w:val="2"/>
+    <w:abstractNumId w:val="3"/>
   </w:num>
   <w:num w:numId="2">
+    <w:abstractNumId w:val="8"/>
+  </w:num>
+  <w:num w:numId="3">
+    <w:abstractNumId w:val="7"/>
+  </w:num>
+  <w:num w:numId="4">
+    <w:abstractNumId w:val="12"/>
+  </w:num>
+  <w:num w:numId="5">
     <w:abstractNumId w:val="6"/>
   </w:num>
-  <w:num w:numId="3">
-    <w:abstractNumId w:val="5"/>
-  </w:num>
-  <w:num w:numId="4">
-    <w:abstractNumId w:val="10"/>
-  </w:num>
-  <w:num w:numId="5">
-    <w:abstractNumId w:val="4"/>
-  </w:num>
   <w:num w:numId="6">
-    <w:abstractNumId w:val="9"/>
+    <w:abstractNumId w:val="11"/>
   </w:num>
   <w:num w:numId="7">
     <w:abstractNumId w:val="0"/>
@@ -8035,13 +8761,19 @@
     <w:abstractNumId w:val="1"/>
   </w:num>
   <w:num w:numId="9">
-    <w:abstractNumId w:val="8"/>
+    <w:abstractNumId w:val="10"/>
   </w:num>
   <w:num w:numId="10">
-    <w:abstractNumId w:val="3"/>
+    <w:abstractNumId w:val="4"/>
   </w:num>
   <w:num w:numId="11">
-    <w:abstractNumId w:val="7"/>
+    <w:abstractNumId w:val="9"/>
+  </w:num>
+  <w:num w:numId="12">
+    <w:abstractNumId w:val="2"/>
+  </w:num>
+  <w:num w:numId="13">
+    <w:abstractNumId w:val="5"/>
   </w:num>
 </w:numbering>
 </file>

</xml_diff>

<commit_message>
Partie 5 question 4
</commit_message>
<xml_diff>
--- a/ai-business_assistant.docx
+++ b/ai-business_assistant.docx
@@ -7425,6 +7425,1115 @@
           <w:szCs w:val="24"/>
         </w:rPr>
       </w:pPr>
+    </w:p>
+    <w:p>
+      <w:pPr>
+        <w:pStyle w:val="Titre2"/>
+        <w:rPr>
+          <w:sz w:val="24"/>
+          <w:szCs w:val="24"/>
+        </w:rPr>
+      </w:pPr>
+      <w:r>
+        <w:rPr>
+          <w:sz w:val="24"/>
+          <w:szCs w:val="24"/>
+        </w:rPr>
+        <w:t>4) Extraction d'informations d'une facture</w:t>
+      </w:r>
+    </w:p>
+    <w:p>
+      <w:pPr>
+        <w:pStyle w:val="PrformatHTML"/>
+        <w:rPr>
+          <w:rStyle w:val="CodeHTML"/>
+          <w:rFonts w:ascii="Times New Roman" w:hAnsi="Times New Roman" w:cs="Times New Roman"/>
+          <w:sz w:val="24"/>
+          <w:szCs w:val="24"/>
+        </w:rPr>
+      </w:pPr>
+      <w:proofErr w:type="spellStart"/>
+      <w:r>
+        <w:rPr>
+          <w:rStyle w:val="CodeHTML"/>
+          <w:rFonts w:ascii="Times New Roman" w:hAnsi="Times New Roman" w:cs="Times New Roman"/>
+          <w:b/>
+          <w:bCs/>
+          <w:sz w:val="24"/>
+          <w:szCs w:val="24"/>
+        </w:rPr>
+        <w:t>Role</w:t>
+      </w:r>
+      <w:proofErr w:type="spellEnd"/>
+      <w:r>
+        <w:rPr>
+          <w:rStyle w:val="CodeHTML"/>
+          <w:rFonts w:ascii="Times New Roman" w:hAnsi="Times New Roman" w:cs="Times New Roman"/>
+          <w:sz w:val="24"/>
+          <w:szCs w:val="24"/>
+        </w:rPr>
+        <w:t xml:space="preserve"> : </w:t>
+      </w:r>
+      <w:r>
+        <w:rPr>
+          <w:rStyle w:val="CodeHTML"/>
+          <w:rFonts w:ascii="Times New Roman" w:hAnsi="Times New Roman" w:cs="Times New Roman"/>
+          <w:sz w:val="24"/>
+          <w:szCs w:val="24"/>
+        </w:rPr>
+        <w:t>Tu es un système d'extraction d'informations à partir de factures.</w:t>
+      </w:r>
+    </w:p>
+    <w:p>
+      <w:pPr>
+        <w:pStyle w:val="PrformatHTML"/>
+        <w:rPr>
+          <w:rStyle w:val="CodeHTML"/>
+          <w:rFonts w:ascii="Times New Roman" w:hAnsi="Times New Roman" w:cs="Times New Roman"/>
+          <w:sz w:val="24"/>
+          <w:szCs w:val="24"/>
+        </w:rPr>
+      </w:pPr>
+    </w:p>
+    <w:p>
+      <w:pPr>
+        <w:pStyle w:val="PrformatHTML"/>
+        <w:rPr>
+          <w:rStyle w:val="CodeHTML"/>
+          <w:rFonts w:ascii="Times New Roman" w:hAnsi="Times New Roman" w:cs="Times New Roman"/>
+          <w:sz w:val="24"/>
+          <w:szCs w:val="24"/>
+        </w:rPr>
+      </w:pPr>
+      <w:r>
+        <w:rPr>
+          <w:rStyle w:val="CodeHTML"/>
+          <w:rFonts w:ascii="Times New Roman" w:hAnsi="Times New Roman" w:cs="Times New Roman"/>
+          <w:b/>
+          <w:bCs/>
+          <w:sz w:val="24"/>
+          <w:szCs w:val="24"/>
+        </w:rPr>
+        <w:t>Tâche</w:t>
+      </w:r>
+      <w:r>
+        <w:rPr>
+          <w:rStyle w:val="CodeHTML"/>
+          <w:rFonts w:ascii="Times New Roman" w:hAnsi="Times New Roman" w:cs="Times New Roman"/>
+          <w:sz w:val="24"/>
+          <w:szCs w:val="24"/>
+        </w:rPr>
+        <w:t xml:space="preserve"> : Extrait les informations suivantes de la facture fournie : </w:t>
+      </w:r>
+      <w:proofErr w:type="spellStart"/>
+      <w:r>
+        <w:rPr>
+          <w:rStyle w:val="CodeHTML"/>
+          <w:rFonts w:ascii="Times New Roman" w:hAnsi="Times New Roman" w:cs="Times New Roman"/>
+          <w:sz w:val="24"/>
+          <w:szCs w:val="24"/>
+        </w:rPr>
+        <w:t>numéro_facture</w:t>
+      </w:r>
+      <w:proofErr w:type="spellEnd"/>
+      <w:r>
+        <w:rPr>
+          <w:rStyle w:val="CodeHTML"/>
+          <w:rFonts w:ascii="Times New Roman" w:hAnsi="Times New Roman" w:cs="Times New Roman"/>
+          <w:sz w:val="24"/>
+          <w:szCs w:val="24"/>
+        </w:rPr>
+        <w:t>,</w:t>
+      </w:r>
+    </w:p>
+    <w:p>
+      <w:pPr>
+        <w:pStyle w:val="PrformatHTML"/>
+        <w:rPr>
+          <w:rStyle w:val="CodeHTML"/>
+          <w:rFonts w:ascii="Times New Roman" w:hAnsi="Times New Roman" w:cs="Times New Roman"/>
+          <w:sz w:val="24"/>
+          <w:szCs w:val="24"/>
+        </w:rPr>
+      </w:pPr>
+      <w:proofErr w:type="gramStart"/>
+      <w:r>
+        <w:rPr>
+          <w:rStyle w:val="CodeHTML"/>
+          <w:rFonts w:ascii="Times New Roman" w:hAnsi="Times New Roman" w:cs="Times New Roman"/>
+          <w:sz w:val="24"/>
+          <w:szCs w:val="24"/>
+        </w:rPr>
+        <w:t>date</w:t>
+      </w:r>
+      <w:proofErr w:type="gramEnd"/>
+      <w:r>
+        <w:rPr>
+          <w:rStyle w:val="CodeHTML"/>
+          <w:rFonts w:ascii="Times New Roman" w:hAnsi="Times New Roman" w:cs="Times New Roman"/>
+          <w:sz w:val="24"/>
+          <w:szCs w:val="24"/>
+        </w:rPr>
+        <w:t xml:space="preserve">, client, </w:t>
+      </w:r>
+      <w:proofErr w:type="spellStart"/>
+      <w:r>
+        <w:rPr>
+          <w:rStyle w:val="CodeHTML"/>
+          <w:rFonts w:ascii="Times New Roman" w:hAnsi="Times New Roman" w:cs="Times New Roman"/>
+          <w:sz w:val="24"/>
+          <w:szCs w:val="24"/>
+        </w:rPr>
+        <w:t>montant_ht</w:t>
+      </w:r>
+      <w:proofErr w:type="spellEnd"/>
+      <w:r>
+        <w:rPr>
+          <w:rStyle w:val="CodeHTML"/>
+          <w:rFonts w:ascii="Times New Roman" w:hAnsi="Times New Roman" w:cs="Times New Roman"/>
+          <w:sz w:val="24"/>
+          <w:szCs w:val="24"/>
+        </w:rPr>
+        <w:t xml:space="preserve">, tva, </w:t>
+      </w:r>
+      <w:proofErr w:type="spellStart"/>
+      <w:r>
+        <w:rPr>
+          <w:rStyle w:val="CodeHTML"/>
+          <w:rFonts w:ascii="Times New Roman" w:hAnsi="Times New Roman" w:cs="Times New Roman"/>
+          <w:sz w:val="24"/>
+          <w:szCs w:val="24"/>
+        </w:rPr>
+        <w:t>montant_ttc</w:t>
+      </w:r>
+      <w:proofErr w:type="spellEnd"/>
+      <w:r>
+        <w:rPr>
+          <w:rStyle w:val="CodeHTML"/>
+          <w:rFonts w:ascii="Times New Roman" w:hAnsi="Times New Roman" w:cs="Times New Roman"/>
+          <w:sz w:val="24"/>
+          <w:szCs w:val="24"/>
+        </w:rPr>
+        <w:t>.</w:t>
+      </w:r>
+    </w:p>
+    <w:p>
+      <w:pPr>
+        <w:pStyle w:val="PrformatHTML"/>
+        <w:rPr>
+          <w:rStyle w:val="CodeHTML"/>
+          <w:rFonts w:ascii="Times New Roman" w:hAnsi="Times New Roman" w:cs="Times New Roman"/>
+          <w:sz w:val="24"/>
+          <w:szCs w:val="24"/>
+        </w:rPr>
+      </w:pPr>
+    </w:p>
+    <w:p>
+      <w:pPr>
+        <w:pStyle w:val="PrformatHTML"/>
+        <w:rPr>
+          <w:rStyle w:val="CodeHTML"/>
+          <w:rFonts w:ascii="Times New Roman" w:hAnsi="Times New Roman" w:cs="Times New Roman"/>
+          <w:sz w:val="24"/>
+          <w:szCs w:val="24"/>
+        </w:rPr>
+      </w:pPr>
+      <w:r>
+        <w:rPr>
+          <w:rStyle w:val="CodeHTML"/>
+          <w:rFonts w:ascii="Times New Roman" w:hAnsi="Times New Roman" w:cs="Times New Roman"/>
+          <w:b/>
+          <w:bCs/>
+          <w:sz w:val="24"/>
+          <w:szCs w:val="24"/>
+        </w:rPr>
+        <w:t>Contraintes</w:t>
+      </w:r>
+      <w:r>
+        <w:rPr>
+          <w:rStyle w:val="CodeHTML"/>
+          <w:rFonts w:ascii="Times New Roman" w:hAnsi="Times New Roman" w:cs="Times New Roman"/>
+          <w:sz w:val="24"/>
+          <w:szCs w:val="24"/>
+        </w:rPr>
+        <w:t xml:space="preserve"> :</w:t>
+      </w:r>
+    </w:p>
+    <w:p>
+      <w:pPr>
+        <w:pStyle w:val="PrformatHTML"/>
+        <w:rPr>
+          <w:rStyle w:val="CodeHTML"/>
+          <w:rFonts w:ascii="Times New Roman" w:hAnsi="Times New Roman" w:cs="Times New Roman"/>
+          <w:sz w:val="24"/>
+          <w:szCs w:val="24"/>
+        </w:rPr>
+      </w:pPr>
+      <w:r>
+        <w:rPr>
+          <w:rStyle w:val="CodeHTML"/>
+          <w:rFonts w:ascii="Times New Roman" w:hAnsi="Times New Roman" w:cs="Times New Roman"/>
+          <w:sz w:val="24"/>
+          <w:szCs w:val="24"/>
+        </w:rPr>
+        <w:t>- Retourne UNIQUEMENT un JSON valide, sans texte avant ou après.</w:t>
+      </w:r>
+    </w:p>
+    <w:p>
+      <w:pPr>
+        <w:pStyle w:val="PrformatHTML"/>
+        <w:rPr>
+          <w:rStyle w:val="CodeHTML"/>
+          <w:rFonts w:ascii="Times New Roman" w:hAnsi="Times New Roman" w:cs="Times New Roman"/>
+          <w:sz w:val="24"/>
+          <w:szCs w:val="24"/>
+        </w:rPr>
+      </w:pPr>
+      <w:r>
+        <w:rPr>
+          <w:rStyle w:val="CodeHTML"/>
+          <w:rFonts w:ascii="Times New Roman" w:hAnsi="Times New Roman" w:cs="Times New Roman"/>
+          <w:sz w:val="24"/>
+          <w:szCs w:val="24"/>
+        </w:rPr>
+        <w:t xml:space="preserve">- Si une information est absente ou illisible, mets la valeur </w:t>
+      </w:r>
+      <w:proofErr w:type="spellStart"/>
+      <w:r>
+        <w:rPr>
+          <w:rStyle w:val="CodeHTML"/>
+          <w:rFonts w:ascii="Times New Roman" w:hAnsi="Times New Roman" w:cs="Times New Roman"/>
+          <w:sz w:val="24"/>
+          <w:szCs w:val="24"/>
+        </w:rPr>
+        <w:t>null</w:t>
+      </w:r>
+      <w:proofErr w:type="spellEnd"/>
+      <w:r>
+        <w:rPr>
+          <w:rStyle w:val="CodeHTML"/>
+          <w:rFonts w:ascii="Times New Roman" w:hAnsi="Times New Roman" w:cs="Times New Roman"/>
+          <w:sz w:val="24"/>
+          <w:szCs w:val="24"/>
+        </w:rPr>
+        <w:t xml:space="preserve"> pour ce champ</w:t>
+      </w:r>
+    </w:p>
+    <w:p>
+      <w:pPr>
+        <w:pStyle w:val="PrformatHTML"/>
+        <w:rPr>
+          <w:rStyle w:val="CodeHTML"/>
+          <w:rFonts w:ascii="Times New Roman" w:hAnsi="Times New Roman" w:cs="Times New Roman"/>
+          <w:sz w:val="24"/>
+          <w:szCs w:val="24"/>
+        </w:rPr>
+      </w:pPr>
+      <w:r>
+        <w:rPr>
+          <w:rStyle w:val="CodeHTML"/>
+          <w:rFonts w:ascii="Times New Roman" w:hAnsi="Times New Roman" w:cs="Times New Roman"/>
+          <w:sz w:val="24"/>
+          <w:szCs w:val="24"/>
+        </w:rPr>
+        <w:t xml:space="preserve">  (</w:t>
+      </w:r>
+      <w:proofErr w:type="gramStart"/>
+      <w:r>
+        <w:rPr>
+          <w:rStyle w:val="CodeHTML"/>
+          <w:rFonts w:ascii="Times New Roman" w:hAnsi="Times New Roman" w:cs="Times New Roman"/>
+          <w:sz w:val="24"/>
+          <w:szCs w:val="24"/>
+        </w:rPr>
+        <w:t>ne</w:t>
+      </w:r>
+      <w:proofErr w:type="gramEnd"/>
+      <w:r>
+        <w:rPr>
+          <w:rStyle w:val="CodeHTML"/>
+          <w:rFonts w:ascii="Times New Roman" w:hAnsi="Times New Roman" w:cs="Times New Roman"/>
+          <w:sz w:val="24"/>
+          <w:szCs w:val="24"/>
+        </w:rPr>
+        <w:t xml:space="preserve"> l'invente jamais).</w:t>
+      </w:r>
+    </w:p>
+    <w:p>
+      <w:pPr>
+        <w:pStyle w:val="PrformatHTML"/>
+        <w:rPr>
+          <w:rStyle w:val="CodeHTML"/>
+          <w:rFonts w:ascii="Times New Roman" w:hAnsi="Times New Roman" w:cs="Times New Roman"/>
+          <w:sz w:val="24"/>
+          <w:szCs w:val="24"/>
+        </w:rPr>
+      </w:pPr>
+      <w:r>
+        <w:rPr>
+          <w:rStyle w:val="CodeHTML"/>
+          <w:rFonts w:ascii="Times New Roman" w:hAnsi="Times New Roman" w:cs="Times New Roman"/>
+          <w:sz w:val="24"/>
+          <w:szCs w:val="24"/>
+        </w:rPr>
+        <w:t>- Les montants doivent être des nombres (pas de symbole monétaire dans la valeur).</w:t>
+      </w:r>
+    </w:p>
+    <w:p>
+      <w:pPr>
+        <w:pStyle w:val="PrformatHTML"/>
+        <w:rPr>
+          <w:rStyle w:val="CodeHTML"/>
+          <w:rFonts w:ascii="Times New Roman" w:hAnsi="Times New Roman" w:cs="Times New Roman"/>
+          <w:sz w:val="24"/>
+          <w:szCs w:val="24"/>
+        </w:rPr>
+      </w:pPr>
+    </w:p>
+    <w:p>
+      <w:pPr>
+        <w:pStyle w:val="PrformatHTML"/>
+        <w:rPr>
+          <w:rStyle w:val="CodeHTML"/>
+          <w:rFonts w:ascii="Times New Roman" w:hAnsi="Times New Roman" w:cs="Times New Roman"/>
+          <w:sz w:val="24"/>
+          <w:szCs w:val="24"/>
+        </w:rPr>
+      </w:pPr>
+      <w:r>
+        <w:rPr>
+          <w:rStyle w:val="CodeHTML"/>
+          <w:rFonts w:ascii="Times New Roman" w:hAnsi="Times New Roman" w:cs="Times New Roman"/>
+          <w:sz w:val="24"/>
+          <w:szCs w:val="24"/>
+        </w:rPr>
+        <w:t>Format de sortie :</w:t>
+      </w:r>
+    </w:p>
+    <w:p>
+      <w:pPr>
+        <w:pStyle w:val="PrformatHTML"/>
+        <w:rPr>
+          <w:rStyle w:val="CodeHTML"/>
+          <w:rFonts w:ascii="Times New Roman" w:hAnsi="Times New Roman" w:cs="Times New Roman"/>
+          <w:sz w:val="24"/>
+          <w:szCs w:val="24"/>
+        </w:rPr>
+      </w:pPr>
+      <w:r>
+        <w:rPr>
+          <w:rStyle w:val="CodeHTML"/>
+          <w:rFonts w:ascii="Times New Roman" w:hAnsi="Times New Roman" w:cs="Times New Roman"/>
+          <w:sz w:val="24"/>
+          <w:szCs w:val="24"/>
+        </w:rPr>
+        <w:t>{</w:t>
+      </w:r>
+    </w:p>
+    <w:p>
+      <w:pPr>
+        <w:pStyle w:val="PrformatHTML"/>
+        <w:rPr>
+          <w:rStyle w:val="CodeHTML"/>
+          <w:rFonts w:ascii="Times New Roman" w:hAnsi="Times New Roman" w:cs="Times New Roman"/>
+          <w:sz w:val="24"/>
+          <w:szCs w:val="24"/>
+        </w:rPr>
+      </w:pPr>
+      <w:r>
+        <w:rPr>
+          <w:rStyle w:val="CodeHTML"/>
+          <w:rFonts w:ascii="Times New Roman" w:hAnsi="Times New Roman" w:cs="Times New Roman"/>
+          <w:sz w:val="24"/>
+          <w:szCs w:val="24"/>
+        </w:rPr>
+        <w:t xml:space="preserve">  "</w:t>
+      </w:r>
+      <w:proofErr w:type="spellStart"/>
+      <w:r>
+        <w:rPr>
+          <w:rStyle w:val="CodeHTML"/>
+          <w:rFonts w:ascii="Times New Roman" w:hAnsi="Times New Roman" w:cs="Times New Roman"/>
+          <w:sz w:val="24"/>
+          <w:szCs w:val="24"/>
+        </w:rPr>
+        <w:t>numero_facture</w:t>
+      </w:r>
+      <w:proofErr w:type="spellEnd"/>
+      <w:proofErr w:type="gramStart"/>
+      <w:r>
+        <w:rPr>
+          <w:rStyle w:val="CodeHTML"/>
+          <w:rFonts w:ascii="Times New Roman" w:hAnsi="Times New Roman" w:cs="Times New Roman"/>
+          <w:sz w:val="24"/>
+          <w:szCs w:val="24"/>
+        </w:rPr>
+        <w:t>":</w:t>
+      </w:r>
+      <w:proofErr w:type="gramEnd"/>
+      <w:r>
+        <w:rPr>
+          <w:rStyle w:val="CodeHTML"/>
+          <w:rFonts w:ascii="Times New Roman" w:hAnsi="Times New Roman" w:cs="Times New Roman"/>
+          <w:sz w:val="24"/>
+          <w:szCs w:val="24"/>
+        </w:rPr>
+        <w:t xml:space="preserve"> ... ou </w:t>
+      </w:r>
+      <w:proofErr w:type="spellStart"/>
+      <w:r>
+        <w:rPr>
+          <w:rStyle w:val="CodeHTML"/>
+          <w:rFonts w:ascii="Times New Roman" w:hAnsi="Times New Roman" w:cs="Times New Roman"/>
+          <w:sz w:val="24"/>
+          <w:szCs w:val="24"/>
+        </w:rPr>
+        <w:t>null</w:t>
+      </w:r>
+      <w:proofErr w:type="spellEnd"/>
+      <w:r>
+        <w:rPr>
+          <w:rStyle w:val="CodeHTML"/>
+          <w:rFonts w:ascii="Times New Roman" w:hAnsi="Times New Roman" w:cs="Times New Roman"/>
+          <w:sz w:val="24"/>
+          <w:szCs w:val="24"/>
+        </w:rPr>
+        <w:t>,</w:t>
+      </w:r>
+    </w:p>
+    <w:p>
+      <w:pPr>
+        <w:pStyle w:val="PrformatHTML"/>
+        <w:rPr>
+          <w:rStyle w:val="CodeHTML"/>
+          <w:rFonts w:ascii="Times New Roman" w:hAnsi="Times New Roman" w:cs="Times New Roman"/>
+          <w:sz w:val="24"/>
+          <w:szCs w:val="24"/>
+        </w:rPr>
+      </w:pPr>
+      <w:r>
+        <w:rPr>
+          <w:rStyle w:val="CodeHTML"/>
+          <w:rFonts w:ascii="Times New Roman" w:hAnsi="Times New Roman" w:cs="Times New Roman"/>
+          <w:sz w:val="24"/>
+          <w:szCs w:val="24"/>
+        </w:rPr>
+        <w:t xml:space="preserve">  "date</w:t>
+      </w:r>
+      <w:proofErr w:type="gramStart"/>
+      <w:r>
+        <w:rPr>
+          <w:rStyle w:val="CodeHTML"/>
+          <w:rFonts w:ascii="Times New Roman" w:hAnsi="Times New Roman" w:cs="Times New Roman"/>
+          <w:sz w:val="24"/>
+          <w:szCs w:val="24"/>
+        </w:rPr>
+        <w:t>":</w:t>
+      </w:r>
+      <w:proofErr w:type="gramEnd"/>
+      <w:r>
+        <w:rPr>
+          <w:rStyle w:val="CodeHTML"/>
+          <w:rFonts w:ascii="Times New Roman" w:hAnsi="Times New Roman" w:cs="Times New Roman"/>
+          <w:sz w:val="24"/>
+          <w:szCs w:val="24"/>
+        </w:rPr>
+        <w:t xml:space="preserve"> ... ou </w:t>
+      </w:r>
+      <w:proofErr w:type="spellStart"/>
+      <w:r>
+        <w:rPr>
+          <w:rStyle w:val="CodeHTML"/>
+          <w:rFonts w:ascii="Times New Roman" w:hAnsi="Times New Roman" w:cs="Times New Roman"/>
+          <w:sz w:val="24"/>
+          <w:szCs w:val="24"/>
+        </w:rPr>
+        <w:t>null</w:t>
+      </w:r>
+      <w:proofErr w:type="spellEnd"/>
+      <w:r>
+        <w:rPr>
+          <w:rStyle w:val="CodeHTML"/>
+          <w:rFonts w:ascii="Times New Roman" w:hAnsi="Times New Roman" w:cs="Times New Roman"/>
+          <w:sz w:val="24"/>
+          <w:szCs w:val="24"/>
+        </w:rPr>
+        <w:t>,</w:t>
+      </w:r>
+    </w:p>
+    <w:p>
+      <w:pPr>
+        <w:pStyle w:val="PrformatHTML"/>
+        <w:rPr>
+          <w:rStyle w:val="CodeHTML"/>
+          <w:rFonts w:ascii="Times New Roman" w:hAnsi="Times New Roman" w:cs="Times New Roman"/>
+          <w:sz w:val="24"/>
+          <w:szCs w:val="24"/>
+        </w:rPr>
+      </w:pPr>
+      <w:r>
+        <w:rPr>
+          <w:rStyle w:val="CodeHTML"/>
+          <w:rFonts w:ascii="Times New Roman" w:hAnsi="Times New Roman" w:cs="Times New Roman"/>
+          <w:sz w:val="24"/>
+          <w:szCs w:val="24"/>
+        </w:rPr>
+        <w:t xml:space="preserve">  "client</w:t>
+      </w:r>
+      <w:proofErr w:type="gramStart"/>
+      <w:r>
+        <w:rPr>
+          <w:rStyle w:val="CodeHTML"/>
+          <w:rFonts w:ascii="Times New Roman" w:hAnsi="Times New Roman" w:cs="Times New Roman"/>
+          <w:sz w:val="24"/>
+          <w:szCs w:val="24"/>
+        </w:rPr>
+        <w:t>":</w:t>
+      </w:r>
+      <w:proofErr w:type="gramEnd"/>
+      <w:r>
+        <w:rPr>
+          <w:rStyle w:val="CodeHTML"/>
+          <w:rFonts w:ascii="Times New Roman" w:hAnsi="Times New Roman" w:cs="Times New Roman"/>
+          <w:sz w:val="24"/>
+          <w:szCs w:val="24"/>
+        </w:rPr>
+        <w:t xml:space="preserve"> ... ou </w:t>
+      </w:r>
+      <w:proofErr w:type="spellStart"/>
+      <w:r>
+        <w:rPr>
+          <w:rStyle w:val="CodeHTML"/>
+          <w:rFonts w:ascii="Times New Roman" w:hAnsi="Times New Roman" w:cs="Times New Roman"/>
+          <w:sz w:val="24"/>
+          <w:szCs w:val="24"/>
+        </w:rPr>
+        <w:t>null</w:t>
+      </w:r>
+      <w:proofErr w:type="spellEnd"/>
+      <w:r>
+        <w:rPr>
+          <w:rStyle w:val="CodeHTML"/>
+          <w:rFonts w:ascii="Times New Roman" w:hAnsi="Times New Roman" w:cs="Times New Roman"/>
+          <w:sz w:val="24"/>
+          <w:szCs w:val="24"/>
+        </w:rPr>
+        <w:t>,</w:t>
+      </w:r>
+    </w:p>
+    <w:p>
+      <w:pPr>
+        <w:pStyle w:val="PrformatHTML"/>
+        <w:rPr>
+          <w:rStyle w:val="CodeHTML"/>
+          <w:rFonts w:ascii="Times New Roman" w:hAnsi="Times New Roman" w:cs="Times New Roman"/>
+          <w:sz w:val="24"/>
+          <w:szCs w:val="24"/>
+        </w:rPr>
+      </w:pPr>
+      <w:r>
+        <w:rPr>
+          <w:rStyle w:val="CodeHTML"/>
+          <w:rFonts w:ascii="Times New Roman" w:hAnsi="Times New Roman" w:cs="Times New Roman"/>
+          <w:sz w:val="24"/>
+          <w:szCs w:val="24"/>
+        </w:rPr>
+        <w:t xml:space="preserve">  "</w:t>
+      </w:r>
+      <w:proofErr w:type="spellStart"/>
+      <w:r>
+        <w:rPr>
+          <w:rStyle w:val="CodeHTML"/>
+          <w:rFonts w:ascii="Times New Roman" w:hAnsi="Times New Roman" w:cs="Times New Roman"/>
+          <w:sz w:val="24"/>
+          <w:szCs w:val="24"/>
+        </w:rPr>
+        <w:t>montant_ht</w:t>
+      </w:r>
+      <w:proofErr w:type="spellEnd"/>
+      <w:proofErr w:type="gramStart"/>
+      <w:r>
+        <w:rPr>
+          <w:rStyle w:val="CodeHTML"/>
+          <w:rFonts w:ascii="Times New Roman" w:hAnsi="Times New Roman" w:cs="Times New Roman"/>
+          <w:sz w:val="24"/>
+          <w:szCs w:val="24"/>
+        </w:rPr>
+        <w:t>":</w:t>
+      </w:r>
+      <w:proofErr w:type="gramEnd"/>
+      <w:r>
+        <w:rPr>
+          <w:rStyle w:val="CodeHTML"/>
+          <w:rFonts w:ascii="Times New Roman" w:hAnsi="Times New Roman" w:cs="Times New Roman"/>
+          <w:sz w:val="24"/>
+          <w:szCs w:val="24"/>
+        </w:rPr>
+        <w:t xml:space="preserve"> ... ou </w:t>
+      </w:r>
+      <w:proofErr w:type="spellStart"/>
+      <w:r>
+        <w:rPr>
+          <w:rStyle w:val="CodeHTML"/>
+          <w:rFonts w:ascii="Times New Roman" w:hAnsi="Times New Roman" w:cs="Times New Roman"/>
+          <w:sz w:val="24"/>
+          <w:szCs w:val="24"/>
+        </w:rPr>
+        <w:t>null</w:t>
+      </w:r>
+      <w:proofErr w:type="spellEnd"/>
+      <w:r>
+        <w:rPr>
+          <w:rStyle w:val="CodeHTML"/>
+          <w:rFonts w:ascii="Times New Roman" w:hAnsi="Times New Roman" w:cs="Times New Roman"/>
+          <w:sz w:val="24"/>
+          <w:szCs w:val="24"/>
+        </w:rPr>
+        <w:t>,</w:t>
+      </w:r>
+    </w:p>
+    <w:p>
+      <w:pPr>
+        <w:pStyle w:val="PrformatHTML"/>
+        <w:rPr>
+          <w:rStyle w:val="CodeHTML"/>
+          <w:rFonts w:ascii="Times New Roman" w:hAnsi="Times New Roman" w:cs="Times New Roman"/>
+          <w:sz w:val="24"/>
+          <w:szCs w:val="24"/>
+        </w:rPr>
+      </w:pPr>
+      <w:r>
+        <w:rPr>
+          <w:rStyle w:val="CodeHTML"/>
+          <w:rFonts w:ascii="Times New Roman" w:hAnsi="Times New Roman" w:cs="Times New Roman"/>
+          <w:sz w:val="24"/>
+          <w:szCs w:val="24"/>
+        </w:rPr>
+        <w:lastRenderedPageBreak/>
+        <w:t xml:space="preserve">  "tva</w:t>
+      </w:r>
+      <w:proofErr w:type="gramStart"/>
+      <w:r>
+        <w:rPr>
+          <w:rStyle w:val="CodeHTML"/>
+          <w:rFonts w:ascii="Times New Roman" w:hAnsi="Times New Roman" w:cs="Times New Roman"/>
+          <w:sz w:val="24"/>
+          <w:szCs w:val="24"/>
+        </w:rPr>
+        <w:t>":</w:t>
+      </w:r>
+      <w:proofErr w:type="gramEnd"/>
+      <w:r>
+        <w:rPr>
+          <w:rStyle w:val="CodeHTML"/>
+          <w:rFonts w:ascii="Times New Roman" w:hAnsi="Times New Roman" w:cs="Times New Roman"/>
+          <w:sz w:val="24"/>
+          <w:szCs w:val="24"/>
+        </w:rPr>
+        <w:t xml:space="preserve"> ... ou </w:t>
+      </w:r>
+      <w:proofErr w:type="spellStart"/>
+      <w:r>
+        <w:rPr>
+          <w:rStyle w:val="CodeHTML"/>
+          <w:rFonts w:ascii="Times New Roman" w:hAnsi="Times New Roman" w:cs="Times New Roman"/>
+          <w:sz w:val="24"/>
+          <w:szCs w:val="24"/>
+        </w:rPr>
+        <w:t>null</w:t>
+      </w:r>
+      <w:proofErr w:type="spellEnd"/>
+      <w:r>
+        <w:rPr>
+          <w:rStyle w:val="CodeHTML"/>
+          <w:rFonts w:ascii="Times New Roman" w:hAnsi="Times New Roman" w:cs="Times New Roman"/>
+          <w:sz w:val="24"/>
+          <w:szCs w:val="24"/>
+        </w:rPr>
+        <w:t>,</w:t>
+      </w:r>
+    </w:p>
+    <w:p>
+      <w:pPr>
+        <w:pStyle w:val="PrformatHTML"/>
+        <w:rPr>
+          <w:rStyle w:val="CodeHTML"/>
+          <w:rFonts w:ascii="Times New Roman" w:hAnsi="Times New Roman" w:cs="Times New Roman"/>
+          <w:sz w:val="24"/>
+          <w:szCs w:val="24"/>
+        </w:rPr>
+      </w:pPr>
+      <w:r>
+        <w:rPr>
+          <w:rStyle w:val="CodeHTML"/>
+          <w:rFonts w:ascii="Times New Roman" w:hAnsi="Times New Roman" w:cs="Times New Roman"/>
+          <w:sz w:val="24"/>
+          <w:szCs w:val="24"/>
+        </w:rPr>
+        <w:t xml:space="preserve">  "</w:t>
+      </w:r>
+      <w:proofErr w:type="spellStart"/>
+      <w:r>
+        <w:rPr>
+          <w:rStyle w:val="CodeHTML"/>
+          <w:rFonts w:ascii="Times New Roman" w:hAnsi="Times New Roman" w:cs="Times New Roman"/>
+          <w:sz w:val="24"/>
+          <w:szCs w:val="24"/>
+        </w:rPr>
+        <w:t>montant_ttc</w:t>
+      </w:r>
+      <w:proofErr w:type="spellEnd"/>
+      <w:proofErr w:type="gramStart"/>
+      <w:r>
+        <w:rPr>
+          <w:rStyle w:val="CodeHTML"/>
+          <w:rFonts w:ascii="Times New Roman" w:hAnsi="Times New Roman" w:cs="Times New Roman"/>
+          <w:sz w:val="24"/>
+          <w:szCs w:val="24"/>
+        </w:rPr>
+        <w:t>":</w:t>
+      </w:r>
+      <w:proofErr w:type="gramEnd"/>
+      <w:r>
+        <w:rPr>
+          <w:rStyle w:val="CodeHTML"/>
+          <w:rFonts w:ascii="Times New Roman" w:hAnsi="Times New Roman" w:cs="Times New Roman"/>
+          <w:sz w:val="24"/>
+          <w:szCs w:val="24"/>
+        </w:rPr>
+        <w:t xml:space="preserve"> ... ou </w:t>
+      </w:r>
+      <w:proofErr w:type="spellStart"/>
+      <w:r>
+        <w:rPr>
+          <w:rStyle w:val="CodeHTML"/>
+          <w:rFonts w:ascii="Times New Roman" w:hAnsi="Times New Roman" w:cs="Times New Roman"/>
+          <w:sz w:val="24"/>
+          <w:szCs w:val="24"/>
+        </w:rPr>
+        <w:t>null</w:t>
+      </w:r>
+      <w:proofErr w:type="spellEnd"/>
+    </w:p>
+    <w:p>
+      <w:pPr>
+        <w:pStyle w:val="PrformatHTML"/>
+        <w:rPr>
+          <w:rStyle w:val="CodeHTML"/>
+          <w:rFonts w:ascii="Times New Roman" w:hAnsi="Times New Roman" w:cs="Times New Roman"/>
+          <w:sz w:val="24"/>
+          <w:szCs w:val="24"/>
+        </w:rPr>
+      </w:pPr>
+      <w:r>
+        <w:rPr>
+          <w:rStyle w:val="CodeHTML"/>
+          <w:rFonts w:ascii="Times New Roman" w:hAnsi="Times New Roman" w:cs="Times New Roman"/>
+          <w:sz w:val="24"/>
+          <w:szCs w:val="24"/>
+        </w:rPr>
+        <w:t>}</w:t>
+      </w:r>
+    </w:p>
+    <w:p>
+      <w:pPr>
+        <w:pStyle w:val="PrformatHTML"/>
+        <w:rPr>
+          <w:rStyle w:val="CodeHTML"/>
+          <w:rFonts w:ascii="Times New Roman" w:hAnsi="Times New Roman" w:cs="Times New Roman"/>
+          <w:sz w:val="24"/>
+          <w:szCs w:val="24"/>
+        </w:rPr>
+      </w:pPr>
+    </w:p>
+    <w:p>
+      <w:pPr>
+        <w:pStyle w:val="PrformatHTML"/>
+        <w:rPr>
+          <w:rStyle w:val="CodeHTML"/>
+          <w:rFonts w:ascii="Times New Roman" w:hAnsi="Times New Roman" w:cs="Times New Roman"/>
+          <w:sz w:val="24"/>
+          <w:szCs w:val="24"/>
+        </w:rPr>
+      </w:pPr>
+      <w:r>
+        <w:rPr>
+          <w:rStyle w:val="CodeHTML"/>
+          <w:rFonts w:ascii="Times New Roman" w:hAnsi="Times New Roman" w:cs="Times New Roman"/>
+          <w:sz w:val="24"/>
+          <w:szCs w:val="24"/>
+        </w:rPr>
+        <w:t>Facture :</w:t>
+      </w:r>
+    </w:p>
+    <w:p>
+      <w:pPr>
+        <w:pStyle w:val="PrformatHTML"/>
+        <w:rPr>
+          <w:rStyle w:val="CodeHTML"/>
+          <w:rFonts w:ascii="Times New Roman" w:hAnsi="Times New Roman" w:cs="Times New Roman"/>
+          <w:sz w:val="24"/>
+          <w:szCs w:val="24"/>
+        </w:rPr>
+      </w:pPr>
+    </w:p>
+    <w:p>
+      <w:pPr>
+        <w:pStyle w:val="PrformatHTML"/>
+        <w:rPr>
+          <w:rFonts w:ascii="Times New Roman" w:hAnsi="Times New Roman" w:cs="Times New Roman"/>
+          <w:sz w:val="24"/>
+          <w:szCs w:val="24"/>
+          <w:lang w:val="en-US"/>
+        </w:rPr>
+      </w:pPr>
+      <w:r>
+        <w:rPr>
+          <w:rFonts w:ascii="Times New Roman" w:hAnsi="Times New Roman" w:cs="Times New Roman"/>
+          <w:sz w:val="24"/>
+          <w:szCs w:val="24"/>
+          <w:lang w:val="en-US"/>
+        </w:rPr>
+        <w:t xml:space="preserve">FACTURE N° FAC-2026-001 </w:t>
+      </w:r>
+    </w:p>
+    <w:p>
+      <w:pPr>
+        <w:pStyle w:val="PrformatHTML"/>
+        <w:rPr>
+          <w:rFonts w:ascii="Times New Roman" w:hAnsi="Times New Roman" w:cs="Times New Roman"/>
+          <w:sz w:val="24"/>
+          <w:szCs w:val="24"/>
+          <w:lang w:val="en-US"/>
+        </w:rPr>
+      </w:pPr>
+      <w:proofErr w:type="gramStart"/>
+      <w:r>
+        <w:rPr>
+          <w:rFonts w:ascii="Times New Roman" w:hAnsi="Times New Roman" w:cs="Times New Roman"/>
+          <w:sz w:val="24"/>
+          <w:szCs w:val="24"/>
+          <w:lang w:val="en-US"/>
+        </w:rPr>
+        <w:t>Date :</w:t>
+      </w:r>
+      <w:proofErr w:type="gramEnd"/>
+      <w:r>
+        <w:rPr>
+          <w:rFonts w:ascii="Times New Roman" w:hAnsi="Times New Roman" w:cs="Times New Roman"/>
+          <w:sz w:val="24"/>
+          <w:szCs w:val="24"/>
+          <w:lang w:val="en-US"/>
+        </w:rPr>
+        <w:t xml:space="preserve"> 10/09/2026 </w:t>
+      </w:r>
+    </w:p>
+    <w:p>
+      <w:pPr>
+        <w:pStyle w:val="PrformatHTML"/>
+        <w:rPr>
+          <w:rFonts w:ascii="Times New Roman" w:hAnsi="Times New Roman" w:cs="Times New Roman"/>
+          <w:sz w:val="24"/>
+          <w:szCs w:val="24"/>
+          <w:lang w:val="en-US"/>
+        </w:rPr>
+      </w:pPr>
+      <w:proofErr w:type="gramStart"/>
+      <w:r>
+        <w:rPr>
+          <w:rFonts w:ascii="Times New Roman" w:hAnsi="Times New Roman" w:cs="Times New Roman"/>
+          <w:sz w:val="24"/>
+          <w:szCs w:val="24"/>
+          <w:lang w:val="en-US"/>
+        </w:rPr>
+        <w:t>Client :</w:t>
+      </w:r>
+      <w:proofErr w:type="gramEnd"/>
+      <w:r>
+        <w:rPr>
+          <w:rFonts w:ascii="Times New Roman" w:hAnsi="Times New Roman" w:cs="Times New Roman"/>
+          <w:sz w:val="24"/>
+          <w:szCs w:val="24"/>
+          <w:lang w:val="en-US"/>
+        </w:rPr>
+        <w:t xml:space="preserve"> </w:t>
+      </w:r>
+      <w:proofErr w:type="spellStart"/>
+      <w:r>
+        <w:rPr>
+          <w:rFonts w:ascii="Times New Roman" w:hAnsi="Times New Roman" w:cs="Times New Roman"/>
+          <w:sz w:val="24"/>
+          <w:szCs w:val="24"/>
+          <w:lang w:val="en-US"/>
+        </w:rPr>
+        <w:t>KharagneTech</w:t>
+      </w:r>
+      <w:proofErr w:type="spellEnd"/>
+      <w:r>
+        <w:rPr>
+          <w:rFonts w:ascii="Times New Roman" w:hAnsi="Times New Roman" w:cs="Times New Roman"/>
+          <w:sz w:val="24"/>
+          <w:szCs w:val="24"/>
+          <w:lang w:val="en-US"/>
+        </w:rPr>
+        <w:t xml:space="preserve"> Consulting </w:t>
+      </w:r>
+    </w:p>
+    <w:p>
+      <w:pPr>
+        <w:pStyle w:val="PrformatHTML"/>
+        <w:rPr>
+          <w:rFonts w:ascii="Times New Roman" w:hAnsi="Times New Roman" w:cs="Times New Roman"/>
+          <w:sz w:val="24"/>
+          <w:szCs w:val="24"/>
+          <w:lang w:val="en-US"/>
+        </w:rPr>
+      </w:pPr>
+      <w:proofErr w:type="spellStart"/>
+      <w:r>
+        <w:rPr>
+          <w:rFonts w:ascii="Times New Roman" w:hAnsi="Times New Roman" w:cs="Times New Roman"/>
+          <w:sz w:val="24"/>
+          <w:szCs w:val="24"/>
+          <w:lang w:val="en-US"/>
+        </w:rPr>
+        <w:t>Montant</w:t>
+      </w:r>
+      <w:proofErr w:type="spellEnd"/>
+      <w:r>
+        <w:rPr>
+          <w:rFonts w:ascii="Times New Roman" w:hAnsi="Times New Roman" w:cs="Times New Roman"/>
+          <w:sz w:val="24"/>
+          <w:szCs w:val="24"/>
+          <w:lang w:val="en-US"/>
+        </w:rPr>
+        <w:t xml:space="preserve"> </w:t>
+      </w:r>
+      <w:proofErr w:type="gramStart"/>
+      <w:r>
+        <w:rPr>
+          <w:rFonts w:ascii="Times New Roman" w:hAnsi="Times New Roman" w:cs="Times New Roman"/>
+          <w:sz w:val="24"/>
+          <w:szCs w:val="24"/>
+          <w:lang w:val="en-US"/>
+        </w:rPr>
+        <w:t>HT :</w:t>
+      </w:r>
+      <w:proofErr w:type="gramEnd"/>
+      <w:r>
+        <w:rPr>
+          <w:rFonts w:ascii="Times New Roman" w:hAnsi="Times New Roman" w:cs="Times New Roman"/>
+          <w:sz w:val="24"/>
+          <w:szCs w:val="24"/>
+          <w:lang w:val="en-US"/>
+        </w:rPr>
+        <w:t xml:space="preserve"> 100 000 FCFA </w:t>
+      </w:r>
+    </w:p>
+    <w:p>
+      <w:pPr>
+        <w:pStyle w:val="PrformatHTML"/>
+        <w:rPr>
+          <w:rFonts w:ascii="Times New Roman" w:hAnsi="Times New Roman" w:cs="Times New Roman"/>
+          <w:sz w:val="24"/>
+          <w:szCs w:val="24"/>
+        </w:rPr>
+      </w:pPr>
+      <w:r>
+        <w:rPr>
+          <w:rFonts w:ascii="Times New Roman" w:hAnsi="Times New Roman" w:cs="Times New Roman"/>
+          <w:sz w:val="24"/>
+          <w:szCs w:val="24"/>
+        </w:rPr>
+        <w:t xml:space="preserve">TVA : 18 000 FCFA </w:t>
+      </w:r>
+    </w:p>
+    <w:p>
+      <w:pPr>
+        <w:pStyle w:val="PrformatHTML"/>
+        <w:rPr>
+          <w:rStyle w:val="CodeHTML"/>
+          <w:rFonts w:ascii="Times New Roman" w:hAnsi="Times New Roman" w:cs="Times New Roman"/>
+          <w:sz w:val="24"/>
+          <w:szCs w:val="24"/>
+        </w:rPr>
+      </w:pPr>
+      <w:r>
+        <w:rPr>
+          <w:rFonts w:ascii="Times New Roman" w:hAnsi="Times New Roman" w:cs="Times New Roman"/>
+          <w:sz w:val="24"/>
+          <w:szCs w:val="24"/>
+        </w:rPr>
+        <w:t>Total TTC : 118 000 FCFA</w:t>
+      </w:r>
+    </w:p>
+    <w:p>
+      <w:pPr>
+        <w:pStyle w:val="NormalWeb"/>
+        <w:rPr>
+          <w:rStyle w:val="lev"/>
+        </w:rPr>
+      </w:pPr>
+      <w:r>
+        <w:rPr>
+          <w:rStyle w:val="lev"/>
+        </w:rPr>
+        <w:t>Ré</w:t>
+      </w:r>
+      <w:r>
+        <w:rPr>
+          <w:rStyle w:val="lev"/>
+        </w:rPr>
+        <w:t>sultat</w:t>
+      </w:r>
+      <w:r>
+        <w:rPr>
+          <w:rStyle w:val="lev"/>
+        </w:rPr>
+        <w:t xml:space="preserve"> :</w:t>
+      </w:r>
+    </w:p>
+    <w:p>
+      <w:pPr>
+        <w:pStyle w:val="NormalWeb"/>
+      </w:pPr>
+      <w:r>
+        <w:drawing>
+          <wp:inline distT="0" distB="0" distL="0" distR="0" wp14:anchorId="2B846B34" wp14:editId="44179864">
+            <wp:extent cx="5759450" cy="1617345"/>
+            <wp:effectExtent l="0" t="0" r="0" b="1905"/>
+            <wp:docPr id="20" name="Image 20"/>
+            <wp:cNvGraphicFramePr>
+              <a:graphicFrameLocks xmlns:a="http://schemas.openxmlformats.org/drawingml/2006/main" noChangeAspect="1"/>
+            </wp:cNvGraphicFramePr>
+            <a:graphic xmlns:a="http://schemas.openxmlformats.org/drawingml/2006/main">
+              <a:graphicData uri="http://schemas.openxmlformats.org/drawingml/2006/picture">
+                <pic:pic xmlns:pic="http://schemas.openxmlformats.org/drawingml/2006/picture">
+                  <pic:nvPicPr>
+                    <pic:cNvPr id="1" name=""/>
+                    <pic:cNvPicPr/>
+                  </pic:nvPicPr>
+                  <pic:blipFill>
+                    <a:blip r:embed="rId24"/>
+                    <a:stretch>
+                      <a:fillRect/>
+                    </a:stretch>
+                  </pic:blipFill>
+                  <pic:spPr>
+                    <a:xfrm>
+                      <a:off x="0" y="0"/>
+                      <a:ext cx="5759450" cy="1617345"/>
+                    </a:xfrm>
+                    <a:prstGeom prst="rect">
+                      <a:avLst/>
+                    </a:prstGeom>
+                  </pic:spPr>
+                </pic:pic>
+              </a:graphicData>
+            </a:graphic>
+          </wp:inline>
+        </w:drawing>
+      </w:r>
     </w:p>
     <w:p>
       <w:pPr>

</xml_diff>

<commit_message>
Partie 5 question 5
</commit_message>
<xml_diff>
--- a/ai-business_assistant.docx
+++ b/ai-business_assistant.docx
@@ -7430,14 +7430,14 @@
       <w:pPr>
         <w:pStyle w:val="Titre2"/>
         <w:rPr>
-          <w:sz w:val="24"/>
-          <w:szCs w:val="24"/>
-        </w:rPr>
-      </w:pPr>
-      <w:r>
-        <w:rPr>
-          <w:sz w:val="24"/>
-          <w:szCs w:val="24"/>
+          <w:sz w:val="28"/>
+          <w:szCs w:val="28"/>
+        </w:rPr>
+      </w:pPr>
+      <w:r>
+        <w:rPr>
+          <w:sz w:val="28"/>
+          <w:szCs w:val="28"/>
         </w:rPr>
         <w:t>4) Extraction d'informations d'une facture</w:t>
       </w:r>
@@ -7545,36 +7545,23 @@
         </w:rPr>
         <w:t>,</w:t>
       </w:r>
-    </w:p>
-    <w:p>
-      <w:pPr>
-        <w:pStyle w:val="PrformatHTML"/>
-        <w:rPr>
-          <w:rStyle w:val="CodeHTML"/>
-          <w:rFonts w:ascii="Times New Roman" w:hAnsi="Times New Roman" w:cs="Times New Roman"/>
-          <w:sz w:val="24"/>
-          <w:szCs w:val="24"/>
-        </w:rPr>
-      </w:pPr>
-      <w:proofErr w:type="gramStart"/>
-      <w:r>
-        <w:rPr>
-          <w:rStyle w:val="CodeHTML"/>
-          <w:rFonts w:ascii="Times New Roman" w:hAnsi="Times New Roman" w:cs="Times New Roman"/>
-          <w:sz w:val="24"/>
-          <w:szCs w:val="24"/>
-        </w:rPr>
-        <w:t>date</w:t>
-      </w:r>
-      <w:proofErr w:type="gramEnd"/>
-      <w:r>
-        <w:rPr>
-          <w:rStyle w:val="CodeHTML"/>
-          <w:rFonts w:ascii="Times New Roman" w:hAnsi="Times New Roman" w:cs="Times New Roman"/>
-          <w:sz w:val="24"/>
-          <w:szCs w:val="24"/>
-        </w:rPr>
-        <w:t xml:space="preserve">, client, </w:t>
+      <w:r>
+        <w:rPr>
+          <w:rStyle w:val="CodeHTML"/>
+          <w:rFonts w:ascii="Times New Roman" w:hAnsi="Times New Roman" w:cs="Times New Roman"/>
+          <w:sz w:val="24"/>
+          <w:szCs w:val="24"/>
+        </w:rPr>
+        <w:t xml:space="preserve"> </w:t>
+      </w:r>
+      <w:r>
+        <w:rPr>
+          <w:rStyle w:val="CodeHTML"/>
+          <w:rFonts w:ascii="Times New Roman" w:hAnsi="Times New Roman" w:cs="Times New Roman"/>
+          <w:sz w:val="24"/>
+          <w:szCs w:val="24"/>
+        </w:rPr>
+        <w:t xml:space="preserve">date, client, </w:t>
       </w:r>
       <w:proofErr w:type="spellStart"/>
       <w:r>
@@ -7662,41 +7649,49 @@
     <w:p>
       <w:pPr>
         <w:pStyle w:val="PrformatHTML"/>
-        <w:rPr>
-          <w:rStyle w:val="CodeHTML"/>
-          <w:rFonts w:ascii="Times New Roman" w:hAnsi="Times New Roman" w:cs="Times New Roman"/>
-          <w:sz w:val="24"/>
-          <w:szCs w:val="24"/>
-        </w:rPr>
-      </w:pPr>
-      <w:r>
-        <w:rPr>
-          <w:rStyle w:val="CodeHTML"/>
-          <w:rFonts w:ascii="Times New Roman" w:hAnsi="Times New Roman" w:cs="Times New Roman"/>
-          <w:sz w:val="24"/>
-          <w:szCs w:val="24"/>
-        </w:rPr>
-        <w:t>- Retourne UNIQUEMENT un JSON valide, sans texte avant ou après.</w:t>
-      </w:r>
-    </w:p>
-    <w:p>
-      <w:pPr>
-        <w:pStyle w:val="PrformatHTML"/>
-        <w:rPr>
-          <w:rStyle w:val="CodeHTML"/>
-          <w:rFonts w:ascii="Times New Roman" w:hAnsi="Times New Roman" w:cs="Times New Roman"/>
-          <w:sz w:val="24"/>
-          <w:szCs w:val="24"/>
-        </w:rPr>
-      </w:pPr>
-      <w:r>
-        <w:rPr>
-          <w:rStyle w:val="CodeHTML"/>
-          <w:rFonts w:ascii="Times New Roman" w:hAnsi="Times New Roman" w:cs="Times New Roman"/>
-          <w:sz w:val="24"/>
-          <w:szCs w:val="24"/>
-        </w:rPr>
-        <w:t xml:space="preserve">- Si une information est absente ou illisible, mets la valeur </w:t>
+        <w:numPr>
+          <w:ilvl w:val="0"/>
+          <w:numId w:val="14"/>
+        </w:numPr>
+        <w:rPr>
+          <w:rStyle w:val="CodeHTML"/>
+          <w:rFonts w:ascii="Times New Roman" w:hAnsi="Times New Roman" w:cs="Times New Roman"/>
+          <w:sz w:val="24"/>
+          <w:szCs w:val="24"/>
+        </w:rPr>
+      </w:pPr>
+      <w:r>
+        <w:rPr>
+          <w:rStyle w:val="CodeHTML"/>
+          <w:rFonts w:ascii="Times New Roman" w:hAnsi="Times New Roman" w:cs="Times New Roman"/>
+          <w:sz w:val="24"/>
+          <w:szCs w:val="24"/>
+        </w:rPr>
+        <w:t>Retourne UNIQUEMENT un JSON valide, sans texte avant ou après.</w:t>
+      </w:r>
+    </w:p>
+    <w:p>
+      <w:pPr>
+        <w:pStyle w:val="PrformatHTML"/>
+        <w:numPr>
+          <w:ilvl w:val="0"/>
+          <w:numId w:val="14"/>
+        </w:numPr>
+        <w:rPr>
+          <w:rStyle w:val="CodeHTML"/>
+          <w:rFonts w:ascii="Times New Roman" w:hAnsi="Times New Roman" w:cs="Times New Roman"/>
+          <w:sz w:val="24"/>
+          <w:szCs w:val="24"/>
+        </w:rPr>
+      </w:pPr>
+      <w:r>
+        <w:rPr>
+          <w:rStyle w:val="CodeHTML"/>
+          <w:rFonts w:ascii="Times New Roman" w:hAnsi="Times New Roman" w:cs="Times New Roman"/>
+          <w:sz w:val="24"/>
+          <w:szCs w:val="24"/>
+        </w:rPr>
+        <w:t xml:space="preserve">Si une information est absente ou illisible, mets la valeur </w:t>
       </w:r>
       <w:proofErr w:type="spellStart"/>
       <w:r>
@@ -7718,65 +7713,47 @@
         </w:rPr>
         <w:t xml:space="preserve"> pour ce champ</w:t>
       </w:r>
-    </w:p>
-    <w:p>
-      <w:pPr>
-        <w:pStyle w:val="PrformatHTML"/>
-        <w:rPr>
-          <w:rStyle w:val="CodeHTML"/>
-          <w:rFonts w:ascii="Times New Roman" w:hAnsi="Times New Roman" w:cs="Times New Roman"/>
-          <w:sz w:val="24"/>
-          <w:szCs w:val="24"/>
-        </w:rPr>
-      </w:pPr>
-      <w:r>
-        <w:rPr>
-          <w:rStyle w:val="CodeHTML"/>
-          <w:rFonts w:ascii="Times New Roman" w:hAnsi="Times New Roman" w:cs="Times New Roman"/>
-          <w:sz w:val="24"/>
-          <w:szCs w:val="24"/>
-        </w:rPr>
-        <w:t xml:space="preserve">  (</w:t>
-      </w:r>
-      <w:proofErr w:type="gramStart"/>
-      <w:r>
-        <w:rPr>
-          <w:rStyle w:val="CodeHTML"/>
-          <w:rFonts w:ascii="Times New Roman" w:hAnsi="Times New Roman" w:cs="Times New Roman"/>
-          <w:sz w:val="24"/>
-          <w:szCs w:val="24"/>
-        </w:rPr>
-        <w:t>ne</w:t>
-      </w:r>
-      <w:proofErr w:type="gramEnd"/>
-      <w:r>
-        <w:rPr>
-          <w:rStyle w:val="CodeHTML"/>
-          <w:rFonts w:ascii="Times New Roman" w:hAnsi="Times New Roman" w:cs="Times New Roman"/>
-          <w:sz w:val="24"/>
-          <w:szCs w:val="24"/>
-        </w:rPr>
-        <w:t xml:space="preserve"> l'invente jamais).</w:t>
-      </w:r>
-    </w:p>
-    <w:p>
-      <w:pPr>
-        <w:pStyle w:val="PrformatHTML"/>
-        <w:rPr>
-          <w:rStyle w:val="CodeHTML"/>
-          <w:rFonts w:ascii="Times New Roman" w:hAnsi="Times New Roman" w:cs="Times New Roman"/>
-          <w:sz w:val="24"/>
-          <w:szCs w:val="24"/>
-        </w:rPr>
-      </w:pPr>
-      <w:r>
-        <w:rPr>
-          <w:rStyle w:val="CodeHTML"/>
-          <w:rFonts w:ascii="Times New Roman" w:hAnsi="Times New Roman" w:cs="Times New Roman"/>
-          <w:sz w:val="24"/>
-          <w:szCs w:val="24"/>
-        </w:rPr>
-        <w:t>- Les montants doivent être des nombres (pas de symbole monétaire dans la valeur).</w:t>
+      <w:r>
+        <w:rPr>
+          <w:rStyle w:val="CodeHTML"/>
+          <w:rFonts w:ascii="Times New Roman" w:hAnsi="Times New Roman" w:cs="Times New Roman"/>
+          <w:sz w:val="24"/>
+          <w:szCs w:val="24"/>
+        </w:rPr>
+        <w:t xml:space="preserve"> </w:t>
+      </w:r>
+      <w:r>
+        <w:rPr>
+          <w:rStyle w:val="CodeHTML"/>
+          <w:rFonts w:ascii="Times New Roman" w:hAnsi="Times New Roman" w:cs="Times New Roman"/>
+          <w:sz w:val="24"/>
+          <w:szCs w:val="24"/>
+        </w:rPr>
+        <w:t>(ne l'invente jamais).</w:t>
+      </w:r>
+    </w:p>
+    <w:p>
+      <w:pPr>
+        <w:pStyle w:val="PrformatHTML"/>
+        <w:numPr>
+          <w:ilvl w:val="0"/>
+          <w:numId w:val="14"/>
+        </w:numPr>
+        <w:rPr>
+          <w:rStyle w:val="CodeHTML"/>
+          <w:rFonts w:ascii="Times New Roman" w:hAnsi="Times New Roman" w:cs="Times New Roman"/>
+          <w:sz w:val="24"/>
+          <w:szCs w:val="24"/>
+        </w:rPr>
+      </w:pPr>
+      <w:r>
+        <w:rPr>
+          <w:rStyle w:val="CodeHTML"/>
+          <w:rFonts w:ascii="Times New Roman" w:hAnsi="Times New Roman" w:cs="Times New Roman"/>
+          <w:sz w:val="24"/>
+          <w:szCs w:val="24"/>
+        </w:rPr>
+        <w:t>Les montants doivent être des nombres (pas de symbole monétaire dans la valeur).</w:t>
       </w:r>
     </w:p>
     <w:p>
@@ -8537,6 +8514,580 @@
     </w:p>
     <w:p>
       <w:pPr>
+        <w:pStyle w:val="Titre2"/>
+        <w:rPr>
+          <w:sz w:val="28"/>
+          <w:szCs w:val="28"/>
+        </w:rPr>
+      </w:pPr>
+      <w:r>
+        <w:rPr>
+          <w:sz w:val="28"/>
+          <w:szCs w:val="28"/>
+        </w:rPr>
+        <w:t>5) Email client</w:t>
+      </w:r>
+      <w:r>
+        <w:rPr>
+          <w:sz w:val="28"/>
+          <w:szCs w:val="28"/>
+        </w:rPr>
+        <w:t xml:space="preserve"> </w:t>
+      </w:r>
+      <w:r>
+        <w:rPr>
+          <w:sz w:val="28"/>
+          <w:szCs w:val="28"/>
+        </w:rPr>
+        <w:t>retard de livraison</w:t>
+      </w:r>
+    </w:p>
+    <w:p>
+      <w:pPr>
+        <w:pStyle w:val="PrformatHTML"/>
+        <w:rPr>
+          <w:rStyle w:val="CodeHTML"/>
+          <w:rFonts w:ascii="Times New Roman" w:hAnsi="Times New Roman" w:cs="Times New Roman"/>
+          <w:sz w:val="24"/>
+          <w:szCs w:val="24"/>
+        </w:rPr>
+      </w:pPr>
+      <w:r>
+        <w:rPr>
+          <w:rStyle w:val="CodeHTML"/>
+          <w:rFonts w:ascii="Times New Roman" w:hAnsi="Times New Roman" w:cs="Times New Roman"/>
+          <w:b/>
+          <w:bCs/>
+          <w:sz w:val="24"/>
+          <w:szCs w:val="24"/>
+        </w:rPr>
+        <w:t>Rôle</w:t>
+      </w:r>
+      <w:r>
+        <w:rPr>
+          <w:rStyle w:val="CodeHTML"/>
+          <w:rFonts w:ascii="Times New Roman" w:hAnsi="Times New Roman" w:cs="Times New Roman"/>
+          <w:sz w:val="24"/>
+          <w:szCs w:val="24"/>
+        </w:rPr>
+        <w:t xml:space="preserve"> : </w:t>
+      </w:r>
+      <w:r>
+        <w:rPr>
+          <w:rStyle w:val="CodeHTML"/>
+          <w:rFonts w:ascii="Times New Roman" w:hAnsi="Times New Roman" w:cs="Times New Roman"/>
+          <w:sz w:val="24"/>
+          <w:szCs w:val="24"/>
+        </w:rPr>
+        <w:t>Tu es un chargé de relation client dans une entreprise de e-commerce.</w:t>
+      </w:r>
+    </w:p>
+    <w:p>
+      <w:pPr>
+        <w:pStyle w:val="PrformatHTML"/>
+        <w:rPr>
+          <w:rStyle w:val="CodeHTML"/>
+          <w:rFonts w:ascii="Times New Roman" w:hAnsi="Times New Roman" w:cs="Times New Roman"/>
+          <w:sz w:val="24"/>
+          <w:szCs w:val="24"/>
+        </w:rPr>
+      </w:pPr>
+    </w:p>
+    <w:p>
+      <w:pPr>
+        <w:pStyle w:val="PrformatHTML"/>
+        <w:rPr>
+          <w:rStyle w:val="CodeHTML"/>
+          <w:rFonts w:ascii="Times New Roman" w:hAnsi="Times New Roman" w:cs="Times New Roman"/>
+          <w:sz w:val="24"/>
+          <w:szCs w:val="24"/>
+        </w:rPr>
+      </w:pPr>
+      <w:r>
+        <w:rPr>
+          <w:rStyle w:val="CodeHTML"/>
+          <w:rFonts w:ascii="Times New Roman" w:hAnsi="Times New Roman" w:cs="Times New Roman"/>
+          <w:b/>
+          <w:bCs/>
+          <w:sz w:val="24"/>
+          <w:szCs w:val="24"/>
+        </w:rPr>
+        <w:t>Tâche</w:t>
+      </w:r>
+      <w:r>
+        <w:rPr>
+          <w:rStyle w:val="CodeHTML"/>
+          <w:rFonts w:ascii="Times New Roman" w:hAnsi="Times New Roman" w:cs="Times New Roman"/>
+          <w:sz w:val="24"/>
+          <w:szCs w:val="24"/>
+        </w:rPr>
+        <w:t xml:space="preserve"> : Rédige un email destiné à un client dont la commande a pris du retard.</w:t>
+      </w:r>
+    </w:p>
+    <w:p>
+      <w:pPr>
+        <w:pStyle w:val="PrformatHTML"/>
+        <w:rPr>
+          <w:rStyle w:val="CodeHTML"/>
+          <w:rFonts w:ascii="Times New Roman" w:hAnsi="Times New Roman" w:cs="Times New Roman"/>
+          <w:sz w:val="24"/>
+          <w:szCs w:val="24"/>
+        </w:rPr>
+      </w:pPr>
+    </w:p>
+    <w:p>
+      <w:pPr>
+        <w:pStyle w:val="PrformatHTML"/>
+        <w:rPr>
+          <w:rStyle w:val="CodeHTML"/>
+          <w:rFonts w:ascii="Times New Roman" w:hAnsi="Times New Roman" w:cs="Times New Roman"/>
+          <w:sz w:val="24"/>
+          <w:szCs w:val="24"/>
+        </w:rPr>
+      </w:pPr>
+      <w:r>
+        <w:rPr>
+          <w:rStyle w:val="CodeHTML"/>
+          <w:rFonts w:ascii="Times New Roman" w:hAnsi="Times New Roman" w:cs="Times New Roman"/>
+          <w:b/>
+          <w:bCs/>
+          <w:sz w:val="24"/>
+          <w:szCs w:val="24"/>
+        </w:rPr>
+        <w:t>Objectifs de l'email</w:t>
+      </w:r>
+      <w:r>
+        <w:rPr>
+          <w:rStyle w:val="CodeHTML"/>
+          <w:rFonts w:ascii="Times New Roman" w:hAnsi="Times New Roman" w:cs="Times New Roman"/>
+          <w:sz w:val="24"/>
+          <w:szCs w:val="24"/>
+        </w:rPr>
+        <w:t xml:space="preserve"> :</w:t>
+      </w:r>
+    </w:p>
+    <w:p>
+      <w:pPr>
+        <w:pStyle w:val="PrformatHTML"/>
+        <w:numPr>
+          <w:ilvl w:val="0"/>
+          <w:numId w:val="15"/>
+        </w:numPr>
+        <w:rPr>
+          <w:rStyle w:val="CodeHTML"/>
+          <w:rFonts w:ascii="Times New Roman" w:hAnsi="Times New Roman" w:cs="Times New Roman"/>
+          <w:sz w:val="24"/>
+          <w:szCs w:val="24"/>
+        </w:rPr>
+      </w:pPr>
+      <w:r>
+        <w:rPr>
+          <w:rStyle w:val="CodeHTML"/>
+          <w:rFonts w:ascii="Times New Roman" w:hAnsi="Times New Roman" w:cs="Times New Roman"/>
+          <w:sz w:val="24"/>
+          <w:szCs w:val="24"/>
+        </w:rPr>
+        <w:t>Reconnaître clairement le retard.</w:t>
+      </w:r>
+    </w:p>
+    <w:p>
+      <w:pPr>
+        <w:pStyle w:val="PrformatHTML"/>
+        <w:numPr>
+          <w:ilvl w:val="0"/>
+          <w:numId w:val="15"/>
+        </w:numPr>
+        <w:rPr>
+          <w:rStyle w:val="CodeHTML"/>
+          <w:rFonts w:ascii="Times New Roman" w:hAnsi="Times New Roman" w:cs="Times New Roman"/>
+          <w:sz w:val="24"/>
+          <w:szCs w:val="24"/>
+        </w:rPr>
+      </w:pPr>
+      <w:r>
+        <w:rPr>
+          <w:rStyle w:val="CodeHTML"/>
+          <w:rFonts w:ascii="Times New Roman" w:hAnsi="Times New Roman" w:cs="Times New Roman"/>
+          <w:sz w:val="24"/>
+          <w:szCs w:val="24"/>
+        </w:rPr>
+        <w:t>Présenter des excuses sincères.</w:t>
+      </w:r>
+    </w:p>
+    <w:p>
+      <w:pPr>
+        <w:pStyle w:val="PrformatHTML"/>
+        <w:numPr>
+          <w:ilvl w:val="0"/>
+          <w:numId w:val="15"/>
+        </w:numPr>
+        <w:rPr>
+          <w:rStyle w:val="CodeHTML"/>
+          <w:rFonts w:ascii="Times New Roman" w:hAnsi="Times New Roman" w:cs="Times New Roman"/>
+          <w:sz w:val="24"/>
+          <w:szCs w:val="24"/>
+        </w:rPr>
+      </w:pPr>
+      <w:r>
+        <w:rPr>
+          <w:rStyle w:val="CodeHTML"/>
+          <w:rFonts w:ascii="Times New Roman" w:hAnsi="Times New Roman" w:cs="Times New Roman"/>
+          <w:sz w:val="24"/>
+          <w:szCs w:val="24"/>
+        </w:rPr>
+        <w:t>Expliquer la situation sans inventer de cause précise (rester général si la</w:t>
+      </w:r>
+      <w:r>
+        <w:rPr>
+          <w:rStyle w:val="CodeHTML"/>
+          <w:rFonts w:ascii="Times New Roman" w:hAnsi="Times New Roman" w:cs="Times New Roman"/>
+          <w:sz w:val="24"/>
+          <w:szCs w:val="24"/>
+        </w:rPr>
+        <w:t xml:space="preserve"> </w:t>
+      </w:r>
+      <w:r>
+        <w:rPr>
+          <w:rStyle w:val="CodeHTML"/>
+          <w:rFonts w:ascii="Times New Roman" w:hAnsi="Times New Roman" w:cs="Times New Roman"/>
+          <w:sz w:val="24"/>
+          <w:szCs w:val="24"/>
+        </w:rPr>
+        <w:t>cause exacte n'est pas connue, par exemple "un contretemps logistique").</w:t>
+      </w:r>
+    </w:p>
+    <w:p>
+      <w:pPr>
+        <w:pStyle w:val="PrformatHTML"/>
+        <w:numPr>
+          <w:ilvl w:val="0"/>
+          <w:numId w:val="15"/>
+        </w:numPr>
+        <w:rPr>
+          <w:rStyle w:val="CodeHTML"/>
+          <w:rFonts w:ascii="Times New Roman" w:hAnsi="Times New Roman" w:cs="Times New Roman"/>
+          <w:sz w:val="24"/>
+          <w:szCs w:val="24"/>
+        </w:rPr>
+      </w:pPr>
+      <w:r>
+        <w:rPr>
+          <w:rStyle w:val="CodeHTML"/>
+          <w:rFonts w:ascii="Times New Roman" w:hAnsi="Times New Roman" w:cs="Times New Roman"/>
+          <w:sz w:val="24"/>
+          <w:szCs w:val="24"/>
+        </w:rPr>
+        <w:t>Proposer une solution concrète (ex. suivi prioritaire, geste commercial, nouveau</w:t>
+      </w:r>
+      <w:r>
+        <w:rPr>
+          <w:rStyle w:val="CodeHTML"/>
+          <w:rFonts w:ascii="Times New Roman" w:hAnsi="Times New Roman" w:cs="Times New Roman"/>
+          <w:sz w:val="24"/>
+          <w:szCs w:val="24"/>
+        </w:rPr>
+        <w:t xml:space="preserve"> </w:t>
+      </w:r>
+      <w:r>
+        <w:rPr>
+          <w:rStyle w:val="CodeHTML"/>
+          <w:rFonts w:ascii="Times New Roman" w:hAnsi="Times New Roman" w:cs="Times New Roman"/>
+          <w:sz w:val="24"/>
+          <w:szCs w:val="24"/>
+        </w:rPr>
+        <w:t>délai estimé).</w:t>
+      </w:r>
+    </w:p>
+    <w:p>
+      <w:pPr>
+        <w:pStyle w:val="PrformatHTML"/>
+        <w:ind w:left="720"/>
+        <w:rPr>
+          <w:rStyle w:val="CodeHTML"/>
+          <w:rFonts w:ascii="Times New Roman" w:hAnsi="Times New Roman" w:cs="Times New Roman"/>
+          <w:sz w:val="24"/>
+          <w:szCs w:val="24"/>
+        </w:rPr>
+      </w:pPr>
+    </w:p>
+    <w:p>
+      <w:pPr>
+        <w:pStyle w:val="PrformatHTML"/>
+        <w:rPr>
+          <w:rStyle w:val="CodeHTML"/>
+          <w:rFonts w:ascii="Times New Roman" w:hAnsi="Times New Roman" w:cs="Times New Roman"/>
+          <w:sz w:val="24"/>
+          <w:szCs w:val="24"/>
+        </w:rPr>
+      </w:pPr>
+      <w:r>
+        <w:rPr>
+          <w:rStyle w:val="CodeHTML"/>
+          <w:rFonts w:ascii="Times New Roman" w:hAnsi="Times New Roman" w:cs="Times New Roman"/>
+          <w:b/>
+          <w:bCs/>
+          <w:sz w:val="24"/>
+          <w:szCs w:val="24"/>
+        </w:rPr>
+        <w:t>Ton</w:t>
+      </w:r>
+      <w:r>
+        <w:rPr>
+          <w:rStyle w:val="CodeHTML"/>
+          <w:rFonts w:ascii="Times New Roman" w:hAnsi="Times New Roman" w:cs="Times New Roman"/>
+          <w:sz w:val="24"/>
+          <w:szCs w:val="24"/>
+        </w:rPr>
+        <w:t xml:space="preserve"> : professionnel, courtois et rassurant.</w:t>
+      </w:r>
+    </w:p>
+    <w:p>
+      <w:pPr>
+        <w:pStyle w:val="PrformatHTML"/>
+        <w:rPr>
+          <w:rStyle w:val="CodeHTML"/>
+          <w:rFonts w:ascii="Times New Roman" w:hAnsi="Times New Roman" w:cs="Times New Roman"/>
+          <w:sz w:val="24"/>
+          <w:szCs w:val="24"/>
+        </w:rPr>
+      </w:pPr>
+    </w:p>
+    <w:p>
+      <w:pPr>
+        <w:pStyle w:val="PrformatHTML"/>
+        <w:rPr>
+          <w:rStyle w:val="CodeHTML"/>
+          <w:rFonts w:ascii="Times New Roman" w:hAnsi="Times New Roman" w:cs="Times New Roman"/>
+          <w:sz w:val="24"/>
+          <w:szCs w:val="24"/>
+        </w:rPr>
+      </w:pPr>
+      <w:r>
+        <w:rPr>
+          <w:rStyle w:val="CodeHTML"/>
+          <w:rFonts w:ascii="Times New Roman" w:hAnsi="Times New Roman" w:cs="Times New Roman"/>
+          <w:b/>
+          <w:bCs/>
+          <w:sz w:val="24"/>
+          <w:szCs w:val="24"/>
+        </w:rPr>
+        <w:t>Contrainte de longueur</w:t>
+      </w:r>
+      <w:r>
+        <w:rPr>
+          <w:rStyle w:val="CodeHTML"/>
+          <w:rFonts w:ascii="Times New Roman" w:hAnsi="Times New Roman" w:cs="Times New Roman"/>
+          <w:sz w:val="24"/>
+          <w:szCs w:val="24"/>
+        </w:rPr>
+        <w:t xml:space="preserve"> : maximum 150 mots.</w:t>
+      </w:r>
+    </w:p>
+    <w:p>
+      <w:pPr>
+        <w:pStyle w:val="PrformatHTML"/>
+        <w:rPr>
+          <w:rStyle w:val="CodeHTML"/>
+          <w:rFonts w:ascii="Times New Roman" w:hAnsi="Times New Roman" w:cs="Times New Roman"/>
+          <w:sz w:val="24"/>
+          <w:szCs w:val="24"/>
+        </w:rPr>
+      </w:pPr>
+    </w:p>
+    <w:p>
+      <w:pPr>
+        <w:pStyle w:val="PrformatHTML"/>
+        <w:rPr>
+          <w:rStyle w:val="CodeHTML"/>
+          <w:rFonts w:ascii="Times New Roman" w:hAnsi="Times New Roman" w:cs="Times New Roman"/>
+          <w:sz w:val="24"/>
+          <w:szCs w:val="24"/>
+        </w:rPr>
+      </w:pPr>
+      <w:r>
+        <w:rPr>
+          <w:rStyle w:val="CodeHTML"/>
+          <w:rFonts w:ascii="Times New Roman" w:hAnsi="Times New Roman" w:cs="Times New Roman"/>
+          <w:sz w:val="24"/>
+          <w:szCs w:val="24"/>
+        </w:rPr>
+        <w:t>Contexte (à adapter si besoin) :</w:t>
+      </w:r>
+    </w:p>
+    <w:p>
+      <w:pPr>
+        <w:pStyle w:val="PrformatHTML"/>
+        <w:rPr>
+          <w:rStyle w:val="CodeHTML"/>
+          <w:rFonts w:ascii="Times New Roman" w:hAnsi="Times New Roman" w:cs="Times New Roman"/>
+          <w:sz w:val="24"/>
+          <w:szCs w:val="24"/>
+        </w:rPr>
+      </w:pPr>
+      <w:r>
+        <w:rPr>
+          <w:rStyle w:val="CodeHTML"/>
+          <w:rFonts w:ascii="Times New Roman" w:hAnsi="Times New Roman" w:cs="Times New Roman"/>
+          <w:sz w:val="24"/>
+          <w:szCs w:val="24"/>
+        </w:rPr>
+        <w:t>"""</w:t>
+      </w:r>
+    </w:p>
+    <w:p>
+      <w:pPr>
+        <w:pStyle w:val="PrformatHTML"/>
+        <w:rPr>
+          <w:rStyle w:val="CodeHTML"/>
+          <w:rFonts w:ascii="Times New Roman" w:hAnsi="Times New Roman" w:cs="Times New Roman"/>
+          <w:sz w:val="24"/>
+          <w:szCs w:val="24"/>
+        </w:rPr>
+      </w:pPr>
+      <w:r>
+        <w:rPr>
+          <w:rStyle w:val="CodeHTML"/>
+          <w:rFonts w:ascii="Times New Roman" w:hAnsi="Times New Roman" w:cs="Times New Roman"/>
+          <w:sz w:val="24"/>
+          <w:szCs w:val="24"/>
+        </w:rPr>
+        <w:t>Client : [NOM]</w:t>
+      </w:r>
+    </w:p>
+    <w:p>
+      <w:pPr>
+        <w:pStyle w:val="PrformatHTML"/>
+        <w:rPr>
+          <w:rStyle w:val="CodeHTML"/>
+          <w:rFonts w:ascii="Times New Roman" w:hAnsi="Times New Roman" w:cs="Times New Roman"/>
+          <w:sz w:val="24"/>
+          <w:szCs w:val="24"/>
+        </w:rPr>
+      </w:pPr>
+      <w:r>
+        <w:rPr>
+          <w:rStyle w:val="CodeHTML"/>
+          <w:rFonts w:ascii="Times New Roman" w:hAnsi="Times New Roman" w:cs="Times New Roman"/>
+          <w:sz w:val="24"/>
+          <w:szCs w:val="24"/>
+        </w:rPr>
+        <w:t>Commande : [NUMÉRO]</w:t>
+      </w:r>
+    </w:p>
+    <w:p>
+      <w:pPr>
+        <w:pStyle w:val="PrformatHTML"/>
+        <w:rPr>
+          <w:rStyle w:val="CodeHTML"/>
+          <w:rFonts w:ascii="Times New Roman" w:hAnsi="Times New Roman" w:cs="Times New Roman"/>
+          <w:sz w:val="24"/>
+          <w:szCs w:val="24"/>
+        </w:rPr>
+      </w:pPr>
+      <w:r>
+        <w:rPr>
+          <w:rStyle w:val="CodeHTML"/>
+          <w:rFonts w:ascii="Times New Roman" w:hAnsi="Times New Roman" w:cs="Times New Roman"/>
+          <w:sz w:val="24"/>
+          <w:szCs w:val="24"/>
+        </w:rPr>
+        <w:t>Retard estimé : [DURÉE]</w:t>
+      </w:r>
+    </w:p>
+    <w:p>
+      <w:pPr>
+        <w:pStyle w:val="PrformatHTML"/>
+        <w:rPr>
+          <w:rFonts w:ascii="Times New Roman" w:hAnsi="Times New Roman" w:cs="Times New Roman"/>
+          <w:sz w:val="24"/>
+          <w:szCs w:val="24"/>
+        </w:rPr>
+      </w:pPr>
+      <w:r>
+        <w:rPr>
+          <w:rStyle w:val="CodeHTML"/>
+          <w:rFonts w:ascii="Times New Roman" w:hAnsi="Times New Roman" w:cs="Times New Roman"/>
+          <w:sz w:val="24"/>
+          <w:szCs w:val="24"/>
+        </w:rPr>
+        <w:t>"""</w:t>
+      </w:r>
+    </w:p>
+    <w:p>
+      <w:pPr>
+        <w:pStyle w:val="NormalWeb"/>
+        <w:rPr>
+          <w:rStyle w:val="lev"/>
+        </w:rPr>
+      </w:pPr>
+      <w:r>
+        <w:rPr>
+          <w:rStyle w:val="lev"/>
+          <w:sz w:val="28"/>
+          <w:szCs w:val="28"/>
+        </w:rPr>
+        <w:lastRenderedPageBreak/>
+        <w:t>Ré</w:t>
+      </w:r>
+      <w:r>
+        <w:rPr>
+          <w:rStyle w:val="lev"/>
+          <w:sz w:val="28"/>
+          <w:szCs w:val="28"/>
+        </w:rPr>
+        <w:t>sultat</w:t>
+      </w:r>
+      <w:r>
+        <w:rPr>
+          <w:rStyle w:val="lev"/>
+        </w:rPr>
+        <w:t xml:space="preserve"> : </w:t>
+      </w:r>
+    </w:p>
+    <w:p>
+      <w:pPr>
+        <w:pStyle w:val="NormalWeb"/>
+      </w:pPr>
+      <w:r>
+        <w:drawing>
+          <wp:inline distT="0" distB="0" distL="0" distR="0" wp14:anchorId="293327A8" wp14:editId="51CF25A8">
+            <wp:extent cx="5759450" cy="3492500"/>
+            <wp:effectExtent l="0" t="0" r="0" b="0"/>
+            <wp:docPr id="21" name="Image 21"/>
+            <wp:cNvGraphicFramePr>
+              <a:graphicFrameLocks xmlns:a="http://schemas.openxmlformats.org/drawingml/2006/main" noChangeAspect="1"/>
+            </wp:cNvGraphicFramePr>
+            <a:graphic xmlns:a="http://schemas.openxmlformats.org/drawingml/2006/main">
+              <a:graphicData uri="http://schemas.openxmlformats.org/drawingml/2006/picture">
+                <pic:pic xmlns:pic="http://schemas.openxmlformats.org/drawingml/2006/picture">
+                  <pic:nvPicPr>
+                    <pic:cNvPr id="1" name=""/>
+                    <pic:cNvPicPr/>
+                  </pic:nvPicPr>
+                  <pic:blipFill>
+                    <a:blip r:embed="rId25"/>
+                    <a:stretch>
+                      <a:fillRect/>
+                    </a:stretch>
+                  </pic:blipFill>
+                  <pic:spPr>
+                    <a:xfrm>
+                      <a:off x="0" y="0"/>
+                      <a:ext cx="5759450" cy="3492500"/>
+                    </a:xfrm>
+                    <a:prstGeom prst="rect">
+                      <a:avLst/>
+                    </a:prstGeom>
+                  </pic:spPr>
+                </pic:pic>
+              </a:graphicData>
+            </a:graphic>
+          </wp:inline>
+        </w:drawing>
+      </w:r>
+    </w:p>
+    <w:p>
+      <w:pPr>
         <w:pStyle w:val="PrformatHTML"/>
         <w:ind w:left="360"/>
         <w:rPr>
@@ -9469,6 +10020,232 @@
     </w:lvl>
   </w:abstractNum>
   <w:abstractNum w:abstractNumId="9" w15:restartNumberingAfterBreak="0">
+    <w:nsid w:val="414D6B93"/>
+    <w:multiLevelType w:val="hybridMultilevel"/>
+    <w:tmpl w:val="5B4875DE"/>
+    <w:lvl w:ilvl="0" w:tplc="040C0001">
+      <w:start w:val="1"/>
+      <w:numFmt w:val="bullet"/>
+      <w:lvlText w:val=""/>
+      <w:lvlJc w:val="left"/>
+      <w:pPr>
+        <w:ind w:left="720" w:hanging="360"/>
+      </w:pPr>
+      <w:rPr>
+        <w:rFonts w:ascii="Symbol" w:hAnsi="Symbol" w:hint="default"/>
+      </w:rPr>
+    </w:lvl>
+    <w:lvl w:ilvl="1" w:tplc="040C0003" w:tentative="1">
+      <w:start w:val="1"/>
+      <w:numFmt w:val="bullet"/>
+      <w:lvlText w:val="o"/>
+      <w:lvlJc w:val="left"/>
+      <w:pPr>
+        <w:ind w:left="1440" w:hanging="360"/>
+      </w:pPr>
+      <w:rPr>
+        <w:rFonts w:ascii="Courier New" w:hAnsi="Courier New" w:cs="Courier New" w:hint="default"/>
+      </w:rPr>
+    </w:lvl>
+    <w:lvl w:ilvl="2" w:tplc="040C0005" w:tentative="1">
+      <w:start w:val="1"/>
+      <w:numFmt w:val="bullet"/>
+      <w:lvlText w:val=""/>
+      <w:lvlJc w:val="left"/>
+      <w:pPr>
+        <w:ind w:left="2160" w:hanging="360"/>
+      </w:pPr>
+      <w:rPr>
+        <w:rFonts w:ascii="Wingdings" w:hAnsi="Wingdings" w:hint="default"/>
+      </w:rPr>
+    </w:lvl>
+    <w:lvl w:ilvl="3" w:tplc="040C0001" w:tentative="1">
+      <w:start w:val="1"/>
+      <w:numFmt w:val="bullet"/>
+      <w:lvlText w:val=""/>
+      <w:lvlJc w:val="left"/>
+      <w:pPr>
+        <w:ind w:left="2880" w:hanging="360"/>
+      </w:pPr>
+      <w:rPr>
+        <w:rFonts w:ascii="Symbol" w:hAnsi="Symbol" w:hint="default"/>
+      </w:rPr>
+    </w:lvl>
+    <w:lvl w:ilvl="4" w:tplc="040C0003" w:tentative="1">
+      <w:start w:val="1"/>
+      <w:numFmt w:val="bullet"/>
+      <w:lvlText w:val="o"/>
+      <w:lvlJc w:val="left"/>
+      <w:pPr>
+        <w:ind w:left="3600" w:hanging="360"/>
+      </w:pPr>
+      <w:rPr>
+        <w:rFonts w:ascii="Courier New" w:hAnsi="Courier New" w:cs="Courier New" w:hint="default"/>
+      </w:rPr>
+    </w:lvl>
+    <w:lvl w:ilvl="5" w:tplc="040C0005" w:tentative="1">
+      <w:start w:val="1"/>
+      <w:numFmt w:val="bullet"/>
+      <w:lvlText w:val=""/>
+      <w:lvlJc w:val="left"/>
+      <w:pPr>
+        <w:ind w:left="4320" w:hanging="360"/>
+      </w:pPr>
+      <w:rPr>
+        <w:rFonts w:ascii="Wingdings" w:hAnsi="Wingdings" w:hint="default"/>
+      </w:rPr>
+    </w:lvl>
+    <w:lvl w:ilvl="6" w:tplc="040C0001" w:tentative="1">
+      <w:start w:val="1"/>
+      <w:numFmt w:val="bullet"/>
+      <w:lvlText w:val=""/>
+      <w:lvlJc w:val="left"/>
+      <w:pPr>
+        <w:ind w:left="5040" w:hanging="360"/>
+      </w:pPr>
+      <w:rPr>
+        <w:rFonts w:ascii="Symbol" w:hAnsi="Symbol" w:hint="default"/>
+      </w:rPr>
+    </w:lvl>
+    <w:lvl w:ilvl="7" w:tplc="040C0003" w:tentative="1">
+      <w:start w:val="1"/>
+      <w:numFmt w:val="bullet"/>
+      <w:lvlText w:val="o"/>
+      <w:lvlJc w:val="left"/>
+      <w:pPr>
+        <w:ind w:left="5760" w:hanging="360"/>
+      </w:pPr>
+      <w:rPr>
+        <w:rFonts w:ascii="Courier New" w:hAnsi="Courier New" w:cs="Courier New" w:hint="default"/>
+      </w:rPr>
+    </w:lvl>
+    <w:lvl w:ilvl="8" w:tplc="040C0005" w:tentative="1">
+      <w:start w:val="1"/>
+      <w:numFmt w:val="bullet"/>
+      <w:lvlText w:val=""/>
+      <w:lvlJc w:val="left"/>
+      <w:pPr>
+        <w:ind w:left="6480" w:hanging="360"/>
+      </w:pPr>
+      <w:rPr>
+        <w:rFonts w:ascii="Wingdings" w:hAnsi="Wingdings" w:hint="default"/>
+      </w:rPr>
+    </w:lvl>
+  </w:abstractNum>
+  <w:abstractNum w:abstractNumId="10" w15:restartNumberingAfterBreak="0">
+    <w:nsid w:val="41B57D60"/>
+    <w:multiLevelType w:val="hybridMultilevel"/>
+    <w:tmpl w:val="210405A2"/>
+    <w:lvl w:ilvl="0" w:tplc="040C0001">
+      <w:start w:val="1"/>
+      <w:numFmt w:val="bullet"/>
+      <w:lvlText w:val=""/>
+      <w:lvlJc w:val="left"/>
+      <w:pPr>
+        <w:ind w:left="720" w:hanging="360"/>
+      </w:pPr>
+      <w:rPr>
+        <w:rFonts w:ascii="Symbol" w:hAnsi="Symbol" w:hint="default"/>
+      </w:rPr>
+    </w:lvl>
+    <w:lvl w:ilvl="1" w:tplc="040C0003" w:tentative="1">
+      <w:start w:val="1"/>
+      <w:numFmt w:val="bullet"/>
+      <w:lvlText w:val="o"/>
+      <w:lvlJc w:val="left"/>
+      <w:pPr>
+        <w:ind w:left="1440" w:hanging="360"/>
+      </w:pPr>
+      <w:rPr>
+        <w:rFonts w:ascii="Courier New" w:hAnsi="Courier New" w:cs="Courier New" w:hint="default"/>
+      </w:rPr>
+    </w:lvl>
+    <w:lvl w:ilvl="2" w:tplc="040C0005" w:tentative="1">
+      <w:start w:val="1"/>
+      <w:numFmt w:val="bullet"/>
+      <w:lvlText w:val=""/>
+      <w:lvlJc w:val="left"/>
+      <w:pPr>
+        <w:ind w:left="2160" w:hanging="360"/>
+      </w:pPr>
+      <w:rPr>
+        <w:rFonts w:ascii="Wingdings" w:hAnsi="Wingdings" w:hint="default"/>
+      </w:rPr>
+    </w:lvl>
+    <w:lvl w:ilvl="3" w:tplc="040C0001" w:tentative="1">
+      <w:start w:val="1"/>
+      <w:numFmt w:val="bullet"/>
+      <w:lvlText w:val=""/>
+      <w:lvlJc w:val="left"/>
+      <w:pPr>
+        <w:ind w:left="2880" w:hanging="360"/>
+      </w:pPr>
+      <w:rPr>
+        <w:rFonts w:ascii="Symbol" w:hAnsi="Symbol" w:hint="default"/>
+      </w:rPr>
+    </w:lvl>
+    <w:lvl w:ilvl="4" w:tplc="040C0003" w:tentative="1">
+      <w:start w:val="1"/>
+      <w:numFmt w:val="bullet"/>
+      <w:lvlText w:val="o"/>
+      <w:lvlJc w:val="left"/>
+      <w:pPr>
+        <w:ind w:left="3600" w:hanging="360"/>
+      </w:pPr>
+      <w:rPr>
+        <w:rFonts w:ascii="Courier New" w:hAnsi="Courier New" w:cs="Courier New" w:hint="default"/>
+      </w:rPr>
+    </w:lvl>
+    <w:lvl w:ilvl="5" w:tplc="040C0005" w:tentative="1">
+      <w:start w:val="1"/>
+      <w:numFmt w:val="bullet"/>
+      <w:lvlText w:val=""/>
+      <w:lvlJc w:val="left"/>
+      <w:pPr>
+        <w:ind w:left="4320" w:hanging="360"/>
+      </w:pPr>
+      <w:rPr>
+        <w:rFonts w:ascii="Wingdings" w:hAnsi="Wingdings" w:hint="default"/>
+      </w:rPr>
+    </w:lvl>
+    <w:lvl w:ilvl="6" w:tplc="040C0001" w:tentative="1">
+      <w:start w:val="1"/>
+      <w:numFmt w:val="bullet"/>
+      <w:lvlText w:val=""/>
+      <w:lvlJc w:val="left"/>
+      <w:pPr>
+        <w:ind w:left="5040" w:hanging="360"/>
+      </w:pPr>
+      <w:rPr>
+        <w:rFonts w:ascii="Symbol" w:hAnsi="Symbol" w:hint="default"/>
+      </w:rPr>
+    </w:lvl>
+    <w:lvl w:ilvl="7" w:tplc="040C0003" w:tentative="1">
+      <w:start w:val="1"/>
+      <w:numFmt w:val="bullet"/>
+      <w:lvlText w:val="o"/>
+      <w:lvlJc w:val="left"/>
+      <w:pPr>
+        <w:ind w:left="5760" w:hanging="360"/>
+      </w:pPr>
+      <w:rPr>
+        <w:rFonts w:ascii="Courier New" w:hAnsi="Courier New" w:cs="Courier New" w:hint="default"/>
+      </w:rPr>
+    </w:lvl>
+    <w:lvl w:ilvl="8" w:tplc="040C0005" w:tentative="1">
+      <w:start w:val="1"/>
+      <w:numFmt w:val="bullet"/>
+      <w:lvlText w:val=""/>
+      <w:lvlJc w:val="left"/>
+      <w:pPr>
+        <w:ind w:left="6480" w:hanging="360"/>
+      </w:pPr>
+      <w:rPr>
+        <w:rFonts w:ascii="Wingdings" w:hAnsi="Wingdings" w:hint="default"/>
+      </w:rPr>
+    </w:lvl>
+  </w:abstractNum>
+  <w:abstractNum w:abstractNumId="11" w15:restartNumberingAfterBreak="0">
     <w:nsid w:val="4845549C"/>
     <w:multiLevelType w:val="hybridMultilevel"/>
     <w:tmpl w:val="81762F32"/>
@@ -9581,7 +10358,7 @@
       </w:rPr>
     </w:lvl>
   </w:abstractNum>
-  <w:abstractNum w:abstractNumId="10" w15:restartNumberingAfterBreak="0">
+  <w:abstractNum w:abstractNumId="12" w15:restartNumberingAfterBreak="0">
     <w:nsid w:val="5CE201C5"/>
     <w:multiLevelType w:val="hybridMultilevel"/>
     <w:tmpl w:val="849848D8"/>
@@ -9670,7 +10447,7 @@
       </w:pPr>
     </w:lvl>
   </w:abstractNum>
-  <w:abstractNum w:abstractNumId="11" w15:restartNumberingAfterBreak="0">
+  <w:abstractNum w:abstractNumId="13" w15:restartNumberingAfterBreak="0">
     <w:nsid w:val="5E0B23B2"/>
     <w:multiLevelType w:val="hybridMultilevel"/>
     <w:tmpl w:val="42507AA4"/>
@@ -9756,7 +10533,7 @@
       </w:pPr>
     </w:lvl>
   </w:abstractNum>
-  <w:abstractNum w:abstractNumId="12" w15:restartNumberingAfterBreak="0">
+  <w:abstractNum w:abstractNumId="14" w15:restartNumberingAfterBreak="0">
     <w:nsid w:val="7EC51315"/>
     <w:multiLevelType w:val="hybridMultilevel"/>
     <w:tmpl w:val="7952CE38"/>
@@ -9855,13 +10632,13 @@
     <w:abstractNumId w:val="7"/>
   </w:num>
   <w:num w:numId="4">
-    <w:abstractNumId w:val="12"/>
+    <w:abstractNumId w:val="14"/>
   </w:num>
   <w:num w:numId="5">
     <w:abstractNumId w:val="6"/>
   </w:num>
   <w:num w:numId="6">
-    <w:abstractNumId w:val="11"/>
+    <w:abstractNumId w:val="13"/>
   </w:num>
   <w:num w:numId="7">
     <w:abstractNumId w:val="0"/>
@@ -9870,19 +10647,25 @@
     <w:abstractNumId w:val="1"/>
   </w:num>
   <w:num w:numId="9">
-    <w:abstractNumId w:val="10"/>
+    <w:abstractNumId w:val="12"/>
   </w:num>
   <w:num w:numId="10">
     <w:abstractNumId w:val="4"/>
   </w:num>
   <w:num w:numId="11">
-    <w:abstractNumId w:val="9"/>
+    <w:abstractNumId w:val="11"/>
   </w:num>
   <w:num w:numId="12">
     <w:abstractNumId w:val="2"/>
   </w:num>
   <w:num w:numId="13">
     <w:abstractNumId w:val="5"/>
+  </w:num>
+  <w:num w:numId="14">
+    <w:abstractNumId w:val="9"/>
+  </w:num>
+  <w:num w:numId="15">
+    <w:abstractNumId w:val="10"/>
   </w:num>
 </w:numbering>
 </file>

</xml_diff>

<commit_message>
Partie 6 question 1
</commit_message>
<xml_diff>
--- a/ai-business_assistant.docx
+++ b/ai-business_assistant.docx
@@ -9088,8 +9088,1453 @@
     </w:p>
     <w:p>
       <w:pPr>
-        <w:pStyle w:val="PrformatHTML"/>
-        <w:ind w:left="360"/>
+        <w:rPr>
+          <w:rFonts w:ascii="Times New Roman" w:hAnsi="Times New Roman" w:cs="Times New Roman"/>
+          <w:sz w:val="36"/>
+          <w:szCs w:val="36"/>
+        </w:rPr>
+      </w:pPr>
+      <w:r>
+        <w:rPr>
+          <w:rFonts w:ascii="Times New Roman" w:hAnsi="Times New Roman" w:cs="Times New Roman"/>
+          <w:sz w:val="36"/>
+          <w:szCs w:val="36"/>
+        </w:rPr>
+        <w:t xml:space="preserve">Partie 6 </w:t>
+      </w:r>
+      <w:r>
+        <w:rPr>
+          <w:rFonts w:ascii="Times New Roman" w:hAnsi="Times New Roman" w:cs="Times New Roman"/>
+          <w:sz w:val="36"/>
+          <w:szCs w:val="36"/>
+        </w:rPr>
+        <w:t xml:space="preserve">: </w:t>
+      </w:r>
+      <w:r>
+        <w:rPr>
+          <w:rFonts w:ascii="Times New Roman" w:hAnsi="Times New Roman" w:cs="Times New Roman"/>
+          <w:sz w:val="36"/>
+          <w:szCs w:val="36"/>
+        </w:rPr>
+        <w:t>Prompt Engineering pour le Machine Learning</w:t>
+      </w:r>
+    </w:p>
+    <w:p>
+      <w:pPr>
+        <w:pStyle w:val="NormalWeb"/>
+      </w:pPr>
+      <w:r>
+        <w:t xml:space="preserve">Les prompts ci-dessous s'appuient sur le dataset des capteurs IoT </w:t>
+      </w:r>
+      <w:r>
+        <w:t>le dataset mesure_capteure.csv</w:t>
+      </w:r>
+    </w:p>
+    <w:p>
+      <w:pPr>
+        <w:pStyle w:val="Titre2"/>
+        <w:rPr>
+          <w:sz w:val="28"/>
+          <w:szCs w:val="28"/>
+        </w:rPr>
+      </w:pPr>
+      <w:r>
+        <w:rPr>
+          <w:sz w:val="28"/>
+          <w:szCs w:val="28"/>
+        </w:rPr>
+        <w:t>1) Stratégies de traitement des données</w:t>
+      </w:r>
+    </w:p>
+    <w:p>
+      <w:pPr>
+        <w:pStyle w:val="PrformatHTML"/>
+        <w:rPr>
+          <w:rStyle w:val="CodeHTML"/>
+          <w:rFonts w:ascii="Times New Roman" w:hAnsi="Times New Roman" w:cs="Times New Roman"/>
+          <w:sz w:val="24"/>
+          <w:szCs w:val="24"/>
+        </w:rPr>
+      </w:pPr>
+      <w:r>
+        <w:rPr>
+          <w:rStyle w:val="CodeHTML"/>
+          <w:rFonts w:ascii="Times New Roman" w:hAnsi="Times New Roman" w:cs="Times New Roman"/>
+          <w:sz w:val="24"/>
+          <w:szCs w:val="24"/>
+        </w:rPr>
+        <w:t xml:space="preserve">Rôle : </w:t>
+      </w:r>
+      <w:r>
+        <w:rPr>
+          <w:rStyle w:val="CodeHTML"/>
+          <w:rFonts w:ascii="Times New Roman" w:hAnsi="Times New Roman" w:cs="Times New Roman"/>
+          <w:sz w:val="24"/>
+          <w:szCs w:val="24"/>
+        </w:rPr>
+        <w:t xml:space="preserve">Tu es un data </w:t>
+      </w:r>
+      <w:proofErr w:type="spellStart"/>
+      <w:r>
+        <w:rPr>
+          <w:rStyle w:val="CodeHTML"/>
+          <w:rFonts w:ascii="Times New Roman" w:hAnsi="Times New Roman" w:cs="Times New Roman"/>
+          <w:sz w:val="24"/>
+          <w:szCs w:val="24"/>
+        </w:rPr>
+        <w:t>scientist</w:t>
+      </w:r>
+      <w:proofErr w:type="spellEnd"/>
+      <w:r>
+        <w:rPr>
+          <w:rStyle w:val="CodeHTML"/>
+          <w:rFonts w:ascii="Times New Roman" w:hAnsi="Times New Roman" w:cs="Times New Roman"/>
+          <w:sz w:val="24"/>
+          <w:szCs w:val="24"/>
+        </w:rPr>
+        <w:t xml:space="preserve"> expérimenté.</w:t>
+      </w:r>
+    </w:p>
+    <w:p>
+      <w:pPr>
+        <w:pStyle w:val="PrformatHTML"/>
+        <w:rPr>
+          <w:rStyle w:val="CodeHTML"/>
+          <w:rFonts w:ascii="Times New Roman" w:hAnsi="Times New Roman" w:cs="Times New Roman"/>
+          <w:sz w:val="24"/>
+          <w:szCs w:val="24"/>
+        </w:rPr>
+      </w:pPr>
+    </w:p>
+    <w:p>
+      <w:pPr>
+        <w:pStyle w:val="PrformatHTML"/>
+        <w:rPr>
+          <w:rStyle w:val="CodeHTML"/>
+          <w:rFonts w:ascii="Times New Roman" w:hAnsi="Times New Roman" w:cs="Times New Roman"/>
+          <w:sz w:val="24"/>
+          <w:szCs w:val="24"/>
+        </w:rPr>
+      </w:pPr>
+      <w:r>
+        <w:rPr>
+          <w:rStyle w:val="CodeHTML"/>
+          <w:rFonts w:ascii="Times New Roman" w:hAnsi="Times New Roman" w:cs="Times New Roman"/>
+          <w:sz w:val="24"/>
+          <w:szCs w:val="24"/>
+        </w:rPr>
+        <w:t>Contexte : Voici la description du dataset de capteurs IoT que j'utilise :</w:t>
+      </w:r>
+      <w:r>
+        <w:rPr>
+          <w:rStyle w:val="CodeHTML"/>
+          <w:rFonts w:ascii="Times New Roman" w:hAnsi="Times New Roman" w:cs="Times New Roman"/>
+          <w:sz w:val="24"/>
+          <w:szCs w:val="24"/>
+        </w:rPr>
+        <w:t xml:space="preserve"> </w:t>
+      </w:r>
+    </w:p>
+    <w:p>
+      <w:pPr>
+        <w:spacing w:after="0" w:line="240" w:lineRule="auto"/>
+        <w:rPr>
+          <w:rFonts w:ascii="Consolas" w:eastAsia="Times New Roman" w:hAnsi="Consolas" w:cs="Times New Roman"/>
+          <w:sz w:val="24"/>
+          <w:szCs w:val="24"/>
+          <w:lang w:val="en-US" w:eastAsia="fr-FR"/>
+        </w:rPr>
+      </w:pPr>
+      <w:r>
+        <w:rPr>
+          <w:rFonts w:ascii="Consolas" w:eastAsia="Times New Roman" w:hAnsi="Consolas" w:cs="Times New Roman"/>
+          <w:sz w:val="24"/>
+          <w:szCs w:val="24"/>
+          <w:lang w:val="en-US" w:eastAsia="fr-FR"/>
+        </w:rPr>
+        <w:t>&lt;class '</w:t>
+      </w:r>
+      <w:proofErr w:type="spellStart"/>
+      <w:proofErr w:type="gramStart"/>
+      <w:r>
+        <w:rPr>
+          <w:rFonts w:ascii="Consolas" w:eastAsia="Times New Roman" w:hAnsi="Consolas" w:cs="Times New Roman"/>
+          <w:sz w:val="24"/>
+          <w:szCs w:val="24"/>
+          <w:lang w:val="en-US" w:eastAsia="fr-FR"/>
+        </w:rPr>
+        <w:t>pandas.DataFrame</w:t>
+      </w:r>
+      <w:proofErr w:type="spellEnd"/>
+      <w:proofErr w:type="gramEnd"/>
+      <w:r>
+        <w:rPr>
+          <w:rFonts w:ascii="Consolas" w:eastAsia="Times New Roman" w:hAnsi="Consolas" w:cs="Times New Roman"/>
+          <w:sz w:val="24"/>
+          <w:szCs w:val="24"/>
+          <w:lang w:val="en-US" w:eastAsia="fr-FR"/>
+        </w:rPr>
+        <w:t>'&gt;</w:t>
+      </w:r>
+    </w:p>
+    <w:p>
+      <w:pPr>
+        <w:spacing w:after="0" w:line="240" w:lineRule="auto"/>
+        <w:rPr>
+          <w:rFonts w:ascii="Consolas" w:eastAsia="Times New Roman" w:hAnsi="Consolas" w:cs="Times New Roman"/>
+          <w:sz w:val="24"/>
+          <w:szCs w:val="24"/>
+          <w:lang w:val="en-US" w:eastAsia="fr-FR"/>
+        </w:rPr>
+      </w:pPr>
+      <w:proofErr w:type="spellStart"/>
+      <w:r>
+        <w:rPr>
+          <w:rFonts w:ascii="Consolas" w:eastAsia="Times New Roman" w:hAnsi="Consolas" w:cs="Times New Roman"/>
+          <w:sz w:val="24"/>
+          <w:szCs w:val="24"/>
+          <w:lang w:val="en-US" w:eastAsia="fr-FR"/>
+        </w:rPr>
+        <w:t>RangeIndex</w:t>
+      </w:r>
+      <w:proofErr w:type="spellEnd"/>
+      <w:r>
+        <w:rPr>
+          <w:rFonts w:ascii="Consolas" w:eastAsia="Times New Roman" w:hAnsi="Consolas" w:cs="Times New Roman"/>
+          <w:sz w:val="24"/>
+          <w:szCs w:val="24"/>
+          <w:lang w:val="en-US" w:eastAsia="fr-FR"/>
+        </w:rPr>
+        <w:t>: 596 entries, 0 to 595</w:t>
+      </w:r>
+    </w:p>
+    <w:p>
+      <w:pPr>
+        <w:spacing w:after="0" w:line="240" w:lineRule="auto"/>
+        <w:rPr>
+          <w:rFonts w:ascii="Consolas" w:eastAsia="Times New Roman" w:hAnsi="Consolas" w:cs="Times New Roman"/>
+          <w:sz w:val="24"/>
+          <w:szCs w:val="24"/>
+          <w:lang w:val="en-US" w:eastAsia="fr-FR"/>
+        </w:rPr>
+      </w:pPr>
+      <w:r>
+        <w:rPr>
+          <w:rFonts w:ascii="Consolas" w:eastAsia="Times New Roman" w:hAnsi="Consolas" w:cs="Times New Roman"/>
+          <w:sz w:val="24"/>
+          <w:szCs w:val="24"/>
+          <w:lang w:val="en-US" w:eastAsia="fr-FR"/>
+        </w:rPr>
+        <w:t>Data columns (total 9 columns):</w:t>
+      </w:r>
+    </w:p>
+    <w:p>
+      <w:pPr>
+        <w:spacing w:after="0" w:line="240" w:lineRule="auto"/>
+        <w:rPr>
+          <w:rFonts w:ascii="Consolas" w:eastAsia="Times New Roman" w:hAnsi="Consolas" w:cs="Times New Roman"/>
+          <w:sz w:val="24"/>
+          <w:szCs w:val="24"/>
+          <w:lang w:val="en-US" w:eastAsia="fr-FR"/>
+        </w:rPr>
+      </w:pPr>
+      <w:r>
+        <w:rPr>
+          <w:rFonts w:ascii="Consolas" w:eastAsia="Times New Roman" w:hAnsi="Consolas" w:cs="Times New Roman"/>
+          <w:sz w:val="24"/>
+          <w:szCs w:val="24"/>
+          <w:lang w:val="en-US" w:eastAsia="fr-FR"/>
+        </w:rPr>
+        <w:t xml:space="preserve"> #   Column        Non-Null </w:t>
+      </w:r>
+      <w:proofErr w:type="gramStart"/>
+      <w:r>
+        <w:rPr>
+          <w:rFonts w:ascii="Consolas" w:eastAsia="Times New Roman" w:hAnsi="Consolas" w:cs="Times New Roman"/>
+          <w:sz w:val="24"/>
+          <w:szCs w:val="24"/>
+          <w:lang w:val="en-US" w:eastAsia="fr-FR"/>
+        </w:rPr>
+        <w:t xml:space="preserve">Count  </w:t>
+      </w:r>
+      <w:proofErr w:type="spellStart"/>
+      <w:r>
+        <w:rPr>
+          <w:rFonts w:ascii="Consolas" w:eastAsia="Times New Roman" w:hAnsi="Consolas" w:cs="Times New Roman"/>
+          <w:sz w:val="24"/>
+          <w:szCs w:val="24"/>
+          <w:lang w:val="en-US" w:eastAsia="fr-FR"/>
+        </w:rPr>
+        <w:t>Dtype</w:t>
+      </w:r>
+      <w:proofErr w:type="spellEnd"/>
+      <w:proofErr w:type="gramEnd"/>
+      <w:r>
+        <w:rPr>
+          <w:rFonts w:ascii="Consolas" w:eastAsia="Times New Roman" w:hAnsi="Consolas" w:cs="Times New Roman"/>
+          <w:sz w:val="24"/>
+          <w:szCs w:val="24"/>
+          <w:lang w:val="en-US" w:eastAsia="fr-FR"/>
+        </w:rPr>
+        <w:t xml:space="preserve">  </w:t>
+      </w:r>
+    </w:p>
+    <w:p>
+      <w:pPr>
+        <w:spacing w:after="0" w:line="240" w:lineRule="auto"/>
+        <w:rPr>
+          <w:rFonts w:ascii="Consolas" w:eastAsia="Times New Roman" w:hAnsi="Consolas" w:cs="Times New Roman"/>
+          <w:sz w:val="24"/>
+          <w:szCs w:val="24"/>
+          <w:lang w:eastAsia="fr-FR"/>
+        </w:rPr>
+      </w:pPr>
+      <w:r>
+        <w:rPr>
+          <w:rFonts w:ascii="Consolas" w:eastAsia="Times New Roman" w:hAnsi="Consolas" w:cs="Times New Roman"/>
+          <w:sz w:val="24"/>
+          <w:szCs w:val="24"/>
+          <w:lang w:eastAsia="fr-FR"/>
+        </w:rPr>
+        <w:t xml:space="preserve">---  ------        --------------  -----  </w:t>
+      </w:r>
+    </w:p>
+    <w:p>
+      <w:pPr>
+        <w:spacing w:after="0" w:line="240" w:lineRule="auto"/>
+        <w:rPr>
+          <w:rFonts w:ascii="Consolas" w:eastAsia="Times New Roman" w:hAnsi="Consolas" w:cs="Times New Roman"/>
+          <w:sz w:val="24"/>
+          <w:szCs w:val="24"/>
+          <w:lang w:eastAsia="fr-FR"/>
+        </w:rPr>
+      </w:pPr>
+      <w:r>
+        <w:rPr>
+          <w:rFonts w:ascii="Consolas" w:eastAsia="Times New Roman" w:hAnsi="Consolas" w:cs="Times New Roman"/>
+          <w:sz w:val="24"/>
+          <w:szCs w:val="24"/>
+          <w:lang w:eastAsia="fr-FR"/>
+        </w:rPr>
+        <w:t xml:space="preserve"> 0   </w:t>
+      </w:r>
+      <w:proofErr w:type="spellStart"/>
+      <w:r>
+        <w:rPr>
+          <w:rFonts w:ascii="Consolas" w:eastAsia="Times New Roman" w:hAnsi="Consolas" w:cs="Times New Roman"/>
+          <w:sz w:val="24"/>
+          <w:szCs w:val="24"/>
+          <w:lang w:eastAsia="fr-FR"/>
+        </w:rPr>
+        <w:t>id_mesure</w:t>
+      </w:r>
+      <w:proofErr w:type="spellEnd"/>
+      <w:r>
+        <w:rPr>
+          <w:rFonts w:ascii="Consolas" w:eastAsia="Times New Roman" w:hAnsi="Consolas" w:cs="Times New Roman"/>
+          <w:sz w:val="24"/>
+          <w:szCs w:val="24"/>
+          <w:lang w:eastAsia="fr-FR"/>
+        </w:rPr>
+        <w:t xml:space="preserve">     596 non-</w:t>
+      </w:r>
+      <w:proofErr w:type="spellStart"/>
+      <w:r>
+        <w:rPr>
+          <w:rFonts w:ascii="Consolas" w:eastAsia="Times New Roman" w:hAnsi="Consolas" w:cs="Times New Roman"/>
+          <w:sz w:val="24"/>
+          <w:szCs w:val="24"/>
+          <w:lang w:eastAsia="fr-FR"/>
+        </w:rPr>
+        <w:t>null</w:t>
+      </w:r>
+      <w:proofErr w:type="spellEnd"/>
+      <w:r>
+        <w:rPr>
+          <w:rFonts w:ascii="Consolas" w:eastAsia="Times New Roman" w:hAnsi="Consolas" w:cs="Times New Roman"/>
+          <w:sz w:val="24"/>
+          <w:szCs w:val="24"/>
+          <w:lang w:eastAsia="fr-FR"/>
+        </w:rPr>
+        <w:t xml:space="preserve">    </w:t>
+      </w:r>
+      <w:proofErr w:type="spellStart"/>
+      <w:r>
+        <w:rPr>
+          <w:rFonts w:ascii="Consolas" w:eastAsia="Times New Roman" w:hAnsi="Consolas" w:cs="Times New Roman"/>
+          <w:sz w:val="24"/>
+          <w:szCs w:val="24"/>
+          <w:lang w:eastAsia="fr-FR"/>
+        </w:rPr>
+        <w:t>str</w:t>
+      </w:r>
+      <w:proofErr w:type="spellEnd"/>
+      <w:r>
+        <w:rPr>
+          <w:rFonts w:ascii="Consolas" w:eastAsia="Times New Roman" w:hAnsi="Consolas" w:cs="Times New Roman"/>
+          <w:sz w:val="24"/>
+          <w:szCs w:val="24"/>
+          <w:lang w:eastAsia="fr-FR"/>
+        </w:rPr>
+        <w:t xml:space="preserve">    </w:t>
+      </w:r>
+    </w:p>
+    <w:p>
+      <w:pPr>
+        <w:spacing w:after="0" w:line="240" w:lineRule="auto"/>
+        <w:rPr>
+          <w:rFonts w:ascii="Consolas" w:eastAsia="Times New Roman" w:hAnsi="Consolas" w:cs="Times New Roman"/>
+          <w:sz w:val="24"/>
+          <w:szCs w:val="24"/>
+          <w:lang w:eastAsia="fr-FR"/>
+        </w:rPr>
+      </w:pPr>
+      <w:r>
+        <w:rPr>
+          <w:rFonts w:ascii="Consolas" w:eastAsia="Times New Roman" w:hAnsi="Consolas" w:cs="Times New Roman"/>
+          <w:sz w:val="24"/>
+          <w:szCs w:val="24"/>
+          <w:lang w:eastAsia="fr-FR"/>
+        </w:rPr>
+        <w:t xml:space="preserve"> 1   </w:t>
+      </w:r>
+      <w:proofErr w:type="spellStart"/>
+      <w:r>
+        <w:rPr>
+          <w:rFonts w:ascii="Consolas" w:eastAsia="Times New Roman" w:hAnsi="Consolas" w:cs="Times New Roman"/>
+          <w:sz w:val="24"/>
+          <w:szCs w:val="24"/>
+          <w:lang w:eastAsia="fr-FR"/>
+        </w:rPr>
+        <w:t>date_heure</w:t>
+      </w:r>
+      <w:proofErr w:type="spellEnd"/>
+      <w:r>
+        <w:rPr>
+          <w:rFonts w:ascii="Consolas" w:eastAsia="Times New Roman" w:hAnsi="Consolas" w:cs="Times New Roman"/>
+          <w:sz w:val="24"/>
+          <w:szCs w:val="24"/>
+          <w:lang w:eastAsia="fr-FR"/>
+        </w:rPr>
+        <w:t xml:space="preserve">    596 non-</w:t>
+      </w:r>
+      <w:proofErr w:type="spellStart"/>
+      <w:r>
+        <w:rPr>
+          <w:rFonts w:ascii="Consolas" w:eastAsia="Times New Roman" w:hAnsi="Consolas" w:cs="Times New Roman"/>
+          <w:sz w:val="24"/>
+          <w:szCs w:val="24"/>
+          <w:lang w:eastAsia="fr-FR"/>
+        </w:rPr>
+        <w:t>null</w:t>
+      </w:r>
+      <w:proofErr w:type="spellEnd"/>
+      <w:r>
+        <w:rPr>
+          <w:rFonts w:ascii="Consolas" w:eastAsia="Times New Roman" w:hAnsi="Consolas" w:cs="Times New Roman"/>
+          <w:sz w:val="24"/>
+          <w:szCs w:val="24"/>
+          <w:lang w:eastAsia="fr-FR"/>
+        </w:rPr>
+        <w:t xml:space="preserve">    </w:t>
+      </w:r>
+      <w:proofErr w:type="spellStart"/>
+      <w:r>
+        <w:rPr>
+          <w:rFonts w:ascii="Consolas" w:eastAsia="Times New Roman" w:hAnsi="Consolas" w:cs="Times New Roman"/>
+          <w:sz w:val="24"/>
+          <w:szCs w:val="24"/>
+          <w:lang w:eastAsia="fr-FR"/>
+        </w:rPr>
+        <w:t>str</w:t>
+      </w:r>
+      <w:proofErr w:type="spellEnd"/>
+      <w:r>
+        <w:rPr>
+          <w:rFonts w:ascii="Consolas" w:eastAsia="Times New Roman" w:hAnsi="Consolas" w:cs="Times New Roman"/>
+          <w:sz w:val="24"/>
+          <w:szCs w:val="24"/>
+          <w:lang w:eastAsia="fr-FR"/>
+        </w:rPr>
+        <w:t xml:space="preserve">    </w:t>
+      </w:r>
+    </w:p>
+    <w:p>
+      <w:pPr>
+        <w:spacing w:after="0" w:line="240" w:lineRule="auto"/>
+        <w:rPr>
+          <w:rFonts w:ascii="Consolas" w:eastAsia="Times New Roman" w:hAnsi="Consolas" w:cs="Times New Roman"/>
+          <w:sz w:val="24"/>
+          <w:szCs w:val="24"/>
+          <w:lang w:eastAsia="fr-FR"/>
+        </w:rPr>
+      </w:pPr>
+      <w:r>
+        <w:rPr>
+          <w:rFonts w:ascii="Consolas" w:eastAsia="Times New Roman" w:hAnsi="Consolas" w:cs="Times New Roman"/>
+          <w:sz w:val="24"/>
+          <w:szCs w:val="24"/>
+          <w:lang w:eastAsia="fr-FR"/>
+        </w:rPr>
+        <w:t xml:space="preserve"> 2   </w:t>
+      </w:r>
+      <w:proofErr w:type="spellStart"/>
+      <w:r>
+        <w:rPr>
+          <w:rFonts w:ascii="Consolas" w:eastAsia="Times New Roman" w:hAnsi="Consolas" w:cs="Times New Roman"/>
+          <w:sz w:val="24"/>
+          <w:szCs w:val="24"/>
+          <w:lang w:eastAsia="fr-FR"/>
+        </w:rPr>
+        <w:t>id_capteur</w:t>
+      </w:r>
+      <w:proofErr w:type="spellEnd"/>
+      <w:r>
+        <w:rPr>
+          <w:rFonts w:ascii="Consolas" w:eastAsia="Times New Roman" w:hAnsi="Consolas" w:cs="Times New Roman"/>
+          <w:sz w:val="24"/>
+          <w:szCs w:val="24"/>
+          <w:lang w:eastAsia="fr-FR"/>
+        </w:rPr>
+        <w:t xml:space="preserve">    596 non-</w:t>
+      </w:r>
+      <w:proofErr w:type="spellStart"/>
+      <w:r>
+        <w:rPr>
+          <w:rFonts w:ascii="Consolas" w:eastAsia="Times New Roman" w:hAnsi="Consolas" w:cs="Times New Roman"/>
+          <w:sz w:val="24"/>
+          <w:szCs w:val="24"/>
+          <w:lang w:eastAsia="fr-FR"/>
+        </w:rPr>
+        <w:t>null</w:t>
+      </w:r>
+      <w:proofErr w:type="spellEnd"/>
+      <w:r>
+        <w:rPr>
+          <w:rFonts w:ascii="Consolas" w:eastAsia="Times New Roman" w:hAnsi="Consolas" w:cs="Times New Roman"/>
+          <w:sz w:val="24"/>
+          <w:szCs w:val="24"/>
+          <w:lang w:eastAsia="fr-FR"/>
+        </w:rPr>
+        <w:t xml:space="preserve">    </w:t>
+      </w:r>
+      <w:proofErr w:type="spellStart"/>
+      <w:r>
+        <w:rPr>
+          <w:rFonts w:ascii="Consolas" w:eastAsia="Times New Roman" w:hAnsi="Consolas" w:cs="Times New Roman"/>
+          <w:sz w:val="24"/>
+          <w:szCs w:val="24"/>
+          <w:lang w:eastAsia="fr-FR"/>
+        </w:rPr>
+        <w:t>str</w:t>
+      </w:r>
+      <w:proofErr w:type="spellEnd"/>
+      <w:r>
+        <w:rPr>
+          <w:rFonts w:ascii="Consolas" w:eastAsia="Times New Roman" w:hAnsi="Consolas" w:cs="Times New Roman"/>
+          <w:sz w:val="24"/>
+          <w:szCs w:val="24"/>
+          <w:lang w:eastAsia="fr-FR"/>
+        </w:rPr>
+        <w:t xml:space="preserve">    </w:t>
+      </w:r>
+    </w:p>
+    <w:p>
+      <w:pPr>
+        <w:spacing w:after="0" w:line="240" w:lineRule="auto"/>
+        <w:rPr>
+          <w:rFonts w:ascii="Consolas" w:eastAsia="Times New Roman" w:hAnsi="Consolas" w:cs="Times New Roman"/>
+          <w:sz w:val="24"/>
+          <w:szCs w:val="24"/>
+          <w:lang w:eastAsia="fr-FR"/>
+        </w:rPr>
+      </w:pPr>
+      <w:r>
+        <w:rPr>
+          <w:rFonts w:ascii="Consolas" w:eastAsia="Times New Roman" w:hAnsi="Consolas" w:cs="Times New Roman"/>
+          <w:sz w:val="24"/>
+          <w:szCs w:val="24"/>
+          <w:lang w:eastAsia="fr-FR"/>
+        </w:rPr>
+        <w:t xml:space="preserve"> 3   </w:t>
+      </w:r>
+      <w:proofErr w:type="spellStart"/>
+      <w:r>
+        <w:rPr>
+          <w:rFonts w:ascii="Consolas" w:eastAsia="Times New Roman" w:hAnsi="Consolas" w:cs="Times New Roman"/>
+          <w:sz w:val="24"/>
+          <w:szCs w:val="24"/>
+          <w:lang w:eastAsia="fr-FR"/>
+        </w:rPr>
+        <w:t>batiment</w:t>
+      </w:r>
+      <w:proofErr w:type="spellEnd"/>
+      <w:r>
+        <w:rPr>
+          <w:rFonts w:ascii="Consolas" w:eastAsia="Times New Roman" w:hAnsi="Consolas" w:cs="Times New Roman"/>
+          <w:sz w:val="24"/>
+          <w:szCs w:val="24"/>
+          <w:lang w:eastAsia="fr-FR"/>
+        </w:rPr>
+        <w:t xml:space="preserve">      596 non-</w:t>
+      </w:r>
+      <w:proofErr w:type="spellStart"/>
+      <w:r>
+        <w:rPr>
+          <w:rFonts w:ascii="Consolas" w:eastAsia="Times New Roman" w:hAnsi="Consolas" w:cs="Times New Roman"/>
+          <w:sz w:val="24"/>
+          <w:szCs w:val="24"/>
+          <w:lang w:eastAsia="fr-FR"/>
+        </w:rPr>
+        <w:t>null</w:t>
+      </w:r>
+      <w:proofErr w:type="spellEnd"/>
+      <w:r>
+        <w:rPr>
+          <w:rFonts w:ascii="Consolas" w:eastAsia="Times New Roman" w:hAnsi="Consolas" w:cs="Times New Roman"/>
+          <w:sz w:val="24"/>
+          <w:szCs w:val="24"/>
+          <w:lang w:eastAsia="fr-FR"/>
+        </w:rPr>
+        <w:t xml:space="preserve">    </w:t>
+      </w:r>
+      <w:proofErr w:type="spellStart"/>
+      <w:r>
+        <w:rPr>
+          <w:rFonts w:ascii="Consolas" w:eastAsia="Times New Roman" w:hAnsi="Consolas" w:cs="Times New Roman"/>
+          <w:sz w:val="24"/>
+          <w:szCs w:val="24"/>
+          <w:lang w:eastAsia="fr-FR"/>
+        </w:rPr>
+        <w:t>str</w:t>
+      </w:r>
+      <w:proofErr w:type="spellEnd"/>
+      <w:r>
+        <w:rPr>
+          <w:rFonts w:ascii="Consolas" w:eastAsia="Times New Roman" w:hAnsi="Consolas" w:cs="Times New Roman"/>
+          <w:sz w:val="24"/>
+          <w:szCs w:val="24"/>
+          <w:lang w:eastAsia="fr-FR"/>
+        </w:rPr>
+        <w:t xml:space="preserve">    </w:t>
+      </w:r>
+    </w:p>
+    <w:p>
+      <w:pPr>
+        <w:spacing w:after="0" w:line="240" w:lineRule="auto"/>
+        <w:rPr>
+          <w:rFonts w:ascii="Consolas" w:eastAsia="Times New Roman" w:hAnsi="Consolas" w:cs="Times New Roman"/>
+          <w:sz w:val="24"/>
+          <w:szCs w:val="24"/>
+          <w:lang w:eastAsia="fr-FR"/>
+        </w:rPr>
+      </w:pPr>
+      <w:r>
+        <w:rPr>
+          <w:rFonts w:ascii="Consolas" w:eastAsia="Times New Roman" w:hAnsi="Consolas" w:cs="Times New Roman"/>
+          <w:sz w:val="24"/>
+          <w:szCs w:val="24"/>
+          <w:lang w:eastAsia="fr-FR"/>
+        </w:rPr>
+        <w:t xml:space="preserve"> 4   </w:t>
+      </w:r>
+      <w:proofErr w:type="spellStart"/>
+      <w:r>
+        <w:rPr>
+          <w:rFonts w:ascii="Consolas" w:eastAsia="Times New Roman" w:hAnsi="Consolas" w:cs="Times New Roman"/>
+          <w:sz w:val="24"/>
+          <w:szCs w:val="24"/>
+          <w:lang w:eastAsia="fr-FR"/>
+        </w:rPr>
+        <w:t>temperature</w:t>
+      </w:r>
+      <w:proofErr w:type="spellEnd"/>
+      <w:r>
+        <w:rPr>
+          <w:rFonts w:ascii="Consolas" w:eastAsia="Times New Roman" w:hAnsi="Consolas" w:cs="Times New Roman"/>
+          <w:sz w:val="24"/>
+          <w:szCs w:val="24"/>
+          <w:lang w:eastAsia="fr-FR"/>
+        </w:rPr>
+        <w:t xml:space="preserve">   590 non-</w:t>
+      </w:r>
+      <w:proofErr w:type="spellStart"/>
+      <w:r>
+        <w:rPr>
+          <w:rFonts w:ascii="Consolas" w:eastAsia="Times New Roman" w:hAnsi="Consolas" w:cs="Times New Roman"/>
+          <w:sz w:val="24"/>
+          <w:szCs w:val="24"/>
+          <w:lang w:eastAsia="fr-FR"/>
+        </w:rPr>
+        <w:t>null</w:t>
+      </w:r>
+      <w:proofErr w:type="spellEnd"/>
+      <w:r>
+        <w:rPr>
+          <w:rFonts w:ascii="Consolas" w:eastAsia="Times New Roman" w:hAnsi="Consolas" w:cs="Times New Roman"/>
+          <w:sz w:val="24"/>
+          <w:szCs w:val="24"/>
+          <w:lang w:eastAsia="fr-FR"/>
+        </w:rPr>
+        <w:t xml:space="preserve">    float64</w:t>
+      </w:r>
+    </w:p>
+    <w:p>
+      <w:pPr>
+        <w:spacing w:after="0" w:line="240" w:lineRule="auto"/>
+        <w:rPr>
+          <w:rFonts w:ascii="Consolas" w:eastAsia="Times New Roman" w:hAnsi="Consolas" w:cs="Times New Roman"/>
+          <w:sz w:val="24"/>
+          <w:szCs w:val="24"/>
+          <w:lang w:eastAsia="fr-FR"/>
+        </w:rPr>
+      </w:pPr>
+      <w:r>
+        <w:rPr>
+          <w:rFonts w:ascii="Consolas" w:eastAsia="Times New Roman" w:hAnsi="Consolas" w:cs="Times New Roman"/>
+          <w:sz w:val="24"/>
+          <w:szCs w:val="24"/>
+          <w:lang w:eastAsia="fr-FR"/>
+        </w:rPr>
+        <w:t xml:space="preserve"> 5   </w:t>
+      </w:r>
+      <w:proofErr w:type="spellStart"/>
+      <w:r>
+        <w:rPr>
+          <w:rFonts w:ascii="Consolas" w:eastAsia="Times New Roman" w:hAnsi="Consolas" w:cs="Times New Roman"/>
+          <w:sz w:val="24"/>
+          <w:szCs w:val="24"/>
+          <w:lang w:eastAsia="fr-FR"/>
+        </w:rPr>
+        <w:t>humidite</w:t>
+      </w:r>
+      <w:proofErr w:type="spellEnd"/>
+      <w:r>
+        <w:rPr>
+          <w:rFonts w:ascii="Consolas" w:eastAsia="Times New Roman" w:hAnsi="Consolas" w:cs="Times New Roman"/>
+          <w:sz w:val="24"/>
+          <w:szCs w:val="24"/>
+          <w:lang w:eastAsia="fr-FR"/>
+        </w:rPr>
+        <w:t xml:space="preserve">      591 non-</w:t>
+      </w:r>
+      <w:proofErr w:type="spellStart"/>
+      <w:r>
+        <w:rPr>
+          <w:rFonts w:ascii="Consolas" w:eastAsia="Times New Roman" w:hAnsi="Consolas" w:cs="Times New Roman"/>
+          <w:sz w:val="24"/>
+          <w:szCs w:val="24"/>
+          <w:lang w:eastAsia="fr-FR"/>
+        </w:rPr>
+        <w:t>null</w:t>
+      </w:r>
+      <w:proofErr w:type="spellEnd"/>
+      <w:r>
+        <w:rPr>
+          <w:rFonts w:ascii="Consolas" w:eastAsia="Times New Roman" w:hAnsi="Consolas" w:cs="Times New Roman"/>
+          <w:sz w:val="24"/>
+          <w:szCs w:val="24"/>
+          <w:lang w:eastAsia="fr-FR"/>
+        </w:rPr>
+        <w:t xml:space="preserve">    float64</w:t>
+      </w:r>
+    </w:p>
+    <w:p>
+      <w:pPr>
+        <w:spacing w:after="0" w:line="240" w:lineRule="auto"/>
+        <w:rPr>
+          <w:rFonts w:ascii="Consolas" w:eastAsia="Times New Roman" w:hAnsi="Consolas" w:cs="Times New Roman"/>
+          <w:sz w:val="24"/>
+          <w:szCs w:val="24"/>
+          <w:lang w:eastAsia="fr-FR"/>
+        </w:rPr>
+      </w:pPr>
+      <w:r>
+        <w:rPr>
+          <w:rFonts w:ascii="Consolas" w:eastAsia="Times New Roman" w:hAnsi="Consolas" w:cs="Times New Roman"/>
+          <w:sz w:val="24"/>
+          <w:szCs w:val="24"/>
+          <w:lang w:eastAsia="fr-FR"/>
+        </w:rPr>
+        <w:t xml:space="preserve"> 6   </w:t>
+      </w:r>
+      <w:proofErr w:type="gramStart"/>
+      <w:r>
+        <w:rPr>
+          <w:rFonts w:ascii="Consolas" w:eastAsia="Times New Roman" w:hAnsi="Consolas" w:cs="Times New Roman"/>
+          <w:sz w:val="24"/>
+          <w:szCs w:val="24"/>
+          <w:lang w:eastAsia="fr-FR"/>
+        </w:rPr>
+        <w:t>pression</w:t>
+      </w:r>
+      <w:proofErr w:type="gramEnd"/>
+      <w:r>
+        <w:rPr>
+          <w:rFonts w:ascii="Consolas" w:eastAsia="Times New Roman" w:hAnsi="Consolas" w:cs="Times New Roman"/>
+          <w:sz w:val="24"/>
+          <w:szCs w:val="24"/>
+          <w:lang w:eastAsia="fr-FR"/>
+        </w:rPr>
+        <w:t xml:space="preserve">      591 non-</w:t>
+      </w:r>
+      <w:proofErr w:type="spellStart"/>
+      <w:r>
+        <w:rPr>
+          <w:rFonts w:ascii="Consolas" w:eastAsia="Times New Roman" w:hAnsi="Consolas" w:cs="Times New Roman"/>
+          <w:sz w:val="24"/>
+          <w:szCs w:val="24"/>
+          <w:lang w:eastAsia="fr-FR"/>
+        </w:rPr>
+        <w:t>null</w:t>
+      </w:r>
+      <w:proofErr w:type="spellEnd"/>
+      <w:r>
+        <w:rPr>
+          <w:rFonts w:ascii="Consolas" w:eastAsia="Times New Roman" w:hAnsi="Consolas" w:cs="Times New Roman"/>
+          <w:sz w:val="24"/>
+          <w:szCs w:val="24"/>
+          <w:lang w:eastAsia="fr-FR"/>
+        </w:rPr>
+        <w:t xml:space="preserve">    float64</w:t>
+      </w:r>
+    </w:p>
+    <w:p>
+      <w:pPr>
+        <w:spacing w:after="0" w:line="240" w:lineRule="auto"/>
+        <w:rPr>
+          <w:rFonts w:ascii="Consolas" w:eastAsia="Times New Roman" w:hAnsi="Consolas" w:cs="Times New Roman"/>
+          <w:sz w:val="24"/>
+          <w:szCs w:val="24"/>
+          <w:lang w:eastAsia="fr-FR"/>
+        </w:rPr>
+      </w:pPr>
+      <w:r>
+        <w:rPr>
+          <w:rFonts w:ascii="Consolas" w:eastAsia="Times New Roman" w:hAnsi="Consolas" w:cs="Times New Roman"/>
+          <w:sz w:val="24"/>
+          <w:szCs w:val="24"/>
+          <w:lang w:eastAsia="fr-FR"/>
+        </w:rPr>
+        <w:t xml:space="preserve"> 7   </w:t>
+      </w:r>
+      <w:proofErr w:type="gramStart"/>
+      <w:r>
+        <w:rPr>
+          <w:rFonts w:ascii="Consolas" w:eastAsia="Times New Roman" w:hAnsi="Consolas" w:cs="Times New Roman"/>
+          <w:sz w:val="24"/>
+          <w:szCs w:val="24"/>
+          <w:lang w:eastAsia="fr-FR"/>
+        </w:rPr>
+        <w:t>consommation  591</w:t>
+      </w:r>
+      <w:proofErr w:type="gramEnd"/>
+      <w:r>
+        <w:rPr>
+          <w:rFonts w:ascii="Consolas" w:eastAsia="Times New Roman" w:hAnsi="Consolas" w:cs="Times New Roman"/>
+          <w:sz w:val="24"/>
+          <w:szCs w:val="24"/>
+          <w:lang w:eastAsia="fr-FR"/>
+        </w:rPr>
+        <w:t xml:space="preserve"> non-</w:t>
+      </w:r>
+      <w:proofErr w:type="spellStart"/>
+      <w:r>
+        <w:rPr>
+          <w:rFonts w:ascii="Consolas" w:eastAsia="Times New Roman" w:hAnsi="Consolas" w:cs="Times New Roman"/>
+          <w:sz w:val="24"/>
+          <w:szCs w:val="24"/>
+          <w:lang w:eastAsia="fr-FR"/>
+        </w:rPr>
+        <w:t>null</w:t>
+      </w:r>
+      <w:proofErr w:type="spellEnd"/>
+      <w:r>
+        <w:rPr>
+          <w:rFonts w:ascii="Consolas" w:eastAsia="Times New Roman" w:hAnsi="Consolas" w:cs="Times New Roman"/>
+          <w:sz w:val="24"/>
+          <w:szCs w:val="24"/>
+          <w:lang w:eastAsia="fr-FR"/>
+        </w:rPr>
+        <w:t xml:space="preserve">    float64</w:t>
+      </w:r>
+    </w:p>
+    <w:p>
+      <w:pPr>
+        <w:spacing w:after="0" w:line="240" w:lineRule="auto"/>
+        <w:rPr>
+          <w:rFonts w:ascii="Consolas" w:eastAsia="Times New Roman" w:hAnsi="Consolas" w:cs="Times New Roman"/>
+          <w:sz w:val="24"/>
+          <w:szCs w:val="24"/>
+          <w:lang w:eastAsia="fr-FR"/>
+        </w:rPr>
+      </w:pPr>
+      <w:r>
+        <w:rPr>
+          <w:rFonts w:ascii="Consolas" w:eastAsia="Times New Roman" w:hAnsi="Consolas" w:cs="Times New Roman"/>
+          <w:sz w:val="24"/>
+          <w:szCs w:val="24"/>
+          <w:lang w:eastAsia="fr-FR"/>
+        </w:rPr>
+        <w:t xml:space="preserve"> 8   </w:t>
+      </w:r>
+      <w:proofErr w:type="spellStart"/>
+      <w:r>
+        <w:rPr>
+          <w:rFonts w:ascii="Consolas" w:eastAsia="Times New Roman" w:hAnsi="Consolas" w:cs="Times New Roman"/>
+          <w:sz w:val="24"/>
+          <w:szCs w:val="24"/>
+          <w:lang w:eastAsia="fr-FR"/>
+        </w:rPr>
+        <w:t>etat</w:t>
+      </w:r>
+      <w:proofErr w:type="spellEnd"/>
+      <w:r>
+        <w:rPr>
+          <w:rFonts w:ascii="Consolas" w:eastAsia="Times New Roman" w:hAnsi="Consolas" w:cs="Times New Roman"/>
+          <w:sz w:val="24"/>
+          <w:szCs w:val="24"/>
+          <w:lang w:eastAsia="fr-FR"/>
+        </w:rPr>
+        <w:t xml:space="preserve">          596 non-</w:t>
+      </w:r>
+      <w:proofErr w:type="spellStart"/>
+      <w:r>
+        <w:rPr>
+          <w:rFonts w:ascii="Consolas" w:eastAsia="Times New Roman" w:hAnsi="Consolas" w:cs="Times New Roman"/>
+          <w:sz w:val="24"/>
+          <w:szCs w:val="24"/>
+          <w:lang w:eastAsia="fr-FR"/>
+        </w:rPr>
+        <w:t>null</w:t>
+      </w:r>
+      <w:proofErr w:type="spellEnd"/>
+      <w:r>
+        <w:rPr>
+          <w:rFonts w:ascii="Consolas" w:eastAsia="Times New Roman" w:hAnsi="Consolas" w:cs="Times New Roman"/>
+          <w:sz w:val="24"/>
+          <w:szCs w:val="24"/>
+          <w:lang w:eastAsia="fr-FR"/>
+        </w:rPr>
+        <w:t xml:space="preserve">    </w:t>
+      </w:r>
+      <w:proofErr w:type="spellStart"/>
+      <w:r>
+        <w:rPr>
+          <w:rFonts w:ascii="Consolas" w:eastAsia="Times New Roman" w:hAnsi="Consolas" w:cs="Times New Roman"/>
+          <w:sz w:val="24"/>
+          <w:szCs w:val="24"/>
+          <w:lang w:eastAsia="fr-FR"/>
+        </w:rPr>
+        <w:t>str</w:t>
+      </w:r>
+      <w:proofErr w:type="spellEnd"/>
+      <w:r>
+        <w:rPr>
+          <w:rFonts w:ascii="Consolas" w:eastAsia="Times New Roman" w:hAnsi="Consolas" w:cs="Times New Roman"/>
+          <w:sz w:val="24"/>
+          <w:szCs w:val="24"/>
+          <w:lang w:eastAsia="fr-FR"/>
+        </w:rPr>
+        <w:t xml:space="preserve">    </w:t>
+      </w:r>
+    </w:p>
+    <w:p>
+      <w:pPr>
+        <w:spacing w:after="0" w:line="240" w:lineRule="auto"/>
+        <w:rPr>
+          <w:rFonts w:ascii="Consolas" w:eastAsia="Times New Roman" w:hAnsi="Consolas" w:cs="Times New Roman"/>
+          <w:sz w:val="24"/>
+          <w:szCs w:val="24"/>
+          <w:lang w:val="en-US" w:eastAsia="fr-FR"/>
+        </w:rPr>
+      </w:pPr>
+      <w:proofErr w:type="spellStart"/>
+      <w:r>
+        <w:rPr>
+          <w:rFonts w:ascii="Consolas" w:eastAsia="Times New Roman" w:hAnsi="Consolas" w:cs="Times New Roman"/>
+          <w:sz w:val="24"/>
+          <w:szCs w:val="24"/>
+          <w:lang w:val="en-US" w:eastAsia="fr-FR"/>
+        </w:rPr>
+        <w:t>dtypes</w:t>
+      </w:r>
+      <w:proofErr w:type="spellEnd"/>
+      <w:r>
+        <w:rPr>
+          <w:rFonts w:ascii="Consolas" w:eastAsia="Times New Roman" w:hAnsi="Consolas" w:cs="Times New Roman"/>
+          <w:sz w:val="24"/>
+          <w:szCs w:val="24"/>
+          <w:lang w:val="en-US" w:eastAsia="fr-FR"/>
+        </w:rPr>
+        <w:t xml:space="preserve">: float64(4), </w:t>
+      </w:r>
+      <w:proofErr w:type="gramStart"/>
+      <w:r>
+        <w:rPr>
+          <w:rFonts w:ascii="Consolas" w:eastAsia="Times New Roman" w:hAnsi="Consolas" w:cs="Times New Roman"/>
+          <w:sz w:val="24"/>
+          <w:szCs w:val="24"/>
+          <w:lang w:val="en-US" w:eastAsia="fr-FR"/>
+        </w:rPr>
+        <w:t>str(</w:t>
+      </w:r>
+      <w:proofErr w:type="gramEnd"/>
+      <w:r>
+        <w:rPr>
+          <w:rFonts w:ascii="Consolas" w:eastAsia="Times New Roman" w:hAnsi="Consolas" w:cs="Times New Roman"/>
+          <w:sz w:val="24"/>
+          <w:szCs w:val="24"/>
+          <w:lang w:val="en-US" w:eastAsia="fr-FR"/>
+        </w:rPr>
+        <w:t>5)</w:t>
+      </w:r>
+    </w:p>
+    <w:p>
+      <w:pPr>
+        <w:pStyle w:val="PrformatHTML"/>
+        <w:rPr>
+          <w:rStyle w:val="CodeHTML"/>
+          <w:rFonts w:ascii="Consolas" w:hAnsi="Consolas" w:cs="Times New Roman"/>
+          <w:sz w:val="24"/>
+          <w:szCs w:val="24"/>
+          <w:lang w:val="en-US"/>
+        </w:rPr>
+      </w:pPr>
+      <w:r>
+        <w:rPr>
+          <w:rFonts w:ascii="Consolas" w:hAnsi="Consolas" w:cs="Times New Roman"/>
+          <w:sz w:val="24"/>
+          <w:szCs w:val="24"/>
+          <w:lang w:val="en-US"/>
+        </w:rPr>
+        <w:t>memory usage: 42.0 KB</w:t>
+      </w:r>
+    </w:p>
+    <w:p>
+      <w:pPr>
+        <w:pStyle w:val="PrformatHTML"/>
+        <w:rPr>
+          <w:rStyle w:val="CodeHTML"/>
+          <w:rFonts w:ascii="Times New Roman" w:hAnsi="Times New Roman" w:cs="Times New Roman"/>
+          <w:sz w:val="24"/>
+          <w:szCs w:val="24"/>
+          <w:lang w:val="en-US"/>
+        </w:rPr>
+      </w:pPr>
+    </w:p>
+    <w:p>
+      <w:pPr>
+        <w:pStyle w:val="PrformatHTML"/>
+        <w:rPr>
+          <w:rStyle w:val="CodeHTML"/>
+          <w:rFonts w:ascii="Times New Roman" w:hAnsi="Times New Roman" w:cs="Times New Roman"/>
+          <w:sz w:val="24"/>
+          <w:szCs w:val="24"/>
+        </w:rPr>
+      </w:pPr>
+      <w:r>
+        <w:rPr>
+          <w:rStyle w:val="CodeHTML"/>
+          <w:rFonts w:ascii="Times New Roman" w:hAnsi="Times New Roman" w:cs="Times New Roman"/>
+          <w:b/>
+          <w:bCs/>
+          <w:sz w:val="24"/>
+          <w:szCs w:val="24"/>
+        </w:rPr>
+        <w:t>Tâche</w:t>
+      </w:r>
+      <w:r>
+        <w:rPr>
+          <w:rStyle w:val="CodeHTML"/>
+          <w:rFonts w:ascii="Times New Roman" w:hAnsi="Times New Roman" w:cs="Times New Roman"/>
+          <w:sz w:val="24"/>
+          <w:szCs w:val="24"/>
+        </w:rPr>
+        <w:t xml:space="preserve"> : Pour chacun des problèmes de qualité de données suivants, propose une</w:t>
+      </w:r>
+      <w:r>
+        <w:rPr>
+          <w:rStyle w:val="CodeHTML"/>
+          <w:rFonts w:ascii="Times New Roman" w:hAnsi="Times New Roman" w:cs="Times New Roman"/>
+          <w:sz w:val="24"/>
+          <w:szCs w:val="24"/>
+        </w:rPr>
+        <w:t xml:space="preserve"> </w:t>
+      </w:r>
+      <w:r>
+        <w:rPr>
+          <w:rStyle w:val="CodeHTML"/>
+          <w:rFonts w:ascii="Times New Roman" w:hAnsi="Times New Roman" w:cs="Times New Roman"/>
+          <w:sz w:val="24"/>
+          <w:szCs w:val="24"/>
+        </w:rPr>
+        <w:t>stratégie de traitement :</w:t>
+      </w:r>
+    </w:p>
+    <w:p>
+      <w:pPr>
+        <w:pStyle w:val="PrformatHTML"/>
+        <w:rPr>
+          <w:rStyle w:val="CodeHTML"/>
+          <w:rFonts w:ascii="Times New Roman" w:hAnsi="Times New Roman" w:cs="Times New Roman"/>
+          <w:sz w:val="24"/>
+          <w:szCs w:val="24"/>
+        </w:rPr>
+      </w:pPr>
+      <w:r>
+        <w:rPr>
+          <w:rStyle w:val="CodeHTML"/>
+          <w:rFonts w:ascii="Times New Roman" w:hAnsi="Times New Roman" w:cs="Times New Roman"/>
+          <w:sz w:val="24"/>
+          <w:szCs w:val="24"/>
+        </w:rPr>
+        <w:t>1. Valeurs manquantes</w:t>
+      </w:r>
+    </w:p>
+    <w:p>
+      <w:pPr>
+        <w:pStyle w:val="PrformatHTML"/>
+        <w:rPr>
+          <w:rStyle w:val="CodeHTML"/>
+          <w:rFonts w:ascii="Times New Roman" w:hAnsi="Times New Roman" w:cs="Times New Roman"/>
+          <w:sz w:val="24"/>
+          <w:szCs w:val="24"/>
+        </w:rPr>
+      </w:pPr>
+      <w:r>
+        <w:rPr>
+          <w:rStyle w:val="CodeHTML"/>
+          <w:rFonts w:ascii="Times New Roman" w:hAnsi="Times New Roman" w:cs="Times New Roman"/>
+          <w:sz w:val="24"/>
+          <w:szCs w:val="24"/>
+        </w:rPr>
+        <w:t>2. Doublons</w:t>
+      </w:r>
+    </w:p>
+    <w:p>
+      <w:pPr>
+        <w:pStyle w:val="PrformatHTML"/>
+        <w:rPr>
+          <w:rStyle w:val="CodeHTML"/>
+          <w:rFonts w:ascii="Times New Roman" w:hAnsi="Times New Roman" w:cs="Times New Roman"/>
+          <w:sz w:val="24"/>
+          <w:szCs w:val="24"/>
+        </w:rPr>
+      </w:pPr>
+      <w:r>
+        <w:rPr>
+          <w:rStyle w:val="CodeHTML"/>
+          <w:rFonts w:ascii="Times New Roman" w:hAnsi="Times New Roman" w:cs="Times New Roman"/>
+          <w:sz w:val="24"/>
+          <w:szCs w:val="24"/>
+        </w:rPr>
+        <w:t>3. Valeurs aberrantes (</w:t>
+      </w:r>
+      <w:proofErr w:type="spellStart"/>
+      <w:r>
+        <w:rPr>
+          <w:rStyle w:val="CodeHTML"/>
+          <w:rFonts w:ascii="Times New Roman" w:hAnsi="Times New Roman" w:cs="Times New Roman"/>
+          <w:sz w:val="24"/>
+          <w:szCs w:val="24"/>
+        </w:rPr>
+        <w:t>outliers</w:t>
+      </w:r>
+      <w:proofErr w:type="spellEnd"/>
+      <w:r>
+        <w:rPr>
+          <w:rStyle w:val="CodeHTML"/>
+          <w:rFonts w:ascii="Times New Roman" w:hAnsi="Times New Roman" w:cs="Times New Roman"/>
+          <w:sz w:val="24"/>
+          <w:szCs w:val="24"/>
+        </w:rPr>
+        <w:t>)</w:t>
+      </w:r>
+    </w:p>
+    <w:p>
+      <w:pPr>
+        <w:pStyle w:val="PrformatHTML"/>
+        <w:rPr>
+          <w:rStyle w:val="CodeHTML"/>
+          <w:rFonts w:ascii="Times New Roman" w:hAnsi="Times New Roman" w:cs="Times New Roman"/>
+          <w:sz w:val="24"/>
+          <w:szCs w:val="24"/>
+        </w:rPr>
+      </w:pPr>
+      <w:r>
+        <w:rPr>
+          <w:rStyle w:val="CodeHTML"/>
+          <w:rFonts w:ascii="Times New Roman" w:hAnsi="Times New Roman" w:cs="Times New Roman"/>
+          <w:sz w:val="24"/>
+          <w:szCs w:val="24"/>
+        </w:rPr>
+        <w:t>4. Variables catégorielles</w:t>
+      </w:r>
+    </w:p>
+    <w:p>
+      <w:pPr>
+        <w:pStyle w:val="PrformatHTML"/>
+        <w:rPr>
+          <w:rStyle w:val="CodeHTML"/>
+          <w:rFonts w:ascii="Times New Roman" w:hAnsi="Times New Roman" w:cs="Times New Roman"/>
+          <w:sz w:val="24"/>
+          <w:szCs w:val="24"/>
+        </w:rPr>
+      </w:pPr>
+    </w:p>
+    <w:p>
+      <w:pPr>
+        <w:pStyle w:val="PrformatHTML"/>
+        <w:rPr>
+          <w:rStyle w:val="CodeHTML"/>
+          <w:rFonts w:ascii="Times New Roman" w:hAnsi="Times New Roman" w:cs="Times New Roman"/>
+          <w:sz w:val="24"/>
+          <w:szCs w:val="24"/>
+        </w:rPr>
+      </w:pPr>
+      <w:r>
+        <w:rPr>
+          <w:rStyle w:val="CodeHTML"/>
+          <w:rFonts w:ascii="Times New Roman" w:hAnsi="Times New Roman" w:cs="Times New Roman"/>
+          <w:sz w:val="24"/>
+          <w:szCs w:val="24"/>
+        </w:rPr>
+        <w:t>Pour chaque point, indique :</w:t>
+      </w:r>
+    </w:p>
+    <w:p>
+      <w:pPr>
+        <w:pStyle w:val="PrformatHTML"/>
+        <w:rPr>
+          <w:rStyle w:val="CodeHTML"/>
+          <w:rFonts w:ascii="Times New Roman" w:hAnsi="Times New Roman" w:cs="Times New Roman"/>
+          <w:sz w:val="24"/>
+          <w:szCs w:val="24"/>
+        </w:rPr>
+      </w:pPr>
+      <w:r>
+        <w:rPr>
+          <w:rStyle w:val="CodeHTML"/>
+          <w:rFonts w:ascii="Times New Roman" w:hAnsi="Times New Roman" w:cs="Times New Roman"/>
+          <w:sz w:val="24"/>
+          <w:szCs w:val="24"/>
+        </w:rPr>
+        <w:t>- Méthode de détection</w:t>
+      </w:r>
+    </w:p>
+    <w:p>
+      <w:pPr>
+        <w:pStyle w:val="PrformatHTML"/>
+        <w:rPr>
+          <w:rStyle w:val="CodeHTML"/>
+          <w:rFonts w:ascii="Times New Roman" w:hAnsi="Times New Roman" w:cs="Times New Roman"/>
+          <w:sz w:val="24"/>
+          <w:szCs w:val="24"/>
+        </w:rPr>
+      </w:pPr>
+      <w:r>
+        <w:rPr>
+          <w:rStyle w:val="CodeHTML"/>
+          <w:rFonts w:ascii="Times New Roman" w:hAnsi="Times New Roman" w:cs="Times New Roman"/>
+          <w:sz w:val="24"/>
+          <w:szCs w:val="24"/>
+        </w:rPr>
+        <w:t>- Méthode(s) de traitement recommandée(s), avec justification adaptée à ce dataset</w:t>
+      </w:r>
+    </w:p>
+    <w:p>
+      <w:pPr>
+        <w:pStyle w:val="PrformatHTML"/>
+        <w:rPr>
+          <w:rStyle w:val="CodeHTML"/>
+          <w:rFonts w:ascii="Times New Roman" w:hAnsi="Times New Roman" w:cs="Times New Roman"/>
+          <w:sz w:val="24"/>
+          <w:szCs w:val="24"/>
+        </w:rPr>
+      </w:pPr>
+      <w:r>
+        <w:rPr>
+          <w:rStyle w:val="CodeHTML"/>
+          <w:rFonts w:ascii="Times New Roman" w:hAnsi="Times New Roman" w:cs="Times New Roman"/>
+          <w:sz w:val="24"/>
+          <w:szCs w:val="24"/>
+        </w:rPr>
+        <w:t>- Risques associés à un mauvais traitement (ex. biais, perte d'information, fuite de données)</w:t>
+      </w:r>
+    </w:p>
+    <w:p>
+      <w:pPr>
+        <w:pStyle w:val="PrformatHTML"/>
+        <w:rPr>
+          <w:rStyle w:val="CodeHTML"/>
+          <w:rFonts w:ascii="Times New Roman" w:hAnsi="Times New Roman" w:cs="Times New Roman"/>
+          <w:sz w:val="24"/>
+          <w:szCs w:val="24"/>
+        </w:rPr>
+      </w:pPr>
+    </w:p>
+    <w:p>
+      <w:pPr>
+        <w:pStyle w:val="PrformatHTML"/>
+        <w:rPr>
+          <w:rFonts w:ascii="Times New Roman" w:hAnsi="Times New Roman" w:cs="Times New Roman"/>
+          <w:sz w:val="24"/>
+          <w:szCs w:val="24"/>
+        </w:rPr>
+      </w:pPr>
+      <w:r>
+        <w:rPr>
+          <w:rStyle w:val="CodeHTML"/>
+          <w:rFonts w:ascii="Times New Roman" w:hAnsi="Times New Roman" w:cs="Times New Roman"/>
+          <w:sz w:val="24"/>
+          <w:szCs w:val="24"/>
+        </w:rPr>
+        <w:t>Format de sortie : un tableau ou une liste structurée par problème.</w:t>
+      </w:r>
+    </w:p>
+    <w:p>
+      <w:pPr>
+        <w:pStyle w:val="NormalWeb"/>
+        <w:rPr>
+          <w:rStyle w:val="lev"/>
+        </w:rPr>
+      </w:pPr>
+      <w:r>
+        <w:rPr>
+          <w:rStyle w:val="lev"/>
+          <w:sz w:val="28"/>
+          <w:szCs w:val="28"/>
+        </w:rPr>
+        <w:t>Ré</w:t>
+      </w:r>
+      <w:r>
+        <w:rPr>
+          <w:rStyle w:val="lev"/>
+          <w:sz w:val="28"/>
+          <w:szCs w:val="28"/>
+        </w:rPr>
+        <w:t>sultat</w:t>
+      </w:r>
+      <w:r>
+        <w:rPr>
+          <w:rStyle w:val="lev"/>
+        </w:rPr>
+        <w:t> :</w:t>
+      </w:r>
+    </w:p>
+    <w:p>
+      <w:pPr>
+        <w:pStyle w:val="NormalWeb"/>
+        <w:rPr>
+          <w:rStyle w:val="CodeHTML"/>
+          <w:rFonts w:ascii="Times New Roman" w:hAnsi="Times New Roman" w:cs="Times New Roman"/>
+          <w:sz w:val="24"/>
+          <w:szCs w:val="24"/>
+        </w:rPr>
+      </w:pPr>
+      <w:r>
+        <w:rPr>
+          <w:rStyle w:val="CodeHTML"/>
+          <w:rFonts w:ascii="Times New Roman" w:hAnsi="Times New Roman" w:cs="Times New Roman"/>
+          <w:sz w:val="24"/>
+          <w:szCs w:val="24"/>
+        </w:rPr>
+        <w:drawing>
+          <wp:inline distT="0" distB="0" distL="0" distR="0" wp14:anchorId="6B1DEB76" wp14:editId="2CF5A7F6">
+            <wp:extent cx="6209809" cy="3356324"/>
+            <wp:effectExtent l="0" t="0" r="635" b="0"/>
+            <wp:docPr id="22" name="Image 22"/>
+            <wp:cNvGraphicFramePr>
+              <a:graphicFrameLocks xmlns:a="http://schemas.openxmlformats.org/drawingml/2006/main" noChangeAspect="1"/>
+            </wp:cNvGraphicFramePr>
+            <a:graphic xmlns:a="http://schemas.openxmlformats.org/drawingml/2006/main">
+              <a:graphicData uri="http://schemas.openxmlformats.org/drawingml/2006/picture">
+                <pic:pic xmlns:pic="http://schemas.openxmlformats.org/drawingml/2006/picture">
+                  <pic:nvPicPr>
+                    <pic:cNvPr id="1" name=""/>
+                    <pic:cNvPicPr/>
+                  </pic:nvPicPr>
+                  <pic:blipFill>
+                    <a:blip r:embed="rId26"/>
+                    <a:stretch>
+                      <a:fillRect/>
+                    </a:stretch>
+                  </pic:blipFill>
+                  <pic:spPr>
+                    <a:xfrm>
+                      <a:off x="0" y="0"/>
+                      <a:ext cx="6259704" cy="3383292"/>
+                    </a:xfrm>
+                    <a:prstGeom prst="rect">
+                      <a:avLst/>
+                    </a:prstGeom>
+                  </pic:spPr>
+                </pic:pic>
+              </a:graphicData>
+            </a:graphic>
+          </wp:inline>
+        </w:drawing>
+      </w:r>
+    </w:p>
+    <w:p>
+      <w:pPr>
+        <w:pStyle w:val="NormalWeb"/>
+        <w:rPr>
+          <w:rStyle w:val="CodeHTML"/>
+          <w:rFonts w:ascii="Times New Roman" w:hAnsi="Times New Roman" w:cs="Times New Roman"/>
+          <w:sz w:val="24"/>
+          <w:szCs w:val="24"/>
+        </w:rPr>
+      </w:pPr>
+      <w:r>
+        <w:rPr>
+          <w:rStyle w:val="CodeHTML"/>
+          <w:rFonts w:ascii="Times New Roman" w:hAnsi="Times New Roman" w:cs="Times New Roman"/>
+          <w:sz w:val="24"/>
+          <w:szCs w:val="24"/>
+        </w:rPr>
+        <w:lastRenderedPageBreak/>
+        <w:drawing>
+          <wp:inline distT="0" distB="0" distL="0" distR="0" wp14:anchorId="4D0EB4CB" wp14:editId="47784744">
+            <wp:extent cx="4793993" cy="3863287"/>
+            <wp:effectExtent l="0" t="0" r="6985" b="4445"/>
+            <wp:docPr id="23" name="Image 23"/>
+            <wp:cNvGraphicFramePr>
+              <a:graphicFrameLocks xmlns:a="http://schemas.openxmlformats.org/drawingml/2006/main" noChangeAspect="1"/>
+            </wp:cNvGraphicFramePr>
+            <a:graphic xmlns:a="http://schemas.openxmlformats.org/drawingml/2006/main">
+              <a:graphicData uri="http://schemas.openxmlformats.org/drawingml/2006/picture">
+                <pic:pic xmlns:pic="http://schemas.openxmlformats.org/drawingml/2006/picture">
+                  <pic:nvPicPr>
+                    <pic:cNvPr id="1" name=""/>
+                    <pic:cNvPicPr/>
+                  </pic:nvPicPr>
+                  <pic:blipFill>
+                    <a:blip r:embed="rId27"/>
+                    <a:stretch>
+                      <a:fillRect/>
+                    </a:stretch>
+                  </pic:blipFill>
+                  <pic:spPr>
+                    <a:xfrm>
+                      <a:off x="0" y="0"/>
+                      <a:ext cx="4821528" cy="3885476"/>
+                    </a:xfrm>
+                    <a:prstGeom prst="rect">
+                      <a:avLst/>
+                    </a:prstGeom>
+                  </pic:spPr>
+                </pic:pic>
+              </a:graphicData>
+            </a:graphic>
+          </wp:inline>
+        </w:drawing>
+      </w:r>
+    </w:p>
+    <w:p>
+      <w:pPr>
+        <w:pStyle w:val="NormalWeb"/>
         <w:rPr>
           <w:rStyle w:val="CodeHTML"/>
           <w:rFonts w:ascii="Times New Roman" w:hAnsi="Times New Roman" w:cs="Times New Roman"/>

</xml_diff>

<commit_message>
Partie 6 question 2
</commit_message>
<xml_diff>
--- a/ai-business_assistant.docx
+++ b/ai-business_assistant.docx
@@ -10534,14 +10534,639 @@
     </w:p>
     <w:p>
       <w:pPr>
+        <w:pStyle w:val="Titre2"/>
+        <w:rPr>
+          <w:sz w:val="28"/>
+          <w:szCs w:val="28"/>
+        </w:rPr>
+      </w:pPr>
+      <w:r>
+        <w:rPr>
+          <w:sz w:val="28"/>
+          <w:szCs w:val="28"/>
+        </w:rPr>
+        <w:t>2) Visualisations pertinentes</w:t>
+      </w:r>
+    </w:p>
+    <w:p>
+      <w:pPr>
+        <w:pStyle w:val="PrformatHTML"/>
+        <w:rPr>
+          <w:rStyle w:val="CodeHTML"/>
+          <w:rFonts w:ascii="Times New Roman" w:hAnsi="Times New Roman" w:cs="Times New Roman"/>
+          <w:sz w:val="24"/>
+          <w:szCs w:val="24"/>
+        </w:rPr>
+      </w:pPr>
+      <w:r>
+        <w:rPr>
+          <w:rStyle w:val="CodeHTML"/>
+          <w:rFonts w:ascii="Times New Roman" w:hAnsi="Times New Roman" w:cs="Times New Roman"/>
+          <w:b/>
+          <w:bCs/>
+          <w:sz w:val="24"/>
+          <w:szCs w:val="24"/>
+        </w:rPr>
+        <w:t>Rôle</w:t>
+      </w:r>
+      <w:r>
+        <w:rPr>
+          <w:rStyle w:val="CodeHTML"/>
+          <w:rFonts w:ascii="Times New Roman" w:hAnsi="Times New Roman" w:cs="Times New Roman"/>
+          <w:sz w:val="24"/>
+          <w:szCs w:val="24"/>
+        </w:rPr>
+        <w:t xml:space="preserve"> : </w:t>
+      </w:r>
+      <w:r>
+        <w:rPr>
+          <w:rStyle w:val="CodeHTML"/>
+          <w:rFonts w:ascii="Times New Roman" w:hAnsi="Times New Roman" w:cs="Times New Roman"/>
+          <w:sz w:val="24"/>
+          <w:szCs w:val="24"/>
+        </w:rPr>
+        <w:t xml:space="preserve">Tu es un data </w:t>
+      </w:r>
+      <w:proofErr w:type="spellStart"/>
+      <w:r>
+        <w:rPr>
+          <w:rStyle w:val="CodeHTML"/>
+          <w:rFonts w:ascii="Times New Roman" w:hAnsi="Times New Roman" w:cs="Times New Roman"/>
+          <w:sz w:val="24"/>
+          <w:szCs w:val="24"/>
+        </w:rPr>
+        <w:t>analyst</w:t>
+      </w:r>
+      <w:proofErr w:type="spellEnd"/>
+      <w:r>
+        <w:rPr>
+          <w:rStyle w:val="CodeHTML"/>
+          <w:rFonts w:ascii="Times New Roman" w:hAnsi="Times New Roman" w:cs="Times New Roman"/>
+          <w:sz w:val="24"/>
+          <w:szCs w:val="24"/>
+        </w:rPr>
+        <w:t xml:space="preserve"> spécialisé en visualisation de données.</w:t>
+      </w:r>
+    </w:p>
+    <w:p>
+      <w:pPr>
+        <w:pStyle w:val="PrformatHTML"/>
+        <w:rPr>
+          <w:rStyle w:val="CodeHTML"/>
+          <w:rFonts w:ascii="Times New Roman" w:hAnsi="Times New Roman" w:cs="Times New Roman"/>
+          <w:sz w:val="24"/>
+          <w:szCs w:val="24"/>
+        </w:rPr>
+      </w:pPr>
+    </w:p>
+    <w:p>
+      <w:pPr>
+        <w:pStyle w:val="PrformatHTML"/>
+        <w:rPr>
+          <w:rStyle w:val="CodeHTML"/>
+          <w:rFonts w:ascii="Times New Roman" w:hAnsi="Times New Roman" w:cs="Times New Roman"/>
+          <w:sz w:val="24"/>
+          <w:szCs w:val="24"/>
+        </w:rPr>
+      </w:pPr>
+      <w:r>
+        <w:rPr>
+          <w:rStyle w:val="CodeHTML"/>
+          <w:rFonts w:ascii="Times New Roman" w:hAnsi="Times New Roman" w:cs="Times New Roman"/>
+          <w:b/>
+          <w:bCs/>
+          <w:sz w:val="24"/>
+          <w:szCs w:val="24"/>
+        </w:rPr>
+        <w:t>Contexte</w:t>
+      </w:r>
+      <w:r>
+        <w:rPr>
+          <w:rStyle w:val="CodeHTML"/>
+          <w:rFonts w:ascii="Times New Roman" w:hAnsi="Times New Roman" w:cs="Times New Roman"/>
+          <w:sz w:val="24"/>
+          <w:szCs w:val="24"/>
+        </w:rPr>
+        <w:t xml:space="preserve"> : Dataset de capteurs IoT avec les variables température, humidité,</w:t>
+      </w:r>
+      <w:r>
+        <w:rPr>
+          <w:rStyle w:val="CodeHTML"/>
+          <w:rFonts w:ascii="Times New Roman" w:hAnsi="Times New Roman" w:cs="Times New Roman"/>
+          <w:sz w:val="24"/>
+          <w:szCs w:val="24"/>
+        </w:rPr>
+        <w:t xml:space="preserve"> p</w:t>
+      </w:r>
+      <w:r>
+        <w:rPr>
+          <w:rStyle w:val="CodeHTML"/>
+          <w:rFonts w:ascii="Times New Roman" w:hAnsi="Times New Roman" w:cs="Times New Roman"/>
+          <w:sz w:val="24"/>
+          <w:szCs w:val="24"/>
+        </w:rPr>
+        <w:t>ression</w:t>
+      </w:r>
+      <w:r>
+        <w:rPr>
+          <w:rStyle w:val="CodeHTML"/>
+          <w:rFonts w:ascii="Times New Roman" w:hAnsi="Times New Roman" w:cs="Times New Roman"/>
+          <w:sz w:val="24"/>
+          <w:szCs w:val="24"/>
+        </w:rPr>
+        <w:t>, consommation énergétique, et un horodatage.</w:t>
+      </w:r>
+    </w:p>
+    <w:p>
+      <w:pPr>
+        <w:pStyle w:val="PrformatHTML"/>
+        <w:rPr>
+          <w:rStyle w:val="CodeHTML"/>
+          <w:rFonts w:ascii="Times New Roman" w:hAnsi="Times New Roman" w:cs="Times New Roman"/>
+          <w:sz w:val="24"/>
+          <w:szCs w:val="24"/>
+        </w:rPr>
+      </w:pPr>
+    </w:p>
+    <w:p>
+      <w:pPr>
+        <w:pStyle w:val="PrformatHTML"/>
+        <w:rPr>
+          <w:rStyle w:val="CodeHTML"/>
+          <w:rFonts w:ascii="Times New Roman" w:hAnsi="Times New Roman" w:cs="Times New Roman"/>
+          <w:sz w:val="24"/>
+          <w:szCs w:val="24"/>
+        </w:rPr>
+      </w:pPr>
+      <w:r>
+        <w:rPr>
+          <w:rStyle w:val="CodeHTML"/>
+          <w:rFonts w:ascii="Times New Roman" w:hAnsi="Times New Roman" w:cs="Times New Roman"/>
+          <w:b/>
+          <w:bCs/>
+          <w:sz w:val="24"/>
+          <w:szCs w:val="24"/>
+        </w:rPr>
+        <w:t>Tâche</w:t>
+      </w:r>
+      <w:r>
+        <w:rPr>
+          <w:rStyle w:val="CodeHTML"/>
+          <w:rFonts w:ascii="Times New Roman" w:hAnsi="Times New Roman" w:cs="Times New Roman"/>
+          <w:sz w:val="24"/>
+          <w:szCs w:val="24"/>
+        </w:rPr>
+        <w:t xml:space="preserve"> : Propose les visualisations les plus pertinentes pour comprendre la</w:t>
+      </w:r>
+      <w:r>
+        <w:rPr>
+          <w:rStyle w:val="CodeHTML"/>
+          <w:rFonts w:ascii="Times New Roman" w:hAnsi="Times New Roman" w:cs="Times New Roman"/>
+          <w:sz w:val="24"/>
+          <w:szCs w:val="24"/>
+        </w:rPr>
+        <w:t xml:space="preserve"> </w:t>
+      </w:r>
+      <w:r>
+        <w:rPr>
+          <w:rStyle w:val="CodeHTML"/>
+          <w:rFonts w:ascii="Times New Roman" w:hAnsi="Times New Roman" w:cs="Times New Roman"/>
+          <w:sz w:val="24"/>
+          <w:szCs w:val="24"/>
+        </w:rPr>
+        <w:t>consommation énergétique d'un bâtiment à partir de ce dataset.</w:t>
+      </w:r>
+    </w:p>
+    <w:p>
+      <w:pPr>
+        <w:pStyle w:val="PrformatHTML"/>
+        <w:rPr>
+          <w:rStyle w:val="CodeHTML"/>
+          <w:rFonts w:ascii="Times New Roman" w:hAnsi="Times New Roman" w:cs="Times New Roman"/>
+          <w:sz w:val="24"/>
+          <w:szCs w:val="24"/>
+        </w:rPr>
+      </w:pPr>
+    </w:p>
+    <w:p>
+      <w:pPr>
+        <w:pStyle w:val="PrformatHTML"/>
+        <w:rPr>
+          <w:rStyle w:val="CodeHTML"/>
+          <w:rFonts w:ascii="Times New Roman" w:hAnsi="Times New Roman" w:cs="Times New Roman"/>
+          <w:sz w:val="24"/>
+          <w:szCs w:val="24"/>
+        </w:rPr>
+      </w:pPr>
+      <w:r>
+        <w:rPr>
+          <w:rStyle w:val="CodeHTML"/>
+          <w:rFonts w:ascii="Times New Roman" w:hAnsi="Times New Roman" w:cs="Times New Roman"/>
+          <w:b/>
+          <w:bCs/>
+          <w:sz w:val="24"/>
+          <w:szCs w:val="24"/>
+        </w:rPr>
+        <w:t>Pour chaque visualisation, indique</w:t>
+      </w:r>
+      <w:r>
+        <w:rPr>
+          <w:rStyle w:val="CodeHTML"/>
+          <w:rFonts w:ascii="Times New Roman" w:hAnsi="Times New Roman" w:cs="Times New Roman"/>
+          <w:sz w:val="24"/>
+          <w:szCs w:val="24"/>
+        </w:rPr>
+        <w:t xml:space="preserve"> :</w:t>
+      </w:r>
+    </w:p>
+    <w:p>
+      <w:pPr>
+        <w:pStyle w:val="PrformatHTML"/>
+        <w:numPr>
+          <w:ilvl w:val="0"/>
+          <w:numId w:val="16"/>
+        </w:numPr>
+        <w:rPr>
+          <w:rStyle w:val="CodeHTML"/>
+          <w:rFonts w:ascii="Times New Roman" w:hAnsi="Times New Roman" w:cs="Times New Roman"/>
+          <w:sz w:val="24"/>
+          <w:szCs w:val="24"/>
+        </w:rPr>
+      </w:pPr>
+      <w:r>
+        <w:rPr>
+          <w:rStyle w:val="CodeHTML"/>
+          <w:rFonts w:ascii="Times New Roman" w:hAnsi="Times New Roman" w:cs="Times New Roman"/>
+          <w:sz w:val="24"/>
+          <w:szCs w:val="24"/>
+        </w:rPr>
+        <w:t xml:space="preserve">Type de graphique (ex. série temporelle, </w:t>
+      </w:r>
+      <w:proofErr w:type="spellStart"/>
+      <w:r>
+        <w:rPr>
+          <w:rStyle w:val="CodeHTML"/>
+          <w:rFonts w:ascii="Times New Roman" w:hAnsi="Times New Roman" w:cs="Times New Roman"/>
+          <w:sz w:val="24"/>
+          <w:szCs w:val="24"/>
+        </w:rPr>
+        <w:t>scatter</w:t>
+      </w:r>
+      <w:proofErr w:type="spellEnd"/>
+      <w:r>
+        <w:rPr>
+          <w:rStyle w:val="CodeHTML"/>
+          <w:rFonts w:ascii="Times New Roman" w:hAnsi="Times New Roman" w:cs="Times New Roman"/>
+          <w:sz w:val="24"/>
+          <w:szCs w:val="24"/>
+        </w:rPr>
+        <w:t xml:space="preserve"> plot, </w:t>
+      </w:r>
+      <w:proofErr w:type="spellStart"/>
+      <w:r>
+        <w:rPr>
+          <w:rStyle w:val="CodeHTML"/>
+          <w:rFonts w:ascii="Times New Roman" w:hAnsi="Times New Roman" w:cs="Times New Roman"/>
+          <w:sz w:val="24"/>
+          <w:szCs w:val="24"/>
+        </w:rPr>
+        <w:t>heatmap</w:t>
+      </w:r>
+      <w:proofErr w:type="spellEnd"/>
+      <w:r>
+        <w:rPr>
+          <w:rStyle w:val="CodeHTML"/>
+          <w:rFonts w:ascii="Times New Roman" w:hAnsi="Times New Roman" w:cs="Times New Roman"/>
+          <w:sz w:val="24"/>
+          <w:szCs w:val="24"/>
+        </w:rPr>
+        <w:t xml:space="preserve">, </w:t>
+      </w:r>
+      <w:proofErr w:type="spellStart"/>
+      <w:r>
+        <w:rPr>
+          <w:rStyle w:val="CodeHTML"/>
+          <w:rFonts w:ascii="Times New Roman" w:hAnsi="Times New Roman" w:cs="Times New Roman"/>
+          <w:sz w:val="24"/>
+          <w:szCs w:val="24"/>
+        </w:rPr>
+        <w:t>boxplot</w:t>
+      </w:r>
+      <w:proofErr w:type="spellEnd"/>
+      <w:r>
+        <w:rPr>
+          <w:rStyle w:val="CodeHTML"/>
+          <w:rFonts w:ascii="Times New Roman" w:hAnsi="Times New Roman" w:cs="Times New Roman"/>
+          <w:sz w:val="24"/>
+          <w:szCs w:val="24"/>
+        </w:rPr>
+        <w:t>...)</w:t>
+      </w:r>
+    </w:p>
+    <w:p>
+      <w:pPr>
+        <w:pStyle w:val="PrformatHTML"/>
+        <w:numPr>
+          <w:ilvl w:val="0"/>
+          <w:numId w:val="16"/>
+        </w:numPr>
+        <w:rPr>
+          <w:rStyle w:val="CodeHTML"/>
+          <w:rFonts w:ascii="Times New Roman" w:hAnsi="Times New Roman" w:cs="Times New Roman"/>
+          <w:sz w:val="24"/>
+          <w:szCs w:val="24"/>
+        </w:rPr>
+      </w:pPr>
+      <w:r>
+        <w:rPr>
+          <w:rStyle w:val="CodeHTML"/>
+          <w:rFonts w:ascii="Times New Roman" w:hAnsi="Times New Roman" w:cs="Times New Roman"/>
+          <w:sz w:val="24"/>
+          <w:szCs w:val="24"/>
+        </w:rPr>
+        <w:t>Variables utilisées</w:t>
+      </w:r>
+    </w:p>
+    <w:p>
+      <w:pPr>
+        <w:pStyle w:val="PrformatHTML"/>
+        <w:numPr>
+          <w:ilvl w:val="0"/>
+          <w:numId w:val="16"/>
+        </w:numPr>
+        <w:rPr>
+          <w:rStyle w:val="CodeHTML"/>
+          <w:rFonts w:ascii="Times New Roman" w:hAnsi="Times New Roman" w:cs="Times New Roman"/>
+          <w:sz w:val="24"/>
+          <w:szCs w:val="24"/>
+        </w:rPr>
+      </w:pPr>
+      <w:r>
+        <w:rPr>
+          <w:rStyle w:val="CodeHTML"/>
+          <w:rFonts w:ascii="Times New Roman" w:hAnsi="Times New Roman" w:cs="Times New Roman"/>
+          <w:sz w:val="24"/>
+          <w:szCs w:val="24"/>
+        </w:rPr>
+        <w:t>Objectif de la visualisation (quelle question elle permet de répondre)</w:t>
+      </w:r>
+    </w:p>
+    <w:p>
+      <w:pPr>
+        <w:pStyle w:val="PrformatHTML"/>
+        <w:numPr>
+          <w:ilvl w:val="0"/>
+          <w:numId w:val="16"/>
+        </w:numPr>
+        <w:rPr>
+          <w:rStyle w:val="CodeHTML"/>
+          <w:rFonts w:ascii="Times New Roman" w:hAnsi="Times New Roman" w:cs="Times New Roman"/>
+          <w:sz w:val="24"/>
+          <w:szCs w:val="24"/>
+        </w:rPr>
+      </w:pPr>
+      <w:r>
+        <w:rPr>
+          <w:rStyle w:val="CodeHTML"/>
+          <w:rFonts w:ascii="Times New Roman" w:hAnsi="Times New Roman" w:cs="Times New Roman"/>
+          <w:sz w:val="24"/>
+          <w:szCs w:val="24"/>
+        </w:rPr>
+        <w:t>Interprétation attendue (ce qu'on devrait pouvoir observer/conclure)</w:t>
+      </w:r>
+    </w:p>
+    <w:p>
+      <w:pPr>
+        <w:pStyle w:val="PrformatHTML"/>
+        <w:rPr>
+          <w:rStyle w:val="CodeHTML"/>
+          <w:rFonts w:ascii="Times New Roman" w:hAnsi="Times New Roman" w:cs="Times New Roman"/>
+          <w:sz w:val="24"/>
+          <w:szCs w:val="24"/>
+        </w:rPr>
+      </w:pPr>
+    </w:p>
+    <w:p>
+      <w:pPr>
+        <w:pStyle w:val="PrformatHTML"/>
+        <w:rPr>
+          <w:rFonts w:ascii="Times New Roman" w:hAnsi="Times New Roman" w:cs="Times New Roman"/>
+          <w:sz w:val="24"/>
+          <w:szCs w:val="24"/>
+        </w:rPr>
+      </w:pPr>
+      <w:r>
+        <w:rPr>
+          <w:rStyle w:val="CodeHTML"/>
+          <w:rFonts w:ascii="Times New Roman" w:hAnsi="Times New Roman" w:cs="Times New Roman"/>
+          <w:b/>
+          <w:bCs/>
+          <w:sz w:val="24"/>
+          <w:szCs w:val="24"/>
+        </w:rPr>
+        <w:t>Format de sortie</w:t>
+      </w:r>
+      <w:r>
+        <w:rPr>
+          <w:rStyle w:val="CodeHTML"/>
+          <w:rFonts w:ascii="Times New Roman" w:hAnsi="Times New Roman" w:cs="Times New Roman"/>
+          <w:sz w:val="24"/>
+          <w:szCs w:val="24"/>
+        </w:rPr>
+        <w:t xml:space="preserve"> : liste numérotée, une entrée par visualisation.</w:t>
+      </w:r>
+    </w:p>
+    <w:p>
+      <w:pPr>
         <w:pStyle w:val="NormalWeb"/>
         <w:rPr>
-          <w:rStyle w:val="CodeHTML"/>
-          <w:rFonts w:ascii="Times New Roman" w:hAnsi="Times New Roman" w:cs="Times New Roman"/>
-          <w:sz w:val="24"/>
-          <w:szCs w:val="24"/>
-        </w:rPr>
-      </w:pPr>
+          <w:rStyle w:val="lev"/>
+          <w:sz w:val="28"/>
+          <w:szCs w:val="28"/>
+        </w:rPr>
+      </w:pPr>
+      <w:r>
+        <w:rPr>
+          <w:rStyle w:val="lev"/>
+          <w:sz w:val="28"/>
+          <w:szCs w:val="28"/>
+        </w:rPr>
+        <w:t>Ré</w:t>
+      </w:r>
+      <w:r>
+        <w:rPr>
+          <w:rStyle w:val="lev"/>
+          <w:sz w:val="28"/>
+          <w:szCs w:val="28"/>
+        </w:rPr>
+        <w:t>sultat</w:t>
+      </w:r>
+      <w:r>
+        <w:rPr>
+          <w:rStyle w:val="lev"/>
+          <w:sz w:val="28"/>
+          <w:szCs w:val="28"/>
+        </w:rPr>
+        <w:t>s :</w:t>
+      </w:r>
+    </w:p>
+    <w:p>
+      <w:pPr>
+        <w:pStyle w:val="NormalWeb"/>
+        <w:rPr>
+          <w:rStyle w:val="lev"/>
+          <w:sz w:val="28"/>
+          <w:szCs w:val="28"/>
+        </w:rPr>
+      </w:pPr>
+      <w:r>
+        <w:rPr>
+          <w:rStyle w:val="lev"/>
+          <w:sz w:val="28"/>
+          <w:szCs w:val="28"/>
+        </w:rPr>
+        <w:lastRenderedPageBreak/>
+        <w:drawing>
+          <wp:inline distT="0" distB="0" distL="0" distR="0" wp14:anchorId="24F278EB" wp14:editId="051587B9">
+            <wp:extent cx="5493032" cy="5016758"/>
+            <wp:effectExtent l="0" t="0" r="0" b="0"/>
+            <wp:docPr id="24" name="Image 24"/>
+            <wp:cNvGraphicFramePr>
+              <a:graphicFrameLocks xmlns:a="http://schemas.openxmlformats.org/drawingml/2006/main" noChangeAspect="1"/>
+            </wp:cNvGraphicFramePr>
+            <a:graphic xmlns:a="http://schemas.openxmlformats.org/drawingml/2006/main">
+              <a:graphicData uri="http://schemas.openxmlformats.org/drawingml/2006/picture">
+                <pic:pic xmlns:pic="http://schemas.openxmlformats.org/drawingml/2006/picture">
+                  <pic:nvPicPr>
+                    <pic:cNvPr id="1" name=""/>
+                    <pic:cNvPicPr/>
+                  </pic:nvPicPr>
+                  <pic:blipFill>
+                    <a:blip r:embed="rId28"/>
+                    <a:stretch>
+                      <a:fillRect/>
+                    </a:stretch>
+                  </pic:blipFill>
+                  <pic:spPr>
+                    <a:xfrm>
+                      <a:off x="0" y="0"/>
+                      <a:ext cx="5493032" cy="5016758"/>
+                    </a:xfrm>
+                    <a:prstGeom prst="rect">
+                      <a:avLst/>
+                    </a:prstGeom>
+                  </pic:spPr>
+                </pic:pic>
+              </a:graphicData>
+            </a:graphic>
+          </wp:inline>
+        </w:drawing>
+      </w:r>
+    </w:p>
+    <w:p>
+      <w:pPr>
+        <w:pStyle w:val="NormalWeb"/>
+        <w:rPr>
+          <w:sz w:val="28"/>
+          <w:szCs w:val="28"/>
+        </w:rPr>
+      </w:pPr>
+      <w:r>
+        <w:rPr>
+          <w:sz w:val="28"/>
+          <w:szCs w:val="28"/>
+        </w:rPr>
+        <w:lastRenderedPageBreak/>
+        <w:drawing>
+          <wp:inline distT="0" distB="0" distL="0" distR="0" wp14:anchorId="3B007FC2" wp14:editId="1D31FB89">
+            <wp:extent cx="5283472" cy="5092962"/>
+            <wp:effectExtent l="0" t="0" r="0" b="0"/>
+            <wp:docPr id="25" name="Image 25"/>
+            <wp:cNvGraphicFramePr>
+              <a:graphicFrameLocks xmlns:a="http://schemas.openxmlformats.org/drawingml/2006/main" noChangeAspect="1"/>
+            </wp:cNvGraphicFramePr>
+            <a:graphic xmlns:a="http://schemas.openxmlformats.org/drawingml/2006/main">
+              <a:graphicData uri="http://schemas.openxmlformats.org/drawingml/2006/picture">
+                <pic:pic xmlns:pic="http://schemas.openxmlformats.org/drawingml/2006/picture">
+                  <pic:nvPicPr>
+                    <pic:cNvPr id="1" name=""/>
+                    <pic:cNvPicPr/>
+                  </pic:nvPicPr>
+                  <pic:blipFill>
+                    <a:blip r:embed="rId29"/>
+                    <a:stretch>
+                      <a:fillRect/>
+                    </a:stretch>
+                  </pic:blipFill>
+                  <pic:spPr>
+                    <a:xfrm>
+                      <a:off x="0" y="0"/>
+                      <a:ext cx="5283472" cy="5092962"/>
+                    </a:xfrm>
+                    <a:prstGeom prst="rect">
+                      <a:avLst/>
+                    </a:prstGeom>
+                  </pic:spPr>
+                </pic:pic>
+              </a:graphicData>
+            </a:graphic>
+          </wp:inline>
+        </w:drawing>
+      </w:r>
+    </w:p>
+    <w:p>
+      <w:pPr>
+        <w:pStyle w:val="NormalWeb"/>
+        <w:rPr>
+          <w:rStyle w:val="CodeHTML"/>
+          <w:rFonts w:ascii="Times New Roman" w:hAnsi="Times New Roman" w:cs="Times New Roman"/>
+          <w:sz w:val="24"/>
+          <w:szCs w:val="24"/>
+        </w:rPr>
+      </w:pPr>
+      <w:r>
+        <w:rPr>
+          <w:rStyle w:val="CodeHTML"/>
+          <w:rFonts w:ascii="Times New Roman" w:hAnsi="Times New Roman" w:cs="Times New Roman"/>
+          <w:sz w:val="24"/>
+          <w:szCs w:val="24"/>
+        </w:rPr>
+        <w:drawing>
+          <wp:inline distT="0" distB="0" distL="0" distR="0" wp14:anchorId="7B36EFAD" wp14:editId="0595BEDB">
+            <wp:extent cx="5200917" cy="2959252"/>
+            <wp:effectExtent l="0" t="0" r="0" b="0"/>
+            <wp:docPr id="26" name="Image 26"/>
+            <wp:cNvGraphicFramePr>
+              <a:graphicFrameLocks xmlns:a="http://schemas.openxmlformats.org/drawingml/2006/main" noChangeAspect="1"/>
+            </wp:cNvGraphicFramePr>
+            <a:graphic xmlns:a="http://schemas.openxmlformats.org/drawingml/2006/main">
+              <a:graphicData uri="http://schemas.openxmlformats.org/drawingml/2006/picture">
+                <pic:pic xmlns:pic="http://schemas.openxmlformats.org/drawingml/2006/picture">
+                  <pic:nvPicPr>
+                    <pic:cNvPr id="1" name=""/>
+                    <pic:cNvPicPr/>
+                  </pic:nvPicPr>
+                  <pic:blipFill>
+                    <a:blip r:embed="rId30"/>
+                    <a:stretch>
+                      <a:fillRect/>
+                    </a:stretch>
+                  </pic:blipFill>
+                  <pic:spPr>
+                    <a:xfrm>
+                      <a:off x="0" y="0"/>
+                      <a:ext cx="5200917" cy="2959252"/>
+                    </a:xfrm>
+                    <a:prstGeom prst="rect">
+                      <a:avLst/>
+                    </a:prstGeom>
+                  </pic:spPr>
+                </pic:pic>
+              </a:graphicData>
+            </a:graphic>
+          </wp:inline>
+        </w:drawing>
+      </w:r>
     </w:p>
     <w:sectPr>
       <w:pgSz w:w="11906" w:h="16838"/>
@@ -11979,6 +12604,119 @@
     </w:lvl>
   </w:abstractNum>
   <w:abstractNum w:abstractNumId="14" w15:restartNumberingAfterBreak="0">
+    <w:nsid w:val="6F710360"/>
+    <w:multiLevelType w:val="hybridMultilevel"/>
+    <w:tmpl w:val="66BCC23A"/>
+    <w:lvl w:ilvl="0" w:tplc="040C0001">
+      <w:start w:val="1"/>
+      <w:numFmt w:val="bullet"/>
+      <w:lvlText w:val=""/>
+      <w:lvlJc w:val="left"/>
+      <w:pPr>
+        <w:ind w:left="720" w:hanging="360"/>
+      </w:pPr>
+      <w:rPr>
+        <w:rFonts w:ascii="Symbol" w:hAnsi="Symbol" w:hint="default"/>
+      </w:rPr>
+    </w:lvl>
+    <w:lvl w:ilvl="1" w:tplc="040C0003" w:tentative="1">
+      <w:start w:val="1"/>
+      <w:numFmt w:val="bullet"/>
+      <w:lvlText w:val="o"/>
+      <w:lvlJc w:val="left"/>
+      <w:pPr>
+        <w:ind w:left="1440" w:hanging="360"/>
+      </w:pPr>
+      <w:rPr>
+        <w:rFonts w:ascii="Courier New" w:hAnsi="Courier New" w:cs="Courier New" w:hint="default"/>
+      </w:rPr>
+    </w:lvl>
+    <w:lvl w:ilvl="2" w:tplc="040C0005" w:tentative="1">
+      <w:start w:val="1"/>
+      <w:numFmt w:val="bullet"/>
+      <w:lvlText w:val=""/>
+      <w:lvlJc w:val="left"/>
+      <w:pPr>
+        <w:ind w:left="2160" w:hanging="360"/>
+      </w:pPr>
+      <w:rPr>
+        <w:rFonts w:ascii="Wingdings" w:hAnsi="Wingdings" w:hint="default"/>
+      </w:rPr>
+    </w:lvl>
+    <w:lvl w:ilvl="3" w:tplc="040C0001" w:tentative="1">
+      <w:start w:val="1"/>
+      <w:numFmt w:val="bullet"/>
+      <w:lvlText w:val=""/>
+      <w:lvlJc w:val="left"/>
+      <w:pPr>
+        <w:ind w:left="2880" w:hanging="360"/>
+      </w:pPr>
+      <w:rPr>
+        <w:rFonts w:ascii="Symbol" w:hAnsi="Symbol" w:hint="default"/>
+      </w:rPr>
+    </w:lvl>
+    <w:lvl w:ilvl="4" w:tplc="040C0003" w:tentative="1">
+      <w:start w:val="1"/>
+      <w:numFmt w:val="bullet"/>
+      <w:lvlText w:val="o"/>
+      <w:lvlJc w:val="left"/>
+      <w:pPr>
+        <w:ind w:left="3600" w:hanging="360"/>
+      </w:pPr>
+      <w:rPr>
+        <w:rFonts w:ascii="Courier New" w:hAnsi="Courier New" w:cs="Courier New" w:hint="default"/>
+      </w:rPr>
+    </w:lvl>
+    <w:lvl w:ilvl="5" w:tplc="040C0005" w:tentative="1">
+      <w:start w:val="1"/>
+      <w:numFmt w:val="bullet"/>
+      <w:lvlText w:val=""/>
+      <w:lvlJc w:val="left"/>
+      <w:pPr>
+        <w:ind w:left="4320" w:hanging="360"/>
+      </w:pPr>
+      <w:rPr>
+        <w:rFonts w:ascii="Wingdings" w:hAnsi="Wingdings" w:hint="default"/>
+      </w:rPr>
+    </w:lvl>
+    <w:lvl w:ilvl="6" w:tplc="040C0001" w:tentative="1">
+      <w:start w:val="1"/>
+      <w:numFmt w:val="bullet"/>
+      <w:lvlText w:val=""/>
+      <w:lvlJc w:val="left"/>
+      <w:pPr>
+        <w:ind w:left="5040" w:hanging="360"/>
+      </w:pPr>
+      <w:rPr>
+        <w:rFonts w:ascii="Symbol" w:hAnsi="Symbol" w:hint="default"/>
+      </w:rPr>
+    </w:lvl>
+    <w:lvl w:ilvl="7" w:tplc="040C0003" w:tentative="1">
+      <w:start w:val="1"/>
+      <w:numFmt w:val="bullet"/>
+      <w:lvlText w:val="o"/>
+      <w:lvlJc w:val="left"/>
+      <w:pPr>
+        <w:ind w:left="5760" w:hanging="360"/>
+      </w:pPr>
+      <w:rPr>
+        <w:rFonts w:ascii="Courier New" w:hAnsi="Courier New" w:cs="Courier New" w:hint="default"/>
+      </w:rPr>
+    </w:lvl>
+    <w:lvl w:ilvl="8" w:tplc="040C0005" w:tentative="1">
+      <w:start w:val="1"/>
+      <w:numFmt w:val="bullet"/>
+      <w:lvlText w:val=""/>
+      <w:lvlJc w:val="left"/>
+      <w:pPr>
+        <w:ind w:left="6480" w:hanging="360"/>
+      </w:pPr>
+      <w:rPr>
+        <w:rFonts w:ascii="Wingdings" w:hAnsi="Wingdings" w:hint="default"/>
+      </w:rPr>
+    </w:lvl>
+  </w:abstractNum>
+  <w:abstractNum w:abstractNumId="15" w15:restartNumberingAfterBreak="0">
     <w:nsid w:val="7EC51315"/>
     <w:multiLevelType w:val="hybridMultilevel"/>
     <w:tmpl w:val="7952CE38"/>
@@ -12077,7 +12815,7 @@
     <w:abstractNumId w:val="7"/>
   </w:num>
   <w:num w:numId="4">
-    <w:abstractNumId w:val="14"/>
+    <w:abstractNumId w:val="15"/>
   </w:num>
   <w:num w:numId="5">
     <w:abstractNumId w:val="6"/>
@@ -12111,6 +12849,9 @@
   </w:num>
   <w:num w:numId="15">
     <w:abstractNumId w:val="10"/>
+  </w:num>
+  <w:num w:numId="16">
+    <w:abstractNumId w:val="14"/>
   </w:num>
 </w:numbering>
 </file>

</xml_diff>

<commit_message>
Partie 6 question 3
</commit_message>
<xml_diff>
--- a/ai-business_assistant.docx
+++ b/ai-business_assistant.docx
@@ -11168,6 +11168,1926 @@
         </w:drawing>
       </w:r>
     </w:p>
+    <w:p>
+      <w:pPr>
+        <w:pStyle w:val="NormalWeb"/>
+        <w:rPr>
+          <w:rStyle w:val="CodeHTML"/>
+          <w:rFonts w:ascii="Times New Roman" w:hAnsi="Times New Roman" w:cs="Times New Roman"/>
+          <w:sz w:val="24"/>
+          <w:szCs w:val="24"/>
+        </w:rPr>
+      </w:pPr>
+    </w:p>
+    <w:p>
+      <w:pPr>
+        <w:pStyle w:val="Titre2"/>
+        <w:rPr>
+          <w:sz w:val="28"/>
+          <w:szCs w:val="28"/>
+        </w:rPr>
+      </w:pPr>
+      <w:r>
+        <w:rPr>
+          <w:sz w:val="28"/>
+          <w:szCs w:val="28"/>
+        </w:rPr>
+        <w:lastRenderedPageBreak/>
+        <w:t>3) Modèles pour la prédiction de consommation énergétique</w:t>
+      </w:r>
+    </w:p>
+    <w:p>
+      <w:pPr>
+        <w:pStyle w:val="PrformatHTML"/>
+        <w:rPr>
+          <w:rStyle w:val="CodeHTML"/>
+          <w:rFonts w:ascii="Times New Roman" w:hAnsi="Times New Roman" w:cs="Times New Roman"/>
+          <w:sz w:val="24"/>
+          <w:szCs w:val="24"/>
+        </w:rPr>
+      </w:pPr>
+      <w:r>
+        <w:rPr>
+          <w:rStyle w:val="CodeHTML"/>
+          <w:rFonts w:ascii="Times New Roman" w:hAnsi="Times New Roman" w:cs="Times New Roman"/>
+          <w:b/>
+          <w:bCs/>
+          <w:sz w:val="24"/>
+          <w:szCs w:val="24"/>
+        </w:rPr>
+        <w:t>Rôle</w:t>
+      </w:r>
+      <w:r>
+        <w:rPr>
+          <w:rStyle w:val="CodeHTML"/>
+          <w:rFonts w:ascii="Times New Roman" w:hAnsi="Times New Roman" w:cs="Times New Roman"/>
+          <w:sz w:val="24"/>
+          <w:szCs w:val="24"/>
+        </w:rPr>
+        <w:t xml:space="preserve"> : </w:t>
+      </w:r>
+      <w:r>
+        <w:rPr>
+          <w:rStyle w:val="CodeHTML"/>
+          <w:rFonts w:ascii="Times New Roman" w:hAnsi="Times New Roman" w:cs="Times New Roman"/>
+          <w:sz w:val="24"/>
+          <w:szCs w:val="24"/>
+        </w:rPr>
+        <w:t xml:space="preserve">Tu es un expert en machine </w:t>
+      </w:r>
+      <w:proofErr w:type="spellStart"/>
+      <w:r>
+        <w:rPr>
+          <w:rStyle w:val="CodeHTML"/>
+          <w:rFonts w:ascii="Times New Roman" w:hAnsi="Times New Roman" w:cs="Times New Roman"/>
+          <w:sz w:val="24"/>
+          <w:szCs w:val="24"/>
+        </w:rPr>
+        <w:t>learning</w:t>
+      </w:r>
+      <w:proofErr w:type="spellEnd"/>
+      <w:r>
+        <w:rPr>
+          <w:rStyle w:val="CodeHTML"/>
+          <w:rFonts w:ascii="Times New Roman" w:hAnsi="Times New Roman" w:cs="Times New Roman"/>
+          <w:sz w:val="24"/>
+          <w:szCs w:val="24"/>
+        </w:rPr>
+        <w:t>.</w:t>
+      </w:r>
+    </w:p>
+    <w:p>
+      <w:pPr>
+        <w:pStyle w:val="PrformatHTML"/>
+        <w:rPr>
+          <w:rStyle w:val="CodeHTML"/>
+          <w:rFonts w:ascii="Times New Roman" w:hAnsi="Times New Roman" w:cs="Times New Roman"/>
+          <w:sz w:val="24"/>
+          <w:szCs w:val="24"/>
+        </w:rPr>
+      </w:pPr>
+    </w:p>
+    <w:p>
+      <w:pPr>
+        <w:pStyle w:val="PrformatHTML"/>
+        <w:rPr>
+          <w:rStyle w:val="CodeHTML"/>
+          <w:rFonts w:ascii="Times New Roman" w:hAnsi="Times New Roman" w:cs="Times New Roman"/>
+          <w:sz w:val="24"/>
+          <w:szCs w:val="24"/>
+        </w:rPr>
+      </w:pPr>
+      <w:r>
+        <w:rPr>
+          <w:rStyle w:val="CodeHTML"/>
+          <w:rFonts w:ascii="Times New Roman" w:hAnsi="Times New Roman" w:cs="Times New Roman"/>
+          <w:b/>
+          <w:bCs/>
+          <w:sz w:val="24"/>
+          <w:szCs w:val="24"/>
+        </w:rPr>
+        <w:t>Contexte</w:t>
+      </w:r>
+      <w:r>
+        <w:rPr>
+          <w:rStyle w:val="CodeHTML"/>
+          <w:rFonts w:ascii="Times New Roman" w:hAnsi="Times New Roman" w:cs="Times New Roman"/>
+          <w:sz w:val="24"/>
+          <w:szCs w:val="24"/>
+        </w:rPr>
+        <w:t xml:space="preserve"> : Je veux prédire la consommation énergétique d'un bâtiment à partir</w:t>
+      </w:r>
+      <w:r>
+        <w:rPr>
+          <w:rStyle w:val="CodeHTML"/>
+          <w:rFonts w:ascii="Times New Roman" w:hAnsi="Times New Roman" w:cs="Times New Roman"/>
+          <w:sz w:val="24"/>
+          <w:szCs w:val="24"/>
+        </w:rPr>
+        <w:t xml:space="preserve"> </w:t>
+      </w:r>
+      <w:r>
+        <w:rPr>
+          <w:rStyle w:val="CodeHTML"/>
+          <w:rFonts w:ascii="Times New Roman" w:hAnsi="Times New Roman" w:cs="Times New Roman"/>
+          <w:sz w:val="24"/>
+          <w:szCs w:val="24"/>
+        </w:rPr>
+        <w:t>de variables de capteurs (température, humidité, pression, horodatage, etc.).</w:t>
+      </w:r>
+    </w:p>
+    <w:p>
+      <w:pPr>
+        <w:pStyle w:val="PrformatHTML"/>
+        <w:rPr>
+          <w:rStyle w:val="CodeHTML"/>
+          <w:rFonts w:ascii="Times New Roman" w:hAnsi="Times New Roman" w:cs="Times New Roman"/>
+          <w:sz w:val="24"/>
+          <w:szCs w:val="24"/>
+        </w:rPr>
+      </w:pPr>
+    </w:p>
+    <w:p>
+      <w:pPr>
+        <w:pStyle w:val="PrformatHTML"/>
+        <w:rPr>
+          <w:rStyle w:val="CodeHTML"/>
+          <w:rFonts w:ascii="Times New Roman" w:hAnsi="Times New Roman" w:cs="Times New Roman"/>
+          <w:sz w:val="24"/>
+          <w:szCs w:val="24"/>
+        </w:rPr>
+      </w:pPr>
+      <w:r>
+        <w:rPr>
+          <w:rStyle w:val="CodeHTML"/>
+          <w:rFonts w:ascii="Times New Roman" w:hAnsi="Times New Roman" w:cs="Times New Roman"/>
+          <w:b/>
+          <w:bCs/>
+          <w:sz w:val="24"/>
+          <w:szCs w:val="24"/>
+        </w:rPr>
+        <w:t>Tâche</w:t>
+      </w:r>
+      <w:r>
+        <w:rPr>
+          <w:rStyle w:val="CodeHTML"/>
+          <w:rFonts w:ascii="Times New Roman" w:hAnsi="Times New Roman" w:cs="Times New Roman"/>
+          <w:sz w:val="24"/>
+          <w:szCs w:val="24"/>
+        </w:rPr>
+        <w:t xml:space="preserve"> : Propose plusieurs modèles adaptés à ce problème de prédiction.</w:t>
+      </w:r>
+    </w:p>
+    <w:p>
+      <w:pPr>
+        <w:pStyle w:val="PrformatHTML"/>
+        <w:rPr>
+          <w:rStyle w:val="CodeHTML"/>
+          <w:rFonts w:ascii="Times New Roman" w:hAnsi="Times New Roman" w:cs="Times New Roman"/>
+          <w:sz w:val="24"/>
+          <w:szCs w:val="24"/>
+        </w:rPr>
+      </w:pPr>
+    </w:p>
+    <w:p>
+      <w:pPr>
+        <w:pStyle w:val="PrformatHTML"/>
+        <w:rPr>
+          <w:rStyle w:val="CodeHTML"/>
+          <w:rFonts w:ascii="Times New Roman" w:hAnsi="Times New Roman" w:cs="Times New Roman"/>
+          <w:sz w:val="24"/>
+          <w:szCs w:val="24"/>
+        </w:rPr>
+      </w:pPr>
+      <w:r>
+        <w:rPr>
+          <w:rStyle w:val="CodeHTML"/>
+          <w:rFonts w:ascii="Times New Roman" w:hAnsi="Times New Roman" w:cs="Times New Roman"/>
+          <w:b/>
+          <w:bCs/>
+          <w:sz w:val="24"/>
+          <w:szCs w:val="24"/>
+        </w:rPr>
+        <w:t>Pour chaque modèle, indique</w:t>
+      </w:r>
+      <w:r>
+        <w:rPr>
+          <w:rStyle w:val="CodeHTML"/>
+          <w:rFonts w:ascii="Times New Roman" w:hAnsi="Times New Roman" w:cs="Times New Roman"/>
+          <w:sz w:val="24"/>
+          <w:szCs w:val="24"/>
+        </w:rPr>
+        <w:t xml:space="preserve"> :</w:t>
+      </w:r>
+    </w:p>
+    <w:p>
+      <w:pPr>
+        <w:pStyle w:val="PrformatHTML"/>
+        <w:numPr>
+          <w:ilvl w:val="0"/>
+          <w:numId w:val="17"/>
+        </w:numPr>
+        <w:rPr>
+          <w:rStyle w:val="CodeHTML"/>
+          <w:rFonts w:ascii="Times New Roman" w:hAnsi="Times New Roman" w:cs="Times New Roman"/>
+          <w:sz w:val="24"/>
+          <w:szCs w:val="24"/>
+        </w:rPr>
+      </w:pPr>
+      <w:r>
+        <w:rPr>
+          <w:rStyle w:val="CodeHTML"/>
+          <w:rFonts w:ascii="Times New Roman" w:hAnsi="Times New Roman" w:cs="Times New Roman"/>
+          <w:sz w:val="24"/>
+          <w:szCs w:val="24"/>
+        </w:rPr>
+        <w:t>Principe de fonctionnement (résumé)</w:t>
+      </w:r>
+    </w:p>
+    <w:p>
+      <w:pPr>
+        <w:pStyle w:val="PrformatHTML"/>
+        <w:numPr>
+          <w:ilvl w:val="0"/>
+          <w:numId w:val="17"/>
+        </w:numPr>
+        <w:rPr>
+          <w:rStyle w:val="CodeHTML"/>
+          <w:rFonts w:ascii="Times New Roman" w:hAnsi="Times New Roman" w:cs="Times New Roman"/>
+          <w:sz w:val="24"/>
+          <w:szCs w:val="24"/>
+        </w:rPr>
+      </w:pPr>
+      <w:r>
+        <w:rPr>
+          <w:rStyle w:val="CodeHTML"/>
+          <w:rFonts w:ascii="Times New Roman" w:hAnsi="Times New Roman" w:cs="Times New Roman"/>
+          <w:sz w:val="24"/>
+          <w:szCs w:val="24"/>
+        </w:rPr>
+        <w:t>Avantages pour ce cas d'usage</w:t>
+      </w:r>
+    </w:p>
+    <w:p>
+      <w:pPr>
+        <w:pStyle w:val="PrformatHTML"/>
+        <w:numPr>
+          <w:ilvl w:val="0"/>
+          <w:numId w:val="17"/>
+        </w:numPr>
+        <w:rPr>
+          <w:rStyle w:val="CodeHTML"/>
+          <w:rFonts w:ascii="Times New Roman" w:hAnsi="Times New Roman" w:cs="Times New Roman"/>
+          <w:sz w:val="24"/>
+          <w:szCs w:val="24"/>
+        </w:rPr>
+      </w:pPr>
+      <w:r>
+        <w:rPr>
+          <w:rStyle w:val="CodeHTML"/>
+          <w:rFonts w:ascii="Times New Roman" w:hAnsi="Times New Roman" w:cs="Times New Roman"/>
+          <w:sz w:val="24"/>
+          <w:szCs w:val="24"/>
+        </w:rPr>
+        <w:t>Limites</w:t>
+      </w:r>
+    </w:p>
+    <w:p>
+      <w:pPr>
+        <w:pStyle w:val="PrformatHTML"/>
+        <w:numPr>
+          <w:ilvl w:val="0"/>
+          <w:numId w:val="17"/>
+        </w:numPr>
+        <w:rPr>
+          <w:rStyle w:val="CodeHTML"/>
+          <w:rFonts w:ascii="Times New Roman" w:hAnsi="Times New Roman" w:cs="Times New Roman"/>
+          <w:sz w:val="24"/>
+          <w:szCs w:val="24"/>
+        </w:rPr>
+      </w:pPr>
+      <w:r>
+        <w:rPr>
+          <w:rStyle w:val="CodeHTML"/>
+          <w:rFonts w:ascii="Times New Roman" w:hAnsi="Times New Roman" w:cs="Times New Roman"/>
+          <w:sz w:val="24"/>
+          <w:szCs w:val="24"/>
+        </w:rPr>
+        <w:t>Type de problème (régression / classification / série temporelle)</w:t>
+      </w:r>
+    </w:p>
+    <w:p>
+      <w:pPr>
+        <w:pStyle w:val="PrformatHTML"/>
+        <w:numPr>
+          <w:ilvl w:val="0"/>
+          <w:numId w:val="17"/>
+        </w:numPr>
+        <w:rPr>
+          <w:rStyle w:val="CodeHTML"/>
+          <w:rFonts w:ascii="Times New Roman" w:hAnsi="Times New Roman" w:cs="Times New Roman"/>
+          <w:sz w:val="24"/>
+          <w:szCs w:val="24"/>
+        </w:rPr>
+      </w:pPr>
+      <w:r>
+        <w:rPr>
+          <w:rStyle w:val="CodeHTML"/>
+          <w:rFonts w:ascii="Times New Roman" w:hAnsi="Times New Roman" w:cs="Times New Roman"/>
+          <w:sz w:val="24"/>
+          <w:szCs w:val="24"/>
+        </w:rPr>
+        <w:t>Métriques pertinentes pour évaluer ce modèle sur ce problème</w:t>
+      </w:r>
+    </w:p>
+    <w:p>
+      <w:pPr>
+        <w:pStyle w:val="PrformatHTML"/>
+        <w:rPr>
+          <w:rStyle w:val="CodeHTML"/>
+          <w:rFonts w:ascii="Times New Roman" w:hAnsi="Times New Roman" w:cs="Times New Roman"/>
+          <w:sz w:val="24"/>
+          <w:szCs w:val="24"/>
+        </w:rPr>
+      </w:pPr>
+    </w:p>
+    <w:p>
+      <w:pPr>
+        <w:pStyle w:val="PrformatHTML"/>
+        <w:rPr>
+          <w:rFonts w:ascii="Times New Roman" w:hAnsi="Times New Roman" w:cs="Times New Roman"/>
+          <w:sz w:val="24"/>
+          <w:szCs w:val="24"/>
+        </w:rPr>
+      </w:pPr>
+      <w:r>
+        <w:rPr>
+          <w:rStyle w:val="CodeHTML"/>
+          <w:rFonts w:ascii="Times New Roman" w:hAnsi="Times New Roman" w:cs="Times New Roman"/>
+          <w:b/>
+          <w:bCs/>
+          <w:sz w:val="24"/>
+          <w:szCs w:val="24"/>
+        </w:rPr>
+        <w:t>Format de sortie</w:t>
+      </w:r>
+      <w:r>
+        <w:rPr>
+          <w:rStyle w:val="CodeHTML"/>
+          <w:rFonts w:ascii="Times New Roman" w:hAnsi="Times New Roman" w:cs="Times New Roman"/>
+          <w:sz w:val="24"/>
+          <w:szCs w:val="24"/>
+        </w:rPr>
+        <w:t xml:space="preserve"> : un tableau comparatif des modèles proposés.</w:t>
+      </w:r>
+    </w:p>
+    <w:p>
+      <w:pPr>
+        <w:pStyle w:val="NormalWeb"/>
+        <w:rPr>
+          <w:rStyle w:val="lev"/>
+        </w:rPr>
+      </w:pPr>
+      <w:r>
+        <w:rPr>
+          <w:rStyle w:val="lev"/>
+        </w:rPr>
+        <w:t>Ré</w:t>
+      </w:r>
+      <w:r>
+        <w:rPr>
+          <w:rStyle w:val="lev"/>
+        </w:rPr>
+        <w:t>sultats :</w:t>
+      </w:r>
+    </w:p>
+    <w:tbl>
+      <w:tblPr>
+        <w:tblStyle w:val="TableauGrille4-Accentuation1"/>
+        <w:tblW w:w="10347" w:type="dxa"/>
+        <w:tblLook w:val="04A0" w:firstRow="1" w:lastRow="0" w:firstColumn="1" w:lastColumn="0" w:noHBand="0" w:noVBand="1"/>
+      </w:tblPr>
+      <w:tblGrid>
+        <w:gridCol w:w="1343"/>
+        <w:gridCol w:w="2218"/>
+        <w:gridCol w:w="2008"/>
+        <w:gridCol w:w="2201"/>
+        <w:gridCol w:w="1260"/>
+        <w:gridCol w:w="1317"/>
+      </w:tblGrid>
+      <w:tr>
+        <w:trPr>
+          <w:cnfStyle w:val="100000000000" w:firstRow="1" w:lastRow="0" w:firstColumn="0" w:lastColumn="0" w:oddVBand="0" w:evenVBand="0" w:oddHBand="0" w:evenHBand="0" w:firstRowFirstColumn="0" w:firstRowLastColumn="0" w:lastRowFirstColumn="0" w:lastRowLastColumn="0"/>
+          <w:trHeight w:val="751"/>
+        </w:trPr>
+        <w:tc>
+          <w:tcPr>
+            <w:cnfStyle w:val="001000000000" w:firstRow="0" w:lastRow="0" w:firstColumn="1" w:lastColumn="0" w:oddVBand="0" w:evenVBand="0" w:oddHBand="0" w:evenHBand="0" w:firstRowFirstColumn="0" w:firstRowLastColumn="0" w:lastRowFirstColumn="0" w:lastRowLastColumn="0"/>
+            <w:tcW w:w="0" w:type="auto"/>
+            <w:hideMark/>
+          </w:tcPr>
+          <w:p>
+            <w:pPr>
+              <w:rPr>
+                <w:lang w:eastAsia="fr-FR"/>
+              </w:rPr>
+            </w:pPr>
+            <w:r>
+              <w:rPr>
+                <w:lang w:eastAsia="fr-FR"/>
+              </w:rPr>
+              <w:t>Modèle</w:t>
+            </w:r>
+          </w:p>
+        </w:tc>
+        <w:tc>
+          <w:tcPr>
+            <w:tcW w:w="0" w:type="auto"/>
+            <w:hideMark/>
+          </w:tcPr>
+          <w:p>
+            <w:pPr>
+              <w:cnfStyle w:val="100000000000" w:firstRow="1" w:lastRow="0" w:firstColumn="0" w:lastColumn="0" w:oddVBand="0" w:evenVBand="0" w:oddHBand="0" w:evenHBand="0" w:firstRowFirstColumn="0" w:firstRowLastColumn="0" w:lastRowFirstColumn="0" w:lastRowLastColumn="0"/>
+              <w:rPr>
+                <w:lang w:eastAsia="fr-FR"/>
+              </w:rPr>
+            </w:pPr>
+            <w:r>
+              <w:rPr>
+                <w:lang w:eastAsia="fr-FR"/>
+              </w:rPr>
+              <w:t>Principe de fonctionnement</w:t>
+            </w:r>
+          </w:p>
+        </w:tc>
+        <w:tc>
+          <w:tcPr>
+            <w:tcW w:w="0" w:type="auto"/>
+            <w:hideMark/>
+          </w:tcPr>
+          <w:p>
+            <w:pPr>
+              <w:cnfStyle w:val="100000000000" w:firstRow="1" w:lastRow="0" w:firstColumn="0" w:lastColumn="0" w:oddVBand="0" w:evenVBand="0" w:oddHBand="0" w:evenHBand="0" w:firstRowFirstColumn="0" w:firstRowLastColumn="0" w:lastRowFirstColumn="0" w:lastRowLastColumn="0"/>
+              <w:rPr>
+                <w:lang w:eastAsia="fr-FR"/>
+              </w:rPr>
+            </w:pPr>
+            <w:r>
+              <w:rPr>
+                <w:lang w:eastAsia="fr-FR"/>
+              </w:rPr>
+              <w:t>Avantages pour ce cas d’usage</w:t>
+            </w:r>
+          </w:p>
+        </w:tc>
+        <w:tc>
+          <w:tcPr>
+            <w:tcW w:w="0" w:type="auto"/>
+            <w:hideMark/>
+          </w:tcPr>
+          <w:p>
+            <w:pPr>
+              <w:cnfStyle w:val="100000000000" w:firstRow="1" w:lastRow="0" w:firstColumn="0" w:lastColumn="0" w:oddVBand="0" w:evenVBand="0" w:oddHBand="0" w:evenHBand="0" w:firstRowFirstColumn="0" w:firstRowLastColumn="0" w:lastRowFirstColumn="0" w:lastRowLastColumn="0"/>
+              <w:rPr>
+                <w:lang w:eastAsia="fr-FR"/>
+              </w:rPr>
+            </w:pPr>
+            <w:r>
+              <w:rPr>
+                <w:lang w:eastAsia="fr-FR"/>
+              </w:rPr>
+              <w:t>Limites</w:t>
+            </w:r>
+          </w:p>
+        </w:tc>
+        <w:tc>
+          <w:tcPr>
+            <w:tcW w:w="0" w:type="auto"/>
+            <w:hideMark/>
+          </w:tcPr>
+          <w:p>
+            <w:pPr>
+              <w:cnfStyle w:val="100000000000" w:firstRow="1" w:lastRow="0" w:firstColumn="0" w:lastColumn="0" w:oddVBand="0" w:evenVBand="0" w:oddHBand="0" w:evenHBand="0" w:firstRowFirstColumn="0" w:firstRowLastColumn="0" w:lastRowFirstColumn="0" w:lastRowLastColumn="0"/>
+              <w:rPr>
+                <w:lang w:eastAsia="fr-FR"/>
+              </w:rPr>
+            </w:pPr>
+            <w:r>
+              <w:rPr>
+                <w:lang w:eastAsia="fr-FR"/>
+              </w:rPr>
+              <w:t>Type de problème</w:t>
+            </w:r>
+          </w:p>
+        </w:tc>
+        <w:tc>
+          <w:tcPr>
+            <w:tcW w:w="0" w:type="auto"/>
+            <w:hideMark/>
+          </w:tcPr>
+          <w:p>
+            <w:pPr>
+              <w:cnfStyle w:val="100000000000" w:firstRow="1" w:lastRow="0" w:firstColumn="0" w:lastColumn="0" w:oddVBand="0" w:evenVBand="0" w:oddHBand="0" w:evenHBand="0" w:firstRowFirstColumn="0" w:firstRowLastColumn="0" w:lastRowFirstColumn="0" w:lastRowLastColumn="0"/>
+              <w:rPr>
+                <w:lang w:eastAsia="fr-FR"/>
+              </w:rPr>
+            </w:pPr>
+            <w:r>
+              <w:rPr>
+                <w:lang w:eastAsia="fr-FR"/>
+              </w:rPr>
+              <w:t>Métriques pertinentes</w:t>
+            </w:r>
+          </w:p>
+        </w:tc>
+      </w:tr>
+      <w:tr>
+        <w:trPr>
+          <w:cnfStyle w:val="000000100000" w:firstRow="0" w:lastRow="0" w:firstColumn="0" w:lastColumn="0" w:oddVBand="0" w:evenVBand="0" w:oddHBand="1" w:evenHBand="0" w:firstRowFirstColumn="0" w:firstRowLastColumn="0" w:lastRowFirstColumn="0" w:lastRowLastColumn="0"/>
+          <w:trHeight w:val="2510"/>
+        </w:trPr>
+        <w:tc>
+          <w:tcPr>
+            <w:cnfStyle w:val="001000000000" w:firstRow="0" w:lastRow="0" w:firstColumn="1" w:lastColumn="0" w:oddVBand="0" w:evenVBand="0" w:oddHBand="0" w:evenHBand="0" w:firstRowFirstColumn="0" w:firstRowLastColumn="0" w:lastRowFirstColumn="0" w:lastRowLastColumn="0"/>
+            <w:tcW w:w="0" w:type="auto"/>
+            <w:hideMark/>
+          </w:tcPr>
+          <w:p>
+            <w:pPr>
+              <w:rPr>
+                <w:lang w:eastAsia="fr-FR"/>
+              </w:rPr>
+            </w:pPr>
+            <w:r>
+              <w:rPr>
+                <w:lang w:eastAsia="fr-FR"/>
+              </w:rPr>
+              <w:t>Régression linéaire</w:t>
+            </w:r>
+          </w:p>
+        </w:tc>
+        <w:tc>
+          <w:tcPr>
+            <w:tcW w:w="0" w:type="auto"/>
+            <w:hideMark/>
+          </w:tcPr>
+          <w:p>
+            <w:pPr>
+              <w:cnfStyle w:val="000000100000" w:firstRow="0" w:lastRow="0" w:firstColumn="0" w:lastColumn="0" w:oddVBand="0" w:evenVBand="0" w:oddHBand="1" w:evenHBand="0" w:firstRowFirstColumn="0" w:firstRowLastColumn="0" w:lastRowFirstColumn="0" w:lastRowLastColumn="0"/>
+              <w:rPr>
+                <w:lang w:eastAsia="fr-FR"/>
+              </w:rPr>
+            </w:pPr>
+            <w:r>
+              <w:rPr>
+                <w:lang w:eastAsia="fr-FR"/>
+              </w:rPr>
+              <w:t>Cherche une relation linéaire entre la consommation et les variables explicatives (</w:t>
+            </w:r>
+            <w:proofErr w:type="spellStart"/>
+            <w:r>
+              <w:rPr>
+                <w:lang w:eastAsia="fr-FR"/>
+              </w:rPr>
+              <w:t>temperature</w:t>
+            </w:r>
+            <w:proofErr w:type="spellEnd"/>
+            <w:r>
+              <w:rPr>
+                <w:lang w:eastAsia="fr-FR"/>
+              </w:rPr>
+              <w:t xml:space="preserve">, </w:t>
+            </w:r>
+            <w:proofErr w:type="spellStart"/>
+            <w:r>
+              <w:rPr>
+                <w:lang w:eastAsia="fr-FR"/>
+              </w:rPr>
+              <w:t>humidite</w:t>
+            </w:r>
+            <w:proofErr w:type="spellEnd"/>
+            <w:r>
+              <w:rPr>
+                <w:lang w:eastAsia="fr-FR"/>
+              </w:rPr>
+              <w:t>, pression, etc.).</w:t>
+            </w:r>
+          </w:p>
+        </w:tc>
+        <w:tc>
+          <w:tcPr>
+            <w:tcW w:w="0" w:type="auto"/>
+            <w:hideMark/>
+          </w:tcPr>
+          <w:p>
+            <w:pPr>
+              <w:cnfStyle w:val="000000100000" w:firstRow="0" w:lastRow="0" w:firstColumn="0" w:lastColumn="0" w:oddVBand="0" w:evenVBand="0" w:oddHBand="1" w:evenHBand="0" w:firstRowFirstColumn="0" w:firstRowLastColumn="0" w:lastRowFirstColumn="0" w:lastRowLastColumn="0"/>
+              <w:rPr>
+                <w:lang w:eastAsia="fr-FR"/>
+              </w:rPr>
+            </w:pPr>
+            <w:r>
+              <w:rPr>
+                <w:lang w:eastAsia="fr-FR"/>
+              </w:rPr>
+              <w:t>Simple, rapide et facilement interprétable. Bon modèle de référence (</w:t>
+            </w:r>
+            <w:proofErr w:type="spellStart"/>
+            <w:r>
+              <w:rPr>
+                <w:lang w:eastAsia="fr-FR"/>
+              </w:rPr>
+              <w:t>baseline</w:t>
+            </w:r>
+            <w:proofErr w:type="spellEnd"/>
+            <w:r>
+              <w:rPr>
+                <w:lang w:eastAsia="fr-FR"/>
+              </w:rPr>
+              <w:t>).</w:t>
+            </w:r>
+          </w:p>
+        </w:tc>
+        <w:tc>
+          <w:tcPr>
+            <w:tcW w:w="0" w:type="auto"/>
+            <w:hideMark/>
+          </w:tcPr>
+          <w:p>
+            <w:pPr>
+              <w:cnfStyle w:val="000000100000" w:firstRow="0" w:lastRow="0" w:firstColumn="0" w:lastColumn="0" w:oddVBand="0" w:evenVBand="0" w:oddHBand="1" w:evenHBand="0" w:firstRowFirstColumn="0" w:firstRowLastColumn="0" w:lastRowFirstColumn="0" w:lastRowLastColumn="0"/>
+              <w:rPr>
+                <w:lang w:eastAsia="fr-FR"/>
+              </w:rPr>
+            </w:pPr>
+            <w:r>
+              <w:rPr>
+                <w:lang w:eastAsia="fr-FR"/>
+              </w:rPr>
+              <w:t>Peut mal représenter les relations non linéaires entre les capteurs et la consommation. Sensible aux valeurs aberrantes.</w:t>
+            </w:r>
+          </w:p>
+        </w:tc>
+        <w:tc>
+          <w:tcPr>
+            <w:tcW w:w="0" w:type="auto"/>
+            <w:hideMark/>
+          </w:tcPr>
+          <w:p>
+            <w:pPr>
+              <w:cnfStyle w:val="000000100000" w:firstRow="0" w:lastRow="0" w:firstColumn="0" w:lastColumn="0" w:oddVBand="0" w:evenVBand="0" w:oddHBand="1" w:evenHBand="0" w:firstRowFirstColumn="0" w:firstRowLastColumn="0" w:lastRowFirstColumn="0" w:lastRowLastColumn="0"/>
+              <w:rPr>
+                <w:lang w:eastAsia="fr-FR"/>
+              </w:rPr>
+            </w:pPr>
+            <w:r>
+              <w:rPr>
+                <w:lang w:eastAsia="fr-FR"/>
+              </w:rPr>
+              <w:t>Régression</w:t>
+            </w:r>
+          </w:p>
+        </w:tc>
+        <w:tc>
+          <w:tcPr>
+            <w:tcW w:w="0" w:type="auto"/>
+            <w:hideMark/>
+          </w:tcPr>
+          <w:p>
+            <w:pPr>
+              <w:cnfStyle w:val="000000100000" w:firstRow="0" w:lastRow="0" w:firstColumn="0" w:lastColumn="0" w:oddVBand="0" w:evenVBand="0" w:oddHBand="1" w:evenHBand="0" w:firstRowFirstColumn="0" w:firstRowLastColumn="0" w:lastRowFirstColumn="0" w:lastRowLastColumn="0"/>
+              <w:rPr>
+                <w:lang w:eastAsia="fr-FR"/>
+              </w:rPr>
+            </w:pPr>
+            <w:r>
+              <w:rPr>
+                <w:lang w:eastAsia="fr-FR"/>
+              </w:rPr>
+              <w:t>MAE, RMSE, R², MAPE</w:t>
+            </w:r>
+          </w:p>
+        </w:tc>
+      </w:tr>
+      <w:tr>
+        <w:trPr>
+          <w:trHeight w:val="2991"/>
+        </w:trPr>
+        <w:tc>
+          <w:tcPr>
+            <w:cnfStyle w:val="001000000000" w:firstRow="0" w:lastRow="0" w:firstColumn="1" w:lastColumn="0" w:oddVBand="0" w:evenVBand="0" w:oddHBand="0" w:evenHBand="0" w:firstRowFirstColumn="0" w:firstRowLastColumn="0" w:lastRowFirstColumn="0" w:lastRowLastColumn="0"/>
+            <w:tcW w:w="0" w:type="auto"/>
+            <w:hideMark/>
+          </w:tcPr>
+          <w:p>
+            <w:pPr>
+              <w:rPr>
+                <w:lang w:eastAsia="fr-FR"/>
+              </w:rPr>
+            </w:pPr>
+            <w:proofErr w:type="spellStart"/>
+            <w:r>
+              <w:rPr>
+                <w:lang w:eastAsia="fr-FR"/>
+              </w:rPr>
+              <w:t>Random</w:t>
+            </w:r>
+            <w:proofErr w:type="spellEnd"/>
+            <w:r>
+              <w:rPr>
+                <w:lang w:eastAsia="fr-FR"/>
+              </w:rPr>
+              <w:t xml:space="preserve"> Forest </w:t>
+            </w:r>
+            <w:proofErr w:type="spellStart"/>
+            <w:r>
+              <w:rPr>
+                <w:lang w:eastAsia="fr-FR"/>
+              </w:rPr>
+              <w:t>Regressor</w:t>
+            </w:r>
+            <w:proofErr w:type="spellEnd"/>
+          </w:p>
+        </w:tc>
+        <w:tc>
+          <w:tcPr>
+            <w:tcW w:w="0" w:type="auto"/>
+            <w:hideMark/>
+          </w:tcPr>
+          <w:p>
+            <w:pPr>
+              <w:cnfStyle w:val="000000000000" w:firstRow="0" w:lastRow="0" w:firstColumn="0" w:lastColumn="0" w:oddVBand="0" w:evenVBand="0" w:oddHBand="0" w:evenHBand="0" w:firstRowFirstColumn="0" w:firstRowLastColumn="0" w:lastRowFirstColumn="0" w:lastRowLastColumn="0"/>
+              <w:rPr>
+                <w:lang w:eastAsia="fr-FR"/>
+              </w:rPr>
+            </w:pPr>
+            <w:r>
+              <w:rPr>
+                <w:lang w:eastAsia="fr-FR"/>
+              </w:rPr>
+              <w:t>Construit plusieurs arbres de décision et combine leurs prédictions pour obtenir une estimation plus robuste.</w:t>
+            </w:r>
+          </w:p>
+        </w:tc>
+        <w:tc>
+          <w:tcPr>
+            <w:tcW w:w="0" w:type="auto"/>
+            <w:hideMark/>
+          </w:tcPr>
+          <w:p>
+            <w:pPr>
+              <w:cnfStyle w:val="000000000000" w:firstRow="0" w:lastRow="0" w:firstColumn="0" w:lastColumn="0" w:oddVBand="0" w:evenVBand="0" w:oddHBand="0" w:evenHBand="0" w:firstRowFirstColumn="0" w:firstRowLastColumn="0" w:lastRowFirstColumn="0" w:lastRowLastColumn="0"/>
+              <w:rPr>
+                <w:lang w:eastAsia="fr-FR"/>
+              </w:rPr>
+            </w:pPr>
+            <w:r>
+              <w:rPr>
+                <w:lang w:eastAsia="fr-FR"/>
+              </w:rPr>
+              <w:t xml:space="preserve">Capture les relations non linéaires et les interactions entre variables. Peu sensible aux valeurs aberrantes. Fonctionne bien sur de petits </w:t>
+            </w:r>
+            <w:proofErr w:type="spellStart"/>
+            <w:r>
+              <w:rPr>
+                <w:lang w:eastAsia="fr-FR"/>
+              </w:rPr>
+              <w:t>datasets</w:t>
+            </w:r>
+            <w:proofErr w:type="spellEnd"/>
+            <w:r>
+              <w:rPr>
+                <w:lang w:eastAsia="fr-FR"/>
+              </w:rPr>
+              <w:t>.</w:t>
+            </w:r>
+          </w:p>
+        </w:tc>
+        <w:tc>
+          <w:tcPr>
+            <w:tcW w:w="0" w:type="auto"/>
+            <w:hideMark/>
+          </w:tcPr>
+          <w:p>
+            <w:pPr>
+              <w:cnfStyle w:val="000000000000" w:firstRow="0" w:lastRow="0" w:firstColumn="0" w:lastColumn="0" w:oddVBand="0" w:evenVBand="0" w:oddHBand="0" w:evenHBand="0" w:firstRowFirstColumn="0" w:firstRowLastColumn="0" w:lastRowFirstColumn="0" w:lastRowLastColumn="0"/>
+              <w:rPr>
+                <w:lang w:eastAsia="fr-FR"/>
+              </w:rPr>
+            </w:pPr>
+            <w:r>
+              <w:rPr>
+                <w:lang w:eastAsia="fr-FR"/>
+              </w:rPr>
+              <w:t xml:space="preserve">Moins interprétable qu'une régression linéaire. </w:t>
+            </w:r>
+            <w:proofErr w:type="spellStart"/>
+            <w:r>
+              <w:rPr>
+                <w:lang w:eastAsia="fr-FR"/>
+              </w:rPr>
+              <w:t>Peut être</w:t>
+            </w:r>
+            <w:proofErr w:type="spellEnd"/>
+            <w:r>
+              <w:rPr>
+                <w:lang w:eastAsia="fr-FR"/>
+              </w:rPr>
+              <w:t xml:space="preserve"> moins performant pour extrapoler dans le temps.</w:t>
+            </w:r>
+          </w:p>
+        </w:tc>
+        <w:tc>
+          <w:tcPr>
+            <w:tcW w:w="0" w:type="auto"/>
+            <w:hideMark/>
+          </w:tcPr>
+          <w:p>
+            <w:pPr>
+              <w:cnfStyle w:val="000000000000" w:firstRow="0" w:lastRow="0" w:firstColumn="0" w:lastColumn="0" w:oddVBand="0" w:evenVBand="0" w:oddHBand="0" w:evenHBand="0" w:firstRowFirstColumn="0" w:firstRowLastColumn="0" w:lastRowFirstColumn="0" w:lastRowLastColumn="0"/>
+              <w:rPr>
+                <w:lang w:eastAsia="fr-FR"/>
+              </w:rPr>
+            </w:pPr>
+            <w:r>
+              <w:rPr>
+                <w:lang w:eastAsia="fr-FR"/>
+              </w:rPr>
+              <w:t>Régression</w:t>
+            </w:r>
+          </w:p>
+        </w:tc>
+        <w:tc>
+          <w:tcPr>
+            <w:tcW w:w="0" w:type="auto"/>
+            <w:hideMark/>
+          </w:tcPr>
+          <w:p>
+            <w:pPr>
+              <w:cnfStyle w:val="000000000000" w:firstRow="0" w:lastRow="0" w:firstColumn="0" w:lastColumn="0" w:oddVBand="0" w:evenVBand="0" w:oddHBand="0" w:evenHBand="0" w:firstRowFirstColumn="0" w:firstRowLastColumn="0" w:lastRowFirstColumn="0" w:lastRowLastColumn="0"/>
+              <w:rPr>
+                <w:lang w:eastAsia="fr-FR"/>
+              </w:rPr>
+            </w:pPr>
+            <w:r>
+              <w:rPr>
+                <w:lang w:eastAsia="fr-FR"/>
+              </w:rPr>
+              <w:t>MAE, RMSE, R²</w:t>
+            </w:r>
+          </w:p>
+        </w:tc>
+      </w:tr>
+      <w:tr>
+        <w:trPr>
+          <w:cnfStyle w:val="000000100000" w:firstRow="0" w:lastRow="0" w:firstColumn="0" w:lastColumn="0" w:oddVBand="0" w:evenVBand="0" w:oddHBand="1" w:evenHBand="0" w:firstRowFirstColumn="0" w:firstRowLastColumn="0" w:lastRowFirstColumn="0" w:lastRowLastColumn="0"/>
+          <w:trHeight w:val="999"/>
+        </w:trPr>
+        <w:tc>
+          <w:tcPr>
+            <w:cnfStyle w:val="001000000000" w:firstRow="0" w:lastRow="0" w:firstColumn="1" w:lastColumn="0" w:oddVBand="0" w:evenVBand="0" w:oddHBand="0" w:evenHBand="0" w:firstRowFirstColumn="0" w:firstRowLastColumn="0" w:lastRowFirstColumn="0" w:lastRowLastColumn="0"/>
+            <w:tcW w:w="0" w:type="auto"/>
+            <w:hideMark/>
+          </w:tcPr>
+          <w:p>
+            <w:pPr>
+              <w:rPr>
+                <w:lang w:eastAsia="fr-FR"/>
+              </w:rPr>
+            </w:pPr>
+            <w:r>
+              <w:rPr>
+                <w:lang w:eastAsia="fr-FR"/>
+              </w:rPr>
+              <w:t xml:space="preserve">Gradient </w:t>
+            </w:r>
+            <w:proofErr w:type="spellStart"/>
+            <w:r>
+              <w:rPr>
+                <w:lang w:eastAsia="fr-FR"/>
+              </w:rPr>
+              <w:t>Boosting</w:t>
+            </w:r>
+            <w:proofErr w:type="spellEnd"/>
+            <w:r>
+              <w:rPr>
+                <w:lang w:eastAsia="fr-FR"/>
+              </w:rPr>
+              <w:t xml:space="preserve"> / </w:t>
+            </w:r>
+            <w:proofErr w:type="spellStart"/>
+            <w:r>
+              <w:rPr>
+                <w:lang w:eastAsia="fr-FR"/>
+              </w:rPr>
+              <w:t>XGBoost</w:t>
+            </w:r>
+            <w:proofErr w:type="spellEnd"/>
+          </w:p>
+        </w:tc>
+        <w:tc>
+          <w:tcPr>
+            <w:tcW w:w="0" w:type="auto"/>
+            <w:hideMark/>
+          </w:tcPr>
+          <w:p>
+            <w:pPr>
+              <w:cnfStyle w:val="000000100000" w:firstRow="0" w:lastRow="0" w:firstColumn="0" w:lastColumn="0" w:oddVBand="0" w:evenVBand="0" w:oddHBand="1" w:evenHBand="0" w:firstRowFirstColumn="0" w:firstRowLastColumn="0" w:lastRowFirstColumn="0" w:lastRowLastColumn="0"/>
+              <w:rPr>
+                <w:lang w:eastAsia="fr-FR"/>
+              </w:rPr>
+            </w:pPr>
+            <w:r>
+              <w:rPr>
+                <w:lang w:eastAsia="fr-FR"/>
+              </w:rPr>
+              <w:t>Construit progressivement des arbres, chaque nouvel arbre corrigeant les erreurs des précédents.</w:t>
+            </w:r>
+          </w:p>
+        </w:tc>
+        <w:tc>
+          <w:tcPr>
+            <w:tcW w:w="0" w:type="auto"/>
+            <w:hideMark/>
+          </w:tcPr>
+          <w:p>
+            <w:pPr>
+              <w:cnfStyle w:val="000000100000" w:firstRow="0" w:lastRow="0" w:firstColumn="0" w:lastColumn="0" w:oddVBand="0" w:evenVBand="0" w:oddHBand="1" w:evenHBand="0" w:firstRowFirstColumn="0" w:firstRowLastColumn="0" w:lastRowFirstColumn="0" w:lastRowLastColumn="0"/>
+              <w:rPr>
+                <w:lang w:eastAsia="fr-FR"/>
+              </w:rPr>
+            </w:pPr>
+            <w:r>
+              <w:rPr>
+                <w:lang w:eastAsia="fr-FR"/>
+              </w:rPr>
+              <w:t xml:space="preserve">Très performant sur les données tabulaires. Capture efficacement les relations complexes entre température, </w:t>
+            </w:r>
+            <w:r>
+              <w:rPr>
+                <w:lang w:eastAsia="fr-FR"/>
+              </w:rPr>
+              <w:lastRenderedPageBreak/>
+              <w:t>humidité, pression et consommation.</w:t>
+            </w:r>
+          </w:p>
+        </w:tc>
+        <w:tc>
+          <w:tcPr>
+            <w:tcW w:w="0" w:type="auto"/>
+            <w:hideMark/>
+          </w:tcPr>
+          <w:p>
+            <w:pPr>
+              <w:cnfStyle w:val="000000100000" w:firstRow="0" w:lastRow="0" w:firstColumn="0" w:lastColumn="0" w:oddVBand="0" w:evenVBand="0" w:oddHBand="1" w:evenHBand="0" w:firstRowFirstColumn="0" w:firstRowLastColumn="0" w:lastRowFirstColumn="0" w:lastRowLastColumn="0"/>
+              <w:rPr>
+                <w:lang w:eastAsia="fr-FR"/>
+              </w:rPr>
+            </w:pPr>
+            <w:r>
+              <w:rPr>
+                <w:lang w:eastAsia="fr-FR"/>
+              </w:rPr>
+              <w:lastRenderedPageBreak/>
+              <w:t>Nécessite un réglage des hyperparamètres. Risque de surapprentissage avec seulement 596 observations.</w:t>
+            </w:r>
+          </w:p>
+        </w:tc>
+        <w:tc>
+          <w:tcPr>
+            <w:tcW w:w="0" w:type="auto"/>
+            <w:hideMark/>
+          </w:tcPr>
+          <w:p>
+            <w:pPr>
+              <w:cnfStyle w:val="000000100000" w:firstRow="0" w:lastRow="0" w:firstColumn="0" w:lastColumn="0" w:oddVBand="0" w:evenVBand="0" w:oddHBand="1" w:evenHBand="0" w:firstRowFirstColumn="0" w:firstRowLastColumn="0" w:lastRowFirstColumn="0" w:lastRowLastColumn="0"/>
+              <w:rPr>
+                <w:lang w:eastAsia="fr-FR"/>
+              </w:rPr>
+            </w:pPr>
+            <w:r>
+              <w:rPr>
+                <w:lang w:eastAsia="fr-FR"/>
+              </w:rPr>
+              <w:t>Régression</w:t>
+            </w:r>
+          </w:p>
+        </w:tc>
+        <w:tc>
+          <w:tcPr>
+            <w:tcW w:w="0" w:type="auto"/>
+            <w:hideMark/>
+          </w:tcPr>
+          <w:p>
+            <w:pPr>
+              <w:cnfStyle w:val="000000100000" w:firstRow="0" w:lastRow="0" w:firstColumn="0" w:lastColumn="0" w:oddVBand="0" w:evenVBand="0" w:oddHBand="1" w:evenHBand="0" w:firstRowFirstColumn="0" w:firstRowLastColumn="0" w:lastRowFirstColumn="0" w:lastRowLastColumn="0"/>
+              <w:rPr>
+                <w:lang w:eastAsia="fr-FR"/>
+              </w:rPr>
+            </w:pPr>
+            <w:r>
+              <w:rPr>
+                <w:lang w:eastAsia="fr-FR"/>
+              </w:rPr>
+              <w:t>MAE, RMSE, R², MAPE</w:t>
+            </w:r>
+          </w:p>
+        </w:tc>
+      </w:tr>
+      <w:tr>
+        <w:trPr>
+          <w:trHeight w:val="2494"/>
+        </w:trPr>
+        <w:tc>
+          <w:tcPr>
+            <w:cnfStyle w:val="001000000000" w:firstRow="0" w:lastRow="0" w:firstColumn="1" w:lastColumn="0" w:oddVBand="0" w:evenVBand="0" w:oddHBand="0" w:evenHBand="0" w:firstRowFirstColumn="0" w:firstRowLastColumn="0" w:lastRowFirstColumn="0" w:lastRowLastColumn="0"/>
+            <w:tcW w:w="0" w:type="auto"/>
+            <w:hideMark/>
+          </w:tcPr>
+          <w:p>
+            <w:pPr>
+              <w:rPr>
+                <w:lang w:eastAsia="fr-FR"/>
+              </w:rPr>
+            </w:pPr>
+            <w:proofErr w:type="spellStart"/>
+            <w:r>
+              <w:rPr>
+                <w:lang w:eastAsia="fr-FR"/>
+              </w:rPr>
+              <w:t>LightGBM</w:t>
+            </w:r>
+            <w:proofErr w:type="spellEnd"/>
+          </w:p>
+        </w:tc>
+        <w:tc>
+          <w:tcPr>
+            <w:tcW w:w="0" w:type="auto"/>
+            <w:hideMark/>
+          </w:tcPr>
+          <w:p>
+            <w:pPr>
+              <w:cnfStyle w:val="000000000000" w:firstRow="0" w:lastRow="0" w:firstColumn="0" w:lastColumn="0" w:oddVBand="0" w:evenVBand="0" w:oddHBand="0" w:evenHBand="0" w:firstRowFirstColumn="0" w:firstRowLastColumn="0" w:lastRowFirstColumn="0" w:lastRowLastColumn="0"/>
+              <w:rPr>
+                <w:lang w:eastAsia="fr-FR"/>
+              </w:rPr>
+            </w:pPr>
+            <w:r>
+              <w:rPr>
+                <w:lang w:eastAsia="fr-FR"/>
+              </w:rPr>
+              <w:t xml:space="preserve">Utilise un algorithme de gradient </w:t>
+            </w:r>
+            <w:proofErr w:type="spellStart"/>
+            <w:r>
+              <w:rPr>
+                <w:lang w:eastAsia="fr-FR"/>
+              </w:rPr>
+              <w:t>boosting</w:t>
+            </w:r>
+            <w:proofErr w:type="spellEnd"/>
+            <w:r>
+              <w:rPr>
+                <w:lang w:eastAsia="fr-FR"/>
+              </w:rPr>
+              <w:t xml:space="preserve"> basé sur des arbres optimisés pour être rapide et efficace.</w:t>
+            </w:r>
+          </w:p>
+        </w:tc>
+        <w:tc>
+          <w:tcPr>
+            <w:tcW w:w="0" w:type="auto"/>
+            <w:hideMark/>
+          </w:tcPr>
+          <w:p>
+            <w:pPr>
+              <w:cnfStyle w:val="000000000000" w:firstRow="0" w:lastRow="0" w:firstColumn="0" w:lastColumn="0" w:oddVBand="0" w:evenVBand="0" w:oddHBand="0" w:evenHBand="0" w:firstRowFirstColumn="0" w:firstRowLastColumn="0" w:lastRowFirstColumn="0" w:lastRowLastColumn="0"/>
+              <w:rPr>
+                <w:lang w:eastAsia="fr-FR"/>
+              </w:rPr>
+            </w:pPr>
+            <w:r>
+              <w:rPr>
+                <w:lang w:eastAsia="fr-FR"/>
+              </w:rPr>
+              <w:t>Très performant sur les données tabulaires et capable de modéliser des relations non linéaires complexes.</w:t>
+            </w:r>
+          </w:p>
+        </w:tc>
+        <w:tc>
+          <w:tcPr>
+            <w:tcW w:w="0" w:type="auto"/>
+            <w:hideMark/>
+          </w:tcPr>
+          <w:p>
+            <w:pPr>
+              <w:cnfStyle w:val="000000000000" w:firstRow="0" w:lastRow="0" w:firstColumn="0" w:lastColumn="0" w:oddVBand="0" w:evenVBand="0" w:oddHBand="0" w:evenHBand="0" w:firstRowFirstColumn="0" w:firstRowLastColumn="0" w:lastRowFirstColumn="0" w:lastRowLastColumn="0"/>
+              <w:rPr>
+                <w:lang w:eastAsia="fr-FR"/>
+              </w:rPr>
+            </w:pPr>
+            <w:r>
+              <w:rPr>
+                <w:lang w:eastAsia="fr-FR"/>
+              </w:rPr>
+              <w:t>Avec seulement 596 lignes, son avantage en vitesse est peu important. Peut facilement surapprendre si le modèle est trop complexe.</w:t>
+            </w:r>
+          </w:p>
+        </w:tc>
+        <w:tc>
+          <w:tcPr>
+            <w:tcW w:w="0" w:type="auto"/>
+            <w:hideMark/>
+          </w:tcPr>
+          <w:p>
+            <w:pPr>
+              <w:cnfStyle w:val="000000000000" w:firstRow="0" w:lastRow="0" w:firstColumn="0" w:lastColumn="0" w:oddVBand="0" w:evenVBand="0" w:oddHBand="0" w:evenHBand="0" w:firstRowFirstColumn="0" w:firstRowLastColumn="0" w:lastRowFirstColumn="0" w:lastRowLastColumn="0"/>
+              <w:rPr>
+                <w:lang w:eastAsia="fr-FR"/>
+              </w:rPr>
+            </w:pPr>
+            <w:r>
+              <w:rPr>
+                <w:lang w:eastAsia="fr-FR"/>
+              </w:rPr>
+              <w:t>Régression</w:t>
+            </w:r>
+          </w:p>
+        </w:tc>
+        <w:tc>
+          <w:tcPr>
+            <w:tcW w:w="0" w:type="auto"/>
+            <w:hideMark/>
+          </w:tcPr>
+          <w:p>
+            <w:pPr>
+              <w:cnfStyle w:val="000000000000" w:firstRow="0" w:lastRow="0" w:firstColumn="0" w:lastColumn="0" w:oddVBand="0" w:evenVBand="0" w:oddHBand="0" w:evenHBand="0" w:firstRowFirstColumn="0" w:firstRowLastColumn="0" w:lastRowFirstColumn="0" w:lastRowLastColumn="0"/>
+              <w:rPr>
+                <w:lang w:eastAsia="fr-FR"/>
+              </w:rPr>
+            </w:pPr>
+            <w:r>
+              <w:rPr>
+                <w:lang w:eastAsia="fr-FR"/>
+              </w:rPr>
+              <w:t>MAE, RMSE, R²</w:t>
+            </w:r>
+          </w:p>
+        </w:tc>
+      </w:tr>
+      <w:tr>
+        <w:trPr>
+          <w:cnfStyle w:val="000000100000" w:firstRow="0" w:lastRow="0" w:firstColumn="0" w:lastColumn="0" w:oddVBand="0" w:evenVBand="0" w:oddHBand="1" w:evenHBand="0" w:firstRowFirstColumn="0" w:firstRowLastColumn="0" w:lastRowFirstColumn="0" w:lastRowLastColumn="0"/>
+          <w:trHeight w:val="3487"/>
+        </w:trPr>
+        <w:tc>
+          <w:tcPr>
+            <w:cnfStyle w:val="001000000000" w:firstRow="0" w:lastRow="0" w:firstColumn="1" w:lastColumn="0" w:oddVBand="0" w:evenVBand="0" w:oddHBand="0" w:evenHBand="0" w:firstRowFirstColumn="0" w:firstRowLastColumn="0" w:lastRowFirstColumn="0" w:lastRowLastColumn="0"/>
+            <w:tcW w:w="0" w:type="auto"/>
+            <w:hideMark/>
+          </w:tcPr>
+          <w:p>
+            <w:pPr>
+              <w:rPr>
+                <w:lang w:eastAsia="fr-FR"/>
+              </w:rPr>
+            </w:pPr>
+            <w:r>
+              <w:rPr>
+                <w:lang w:eastAsia="fr-FR"/>
+              </w:rPr>
+              <w:t xml:space="preserve">SVR (Support </w:t>
+            </w:r>
+            <w:proofErr w:type="spellStart"/>
+            <w:r>
+              <w:rPr>
+                <w:lang w:eastAsia="fr-FR"/>
+              </w:rPr>
+              <w:t>Vector</w:t>
+            </w:r>
+            <w:proofErr w:type="spellEnd"/>
+            <w:r>
+              <w:rPr>
+                <w:lang w:eastAsia="fr-FR"/>
+              </w:rPr>
+              <w:t xml:space="preserve"> </w:t>
+            </w:r>
+            <w:proofErr w:type="spellStart"/>
+            <w:r>
+              <w:rPr>
+                <w:lang w:eastAsia="fr-FR"/>
+              </w:rPr>
+              <w:t>Regression</w:t>
+            </w:r>
+            <w:proofErr w:type="spellEnd"/>
+            <w:r>
+              <w:rPr>
+                <w:lang w:eastAsia="fr-FR"/>
+              </w:rPr>
+              <w:t>)</w:t>
+            </w:r>
+          </w:p>
+        </w:tc>
+        <w:tc>
+          <w:tcPr>
+            <w:tcW w:w="0" w:type="auto"/>
+            <w:hideMark/>
+          </w:tcPr>
+          <w:p>
+            <w:pPr>
+              <w:cnfStyle w:val="000000100000" w:firstRow="0" w:lastRow="0" w:firstColumn="0" w:lastColumn="0" w:oddVBand="0" w:evenVBand="0" w:oddHBand="1" w:evenHBand="0" w:firstRowFirstColumn="0" w:firstRowLastColumn="0" w:lastRowFirstColumn="0" w:lastRowLastColumn="0"/>
+              <w:rPr>
+                <w:lang w:eastAsia="fr-FR"/>
+              </w:rPr>
+            </w:pPr>
+            <w:r>
+              <w:rPr>
+                <w:lang w:eastAsia="fr-FR"/>
+              </w:rPr>
+              <w:t>Cherche une fonction permettant de prédire les valeurs tout en tolérant une certaine erreur autour des observations. Avec un noyau RBF, il peut modéliser des relations non linéaires.</w:t>
+            </w:r>
+          </w:p>
+        </w:tc>
+        <w:tc>
+          <w:tcPr>
+            <w:tcW w:w="0" w:type="auto"/>
+            <w:hideMark/>
+          </w:tcPr>
+          <w:p>
+            <w:pPr>
+              <w:cnfStyle w:val="000000100000" w:firstRow="0" w:lastRow="0" w:firstColumn="0" w:lastColumn="0" w:oddVBand="0" w:evenVBand="0" w:oddHBand="1" w:evenHBand="0" w:firstRowFirstColumn="0" w:firstRowLastColumn="0" w:lastRowFirstColumn="0" w:lastRowLastColumn="0"/>
+              <w:rPr>
+                <w:lang w:eastAsia="fr-FR"/>
+              </w:rPr>
+            </w:pPr>
+            <w:r>
+              <w:rPr>
+                <w:lang w:eastAsia="fr-FR"/>
+              </w:rPr>
+              <w:t>Intéressant pour un petit dataset comme celui-ci. Peut être efficace avec peu d'observations.</w:t>
+            </w:r>
+          </w:p>
+        </w:tc>
+        <w:tc>
+          <w:tcPr>
+            <w:tcW w:w="0" w:type="auto"/>
+            <w:hideMark/>
+          </w:tcPr>
+          <w:p>
+            <w:pPr>
+              <w:cnfStyle w:val="000000100000" w:firstRow="0" w:lastRow="0" w:firstColumn="0" w:lastColumn="0" w:oddVBand="0" w:evenVBand="0" w:oddHBand="1" w:evenHBand="0" w:firstRowFirstColumn="0" w:firstRowLastColumn="0" w:lastRowFirstColumn="0" w:lastRowLastColumn="0"/>
+              <w:rPr>
+                <w:lang w:eastAsia="fr-FR"/>
+              </w:rPr>
+            </w:pPr>
+            <w:r>
+              <w:rPr>
+                <w:lang w:eastAsia="fr-FR"/>
+              </w:rPr>
+              <w:t>Nécessite généralement une standardisation des variables et un réglage de C, gamma et epsilon. Moins facile à interpréter.</w:t>
+            </w:r>
+          </w:p>
+        </w:tc>
+        <w:tc>
+          <w:tcPr>
+            <w:tcW w:w="0" w:type="auto"/>
+            <w:hideMark/>
+          </w:tcPr>
+          <w:p>
+            <w:pPr>
+              <w:cnfStyle w:val="000000100000" w:firstRow="0" w:lastRow="0" w:firstColumn="0" w:lastColumn="0" w:oddVBand="0" w:evenVBand="0" w:oddHBand="1" w:evenHBand="0" w:firstRowFirstColumn="0" w:firstRowLastColumn="0" w:lastRowFirstColumn="0" w:lastRowLastColumn="0"/>
+              <w:rPr>
+                <w:lang w:eastAsia="fr-FR"/>
+              </w:rPr>
+            </w:pPr>
+            <w:r>
+              <w:rPr>
+                <w:lang w:eastAsia="fr-FR"/>
+              </w:rPr>
+              <w:t>Régression</w:t>
+            </w:r>
+          </w:p>
+        </w:tc>
+        <w:tc>
+          <w:tcPr>
+            <w:tcW w:w="0" w:type="auto"/>
+            <w:hideMark/>
+          </w:tcPr>
+          <w:p>
+            <w:pPr>
+              <w:cnfStyle w:val="000000100000" w:firstRow="0" w:lastRow="0" w:firstColumn="0" w:lastColumn="0" w:oddVBand="0" w:evenVBand="0" w:oddHBand="1" w:evenHBand="0" w:firstRowFirstColumn="0" w:firstRowLastColumn="0" w:lastRowFirstColumn="0" w:lastRowLastColumn="0"/>
+              <w:rPr>
+                <w:lang w:eastAsia="fr-FR"/>
+              </w:rPr>
+            </w:pPr>
+            <w:r>
+              <w:rPr>
+                <w:lang w:eastAsia="fr-FR"/>
+              </w:rPr>
+              <w:t>MAE, RMSE, R²</w:t>
+            </w:r>
+          </w:p>
+        </w:tc>
+      </w:tr>
+      <w:tr>
+        <w:trPr>
+          <w:trHeight w:val="1991"/>
+        </w:trPr>
+        <w:tc>
+          <w:tcPr>
+            <w:cnfStyle w:val="001000000000" w:firstRow="0" w:lastRow="0" w:firstColumn="1" w:lastColumn="0" w:oddVBand="0" w:evenVBand="0" w:oddHBand="0" w:evenHBand="0" w:firstRowFirstColumn="0" w:firstRowLastColumn="0" w:lastRowFirstColumn="0" w:lastRowLastColumn="0"/>
+            <w:tcW w:w="0" w:type="auto"/>
+            <w:hideMark/>
+          </w:tcPr>
+          <w:p>
+            <w:pPr>
+              <w:rPr>
+                <w:lang w:eastAsia="fr-FR"/>
+              </w:rPr>
+            </w:pPr>
+            <w:r>
+              <w:rPr>
+                <w:lang w:eastAsia="fr-FR"/>
+              </w:rPr>
+              <w:t xml:space="preserve">KNN </w:t>
+            </w:r>
+            <w:proofErr w:type="spellStart"/>
+            <w:r>
+              <w:rPr>
+                <w:lang w:eastAsia="fr-FR"/>
+              </w:rPr>
+              <w:t>Regressor</w:t>
+            </w:r>
+            <w:proofErr w:type="spellEnd"/>
+          </w:p>
+        </w:tc>
+        <w:tc>
+          <w:tcPr>
+            <w:tcW w:w="0" w:type="auto"/>
+            <w:hideMark/>
+          </w:tcPr>
+          <w:p>
+            <w:pPr>
+              <w:cnfStyle w:val="000000000000" w:firstRow="0" w:lastRow="0" w:firstColumn="0" w:lastColumn="0" w:oddVBand="0" w:evenVBand="0" w:oddHBand="0" w:evenHBand="0" w:firstRowFirstColumn="0" w:firstRowLastColumn="0" w:lastRowFirstColumn="0" w:lastRowLastColumn="0"/>
+              <w:rPr>
+                <w:lang w:eastAsia="fr-FR"/>
+              </w:rPr>
+            </w:pPr>
+            <w:r>
+              <w:rPr>
+                <w:lang w:eastAsia="fr-FR"/>
+              </w:rPr>
+              <w:t>Prédit la consommation à partir des observations les plus proches dans l'espace des variables.</w:t>
+            </w:r>
+          </w:p>
+        </w:tc>
+        <w:tc>
+          <w:tcPr>
+            <w:tcW w:w="0" w:type="auto"/>
+            <w:hideMark/>
+          </w:tcPr>
+          <w:p>
+            <w:pPr>
+              <w:cnfStyle w:val="000000000000" w:firstRow="0" w:lastRow="0" w:firstColumn="0" w:lastColumn="0" w:oddVBand="0" w:evenVBand="0" w:oddHBand="0" w:evenHBand="0" w:firstRowFirstColumn="0" w:firstRowLastColumn="0" w:lastRowFirstColumn="0" w:lastRowLastColumn="0"/>
+              <w:rPr>
+                <w:lang w:eastAsia="fr-FR"/>
+              </w:rPr>
+            </w:pPr>
+            <w:r>
+              <w:rPr>
+                <w:lang w:eastAsia="fr-FR"/>
+              </w:rPr>
+              <w:t>Très simple à mettre en œuvre et peut être intéressant comme modèle de comparaison.</w:t>
+            </w:r>
+          </w:p>
+        </w:tc>
+        <w:tc>
+          <w:tcPr>
+            <w:tcW w:w="0" w:type="auto"/>
+            <w:hideMark/>
+          </w:tcPr>
+          <w:p>
+            <w:pPr>
+              <w:cnfStyle w:val="000000000000" w:firstRow="0" w:lastRow="0" w:firstColumn="0" w:lastColumn="0" w:oddVBand="0" w:evenVBand="0" w:oddHBand="0" w:evenHBand="0" w:firstRowFirstColumn="0" w:firstRowLastColumn="0" w:lastRowFirstColumn="0" w:lastRowLastColumn="0"/>
+              <w:rPr>
+                <w:lang w:eastAsia="fr-FR"/>
+              </w:rPr>
+            </w:pPr>
+            <w:r>
+              <w:rPr>
+                <w:lang w:eastAsia="fr-FR"/>
+              </w:rPr>
+              <w:t>Sensible à l'échelle des variables et au choix de k. Peu performant si les données sont dispersées.</w:t>
+            </w:r>
+          </w:p>
+        </w:tc>
+        <w:tc>
+          <w:tcPr>
+            <w:tcW w:w="0" w:type="auto"/>
+            <w:hideMark/>
+          </w:tcPr>
+          <w:p>
+            <w:pPr>
+              <w:cnfStyle w:val="000000000000" w:firstRow="0" w:lastRow="0" w:firstColumn="0" w:lastColumn="0" w:oddVBand="0" w:evenVBand="0" w:oddHBand="0" w:evenHBand="0" w:firstRowFirstColumn="0" w:firstRowLastColumn="0" w:lastRowFirstColumn="0" w:lastRowLastColumn="0"/>
+              <w:rPr>
+                <w:lang w:eastAsia="fr-FR"/>
+              </w:rPr>
+            </w:pPr>
+            <w:r>
+              <w:rPr>
+                <w:lang w:eastAsia="fr-FR"/>
+              </w:rPr>
+              <w:t>Régression</w:t>
+            </w:r>
+          </w:p>
+        </w:tc>
+        <w:tc>
+          <w:tcPr>
+            <w:tcW w:w="0" w:type="auto"/>
+            <w:hideMark/>
+          </w:tcPr>
+          <w:p>
+            <w:pPr>
+              <w:cnfStyle w:val="000000000000" w:firstRow="0" w:lastRow="0" w:firstColumn="0" w:lastColumn="0" w:oddVBand="0" w:evenVBand="0" w:oddHBand="0" w:evenHBand="0" w:firstRowFirstColumn="0" w:firstRowLastColumn="0" w:lastRowFirstColumn="0" w:lastRowLastColumn="0"/>
+              <w:rPr>
+                <w:lang w:eastAsia="fr-FR"/>
+              </w:rPr>
+            </w:pPr>
+            <w:r>
+              <w:rPr>
+                <w:lang w:eastAsia="fr-FR"/>
+              </w:rPr>
+              <w:t>MAE, RMSE, R²</w:t>
+            </w:r>
+          </w:p>
+        </w:tc>
+      </w:tr>
+      <w:tr>
+        <w:trPr>
+          <w:cnfStyle w:val="000000100000" w:firstRow="0" w:lastRow="0" w:firstColumn="0" w:lastColumn="0" w:oddVBand="0" w:evenVBand="0" w:oddHBand="1" w:evenHBand="0" w:firstRowFirstColumn="0" w:firstRowLastColumn="0" w:lastRowFirstColumn="0" w:lastRowLastColumn="0"/>
+          <w:trHeight w:val="1750"/>
+        </w:trPr>
+        <w:tc>
+          <w:tcPr>
+            <w:cnfStyle w:val="001000000000" w:firstRow="0" w:lastRow="0" w:firstColumn="1" w:lastColumn="0" w:oddVBand="0" w:evenVBand="0" w:oddHBand="0" w:evenHBand="0" w:firstRowFirstColumn="0" w:firstRowLastColumn="0" w:lastRowFirstColumn="0" w:lastRowLastColumn="0"/>
+            <w:tcW w:w="0" w:type="auto"/>
+            <w:hideMark/>
+          </w:tcPr>
+          <w:p>
+            <w:pPr>
+              <w:rPr>
+                <w:lang w:eastAsia="fr-FR"/>
+              </w:rPr>
+            </w:pPr>
+            <w:r>
+              <w:rPr>
+                <w:lang w:eastAsia="fr-FR"/>
+              </w:rPr>
+              <w:t>Réseau de neurones (MLP)</w:t>
+            </w:r>
+          </w:p>
+        </w:tc>
+        <w:tc>
+          <w:tcPr>
+            <w:tcW w:w="0" w:type="auto"/>
+            <w:hideMark/>
+          </w:tcPr>
+          <w:p>
+            <w:pPr>
+              <w:cnfStyle w:val="000000100000" w:firstRow="0" w:lastRow="0" w:firstColumn="0" w:lastColumn="0" w:oddVBand="0" w:evenVBand="0" w:oddHBand="1" w:evenHBand="0" w:firstRowFirstColumn="0" w:firstRowLastColumn="0" w:lastRowFirstColumn="0" w:lastRowLastColumn="0"/>
+              <w:rPr>
+                <w:lang w:eastAsia="fr-FR"/>
+              </w:rPr>
+            </w:pPr>
+            <w:r>
+              <w:rPr>
+                <w:lang w:eastAsia="fr-FR"/>
+              </w:rPr>
+              <w:t>Apprend une fonction non linéaire reliant les caractéristiques des capteurs à la consommation.</w:t>
+            </w:r>
+          </w:p>
+        </w:tc>
+        <w:tc>
+          <w:tcPr>
+            <w:tcW w:w="0" w:type="auto"/>
+            <w:hideMark/>
+          </w:tcPr>
+          <w:p>
+            <w:pPr>
+              <w:cnfStyle w:val="000000100000" w:firstRow="0" w:lastRow="0" w:firstColumn="0" w:lastColumn="0" w:oddVBand="0" w:evenVBand="0" w:oddHBand="1" w:evenHBand="0" w:firstRowFirstColumn="0" w:firstRowLastColumn="0" w:lastRowFirstColumn="0" w:lastRowLastColumn="0"/>
+              <w:rPr>
+                <w:lang w:eastAsia="fr-FR"/>
+              </w:rPr>
+            </w:pPr>
+            <w:r>
+              <w:rPr>
+                <w:lang w:eastAsia="fr-FR"/>
+              </w:rPr>
+              <w:t xml:space="preserve">Peut apprendre des relations complexes et servir de base à une approche </w:t>
+            </w:r>
+            <w:proofErr w:type="spellStart"/>
+            <w:r>
+              <w:rPr>
+                <w:lang w:eastAsia="fr-FR"/>
+              </w:rPr>
+              <w:t>Deep</w:t>
+            </w:r>
+            <w:proofErr w:type="spellEnd"/>
+            <w:r>
+              <w:rPr>
+                <w:lang w:eastAsia="fr-FR"/>
+              </w:rPr>
+              <w:t xml:space="preserve"> Learning.</w:t>
+            </w:r>
+          </w:p>
+        </w:tc>
+        <w:tc>
+          <w:tcPr>
+            <w:tcW w:w="0" w:type="auto"/>
+            <w:hideMark/>
+          </w:tcPr>
+          <w:p>
+            <w:pPr>
+              <w:cnfStyle w:val="000000100000" w:firstRow="0" w:lastRow="0" w:firstColumn="0" w:lastColumn="0" w:oddVBand="0" w:evenVBand="0" w:oddHBand="1" w:evenHBand="0" w:firstRowFirstColumn="0" w:firstRowLastColumn="0" w:lastRowFirstColumn="0" w:lastRowLastColumn="0"/>
+              <w:rPr>
+                <w:lang w:eastAsia="fr-FR"/>
+              </w:rPr>
+            </w:pPr>
+            <w:r>
+              <w:rPr>
+                <w:lang w:eastAsia="fr-FR"/>
+              </w:rPr>
+              <w:t>596 observations sont peu nombreuses pour un réseau profond. Risque important de surapprentissage. Nécessite une standardisation.</w:t>
+            </w:r>
+          </w:p>
+        </w:tc>
+        <w:tc>
+          <w:tcPr>
+            <w:tcW w:w="0" w:type="auto"/>
+            <w:hideMark/>
+          </w:tcPr>
+          <w:p>
+            <w:pPr>
+              <w:cnfStyle w:val="000000100000" w:firstRow="0" w:lastRow="0" w:firstColumn="0" w:lastColumn="0" w:oddVBand="0" w:evenVBand="0" w:oddHBand="1" w:evenHBand="0" w:firstRowFirstColumn="0" w:firstRowLastColumn="0" w:lastRowFirstColumn="0" w:lastRowLastColumn="0"/>
+              <w:rPr>
+                <w:lang w:eastAsia="fr-FR"/>
+              </w:rPr>
+            </w:pPr>
+            <w:r>
+              <w:rPr>
+                <w:lang w:eastAsia="fr-FR"/>
+              </w:rPr>
+              <w:t>Régression</w:t>
+            </w:r>
+          </w:p>
+        </w:tc>
+        <w:tc>
+          <w:tcPr>
+            <w:tcW w:w="0" w:type="auto"/>
+            <w:hideMark/>
+          </w:tcPr>
+          <w:p>
+            <w:pPr>
+              <w:cnfStyle w:val="000000100000" w:firstRow="0" w:lastRow="0" w:firstColumn="0" w:lastColumn="0" w:oddVBand="0" w:evenVBand="0" w:oddHBand="1" w:evenHBand="0" w:firstRowFirstColumn="0" w:firstRowLastColumn="0" w:lastRowFirstColumn="0" w:lastRowLastColumn="0"/>
+              <w:rPr>
+                <w:lang w:eastAsia="fr-FR"/>
+              </w:rPr>
+            </w:pPr>
+            <w:r>
+              <w:rPr>
+                <w:lang w:eastAsia="fr-FR"/>
+              </w:rPr>
+              <w:t>MAE, RMSE, R²</w:t>
+            </w:r>
+          </w:p>
+        </w:tc>
+      </w:tr>
+      <w:tr>
+        <w:trPr>
+          <w:trHeight w:val="2991"/>
+        </w:trPr>
+        <w:tc>
+          <w:tcPr>
+            <w:cnfStyle w:val="001000000000" w:firstRow="0" w:lastRow="0" w:firstColumn="1" w:lastColumn="0" w:oddVBand="0" w:evenVBand="0" w:oddHBand="0" w:evenHBand="0" w:firstRowFirstColumn="0" w:firstRowLastColumn="0" w:lastRowFirstColumn="0" w:lastRowLastColumn="0"/>
+            <w:tcW w:w="0" w:type="auto"/>
+            <w:hideMark/>
+          </w:tcPr>
+          <w:p>
+            <w:pPr>
+              <w:rPr>
+                <w:lang w:eastAsia="fr-FR"/>
+              </w:rPr>
+            </w:pPr>
+            <w:r>
+              <w:rPr>
+                <w:lang w:eastAsia="fr-FR"/>
+              </w:rPr>
+              <w:t>ARIMA / SARIMA</w:t>
+            </w:r>
+          </w:p>
+        </w:tc>
+        <w:tc>
+          <w:tcPr>
+            <w:tcW w:w="0" w:type="auto"/>
+            <w:hideMark/>
+          </w:tcPr>
+          <w:p>
+            <w:pPr>
+              <w:cnfStyle w:val="000000000000" w:firstRow="0" w:lastRow="0" w:firstColumn="0" w:lastColumn="0" w:oddVBand="0" w:evenVBand="0" w:oddHBand="0" w:evenHBand="0" w:firstRowFirstColumn="0" w:firstRowLastColumn="0" w:lastRowFirstColumn="0" w:lastRowLastColumn="0"/>
+              <w:rPr>
+                <w:lang w:eastAsia="fr-FR"/>
+              </w:rPr>
+            </w:pPr>
+            <w:r>
+              <w:rPr>
+                <w:lang w:eastAsia="fr-FR"/>
+              </w:rPr>
+              <w:t>Modélise principalement l'évolution temporelle de la consommation à partir de ses valeurs passées et, pour SARIMA, de structures saisonnières.</w:t>
+            </w:r>
+          </w:p>
+        </w:tc>
+        <w:tc>
+          <w:tcPr>
+            <w:tcW w:w="0" w:type="auto"/>
+            <w:hideMark/>
+          </w:tcPr>
+          <w:p>
+            <w:pPr>
+              <w:cnfStyle w:val="000000000000" w:firstRow="0" w:lastRow="0" w:firstColumn="0" w:lastColumn="0" w:oddVBand="0" w:evenVBand="0" w:oddHBand="0" w:evenHBand="0" w:firstRowFirstColumn="0" w:firstRowLastColumn="0" w:lastRowFirstColumn="0" w:lastRowLastColumn="0"/>
+              <w:rPr>
+                <w:lang w:eastAsia="fr-FR"/>
+              </w:rPr>
+            </w:pPr>
+            <w:r>
+              <w:rPr>
+                <w:lang w:eastAsia="fr-FR"/>
+              </w:rPr>
+              <w:t>Pertinent si la consommation présente une forte dépendance temporelle ou une saisonnalité.</w:t>
+            </w:r>
+          </w:p>
+        </w:tc>
+        <w:tc>
+          <w:tcPr>
+            <w:tcW w:w="0" w:type="auto"/>
+            <w:hideMark/>
+          </w:tcPr>
+          <w:p>
+            <w:pPr>
+              <w:cnfStyle w:val="000000000000" w:firstRow="0" w:lastRow="0" w:firstColumn="0" w:lastColumn="0" w:oddVBand="0" w:evenVBand="0" w:oddHBand="0" w:evenHBand="0" w:firstRowFirstColumn="0" w:firstRowLastColumn="0" w:lastRowFirstColumn="0" w:lastRowLastColumn="0"/>
+              <w:rPr>
+                <w:lang w:eastAsia="fr-FR"/>
+              </w:rPr>
+            </w:pPr>
+            <w:r>
+              <w:rPr>
+                <w:lang w:eastAsia="fr-FR"/>
+              </w:rPr>
+              <w:t>Utilise moins directement les variables IoT comme température, humidité et pression. Nécessite une série temporelle suffisamment structurée.</w:t>
+            </w:r>
+          </w:p>
+        </w:tc>
+        <w:tc>
+          <w:tcPr>
+            <w:tcW w:w="0" w:type="auto"/>
+            <w:hideMark/>
+          </w:tcPr>
+          <w:p>
+            <w:pPr>
+              <w:cnfStyle w:val="000000000000" w:firstRow="0" w:lastRow="0" w:firstColumn="0" w:lastColumn="0" w:oddVBand="0" w:evenVBand="0" w:oddHBand="0" w:evenHBand="0" w:firstRowFirstColumn="0" w:firstRowLastColumn="0" w:lastRowFirstColumn="0" w:lastRowLastColumn="0"/>
+              <w:rPr>
+                <w:lang w:eastAsia="fr-FR"/>
+              </w:rPr>
+            </w:pPr>
+            <w:r>
+              <w:rPr>
+                <w:lang w:eastAsia="fr-FR"/>
+              </w:rPr>
+              <w:t>Série temporelle / Régression</w:t>
+            </w:r>
+          </w:p>
+        </w:tc>
+        <w:tc>
+          <w:tcPr>
+            <w:tcW w:w="0" w:type="auto"/>
+            <w:hideMark/>
+          </w:tcPr>
+          <w:p>
+            <w:pPr>
+              <w:cnfStyle w:val="000000000000" w:firstRow="0" w:lastRow="0" w:firstColumn="0" w:lastColumn="0" w:oddVBand="0" w:evenVBand="0" w:oddHBand="0" w:evenHBand="0" w:firstRowFirstColumn="0" w:firstRowLastColumn="0" w:lastRowFirstColumn="0" w:lastRowLastColumn="0"/>
+              <w:rPr>
+                <w:lang w:eastAsia="fr-FR"/>
+              </w:rPr>
+            </w:pPr>
+            <w:r>
+              <w:rPr>
+                <w:lang w:eastAsia="fr-FR"/>
+              </w:rPr>
+              <w:t>MAE, RMSE, RMSE, MAPE</w:t>
+            </w:r>
+          </w:p>
+        </w:tc>
+      </w:tr>
+      <w:tr>
+        <w:trPr>
+          <w:cnfStyle w:val="000000100000" w:firstRow="0" w:lastRow="0" w:firstColumn="0" w:lastColumn="0" w:oddVBand="0" w:evenVBand="0" w:oddHBand="1" w:evenHBand="0" w:firstRowFirstColumn="0" w:firstRowLastColumn="0" w:lastRowFirstColumn="0" w:lastRowLastColumn="0"/>
+          <w:trHeight w:val="2247"/>
+        </w:trPr>
+        <w:tc>
+          <w:tcPr>
+            <w:cnfStyle w:val="001000000000" w:firstRow="0" w:lastRow="0" w:firstColumn="1" w:lastColumn="0" w:oddVBand="0" w:evenVBand="0" w:oddHBand="0" w:evenHBand="0" w:firstRowFirstColumn="0" w:firstRowLastColumn="0" w:lastRowFirstColumn="0" w:lastRowLastColumn="0"/>
+            <w:tcW w:w="0" w:type="auto"/>
+            <w:hideMark/>
+          </w:tcPr>
+          <w:p>
+            <w:pPr>
+              <w:rPr>
+                <w:lang w:eastAsia="fr-FR"/>
+              </w:rPr>
+            </w:pPr>
+            <w:r>
+              <w:rPr>
+                <w:lang w:eastAsia="fr-FR"/>
+              </w:rPr>
+              <w:lastRenderedPageBreak/>
+              <w:t>LSTM</w:t>
+            </w:r>
+          </w:p>
+        </w:tc>
+        <w:tc>
+          <w:tcPr>
+            <w:tcW w:w="0" w:type="auto"/>
+            <w:hideMark/>
+          </w:tcPr>
+          <w:p>
+            <w:pPr>
+              <w:cnfStyle w:val="000000100000" w:firstRow="0" w:lastRow="0" w:firstColumn="0" w:lastColumn="0" w:oddVBand="0" w:evenVBand="0" w:oddHBand="1" w:evenHBand="0" w:firstRowFirstColumn="0" w:firstRowLastColumn="0" w:lastRowFirstColumn="0" w:lastRowLastColumn="0"/>
+              <w:rPr>
+                <w:lang w:eastAsia="fr-FR"/>
+              </w:rPr>
+            </w:pPr>
+            <w:r>
+              <w:rPr>
+                <w:lang w:eastAsia="fr-FR"/>
+              </w:rPr>
+              <w:t>Réseau neuronal récurrent conçu pour apprendre des dépendances dans des séquences temporelles.</w:t>
+            </w:r>
+          </w:p>
+        </w:tc>
+        <w:tc>
+          <w:tcPr>
+            <w:tcW w:w="0" w:type="auto"/>
+            <w:hideMark/>
+          </w:tcPr>
+          <w:p>
+            <w:pPr>
+              <w:cnfStyle w:val="000000100000" w:firstRow="0" w:lastRow="0" w:firstColumn="0" w:lastColumn="0" w:oddVBand="0" w:evenVBand="0" w:oddHBand="1" w:evenHBand="0" w:firstRowFirstColumn="0" w:firstRowLastColumn="0" w:lastRowFirstColumn="0" w:lastRowLastColumn="0"/>
+              <w:rPr>
+                <w:lang w:eastAsia="fr-FR"/>
+              </w:rPr>
+            </w:pPr>
+            <w:r>
+              <w:rPr>
+                <w:lang w:eastAsia="fr-FR"/>
+              </w:rPr>
+              <w:t>Peut exploiter l'historique de température, humidité, pression et consommation pour prédire les prochaines valeurs.</w:t>
+            </w:r>
+          </w:p>
+        </w:tc>
+        <w:tc>
+          <w:tcPr>
+            <w:tcW w:w="0" w:type="auto"/>
+            <w:hideMark/>
+          </w:tcPr>
+          <w:p>
+            <w:pPr>
+              <w:cnfStyle w:val="000000100000" w:firstRow="0" w:lastRow="0" w:firstColumn="0" w:lastColumn="0" w:oddVBand="0" w:evenVBand="0" w:oddHBand="1" w:evenHBand="0" w:firstRowFirstColumn="0" w:firstRowLastColumn="0" w:lastRowFirstColumn="0" w:lastRowLastColumn="0"/>
+              <w:rPr>
+                <w:lang w:eastAsia="fr-FR"/>
+              </w:rPr>
+            </w:pPr>
+            <w:r>
+              <w:rPr>
+                <w:lang w:eastAsia="fr-FR"/>
+              </w:rPr>
+              <w:t>Trop complexe pour seulement 596 observations. Risque élevé de surapprentissage et entraînement plus difficile.</w:t>
+            </w:r>
+          </w:p>
+        </w:tc>
+        <w:tc>
+          <w:tcPr>
+            <w:tcW w:w="0" w:type="auto"/>
+            <w:hideMark/>
+          </w:tcPr>
+          <w:p>
+            <w:pPr>
+              <w:cnfStyle w:val="000000100000" w:firstRow="0" w:lastRow="0" w:firstColumn="0" w:lastColumn="0" w:oddVBand="0" w:evenVBand="0" w:oddHBand="1" w:evenHBand="0" w:firstRowFirstColumn="0" w:firstRowLastColumn="0" w:lastRowFirstColumn="0" w:lastRowLastColumn="0"/>
+              <w:rPr>
+                <w:lang w:eastAsia="fr-FR"/>
+              </w:rPr>
+            </w:pPr>
+            <w:r>
+              <w:rPr>
+                <w:lang w:eastAsia="fr-FR"/>
+              </w:rPr>
+              <w:t>Série temporelle / Régression</w:t>
+            </w:r>
+          </w:p>
+        </w:tc>
+        <w:tc>
+          <w:tcPr>
+            <w:tcW w:w="0" w:type="auto"/>
+            <w:hideMark/>
+          </w:tcPr>
+          <w:p>
+            <w:pPr>
+              <w:cnfStyle w:val="000000100000" w:firstRow="0" w:lastRow="0" w:firstColumn="0" w:lastColumn="0" w:oddVBand="0" w:evenVBand="0" w:oddHBand="1" w:evenHBand="0" w:firstRowFirstColumn="0" w:firstRowLastColumn="0" w:lastRowFirstColumn="0" w:lastRowLastColumn="0"/>
+              <w:rPr>
+                <w:lang w:eastAsia="fr-FR"/>
+              </w:rPr>
+            </w:pPr>
+            <w:r>
+              <w:rPr>
+                <w:lang w:eastAsia="fr-FR"/>
+              </w:rPr>
+              <w:t>MAE, RMSE, R²</w:t>
+            </w:r>
+          </w:p>
+        </w:tc>
+      </w:tr>
+    </w:tbl>
+    <w:p>
+      <w:pPr>
+        <w:pStyle w:val="NormalWeb"/>
+      </w:pPr>
+      <w:r>
+        <w:drawing>
+          <wp:inline distT="0" distB="0" distL="0" distR="0" wp14:anchorId="73E76566" wp14:editId="0F29DD6A">
+            <wp:extent cx="5169166" cy="4210266"/>
+            <wp:effectExtent l="0" t="0" r="0" b="0"/>
+            <wp:docPr id="27" name="Image 27"/>
+            <wp:cNvGraphicFramePr>
+              <a:graphicFrameLocks xmlns:a="http://schemas.openxmlformats.org/drawingml/2006/main" noChangeAspect="1"/>
+            </wp:cNvGraphicFramePr>
+            <a:graphic xmlns:a="http://schemas.openxmlformats.org/drawingml/2006/main">
+              <a:graphicData uri="http://schemas.openxmlformats.org/drawingml/2006/picture">
+                <pic:pic xmlns:pic="http://schemas.openxmlformats.org/drawingml/2006/picture">
+                  <pic:nvPicPr>
+                    <pic:cNvPr id="1" name=""/>
+                    <pic:cNvPicPr/>
+                  </pic:nvPicPr>
+                  <pic:blipFill>
+                    <a:blip r:embed="rId31"/>
+                    <a:stretch>
+                      <a:fillRect/>
+                    </a:stretch>
+                  </pic:blipFill>
+                  <pic:spPr>
+                    <a:xfrm>
+                      <a:off x="0" y="0"/>
+                      <a:ext cx="5169166" cy="4210266"/>
+                    </a:xfrm>
+                    <a:prstGeom prst="rect">
+                      <a:avLst/>
+                    </a:prstGeom>
+                  </pic:spPr>
+                </pic:pic>
+              </a:graphicData>
+            </a:graphic>
+          </wp:inline>
+        </w:drawing>
+      </w:r>
+    </w:p>
+    <w:p>
+      <w:pPr>
+        <w:pStyle w:val="NormalWeb"/>
+        <w:rPr>
+          <w:rStyle w:val="CodeHTML"/>
+          <w:rFonts w:ascii="Times New Roman" w:hAnsi="Times New Roman" w:cs="Times New Roman"/>
+          <w:sz w:val="24"/>
+          <w:szCs w:val="24"/>
+        </w:rPr>
+      </w:pPr>
+    </w:p>
     <w:sectPr>
       <w:pgSz w:w="11906" w:h="16838"/>
       <w:pgMar w:top="1418" w:right="1418" w:bottom="1418" w:left="1418" w:header="709" w:footer="709" w:gutter="0"/>
@@ -12518,95 +14438,9 @@
     </w:lvl>
   </w:abstractNum>
   <w:abstractNum w:abstractNumId="13" w15:restartNumberingAfterBreak="0">
-    <w:nsid w:val="5E0B23B2"/>
+    <w:nsid w:val="5DF708BE"/>
     <w:multiLevelType w:val="hybridMultilevel"/>
-    <w:tmpl w:val="42507AA4"/>
-    <w:lvl w:ilvl="0" w:tplc="040C0011">
-      <w:start w:val="1"/>
-      <w:numFmt w:val="decimal"/>
-      <w:lvlText w:val="%1)"/>
-      <w:lvlJc w:val="left"/>
-      <w:pPr>
-        <w:ind w:left="720" w:hanging="360"/>
-      </w:pPr>
-    </w:lvl>
-    <w:lvl w:ilvl="1" w:tplc="040C0019" w:tentative="1">
-      <w:start w:val="1"/>
-      <w:numFmt w:val="lowerLetter"/>
-      <w:lvlText w:val="%2."/>
-      <w:lvlJc w:val="left"/>
-      <w:pPr>
-        <w:ind w:left="1440" w:hanging="360"/>
-      </w:pPr>
-    </w:lvl>
-    <w:lvl w:ilvl="2" w:tplc="040C001B" w:tentative="1">
-      <w:start w:val="1"/>
-      <w:numFmt w:val="lowerRoman"/>
-      <w:lvlText w:val="%3."/>
-      <w:lvlJc w:val="right"/>
-      <w:pPr>
-        <w:ind w:left="2160" w:hanging="180"/>
-      </w:pPr>
-    </w:lvl>
-    <w:lvl w:ilvl="3" w:tplc="040C000F" w:tentative="1">
-      <w:start w:val="1"/>
-      <w:numFmt w:val="decimal"/>
-      <w:lvlText w:val="%4."/>
-      <w:lvlJc w:val="left"/>
-      <w:pPr>
-        <w:ind w:left="2880" w:hanging="360"/>
-      </w:pPr>
-    </w:lvl>
-    <w:lvl w:ilvl="4" w:tplc="040C0019" w:tentative="1">
-      <w:start w:val="1"/>
-      <w:numFmt w:val="lowerLetter"/>
-      <w:lvlText w:val="%5."/>
-      <w:lvlJc w:val="left"/>
-      <w:pPr>
-        <w:ind w:left="3600" w:hanging="360"/>
-      </w:pPr>
-    </w:lvl>
-    <w:lvl w:ilvl="5" w:tplc="040C001B" w:tentative="1">
-      <w:start w:val="1"/>
-      <w:numFmt w:val="lowerRoman"/>
-      <w:lvlText w:val="%6."/>
-      <w:lvlJc w:val="right"/>
-      <w:pPr>
-        <w:ind w:left="4320" w:hanging="180"/>
-      </w:pPr>
-    </w:lvl>
-    <w:lvl w:ilvl="6" w:tplc="040C000F" w:tentative="1">
-      <w:start w:val="1"/>
-      <w:numFmt w:val="decimal"/>
-      <w:lvlText w:val="%7."/>
-      <w:lvlJc w:val="left"/>
-      <w:pPr>
-        <w:ind w:left="5040" w:hanging="360"/>
-      </w:pPr>
-    </w:lvl>
-    <w:lvl w:ilvl="7" w:tplc="040C0019" w:tentative="1">
-      <w:start w:val="1"/>
-      <w:numFmt w:val="lowerLetter"/>
-      <w:lvlText w:val="%8."/>
-      <w:lvlJc w:val="left"/>
-      <w:pPr>
-        <w:ind w:left="5760" w:hanging="360"/>
-      </w:pPr>
-    </w:lvl>
-    <w:lvl w:ilvl="8" w:tplc="040C001B" w:tentative="1">
-      <w:start w:val="1"/>
-      <w:numFmt w:val="lowerRoman"/>
-      <w:lvlText w:val="%9."/>
-      <w:lvlJc w:val="right"/>
-      <w:pPr>
-        <w:ind w:left="6480" w:hanging="180"/>
-      </w:pPr>
-    </w:lvl>
-  </w:abstractNum>
-  <w:abstractNum w:abstractNumId="14" w15:restartNumberingAfterBreak="0">
-    <w:nsid w:val="6F710360"/>
-    <w:multiLevelType w:val="hybridMultilevel"/>
-    <w:tmpl w:val="66BCC23A"/>
+    <w:tmpl w:val="2AF0B416"/>
     <w:lvl w:ilvl="0" w:tplc="040C0001">
       <w:start w:val="1"/>
       <w:numFmt w:val="bullet"/>
@@ -12716,7 +14550,206 @@
       </w:rPr>
     </w:lvl>
   </w:abstractNum>
+  <w:abstractNum w:abstractNumId="14" w15:restartNumberingAfterBreak="0">
+    <w:nsid w:val="5E0B23B2"/>
+    <w:multiLevelType w:val="hybridMultilevel"/>
+    <w:tmpl w:val="42507AA4"/>
+    <w:lvl w:ilvl="0" w:tplc="040C0011">
+      <w:start w:val="1"/>
+      <w:numFmt w:val="decimal"/>
+      <w:lvlText w:val="%1)"/>
+      <w:lvlJc w:val="left"/>
+      <w:pPr>
+        <w:ind w:left="720" w:hanging="360"/>
+      </w:pPr>
+    </w:lvl>
+    <w:lvl w:ilvl="1" w:tplc="040C0019" w:tentative="1">
+      <w:start w:val="1"/>
+      <w:numFmt w:val="lowerLetter"/>
+      <w:lvlText w:val="%2."/>
+      <w:lvlJc w:val="left"/>
+      <w:pPr>
+        <w:ind w:left="1440" w:hanging="360"/>
+      </w:pPr>
+    </w:lvl>
+    <w:lvl w:ilvl="2" w:tplc="040C001B" w:tentative="1">
+      <w:start w:val="1"/>
+      <w:numFmt w:val="lowerRoman"/>
+      <w:lvlText w:val="%3."/>
+      <w:lvlJc w:val="right"/>
+      <w:pPr>
+        <w:ind w:left="2160" w:hanging="180"/>
+      </w:pPr>
+    </w:lvl>
+    <w:lvl w:ilvl="3" w:tplc="040C000F" w:tentative="1">
+      <w:start w:val="1"/>
+      <w:numFmt w:val="decimal"/>
+      <w:lvlText w:val="%4."/>
+      <w:lvlJc w:val="left"/>
+      <w:pPr>
+        <w:ind w:left="2880" w:hanging="360"/>
+      </w:pPr>
+    </w:lvl>
+    <w:lvl w:ilvl="4" w:tplc="040C0019" w:tentative="1">
+      <w:start w:val="1"/>
+      <w:numFmt w:val="lowerLetter"/>
+      <w:lvlText w:val="%5."/>
+      <w:lvlJc w:val="left"/>
+      <w:pPr>
+        <w:ind w:left="3600" w:hanging="360"/>
+      </w:pPr>
+    </w:lvl>
+    <w:lvl w:ilvl="5" w:tplc="040C001B" w:tentative="1">
+      <w:start w:val="1"/>
+      <w:numFmt w:val="lowerRoman"/>
+      <w:lvlText w:val="%6."/>
+      <w:lvlJc w:val="right"/>
+      <w:pPr>
+        <w:ind w:left="4320" w:hanging="180"/>
+      </w:pPr>
+    </w:lvl>
+    <w:lvl w:ilvl="6" w:tplc="040C000F" w:tentative="1">
+      <w:start w:val="1"/>
+      <w:numFmt w:val="decimal"/>
+      <w:lvlText w:val="%7."/>
+      <w:lvlJc w:val="left"/>
+      <w:pPr>
+        <w:ind w:left="5040" w:hanging="360"/>
+      </w:pPr>
+    </w:lvl>
+    <w:lvl w:ilvl="7" w:tplc="040C0019" w:tentative="1">
+      <w:start w:val="1"/>
+      <w:numFmt w:val="lowerLetter"/>
+      <w:lvlText w:val="%8."/>
+      <w:lvlJc w:val="left"/>
+      <w:pPr>
+        <w:ind w:left="5760" w:hanging="360"/>
+      </w:pPr>
+    </w:lvl>
+    <w:lvl w:ilvl="8" w:tplc="040C001B" w:tentative="1">
+      <w:start w:val="1"/>
+      <w:numFmt w:val="lowerRoman"/>
+      <w:lvlText w:val="%9."/>
+      <w:lvlJc w:val="right"/>
+      <w:pPr>
+        <w:ind w:left="6480" w:hanging="180"/>
+      </w:pPr>
+    </w:lvl>
+  </w:abstractNum>
   <w:abstractNum w:abstractNumId="15" w15:restartNumberingAfterBreak="0">
+    <w:nsid w:val="6F710360"/>
+    <w:multiLevelType w:val="hybridMultilevel"/>
+    <w:tmpl w:val="66BCC23A"/>
+    <w:lvl w:ilvl="0" w:tplc="040C0001">
+      <w:start w:val="1"/>
+      <w:numFmt w:val="bullet"/>
+      <w:lvlText w:val=""/>
+      <w:lvlJc w:val="left"/>
+      <w:pPr>
+        <w:ind w:left="720" w:hanging="360"/>
+      </w:pPr>
+      <w:rPr>
+        <w:rFonts w:ascii="Symbol" w:hAnsi="Symbol" w:hint="default"/>
+      </w:rPr>
+    </w:lvl>
+    <w:lvl w:ilvl="1" w:tplc="040C0003" w:tentative="1">
+      <w:start w:val="1"/>
+      <w:numFmt w:val="bullet"/>
+      <w:lvlText w:val="o"/>
+      <w:lvlJc w:val="left"/>
+      <w:pPr>
+        <w:ind w:left="1440" w:hanging="360"/>
+      </w:pPr>
+      <w:rPr>
+        <w:rFonts w:ascii="Courier New" w:hAnsi="Courier New" w:cs="Courier New" w:hint="default"/>
+      </w:rPr>
+    </w:lvl>
+    <w:lvl w:ilvl="2" w:tplc="040C0005" w:tentative="1">
+      <w:start w:val="1"/>
+      <w:numFmt w:val="bullet"/>
+      <w:lvlText w:val=""/>
+      <w:lvlJc w:val="left"/>
+      <w:pPr>
+        <w:ind w:left="2160" w:hanging="360"/>
+      </w:pPr>
+      <w:rPr>
+        <w:rFonts w:ascii="Wingdings" w:hAnsi="Wingdings" w:hint="default"/>
+      </w:rPr>
+    </w:lvl>
+    <w:lvl w:ilvl="3" w:tplc="040C0001" w:tentative="1">
+      <w:start w:val="1"/>
+      <w:numFmt w:val="bullet"/>
+      <w:lvlText w:val=""/>
+      <w:lvlJc w:val="left"/>
+      <w:pPr>
+        <w:ind w:left="2880" w:hanging="360"/>
+      </w:pPr>
+      <w:rPr>
+        <w:rFonts w:ascii="Symbol" w:hAnsi="Symbol" w:hint="default"/>
+      </w:rPr>
+    </w:lvl>
+    <w:lvl w:ilvl="4" w:tplc="040C0003" w:tentative="1">
+      <w:start w:val="1"/>
+      <w:numFmt w:val="bullet"/>
+      <w:lvlText w:val="o"/>
+      <w:lvlJc w:val="left"/>
+      <w:pPr>
+        <w:ind w:left="3600" w:hanging="360"/>
+      </w:pPr>
+      <w:rPr>
+        <w:rFonts w:ascii="Courier New" w:hAnsi="Courier New" w:cs="Courier New" w:hint="default"/>
+      </w:rPr>
+    </w:lvl>
+    <w:lvl w:ilvl="5" w:tplc="040C0005" w:tentative="1">
+      <w:start w:val="1"/>
+      <w:numFmt w:val="bullet"/>
+      <w:lvlText w:val=""/>
+      <w:lvlJc w:val="left"/>
+      <w:pPr>
+        <w:ind w:left="4320" w:hanging="360"/>
+      </w:pPr>
+      <w:rPr>
+        <w:rFonts w:ascii="Wingdings" w:hAnsi="Wingdings" w:hint="default"/>
+      </w:rPr>
+    </w:lvl>
+    <w:lvl w:ilvl="6" w:tplc="040C0001" w:tentative="1">
+      <w:start w:val="1"/>
+      <w:numFmt w:val="bullet"/>
+      <w:lvlText w:val=""/>
+      <w:lvlJc w:val="left"/>
+      <w:pPr>
+        <w:ind w:left="5040" w:hanging="360"/>
+      </w:pPr>
+      <w:rPr>
+        <w:rFonts w:ascii="Symbol" w:hAnsi="Symbol" w:hint="default"/>
+      </w:rPr>
+    </w:lvl>
+    <w:lvl w:ilvl="7" w:tplc="040C0003" w:tentative="1">
+      <w:start w:val="1"/>
+      <w:numFmt w:val="bullet"/>
+      <w:lvlText w:val="o"/>
+      <w:lvlJc w:val="left"/>
+      <w:pPr>
+        <w:ind w:left="5760" w:hanging="360"/>
+      </w:pPr>
+      <w:rPr>
+        <w:rFonts w:ascii="Courier New" w:hAnsi="Courier New" w:cs="Courier New" w:hint="default"/>
+      </w:rPr>
+    </w:lvl>
+    <w:lvl w:ilvl="8" w:tplc="040C0005" w:tentative="1">
+      <w:start w:val="1"/>
+      <w:numFmt w:val="bullet"/>
+      <w:lvlText w:val=""/>
+      <w:lvlJc w:val="left"/>
+      <w:pPr>
+        <w:ind w:left="6480" w:hanging="360"/>
+      </w:pPr>
+      <w:rPr>
+        <w:rFonts w:ascii="Wingdings" w:hAnsi="Wingdings" w:hint="default"/>
+      </w:rPr>
+    </w:lvl>
+  </w:abstractNum>
+  <w:abstractNum w:abstractNumId="16" w15:restartNumberingAfterBreak="0">
     <w:nsid w:val="7EC51315"/>
     <w:multiLevelType w:val="hybridMultilevel"/>
     <w:tmpl w:val="7952CE38"/>
@@ -12815,13 +14848,13 @@
     <w:abstractNumId w:val="7"/>
   </w:num>
   <w:num w:numId="4">
-    <w:abstractNumId w:val="15"/>
+    <w:abstractNumId w:val="16"/>
   </w:num>
   <w:num w:numId="5">
     <w:abstractNumId w:val="6"/>
   </w:num>
   <w:num w:numId="6">
-    <w:abstractNumId w:val="13"/>
+    <w:abstractNumId w:val="14"/>
   </w:num>
   <w:num w:numId="7">
     <w:abstractNumId w:val="0"/>
@@ -12851,7 +14884,10 @@
     <w:abstractNumId w:val="10"/>
   </w:num>
   <w:num w:numId="16">
-    <w:abstractNumId w:val="14"/>
+    <w:abstractNumId w:val="15"/>
+  </w:num>
+  <w:num w:numId="17">
+    <w:abstractNumId w:val="13"/>
   </w:num>
 </w:numbering>
 </file>
@@ -13510,6 +15546,101 @@
       <w:lang w:eastAsia="fr-FR"/>
     </w:rPr>
   </w:style>
+  <w:style w:type="table" w:styleId="Grilledutableau">
+    <w:name w:val="Table Grid"/>
+    <w:basedOn w:val="TableauNormal"/>
+    <w:uiPriority w:val="39"/>
+    <w:rsid w:val="005C4939"/>
+    <w:pPr>
+      <w:spacing w:after="0" w:line="240" w:lineRule="auto"/>
+    </w:pPr>
+    <w:tblPr>
+      <w:tblBorders>
+        <w:top w:val="single" w:sz="4" w:space="0" w:color="auto"/>
+        <w:left w:val="single" w:sz="4" w:space="0" w:color="auto"/>
+        <w:bottom w:val="single" w:sz="4" w:space="0" w:color="auto"/>
+        <w:right w:val="single" w:sz="4" w:space="0" w:color="auto"/>
+        <w:insideH w:val="single" w:sz="4" w:space="0" w:color="auto"/>
+        <w:insideV w:val="single" w:sz="4" w:space="0" w:color="auto"/>
+      </w:tblBorders>
+    </w:tblPr>
+  </w:style>
+  <w:style w:type="table" w:styleId="TableauGrille4-Accentuation1">
+    <w:name w:val="Grid Table 4 Accent 1"/>
+    <w:basedOn w:val="TableauNormal"/>
+    <w:uiPriority w:val="49"/>
+    <w:rsid w:val="005C4939"/>
+    <w:pPr>
+      <w:spacing w:after="0" w:line="240" w:lineRule="auto"/>
+    </w:pPr>
+    <w:tblPr>
+      <w:tblStyleRowBandSize w:val="1"/>
+      <w:tblStyleColBandSize w:val="1"/>
+      <w:tblBorders>
+        <w:top w:val="single" w:sz="4" w:space="0" w:color="8EAADB" w:themeColor="accent1" w:themeTint="99"/>
+        <w:left w:val="single" w:sz="4" w:space="0" w:color="8EAADB" w:themeColor="accent1" w:themeTint="99"/>
+        <w:bottom w:val="single" w:sz="4" w:space="0" w:color="8EAADB" w:themeColor="accent1" w:themeTint="99"/>
+        <w:right w:val="single" w:sz="4" w:space="0" w:color="8EAADB" w:themeColor="accent1" w:themeTint="99"/>
+        <w:insideH w:val="single" w:sz="4" w:space="0" w:color="8EAADB" w:themeColor="accent1" w:themeTint="99"/>
+        <w:insideV w:val="single" w:sz="4" w:space="0" w:color="8EAADB" w:themeColor="accent1" w:themeTint="99"/>
+      </w:tblBorders>
+    </w:tblPr>
+    <w:tblStylePr w:type="firstRow">
+      <w:rPr>
+        <w:b/>
+        <w:bCs/>
+        <w:color w:val="FFFFFF" w:themeColor="background1"/>
+      </w:rPr>
+      <w:tblPr/>
+      <w:tcPr>
+        <w:tcBorders>
+          <w:top w:val="single" w:sz="4" w:space="0" w:color="4472C4" w:themeColor="accent1"/>
+          <w:left w:val="single" w:sz="4" w:space="0" w:color="4472C4" w:themeColor="accent1"/>
+          <w:bottom w:val="single" w:sz="4" w:space="0" w:color="4472C4" w:themeColor="accent1"/>
+          <w:right w:val="single" w:sz="4" w:space="0" w:color="4472C4" w:themeColor="accent1"/>
+          <w:insideH w:val="nil"/>
+          <w:insideV w:val="nil"/>
+        </w:tcBorders>
+        <w:shd w:val="clear" w:color="auto" w:fill="4472C4" w:themeFill="accent1"/>
+      </w:tcPr>
+    </w:tblStylePr>
+    <w:tblStylePr w:type="lastRow">
+      <w:rPr>
+        <w:b/>
+        <w:bCs/>
+      </w:rPr>
+      <w:tblPr/>
+      <w:tcPr>
+        <w:tcBorders>
+          <w:top w:val="double" w:sz="4" w:space="0" w:color="4472C4" w:themeColor="accent1"/>
+        </w:tcBorders>
+      </w:tcPr>
+    </w:tblStylePr>
+    <w:tblStylePr w:type="firstCol">
+      <w:rPr>
+        <w:b/>
+        <w:bCs/>
+      </w:rPr>
+    </w:tblStylePr>
+    <w:tblStylePr w:type="lastCol">
+      <w:rPr>
+        <w:b/>
+        <w:bCs/>
+      </w:rPr>
+    </w:tblStylePr>
+    <w:tblStylePr w:type="band1Vert">
+      <w:tblPr/>
+      <w:tcPr>
+        <w:shd w:val="clear" w:color="auto" w:fill="D9E2F3" w:themeFill="accent1" w:themeFillTint="33"/>
+      </w:tcPr>
+    </w:tblStylePr>
+    <w:tblStylePr w:type="band1Horz">
+      <w:tblPr/>
+      <w:tcPr>
+        <w:shd w:val="clear" w:color="auto" w:fill="D9E2F3" w:themeFill="accent1" w:themeFillTint="33"/>
+      </w:tcPr>
+    </w:tblStylePr>
+  </w:style>
 </w:styles>
 </file>
 

</xml_diff>

<commit_message>
Partie 6 question 4
</commit_message>
<xml_diff>
--- a/ai-business_assistant.docx
+++ b/ai-business_assistant.docx
@@ -13079,14 +13079,933 @@
     </w:p>
     <w:p>
       <w:pPr>
+        <w:pStyle w:val="Titre2"/>
+        <w:rPr>
+          <w:sz w:val="28"/>
+          <w:szCs w:val="28"/>
+        </w:rPr>
+      </w:pPr>
+      <w:r>
+        <w:rPr>
+          <w:sz w:val="28"/>
+          <w:szCs w:val="28"/>
+        </w:rPr>
+        <w:t>4) Métriques de classification</w:t>
+      </w:r>
+    </w:p>
+    <w:p>
+      <w:pPr>
+        <w:pStyle w:val="PrformatHTML"/>
+        <w:rPr>
+          <w:rStyle w:val="CodeHTML"/>
+          <w:rFonts w:ascii="Times New Roman" w:hAnsi="Times New Roman" w:cs="Times New Roman"/>
+          <w:sz w:val="24"/>
+          <w:szCs w:val="24"/>
+        </w:rPr>
+      </w:pPr>
+      <w:r>
+        <w:rPr>
+          <w:rStyle w:val="CodeHTML"/>
+          <w:rFonts w:ascii="Times New Roman" w:hAnsi="Times New Roman" w:cs="Times New Roman"/>
+          <w:b/>
+          <w:bCs/>
+          <w:sz w:val="24"/>
+          <w:szCs w:val="24"/>
+        </w:rPr>
+        <w:t>Rôle</w:t>
+      </w:r>
+      <w:r>
+        <w:rPr>
+          <w:rStyle w:val="CodeHTML"/>
+          <w:rFonts w:ascii="Times New Roman" w:hAnsi="Times New Roman" w:cs="Times New Roman"/>
+          <w:sz w:val="24"/>
+          <w:szCs w:val="24"/>
+        </w:rPr>
+        <w:t xml:space="preserve"> : </w:t>
+      </w:r>
+      <w:r>
+        <w:rPr>
+          <w:rStyle w:val="CodeHTML"/>
+          <w:rFonts w:ascii="Times New Roman" w:hAnsi="Times New Roman" w:cs="Times New Roman"/>
+          <w:sz w:val="24"/>
+          <w:szCs w:val="24"/>
+        </w:rPr>
+        <w:t xml:space="preserve">Tu es un formateur en machine </w:t>
+      </w:r>
+      <w:proofErr w:type="spellStart"/>
+      <w:r>
+        <w:rPr>
+          <w:rStyle w:val="CodeHTML"/>
+          <w:rFonts w:ascii="Times New Roman" w:hAnsi="Times New Roman" w:cs="Times New Roman"/>
+          <w:sz w:val="24"/>
+          <w:szCs w:val="24"/>
+        </w:rPr>
+        <w:t>learning</w:t>
+      </w:r>
+      <w:proofErr w:type="spellEnd"/>
+      <w:r>
+        <w:rPr>
+          <w:rStyle w:val="CodeHTML"/>
+          <w:rFonts w:ascii="Times New Roman" w:hAnsi="Times New Roman" w:cs="Times New Roman"/>
+          <w:sz w:val="24"/>
+          <w:szCs w:val="24"/>
+        </w:rPr>
+        <w:t>.</w:t>
+      </w:r>
+    </w:p>
+    <w:p>
+      <w:pPr>
+        <w:pStyle w:val="PrformatHTML"/>
+        <w:rPr>
+          <w:rStyle w:val="CodeHTML"/>
+          <w:rFonts w:ascii="Times New Roman" w:hAnsi="Times New Roman" w:cs="Times New Roman"/>
+          <w:sz w:val="24"/>
+          <w:szCs w:val="24"/>
+        </w:rPr>
+      </w:pPr>
+    </w:p>
+    <w:p>
+      <w:pPr>
+        <w:pStyle w:val="PrformatHTML"/>
+        <w:rPr>
+          <w:rStyle w:val="CodeHTML"/>
+          <w:rFonts w:ascii="Times New Roman" w:hAnsi="Times New Roman" w:cs="Times New Roman"/>
+          <w:sz w:val="24"/>
+          <w:szCs w:val="24"/>
+        </w:rPr>
+      </w:pPr>
+      <w:r>
+        <w:rPr>
+          <w:rStyle w:val="CodeHTML"/>
+          <w:rFonts w:ascii="Times New Roman" w:hAnsi="Times New Roman" w:cs="Times New Roman"/>
+          <w:b/>
+          <w:bCs/>
+          <w:sz w:val="24"/>
+          <w:szCs w:val="24"/>
+        </w:rPr>
+        <w:t>Tâche</w:t>
+      </w:r>
+      <w:r>
+        <w:rPr>
+          <w:rStyle w:val="CodeHTML"/>
+          <w:rFonts w:ascii="Times New Roman" w:hAnsi="Times New Roman" w:cs="Times New Roman"/>
+          <w:sz w:val="24"/>
+          <w:szCs w:val="24"/>
+        </w:rPr>
+        <w:t xml:space="preserve"> : Explique les métriques de classification suivantes : Accuracy, </w:t>
+      </w:r>
+      <w:proofErr w:type="spellStart"/>
+      <w:r>
+        <w:rPr>
+          <w:rStyle w:val="CodeHTML"/>
+          <w:rFonts w:ascii="Times New Roman" w:hAnsi="Times New Roman" w:cs="Times New Roman"/>
+          <w:sz w:val="24"/>
+          <w:szCs w:val="24"/>
+        </w:rPr>
+        <w:t>Precision</w:t>
+      </w:r>
+      <w:proofErr w:type="spellEnd"/>
+      <w:r>
+        <w:rPr>
+          <w:rStyle w:val="CodeHTML"/>
+          <w:rFonts w:ascii="Times New Roman" w:hAnsi="Times New Roman" w:cs="Times New Roman"/>
+          <w:sz w:val="24"/>
+          <w:szCs w:val="24"/>
+        </w:rPr>
+        <w:t>,</w:t>
+      </w:r>
+    </w:p>
+    <w:p>
+      <w:pPr>
+        <w:pStyle w:val="PrformatHTML"/>
+        <w:rPr>
+          <w:rStyle w:val="CodeHTML"/>
+          <w:rFonts w:ascii="Times New Roman" w:hAnsi="Times New Roman" w:cs="Times New Roman"/>
+          <w:sz w:val="24"/>
+          <w:szCs w:val="24"/>
+          <w:lang w:val="en-US"/>
+        </w:rPr>
+      </w:pPr>
+      <w:r>
+        <w:rPr>
+          <w:rStyle w:val="CodeHTML"/>
+          <w:rFonts w:ascii="Times New Roman" w:hAnsi="Times New Roman" w:cs="Times New Roman"/>
+          <w:sz w:val="24"/>
+          <w:szCs w:val="24"/>
+          <w:lang w:val="en-US"/>
+        </w:rPr>
+        <w:t>Recall, F1-score, ROC-AUC.</w:t>
+      </w:r>
+    </w:p>
+    <w:p>
+      <w:pPr>
+        <w:pStyle w:val="PrformatHTML"/>
+        <w:rPr>
+          <w:rStyle w:val="CodeHTML"/>
+          <w:rFonts w:ascii="Times New Roman" w:hAnsi="Times New Roman" w:cs="Times New Roman"/>
+          <w:sz w:val="24"/>
+          <w:szCs w:val="24"/>
+          <w:lang w:val="en-US"/>
+        </w:rPr>
+      </w:pPr>
+    </w:p>
+    <w:p>
+      <w:pPr>
+        <w:pStyle w:val="PrformatHTML"/>
+        <w:rPr>
+          <w:rStyle w:val="CodeHTML"/>
+          <w:rFonts w:ascii="Times New Roman" w:hAnsi="Times New Roman" w:cs="Times New Roman"/>
+          <w:sz w:val="24"/>
+          <w:szCs w:val="24"/>
+        </w:rPr>
+      </w:pPr>
+      <w:r>
+        <w:rPr>
+          <w:rStyle w:val="CodeHTML"/>
+          <w:rFonts w:ascii="Times New Roman" w:hAnsi="Times New Roman" w:cs="Times New Roman"/>
+          <w:b/>
+          <w:bCs/>
+          <w:sz w:val="24"/>
+          <w:szCs w:val="24"/>
+        </w:rPr>
+        <w:t>Pour chaque métrique, donne</w:t>
+      </w:r>
+      <w:r>
+        <w:rPr>
+          <w:rStyle w:val="CodeHTML"/>
+          <w:rFonts w:ascii="Times New Roman" w:hAnsi="Times New Roman" w:cs="Times New Roman"/>
+          <w:sz w:val="24"/>
+          <w:szCs w:val="24"/>
+        </w:rPr>
+        <w:t xml:space="preserve"> :</w:t>
+      </w:r>
+    </w:p>
+    <w:p>
+      <w:pPr>
+        <w:pStyle w:val="PrformatHTML"/>
+        <w:numPr>
+          <w:ilvl w:val="0"/>
+          <w:numId w:val="18"/>
+        </w:numPr>
+        <w:rPr>
+          <w:rStyle w:val="CodeHTML"/>
+          <w:rFonts w:ascii="Times New Roman" w:hAnsi="Times New Roman" w:cs="Times New Roman"/>
+          <w:sz w:val="24"/>
+          <w:szCs w:val="24"/>
+        </w:rPr>
+      </w:pPr>
+      <w:r>
+        <w:rPr>
+          <w:rStyle w:val="CodeHTML"/>
+          <w:rFonts w:ascii="Times New Roman" w:hAnsi="Times New Roman" w:cs="Times New Roman"/>
+          <w:sz w:val="24"/>
+          <w:szCs w:val="24"/>
+        </w:rPr>
+        <w:t>Définition</w:t>
+      </w:r>
+    </w:p>
+    <w:p>
+      <w:pPr>
+        <w:pStyle w:val="PrformatHTML"/>
+        <w:numPr>
+          <w:ilvl w:val="0"/>
+          <w:numId w:val="18"/>
+        </w:numPr>
+        <w:rPr>
+          <w:rStyle w:val="CodeHTML"/>
+          <w:rFonts w:ascii="Times New Roman" w:hAnsi="Times New Roman" w:cs="Times New Roman"/>
+          <w:sz w:val="24"/>
+          <w:szCs w:val="24"/>
+        </w:rPr>
+      </w:pPr>
+      <w:r>
+        <w:rPr>
+          <w:rStyle w:val="CodeHTML"/>
+          <w:rFonts w:ascii="Times New Roman" w:hAnsi="Times New Roman" w:cs="Times New Roman"/>
+          <w:sz w:val="24"/>
+          <w:szCs w:val="24"/>
+        </w:rPr>
+        <w:t>Interprétation (comment lire la valeur)</w:t>
+      </w:r>
+    </w:p>
+    <w:p>
+      <w:pPr>
+        <w:pStyle w:val="PrformatHTML"/>
+        <w:numPr>
+          <w:ilvl w:val="0"/>
+          <w:numId w:val="18"/>
+        </w:numPr>
+        <w:rPr>
+          <w:rStyle w:val="CodeHTML"/>
+          <w:rFonts w:ascii="Times New Roman" w:hAnsi="Times New Roman" w:cs="Times New Roman"/>
+          <w:sz w:val="24"/>
+          <w:szCs w:val="24"/>
+        </w:rPr>
+      </w:pPr>
+      <w:r>
+        <w:rPr>
+          <w:rStyle w:val="CodeHTML"/>
+          <w:rFonts w:ascii="Times New Roman" w:hAnsi="Times New Roman" w:cs="Times New Roman"/>
+          <w:sz w:val="24"/>
+          <w:szCs w:val="24"/>
+        </w:rPr>
+        <w:t>Un exemple concret chiffré</w:t>
+      </w:r>
+    </w:p>
+    <w:p>
+      <w:pPr>
+        <w:pStyle w:val="PrformatHTML"/>
+        <w:numPr>
+          <w:ilvl w:val="0"/>
+          <w:numId w:val="18"/>
+        </w:numPr>
+        <w:rPr>
+          <w:rStyle w:val="CodeHTML"/>
+          <w:rFonts w:ascii="Times New Roman" w:hAnsi="Times New Roman" w:cs="Times New Roman"/>
+          <w:sz w:val="24"/>
+          <w:szCs w:val="24"/>
+        </w:rPr>
+      </w:pPr>
+      <w:r>
+        <w:rPr>
+          <w:rStyle w:val="CodeHTML"/>
+          <w:rFonts w:ascii="Times New Roman" w:hAnsi="Times New Roman" w:cs="Times New Roman"/>
+          <w:sz w:val="24"/>
+          <w:szCs w:val="24"/>
+        </w:rPr>
+        <w:t>Le contexte dans lequel cette métrique est particulièrement utile (ex. classes</w:t>
+      </w:r>
+      <w:r>
+        <w:rPr>
+          <w:rStyle w:val="CodeHTML"/>
+          <w:rFonts w:ascii="Times New Roman" w:hAnsi="Times New Roman" w:cs="Times New Roman"/>
+          <w:sz w:val="24"/>
+          <w:szCs w:val="24"/>
+        </w:rPr>
+        <w:t xml:space="preserve"> </w:t>
+      </w:r>
+      <w:r>
+        <w:rPr>
+          <w:rStyle w:val="CodeHTML"/>
+          <w:rFonts w:ascii="Times New Roman" w:hAnsi="Times New Roman" w:cs="Times New Roman"/>
+          <w:sz w:val="24"/>
+          <w:szCs w:val="24"/>
+        </w:rPr>
+        <w:t>déséquilibrées, coût des faux positifs/négatifs...)</w:t>
+      </w:r>
+    </w:p>
+    <w:p>
+      <w:pPr>
+        <w:pStyle w:val="PrformatHTML"/>
+        <w:rPr>
+          <w:rStyle w:val="CodeHTML"/>
+          <w:rFonts w:ascii="Times New Roman" w:hAnsi="Times New Roman" w:cs="Times New Roman"/>
+          <w:sz w:val="24"/>
+          <w:szCs w:val="24"/>
+        </w:rPr>
+      </w:pPr>
+    </w:p>
+    <w:p>
+      <w:pPr>
+        <w:pStyle w:val="PrformatHTML"/>
+        <w:rPr>
+          <w:rFonts w:ascii="Times New Roman" w:hAnsi="Times New Roman" w:cs="Times New Roman"/>
+          <w:sz w:val="24"/>
+          <w:szCs w:val="24"/>
+        </w:rPr>
+      </w:pPr>
+      <w:r>
+        <w:rPr>
+          <w:rStyle w:val="CodeHTML"/>
+          <w:rFonts w:ascii="Times New Roman" w:hAnsi="Times New Roman" w:cs="Times New Roman"/>
+          <w:b/>
+          <w:bCs/>
+          <w:sz w:val="24"/>
+          <w:szCs w:val="24"/>
+        </w:rPr>
+        <w:t>Format de sortie</w:t>
+      </w:r>
+      <w:r>
+        <w:rPr>
+          <w:rStyle w:val="CodeHTML"/>
+          <w:rFonts w:ascii="Times New Roman" w:hAnsi="Times New Roman" w:cs="Times New Roman"/>
+          <w:sz w:val="24"/>
+          <w:szCs w:val="24"/>
+        </w:rPr>
+        <w:t xml:space="preserve"> : une section par métrique.</w:t>
+      </w:r>
+    </w:p>
+    <w:p>
+      <w:pPr>
         <w:pStyle w:val="NormalWeb"/>
         <w:rPr>
-          <w:rStyle w:val="CodeHTML"/>
-          <w:rFonts w:ascii="Times New Roman" w:hAnsi="Times New Roman" w:cs="Times New Roman"/>
-          <w:sz w:val="24"/>
-          <w:szCs w:val="24"/>
-        </w:rPr>
-      </w:pPr>
+          <w:rStyle w:val="lev"/>
+          <w:sz w:val="28"/>
+          <w:szCs w:val="28"/>
+        </w:rPr>
+      </w:pPr>
+      <w:r>
+        <w:rPr>
+          <w:rStyle w:val="lev"/>
+          <w:sz w:val="28"/>
+          <w:szCs w:val="28"/>
+        </w:rPr>
+        <w:lastRenderedPageBreak/>
+        <w:t>Ré</w:t>
+      </w:r>
+      <w:r>
+        <w:rPr>
+          <w:rStyle w:val="lev"/>
+          <w:sz w:val="28"/>
+          <w:szCs w:val="28"/>
+        </w:rPr>
+        <w:t>sultats :</w:t>
+      </w:r>
+    </w:p>
+    <w:p>
+      <w:pPr>
+        <w:pStyle w:val="NormalWeb"/>
+        <w:rPr>
+          <w:rStyle w:val="CodeHTML"/>
+          <w:rFonts w:ascii="Times New Roman" w:hAnsi="Times New Roman" w:cs="Times New Roman"/>
+          <w:sz w:val="28"/>
+          <w:szCs w:val="28"/>
+        </w:rPr>
+      </w:pPr>
+      <w:r>
+        <w:rPr>
+          <w:rStyle w:val="CodeHTML"/>
+          <w:rFonts w:ascii="Times New Roman" w:hAnsi="Times New Roman" w:cs="Times New Roman"/>
+          <w:sz w:val="28"/>
+          <w:szCs w:val="28"/>
+        </w:rPr>
+        <w:drawing>
+          <wp:inline distT="0" distB="0" distL="0" distR="0" wp14:anchorId="16A27A41" wp14:editId="4ADF8DEC">
+            <wp:extent cx="5759450" cy="3021330"/>
+            <wp:effectExtent l="0" t="0" r="0" b="7620"/>
+            <wp:docPr id="28" name="Image 28"/>
+            <wp:cNvGraphicFramePr>
+              <a:graphicFrameLocks xmlns:a="http://schemas.openxmlformats.org/drawingml/2006/main" noChangeAspect="1"/>
+            </wp:cNvGraphicFramePr>
+            <a:graphic xmlns:a="http://schemas.openxmlformats.org/drawingml/2006/main">
+              <a:graphicData uri="http://schemas.openxmlformats.org/drawingml/2006/picture">
+                <pic:pic xmlns:pic="http://schemas.openxmlformats.org/drawingml/2006/picture">
+                  <pic:nvPicPr>
+                    <pic:cNvPr id="1" name=""/>
+                    <pic:cNvPicPr/>
+                  </pic:nvPicPr>
+                  <pic:blipFill>
+                    <a:blip r:embed="rId32"/>
+                    <a:stretch>
+                      <a:fillRect/>
+                    </a:stretch>
+                  </pic:blipFill>
+                  <pic:spPr>
+                    <a:xfrm>
+                      <a:off x="0" y="0"/>
+                      <a:ext cx="5759450" cy="3021330"/>
+                    </a:xfrm>
+                    <a:prstGeom prst="rect">
+                      <a:avLst/>
+                    </a:prstGeom>
+                  </pic:spPr>
+                </pic:pic>
+              </a:graphicData>
+            </a:graphic>
+          </wp:inline>
+        </w:drawing>
+      </w:r>
+    </w:p>
+    <w:p>
+      <w:pPr>
+        <w:pStyle w:val="NormalWeb"/>
+        <w:rPr>
+          <w:rStyle w:val="CodeHTML"/>
+          <w:rFonts w:ascii="Times New Roman" w:hAnsi="Times New Roman" w:cs="Times New Roman"/>
+          <w:sz w:val="28"/>
+          <w:szCs w:val="28"/>
+        </w:rPr>
+      </w:pPr>
+      <w:r>
+        <w:rPr>
+          <w:rStyle w:val="CodeHTML"/>
+          <w:rFonts w:ascii="Times New Roman" w:hAnsi="Times New Roman" w:cs="Times New Roman"/>
+          <w:sz w:val="28"/>
+          <w:szCs w:val="28"/>
+        </w:rPr>
+        <w:drawing>
+          <wp:inline distT="0" distB="0" distL="0" distR="0" wp14:anchorId="039FBBA0" wp14:editId="21ED9470">
+            <wp:extent cx="5493032" cy="4826248"/>
+            <wp:effectExtent l="0" t="0" r="0" b="0"/>
+            <wp:docPr id="29" name="Image 29"/>
+            <wp:cNvGraphicFramePr>
+              <a:graphicFrameLocks xmlns:a="http://schemas.openxmlformats.org/drawingml/2006/main" noChangeAspect="1"/>
+            </wp:cNvGraphicFramePr>
+            <a:graphic xmlns:a="http://schemas.openxmlformats.org/drawingml/2006/main">
+              <a:graphicData uri="http://schemas.openxmlformats.org/drawingml/2006/picture">
+                <pic:pic xmlns:pic="http://schemas.openxmlformats.org/drawingml/2006/picture">
+                  <pic:nvPicPr>
+                    <pic:cNvPr id="1" name=""/>
+                    <pic:cNvPicPr/>
+                  </pic:nvPicPr>
+                  <pic:blipFill>
+                    <a:blip r:embed="rId33"/>
+                    <a:stretch>
+                      <a:fillRect/>
+                    </a:stretch>
+                  </pic:blipFill>
+                  <pic:spPr>
+                    <a:xfrm>
+                      <a:off x="0" y="0"/>
+                      <a:ext cx="5493032" cy="4826248"/>
+                    </a:xfrm>
+                    <a:prstGeom prst="rect">
+                      <a:avLst/>
+                    </a:prstGeom>
+                  </pic:spPr>
+                </pic:pic>
+              </a:graphicData>
+            </a:graphic>
+          </wp:inline>
+        </w:drawing>
+      </w:r>
+    </w:p>
+    <w:p>
+      <w:pPr>
+        <w:pStyle w:val="NormalWeb"/>
+        <w:rPr>
+          <w:rStyle w:val="CodeHTML"/>
+          <w:rFonts w:ascii="Times New Roman" w:hAnsi="Times New Roman" w:cs="Times New Roman"/>
+          <w:sz w:val="28"/>
+          <w:szCs w:val="28"/>
+        </w:rPr>
+      </w:pPr>
+      <w:r>
+        <w:rPr>
+          <w:rStyle w:val="CodeHTML"/>
+          <w:rFonts w:ascii="Times New Roman" w:hAnsi="Times New Roman" w:cs="Times New Roman"/>
+          <w:sz w:val="28"/>
+          <w:szCs w:val="28"/>
+        </w:rPr>
+        <w:lastRenderedPageBreak/>
+        <w:drawing>
+          <wp:inline distT="0" distB="0" distL="0" distR="0" wp14:anchorId="46C1498D" wp14:editId="0EDE9743">
+            <wp:extent cx="5759450" cy="5174615"/>
+            <wp:effectExtent l="0" t="0" r="0" b="6985"/>
+            <wp:docPr id="30" name="Image 30"/>
+            <wp:cNvGraphicFramePr>
+              <a:graphicFrameLocks xmlns:a="http://schemas.openxmlformats.org/drawingml/2006/main" noChangeAspect="1"/>
+            </wp:cNvGraphicFramePr>
+            <a:graphic xmlns:a="http://schemas.openxmlformats.org/drawingml/2006/main">
+              <a:graphicData uri="http://schemas.openxmlformats.org/drawingml/2006/picture">
+                <pic:pic xmlns:pic="http://schemas.openxmlformats.org/drawingml/2006/picture">
+                  <pic:nvPicPr>
+                    <pic:cNvPr id="1" name=""/>
+                    <pic:cNvPicPr/>
+                  </pic:nvPicPr>
+                  <pic:blipFill>
+                    <a:blip r:embed="rId34"/>
+                    <a:stretch>
+                      <a:fillRect/>
+                    </a:stretch>
+                  </pic:blipFill>
+                  <pic:spPr>
+                    <a:xfrm>
+                      <a:off x="0" y="0"/>
+                      <a:ext cx="5759450" cy="5174615"/>
+                    </a:xfrm>
+                    <a:prstGeom prst="rect">
+                      <a:avLst/>
+                    </a:prstGeom>
+                  </pic:spPr>
+                </pic:pic>
+              </a:graphicData>
+            </a:graphic>
+          </wp:inline>
+        </w:drawing>
+      </w:r>
+    </w:p>
+    <w:p>
+      <w:pPr>
+        <w:pStyle w:val="NormalWeb"/>
+        <w:rPr>
+          <w:rStyle w:val="CodeHTML"/>
+          <w:rFonts w:ascii="Times New Roman" w:hAnsi="Times New Roman" w:cs="Times New Roman"/>
+          <w:sz w:val="28"/>
+          <w:szCs w:val="28"/>
+        </w:rPr>
+      </w:pPr>
+      <w:r>
+        <w:rPr>
+          <w:rStyle w:val="CodeHTML"/>
+          <w:rFonts w:ascii="Times New Roman" w:hAnsi="Times New Roman" w:cs="Times New Roman"/>
+          <w:sz w:val="28"/>
+          <w:szCs w:val="28"/>
+        </w:rPr>
+        <w:lastRenderedPageBreak/>
+        <w:drawing>
+          <wp:inline distT="0" distB="0" distL="0" distR="0" wp14:anchorId="67B09EAE" wp14:editId="7DC46C4C">
+            <wp:extent cx="5150115" cy="4845299"/>
+            <wp:effectExtent l="0" t="0" r="0" b="0"/>
+            <wp:docPr id="31" name="Image 31"/>
+            <wp:cNvGraphicFramePr>
+              <a:graphicFrameLocks xmlns:a="http://schemas.openxmlformats.org/drawingml/2006/main" noChangeAspect="1"/>
+            </wp:cNvGraphicFramePr>
+            <a:graphic xmlns:a="http://schemas.openxmlformats.org/drawingml/2006/main">
+              <a:graphicData uri="http://schemas.openxmlformats.org/drawingml/2006/picture">
+                <pic:pic xmlns:pic="http://schemas.openxmlformats.org/drawingml/2006/picture">
+                  <pic:nvPicPr>
+                    <pic:cNvPr id="1" name=""/>
+                    <pic:cNvPicPr/>
+                  </pic:nvPicPr>
+                  <pic:blipFill>
+                    <a:blip r:embed="rId35"/>
+                    <a:stretch>
+                      <a:fillRect/>
+                    </a:stretch>
+                  </pic:blipFill>
+                  <pic:spPr>
+                    <a:xfrm>
+                      <a:off x="0" y="0"/>
+                      <a:ext cx="5150115" cy="4845299"/>
+                    </a:xfrm>
+                    <a:prstGeom prst="rect">
+                      <a:avLst/>
+                    </a:prstGeom>
+                  </pic:spPr>
+                </pic:pic>
+              </a:graphicData>
+            </a:graphic>
+          </wp:inline>
+        </w:drawing>
+      </w:r>
+    </w:p>
+    <w:p>
+      <w:pPr>
+        <w:pStyle w:val="NormalWeb"/>
+        <w:rPr>
+          <w:rStyle w:val="CodeHTML"/>
+          <w:rFonts w:ascii="Times New Roman" w:hAnsi="Times New Roman" w:cs="Times New Roman"/>
+          <w:sz w:val="28"/>
+          <w:szCs w:val="28"/>
+        </w:rPr>
+      </w:pPr>
+      <w:r>
+        <w:rPr>
+          <w:rStyle w:val="CodeHTML"/>
+          <w:rFonts w:ascii="Times New Roman" w:hAnsi="Times New Roman" w:cs="Times New Roman"/>
+          <w:sz w:val="28"/>
+          <w:szCs w:val="28"/>
+        </w:rPr>
+        <w:drawing>
+          <wp:inline distT="0" distB="0" distL="0" distR="0" wp14:anchorId="18FD08EC" wp14:editId="3E4C0666">
+            <wp:extent cx="5207268" cy="2800494"/>
+            <wp:effectExtent l="0" t="0" r="0" b="0"/>
+            <wp:docPr id="32" name="Image 32"/>
+            <wp:cNvGraphicFramePr>
+              <a:graphicFrameLocks xmlns:a="http://schemas.openxmlformats.org/drawingml/2006/main" noChangeAspect="1"/>
+            </wp:cNvGraphicFramePr>
+            <a:graphic xmlns:a="http://schemas.openxmlformats.org/drawingml/2006/main">
+              <a:graphicData uri="http://schemas.openxmlformats.org/drawingml/2006/picture">
+                <pic:pic xmlns:pic="http://schemas.openxmlformats.org/drawingml/2006/picture">
+                  <pic:nvPicPr>
+                    <pic:cNvPr id="1" name=""/>
+                    <pic:cNvPicPr/>
+                  </pic:nvPicPr>
+                  <pic:blipFill>
+                    <a:blip r:embed="rId36"/>
+                    <a:stretch>
+                      <a:fillRect/>
+                    </a:stretch>
+                  </pic:blipFill>
+                  <pic:spPr>
+                    <a:xfrm>
+                      <a:off x="0" y="0"/>
+                      <a:ext cx="5207268" cy="2800494"/>
+                    </a:xfrm>
+                    <a:prstGeom prst="rect">
+                      <a:avLst/>
+                    </a:prstGeom>
+                  </pic:spPr>
+                </pic:pic>
+              </a:graphicData>
+            </a:graphic>
+          </wp:inline>
+        </w:drawing>
+      </w:r>
+    </w:p>
+    <w:p>
+      <w:pPr>
+        <w:pStyle w:val="NormalWeb"/>
+        <w:rPr>
+          <w:rStyle w:val="CodeHTML"/>
+          <w:rFonts w:ascii="Times New Roman" w:hAnsi="Times New Roman" w:cs="Times New Roman"/>
+          <w:sz w:val="28"/>
+          <w:szCs w:val="28"/>
+        </w:rPr>
+      </w:pPr>
+      <w:r>
+        <w:rPr>
+          <w:rStyle w:val="CodeHTML"/>
+          <w:rFonts w:ascii="Times New Roman" w:hAnsi="Times New Roman" w:cs="Times New Roman"/>
+          <w:sz w:val="28"/>
+          <w:szCs w:val="28"/>
+        </w:rPr>
+        <w:lastRenderedPageBreak/>
+        <w:drawing>
+          <wp:inline distT="0" distB="0" distL="0" distR="0" wp14:anchorId="6483A614" wp14:editId="7A490AFA">
+            <wp:extent cx="5759450" cy="4926330"/>
+            <wp:effectExtent l="0" t="0" r="0" b="7620"/>
+            <wp:docPr id="33" name="Image 33"/>
+            <wp:cNvGraphicFramePr>
+              <a:graphicFrameLocks xmlns:a="http://schemas.openxmlformats.org/drawingml/2006/main" noChangeAspect="1"/>
+            </wp:cNvGraphicFramePr>
+            <a:graphic xmlns:a="http://schemas.openxmlformats.org/drawingml/2006/main">
+              <a:graphicData uri="http://schemas.openxmlformats.org/drawingml/2006/picture">
+                <pic:pic xmlns:pic="http://schemas.openxmlformats.org/drawingml/2006/picture">
+                  <pic:nvPicPr>
+                    <pic:cNvPr id="1" name=""/>
+                    <pic:cNvPicPr/>
+                  </pic:nvPicPr>
+                  <pic:blipFill>
+                    <a:blip r:embed="rId37"/>
+                    <a:stretch>
+                      <a:fillRect/>
+                    </a:stretch>
+                  </pic:blipFill>
+                  <pic:spPr>
+                    <a:xfrm>
+                      <a:off x="0" y="0"/>
+                      <a:ext cx="5759450" cy="4926330"/>
+                    </a:xfrm>
+                    <a:prstGeom prst="rect">
+                      <a:avLst/>
+                    </a:prstGeom>
+                  </pic:spPr>
+                </pic:pic>
+              </a:graphicData>
+            </a:graphic>
+          </wp:inline>
+        </w:drawing>
+      </w:r>
+    </w:p>
+    <w:p>
+      <w:pPr>
+        <w:pStyle w:val="NormalWeb"/>
+        <w:rPr>
+          <w:rStyle w:val="CodeHTML"/>
+          <w:rFonts w:ascii="Times New Roman" w:hAnsi="Times New Roman" w:cs="Times New Roman"/>
+          <w:sz w:val="28"/>
+          <w:szCs w:val="28"/>
+        </w:rPr>
+      </w:pPr>
+      <w:r>
+        <w:rPr>
+          <w:rStyle w:val="CodeHTML"/>
+          <w:rFonts w:ascii="Times New Roman" w:hAnsi="Times New Roman" w:cs="Times New Roman"/>
+          <w:sz w:val="28"/>
+          <w:szCs w:val="28"/>
+        </w:rPr>
+        <w:drawing>
+          <wp:inline distT="0" distB="0" distL="0" distR="0" wp14:anchorId="5C549AC4" wp14:editId="34C24318">
+            <wp:extent cx="4991357" cy="1663786"/>
+            <wp:effectExtent l="0" t="0" r="0" b="0"/>
+            <wp:docPr id="34" name="Image 34"/>
+            <wp:cNvGraphicFramePr>
+              <a:graphicFrameLocks xmlns:a="http://schemas.openxmlformats.org/drawingml/2006/main" noChangeAspect="1"/>
+            </wp:cNvGraphicFramePr>
+            <a:graphic xmlns:a="http://schemas.openxmlformats.org/drawingml/2006/main">
+              <a:graphicData uri="http://schemas.openxmlformats.org/drawingml/2006/picture">
+                <pic:pic xmlns:pic="http://schemas.openxmlformats.org/drawingml/2006/picture">
+                  <pic:nvPicPr>
+                    <pic:cNvPr id="1" name=""/>
+                    <pic:cNvPicPr/>
+                  </pic:nvPicPr>
+                  <pic:blipFill>
+                    <a:blip r:embed="rId38"/>
+                    <a:stretch>
+                      <a:fillRect/>
+                    </a:stretch>
+                  </pic:blipFill>
+                  <pic:spPr>
+                    <a:xfrm>
+                      <a:off x="0" y="0"/>
+                      <a:ext cx="4991357" cy="1663786"/>
+                    </a:xfrm>
+                    <a:prstGeom prst="rect">
+                      <a:avLst/>
+                    </a:prstGeom>
+                  </pic:spPr>
+                </pic:pic>
+              </a:graphicData>
+            </a:graphic>
+          </wp:inline>
+        </w:drawing>
+      </w:r>
+    </w:p>
+    <w:p>
+      <w:pPr>
+        <w:pStyle w:val="NormalWeb"/>
+        <w:rPr>
+          <w:rStyle w:val="CodeHTML"/>
+          <w:rFonts w:ascii="Times New Roman" w:hAnsi="Times New Roman" w:cs="Times New Roman"/>
+          <w:sz w:val="28"/>
+          <w:szCs w:val="28"/>
+        </w:rPr>
+      </w:pPr>
+      <w:r>
+        <w:rPr>
+          <w:rStyle w:val="CodeHTML"/>
+          <w:rFonts w:ascii="Times New Roman" w:hAnsi="Times New Roman" w:cs="Times New Roman"/>
+          <w:sz w:val="28"/>
+          <w:szCs w:val="28"/>
+        </w:rPr>
+        <w:lastRenderedPageBreak/>
+        <w:drawing>
+          <wp:inline distT="0" distB="0" distL="0" distR="0" wp14:anchorId="30773CBF" wp14:editId="69622AD9">
+            <wp:extent cx="5429529" cy="4426177"/>
+            <wp:effectExtent l="0" t="0" r="0" b="0"/>
+            <wp:docPr id="35" name="Image 35"/>
+            <wp:cNvGraphicFramePr>
+              <a:graphicFrameLocks xmlns:a="http://schemas.openxmlformats.org/drawingml/2006/main" noChangeAspect="1"/>
+            </wp:cNvGraphicFramePr>
+            <a:graphic xmlns:a="http://schemas.openxmlformats.org/drawingml/2006/main">
+              <a:graphicData uri="http://schemas.openxmlformats.org/drawingml/2006/picture">
+                <pic:pic xmlns:pic="http://schemas.openxmlformats.org/drawingml/2006/picture">
+                  <pic:nvPicPr>
+                    <pic:cNvPr id="1" name=""/>
+                    <pic:cNvPicPr/>
+                  </pic:nvPicPr>
+                  <pic:blipFill>
+                    <a:blip r:embed="rId39"/>
+                    <a:stretch>
+                      <a:fillRect/>
+                    </a:stretch>
+                  </pic:blipFill>
+                  <pic:spPr>
+                    <a:xfrm>
+                      <a:off x="0" y="0"/>
+                      <a:ext cx="5429529" cy="4426177"/>
+                    </a:xfrm>
+                    <a:prstGeom prst="rect">
+                      <a:avLst/>
+                    </a:prstGeom>
+                  </pic:spPr>
+                </pic:pic>
+              </a:graphicData>
+            </a:graphic>
+          </wp:inline>
+        </w:drawing>
+      </w:r>
+    </w:p>
+    <w:p>
+      <w:pPr>
+        <w:pStyle w:val="NormalWeb"/>
+        <w:rPr>
+          <w:rStyle w:val="CodeHTML"/>
+          <w:rFonts w:ascii="Times New Roman" w:hAnsi="Times New Roman" w:cs="Times New Roman"/>
+          <w:sz w:val="28"/>
+          <w:szCs w:val="28"/>
+        </w:rPr>
+      </w:pPr>
+      <w:r>
+        <w:rPr>
+          <w:rStyle w:val="CodeHTML"/>
+          <w:rFonts w:ascii="Times New Roman" w:hAnsi="Times New Roman" w:cs="Times New Roman"/>
+          <w:sz w:val="28"/>
+          <w:szCs w:val="28"/>
+        </w:rPr>
+        <w:drawing>
+          <wp:inline distT="0" distB="0" distL="0" distR="0" wp14:anchorId="694FAD08" wp14:editId="33303AF3">
+            <wp:extent cx="5759450" cy="2954655"/>
+            <wp:effectExtent l="0" t="0" r="0" b="0"/>
+            <wp:docPr id="36" name="Image 36"/>
+            <wp:cNvGraphicFramePr>
+              <a:graphicFrameLocks xmlns:a="http://schemas.openxmlformats.org/drawingml/2006/main" noChangeAspect="1"/>
+            </wp:cNvGraphicFramePr>
+            <a:graphic xmlns:a="http://schemas.openxmlformats.org/drawingml/2006/main">
+              <a:graphicData uri="http://schemas.openxmlformats.org/drawingml/2006/picture">
+                <pic:pic xmlns:pic="http://schemas.openxmlformats.org/drawingml/2006/picture">
+                  <pic:nvPicPr>
+                    <pic:cNvPr id="1" name=""/>
+                    <pic:cNvPicPr/>
+                  </pic:nvPicPr>
+                  <pic:blipFill>
+                    <a:blip r:embed="rId40"/>
+                    <a:stretch>
+                      <a:fillRect/>
+                    </a:stretch>
+                  </pic:blipFill>
+                  <pic:spPr>
+                    <a:xfrm>
+                      <a:off x="0" y="0"/>
+                      <a:ext cx="5759450" cy="2954655"/>
+                    </a:xfrm>
+                    <a:prstGeom prst="rect">
+                      <a:avLst/>
+                    </a:prstGeom>
+                  </pic:spPr>
+                </pic:pic>
+              </a:graphicData>
+            </a:graphic>
+          </wp:inline>
+        </w:drawing>
+      </w:r>
+    </w:p>
+    <w:p>
+      <w:pPr>
+        <w:pStyle w:val="NormalWeb"/>
+        <w:rPr>
+          <w:rStyle w:val="CodeHTML"/>
+          <w:rFonts w:ascii="Times New Roman" w:hAnsi="Times New Roman" w:cs="Times New Roman"/>
+          <w:sz w:val="28"/>
+          <w:szCs w:val="28"/>
+        </w:rPr>
+      </w:pPr>
+      <w:r>
+        <w:rPr>
+          <w:rStyle w:val="CodeHTML"/>
+          <w:rFonts w:ascii="Times New Roman" w:hAnsi="Times New Roman" w:cs="Times New Roman"/>
+          <w:sz w:val="28"/>
+          <w:szCs w:val="28"/>
+        </w:rPr>
+        <w:lastRenderedPageBreak/>
+        <w:drawing>
+          <wp:inline distT="0" distB="0" distL="0" distR="0" wp14:anchorId="1E8FD326" wp14:editId="0EA42C5A">
+            <wp:extent cx="5359675" cy="3378374"/>
+            <wp:effectExtent l="0" t="0" r="0" b="0"/>
+            <wp:docPr id="37" name="Image 37"/>
+            <wp:cNvGraphicFramePr>
+              <a:graphicFrameLocks xmlns:a="http://schemas.openxmlformats.org/drawingml/2006/main" noChangeAspect="1"/>
+            </wp:cNvGraphicFramePr>
+            <a:graphic xmlns:a="http://schemas.openxmlformats.org/drawingml/2006/main">
+              <a:graphicData uri="http://schemas.openxmlformats.org/drawingml/2006/picture">
+                <pic:pic xmlns:pic="http://schemas.openxmlformats.org/drawingml/2006/picture">
+                  <pic:nvPicPr>
+                    <pic:cNvPr id="1" name=""/>
+                    <pic:cNvPicPr/>
+                  </pic:nvPicPr>
+                  <pic:blipFill>
+                    <a:blip r:embed="rId41"/>
+                    <a:stretch>
+                      <a:fillRect/>
+                    </a:stretch>
+                  </pic:blipFill>
+                  <pic:spPr>
+                    <a:xfrm>
+                      <a:off x="0" y="0"/>
+                      <a:ext cx="5359675" cy="3378374"/>
+                    </a:xfrm>
+                    <a:prstGeom prst="rect">
+                      <a:avLst/>
+                    </a:prstGeom>
+                  </pic:spPr>
+                </pic:pic>
+              </a:graphicData>
+            </a:graphic>
+          </wp:inline>
+        </w:drawing>
+      </w:r>
     </w:p>
     <w:sectPr>
       <w:pgSz w:w="11906" w:h="16838"/>
@@ -13838,181 +14757,9 @@
     </w:lvl>
   </w:abstractNum>
   <w:abstractNum w:abstractNumId="7" w15:restartNumberingAfterBreak="0">
-    <w:nsid w:val="2DE869EE"/>
+    <w:nsid w:val="1A69547A"/>
     <w:multiLevelType w:val="hybridMultilevel"/>
-    <w:tmpl w:val="4E94F688"/>
-    <w:lvl w:ilvl="0" w:tplc="040C000F">
-      <w:start w:val="1"/>
-      <w:numFmt w:val="decimal"/>
-      <w:lvlText w:val="%1."/>
-      <w:lvlJc w:val="left"/>
-      <w:pPr>
-        <w:ind w:left="720" w:hanging="360"/>
-      </w:pPr>
-    </w:lvl>
-    <w:lvl w:ilvl="1" w:tplc="040C0019" w:tentative="1">
-      <w:start w:val="1"/>
-      <w:numFmt w:val="lowerLetter"/>
-      <w:lvlText w:val="%2."/>
-      <w:lvlJc w:val="left"/>
-      <w:pPr>
-        <w:ind w:left="1440" w:hanging="360"/>
-      </w:pPr>
-    </w:lvl>
-    <w:lvl w:ilvl="2" w:tplc="040C001B" w:tentative="1">
-      <w:start w:val="1"/>
-      <w:numFmt w:val="lowerRoman"/>
-      <w:lvlText w:val="%3."/>
-      <w:lvlJc w:val="right"/>
-      <w:pPr>
-        <w:ind w:left="2160" w:hanging="180"/>
-      </w:pPr>
-    </w:lvl>
-    <w:lvl w:ilvl="3" w:tplc="040C000F" w:tentative="1">
-      <w:start w:val="1"/>
-      <w:numFmt w:val="decimal"/>
-      <w:lvlText w:val="%4."/>
-      <w:lvlJc w:val="left"/>
-      <w:pPr>
-        <w:ind w:left="2880" w:hanging="360"/>
-      </w:pPr>
-    </w:lvl>
-    <w:lvl w:ilvl="4" w:tplc="040C0019" w:tentative="1">
-      <w:start w:val="1"/>
-      <w:numFmt w:val="lowerLetter"/>
-      <w:lvlText w:val="%5."/>
-      <w:lvlJc w:val="left"/>
-      <w:pPr>
-        <w:ind w:left="3600" w:hanging="360"/>
-      </w:pPr>
-    </w:lvl>
-    <w:lvl w:ilvl="5" w:tplc="040C001B" w:tentative="1">
-      <w:start w:val="1"/>
-      <w:numFmt w:val="lowerRoman"/>
-      <w:lvlText w:val="%6."/>
-      <w:lvlJc w:val="right"/>
-      <w:pPr>
-        <w:ind w:left="4320" w:hanging="180"/>
-      </w:pPr>
-    </w:lvl>
-    <w:lvl w:ilvl="6" w:tplc="040C000F" w:tentative="1">
-      <w:start w:val="1"/>
-      <w:numFmt w:val="decimal"/>
-      <w:lvlText w:val="%7."/>
-      <w:lvlJc w:val="left"/>
-      <w:pPr>
-        <w:ind w:left="5040" w:hanging="360"/>
-      </w:pPr>
-    </w:lvl>
-    <w:lvl w:ilvl="7" w:tplc="040C0019" w:tentative="1">
-      <w:start w:val="1"/>
-      <w:numFmt w:val="lowerLetter"/>
-      <w:lvlText w:val="%8."/>
-      <w:lvlJc w:val="left"/>
-      <w:pPr>
-        <w:ind w:left="5760" w:hanging="360"/>
-      </w:pPr>
-    </w:lvl>
-    <w:lvl w:ilvl="8" w:tplc="040C001B" w:tentative="1">
-      <w:start w:val="1"/>
-      <w:numFmt w:val="lowerRoman"/>
-      <w:lvlText w:val="%9."/>
-      <w:lvlJc w:val="right"/>
-      <w:pPr>
-        <w:ind w:left="6480" w:hanging="180"/>
-      </w:pPr>
-    </w:lvl>
-  </w:abstractNum>
-  <w:abstractNum w:abstractNumId="8" w15:restartNumberingAfterBreak="0">
-    <w:nsid w:val="32BC2236"/>
-    <w:multiLevelType w:val="hybridMultilevel"/>
-    <w:tmpl w:val="30F47246"/>
-    <w:lvl w:ilvl="0" w:tplc="040C0011">
-      <w:start w:val="1"/>
-      <w:numFmt w:val="decimal"/>
-      <w:lvlText w:val="%1)"/>
-      <w:lvlJc w:val="left"/>
-      <w:pPr>
-        <w:ind w:left="720" w:hanging="360"/>
-      </w:pPr>
-    </w:lvl>
-    <w:lvl w:ilvl="1" w:tplc="040C0019" w:tentative="1">
-      <w:start w:val="1"/>
-      <w:numFmt w:val="lowerLetter"/>
-      <w:lvlText w:val="%2."/>
-      <w:lvlJc w:val="left"/>
-      <w:pPr>
-        <w:ind w:left="1440" w:hanging="360"/>
-      </w:pPr>
-    </w:lvl>
-    <w:lvl w:ilvl="2" w:tplc="040C001B" w:tentative="1">
-      <w:start w:val="1"/>
-      <w:numFmt w:val="lowerRoman"/>
-      <w:lvlText w:val="%3."/>
-      <w:lvlJc w:val="right"/>
-      <w:pPr>
-        <w:ind w:left="2160" w:hanging="180"/>
-      </w:pPr>
-    </w:lvl>
-    <w:lvl w:ilvl="3" w:tplc="040C000F" w:tentative="1">
-      <w:start w:val="1"/>
-      <w:numFmt w:val="decimal"/>
-      <w:lvlText w:val="%4."/>
-      <w:lvlJc w:val="left"/>
-      <w:pPr>
-        <w:ind w:left="2880" w:hanging="360"/>
-      </w:pPr>
-    </w:lvl>
-    <w:lvl w:ilvl="4" w:tplc="040C0019" w:tentative="1">
-      <w:start w:val="1"/>
-      <w:numFmt w:val="lowerLetter"/>
-      <w:lvlText w:val="%5."/>
-      <w:lvlJc w:val="left"/>
-      <w:pPr>
-        <w:ind w:left="3600" w:hanging="360"/>
-      </w:pPr>
-    </w:lvl>
-    <w:lvl w:ilvl="5" w:tplc="040C001B" w:tentative="1">
-      <w:start w:val="1"/>
-      <w:numFmt w:val="lowerRoman"/>
-      <w:lvlText w:val="%6."/>
-      <w:lvlJc w:val="right"/>
-      <w:pPr>
-        <w:ind w:left="4320" w:hanging="180"/>
-      </w:pPr>
-    </w:lvl>
-    <w:lvl w:ilvl="6" w:tplc="040C000F" w:tentative="1">
-      <w:start w:val="1"/>
-      <w:numFmt w:val="decimal"/>
-      <w:lvlText w:val="%7."/>
-      <w:lvlJc w:val="left"/>
-      <w:pPr>
-        <w:ind w:left="5040" w:hanging="360"/>
-      </w:pPr>
-    </w:lvl>
-    <w:lvl w:ilvl="7" w:tplc="040C0019" w:tentative="1">
-      <w:start w:val="1"/>
-      <w:numFmt w:val="lowerLetter"/>
-      <w:lvlText w:val="%8."/>
-      <w:lvlJc w:val="left"/>
-      <w:pPr>
-        <w:ind w:left="5760" w:hanging="360"/>
-      </w:pPr>
-    </w:lvl>
-    <w:lvl w:ilvl="8" w:tplc="040C001B" w:tentative="1">
-      <w:start w:val="1"/>
-      <w:numFmt w:val="lowerRoman"/>
-      <w:lvlText w:val="%9."/>
-      <w:lvlJc w:val="right"/>
-      <w:pPr>
-        <w:ind w:left="6480" w:hanging="180"/>
-      </w:pPr>
-    </w:lvl>
-  </w:abstractNum>
-  <w:abstractNum w:abstractNumId="9" w15:restartNumberingAfterBreak="0">
-    <w:nsid w:val="414D6B93"/>
-    <w:multiLevelType w:val="hybridMultilevel"/>
-    <w:tmpl w:val="5B4875DE"/>
+    <w:tmpl w:val="4C00F81E"/>
     <w:lvl w:ilvl="0" w:tplc="040C0001">
       <w:start w:val="1"/>
       <w:numFmt w:val="bullet"/>
@@ -14122,10 +14869,182 @@
       </w:rPr>
     </w:lvl>
   </w:abstractNum>
+  <w:abstractNum w:abstractNumId="8" w15:restartNumberingAfterBreak="0">
+    <w:nsid w:val="2DE869EE"/>
+    <w:multiLevelType w:val="hybridMultilevel"/>
+    <w:tmpl w:val="4E94F688"/>
+    <w:lvl w:ilvl="0" w:tplc="040C000F">
+      <w:start w:val="1"/>
+      <w:numFmt w:val="decimal"/>
+      <w:lvlText w:val="%1."/>
+      <w:lvlJc w:val="left"/>
+      <w:pPr>
+        <w:ind w:left="720" w:hanging="360"/>
+      </w:pPr>
+    </w:lvl>
+    <w:lvl w:ilvl="1" w:tplc="040C0019" w:tentative="1">
+      <w:start w:val="1"/>
+      <w:numFmt w:val="lowerLetter"/>
+      <w:lvlText w:val="%2."/>
+      <w:lvlJc w:val="left"/>
+      <w:pPr>
+        <w:ind w:left="1440" w:hanging="360"/>
+      </w:pPr>
+    </w:lvl>
+    <w:lvl w:ilvl="2" w:tplc="040C001B" w:tentative="1">
+      <w:start w:val="1"/>
+      <w:numFmt w:val="lowerRoman"/>
+      <w:lvlText w:val="%3."/>
+      <w:lvlJc w:val="right"/>
+      <w:pPr>
+        <w:ind w:left="2160" w:hanging="180"/>
+      </w:pPr>
+    </w:lvl>
+    <w:lvl w:ilvl="3" w:tplc="040C000F" w:tentative="1">
+      <w:start w:val="1"/>
+      <w:numFmt w:val="decimal"/>
+      <w:lvlText w:val="%4."/>
+      <w:lvlJc w:val="left"/>
+      <w:pPr>
+        <w:ind w:left="2880" w:hanging="360"/>
+      </w:pPr>
+    </w:lvl>
+    <w:lvl w:ilvl="4" w:tplc="040C0019" w:tentative="1">
+      <w:start w:val="1"/>
+      <w:numFmt w:val="lowerLetter"/>
+      <w:lvlText w:val="%5."/>
+      <w:lvlJc w:val="left"/>
+      <w:pPr>
+        <w:ind w:left="3600" w:hanging="360"/>
+      </w:pPr>
+    </w:lvl>
+    <w:lvl w:ilvl="5" w:tplc="040C001B" w:tentative="1">
+      <w:start w:val="1"/>
+      <w:numFmt w:val="lowerRoman"/>
+      <w:lvlText w:val="%6."/>
+      <w:lvlJc w:val="right"/>
+      <w:pPr>
+        <w:ind w:left="4320" w:hanging="180"/>
+      </w:pPr>
+    </w:lvl>
+    <w:lvl w:ilvl="6" w:tplc="040C000F" w:tentative="1">
+      <w:start w:val="1"/>
+      <w:numFmt w:val="decimal"/>
+      <w:lvlText w:val="%7."/>
+      <w:lvlJc w:val="left"/>
+      <w:pPr>
+        <w:ind w:left="5040" w:hanging="360"/>
+      </w:pPr>
+    </w:lvl>
+    <w:lvl w:ilvl="7" w:tplc="040C0019" w:tentative="1">
+      <w:start w:val="1"/>
+      <w:numFmt w:val="lowerLetter"/>
+      <w:lvlText w:val="%8."/>
+      <w:lvlJc w:val="left"/>
+      <w:pPr>
+        <w:ind w:left="5760" w:hanging="360"/>
+      </w:pPr>
+    </w:lvl>
+    <w:lvl w:ilvl="8" w:tplc="040C001B" w:tentative="1">
+      <w:start w:val="1"/>
+      <w:numFmt w:val="lowerRoman"/>
+      <w:lvlText w:val="%9."/>
+      <w:lvlJc w:val="right"/>
+      <w:pPr>
+        <w:ind w:left="6480" w:hanging="180"/>
+      </w:pPr>
+    </w:lvl>
+  </w:abstractNum>
+  <w:abstractNum w:abstractNumId="9" w15:restartNumberingAfterBreak="0">
+    <w:nsid w:val="32BC2236"/>
+    <w:multiLevelType w:val="hybridMultilevel"/>
+    <w:tmpl w:val="30F47246"/>
+    <w:lvl w:ilvl="0" w:tplc="040C0011">
+      <w:start w:val="1"/>
+      <w:numFmt w:val="decimal"/>
+      <w:lvlText w:val="%1)"/>
+      <w:lvlJc w:val="left"/>
+      <w:pPr>
+        <w:ind w:left="720" w:hanging="360"/>
+      </w:pPr>
+    </w:lvl>
+    <w:lvl w:ilvl="1" w:tplc="040C0019" w:tentative="1">
+      <w:start w:val="1"/>
+      <w:numFmt w:val="lowerLetter"/>
+      <w:lvlText w:val="%2."/>
+      <w:lvlJc w:val="left"/>
+      <w:pPr>
+        <w:ind w:left="1440" w:hanging="360"/>
+      </w:pPr>
+    </w:lvl>
+    <w:lvl w:ilvl="2" w:tplc="040C001B" w:tentative="1">
+      <w:start w:val="1"/>
+      <w:numFmt w:val="lowerRoman"/>
+      <w:lvlText w:val="%3."/>
+      <w:lvlJc w:val="right"/>
+      <w:pPr>
+        <w:ind w:left="2160" w:hanging="180"/>
+      </w:pPr>
+    </w:lvl>
+    <w:lvl w:ilvl="3" w:tplc="040C000F" w:tentative="1">
+      <w:start w:val="1"/>
+      <w:numFmt w:val="decimal"/>
+      <w:lvlText w:val="%4."/>
+      <w:lvlJc w:val="left"/>
+      <w:pPr>
+        <w:ind w:left="2880" w:hanging="360"/>
+      </w:pPr>
+    </w:lvl>
+    <w:lvl w:ilvl="4" w:tplc="040C0019" w:tentative="1">
+      <w:start w:val="1"/>
+      <w:numFmt w:val="lowerLetter"/>
+      <w:lvlText w:val="%5."/>
+      <w:lvlJc w:val="left"/>
+      <w:pPr>
+        <w:ind w:left="3600" w:hanging="360"/>
+      </w:pPr>
+    </w:lvl>
+    <w:lvl w:ilvl="5" w:tplc="040C001B" w:tentative="1">
+      <w:start w:val="1"/>
+      <w:numFmt w:val="lowerRoman"/>
+      <w:lvlText w:val="%6."/>
+      <w:lvlJc w:val="right"/>
+      <w:pPr>
+        <w:ind w:left="4320" w:hanging="180"/>
+      </w:pPr>
+    </w:lvl>
+    <w:lvl w:ilvl="6" w:tplc="040C000F" w:tentative="1">
+      <w:start w:val="1"/>
+      <w:numFmt w:val="decimal"/>
+      <w:lvlText w:val="%7."/>
+      <w:lvlJc w:val="left"/>
+      <w:pPr>
+        <w:ind w:left="5040" w:hanging="360"/>
+      </w:pPr>
+    </w:lvl>
+    <w:lvl w:ilvl="7" w:tplc="040C0019" w:tentative="1">
+      <w:start w:val="1"/>
+      <w:numFmt w:val="lowerLetter"/>
+      <w:lvlText w:val="%8."/>
+      <w:lvlJc w:val="left"/>
+      <w:pPr>
+        <w:ind w:left="5760" w:hanging="360"/>
+      </w:pPr>
+    </w:lvl>
+    <w:lvl w:ilvl="8" w:tplc="040C001B" w:tentative="1">
+      <w:start w:val="1"/>
+      <w:numFmt w:val="lowerRoman"/>
+      <w:lvlText w:val="%9."/>
+      <w:lvlJc w:val="right"/>
+      <w:pPr>
+        <w:ind w:left="6480" w:hanging="180"/>
+      </w:pPr>
+    </w:lvl>
+  </w:abstractNum>
   <w:abstractNum w:abstractNumId="10" w15:restartNumberingAfterBreak="0">
-    <w:nsid w:val="41B57D60"/>
+    <w:nsid w:val="414D6B93"/>
     <w:multiLevelType w:val="hybridMultilevel"/>
-    <w:tmpl w:val="210405A2"/>
+    <w:tmpl w:val="5B4875DE"/>
     <w:lvl w:ilvl="0" w:tplc="040C0001">
       <w:start w:val="1"/>
       <w:numFmt w:val="bullet"/>
@@ -14236,9 +15155,9 @@
     </w:lvl>
   </w:abstractNum>
   <w:abstractNum w:abstractNumId="11" w15:restartNumberingAfterBreak="0">
-    <w:nsid w:val="4845549C"/>
+    <w:nsid w:val="41B57D60"/>
     <w:multiLevelType w:val="hybridMultilevel"/>
-    <w:tmpl w:val="81762F32"/>
+    <w:tmpl w:val="210405A2"/>
     <w:lvl w:ilvl="0" w:tplc="040C0001">
       <w:start w:val="1"/>
       <w:numFmt w:val="bullet"/>
@@ -14349,6 +15268,119 @@
     </w:lvl>
   </w:abstractNum>
   <w:abstractNum w:abstractNumId="12" w15:restartNumberingAfterBreak="0">
+    <w:nsid w:val="4845549C"/>
+    <w:multiLevelType w:val="hybridMultilevel"/>
+    <w:tmpl w:val="81762F32"/>
+    <w:lvl w:ilvl="0" w:tplc="040C0001">
+      <w:start w:val="1"/>
+      <w:numFmt w:val="bullet"/>
+      <w:lvlText w:val=""/>
+      <w:lvlJc w:val="left"/>
+      <w:pPr>
+        <w:ind w:left="720" w:hanging="360"/>
+      </w:pPr>
+      <w:rPr>
+        <w:rFonts w:ascii="Symbol" w:hAnsi="Symbol" w:hint="default"/>
+      </w:rPr>
+    </w:lvl>
+    <w:lvl w:ilvl="1" w:tplc="040C0003" w:tentative="1">
+      <w:start w:val="1"/>
+      <w:numFmt w:val="bullet"/>
+      <w:lvlText w:val="o"/>
+      <w:lvlJc w:val="left"/>
+      <w:pPr>
+        <w:ind w:left="1440" w:hanging="360"/>
+      </w:pPr>
+      <w:rPr>
+        <w:rFonts w:ascii="Courier New" w:hAnsi="Courier New" w:cs="Courier New" w:hint="default"/>
+      </w:rPr>
+    </w:lvl>
+    <w:lvl w:ilvl="2" w:tplc="040C0005" w:tentative="1">
+      <w:start w:val="1"/>
+      <w:numFmt w:val="bullet"/>
+      <w:lvlText w:val=""/>
+      <w:lvlJc w:val="left"/>
+      <w:pPr>
+        <w:ind w:left="2160" w:hanging="360"/>
+      </w:pPr>
+      <w:rPr>
+        <w:rFonts w:ascii="Wingdings" w:hAnsi="Wingdings" w:hint="default"/>
+      </w:rPr>
+    </w:lvl>
+    <w:lvl w:ilvl="3" w:tplc="040C0001" w:tentative="1">
+      <w:start w:val="1"/>
+      <w:numFmt w:val="bullet"/>
+      <w:lvlText w:val=""/>
+      <w:lvlJc w:val="left"/>
+      <w:pPr>
+        <w:ind w:left="2880" w:hanging="360"/>
+      </w:pPr>
+      <w:rPr>
+        <w:rFonts w:ascii="Symbol" w:hAnsi="Symbol" w:hint="default"/>
+      </w:rPr>
+    </w:lvl>
+    <w:lvl w:ilvl="4" w:tplc="040C0003" w:tentative="1">
+      <w:start w:val="1"/>
+      <w:numFmt w:val="bullet"/>
+      <w:lvlText w:val="o"/>
+      <w:lvlJc w:val="left"/>
+      <w:pPr>
+        <w:ind w:left="3600" w:hanging="360"/>
+      </w:pPr>
+      <w:rPr>
+        <w:rFonts w:ascii="Courier New" w:hAnsi="Courier New" w:cs="Courier New" w:hint="default"/>
+      </w:rPr>
+    </w:lvl>
+    <w:lvl w:ilvl="5" w:tplc="040C0005" w:tentative="1">
+      <w:start w:val="1"/>
+      <w:numFmt w:val="bullet"/>
+      <w:lvlText w:val=""/>
+      <w:lvlJc w:val="left"/>
+      <w:pPr>
+        <w:ind w:left="4320" w:hanging="360"/>
+      </w:pPr>
+      <w:rPr>
+        <w:rFonts w:ascii="Wingdings" w:hAnsi="Wingdings" w:hint="default"/>
+      </w:rPr>
+    </w:lvl>
+    <w:lvl w:ilvl="6" w:tplc="040C0001" w:tentative="1">
+      <w:start w:val="1"/>
+      <w:numFmt w:val="bullet"/>
+      <w:lvlText w:val=""/>
+      <w:lvlJc w:val="left"/>
+      <w:pPr>
+        <w:ind w:left="5040" w:hanging="360"/>
+      </w:pPr>
+      <w:rPr>
+        <w:rFonts w:ascii="Symbol" w:hAnsi="Symbol" w:hint="default"/>
+      </w:rPr>
+    </w:lvl>
+    <w:lvl w:ilvl="7" w:tplc="040C0003" w:tentative="1">
+      <w:start w:val="1"/>
+      <w:numFmt w:val="bullet"/>
+      <w:lvlText w:val="o"/>
+      <w:lvlJc w:val="left"/>
+      <w:pPr>
+        <w:ind w:left="5760" w:hanging="360"/>
+      </w:pPr>
+      <w:rPr>
+        <w:rFonts w:ascii="Courier New" w:hAnsi="Courier New" w:cs="Courier New" w:hint="default"/>
+      </w:rPr>
+    </w:lvl>
+    <w:lvl w:ilvl="8" w:tplc="040C0005" w:tentative="1">
+      <w:start w:val="1"/>
+      <w:numFmt w:val="bullet"/>
+      <w:lvlText w:val=""/>
+      <w:lvlJc w:val="left"/>
+      <w:pPr>
+        <w:ind w:left="6480" w:hanging="360"/>
+      </w:pPr>
+      <w:rPr>
+        <w:rFonts w:ascii="Wingdings" w:hAnsi="Wingdings" w:hint="default"/>
+      </w:rPr>
+    </w:lvl>
+  </w:abstractNum>
+  <w:abstractNum w:abstractNumId="13" w15:restartNumberingAfterBreak="0">
     <w:nsid w:val="5CE201C5"/>
     <w:multiLevelType w:val="hybridMultilevel"/>
     <w:tmpl w:val="849848D8"/>
@@ -14437,7 +15469,7 @@
       </w:pPr>
     </w:lvl>
   </w:abstractNum>
-  <w:abstractNum w:abstractNumId="13" w15:restartNumberingAfterBreak="0">
+  <w:abstractNum w:abstractNumId="14" w15:restartNumberingAfterBreak="0">
     <w:nsid w:val="5DF708BE"/>
     <w:multiLevelType w:val="hybridMultilevel"/>
     <w:tmpl w:val="2AF0B416"/>
@@ -14550,7 +15582,7 @@
       </w:rPr>
     </w:lvl>
   </w:abstractNum>
-  <w:abstractNum w:abstractNumId="14" w15:restartNumberingAfterBreak="0">
+  <w:abstractNum w:abstractNumId="15" w15:restartNumberingAfterBreak="0">
     <w:nsid w:val="5E0B23B2"/>
     <w:multiLevelType w:val="hybridMultilevel"/>
     <w:tmpl w:val="42507AA4"/>
@@ -14636,7 +15668,7 @@
       </w:pPr>
     </w:lvl>
   </w:abstractNum>
-  <w:abstractNum w:abstractNumId="15" w15:restartNumberingAfterBreak="0">
+  <w:abstractNum w:abstractNumId="16" w15:restartNumberingAfterBreak="0">
     <w:nsid w:val="6F710360"/>
     <w:multiLevelType w:val="hybridMultilevel"/>
     <w:tmpl w:val="66BCC23A"/>
@@ -14749,7 +15781,7 @@
       </w:rPr>
     </w:lvl>
   </w:abstractNum>
-  <w:abstractNum w:abstractNumId="16" w15:restartNumberingAfterBreak="0">
+  <w:abstractNum w:abstractNumId="17" w15:restartNumberingAfterBreak="0">
     <w:nsid w:val="7EC51315"/>
     <w:multiLevelType w:val="hybridMultilevel"/>
     <w:tmpl w:val="7952CE38"/>
@@ -14842,19 +15874,19 @@
     <w:abstractNumId w:val="3"/>
   </w:num>
   <w:num w:numId="2">
+    <w:abstractNumId w:val="9"/>
+  </w:num>
+  <w:num w:numId="3">
     <w:abstractNumId w:val="8"/>
   </w:num>
-  <w:num w:numId="3">
-    <w:abstractNumId w:val="7"/>
-  </w:num>
   <w:num w:numId="4">
-    <w:abstractNumId w:val="16"/>
+    <w:abstractNumId w:val="17"/>
   </w:num>
   <w:num w:numId="5">
     <w:abstractNumId w:val="6"/>
   </w:num>
   <w:num w:numId="6">
-    <w:abstractNumId w:val="14"/>
+    <w:abstractNumId w:val="15"/>
   </w:num>
   <w:num w:numId="7">
     <w:abstractNumId w:val="0"/>
@@ -14863,13 +15895,13 @@
     <w:abstractNumId w:val="1"/>
   </w:num>
   <w:num w:numId="9">
-    <w:abstractNumId w:val="12"/>
+    <w:abstractNumId w:val="13"/>
   </w:num>
   <w:num w:numId="10">
     <w:abstractNumId w:val="4"/>
   </w:num>
   <w:num w:numId="11">
-    <w:abstractNumId w:val="11"/>
+    <w:abstractNumId w:val="12"/>
   </w:num>
   <w:num w:numId="12">
     <w:abstractNumId w:val="2"/>
@@ -14878,16 +15910,19 @@
     <w:abstractNumId w:val="5"/>
   </w:num>
   <w:num w:numId="14">
-    <w:abstractNumId w:val="9"/>
+    <w:abstractNumId w:val="10"/>
   </w:num>
   <w:num w:numId="15">
-    <w:abstractNumId w:val="10"/>
+    <w:abstractNumId w:val="11"/>
   </w:num>
   <w:num w:numId="16">
-    <w:abstractNumId w:val="15"/>
+    <w:abstractNumId w:val="16"/>
   </w:num>
   <w:num w:numId="17">
-    <w:abstractNumId w:val="13"/>
+    <w:abstractNumId w:val="14"/>
+  </w:num>
+  <w:num w:numId="18">
+    <w:abstractNumId w:val="7"/>
   </w:num>
 </w:numbering>
 </file>

</xml_diff>

<commit_message>
Partie 6 question 5
</commit_message>
<xml_diff>
--- a/ai-business_assistant.docx
+++ b/ai-business_assistant.docx
@@ -14007,6 +14007,711 @@
         </w:drawing>
       </w:r>
     </w:p>
+    <w:p>
+      <w:pPr>
+        <w:pStyle w:val="Titre2"/>
+        <w:rPr>
+          <w:sz w:val="24"/>
+          <w:szCs w:val="24"/>
+        </w:rPr>
+      </w:pPr>
+      <w:r>
+        <w:rPr>
+          <w:sz w:val="24"/>
+          <w:szCs w:val="24"/>
+        </w:rPr>
+        <w:t>5) Métriques de régression</w:t>
+      </w:r>
+    </w:p>
+    <w:p>
+      <w:pPr>
+        <w:pStyle w:val="PrformatHTML"/>
+        <w:rPr>
+          <w:rStyle w:val="CodeHTML"/>
+          <w:rFonts w:ascii="Times New Roman" w:hAnsi="Times New Roman" w:cs="Times New Roman"/>
+          <w:sz w:val="24"/>
+          <w:szCs w:val="24"/>
+        </w:rPr>
+      </w:pPr>
+      <w:r>
+        <w:rPr>
+          <w:rStyle w:val="CodeHTML"/>
+          <w:rFonts w:ascii="Times New Roman" w:hAnsi="Times New Roman" w:cs="Times New Roman"/>
+          <w:b/>
+          <w:bCs/>
+          <w:sz w:val="24"/>
+          <w:szCs w:val="24"/>
+        </w:rPr>
+        <w:t>Rôle</w:t>
+      </w:r>
+      <w:r>
+        <w:rPr>
+          <w:rStyle w:val="CodeHTML"/>
+          <w:rFonts w:ascii="Times New Roman" w:hAnsi="Times New Roman" w:cs="Times New Roman"/>
+          <w:sz w:val="24"/>
+          <w:szCs w:val="24"/>
+        </w:rPr>
+        <w:t xml:space="preserve"> : Tu</w:t>
+      </w:r>
+      <w:r>
+        <w:rPr>
+          <w:rStyle w:val="CodeHTML"/>
+          <w:rFonts w:ascii="Times New Roman" w:hAnsi="Times New Roman" w:cs="Times New Roman"/>
+          <w:sz w:val="24"/>
+          <w:szCs w:val="24"/>
+        </w:rPr>
+        <w:t xml:space="preserve"> es un formateur en machine </w:t>
+      </w:r>
+      <w:proofErr w:type="spellStart"/>
+      <w:r>
+        <w:rPr>
+          <w:rStyle w:val="CodeHTML"/>
+          <w:rFonts w:ascii="Times New Roman" w:hAnsi="Times New Roman" w:cs="Times New Roman"/>
+          <w:sz w:val="24"/>
+          <w:szCs w:val="24"/>
+        </w:rPr>
+        <w:t>learning</w:t>
+      </w:r>
+      <w:proofErr w:type="spellEnd"/>
+      <w:r>
+        <w:rPr>
+          <w:rStyle w:val="CodeHTML"/>
+          <w:rFonts w:ascii="Times New Roman" w:hAnsi="Times New Roman" w:cs="Times New Roman"/>
+          <w:sz w:val="24"/>
+          <w:szCs w:val="24"/>
+        </w:rPr>
+        <w:t>.</w:t>
+      </w:r>
+    </w:p>
+    <w:p>
+      <w:pPr>
+        <w:pStyle w:val="PrformatHTML"/>
+        <w:rPr>
+          <w:rStyle w:val="CodeHTML"/>
+          <w:rFonts w:ascii="Times New Roman" w:hAnsi="Times New Roman" w:cs="Times New Roman"/>
+          <w:sz w:val="24"/>
+          <w:szCs w:val="24"/>
+        </w:rPr>
+      </w:pPr>
+    </w:p>
+    <w:p>
+      <w:pPr>
+        <w:pStyle w:val="PrformatHTML"/>
+        <w:rPr>
+          <w:rStyle w:val="CodeHTML"/>
+          <w:rFonts w:ascii="Times New Roman" w:hAnsi="Times New Roman" w:cs="Times New Roman"/>
+          <w:sz w:val="24"/>
+          <w:szCs w:val="24"/>
+        </w:rPr>
+      </w:pPr>
+      <w:r>
+        <w:rPr>
+          <w:rStyle w:val="CodeHTML"/>
+          <w:rFonts w:ascii="Times New Roman" w:hAnsi="Times New Roman" w:cs="Times New Roman"/>
+          <w:b/>
+          <w:bCs/>
+          <w:sz w:val="24"/>
+          <w:szCs w:val="24"/>
+        </w:rPr>
+        <w:t>Tâche</w:t>
+      </w:r>
+      <w:r>
+        <w:rPr>
+          <w:rStyle w:val="CodeHTML"/>
+          <w:rFonts w:ascii="Times New Roman" w:hAnsi="Times New Roman" w:cs="Times New Roman"/>
+          <w:sz w:val="24"/>
+          <w:szCs w:val="24"/>
+        </w:rPr>
+        <w:t xml:space="preserve"> : Explique les métriques de régression suivantes : MAE, MSE, RMSE.</w:t>
+      </w:r>
+    </w:p>
+    <w:p>
+      <w:pPr>
+        <w:pStyle w:val="PrformatHTML"/>
+        <w:rPr>
+          <w:rStyle w:val="CodeHTML"/>
+          <w:rFonts w:ascii="Times New Roman" w:hAnsi="Times New Roman" w:cs="Times New Roman"/>
+          <w:sz w:val="24"/>
+          <w:szCs w:val="24"/>
+        </w:rPr>
+      </w:pPr>
+    </w:p>
+    <w:p>
+      <w:pPr>
+        <w:pStyle w:val="PrformatHTML"/>
+        <w:rPr>
+          <w:rStyle w:val="CodeHTML"/>
+          <w:rFonts w:ascii="Times New Roman" w:hAnsi="Times New Roman" w:cs="Times New Roman"/>
+          <w:sz w:val="24"/>
+          <w:szCs w:val="24"/>
+        </w:rPr>
+      </w:pPr>
+      <w:r>
+        <w:rPr>
+          <w:rStyle w:val="CodeHTML"/>
+          <w:rFonts w:ascii="Times New Roman" w:hAnsi="Times New Roman" w:cs="Times New Roman"/>
+          <w:b/>
+          <w:bCs/>
+          <w:sz w:val="24"/>
+          <w:szCs w:val="24"/>
+        </w:rPr>
+        <w:t>Pour chaque métrique, donne</w:t>
+      </w:r>
+      <w:r>
+        <w:rPr>
+          <w:rStyle w:val="CodeHTML"/>
+          <w:rFonts w:ascii="Times New Roman" w:hAnsi="Times New Roman" w:cs="Times New Roman"/>
+          <w:sz w:val="24"/>
+          <w:szCs w:val="24"/>
+        </w:rPr>
+        <w:t xml:space="preserve"> :</w:t>
+      </w:r>
+    </w:p>
+    <w:p>
+      <w:pPr>
+        <w:pStyle w:val="PrformatHTML"/>
+        <w:numPr>
+          <w:ilvl w:val="0"/>
+          <w:numId w:val="19"/>
+        </w:numPr>
+        <w:rPr>
+          <w:rStyle w:val="CodeHTML"/>
+          <w:rFonts w:ascii="Times New Roman" w:hAnsi="Times New Roman" w:cs="Times New Roman"/>
+          <w:sz w:val="24"/>
+          <w:szCs w:val="24"/>
+        </w:rPr>
+      </w:pPr>
+      <w:r>
+        <w:rPr>
+          <w:rStyle w:val="CodeHTML"/>
+          <w:rFonts w:ascii="Times New Roman" w:hAnsi="Times New Roman" w:cs="Times New Roman"/>
+          <w:sz w:val="24"/>
+          <w:szCs w:val="24"/>
+        </w:rPr>
+        <w:t>Définition</w:t>
+      </w:r>
+    </w:p>
+    <w:p>
+      <w:pPr>
+        <w:pStyle w:val="PrformatHTML"/>
+        <w:numPr>
+          <w:ilvl w:val="0"/>
+          <w:numId w:val="19"/>
+        </w:numPr>
+        <w:rPr>
+          <w:rStyle w:val="CodeHTML"/>
+          <w:rFonts w:ascii="Times New Roman" w:hAnsi="Times New Roman" w:cs="Times New Roman"/>
+          <w:sz w:val="24"/>
+          <w:szCs w:val="24"/>
+        </w:rPr>
+      </w:pPr>
+      <w:r>
+        <w:rPr>
+          <w:rStyle w:val="CodeHTML"/>
+          <w:rFonts w:ascii="Times New Roman" w:hAnsi="Times New Roman" w:cs="Times New Roman"/>
+          <w:sz w:val="24"/>
+          <w:szCs w:val="24"/>
+        </w:rPr>
+        <w:t>Interprétation (comment lire la valeur, unité)</w:t>
+      </w:r>
+    </w:p>
+    <w:p>
+      <w:pPr>
+        <w:pStyle w:val="PrformatHTML"/>
+        <w:numPr>
+          <w:ilvl w:val="0"/>
+          <w:numId w:val="19"/>
+        </w:numPr>
+        <w:rPr>
+          <w:rStyle w:val="CodeHTML"/>
+          <w:rFonts w:ascii="Times New Roman" w:hAnsi="Times New Roman" w:cs="Times New Roman"/>
+          <w:sz w:val="24"/>
+          <w:szCs w:val="24"/>
+        </w:rPr>
+      </w:pPr>
+      <w:r>
+        <w:rPr>
+          <w:rStyle w:val="CodeHTML"/>
+          <w:rFonts w:ascii="Times New Roman" w:hAnsi="Times New Roman" w:cs="Times New Roman"/>
+          <w:sz w:val="24"/>
+          <w:szCs w:val="24"/>
+        </w:rPr>
+        <w:t>Un exemple concret chiffré</w:t>
+      </w:r>
+    </w:p>
+    <w:p>
+      <w:pPr>
+        <w:pStyle w:val="PrformatHTML"/>
+        <w:numPr>
+          <w:ilvl w:val="0"/>
+          <w:numId w:val="19"/>
+        </w:numPr>
+        <w:rPr>
+          <w:rStyle w:val="CodeHTML"/>
+          <w:rFonts w:ascii="Times New Roman" w:hAnsi="Times New Roman" w:cs="Times New Roman"/>
+          <w:sz w:val="24"/>
+          <w:szCs w:val="24"/>
+        </w:rPr>
+      </w:pPr>
+      <w:r>
+        <w:rPr>
+          <w:rStyle w:val="CodeHTML"/>
+          <w:rFonts w:ascii="Times New Roman" w:hAnsi="Times New Roman" w:cs="Times New Roman"/>
+          <w:sz w:val="24"/>
+          <w:szCs w:val="24"/>
+        </w:rPr>
+        <w:t>Le contexte dans lequel cette métrique est particulièrement utile</w:t>
+      </w:r>
+    </w:p>
+    <w:p>
+      <w:pPr>
+        <w:pStyle w:val="PrformatHTML"/>
+        <w:rPr>
+          <w:rStyle w:val="CodeHTML"/>
+          <w:rFonts w:ascii="Times New Roman" w:hAnsi="Times New Roman" w:cs="Times New Roman"/>
+          <w:sz w:val="24"/>
+          <w:szCs w:val="24"/>
+        </w:rPr>
+      </w:pPr>
+    </w:p>
+    <w:p>
+      <w:pPr>
+        <w:pStyle w:val="PrformatHTML"/>
+        <w:rPr>
+          <w:rFonts w:ascii="Times New Roman" w:hAnsi="Times New Roman" w:cs="Times New Roman"/>
+          <w:sz w:val="24"/>
+          <w:szCs w:val="24"/>
+        </w:rPr>
+      </w:pPr>
+      <w:r>
+        <w:rPr>
+          <w:rStyle w:val="CodeHTML"/>
+          <w:rFonts w:ascii="Times New Roman" w:hAnsi="Times New Roman" w:cs="Times New Roman"/>
+          <w:b/>
+          <w:bCs/>
+          <w:sz w:val="24"/>
+          <w:szCs w:val="24"/>
+        </w:rPr>
+        <w:t>Format de sortie</w:t>
+      </w:r>
+      <w:r>
+        <w:rPr>
+          <w:rStyle w:val="CodeHTML"/>
+          <w:rFonts w:ascii="Times New Roman" w:hAnsi="Times New Roman" w:cs="Times New Roman"/>
+          <w:sz w:val="24"/>
+          <w:szCs w:val="24"/>
+        </w:rPr>
+        <w:t xml:space="preserve"> : une section par métrique.</w:t>
+      </w:r>
+    </w:p>
+    <w:p>
+      <w:pPr>
+        <w:pStyle w:val="NormalWeb"/>
+        <w:rPr>
+          <w:rStyle w:val="lev"/>
+          <w:sz w:val="28"/>
+          <w:szCs w:val="28"/>
+        </w:rPr>
+      </w:pPr>
+      <w:r>
+        <w:rPr>
+          <w:rStyle w:val="lev"/>
+          <w:sz w:val="28"/>
+          <w:szCs w:val="28"/>
+        </w:rPr>
+        <w:t>Ré</w:t>
+      </w:r>
+      <w:r>
+        <w:rPr>
+          <w:rStyle w:val="lev"/>
+          <w:sz w:val="28"/>
+          <w:szCs w:val="28"/>
+        </w:rPr>
+        <w:t>sultats</w:t>
+      </w:r>
+      <w:r>
+        <w:rPr>
+          <w:rStyle w:val="lev"/>
+          <w:sz w:val="28"/>
+          <w:szCs w:val="28"/>
+        </w:rPr>
+        <w:t> :</w:t>
+      </w:r>
+    </w:p>
+    <w:p>
+      <w:pPr>
+        <w:pStyle w:val="NormalWeb"/>
+        <w:rPr>
+          <w:rStyle w:val="lev"/>
+          <w:sz w:val="28"/>
+          <w:szCs w:val="28"/>
+        </w:rPr>
+      </w:pPr>
+      <w:r>
+        <w:rPr>
+          <w:rStyle w:val="lev"/>
+          <w:sz w:val="28"/>
+          <w:szCs w:val="28"/>
+        </w:rPr>
+        <w:lastRenderedPageBreak/>
+        <w:drawing>
+          <wp:inline distT="0" distB="0" distL="0" distR="0" wp14:anchorId="1FABFE20" wp14:editId="2440D583">
+            <wp:extent cx="5302523" cy="3416476"/>
+            <wp:effectExtent l="0" t="0" r="0" b="0"/>
+            <wp:docPr id="38" name="Image 38"/>
+            <wp:cNvGraphicFramePr>
+              <a:graphicFrameLocks xmlns:a="http://schemas.openxmlformats.org/drawingml/2006/main" noChangeAspect="1"/>
+            </wp:cNvGraphicFramePr>
+            <a:graphic xmlns:a="http://schemas.openxmlformats.org/drawingml/2006/main">
+              <a:graphicData uri="http://schemas.openxmlformats.org/drawingml/2006/picture">
+                <pic:pic xmlns:pic="http://schemas.openxmlformats.org/drawingml/2006/picture">
+                  <pic:nvPicPr>
+                    <pic:cNvPr id="1" name=""/>
+                    <pic:cNvPicPr/>
+                  </pic:nvPicPr>
+                  <pic:blipFill>
+                    <a:blip r:embed="rId42"/>
+                    <a:stretch>
+                      <a:fillRect/>
+                    </a:stretch>
+                  </pic:blipFill>
+                  <pic:spPr>
+                    <a:xfrm>
+                      <a:off x="0" y="0"/>
+                      <a:ext cx="5302523" cy="3416476"/>
+                    </a:xfrm>
+                    <a:prstGeom prst="rect">
+                      <a:avLst/>
+                    </a:prstGeom>
+                  </pic:spPr>
+                </pic:pic>
+              </a:graphicData>
+            </a:graphic>
+          </wp:inline>
+        </w:drawing>
+      </w:r>
+    </w:p>
+    <w:p>
+      <w:pPr>
+        <w:pStyle w:val="NormalWeb"/>
+        <w:rPr>
+          <w:rStyle w:val="lev"/>
+          <w:sz w:val="28"/>
+          <w:szCs w:val="28"/>
+        </w:rPr>
+      </w:pPr>
+      <w:r>
+        <w:rPr>
+          <w:rStyle w:val="lev"/>
+          <w:sz w:val="28"/>
+          <w:szCs w:val="28"/>
+        </w:rPr>
+        <w:drawing>
+          <wp:inline distT="0" distB="0" distL="0" distR="0" wp14:anchorId="1401B29F" wp14:editId="0A987221">
+            <wp:extent cx="5759450" cy="3773170"/>
+            <wp:effectExtent l="0" t="0" r="0" b="0"/>
+            <wp:docPr id="39" name="Image 39"/>
+            <wp:cNvGraphicFramePr>
+              <a:graphicFrameLocks xmlns:a="http://schemas.openxmlformats.org/drawingml/2006/main" noChangeAspect="1"/>
+            </wp:cNvGraphicFramePr>
+            <a:graphic xmlns:a="http://schemas.openxmlformats.org/drawingml/2006/main">
+              <a:graphicData uri="http://schemas.openxmlformats.org/drawingml/2006/picture">
+                <pic:pic xmlns:pic="http://schemas.openxmlformats.org/drawingml/2006/picture">
+                  <pic:nvPicPr>
+                    <pic:cNvPr id="1" name=""/>
+                    <pic:cNvPicPr/>
+                  </pic:nvPicPr>
+                  <pic:blipFill>
+                    <a:blip r:embed="rId43"/>
+                    <a:stretch>
+                      <a:fillRect/>
+                    </a:stretch>
+                  </pic:blipFill>
+                  <pic:spPr>
+                    <a:xfrm>
+                      <a:off x="0" y="0"/>
+                      <a:ext cx="5759450" cy="3773170"/>
+                    </a:xfrm>
+                    <a:prstGeom prst="rect">
+                      <a:avLst/>
+                    </a:prstGeom>
+                  </pic:spPr>
+                </pic:pic>
+              </a:graphicData>
+            </a:graphic>
+          </wp:inline>
+        </w:drawing>
+      </w:r>
+    </w:p>
+    <w:p>
+      <w:pPr>
+        <w:pStyle w:val="NormalWeb"/>
+        <w:rPr>
+          <w:rStyle w:val="lev"/>
+          <w:sz w:val="28"/>
+          <w:szCs w:val="28"/>
+        </w:rPr>
+      </w:pPr>
+      <w:r>
+        <w:rPr>
+          <w:rStyle w:val="lev"/>
+          <w:sz w:val="28"/>
+          <w:szCs w:val="28"/>
+        </w:rPr>
+        <w:lastRenderedPageBreak/>
+        <w:drawing>
+          <wp:inline distT="0" distB="0" distL="0" distR="0" wp14:anchorId="3D983DC6" wp14:editId="148699DE">
+            <wp:extent cx="5315223" cy="2838596"/>
+            <wp:effectExtent l="0" t="0" r="0" b="0"/>
+            <wp:docPr id="40" name="Image 40"/>
+            <wp:cNvGraphicFramePr>
+              <a:graphicFrameLocks xmlns:a="http://schemas.openxmlformats.org/drawingml/2006/main" noChangeAspect="1"/>
+            </wp:cNvGraphicFramePr>
+            <a:graphic xmlns:a="http://schemas.openxmlformats.org/drawingml/2006/main">
+              <a:graphicData uri="http://schemas.openxmlformats.org/drawingml/2006/picture">
+                <pic:pic xmlns:pic="http://schemas.openxmlformats.org/drawingml/2006/picture">
+                  <pic:nvPicPr>
+                    <pic:cNvPr id="1" name=""/>
+                    <pic:cNvPicPr/>
+                  </pic:nvPicPr>
+                  <pic:blipFill>
+                    <a:blip r:embed="rId44"/>
+                    <a:stretch>
+                      <a:fillRect/>
+                    </a:stretch>
+                  </pic:blipFill>
+                  <pic:spPr>
+                    <a:xfrm>
+                      <a:off x="0" y="0"/>
+                      <a:ext cx="5315223" cy="2838596"/>
+                    </a:xfrm>
+                    <a:prstGeom prst="rect">
+                      <a:avLst/>
+                    </a:prstGeom>
+                  </pic:spPr>
+                </pic:pic>
+              </a:graphicData>
+            </a:graphic>
+          </wp:inline>
+        </w:drawing>
+      </w:r>
+    </w:p>
+    <w:p>
+      <w:pPr>
+        <w:pStyle w:val="NormalWeb"/>
+        <w:rPr>
+          <w:rStyle w:val="lev"/>
+          <w:sz w:val="28"/>
+          <w:szCs w:val="28"/>
+        </w:rPr>
+      </w:pPr>
+      <w:r>
+        <w:rPr>
+          <w:rStyle w:val="lev"/>
+          <w:sz w:val="28"/>
+          <w:szCs w:val="28"/>
+        </w:rPr>
+        <w:drawing>
+          <wp:inline distT="0" distB="0" distL="0" distR="0" wp14:anchorId="4D9A4FF3" wp14:editId="09E0ABC8">
+            <wp:extent cx="5759450" cy="4325620"/>
+            <wp:effectExtent l="0" t="0" r="0" b="0"/>
+            <wp:docPr id="41" name="Image 41"/>
+            <wp:cNvGraphicFramePr>
+              <a:graphicFrameLocks xmlns:a="http://schemas.openxmlformats.org/drawingml/2006/main" noChangeAspect="1"/>
+            </wp:cNvGraphicFramePr>
+            <a:graphic xmlns:a="http://schemas.openxmlformats.org/drawingml/2006/main">
+              <a:graphicData uri="http://schemas.openxmlformats.org/drawingml/2006/picture">
+                <pic:pic xmlns:pic="http://schemas.openxmlformats.org/drawingml/2006/picture">
+                  <pic:nvPicPr>
+                    <pic:cNvPr id="1" name=""/>
+                    <pic:cNvPicPr/>
+                  </pic:nvPicPr>
+                  <pic:blipFill>
+                    <a:blip r:embed="rId45"/>
+                    <a:stretch>
+                      <a:fillRect/>
+                    </a:stretch>
+                  </pic:blipFill>
+                  <pic:spPr>
+                    <a:xfrm>
+                      <a:off x="0" y="0"/>
+                      <a:ext cx="5759450" cy="4325620"/>
+                    </a:xfrm>
+                    <a:prstGeom prst="rect">
+                      <a:avLst/>
+                    </a:prstGeom>
+                  </pic:spPr>
+                </pic:pic>
+              </a:graphicData>
+            </a:graphic>
+          </wp:inline>
+        </w:drawing>
+      </w:r>
+    </w:p>
+    <w:p>
+      <w:pPr>
+        <w:pStyle w:val="NormalWeb"/>
+        <w:rPr>
+          <w:rStyle w:val="CodeHTML"/>
+          <w:rFonts w:ascii="Times New Roman" w:hAnsi="Times New Roman" w:cs="Times New Roman"/>
+          <w:sz w:val="28"/>
+          <w:szCs w:val="28"/>
+        </w:rPr>
+      </w:pPr>
+      <w:r>
+        <w:rPr>
+          <w:rStyle w:val="CodeHTML"/>
+          <w:rFonts w:ascii="Times New Roman" w:hAnsi="Times New Roman" w:cs="Times New Roman"/>
+          <w:sz w:val="28"/>
+          <w:szCs w:val="28"/>
+        </w:rPr>
+        <w:lastRenderedPageBreak/>
+        <w:drawing>
+          <wp:inline distT="0" distB="0" distL="0" distR="0" wp14:anchorId="0EED7B7B" wp14:editId="19F41CAB">
+            <wp:extent cx="5759450" cy="4707255"/>
+            <wp:effectExtent l="0" t="0" r="0" b="0"/>
+            <wp:docPr id="42" name="Image 42"/>
+            <wp:cNvGraphicFramePr>
+              <a:graphicFrameLocks xmlns:a="http://schemas.openxmlformats.org/drawingml/2006/main" noChangeAspect="1"/>
+            </wp:cNvGraphicFramePr>
+            <a:graphic xmlns:a="http://schemas.openxmlformats.org/drawingml/2006/main">
+              <a:graphicData uri="http://schemas.openxmlformats.org/drawingml/2006/picture">
+                <pic:pic xmlns:pic="http://schemas.openxmlformats.org/drawingml/2006/picture">
+                  <pic:nvPicPr>
+                    <pic:cNvPr id="1" name=""/>
+                    <pic:cNvPicPr/>
+                  </pic:nvPicPr>
+                  <pic:blipFill>
+                    <a:blip r:embed="rId46"/>
+                    <a:stretch>
+                      <a:fillRect/>
+                    </a:stretch>
+                  </pic:blipFill>
+                  <pic:spPr>
+                    <a:xfrm>
+                      <a:off x="0" y="0"/>
+                      <a:ext cx="5759450" cy="4707255"/>
+                    </a:xfrm>
+                    <a:prstGeom prst="rect">
+                      <a:avLst/>
+                    </a:prstGeom>
+                  </pic:spPr>
+                </pic:pic>
+              </a:graphicData>
+            </a:graphic>
+          </wp:inline>
+        </w:drawing>
+      </w:r>
+    </w:p>
+    <w:p>
+      <w:pPr>
+        <w:pStyle w:val="NormalWeb"/>
+        <w:rPr>
+          <w:rStyle w:val="CodeHTML"/>
+          <w:rFonts w:ascii="Times New Roman" w:hAnsi="Times New Roman" w:cs="Times New Roman"/>
+          <w:sz w:val="28"/>
+          <w:szCs w:val="28"/>
+        </w:rPr>
+      </w:pPr>
+      <w:r>
+        <w:rPr>
+          <w:rStyle w:val="CodeHTML"/>
+          <w:rFonts w:ascii="Times New Roman" w:hAnsi="Times New Roman" w:cs="Times New Roman"/>
+          <w:sz w:val="28"/>
+          <w:szCs w:val="28"/>
+        </w:rPr>
+        <w:drawing>
+          <wp:inline distT="0" distB="0" distL="0" distR="0" wp14:anchorId="62BDFFA4" wp14:editId="2E052C24">
+            <wp:extent cx="5454930" cy="2190863"/>
+            <wp:effectExtent l="0" t="0" r="0" b="0"/>
+            <wp:docPr id="43" name="Image 43"/>
+            <wp:cNvGraphicFramePr>
+              <a:graphicFrameLocks xmlns:a="http://schemas.openxmlformats.org/drawingml/2006/main" noChangeAspect="1"/>
+            </wp:cNvGraphicFramePr>
+            <a:graphic xmlns:a="http://schemas.openxmlformats.org/drawingml/2006/main">
+              <a:graphicData uri="http://schemas.openxmlformats.org/drawingml/2006/picture">
+                <pic:pic xmlns:pic="http://schemas.openxmlformats.org/drawingml/2006/picture">
+                  <pic:nvPicPr>
+                    <pic:cNvPr id="1" name=""/>
+                    <pic:cNvPicPr/>
+                  </pic:nvPicPr>
+                  <pic:blipFill>
+                    <a:blip r:embed="rId47"/>
+                    <a:stretch>
+                      <a:fillRect/>
+                    </a:stretch>
+                  </pic:blipFill>
+                  <pic:spPr>
+                    <a:xfrm>
+                      <a:off x="0" y="0"/>
+                      <a:ext cx="5454930" cy="2190863"/>
+                    </a:xfrm>
+                    <a:prstGeom prst="rect">
+                      <a:avLst/>
+                    </a:prstGeom>
+                  </pic:spPr>
+                </pic:pic>
+              </a:graphicData>
+            </a:graphic>
+          </wp:inline>
+        </w:drawing>
+      </w:r>
+    </w:p>
+    <w:p>
+      <w:pPr>
+        <w:pStyle w:val="NormalWeb"/>
+        <w:rPr>
+          <w:rStyle w:val="CodeHTML"/>
+          <w:rFonts w:ascii="Times New Roman" w:hAnsi="Times New Roman" w:cs="Times New Roman"/>
+          <w:sz w:val="28"/>
+          <w:szCs w:val="28"/>
+        </w:rPr>
+      </w:pPr>
+      <w:r>
+        <w:rPr>
+          <w:rStyle w:val="CodeHTML"/>
+          <w:rFonts w:ascii="Times New Roman" w:hAnsi="Times New Roman" w:cs="Times New Roman"/>
+          <w:sz w:val="28"/>
+          <w:szCs w:val="28"/>
+        </w:rPr>
+        <w:lastRenderedPageBreak/>
+        <w:drawing>
+          <wp:inline distT="0" distB="0" distL="0" distR="0" wp14:anchorId="0029C918" wp14:editId="5E144953">
+            <wp:extent cx="5543835" cy="5073911"/>
+            <wp:effectExtent l="0" t="0" r="0" b="0"/>
+            <wp:docPr id="44" name="Image 44"/>
+            <wp:cNvGraphicFramePr>
+              <a:graphicFrameLocks xmlns:a="http://schemas.openxmlformats.org/drawingml/2006/main" noChangeAspect="1"/>
+            </wp:cNvGraphicFramePr>
+            <a:graphic xmlns:a="http://schemas.openxmlformats.org/drawingml/2006/main">
+              <a:graphicData uri="http://schemas.openxmlformats.org/drawingml/2006/picture">
+                <pic:pic xmlns:pic="http://schemas.openxmlformats.org/drawingml/2006/picture">
+                  <pic:nvPicPr>
+                    <pic:cNvPr id="1" name=""/>
+                    <pic:cNvPicPr/>
+                  </pic:nvPicPr>
+                  <pic:blipFill>
+                    <a:blip r:embed="rId48"/>
+                    <a:stretch>
+                      <a:fillRect/>
+                    </a:stretch>
+                  </pic:blipFill>
+                  <pic:spPr>
+                    <a:xfrm>
+                      <a:off x="0" y="0"/>
+                      <a:ext cx="5543835" cy="5073911"/>
+                    </a:xfrm>
+                    <a:prstGeom prst="rect">
+                      <a:avLst/>
+                    </a:prstGeom>
+                  </pic:spPr>
+                </pic:pic>
+              </a:graphicData>
+            </a:graphic>
+          </wp:inline>
+        </w:drawing>
+      </w:r>
+    </w:p>
     <w:sectPr>
       <w:pgSz w:w="11906" w:h="16838"/>
       <w:pgMar w:top="1418" w:right="1418" w:bottom="1418" w:left="1418" w:header="709" w:footer="709" w:gutter="0"/>
@@ -15669,9 +16374,9 @@
     </w:lvl>
   </w:abstractNum>
   <w:abstractNum w:abstractNumId="16" w15:restartNumberingAfterBreak="0">
-    <w:nsid w:val="6F710360"/>
+    <w:nsid w:val="65390315"/>
     <w:multiLevelType w:val="hybridMultilevel"/>
-    <w:tmpl w:val="66BCC23A"/>
+    <w:tmpl w:val="ED686912"/>
     <w:lvl w:ilvl="0" w:tplc="040C0001">
       <w:start w:val="1"/>
       <w:numFmt w:val="bullet"/>
@@ -15782,6 +16487,119 @@
     </w:lvl>
   </w:abstractNum>
   <w:abstractNum w:abstractNumId="17" w15:restartNumberingAfterBreak="0">
+    <w:nsid w:val="6F710360"/>
+    <w:multiLevelType w:val="hybridMultilevel"/>
+    <w:tmpl w:val="66BCC23A"/>
+    <w:lvl w:ilvl="0" w:tplc="040C0001">
+      <w:start w:val="1"/>
+      <w:numFmt w:val="bullet"/>
+      <w:lvlText w:val=""/>
+      <w:lvlJc w:val="left"/>
+      <w:pPr>
+        <w:ind w:left="720" w:hanging="360"/>
+      </w:pPr>
+      <w:rPr>
+        <w:rFonts w:ascii="Symbol" w:hAnsi="Symbol" w:hint="default"/>
+      </w:rPr>
+    </w:lvl>
+    <w:lvl w:ilvl="1" w:tplc="040C0003" w:tentative="1">
+      <w:start w:val="1"/>
+      <w:numFmt w:val="bullet"/>
+      <w:lvlText w:val="o"/>
+      <w:lvlJc w:val="left"/>
+      <w:pPr>
+        <w:ind w:left="1440" w:hanging="360"/>
+      </w:pPr>
+      <w:rPr>
+        <w:rFonts w:ascii="Courier New" w:hAnsi="Courier New" w:cs="Courier New" w:hint="default"/>
+      </w:rPr>
+    </w:lvl>
+    <w:lvl w:ilvl="2" w:tplc="040C0005" w:tentative="1">
+      <w:start w:val="1"/>
+      <w:numFmt w:val="bullet"/>
+      <w:lvlText w:val=""/>
+      <w:lvlJc w:val="left"/>
+      <w:pPr>
+        <w:ind w:left="2160" w:hanging="360"/>
+      </w:pPr>
+      <w:rPr>
+        <w:rFonts w:ascii="Wingdings" w:hAnsi="Wingdings" w:hint="default"/>
+      </w:rPr>
+    </w:lvl>
+    <w:lvl w:ilvl="3" w:tplc="040C0001" w:tentative="1">
+      <w:start w:val="1"/>
+      <w:numFmt w:val="bullet"/>
+      <w:lvlText w:val=""/>
+      <w:lvlJc w:val="left"/>
+      <w:pPr>
+        <w:ind w:left="2880" w:hanging="360"/>
+      </w:pPr>
+      <w:rPr>
+        <w:rFonts w:ascii="Symbol" w:hAnsi="Symbol" w:hint="default"/>
+      </w:rPr>
+    </w:lvl>
+    <w:lvl w:ilvl="4" w:tplc="040C0003" w:tentative="1">
+      <w:start w:val="1"/>
+      <w:numFmt w:val="bullet"/>
+      <w:lvlText w:val="o"/>
+      <w:lvlJc w:val="left"/>
+      <w:pPr>
+        <w:ind w:left="3600" w:hanging="360"/>
+      </w:pPr>
+      <w:rPr>
+        <w:rFonts w:ascii="Courier New" w:hAnsi="Courier New" w:cs="Courier New" w:hint="default"/>
+      </w:rPr>
+    </w:lvl>
+    <w:lvl w:ilvl="5" w:tplc="040C0005" w:tentative="1">
+      <w:start w:val="1"/>
+      <w:numFmt w:val="bullet"/>
+      <w:lvlText w:val=""/>
+      <w:lvlJc w:val="left"/>
+      <w:pPr>
+        <w:ind w:left="4320" w:hanging="360"/>
+      </w:pPr>
+      <w:rPr>
+        <w:rFonts w:ascii="Wingdings" w:hAnsi="Wingdings" w:hint="default"/>
+      </w:rPr>
+    </w:lvl>
+    <w:lvl w:ilvl="6" w:tplc="040C0001" w:tentative="1">
+      <w:start w:val="1"/>
+      <w:numFmt w:val="bullet"/>
+      <w:lvlText w:val=""/>
+      <w:lvlJc w:val="left"/>
+      <w:pPr>
+        <w:ind w:left="5040" w:hanging="360"/>
+      </w:pPr>
+      <w:rPr>
+        <w:rFonts w:ascii="Symbol" w:hAnsi="Symbol" w:hint="default"/>
+      </w:rPr>
+    </w:lvl>
+    <w:lvl w:ilvl="7" w:tplc="040C0003" w:tentative="1">
+      <w:start w:val="1"/>
+      <w:numFmt w:val="bullet"/>
+      <w:lvlText w:val="o"/>
+      <w:lvlJc w:val="left"/>
+      <w:pPr>
+        <w:ind w:left="5760" w:hanging="360"/>
+      </w:pPr>
+      <w:rPr>
+        <w:rFonts w:ascii="Courier New" w:hAnsi="Courier New" w:cs="Courier New" w:hint="default"/>
+      </w:rPr>
+    </w:lvl>
+    <w:lvl w:ilvl="8" w:tplc="040C0005" w:tentative="1">
+      <w:start w:val="1"/>
+      <w:numFmt w:val="bullet"/>
+      <w:lvlText w:val=""/>
+      <w:lvlJc w:val="left"/>
+      <w:pPr>
+        <w:ind w:left="6480" w:hanging="360"/>
+      </w:pPr>
+      <w:rPr>
+        <w:rFonts w:ascii="Wingdings" w:hAnsi="Wingdings" w:hint="default"/>
+      </w:rPr>
+    </w:lvl>
+  </w:abstractNum>
+  <w:abstractNum w:abstractNumId="18" w15:restartNumberingAfterBreak="0">
     <w:nsid w:val="7EC51315"/>
     <w:multiLevelType w:val="hybridMultilevel"/>
     <w:tmpl w:val="7952CE38"/>
@@ -15880,7 +16698,7 @@
     <w:abstractNumId w:val="8"/>
   </w:num>
   <w:num w:numId="4">
-    <w:abstractNumId w:val="17"/>
+    <w:abstractNumId w:val="18"/>
   </w:num>
   <w:num w:numId="5">
     <w:abstractNumId w:val="6"/>
@@ -15916,13 +16734,16 @@
     <w:abstractNumId w:val="11"/>
   </w:num>
   <w:num w:numId="16">
-    <w:abstractNumId w:val="16"/>
+    <w:abstractNumId w:val="17"/>
   </w:num>
   <w:num w:numId="17">
     <w:abstractNumId w:val="14"/>
   </w:num>
   <w:num w:numId="18">
     <w:abstractNumId w:val="7"/>
+  </w:num>
+  <w:num w:numId="19">
+    <w:abstractNumId w:val="16"/>
   </w:num>
 </w:numbering>
 </file>

</xml_diff>

<commit_message>
Partie 6 question 1 et 2
</commit_message>
<xml_diff>
--- a/ai-business_assistant.docx
+++ b/ai-business_assistant.docx
@@ -1256,16 +1256,7 @@
           <w:sz w:val="28"/>
           <w:szCs w:val="28"/>
         </w:rPr>
-        <w:t xml:space="preserve">Prompt </w:t>
-      </w:r>
-      <w:r>
-        <w:rPr>
-          <w:rFonts w:ascii="Times New Roman" w:hAnsi="Times New Roman" w:cs="Times New Roman"/>
-          <w:b/>
-          <w:sz w:val="28"/>
-          <w:szCs w:val="28"/>
-        </w:rPr>
-        <w:t>One-shot</w:t>
+        <w:t>Prompt One-shot</w:t>
       </w:r>
     </w:p>
     <w:p>
@@ -1411,6 +1402,7 @@
         <w:rPr>
           <w:rFonts w:ascii="var(--font-mono)" w:eastAsia="Times New Roman" w:hAnsi="var(--font-mono)" w:cs="Courier New"/>
           <w:b/>
+          <w:noProof/>
           <w:sz w:val="20"/>
           <w:szCs w:val="20"/>
           <w:lang w:eastAsia="fr-FR"/>
@@ -1569,27 +1561,7 @@
           <w:sz w:val="24"/>
           <w:szCs w:val="24"/>
         </w:rPr>
-        <w:t xml:space="preserve">Commentaire : "Le produit est arrivé </w:t>
-      </w:r>
-      <w:proofErr w:type="gramStart"/>
-      <w:r>
-        <w:rPr>
-          <w:rStyle w:val="CodeHTML"/>
-          <w:rFonts w:ascii="Times New Roman" w:eastAsiaTheme="minorHAnsi" w:hAnsi="Times New Roman" w:cs="Times New Roman"/>
-          <w:sz w:val="24"/>
-          <w:szCs w:val="24"/>
-        </w:rPr>
-        <w:t>cassé</w:t>
-      </w:r>
-      <w:proofErr w:type="gramEnd"/>
-      <w:r>
-        <w:rPr>
-          <w:rStyle w:val="CodeHTML"/>
-          <w:rFonts w:ascii="Times New Roman" w:eastAsiaTheme="minorHAnsi" w:hAnsi="Times New Roman" w:cs="Times New Roman"/>
-          <w:sz w:val="24"/>
-          <w:szCs w:val="24"/>
-        </w:rPr>
-        <w:t xml:space="preserve"> et le support ne répond pas."</w:t>
+        <w:t>Commentaire : "Le produit est arrivé cassé et le support ne répond pas."</w:t>
       </w:r>
     </w:p>
     <w:p>
@@ -1774,6 +1746,7 @@
         <w:rPr>
           <w:rFonts w:ascii="Times New Roman" w:eastAsia="Times New Roman" w:hAnsi="Times New Roman" w:cs="Times New Roman"/>
           <w:b/>
+          <w:noProof/>
           <w:sz w:val="28"/>
           <w:szCs w:val="28"/>
           <w:lang w:eastAsia="fr-FR"/>
@@ -1967,16 +1940,7 @@
           <w:sz w:val="24"/>
           <w:szCs w:val="24"/>
         </w:rPr>
-        <w:t>Positif</w:t>
-      </w:r>
-      <w:r>
-        <w:rPr>
-          <w:rStyle w:val="CodeHTML"/>
-          <w:rFonts w:ascii="Times New Roman" w:hAnsi="Times New Roman" w:cs="Times New Roman"/>
-          <w:sz w:val="24"/>
-          <w:szCs w:val="24"/>
-        </w:rPr>
-        <w:t>, négatif, neutre.</w:t>
+        <w:t>Positif, négatif, neutre.</w:t>
       </w:r>
     </w:p>
     <w:p>
@@ -2072,27 +2036,7 @@
           <w:sz w:val="24"/>
           <w:szCs w:val="24"/>
         </w:rPr>
-        <w:t xml:space="preserve">   (</w:t>
-      </w:r>
-      <w:proofErr w:type="gramStart"/>
-      <w:r>
-        <w:rPr>
-          <w:rStyle w:val="CodeHTML"/>
-          <w:rFonts w:ascii="Times New Roman" w:hAnsi="Times New Roman" w:cs="Times New Roman"/>
-          <w:sz w:val="24"/>
-          <w:szCs w:val="24"/>
-        </w:rPr>
-        <w:t>un</w:t>
-      </w:r>
-      <w:proofErr w:type="gramEnd"/>
-      <w:r>
-        <w:rPr>
-          <w:rStyle w:val="CodeHTML"/>
-          <w:rFonts w:ascii="Times New Roman" w:hAnsi="Times New Roman" w:cs="Times New Roman"/>
-          <w:sz w:val="24"/>
-          <w:szCs w:val="24"/>
-        </w:rPr>
-        <w:t xml:space="preserve"> commentaire mixte penche généralement vers négatif si le problème</w:t>
+        <w:t xml:space="preserve">   (un commentaire mixte penche généralement vers négatif si le problème</w:t>
       </w:r>
     </w:p>
     <w:p>
@@ -2113,27 +2057,7 @@
           <w:sz w:val="24"/>
           <w:szCs w:val="24"/>
         </w:rPr>
-        <w:t xml:space="preserve">   </w:t>
-      </w:r>
-      <w:proofErr w:type="gramStart"/>
-      <w:r>
-        <w:rPr>
-          <w:rStyle w:val="CodeHTML"/>
-          <w:rFonts w:ascii="Times New Roman" w:hAnsi="Times New Roman" w:cs="Times New Roman"/>
-          <w:sz w:val="24"/>
-          <w:szCs w:val="24"/>
-        </w:rPr>
-        <w:t>mentionné</w:t>
-      </w:r>
-      <w:proofErr w:type="gramEnd"/>
-      <w:r>
-        <w:rPr>
-          <w:rStyle w:val="CodeHTML"/>
-          <w:rFonts w:ascii="Times New Roman" w:hAnsi="Times New Roman" w:cs="Times New Roman"/>
-          <w:sz w:val="24"/>
-          <w:szCs w:val="24"/>
-        </w:rPr>
-        <w:t xml:space="preserve"> affecte l'usage du produit).</w:t>
+        <w:t xml:space="preserve">   mentionné affecte l'usage du produit).</w:t>
       </w:r>
     </w:p>
     <w:p>
@@ -2287,25 +2211,14 @@
         <w:t>elements_positifs</w:t>
       </w:r>
       <w:proofErr w:type="spellEnd"/>
-      <w:proofErr w:type="gramStart"/>
-      <w:r>
-        <w:rPr>
-          <w:rStyle w:val="CodeHTML"/>
-          <w:rFonts w:ascii="Times New Roman" w:hAnsi="Times New Roman" w:cs="Times New Roman"/>
-          <w:sz w:val="24"/>
-          <w:szCs w:val="24"/>
-        </w:rPr>
-        <w:t>":</w:t>
-      </w:r>
-      <w:proofErr w:type="gramEnd"/>
-      <w:r>
-        <w:rPr>
-          <w:rStyle w:val="CodeHTML"/>
-          <w:rFonts w:ascii="Times New Roman" w:hAnsi="Times New Roman" w:cs="Times New Roman"/>
-          <w:sz w:val="24"/>
-          <w:szCs w:val="24"/>
-        </w:rPr>
-        <w:t xml:space="preserve"> [...],</w:t>
+      <w:r>
+        <w:rPr>
+          <w:rStyle w:val="CodeHTML"/>
+          <w:rFonts w:ascii="Times New Roman" w:hAnsi="Times New Roman" w:cs="Times New Roman"/>
+          <w:sz w:val="24"/>
+          <w:szCs w:val="24"/>
+        </w:rPr>
+        <w:t>": [...],</w:t>
       </w:r>
     </w:p>
     <w:p>
@@ -2339,25 +2252,14 @@
         <w:t>elements_negatifs</w:t>
       </w:r>
       <w:proofErr w:type="spellEnd"/>
-      <w:proofErr w:type="gramStart"/>
-      <w:r>
-        <w:rPr>
-          <w:rStyle w:val="CodeHTML"/>
-          <w:rFonts w:ascii="Times New Roman" w:hAnsi="Times New Roman" w:cs="Times New Roman"/>
-          <w:sz w:val="24"/>
-          <w:szCs w:val="24"/>
-        </w:rPr>
-        <w:t>":</w:t>
-      </w:r>
-      <w:proofErr w:type="gramEnd"/>
-      <w:r>
-        <w:rPr>
-          <w:rStyle w:val="CodeHTML"/>
-          <w:rFonts w:ascii="Times New Roman" w:hAnsi="Times New Roman" w:cs="Times New Roman"/>
-          <w:sz w:val="24"/>
-          <w:szCs w:val="24"/>
-        </w:rPr>
-        <w:t xml:space="preserve"> [...],</w:t>
+      <w:r>
+        <w:rPr>
+          <w:rStyle w:val="CodeHTML"/>
+          <w:rFonts w:ascii="Times New Roman" w:hAnsi="Times New Roman" w:cs="Times New Roman"/>
+          <w:sz w:val="24"/>
+          <w:szCs w:val="24"/>
+        </w:rPr>
+        <w:t>": [...],</w:t>
       </w:r>
     </w:p>
     <w:p>
@@ -2378,27 +2280,7 @@
           <w:sz w:val="24"/>
           <w:szCs w:val="24"/>
         </w:rPr>
-        <w:t xml:space="preserve">  "classe</w:t>
-      </w:r>
-      <w:proofErr w:type="gramStart"/>
-      <w:r>
-        <w:rPr>
-          <w:rStyle w:val="CodeHTML"/>
-          <w:rFonts w:ascii="Times New Roman" w:hAnsi="Times New Roman" w:cs="Times New Roman"/>
-          <w:sz w:val="24"/>
-          <w:szCs w:val="24"/>
-        </w:rPr>
-        <w:t>":</w:t>
-      </w:r>
-      <w:proofErr w:type="gramEnd"/>
-      <w:r>
-        <w:rPr>
-          <w:rStyle w:val="CodeHTML"/>
-          <w:rFonts w:ascii="Times New Roman" w:hAnsi="Times New Roman" w:cs="Times New Roman"/>
-          <w:sz w:val="24"/>
-          <w:szCs w:val="24"/>
-        </w:rPr>
-        <w:t xml:space="preserve"> "positif | négatif | neutre",</w:t>
+        <w:t xml:space="preserve">  "classe": "positif | négatif | neutre",</w:t>
       </w:r>
     </w:p>
     <w:p>
@@ -2419,27 +2301,7 @@
           <w:sz w:val="24"/>
           <w:szCs w:val="24"/>
         </w:rPr>
-        <w:t xml:space="preserve">  "justification</w:t>
-      </w:r>
-      <w:proofErr w:type="gramStart"/>
-      <w:r>
-        <w:rPr>
-          <w:rStyle w:val="CodeHTML"/>
-          <w:rFonts w:ascii="Times New Roman" w:hAnsi="Times New Roman" w:cs="Times New Roman"/>
-          <w:sz w:val="24"/>
-          <w:szCs w:val="24"/>
-        </w:rPr>
-        <w:t>":</w:t>
-      </w:r>
-      <w:proofErr w:type="gramEnd"/>
-      <w:r>
-        <w:rPr>
-          <w:rStyle w:val="CodeHTML"/>
-          <w:rFonts w:ascii="Times New Roman" w:hAnsi="Times New Roman" w:cs="Times New Roman"/>
-          <w:sz w:val="24"/>
-          <w:szCs w:val="24"/>
-        </w:rPr>
-        <w:t xml:space="preserve"> "..."</w:t>
+        <w:t xml:space="preserve">  "justification": "..."</w:t>
       </w:r>
     </w:p>
     <w:p>
@@ -2511,6 +2373,7 @@
         <w:rPr>
           <w:rFonts w:ascii="Times New Roman" w:eastAsia="Times New Roman" w:hAnsi="Times New Roman" w:cs="Times New Roman"/>
           <w:b/>
+          <w:noProof/>
           <w:sz w:val="28"/>
           <w:szCs w:val="28"/>
           <w:lang w:eastAsia="fr-FR"/>
@@ -2642,6 +2505,9 @@
         <w:pStyle w:val="NormalWeb"/>
       </w:pPr>
       <w:r>
+        <w:rPr>
+          <w:noProof/>
+        </w:rPr>
         <w:lastRenderedPageBreak/>
         <w:drawing>
           <wp:inline distT="0" distB="0" distL="0" distR="0" wp14:anchorId="6E8E32D7" wp14:editId="1D390B78">
@@ -2992,6 +2858,7 @@
       <w:r>
         <w:rPr>
           <w:rFonts w:ascii="Times New Roman" w:hAnsi="Times New Roman" w:cs="Times New Roman"/>
+          <w:noProof/>
           <w:sz w:val="24"/>
           <w:szCs w:val="24"/>
         </w:rPr>
@@ -3045,6 +2912,7 @@
       <w:r>
         <w:rPr>
           <w:rFonts w:ascii="Times New Roman" w:hAnsi="Times New Roman" w:cs="Times New Roman"/>
+          <w:noProof/>
           <w:sz w:val="24"/>
           <w:szCs w:val="24"/>
         </w:rPr>
@@ -3292,7 +3160,6 @@
           <w:szCs w:val="24"/>
         </w:rPr>
       </w:pPr>
-      <w:proofErr w:type="gramStart"/>
       <w:r>
         <w:rPr>
           <w:rStyle w:val="CodeHTML"/>
@@ -3300,39 +3167,37 @@
           <w:sz w:val="24"/>
           <w:szCs w:val="24"/>
         </w:rPr>
-        <w:t>pour</w:t>
-      </w:r>
-      <w:proofErr w:type="gramEnd"/>
-      <w:r>
+        <w:t>pour lundi, mais nous sommes jeudi et je n'ai toujours rien reçu. Le suivi de ma</w:t>
+      </w:r>
+    </w:p>
+    <w:p>
+      <w:pPr>
         <w:rPr>
           <w:rStyle w:val="CodeHTML"/>
           <w:rFonts w:ascii="Times New Roman" w:eastAsiaTheme="minorHAnsi" w:hAnsi="Times New Roman" w:cs="Times New Roman"/>
           <w:sz w:val="24"/>
           <w:szCs w:val="24"/>
         </w:rPr>
-        <w:t xml:space="preserve"> lundi, mais nous sommes jeudi et je n'ai toujours rien reçu. Le suivi de ma</w:t>
-      </w:r>
-    </w:p>
-    <w:p>
-      <w:pPr>
+      </w:pPr>
+      <w:r>
         <w:rPr>
           <w:rStyle w:val="CodeHTML"/>
           <w:rFonts w:ascii="Times New Roman" w:eastAsiaTheme="minorHAnsi" w:hAnsi="Times New Roman" w:cs="Times New Roman"/>
           <w:sz w:val="24"/>
           <w:szCs w:val="24"/>
         </w:rPr>
-      </w:pPr>
-      <w:proofErr w:type="gramStart"/>
-      <w:r>
+        <w:t>commande n'a pas été mis à jour depuis lundi. J'ai également contacté le service</w:t>
+      </w:r>
+    </w:p>
+    <w:p>
+      <w:pPr>
         <w:rPr>
           <w:rStyle w:val="CodeHTML"/>
           <w:rFonts w:ascii="Times New Roman" w:eastAsiaTheme="minorHAnsi" w:hAnsi="Times New Roman" w:cs="Times New Roman"/>
           <w:sz w:val="24"/>
           <w:szCs w:val="24"/>
         </w:rPr>
-        <w:t>commande</w:t>
-      </w:r>
-      <w:proofErr w:type="gramEnd"/>
+      </w:pPr>
       <w:r>
         <w:rPr>
           <w:rStyle w:val="CodeHTML"/>
@@ -3340,37 +3205,7 @@
           <w:sz w:val="24"/>
           <w:szCs w:val="24"/>
         </w:rPr>
-        <w:t xml:space="preserve"> n'a pas été mis à jour depuis lundi. J'ai également contacté le service</w:t>
-      </w:r>
-    </w:p>
-    <w:p>
-      <w:pPr>
-        <w:rPr>
-          <w:rStyle w:val="CodeHTML"/>
-          <w:rFonts w:ascii="Times New Roman" w:eastAsiaTheme="minorHAnsi" w:hAnsi="Times New Roman" w:cs="Times New Roman"/>
-          <w:sz w:val="24"/>
-          <w:szCs w:val="24"/>
-        </w:rPr>
-      </w:pPr>
-      <w:proofErr w:type="gramStart"/>
-      <w:r>
-        <w:rPr>
-          <w:rStyle w:val="CodeHTML"/>
-          <w:rFonts w:ascii="Times New Roman" w:eastAsiaTheme="minorHAnsi" w:hAnsi="Times New Roman" w:cs="Times New Roman"/>
-          <w:sz w:val="24"/>
-          <w:szCs w:val="24"/>
-        </w:rPr>
-        <w:t>client</w:t>
-      </w:r>
-      <w:proofErr w:type="gramEnd"/>
-      <w:r>
-        <w:rPr>
-          <w:rStyle w:val="CodeHTML"/>
-          <w:rFonts w:ascii="Times New Roman" w:eastAsiaTheme="minorHAnsi" w:hAnsi="Times New Roman" w:cs="Times New Roman"/>
-          <w:sz w:val="24"/>
-          <w:szCs w:val="24"/>
-        </w:rPr>
-        <w:t xml:space="preserve"> mardi, mais je n'ai reçu aucune réponse jusqu'à présent.</w:t>
+        <w:t>client mardi, mais je n'ai reçu aucune réponse jusqu'à présent.</w:t>
       </w:r>
     </w:p>
     <w:p>
@@ -3409,6 +3244,7 @@
         <w:rPr>
           <w:rStyle w:val="CodeHTML"/>
           <w:rFonts w:ascii="Times New Roman" w:eastAsiaTheme="minorHAnsi" w:hAnsi="Times New Roman" w:cs="Times New Roman"/>
+          <w:noProof/>
           <w:sz w:val="24"/>
           <w:szCs w:val="24"/>
         </w:rPr>
@@ -3584,7 +3420,6 @@
       </w:r>
       <w:r>
         <w:rPr>
-          <w:rStyle w:val="Paragraphedeliste"/>
           <w:rFonts w:ascii="Times New Roman" w:hAnsi="Times New Roman" w:cs="Times New Roman"/>
           <w:sz w:val="24"/>
           <w:szCs w:val="24"/>
@@ -3970,7 +3805,6 @@
         <w:t>informations_non_justifiees</w:t>
       </w:r>
       <w:proofErr w:type="spellEnd"/>
-      <w:proofErr w:type="gramStart"/>
       <w:r>
         <w:rPr>
           <w:rStyle w:val="CodeHTML"/>
@@ -3978,38 +3812,37 @@
           <w:sz w:val="24"/>
           <w:szCs w:val="24"/>
         </w:rPr>
-        <w:t>":</w:t>
-      </w:r>
-      <w:proofErr w:type="gramEnd"/>
-      <w:r>
+        <w:t>": [...],</w:t>
+      </w:r>
+    </w:p>
+    <w:p>
+      <w:pPr>
         <w:rPr>
           <w:rStyle w:val="CodeHTML"/>
           <w:rFonts w:ascii="Times New Roman" w:eastAsiaTheme="minorHAnsi" w:hAnsi="Times New Roman" w:cs="Times New Roman"/>
           <w:sz w:val="24"/>
           <w:szCs w:val="24"/>
         </w:rPr>
-        <w:t xml:space="preserve"> [...],</w:t>
-      </w:r>
-    </w:p>
-    <w:p>
-      <w:pPr>
+      </w:pPr>
+      <w:r>
         <w:rPr>
           <w:rStyle w:val="CodeHTML"/>
           <w:rFonts w:ascii="Times New Roman" w:eastAsiaTheme="minorHAnsi" w:hAnsi="Times New Roman" w:cs="Times New Roman"/>
           <w:sz w:val="24"/>
           <w:szCs w:val="24"/>
         </w:rPr>
-      </w:pPr>
-      <w:r>
+        <w:t xml:space="preserve">  "contradictions": [...],</w:t>
+      </w:r>
+    </w:p>
+    <w:p>
+      <w:pPr>
         <w:rPr>
           <w:rStyle w:val="CodeHTML"/>
           <w:rFonts w:ascii="Times New Roman" w:eastAsiaTheme="minorHAnsi" w:hAnsi="Times New Roman" w:cs="Times New Roman"/>
           <w:sz w:val="24"/>
           <w:szCs w:val="24"/>
         </w:rPr>
-        <w:t xml:space="preserve">  "contradictions</w:t>
-      </w:r>
-      <w:proofErr w:type="gramStart"/>
+      </w:pPr>
       <w:r>
         <w:rPr>
           <w:rStyle w:val="CodeHTML"/>
@@ -4017,9 +3850,9 @@
           <w:sz w:val="24"/>
           <w:szCs w:val="24"/>
         </w:rPr>
-        <w:t>":</w:t>
-      </w:r>
-      <w:proofErr w:type="gramEnd"/>
+        <w:t xml:space="preserve">  "</w:t>
+      </w:r>
+      <w:proofErr w:type="spellStart"/>
       <w:r>
         <w:rPr>
           <w:rStyle w:val="CodeHTML"/>
@@ -4027,25 +3860,54 @@
           <w:sz w:val="24"/>
           <w:szCs w:val="24"/>
         </w:rPr>
-        <w:t xml:space="preserve"> [...],</w:t>
-      </w:r>
-    </w:p>
-    <w:p>
-      <w:pPr>
+        <w:t>informations_absentes</w:t>
+      </w:r>
+      <w:proofErr w:type="spellEnd"/>
+      <w:r>
         <w:rPr>
           <w:rStyle w:val="CodeHTML"/>
           <w:rFonts w:ascii="Times New Roman" w:eastAsiaTheme="minorHAnsi" w:hAnsi="Times New Roman" w:cs="Times New Roman"/>
           <w:sz w:val="24"/>
           <w:szCs w:val="24"/>
         </w:rPr>
-      </w:pPr>
-      <w:r>
+        <w:t>": [...],</w:t>
+      </w:r>
+    </w:p>
+    <w:p>
+      <w:pPr>
         <w:rPr>
           <w:rStyle w:val="CodeHTML"/>
           <w:rFonts w:ascii="Times New Roman" w:eastAsiaTheme="minorHAnsi" w:hAnsi="Times New Roman" w:cs="Times New Roman"/>
           <w:sz w:val="24"/>
           <w:szCs w:val="24"/>
         </w:rPr>
+      </w:pPr>
+      <w:r>
+        <w:rPr>
+          <w:rStyle w:val="CodeHTML"/>
+          <w:rFonts w:ascii="Times New Roman" w:eastAsiaTheme="minorHAnsi" w:hAnsi="Times New Roman" w:cs="Times New Roman"/>
+          <w:sz w:val="24"/>
+          <w:szCs w:val="24"/>
+        </w:rPr>
+        <w:t xml:space="preserve">  "hallucinations": [...],</w:t>
+      </w:r>
+    </w:p>
+    <w:p>
+      <w:pPr>
+        <w:rPr>
+          <w:rStyle w:val="CodeHTML"/>
+          <w:rFonts w:ascii="Times New Roman" w:eastAsiaTheme="minorHAnsi" w:hAnsi="Times New Roman" w:cs="Times New Roman"/>
+          <w:sz w:val="24"/>
+          <w:szCs w:val="24"/>
+        </w:rPr>
+      </w:pPr>
+      <w:r>
+        <w:rPr>
+          <w:rStyle w:val="CodeHTML"/>
+          <w:rFonts w:ascii="Times New Roman" w:eastAsiaTheme="minorHAnsi" w:hAnsi="Times New Roman" w:cs="Times New Roman"/>
+          <w:sz w:val="24"/>
+          <w:szCs w:val="24"/>
+        </w:rPr>
         <w:t xml:space="preserve">  "</w:t>
       </w:r>
       <w:proofErr w:type="spellStart"/>
@@ -4056,10 +3918,9 @@
           <w:sz w:val="24"/>
           <w:szCs w:val="24"/>
         </w:rPr>
-        <w:t>informations_absentes</w:t>
+        <w:t>contraintes_respectees</w:t>
       </w:r>
       <w:proofErr w:type="spellEnd"/>
-      <w:proofErr w:type="gramStart"/>
       <w:r>
         <w:rPr>
           <w:rStyle w:val="CodeHTML"/>
@@ -4067,9 +3928,9 @@
           <w:sz w:val="24"/>
           <w:szCs w:val="24"/>
         </w:rPr>
-        <w:t>":</w:t>
-      </w:r>
-      <w:proofErr w:type="gramEnd"/>
+        <w:t xml:space="preserve">": </w:t>
+      </w:r>
+      <w:proofErr w:type="spellStart"/>
       <w:r>
         <w:rPr>
           <w:rStyle w:val="CodeHTML"/>
@@ -4077,28 +3938,28 @@
           <w:sz w:val="24"/>
           <w:szCs w:val="24"/>
         </w:rPr>
-        <w:t xml:space="preserve"> [...],</w:t>
-      </w:r>
-    </w:p>
-    <w:p>
-      <w:pPr>
+        <w:t>true</w:t>
+      </w:r>
+      <w:proofErr w:type="spellEnd"/>
+      <w:r>
         <w:rPr>
           <w:rStyle w:val="CodeHTML"/>
           <w:rFonts w:ascii="Times New Roman" w:eastAsiaTheme="minorHAnsi" w:hAnsi="Times New Roman" w:cs="Times New Roman"/>
           <w:sz w:val="24"/>
           <w:szCs w:val="24"/>
         </w:rPr>
-      </w:pPr>
-      <w:r>
+        <w:t>/false,</w:t>
+      </w:r>
+    </w:p>
+    <w:p>
+      <w:pPr>
         <w:rPr>
           <w:rStyle w:val="CodeHTML"/>
           <w:rFonts w:ascii="Times New Roman" w:eastAsiaTheme="minorHAnsi" w:hAnsi="Times New Roman" w:cs="Times New Roman"/>
           <w:sz w:val="24"/>
           <w:szCs w:val="24"/>
         </w:rPr>
-        <w:t xml:space="preserve">  "hallucinations</w:t>
-      </w:r>
-      <w:proofErr w:type="gramStart"/>
+      </w:pPr>
       <w:r>
         <w:rPr>
           <w:rStyle w:val="CodeHTML"/>
@@ -4106,9 +3967,9 @@
           <w:sz w:val="24"/>
           <w:szCs w:val="24"/>
         </w:rPr>
-        <w:t>":</w:t>
-      </w:r>
-      <w:proofErr w:type="gramEnd"/>
+        <w:t xml:space="preserve">  "</w:t>
+      </w:r>
+      <w:proofErr w:type="spellStart"/>
       <w:r>
         <w:rPr>
           <w:rStyle w:val="CodeHTML"/>
@@ -4116,127 +3977,17 @@
           <w:sz w:val="24"/>
           <w:szCs w:val="24"/>
         </w:rPr>
-        <w:t xml:space="preserve"> [...],</w:t>
-      </w:r>
-    </w:p>
-    <w:p>
-      <w:pPr>
+        <w:t>verdict_global</w:t>
+      </w:r>
+      <w:proofErr w:type="spellEnd"/>
+      <w:r>
         <w:rPr>
           <w:rStyle w:val="CodeHTML"/>
           <w:rFonts w:ascii="Times New Roman" w:eastAsiaTheme="minorHAnsi" w:hAnsi="Times New Roman" w:cs="Times New Roman"/>
           <w:sz w:val="24"/>
           <w:szCs w:val="24"/>
         </w:rPr>
-      </w:pPr>
-      <w:r>
-        <w:rPr>
-          <w:rStyle w:val="CodeHTML"/>
-          <w:rFonts w:ascii="Times New Roman" w:eastAsiaTheme="minorHAnsi" w:hAnsi="Times New Roman" w:cs="Times New Roman"/>
-          <w:sz w:val="24"/>
-          <w:szCs w:val="24"/>
-        </w:rPr>
-        <w:t xml:space="preserve">  "</w:t>
-      </w:r>
-      <w:proofErr w:type="spellStart"/>
-      <w:r>
-        <w:rPr>
-          <w:rStyle w:val="CodeHTML"/>
-          <w:rFonts w:ascii="Times New Roman" w:eastAsiaTheme="minorHAnsi" w:hAnsi="Times New Roman" w:cs="Times New Roman"/>
-          <w:sz w:val="24"/>
-          <w:szCs w:val="24"/>
-        </w:rPr>
-        <w:t>contraintes_respectees</w:t>
-      </w:r>
-      <w:proofErr w:type="spellEnd"/>
-      <w:proofErr w:type="gramStart"/>
-      <w:r>
-        <w:rPr>
-          <w:rStyle w:val="CodeHTML"/>
-          <w:rFonts w:ascii="Times New Roman" w:eastAsiaTheme="minorHAnsi" w:hAnsi="Times New Roman" w:cs="Times New Roman"/>
-          <w:sz w:val="24"/>
-          <w:szCs w:val="24"/>
-        </w:rPr>
-        <w:t>":</w:t>
-      </w:r>
-      <w:proofErr w:type="gramEnd"/>
-      <w:r>
-        <w:rPr>
-          <w:rStyle w:val="CodeHTML"/>
-          <w:rFonts w:ascii="Times New Roman" w:eastAsiaTheme="minorHAnsi" w:hAnsi="Times New Roman" w:cs="Times New Roman"/>
-          <w:sz w:val="24"/>
-          <w:szCs w:val="24"/>
-        </w:rPr>
-        <w:t xml:space="preserve"> </w:t>
-      </w:r>
-      <w:proofErr w:type="spellStart"/>
-      <w:r>
-        <w:rPr>
-          <w:rStyle w:val="CodeHTML"/>
-          <w:rFonts w:ascii="Times New Roman" w:eastAsiaTheme="minorHAnsi" w:hAnsi="Times New Roman" w:cs="Times New Roman"/>
-          <w:sz w:val="24"/>
-          <w:szCs w:val="24"/>
-        </w:rPr>
-        <w:t>true</w:t>
-      </w:r>
-      <w:proofErr w:type="spellEnd"/>
-      <w:r>
-        <w:rPr>
-          <w:rStyle w:val="CodeHTML"/>
-          <w:rFonts w:ascii="Times New Roman" w:eastAsiaTheme="minorHAnsi" w:hAnsi="Times New Roman" w:cs="Times New Roman"/>
-          <w:sz w:val="24"/>
-          <w:szCs w:val="24"/>
-        </w:rPr>
-        <w:t>/false,</w:t>
-      </w:r>
-    </w:p>
-    <w:p>
-      <w:pPr>
-        <w:rPr>
-          <w:rStyle w:val="CodeHTML"/>
-          <w:rFonts w:ascii="Times New Roman" w:eastAsiaTheme="minorHAnsi" w:hAnsi="Times New Roman" w:cs="Times New Roman"/>
-          <w:sz w:val="24"/>
-          <w:szCs w:val="24"/>
-        </w:rPr>
-      </w:pPr>
-      <w:r>
-        <w:rPr>
-          <w:rStyle w:val="CodeHTML"/>
-          <w:rFonts w:ascii="Times New Roman" w:eastAsiaTheme="minorHAnsi" w:hAnsi="Times New Roman" w:cs="Times New Roman"/>
-          <w:sz w:val="24"/>
-          <w:szCs w:val="24"/>
-        </w:rPr>
-        <w:t xml:space="preserve">  "</w:t>
-      </w:r>
-      <w:proofErr w:type="spellStart"/>
-      <w:r>
-        <w:rPr>
-          <w:rStyle w:val="CodeHTML"/>
-          <w:rFonts w:ascii="Times New Roman" w:eastAsiaTheme="minorHAnsi" w:hAnsi="Times New Roman" w:cs="Times New Roman"/>
-          <w:sz w:val="24"/>
-          <w:szCs w:val="24"/>
-        </w:rPr>
-        <w:t>verdict_global</w:t>
-      </w:r>
-      <w:proofErr w:type="spellEnd"/>
-      <w:proofErr w:type="gramStart"/>
-      <w:r>
-        <w:rPr>
-          <w:rStyle w:val="CodeHTML"/>
-          <w:rFonts w:ascii="Times New Roman" w:eastAsiaTheme="minorHAnsi" w:hAnsi="Times New Roman" w:cs="Times New Roman"/>
-          <w:sz w:val="24"/>
-          <w:szCs w:val="24"/>
-        </w:rPr>
-        <w:t>":</w:t>
-      </w:r>
-      <w:proofErr w:type="gramEnd"/>
-      <w:r>
-        <w:rPr>
-          <w:rStyle w:val="CodeHTML"/>
-          <w:rFonts w:ascii="Times New Roman" w:eastAsiaTheme="minorHAnsi" w:hAnsi="Times New Roman" w:cs="Times New Roman"/>
-          <w:sz w:val="24"/>
-          <w:szCs w:val="24"/>
-        </w:rPr>
-        <w:t xml:space="preserve"> "..."</w:t>
+        <w:t>": "..."</w:t>
       </w:r>
     </w:p>
     <w:p>
@@ -4317,6 +4068,7 @@
           <w:rFonts w:ascii="Times New Roman" w:hAnsi="Times New Roman" w:cs="Times New Roman"/>
           <w:b/>
           <w:bCs/>
+          <w:noProof/>
           <w:sz w:val="24"/>
           <w:szCs w:val="24"/>
         </w:rPr>
@@ -4906,25 +4658,7 @@
           <w:sz w:val="24"/>
           <w:szCs w:val="24"/>
         </w:rPr>
-        <w:t xml:space="preserve">  "sentiment</w:t>
-      </w:r>
-      <w:proofErr w:type="gramStart"/>
-      <w:r>
-        <w:rPr>
-          <w:rFonts w:ascii="Times New Roman" w:hAnsi="Times New Roman" w:cs="Times New Roman"/>
-          <w:sz w:val="24"/>
-          <w:szCs w:val="24"/>
-        </w:rPr>
-        <w:t>":</w:t>
-      </w:r>
-      <w:proofErr w:type="gramEnd"/>
-      <w:r>
-        <w:rPr>
-          <w:rFonts w:ascii="Times New Roman" w:hAnsi="Times New Roman" w:cs="Times New Roman"/>
-          <w:sz w:val="24"/>
-          <w:szCs w:val="24"/>
-        </w:rPr>
-        <w:t xml:space="preserve"> "</w:t>
+        <w:t xml:space="preserve">  "sentiment": "</w:t>
       </w:r>
       <w:proofErr w:type="spellStart"/>
       <w:r>
@@ -4972,23 +4706,13 @@
         <w:t>categorie</w:t>
       </w:r>
       <w:proofErr w:type="spellEnd"/>
-      <w:proofErr w:type="gramStart"/>
-      <w:r>
-        <w:rPr>
-          <w:rFonts w:ascii="Times New Roman" w:hAnsi="Times New Roman" w:cs="Times New Roman"/>
-          <w:sz w:val="24"/>
-          <w:szCs w:val="24"/>
-        </w:rPr>
-        <w:t>":</w:t>
-      </w:r>
-      <w:proofErr w:type="gramEnd"/>
-      <w:r>
-        <w:rPr>
-          <w:rFonts w:ascii="Times New Roman" w:hAnsi="Times New Roman" w:cs="Times New Roman"/>
-          <w:sz w:val="24"/>
-          <w:szCs w:val="24"/>
-        </w:rPr>
-        <w:t xml:space="preserve"> "livraison",</w:t>
+      <w:r>
+        <w:rPr>
+          <w:rFonts w:ascii="Times New Roman" w:hAnsi="Times New Roman" w:cs="Times New Roman"/>
+          <w:sz w:val="24"/>
+          <w:szCs w:val="24"/>
+        </w:rPr>
+        <w:t>": "livraison",</w:t>
       </w:r>
     </w:p>
     <w:p>
@@ -5006,25 +4730,7 @@
           <w:sz w:val="24"/>
           <w:szCs w:val="24"/>
         </w:rPr>
-        <w:t xml:space="preserve">  "urgence</w:t>
-      </w:r>
-      <w:proofErr w:type="gramStart"/>
-      <w:r>
-        <w:rPr>
-          <w:rFonts w:ascii="Times New Roman" w:hAnsi="Times New Roman" w:cs="Times New Roman"/>
-          <w:sz w:val="24"/>
-          <w:szCs w:val="24"/>
-        </w:rPr>
-        <w:t>":</w:t>
-      </w:r>
-      <w:proofErr w:type="gramEnd"/>
-      <w:r>
-        <w:rPr>
-          <w:rFonts w:ascii="Times New Roman" w:hAnsi="Times New Roman" w:cs="Times New Roman"/>
-          <w:sz w:val="24"/>
-          <w:szCs w:val="24"/>
-        </w:rPr>
-        <w:t xml:space="preserve"> "moyenne",</w:t>
+        <w:t xml:space="preserve">  "urgence": "moyenne",</w:t>
       </w:r>
     </w:p>
     <w:p>
@@ -5054,23 +4760,13 @@
         <w:t>probleme</w:t>
       </w:r>
       <w:proofErr w:type="spellEnd"/>
-      <w:proofErr w:type="gramStart"/>
-      <w:r>
-        <w:rPr>
-          <w:rFonts w:ascii="Times New Roman" w:hAnsi="Times New Roman" w:cs="Times New Roman"/>
-          <w:sz w:val="24"/>
-          <w:szCs w:val="24"/>
-        </w:rPr>
-        <w:t>":</w:t>
-      </w:r>
-      <w:proofErr w:type="gramEnd"/>
-      <w:r>
-        <w:rPr>
-          <w:rFonts w:ascii="Times New Roman" w:hAnsi="Times New Roman" w:cs="Times New Roman"/>
-          <w:sz w:val="24"/>
-          <w:szCs w:val="24"/>
-        </w:rPr>
-        <w:t xml:space="preserve"> "Retard de livraison",</w:t>
+      <w:r>
+        <w:rPr>
+          <w:rFonts w:ascii="Times New Roman" w:hAnsi="Times New Roman" w:cs="Times New Roman"/>
+          <w:sz w:val="24"/>
+          <w:szCs w:val="24"/>
+        </w:rPr>
+        <w:t>": "Retard de livraison",</w:t>
       </w:r>
     </w:p>
     <w:p>
@@ -5088,25 +4784,7 @@
           <w:sz w:val="24"/>
           <w:szCs w:val="24"/>
         </w:rPr>
-        <w:t xml:space="preserve">  "confiance</w:t>
-      </w:r>
-      <w:proofErr w:type="gramStart"/>
-      <w:r>
-        <w:rPr>
-          <w:rFonts w:ascii="Times New Roman" w:hAnsi="Times New Roman" w:cs="Times New Roman"/>
-          <w:sz w:val="24"/>
-          <w:szCs w:val="24"/>
-        </w:rPr>
-        <w:t>":</w:t>
-      </w:r>
-      <w:proofErr w:type="gramEnd"/>
-      <w:r>
-        <w:rPr>
-          <w:rFonts w:ascii="Times New Roman" w:hAnsi="Times New Roman" w:cs="Times New Roman"/>
-          <w:sz w:val="24"/>
-          <w:szCs w:val="24"/>
-        </w:rPr>
-        <w:t xml:space="preserve"> 0.91</w:t>
+        <w:t xml:space="preserve">  "confiance": 0.91</w:t>
       </w:r>
     </w:p>
     <w:p>
@@ -5175,6 +4853,7 @@
           <w:rFonts w:ascii="Times New Roman" w:hAnsi="Times New Roman" w:cs="Times New Roman"/>
           <w:b/>
           <w:bCs/>
+          <w:noProof/>
           <w:sz w:val="24"/>
           <w:szCs w:val="24"/>
         </w:rPr>
@@ -5416,31 +5095,7 @@
           <w:sz w:val="24"/>
           <w:szCs w:val="24"/>
         </w:rPr>
-        <w:t>Urgence</w:t>
-      </w:r>
-      <w:r>
-        <w:rPr>
-          <w:rFonts w:ascii="Times New Roman" w:hAnsi="Times New Roman" w:cs="Times New Roman"/>
-          <w:sz w:val="24"/>
-          <w:szCs w:val="24"/>
-        </w:rPr>
-        <w:t xml:space="preserve">, </w:t>
-      </w:r>
-      <w:r>
-        <w:rPr>
-          <w:rFonts w:ascii="Times New Roman" w:hAnsi="Times New Roman" w:cs="Times New Roman"/>
-          <w:sz w:val="24"/>
-          <w:szCs w:val="24"/>
-        </w:rPr>
-        <w:t>problème</w:t>
-      </w:r>
-      <w:r>
-        <w:rPr>
-          <w:rFonts w:ascii="Times New Roman" w:hAnsi="Times New Roman" w:cs="Times New Roman"/>
-          <w:sz w:val="24"/>
-          <w:szCs w:val="24"/>
-        </w:rPr>
-        <w:t>, confiance.</w:t>
+        <w:t>Urgence, problème, confiance.</w:t>
       </w:r>
     </w:p>
     <w:p>
@@ -5546,18 +5201,8 @@
           <w:sz w:val="24"/>
           <w:szCs w:val="24"/>
         </w:rPr>
-        <w:t xml:space="preserve">Si une valeur ne peut pas être déterminée avec certitude, choisis la valeur </w:t>
-      </w:r>
-      <w:proofErr w:type="gramStart"/>
-      <w:r>
-        <w:rPr>
-          <w:rFonts w:ascii="Times New Roman" w:hAnsi="Times New Roman" w:cs="Times New Roman"/>
-          <w:sz w:val="24"/>
-          <w:szCs w:val="24"/>
-        </w:rPr>
-        <w:t>la</w:t>
-      </w:r>
-      <w:proofErr w:type="gramEnd"/>
+        <w:t>Si une valeur ne peut pas être déterminée avec certitude, choisis la valeur la</w:t>
+      </w:r>
     </w:p>
     <w:p>
       <w:pPr>
@@ -5578,15 +5223,7 @@
           <w:sz w:val="24"/>
           <w:szCs w:val="24"/>
         </w:rPr>
-        <w:t>Plus</w:t>
-      </w:r>
-      <w:r>
-        <w:rPr>
-          <w:rFonts w:ascii="Times New Roman" w:hAnsi="Times New Roman" w:cs="Times New Roman"/>
-          <w:sz w:val="24"/>
-          <w:szCs w:val="24"/>
-        </w:rPr>
-        <w:t xml:space="preserve"> prudente plutôt que d'inventer.</w:t>
+        <w:t>Plus prudente plutôt que d'inventer.</w:t>
       </w:r>
     </w:p>
     <w:p>
@@ -5710,6 +5347,7 @@
           <w:rFonts w:ascii="Times New Roman" w:hAnsi="Times New Roman" w:cs="Times New Roman"/>
           <w:b/>
           <w:bCs/>
+          <w:noProof/>
           <w:sz w:val="24"/>
           <w:szCs w:val="24"/>
         </w:rPr>
@@ -5775,23 +5413,7 @@
           <w:sz w:val="36"/>
           <w:szCs w:val="36"/>
         </w:rPr>
-        <w:t>Partie 5</w:t>
-      </w:r>
-      <w:r>
-        <w:rPr>
-          <w:rFonts w:ascii="Times New Roman" w:hAnsi="Times New Roman" w:cs="Times New Roman"/>
-          <w:sz w:val="36"/>
-          <w:szCs w:val="36"/>
-        </w:rPr>
-        <w:t xml:space="preserve"> : </w:t>
-      </w:r>
-      <w:r>
-        <w:rPr>
-          <w:rFonts w:ascii="Times New Roman" w:hAnsi="Times New Roman" w:cs="Times New Roman"/>
-          <w:sz w:val="36"/>
-          <w:szCs w:val="36"/>
-        </w:rPr>
-        <w:t>Prompts pour les applications métier</w:t>
+        <w:t>Partie 5 : Prompts pour les applications métier</w:t>
       </w:r>
     </w:p>
     <w:p>
@@ -5909,16 +5531,7 @@
           <w:sz w:val="24"/>
           <w:szCs w:val="24"/>
         </w:rPr>
-        <w:t>C</w:t>
-      </w:r>
-      <w:r>
-        <w:rPr>
-          <w:rStyle w:val="CodeHTML"/>
-          <w:rFonts w:ascii="Times New Roman" w:hAnsi="Times New Roman" w:cs="Times New Roman"/>
-          <w:sz w:val="24"/>
-          <w:szCs w:val="24"/>
-        </w:rPr>
-        <w:t>ontraintes</w:t>
+        <w:t>Contraintes</w:t>
       </w:r>
       <w:r>
         <w:rPr>
@@ -6271,6 +5884,7 @@
           <w:rFonts w:ascii="Times New Roman" w:hAnsi="Times New Roman" w:cs="Times New Roman"/>
           <w:b/>
           <w:bCs/>
+          <w:noProof/>
           <w:sz w:val="24"/>
           <w:szCs w:val="24"/>
         </w:rPr>
@@ -6769,6 +6383,7 @@
           <w:rFonts w:ascii="Times New Roman" w:hAnsi="Times New Roman" w:cs="Times New Roman"/>
           <w:b/>
           <w:bCs/>
+          <w:noProof/>
           <w:sz w:val="24"/>
           <w:szCs w:val="24"/>
         </w:rPr>
@@ -6843,6 +6458,7 @@
           <w:rFonts w:ascii="Times New Roman" w:hAnsi="Times New Roman" w:cs="Times New Roman"/>
           <w:b/>
           <w:bCs/>
+          <w:noProof/>
           <w:sz w:val="24"/>
           <w:szCs w:val="24"/>
         </w:rPr>
@@ -7228,65 +6844,34 @@
         <w:t>categorie</w:t>
       </w:r>
       <w:proofErr w:type="spellEnd"/>
-      <w:proofErr w:type="gramStart"/>
-      <w:r>
-        <w:rPr>
-          <w:rStyle w:val="CodeHTML"/>
-          <w:rFonts w:ascii="Times New Roman" w:hAnsi="Times New Roman" w:cs="Times New Roman"/>
-          <w:sz w:val="24"/>
-          <w:szCs w:val="24"/>
-        </w:rPr>
-        <w:t>":</w:t>
-      </w:r>
-      <w:proofErr w:type="gramEnd"/>
-      <w:r>
-        <w:rPr>
-          <w:rStyle w:val="CodeHTML"/>
-          <w:rFonts w:ascii="Times New Roman" w:hAnsi="Times New Roman" w:cs="Times New Roman"/>
-          <w:sz w:val="24"/>
-          <w:szCs w:val="24"/>
-        </w:rPr>
-        <w:t xml:space="preserve"> "réseau | logiciel | matériel | sécurité | accès | autre",</w:t>
-      </w:r>
-    </w:p>
-    <w:p>
-      <w:pPr>
-        <w:pStyle w:val="PrformatHTML"/>
-        <w:rPr>
-          <w:rStyle w:val="CodeHTML"/>
-          <w:rFonts w:ascii="Times New Roman" w:hAnsi="Times New Roman" w:cs="Times New Roman"/>
-          <w:sz w:val="24"/>
-          <w:szCs w:val="24"/>
-        </w:rPr>
-      </w:pPr>
-      <w:r>
-        <w:rPr>
-          <w:rStyle w:val="CodeHTML"/>
-          <w:rFonts w:ascii="Times New Roman" w:hAnsi="Times New Roman" w:cs="Times New Roman"/>
-          <w:sz w:val="24"/>
-          <w:szCs w:val="24"/>
-        </w:rPr>
-        <w:t xml:space="preserve">  "justification</w:t>
-      </w:r>
-      <w:proofErr w:type="gramStart"/>
-      <w:r>
-        <w:rPr>
-          <w:rStyle w:val="CodeHTML"/>
-          <w:rFonts w:ascii="Times New Roman" w:hAnsi="Times New Roman" w:cs="Times New Roman"/>
-          <w:sz w:val="24"/>
-          <w:szCs w:val="24"/>
-        </w:rPr>
-        <w:t>":</w:t>
-      </w:r>
-      <w:proofErr w:type="gramEnd"/>
-      <w:r>
-        <w:rPr>
-          <w:rStyle w:val="CodeHTML"/>
-          <w:rFonts w:ascii="Times New Roman" w:hAnsi="Times New Roman" w:cs="Times New Roman"/>
-          <w:sz w:val="24"/>
-          <w:szCs w:val="24"/>
-        </w:rPr>
-        <w:t xml:space="preserve"> "..."</w:t>
+      <w:r>
+        <w:rPr>
+          <w:rStyle w:val="CodeHTML"/>
+          <w:rFonts w:ascii="Times New Roman" w:hAnsi="Times New Roman" w:cs="Times New Roman"/>
+          <w:sz w:val="24"/>
+          <w:szCs w:val="24"/>
+        </w:rPr>
+        <w:t>": "réseau | logiciel | matériel | sécurité | accès | autre",</w:t>
+      </w:r>
+    </w:p>
+    <w:p>
+      <w:pPr>
+        <w:pStyle w:val="PrformatHTML"/>
+        <w:rPr>
+          <w:rStyle w:val="CodeHTML"/>
+          <w:rFonts w:ascii="Times New Roman" w:hAnsi="Times New Roman" w:cs="Times New Roman"/>
+          <w:sz w:val="24"/>
+          <w:szCs w:val="24"/>
+        </w:rPr>
+      </w:pPr>
+      <w:r>
+        <w:rPr>
+          <w:rStyle w:val="CodeHTML"/>
+          <w:rFonts w:ascii="Times New Roman" w:hAnsi="Times New Roman" w:cs="Times New Roman"/>
+          <w:sz w:val="24"/>
+          <w:szCs w:val="24"/>
+        </w:rPr>
+        <w:t xml:space="preserve">  "justification": "..."</w:t>
       </w:r>
     </w:p>
     <w:p>
@@ -7361,6 +6946,7 @@
           <w:rFonts w:ascii="Times New Roman" w:hAnsi="Times New Roman" w:cs="Times New Roman"/>
           <w:b/>
           <w:bCs/>
+          <w:noProof/>
           <w:sz w:val="28"/>
           <w:szCs w:val="28"/>
         </w:rPr>
@@ -7837,25 +7423,14 @@
         <w:t>numero_facture</w:t>
       </w:r>
       <w:proofErr w:type="spellEnd"/>
-      <w:proofErr w:type="gramStart"/>
-      <w:r>
-        <w:rPr>
-          <w:rStyle w:val="CodeHTML"/>
-          <w:rFonts w:ascii="Times New Roman" w:hAnsi="Times New Roman" w:cs="Times New Roman"/>
-          <w:sz w:val="24"/>
-          <w:szCs w:val="24"/>
-        </w:rPr>
-        <w:t>":</w:t>
-      </w:r>
-      <w:proofErr w:type="gramEnd"/>
-      <w:r>
-        <w:rPr>
-          <w:rStyle w:val="CodeHTML"/>
-          <w:rFonts w:ascii="Times New Roman" w:hAnsi="Times New Roman" w:cs="Times New Roman"/>
-          <w:sz w:val="24"/>
-          <w:szCs w:val="24"/>
-        </w:rPr>
-        <w:t xml:space="preserve"> ... ou </w:t>
+      <w:r>
+        <w:rPr>
+          <w:rStyle w:val="CodeHTML"/>
+          <w:rFonts w:ascii="Times New Roman" w:hAnsi="Times New Roman" w:cs="Times New Roman"/>
+          <w:sz w:val="24"/>
+          <w:szCs w:val="24"/>
+        </w:rPr>
+        <w:t xml:space="preserve">": ... ou </w:t>
       </w:r>
       <w:proofErr w:type="spellStart"/>
       <w:r>
@@ -7895,27 +7470,7 @@
           <w:sz w:val="24"/>
           <w:szCs w:val="24"/>
         </w:rPr>
-        <w:t xml:space="preserve">  "date</w:t>
-      </w:r>
-      <w:proofErr w:type="gramStart"/>
-      <w:r>
-        <w:rPr>
-          <w:rStyle w:val="CodeHTML"/>
-          <w:rFonts w:ascii="Times New Roman" w:hAnsi="Times New Roman" w:cs="Times New Roman"/>
-          <w:sz w:val="24"/>
-          <w:szCs w:val="24"/>
-        </w:rPr>
-        <w:t>":</w:t>
-      </w:r>
-      <w:proofErr w:type="gramEnd"/>
-      <w:r>
-        <w:rPr>
-          <w:rStyle w:val="CodeHTML"/>
-          <w:rFonts w:ascii="Times New Roman" w:hAnsi="Times New Roman" w:cs="Times New Roman"/>
-          <w:sz w:val="24"/>
-          <w:szCs w:val="24"/>
-        </w:rPr>
-        <w:t xml:space="preserve"> ... ou </w:t>
+        <w:t xml:space="preserve">  "date": ... ou </w:t>
       </w:r>
       <w:proofErr w:type="spellStart"/>
       <w:r>
@@ -7955,27 +7510,7 @@
           <w:sz w:val="24"/>
           <w:szCs w:val="24"/>
         </w:rPr>
-        <w:t xml:space="preserve">  "client</w:t>
-      </w:r>
-      <w:proofErr w:type="gramStart"/>
-      <w:r>
-        <w:rPr>
-          <w:rStyle w:val="CodeHTML"/>
-          <w:rFonts w:ascii="Times New Roman" w:hAnsi="Times New Roman" w:cs="Times New Roman"/>
-          <w:sz w:val="24"/>
-          <w:szCs w:val="24"/>
-        </w:rPr>
-        <w:t>":</w:t>
-      </w:r>
-      <w:proofErr w:type="gramEnd"/>
-      <w:r>
-        <w:rPr>
-          <w:rStyle w:val="CodeHTML"/>
-          <w:rFonts w:ascii="Times New Roman" w:hAnsi="Times New Roman" w:cs="Times New Roman"/>
-          <w:sz w:val="24"/>
-          <w:szCs w:val="24"/>
-        </w:rPr>
-        <w:t xml:space="preserve"> ... ou </w:t>
+        <w:t xml:space="preserve">  "client": ... ou </w:t>
       </w:r>
       <w:proofErr w:type="spellStart"/>
       <w:r>
@@ -8028,25 +7563,14 @@
         <w:t>montant_ht</w:t>
       </w:r>
       <w:proofErr w:type="spellEnd"/>
-      <w:proofErr w:type="gramStart"/>
-      <w:r>
-        <w:rPr>
-          <w:rStyle w:val="CodeHTML"/>
-          <w:rFonts w:ascii="Times New Roman" w:hAnsi="Times New Roman" w:cs="Times New Roman"/>
-          <w:sz w:val="24"/>
-          <w:szCs w:val="24"/>
-        </w:rPr>
-        <w:t>":</w:t>
-      </w:r>
-      <w:proofErr w:type="gramEnd"/>
-      <w:r>
-        <w:rPr>
-          <w:rStyle w:val="CodeHTML"/>
-          <w:rFonts w:ascii="Times New Roman" w:hAnsi="Times New Roman" w:cs="Times New Roman"/>
-          <w:sz w:val="24"/>
-          <w:szCs w:val="24"/>
-        </w:rPr>
-        <w:t xml:space="preserve"> ... ou </w:t>
+      <w:r>
+        <w:rPr>
+          <w:rStyle w:val="CodeHTML"/>
+          <w:rFonts w:ascii="Times New Roman" w:hAnsi="Times New Roman" w:cs="Times New Roman"/>
+          <w:sz w:val="24"/>
+          <w:szCs w:val="24"/>
+        </w:rPr>
+        <w:t xml:space="preserve">": ... ou </w:t>
       </w:r>
       <w:proofErr w:type="spellStart"/>
       <w:r>
@@ -8087,27 +7611,7 @@
           <w:szCs w:val="24"/>
         </w:rPr>
         <w:lastRenderedPageBreak/>
-        <w:t xml:space="preserve">  "tva</w:t>
-      </w:r>
-      <w:proofErr w:type="gramStart"/>
-      <w:r>
-        <w:rPr>
-          <w:rStyle w:val="CodeHTML"/>
-          <w:rFonts w:ascii="Times New Roman" w:hAnsi="Times New Roman" w:cs="Times New Roman"/>
-          <w:sz w:val="24"/>
-          <w:szCs w:val="24"/>
-        </w:rPr>
-        <w:t>":</w:t>
-      </w:r>
-      <w:proofErr w:type="gramEnd"/>
-      <w:r>
-        <w:rPr>
-          <w:rStyle w:val="CodeHTML"/>
-          <w:rFonts w:ascii="Times New Roman" w:hAnsi="Times New Roman" w:cs="Times New Roman"/>
-          <w:sz w:val="24"/>
-          <w:szCs w:val="24"/>
-        </w:rPr>
-        <w:t xml:space="preserve"> ... ou </w:t>
+        <w:t xml:space="preserve">  "tva": ... ou </w:t>
       </w:r>
       <w:proofErr w:type="spellStart"/>
       <w:r>
@@ -8160,25 +7664,14 @@
         <w:t>montant_ttc</w:t>
       </w:r>
       <w:proofErr w:type="spellEnd"/>
-      <w:proofErr w:type="gramStart"/>
-      <w:r>
-        <w:rPr>
-          <w:rStyle w:val="CodeHTML"/>
-          <w:rFonts w:ascii="Times New Roman" w:hAnsi="Times New Roman" w:cs="Times New Roman"/>
-          <w:sz w:val="24"/>
-          <w:szCs w:val="24"/>
-        </w:rPr>
-        <w:t>":</w:t>
-      </w:r>
-      <w:proofErr w:type="gramEnd"/>
-      <w:r>
-        <w:rPr>
-          <w:rStyle w:val="CodeHTML"/>
-          <w:rFonts w:ascii="Times New Roman" w:hAnsi="Times New Roman" w:cs="Times New Roman"/>
-          <w:sz w:val="24"/>
-          <w:szCs w:val="24"/>
-        </w:rPr>
-        <w:t xml:space="preserve"> ... ou </w:t>
+      <w:r>
+        <w:rPr>
+          <w:rStyle w:val="CodeHTML"/>
+          <w:rFonts w:ascii="Times New Roman" w:hAnsi="Times New Roman" w:cs="Times New Roman"/>
+          <w:sz w:val="24"/>
+          <w:szCs w:val="24"/>
+        </w:rPr>
+        <w:t xml:space="preserve">": ... ou </w:t>
       </w:r>
       <w:proofErr w:type="spellStart"/>
       <w:r>
@@ -8284,7 +7777,6 @@
           <w:lang w:val="en-US"/>
         </w:rPr>
       </w:pPr>
-      <w:proofErr w:type="gramStart"/>
       <w:r>
         <w:rPr>
           <w:rFonts w:ascii="Times New Roman" w:hAnsi="Times New Roman" w:cs="Times New Roman"/>
@@ -8292,30 +7784,29 @@
           <w:szCs w:val="24"/>
           <w:lang w:val="en-US"/>
         </w:rPr>
-        <w:t>Date :</w:t>
-      </w:r>
-      <w:proofErr w:type="gramEnd"/>
-      <w:r>
+        <w:t xml:space="preserve">Date : 10/09/2026 </w:t>
+      </w:r>
+    </w:p>
+    <w:p>
+      <w:pPr>
+        <w:pStyle w:val="PrformatHTML"/>
         <w:rPr>
           <w:rFonts w:ascii="Times New Roman" w:hAnsi="Times New Roman" w:cs="Times New Roman"/>
           <w:sz w:val="24"/>
           <w:szCs w:val="24"/>
           <w:lang w:val="en-US"/>
         </w:rPr>
-        <w:t xml:space="preserve"> 10/09/2026 </w:t>
-      </w:r>
-    </w:p>
-    <w:p>
-      <w:pPr>
-        <w:pStyle w:val="PrformatHTML"/>
+      </w:pPr>
+      <w:r>
         <w:rPr>
           <w:rFonts w:ascii="Times New Roman" w:hAnsi="Times New Roman" w:cs="Times New Roman"/>
           <w:sz w:val="24"/>
           <w:szCs w:val="24"/>
           <w:lang w:val="en-US"/>
         </w:rPr>
-      </w:pPr>
-      <w:proofErr w:type="gramStart"/>
+        <w:t xml:space="preserve">Client : </w:t>
+      </w:r>
+      <w:proofErr w:type="spellStart"/>
       <w:r>
         <w:rPr>
           <w:rFonts w:ascii="Times New Roman" w:hAnsi="Times New Roman" w:cs="Times New Roman"/>
@@ -8323,9 +7814,9 @@
           <w:szCs w:val="24"/>
           <w:lang w:val="en-US"/>
         </w:rPr>
-        <w:t>Client :</w:t>
-      </w:r>
-      <w:proofErr w:type="gramEnd"/>
+        <w:t>KharagneTech</w:t>
+      </w:r>
+      <w:proofErr w:type="spellEnd"/>
       <w:r>
         <w:rPr>
           <w:rFonts w:ascii="Times New Roman" w:hAnsi="Times New Roman" w:cs="Times New Roman"/>
@@ -8333,8 +7824,19 @@
           <w:szCs w:val="24"/>
           <w:lang w:val="en-US"/>
         </w:rPr>
-        <w:t xml:space="preserve"> </w:t>
-      </w:r>
+        <w:t xml:space="preserve"> Consulting </w:t>
+      </w:r>
+    </w:p>
+    <w:p>
+      <w:pPr>
+        <w:pStyle w:val="PrformatHTML"/>
+        <w:rPr>
+          <w:rFonts w:ascii="Times New Roman" w:hAnsi="Times New Roman" w:cs="Times New Roman"/>
+          <w:sz w:val="24"/>
+          <w:szCs w:val="24"/>
+          <w:lang w:val="en-US"/>
+        </w:rPr>
+      </w:pPr>
       <w:proofErr w:type="spellStart"/>
       <w:r>
         <w:rPr>
@@ -8343,7 +7845,7 @@
           <w:szCs w:val="24"/>
           <w:lang w:val="en-US"/>
         </w:rPr>
-        <w:t>KharagneTech</w:t>
+        <w:t>Montant</w:t>
       </w:r>
       <w:proofErr w:type="spellEnd"/>
       <w:r>
@@ -8353,58 +7855,7 @@
           <w:szCs w:val="24"/>
           <w:lang w:val="en-US"/>
         </w:rPr>
-        <w:t xml:space="preserve"> Consulting </w:t>
-      </w:r>
-    </w:p>
-    <w:p>
-      <w:pPr>
-        <w:pStyle w:val="PrformatHTML"/>
-        <w:rPr>
-          <w:rFonts w:ascii="Times New Roman" w:hAnsi="Times New Roman" w:cs="Times New Roman"/>
-          <w:sz w:val="24"/>
-          <w:szCs w:val="24"/>
-          <w:lang w:val="en-US"/>
-        </w:rPr>
-      </w:pPr>
-      <w:proofErr w:type="spellStart"/>
-      <w:r>
-        <w:rPr>
-          <w:rFonts w:ascii="Times New Roman" w:hAnsi="Times New Roman" w:cs="Times New Roman"/>
-          <w:sz w:val="24"/>
-          <w:szCs w:val="24"/>
-          <w:lang w:val="en-US"/>
-        </w:rPr>
-        <w:t>Montant</w:t>
-      </w:r>
-      <w:proofErr w:type="spellEnd"/>
-      <w:r>
-        <w:rPr>
-          <w:rFonts w:ascii="Times New Roman" w:hAnsi="Times New Roman" w:cs="Times New Roman"/>
-          <w:sz w:val="24"/>
-          <w:szCs w:val="24"/>
-          <w:lang w:val="en-US"/>
-        </w:rPr>
-        <w:t xml:space="preserve"> </w:t>
-      </w:r>
-      <w:proofErr w:type="gramStart"/>
-      <w:r>
-        <w:rPr>
-          <w:rFonts w:ascii="Times New Roman" w:hAnsi="Times New Roman" w:cs="Times New Roman"/>
-          <w:sz w:val="24"/>
-          <w:szCs w:val="24"/>
-          <w:lang w:val="en-US"/>
-        </w:rPr>
-        <w:t>HT :</w:t>
-      </w:r>
-      <w:proofErr w:type="gramEnd"/>
-      <w:r>
-        <w:rPr>
-          <w:rFonts w:ascii="Times New Roman" w:hAnsi="Times New Roman" w:cs="Times New Roman"/>
-          <w:sz w:val="24"/>
-          <w:szCs w:val="24"/>
-          <w:lang w:val="en-US"/>
-        </w:rPr>
-        <w:t xml:space="preserve"> 100 000 FCFA </w:t>
+        <w:t xml:space="preserve"> HT : 100 000 FCFA </w:t>
       </w:r>
     </w:p>
     <w:p>
@@ -8475,6 +7926,9 @@
         <w:pStyle w:val="NormalWeb"/>
       </w:pPr>
       <w:r>
+        <w:rPr>
+          <w:noProof/>
+        </w:rPr>
         <w:drawing>
           <wp:inline distT="0" distB="0" distL="0" distR="0" wp14:anchorId="2B846B34" wp14:editId="44179864">
             <wp:extent cx="5759450" cy="1617345"/>
@@ -9027,19 +8481,11 @@
           <w:szCs w:val="28"/>
         </w:rPr>
         <w:lastRenderedPageBreak/>
-        <w:t>Ré</w:t>
+        <w:t>Résultat</w:t>
       </w:r>
       <w:r>
         <w:rPr>
           <w:rStyle w:val="lev"/>
-          <w:sz w:val="28"/>
-          <w:szCs w:val="28"/>
-        </w:rPr>
-        <w:t>sultat</w:t>
-      </w:r>
-      <w:r>
-        <w:rPr>
-          <w:rStyle w:val="lev"/>
         </w:rPr>
         <w:t xml:space="preserve"> : </w:t>
       </w:r>
@@ -9049,6 +8495,9 @@
         <w:pStyle w:val="NormalWeb"/>
       </w:pPr>
       <w:r>
+        <w:rPr>
+          <w:noProof/>
+        </w:rPr>
         <w:drawing>
           <wp:inline distT="0" distB="0" distL="0" distR="0" wp14:anchorId="293327A8" wp14:editId="51CF25A8">
             <wp:extent cx="5759450" cy="3492500"/>
@@ -9092,31 +8541,28 @@
           <w:rFonts w:ascii="Times New Roman" w:hAnsi="Times New Roman" w:cs="Times New Roman"/>
           <w:sz w:val="36"/>
           <w:szCs w:val="36"/>
-        </w:rPr>
-      </w:pPr>
+          <w:lang w:val="en-US"/>
+        </w:rPr>
+      </w:pPr>
+      <w:proofErr w:type="spellStart"/>
       <w:r>
         <w:rPr>
           <w:rFonts w:ascii="Times New Roman" w:hAnsi="Times New Roman" w:cs="Times New Roman"/>
           <w:sz w:val="36"/>
           <w:szCs w:val="36"/>
-        </w:rPr>
-        <w:t xml:space="preserve">Partie 6 </w:t>
-      </w:r>
+          <w:lang w:val="en-US"/>
+        </w:rPr>
+        <w:t>Partie</w:t>
+      </w:r>
+      <w:proofErr w:type="spellEnd"/>
       <w:r>
         <w:rPr>
           <w:rFonts w:ascii="Times New Roman" w:hAnsi="Times New Roman" w:cs="Times New Roman"/>
           <w:sz w:val="36"/>
           <w:szCs w:val="36"/>
-        </w:rPr>
-        <w:t xml:space="preserve">: </w:t>
-      </w:r>
-      <w:r>
-        <w:rPr>
-          <w:rFonts w:ascii="Times New Roman" w:hAnsi="Times New Roman" w:cs="Times New Roman"/>
-          <w:sz w:val="36"/>
-          <w:szCs w:val="36"/>
-        </w:rPr>
-        <w:t>Prompt Engineering pour le Machine Learning</w:t>
+          <w:lang w:val="en-US"/>
+        </w:rPr>
+        <w:t xml:space="preserve"> 6 : Prompt Engineering pour le Machine Learning</w:t>
       </w:r>
     </w:p>
     <w:p>
@@ -9124,10 +8570,7 @@
         <w:pStyle w:val="NormalWeb"/>
       </w:pPr>
       <w:r>
-        <w:t xml:space="preserve">Les prompts ci-dessous s'appuient sur le dataset des capteurs IoT </w:t>
-      </w:r>
-      <w:r>
-        <w:t>le dataset mesure_capteure.csv</w:t>
+        <w:t>Les prompts ci-dessous s'appuient sur le dataset des capteurs IoT le dataset mesure_capteure.csv</w:t>
       </w:r>
     </w:p>
     <w:p>
@@ -9255,7 +8698,6 @@
         <w:t>&lt;class '</w:t>
       </w:r>
       <w:proofErr w:type="spellStart"/>
-      <w:proofErr w:type="gramStart"/>
       <w:r>
         <w:rPr>
           <w:rFonts w:ascii="Consolas" w:eastAsia="Times New Roman" w:hAnsi="Consolas" w:cs="Times New Roman"/>
@@ -9266,7 +8708,6 @@
         <w:t>pandas.DataFrame</w:t>
       </w:r>
       <w:proofErr w:type="spellEnd"/>
-      <w:proofErr w:type="gramEnd"/>
       <w:r>
         <w:rPr>
           <w:rFonts w:ascii="Consolas" w:eastAsia="Times New Roman" w:hAnsi="Consolas" w:cs="Times New Roman"/>
@@ -9345,9 +8786,9 @@
           <w:szCs w:val="24"/>
           <w:lang w:val="en-US" w:eastAsia="fr-FR"/>
         </w:rPr>
-        <w:t xml:space="preserve"> #   Column        Non-Null </w:t>
-      </w:r>
-      <w:proofErr w:type="gramStart"/>
+        <w:t xml:space="preserve"> #   Column        Non-Null Count  </w:t>
+      </w:r>
+      <w:proofErr w:type="spellStart"/>
       <w:r>
         <w:rPr>
           <w:rFonts w:ascii="Consolas" w:eastAsia="Times New Roman" w:hAnsi="Consolas" w:cs="Times New Roman"/>
@@ -9355,7 +8796,66 @@
           <w:szCs w:val="24"/>
           <w:lang w:val="en-US" w:eastAsia="fr-FR"/>
         </w:rPr>
-        <w:t xml:space="preserve">Count  </w:t>
+        <w:t>Dtype</w:t>
+      </w:r>
+      <w:proofErr w:type="spellEnd"/>
+      <w:r>
+        <w:rPr>
+          <w:rFonts w:ascii="Consolas" w:eastAsia="Times New Roman" w:hAnsi="Consolas" w:cs="Times New Roman"/>
+          <w:sz w:val="24"/>
+          <w:szCs w:val="24"/>
+          <w:lang w:val="en-US" w:eastAsia="fr-FR"/>
+        </w:rPr>
+        <w:t xml:space="preserve">  </w:t>
+      </w:r>
+    </w:p>
+    <w:p>
+      <w:pPr>
+        <w:spacing w:after="0" w:line="240" w:lineRule="auto"/>
+        <w:rPr>
+          <w:rFonts w:ascii="Consolas" w:eastAsia="Times New Roman" w:hAnsi="Consolas" w:cs="Times New Roman"/>
+          <w:sz w:val="24"/>
+          <w:szCs w:val="24"/>
+          <w:lang w:val="en-US" w:eastAsia="fr-FR"/>
+        </w:rPr>
+      </w:pPr>
+      <w:r>
+        <w:rPr>
+          <w:rFonts w:ascii="Consolas" w:eastAsia="Times New Roman" w:hAnsi="Consolas" w:cs="Times New Roman"/>
+          <w:sz w:val="24"/>
+          <w:szCs w:val="24"/>
+          <w:lang w:val="en-US" w:eastAsia="fr-FR"/>
+        </w:rPr>
+        <w:t xml:space="preserve">---  ------        --------------  -----  </w:t>
+      </w:r>
+    </w:p>
+    <w:p>
+      <w:pPr>
+        <w:spacing w:after="0" w:line="240" w:lineRule="auto"/>
+        <w:rPr>
+          <w:rFonts w:ascii="Consolas" w:eastAsia="Times New Roman" w:hAnsi="Consolas" w:cs="Times New Roman"/>
+          <w:sz w:val="24"/>
+          <w:szCs w:val="24"/>
+          <w:lang w:eastAsia="fr-FR"/>
+        </w:rPr>
+      </w:pPr>
+      <w:r>
+        <w:rPr>
+          <w:rFonts w:ascii="Consolas" w:eastAsia="Times New Roman" w:hAnsi="Consolas" w:cs="Times New Roman"/>
+          <w:sz w:val="24"/>
+          <w:szCs w:val="24"/>
+          <w:lang w:val="en-US" w:eastAsia="fr-FR"/>
+        </w:rPr>
+        <w:t xml:space="preserve"> </w:t>
+      </w:r>
+      <w:r>
+        <w:rPr>
+          <w:rFonts w:ascii="Consolas" w:eastAsia="Times New Roman" w:hAnsi="Consolas" w:cs="Times New Roman"/>
+          <w:sz w:val="24"/>
+          <w:szCs w:val="24"/>
+          <w:lang w:eastAsia="fr-FR"/>
+        </w:rPr>
+        <w:t xml:space="preserve">0   </w:t>
       </w:r>
       <w:proofErr w:type="spellStart"/>
       <w:r>
@@ -9363,12 +8863,602 @@
           <w:rFonts w:ascii="Consolas" w:eastAsia="Times New Roman" w:hAnsi="Consolas" w:cs="Times New Roman"/>
           <w:sz w:val="24"/>
           <w:szCs w:val="24"/>
+          <w:lang w:eastAsia="fr-FR"/>
+        </w:rPr>
+        <w:t>id_mesure</w:t>
+      </w:r>
+      <w:proofErr w:type="spellEnd"/>
+      <w:r>
+        <w:rPr>
+          <w:rFonts w:ascii="Consolas" w:eastAsia="Times New Roman" w:hAnsi="Consolas" w:cs="Times New Roman"/>
+          <w:sz w:val="24"/>
+          <w:szCs w:val="24"/>
+          <w:lang w:eastAsia="fr-FR"/>
+        </w:rPr>
+        <w:t xml:space="preserve">     596 non-</w:t>
+      </w:r>
+      <w:proofErr w:type="spellStart"/>
+      <w:r>
+        <w:rPr>
+          <w:rFonts w:ascii="Consolas" w:eastAsia="Times New Roman" w:hAnsi="Consolas" w:cs="Times New Roman"/>
+          <w:sz w:val="24"/>
+          <w:szCs w:val="24"/>
+          <w:lang w:eastAsia="fr-FR"/>
+        </w:rPr>
+        <w:t>null</w:t>
+      </w:r>
+      <w:proofErr w:type="spellEnd"/>
+      <w:r>
+        <w:rPr>
+          <w:rFonts w:ascii="Consolas" w:eastAsia="Times New Roman" w:hAnsi="Consolas" w:cs="Times New Roman"/>
+          <w:sz w:val="24"/>
+          <w:szCs w:val="24"/>
+          <w:lang w:eastAsia="fr-FR"/>
+        </w:rPr>
+        <w:t xml:space="preserve">    </w:t>
+      </w:r>
+      <w:proofErr w:type="spellStart"/>
+      <w:r>
+        <w:rPr>
+          <w:rFonts w:ascii="Consolas" w:eastAsia="Times New Roman" w:hAnsi="Consolas" w:cs="Times New Roman"/>
+          <w:sz w:val="24"/>
+          <w:szCs w:val="24"/>
+          <w:lang w:eastAsia="fr-FR"/>
+        </w:rPr>
+        <w:t>str</w:t>
+      </w:r>
+      <w:proofErr w:type="spellEnd"/>
+      <w:r>
+        <w:rPr>
+          <w:rFonts w:ascii="Consolas" w:eastAsia="Times New Roman" w:hAnsi="Consolas" w:cs="Times New Roman"/>
+          <w:sz w:val="24"/>
+          <w:szCs w:val="24"/>
+          <w:lang w:eastAsia="fr-FR"/>
+        </w:rPr>
+        <w:t xml:space="preserve">    </w:t>
+      </w:r>
+    </w:p>
+    <w:p>
+      <w:pPr>
+        <w:spacing w:after="0" w:line="240" w:lineRule="auto"/>
+        <w:rPr>
+          <w:rFonts w:ascii="Consolas" w:eastAsia="Times New Roman" w:hAnsi="Consolas" w:cs="Times New Roman"/>
+          <w:sz w:val="24"/>
+          <w:szCs w:val="24"/>
+          <w:lang w:eastAsia="fr-FR"/>
+        </w:rPr>
+      </w:pPr>
+      <w:r>
+        <w:rPr>
+          <w:rFonts w:ascii="Consolas" w:eastAsia="Times New Roman" w:hAnsi="Consolas" w:cs="Times New Roman"/>
+          <w:sz w:val="24"/>
+          <w:szCs w:val="24"/>
+          <w:lang w:eastAsia="fr-FR"/>
+        </w:rPr>
+        <w:t xml:space="preserve"> 1   </w:t>
+      </w:r>
+      <w:proofErr w:type="spellStart"/>
+      <w:r>
+        <w:rPr>
+          <w:rFonts w:ascii="Consolas" w:eastAsia="Times New Roman" w:hAnsi="Consolas" w:cs="Times New Roman"/>
+          <w:sz w:val="24"/>
+          <w:szCs w:val="24"/>
+          <w:lang w:eastAsia="fr-FR"/>
+        </w:rPr>
+        <w:t>date_heure</w:t>
+      </w:r>
+      <w:proofErr w:type="spellEnd"/>
+      <w:r>
+        <w:rPr>
+          <w:rFonts w:ascii="Consolas" w:eastAsia="Times New Roman" w:hAnsi="Consolas" w:cs="Times New Roman"/>
+          <w:sz w:val="24"/>
+          <w:szCs w:val="24"/>
+          <w:lang w:eastAsia="fr-FR"/>
+        </w:rPr>
+        <w:t xml:space="preserve">    596 non-</w:t>
+      </w:r>
+      <w:proofErr w:type="spellStart"/>
+      <w:r>
+        <w:rPr>
+          <w:rFonts w:ascii="Consolas" w:eastAsia="Times New Roman" w:hAnsi="Consolas" w:cs="Times New Roman"/>
+          <w:sz w:val="24"/>
+          <w:szCs w:val="24"/>
+          <w:lang w:eastAsia="fr-FR"/>
+        </w:rPr>
+        <w:t>null</w:t>
+      </w:r>
+      <w:proofErr w:type="spellEnd"/>
+      <w:r>
+        <w:rPr>
+          <w:rFonts w:ascii="Consolas" w:eastAsia="Times New Roman" w:hAnsi="Consolas" w:cs="Times New Roman"/>
+          <w:sz w:val="24"/>
+          <w:szCs w:val="24"/>
+          <w:lang w:eastAsia="fr-FR"/>
+        </w:rPr>
+        <w:t xml:space="preserve">    </w:t>
+      </w:r>
+      <w:proofErr w:type="spellStart"/>
+      <w:r>
+        <w:rPr>
+          <w:rFonts w:ascii="Consolas" w:eastAsia="Times New Roman" w:hAnsi="Consolas" w:cs="Times New Roman"/>
+          <w:sz w:val="24"/>
+          <w:szCs w:val="24"/>
+          <w:lang w:eastAsia="fr-FR"/>
+        </w:rPr>
+        <w:t>str</w:t>
+      </w:r>
+      <w:proofErr w:type="spellEnd"/>
+      <w:r>
+        <w:rPr>
+          <w:rFonts w:ascii="Consolas" w:eastAsia="Times New Roman" w:hAnsi="Consolas" w:cs="Times New Roman"/>
+          <w:sz w:val="24"/>
+          <w:szCs w:val="24"/>
+          <w:lang w:eastAsia="fr-FR"/>
+        </w:rPr>
+        <w:t xml:space="preserve">    </w:t>
+      </w:r>
+    </w:p>
+    <w:p>
+      <w:pPr>
+        <w:spacing w:after="0" w:line="240" w:lineRule="auto"/>
+        <w:rPr>
+          <w:rFonts w:ascii="Consolas" w:eastAsia="Times New Roman" w:hAnsi="Consolas" w:cs="Times New Roman"/>
+          <w:sz w:val="24"/>
+          <w:szCs w:val="24"/>
+          <w:lang w:eastAsia="fr-FR"/>
+        </w:rPr>
+      </w:pPr>
+      <w:r>
+        <w:rPr>
+          <w:rFonts w:ascii="Consolas" w:eastAsia="Times New Roman" w:hAnsi="Consolas" w:cs="Times New Roman"/>
+          <w:sz w:val="24"/>
+          <w:szCs w:val="24"/>
+          <w:lang w:eastAsia="fr-FR"/>
+        </w:rPr>
+        <w:t xml:space="preserve"> 2   </w:t>
+      </w:r>
+      <w:proofErr w:type="spellStart"/>
+      <w:r>
+        <w:rPr>
+          <w:rFonts w:ascii="Consolas" w:eastAsia="Times New Roman" w:hAnsi="Consolas" w:cs="Times New Roman"/>
+          <w:sz w:val="24"/>
+          <w:szCs w:val="24"/>
+          <w:lang w:eastAsia="fr-FR"/>
+        </w:rPr>
+        <w:t>id_capteur</w:t>
+      </w:r>
+      <w:proofErr w:type="spellEnd"/>
+      <w:r>
+        <w:rPr>
+          <w:rFonts w:ascii="Consolas" w:eastAsia="Times New Roman" w:hAnsi="Consolas" w:cs="Times New Roman"/>
+          <w:sz w:val="24"/>
+          <w:szCs w:val="24"/>
+          <w:lang w:eastAsia="fr-FR"/>
+        </w:rPr>
+        <w:t xml:space="preserve">    596 non-</w:t>
+      </w:r>
+      <w:proofErr w:type="spellStart"/>
+      <w:r>
+        <w:rPr>
+          <w:rFonts w:ascii="Consolas" w:eastAsia="Times New Roman" w:hAnsi="Consolas" w:cs="Times New Roman"/>
+          <w:sz w:val="24"/>
+          <w:szCs w:val="24"/>
+          <w:lang w:eastAsia="fr-FR"/>
+        </w:rPr>
+        <w:t>null</w:t>
+      </w:r>
+      <w:proofErr w:type="spellEnd"/>
+      <w:r>
+        <w:rPr>
+          <w:rFonts w:ascii="Consolas" w:eastAsia="Times New Roman" w:hAnsi="Consolas" w:cs="Times New Roman"/>
+          <w:sz w:val="24"/>
+          <w:szCs w:val="24"/>
+          <w:lang w:eastAsia="fr-FR"/>
+        </w:rPr>
+        <w:t xml:space="preserve">    </w:t>
+      </w:r>
+      <w:proofErr w:type="spellStart"/>
+      <w:r>
+        <w:rPr>
+          <w:rFonts w:ascii="Consolas" w:eastAsia="Times New Roman" w:hAnsi="Consolas" w:cs="Times New Roman"/>
+          <w:sz w:val="24"/>
+          <w:szCs w:val="24"/>
+          <w:lang w:eastAsia="fr-FR"/>
+        </w:rPr>
+        <w:t>str</w:t>
+      </w:r>
+      <w:proofErr w:type="spellEnd"/>
+      <w:r>
+        <w:rPr>
+          <w:rFonts w:ascii="Consolas" w:eastAsia="Times New Roman" w:hAnsi="Consolas" w:cs="Times New Roman"/>
+          <w:sz w:val="24"/>
+          <w:szCs w:val="24"/>
+          <w:lang w:eastAsia="fr-FR"/>
+        </w:rPr>
+        <w:t xml:space="preserve">    </w:t>
+      </w:r>
+    </w:p>
+    <w:p>
+      <w:pPr>
+        <w:spacing w:after="0" w:line="240" w:lineRule="auto"/>
+        <w:rPr>
+          <w:rFonts w:ascii="Consolas" w:eastAsia="Times New Roman" w:hAnsi="Consolas" w:cs="Times New Roman"/>
+          <w:sz w:val="24"/>
+          <w:szCs w:val="24"/>
+          <w:lang w:eastAsia="fr-FR"/>
+        </w:rPr>
+      </w:pPr>
+      <w:r>
+        <w:rPr>
+          <w:rFonts w:ascii="Consolas" w:eastAsia="Times New Roman" w:hAnsi="Consolas" w:cs="Times New Roman"/>
+          <w:sz w:val="24"/>
+          <w:szCs w:val="24"/>
+          <w:lang w:eastAsia="fr-FR"/>
+        </w:rPr>
+        <w:t xml:space="preserve"> 3   </w:t>
+      </w:r>
+      <w:proofErr w:type="spellStart"/>
+      <w:r>
+        <w:rPr>
+          <w:rFonts w:ascii="Consolas" w:eastAsia="Times New Roman" w:hAnsi="Consolas" w:cs="Times New Roman"/>
+          <w:sz w:val="24"/>
+          <w:szCs w:val="24"/>
+          <w:lang w:eastAsia="fr-FR"/>
+        </w:rPr>
+        <w:t>batiment</w:t>
+      </w:r>
+      <w:proofErr w:type="spellEnd"/>
+      <w:r>
+        <w:rPr>
+          <w:rFonts w:ascii="Consolas" w:eastAsia="Times New Roman" w:hAnsi="Consolas" w:cs="Times New Roman"/>
+          <w:sz w:val="24"/>
+          <w:szCs w:val="24"/>
+          <w:lang w:eastAsia="fr-FR"/>
+        </w:rPr>
+        <w:t xml:space="preserve">      596 non-</w:t>
+      </w:r>
+      <w:proofErr w:type="spellStart"/>
+      <w:r>
+        <w:rPr>
+          <w:rFonts w:ascii="Consolas" w:eastAsia="Times New Roman" w:hAnsi="Consolas" w:cs="Times New Roman"/>
+          <w:sz w:val="24"/>
+          <w:szCs w:val="24"/>
+          <w:lang w:eastAsia="fr-FR"/>
+        </w:rPr>
+        <w:t>null</w:t>
+      </w:r>
+      <w:proofErr w:type="spellEnd"/>
+      <w:r>
+        <w:rPr>
+          <w:rFonts w:ascii="Consolas" w:eastAsia="Times New Roman" w:hAnsi="Consolas" w:cs="Times New Roman"/>
+          <w:sz w:val="24"/>
+          <w:szCs w:val="24"/>
+          <w:lang w:eastAsia="fr-FR"/>
+        </w:rPr>
+        <w:t xml:space="preserve">    </w:t>
+      </w:r>
+      <w:proofErr w:type="spellStart"/>
+      <w:r>
+        <w:rPr>
+          <w:rFonts w:ascii="Consolas" w:eastAsia="Times New Roman" w:hAnsi="Consolas" w:cs="Times New Roman"/>
+          <w:sz w:val="24"/>
+          <w:szCs w:val="24"/>
+          <w:lang w:eastAsia="fr-FR"/>
+        </w:rPr>
+        <w:t>str</w:t>
+      </w:r>
+      <w:proofErr w:type="spellEnd"/>
+      <w:r>
+        <w:rPr>
+          <w:rFonts w:ascii="Consolas" w:eastAsia="Times New Roman" w:hAnsi="Consolas" w:cs="Times New Roman"/>
+          <w:sz w:val="24"/>
+          <w:szCs w:val="24"/>
+          <w:lang w:eastAsia="fr-FR"/>
+        </w:rPr>
+        <w:t xml:space="preserve">    </w:t>
+      </w:r>
+    </w:p>
+    <w:p>
+      <w:pPr>
+        <w:spacing w:after="0" w:line="240" w:lineRule="auto"/>
+        <w:rPr>
+          <w:rFonts w:ascii="Consolas" w:eastAsia="Times New Roman" w:hAnsi="Consolas" w:cs="Times New Roman"/>
+          <w:sz w:val="24"/>
+          <w:szCs w:val="24"/>
+          <w:lang w:eastAsia="fr-FR"/>
+        </w:rPr>
+      </w:pPr>
+      <w:r>
+        <w:rPr>
+          <w:rFonts w:ascii="Consolas" w:eastAsia="Times New Roman" w:hAnsi="Consolas" w:cs="Times New Roman"/>
+          <w:sz w:val="24"/>
+          <w:szCs w:val="24"/>
+          <w:lang w:eastAsia="fr-FR"/>
+        </w:rPr>
+        <w:t xml:space="preserve"> 4   </w:t>
+      </w:r>
+      <w:proofErr w:type="spellStart"/>
+      <w:r>
+        <w:rPr>
+          <w:rFonts w:ascii="Consolas" w:eastAsia="Times New Roman" w:hAnsi="Consolas" w:cs="Times New Roman"/>
+          <w:sz w:val="24"/>
+          <w:szCs w:val="24"/>
+          <w:lang w:eastAsia="fr-FR"/>
+        </w:rPr>
+        <w:t>temperature</w:t>
+      </w:r>
+      <w:proofErr w:type="spellEnd"/>
+      <w:r>
+        <w:rPr>
+          <w:rFonts w:ascii="Consolas" w:eastAsia="Times New Roman" w:hAnsi="Consolas" w:cs="Times New Roman"/>
+          <w:sz w:val="24"/>
+          <w:szCs w:val="24"/>
+          <w:lang w:eastAsia="fr-FR"/>
+        </w:rPr>
+        <w:t xml:space="preserve">   590 non-</w:t>
+      </w:r>
+      <w:proofErr w:type="spellStart"/>
+      <w:r>
+        <w:rPr>
+          <w:rFonts w:ascii="Consolas" w:eastAsia="Times New Roman" w:hAnsi="Consolas" w:cs="Times New Roman"/>
+          <w:sz w:val="24"/>
+          <w:szCs w:val="24"/>
+          <w:lang w:eastAsia="fr-FR"/>
+        </w:rPr>
+        <w:t>null</w:t>
+      </w:r>
+      <w:proofErr w:type="spellEnd"/>
+      <w:r>
+        <w:rPr>
+          <w:rFonts w:ascii="Consolas" w:eastAsia="Times New Roman" w:hAnsi="Consolas" w:cs="Times New Roman"/>
+          <w:sz w:val="24"/>
+          <w:szCs w:val="24"/>
+          <w:lang w:eastAsia="fr-FR"/>
+        </w:rPr>
+        <w:t xml:space="preserve">    float64</w:t>
+      </w:r>
+    </w:p>
+    <w:p>
+      <w:pPr>
+        <w:spacing w:after="0" w:line="240" w:lineRule="auto"/>
+        <w:rPr>
+          <w:rFonts w:ascii="Consolas" w:eastAsia="Times New Roman" w:hAnsi="Consolas" w:cs="Times New Roman"/>
+          <w:sz w:val="24"/>
+          <w:szCs w:val="24"/>
+          <w:lang w:eastAsia="fr-FR"/>
+        </w:rPr>
+      </w:pPr>
+      <w:r>
+        <w:rPr>
+          <w:rFonts w:ascii="Consolas" w:eastAsia="Times New Roman" w:hAnsi="Consolas" w:cs="Times New Roman"/>
+          <w:sz w:val="24"/>
+          <w:szCs w:val="24"/>
+          <w:lang w:eastAsia="fr-FR"/>
+        </w:rPr>
+        <w:t xml:space="preserve"> 5   </w:t>
+      </w:r>
+      <w:proofErr w:type="spellStart"/>
+      <w:r>
+        <w:rPr>
+          <w:rFonts w:ascii="Consolas" w:eastAsia="Times New Roman" w:hAnsi="Consolas" w:cs="Times New Roman"/>
+          <w:sz w:val="24"/>
+          <w:szCs w:val="24"/>
+          <w:lang w:eastAsia="fr-FR"/>
+        </w:rPr>
+        <w:t>humidite</w:t>
+      </w:r>
+      <w:proofErr w:type="spellEnd"/>
+      <w:r>
+        <w:rPr>
+          <w:rFonts w:ascii="Consolas" w:eastAsia="Times New Roman" w:hAnsi="Consolas" w:cs="Times New Roman"/>
+          <w:sz w:val="24"/>
+          <w:szCs w:val="24"/>
+          <w:lang w:eastAsia="fr-FR"/>
+        </w:rPr>
+        <w:t xml:space="preserve">      591 non-</w:t>
+      </w:r>
+      <w:proofErr w:type="spellStart"/>
+      <w:r>
+        <w:rPr>
+          <w:rFonts w:ascii="Consolas" w:eastAsia="Times New Roman" w:hAnsi="Consolas" w:cs="Times New Roman"/>
+          <w:sz w:val="24"/>
+          <w:szCs w:val="24"/>
+          <w:lang w:eastAsia="fr-FR"/>
+        </w:rPr>
+        <w:t>null</w:t>
+      </w:r>
+      <w:proofErr w:type="spellEnd"/>
+      <w:r>
+        <w:rPr>
+          <w:rFonts w:ascii="Consolas" w:eastAsia="Times New Roman" w:hAnsi="Consolas" w:cs="Times New Roman"/>
+          <w:sz w:val="24"/>
+          <w:szCs w:val="24"/>
+          <w:lang w:eastAsia="fr-FR"/>
+        </w:rPr>
+        <w:t xml:space="preserve">    float64</w:t>
+      </w:r>
+    </w:p>
+    <w:p>
+      <w:pPr>
+        <w:spacing w:after="0" w:line="240" w:lineRule="auto"/>
+        <w:rPr>
+          <w:rFonts w:ascii="Consolas" w:eastAsia="Times New Roman" w:hAnsi="Consolas" w:cs="Times New Roman"/>
+          <w:sz w:val="24"/>
+          <w:szCs w:val="24"/>
+          <w:lang w:eastAsia="fr-FR"/>
+        </w:rPr>
+      </w:pPr>
+      <w:r>
+        <w:rPr>
+          <w:rFonts w:ascii="Consolas" w:eastAsia="Times New Roman" w:hAnsi="Consolas" w:cs="Times New Roman"/>
+          <w:sz w:val="24"/>
+          <w:szCs w:val="24"/>
+          <w:lang w:eastAsia="fr-FR"/>
+        </w:rPr>
+        <w:t xml:space="preserve"> 6   pression      591 non-</w:t>
+      </w:r>
+      <w:proofErr w:type="spellStart"/>
+      <w:r>
+        <w:rPr>
+          <w:rFonts w:ascii="Consolas" w:eastAsia="Times New Roman" w:hAnsi="Consolas" w:cs="Times New Roman"/>
+          <w:sz w:val="24"/>
+          <w:szCs w:val="24"/>
+          <w:lang w:eastAsia="fr-FR"/>
+        </w:rPr>
+        <w:t>null</w:t>
+      </w:r>
+      <w:proofErr w:type="spellEnd"/>
+      <w:r>
+        <w:rPr>
+          <w:rFonts w:ascii="Consolas" w:eastAsia="Times New Roman" w:hAnsi="Consolas" w:cs="Times New Roman"/>
+          <w:sz w:val="24"/>
+          <w:szCs w:val="24"/>
+          <w:lang w:eastAsia="fr-FR"/>
+        </w:rPr>
+        <w:t xml:space="preserve">    float64</w:t>
+      </w:r>
+    </w:p>
+    <w:p>
+      <w:pPr>
+        <w:spacing w:after="0" w:line="240" w:lineRule="auto"/>
+        <w:rPr>
+          <w:rFonts w:ascii="Consolas" w:eastAsia="Times New Roman" w:hAnsi="Consolas" w:cs="Times New Roman"/>
+          <w:sz w:val="24"/>
+          <w:szCs w:val="24"/>
+          <w:lang w:eastAsia="fr-FR"/>
+        </w:rPr>
+      </w:pPr>
+      <w:r>
+        <w:rPr>
+          <w:rFonts w:ascii="Consolas" w:eastAsia="Times New Roman" w:hAnsi="Consolas" w:cs="Times New Roman"/>
+          <w:sz w:val="24"/>
+          <w:szCs w:val="24"/>
+          <w:lang w:eastAsia="fr-FR"/>
+        </w:rPr>
+        <w:t xml:space="preserve"> 7   consommation  591 non-</w:t>
+      </w:r>
+      <w:proofErr w:type="spellStart"/>
+      <w:r>
+        <w:rPr>
+          <w:rFonts w:ascii="Consolas" w:eastAsia="Times New Roman" w:hAnsi="Consolas" w:cs="Times New Roman"/>
+          <w:sz w:val="24"/>
+          <w:szCs w:val="24"/>
+          <w:lang w:eastAsia="fr-FR"/>
+        </w:rPr>
+        <w:t>null</w:t>
+      </w:r>
+      <w:proofErr w:type="spellEnd"/>
+      <w:r>
+        <w:rPr>
+          <w:rFonts w:ascii="Consolas" w:eastAsia="Times New Roman" w:hAnsi="Consolas" w:cs="Times New Roman"/>
+          <w:sz w:val="24"/>
+          <w:szCs w:val="24"/>
+          <w:lang w:eastAsia="fr-FR"/>
+        </w:rPr>
+        <w:t xml:space="preserve">    float64</w:t>
+      </w:r>
+    </w:p>
+    <w:p>
+      <w:pPr>
+        <w:spacing w:after="0" w:line="240" w:lineRule="auto"/>
+        <w:rPr>
+          <w:rFonts w:ascii="Consolas" w:eastAsia="Times New Roman" w:hAnsi="Consolas" w:cs="Times New Roman"/>
+          <w:sz w:val="24"/>
+          <w:szCs w:val="24"/>
+          <w:lang w:eastAsia="fr-FR"/>
+        </w:rPr>
+      </w:pPr>
+      <w:r>
+        <w:rPr>
+          <w:rFonts w:ascii="Consolas" w:eastAsia="Times New Roman" w:hAnsi="Consolas" w:cs="Times New Roman"/>
+          <w:sz w:val="24"/>
+          <w:szCs w:val="24"/>
+          <w:lang w:eastAsia="fr-FR"/>
+        </w:rPr>
+        <w:t xml:space="preserve"> 8   </w:t>
+      </w:r>
+      <w:proofErr w:type="spellStart"/>
+      <w:r>
+        <w:rPr>
+          <w:rFonts w:ascii="Consolas" w:eastAsia="Times New Roman" w:hAnsi="Consolas" w:cs="Times New Roman"/>
+          <w:sz w:val="24"/>
+          <w:szCs w:val="24"/>
+          <w:lang w:eastAsia="fr-FR"/>
+        </w:rPr>
+        <w:t>etat</w:t>
+      </w:r>
+      <w:proofErr w:type="spellEnd"/>
+      <w:r>
+        <w:rPr>
+          <w:rFonts w:ascii="Consolas" w:eastAsia="Times New Roman" w:hAnsi="Consolas" w:cs="Times New Roman"/>
+          <w:sz w:val="24"/>
+          <w:szCs w:val="24"/>
+          <w:lang w:eastAsia="fr-FR"/>
+        </w:rPr>
+        <w:t xml:space="preserve">          596 non-</w:t>
+      </w:r>
+      <w:proofErr w:type="spellStart"/>
+      <w:r>
+        <w:rPr>
+          <w:rFonts w:ascii="Consolas" w:eastAsia="Times New Roman" w:hAnsi="Consolas" w:cs="Times New Roman"/>
+          <w:sz w:val="24"/>
+          <w:szCs w:val="24"/>
+          <w:lang w:eastAsia="fr-FR"/>
+        </w:rPr>
+        <w:t>null</w:t>
+      </w:r>
+      <w:proofErr w:type="spellEnd"/>
+      <w:r>
+        <w:rPr>
+          <w:rFonts w:ascii="Consolas" w:eastAsia="Times New Roman" w:hAnsi="Consolas" w:cs="Times New Roman"/>
+          <w:sz w:val="24"/>
+          <w:szCs w:val="24"/>
+          <w:lang w:eastAsia="fr-FR"/>
+        </w:rPr>
+        <w:t xml:space="preserve">    </w:t>
+      </w:r>
+      <w:proofErr w:type="spellStart"/>
+      <w:r>
+        <w:rPr>
+          <w:rFonts w:ascii="Consolas" w:eastAsia="Times New Roman" w:hAnsi="Consolas" w:cs="Times New Roman"/>
+          <w:sz w:val="24"/>
+          <w:szCs w:val="24"/>
+          <w:lang w:eastAsia="fr-FR"/>
+        </w:rPr>
+        <w:t>str</w:t>
+      </w:r>
+      <w:proofErr w:type="spellEnd"/>
+      <w:r>
+        <w:rPr>
+          <w:rFonts w:ascii="Consolas" w:eastAsia="Times New Roman" w:hAnsi="Consolas" w:cs="Times New Roman"/>
+          <w:sz w:val="24"/>
+          <w:szCs w:val="24"/>
+          <w:lang w:eastAsia="fr-FR"/>
+        </w:rPr>
+        <w:t xml:space="preserve">    </w:t>
+      </w:r>
+    </w:p>
+    <w:p>
+      <w:pPr>
+        <w:spacing w:after="0" w:line="240" w:lineRule="auto"/>
+        <w:rPr>
+          <w:rFonts w:ascii="Consolas" w:eastAsia="Times New Roman" w:hAnsi="Consolas" w:cs="Times New Roman"/>
+          <w:sz w:val="24"/>
+          <w:szCs w:val="24"/>
           <w:lang w:val="en-US" w:eastAsia="fr-FR"/>
         </w:rPr>
-        <w:t>Dtype</w:t>
+      </w:pPr>
+      <w:proofErr w:type="spellStart"/>
+      <w:r>
+        <w:rPr>
+          <w:rFonts w:ascii="Consolas" w:eastAsia="Times New Roman" w:hAnsi="Consolas" w:cs="Times New Roman"/>
+          <w:sz w:val="24"/>
+          <w:szCs w:val="24"/>
+          <w:lang w:val="en-US" w:eastAsia="fr-FR"/>
+        </w:rPr>
+        <w:t>dtypes</w:t>
       </w:r>
       <w:proofErr w:type="spellEnd"/>
-      <w:proofErr w:type="gramEnd"/>
       <w:r>
         <w:rPr>
           <w:rFonts w:ascii="Consolas" w:eastAsia="Times New Roman" w:hAnsi="Consolas" w:cs="Times New Roman"/>
@@ -9376,718 +9466,7 @@
           <w:szCs w:val="24"/>
           <w:lang w:val="en-US" w:eastAsia="fr-FR"/>
         </w:rPr>
-        <w:t xml:space="preserve">  </w:t>
-      </w:r>
-    </w:p>
-    <w:p>
-      <w:pPr>
-        <w:spacing w:after="0" w:line="240" w:lineRule="auto"/>
-        <w:rPr>
-          <w:rFonts w:ascii="Consolas" w:eastAsia="Times New Roman" w:hAnsi="Consolas" w:cs="Times New Roman"/>
-          <w:sz w:val="24"/>
-          <w:szCs w:val="24"/>
-          <w:lang w:eastAsia="fr-FR"/>
-        </w:rPr>
-      </w:pPr>
-      <w:r>
-        <w:rPr>
-          <w:rFonts w:ascii="Consolas" w:eastAsia="Times New Roman" w:hAnsi="Consolas" w:cs="Times New Roman"/>
-          <w:sz w:val="24"/>
-          <w:szCs w:val="24"/>
-          <w:lang w:eastAsia="fr-FR"/>
-        </w:rPr>
-        <w:t xml:space="preserve">---  ------        --------------  -----  </w:t>
-      </w:r>
-    </w:p>
-    <w:p>
-      <w:pPr>
-        <w:spacing w:after="0" w:line="240" w:lineRule="auto"/>
-        <w:rPr>
-          <w:rFonts w:ascii="Consolas" w:eastAsia="Times New Roman" w:hAnsi="Consolas" w:cs="Times New Roman"/>
-          <w:sz w:val="24"/>
-          <w:szCs w:val="24"/>
-          <w:lang w:eastAsia="fr-FR"/>
-        </w:rPr>
-      </w:pPr>
-      <w:r>
-        <w:rPr>
-          <w:rFonts w:ascii="Consolas" w:eastAsia="Times New Roman" w:hAnsi="Consolas" w:cs="Times New Roman"/>
-          <w:sz w:val="24"/>
-          <w:szCs w:val="24"/>
-          <w:lang w:eastAsia="fr-FR"/>
-        </w:rPr>
-        <w:t xml:space="preserve"> 0   </w:t>
-      </w:r>
-      <w:proofErr w:type="spellStart"/>
-      <w:r>
-        <w:rPr>
-          <w:rFonts w:ascii="Consolas" w:eastAsia="Times New Roman" w:hAnsi="Consolas" w:cs="Times New Roman"/>
-          <w:sz w:val="24"/>
-          <w:szCs w:val="24"/>
-          <w:lang w:eastAsia="fr-FR"/>
-        </w:rPr>
-        <w:t>id_mesure</w:t>
-      </w:r>
-      <w:proofErr w:type="spellEnd"/>
-      <w:r>
-        <w:rPr>
-          <w:rFonts w:ascii="Consolas" w:eastAsia="Times New Roman" w:hAnsi="Consolas" w:cs="Times New Roman"/>
-          <w:sz w:val="24"/>
-          <w:szCs w:val="24"/>
-          <w:lang w:eastAsia="fr-FR"/>
-        </w:rPr>
-        <w:t xml:space="preserve">     596 non-</w:t>
-      </w:r>
-      <w:proofErr w:type="spellStart"/>
-      <w:r>
-        <w:rPr>
-          <w:rFonts w:ascii="Consolas" w:eastAsia="Times New Roman" w:hAnsi="Consolas" w:cs="Times New Roman"/>
-          <w:sz w:val="24"/>
-          <w:szCs w:val="24"/>
-          <w:lang w:eastAsia="fr-FR"/>
-        </w:rPr>
-        <w:t>null</w:t>
-      </w:r>
-      <w:proofErr w:type="spellEnd"/>
-      <w:r>
-        <w:rPr>
-          <w:rFonts w:ascii="Consolas" w:eastAsia="Times New Roman" w:hAnsi="Consolas" w:cs="Times New Roman"/>
-          <w:sz w:val="24"/>
-          <w:szCs w:val="24"/>
-          <w:lang w:eastAsia="fr-FR"/>
-        </w:rPr>
-        <w:t xml:space="preserve">    </w:t>
-      </w:r>
-      <w:proofErr w:type="spellStart"/>
-      <w:r>
-        <w:rPr>
-          <w:rFonts w:ascii="Consolas" w:eastAsia="Times New Roman" w:hAnsi="Consolas" w:cs="Times New Roman"/>
-          <w:sz w:val="24"/>
-          <w:szCs w:val="24"/>
-          <w:lang w:eastAsia="fr-FR"/>
-        </w:rPr>
-        <w:t>str</w:t>
-      </w:r>
-      <w:proofErr w:type="spellEnd"/>
-      <w:r>
-        <w:rPr>
-          <w:rFonts w:ascii="Consolas" w:eastAsia="Times New Roman" w:hAnsi="Consolas" w:cs="Times New Roman"/>
-          <w:sz w:val="24"/>
-          <w:szCs w:val="24"/>
-          <w:lang w:eastAsia="fr-FR"/>
-        </w:rPr>
-        <w:t xml:space="preserve">    </w:t>
-      </w:r>
-    </w:p>
-    <w:p>
-      <w:pPr>
-        <w:spacing w:after="0" w:line="240" w:lineRule="auto"/>
-        <w:rPr>
-          <w:rFonts w:ascii="Consolas" w:eastAsia="Times New Roman" w:hAnsi="Consolas" w:cs="Times New Roman"/>
-          <w:sz w:val="24"/>
-          <w:szCs w:val="24"/>
-          <w:lang w:eastAsia="fr-FR"/>
-        </w:rPr>
-      </w:pPr>
-      <w:r>
-        <w:rPr>
-          <w:rFonts w:ascii="Consolas" w:eastAsia="Times New Roman" w:hAnsi="Consolas" w:cs="Times New Roman"/>
-          <w:sz w:val="24"/>
-          <w:szCs w:val="24"/>
-          <w:lang w:eastAsia="fr-FR"/>
-        </w:rPr>
-        <w:t xml:space="preserve"> 1   </w:t>
-      </w:r>
-      <w:proofErr w:type="spellStart"/>
-      <w:r>
-        <w:rPr>
-          <w:rFonts w:ascii="Consolas" w:eastAsia="Times New Roman" w:hAnsi="Consolas" w:cs="Times New Roman"/>
-          <w:sz w:val="24"/>
-          <w:szCs w:val="24"/>
-          <w:lang w:eastAsia="fr-FR"/>
-        </w:rPr>
-        <w:t>date_heure</w:t>
-      </w:r>
-      <w:proofErr w:type="spellEnd"/>
-      <w:r>
-        <w:rPr>
-          <w:rFonts w:ascii="Consolas" w:eastAsia="Times New Roman" w:hAnsi="Consolas" w:cs="Times New Roman"/>
-          <w:sz w:val="24"/>
-          <w:szCs w:val="24"/>
-          <w:lang w:eastAsia="fr-FR"/>
-        </w:rPr>
-        <w:t xml:space="preserve">    596 non-</w:t>
-      </w:r>
-      <w:proofErr w:type="spellStart"/>
-      <w:r>
-        <w:rPr>
-          <w:rFonts w:ascii="Consolas" w:eastAsia="Times New Roman" w:hAnsi="Consolas" w:cs="Times New Roman"/>
-          <w:sz w:val="24"/>
-          <w:szCs w:val="24"/>
-          <w:lang w:eastAsia="fr-FR"/>
-        </w:rPr>
-        <w:t>null</w:t>
-      </w:r>
-      <w:proofErr w:type="spellEnd"/>
-      <w:r>
-        <w:rPr>
-          <w:rFonts w:ascii="Consolas" w:eastAsia="Times New Roman" w:hAnsi="Consolas" w:cs="Times New Roman"/>
-          <w:sz w:val="24"/>
-          <w:szCs w:val="24"/>
-          <w:lang w:eastAsia="fr-FR"/>
-        </w:rPr>
-        <w:t xml:space="preserve">    </w:t>
-      </w:r>
-      <w:proofErr w:type="spellStart"/>
-      <w:r>
-        <w:rPr>
-          <w:rFonts w:ascii="Consolas" w:eastAsia="Times New Roman" w:hAnsi="Consolas" w:cs="Times New Roman"/>
-          <w:sz w:val="24"/>
-          <w:szCs w:val="24"/>
-          <w:lang w:eastAsia="fr-FR"/>
-        </w:rPr>
-        <w:t>str</w:t>
-      </w:r>
-      <w:proofErr w:type="spellEnd"/>
-      <w:r>
-        <w:rPr>
-          <w:rFonts w:ascii="Consolas" w:eastAsia="Times New Roman" w:hAnsi="Consolas" w:cs="Times New Roman"/>
-          <w:sz w:val="24"/>
-          <w:szCs w:val="24"/>
-          <w:lang w:eastAsia="fr-FR"/>
-        </w:rPr>
-        <w:t xml:space="preserve">    </w:t>
-      </w:r>
-    </w:p>
-    <w:p>
-      <w:pPr>
-        <w:spacing w:after="0" w:line="240" w:lineRule="auto"/>
-        <w:rPr>
-          <w:rFonts w:ascii="Consolas" w:eastAsia="Times New Roman" w:hAnsi="Consolas" w:cs="Times New Roman"/>
-          <w:sz w:val="24"/>
-          <w:szCs w:val="24"/>
-          <w:lang w:eastAsia="fr-FR"/>
-        </w:rPr>
-      </w:pPr>
-      <w:r>
-        <w:rPr>
-          <w:rFonts w:ascii="Consolas" w:eastAsia="Times New Roman" w:hAnsi="Consolas" w:cs="Times New Roman"/>
-          <w:sz w:val="24"/>
-          <w:szCs w:val="24"/>
-          <w:lang w:eastAsia="fr-FR"/>
-        </w:rPr>
-        <w:t xml:space="preserve"> 2   </w:t>
-      </w:r>
-      <w:proofErr w:type="spellStart"/>
-      <w:r>
-        <w:rPr>
-          <w:rFonts w:ascii="Consolas" w:eastAsia="Times New Roman" w:hAnsi="Consolas" w:cs="Times New Roman"/>
-          <w:sz w:val="24"/>
-          <w:szCs w:val="24"/>
-          <w:lang w:eastAsia="fr-FR"/>
-        </w:rPr>
-        <w:t>id_capteur</w:t>
-      </w:r>
-      <w:proofErr w:type="spellEnd"/>
-      <w:r>
-        <w:rPr>
-          <w:rFonts w:ascii="Consolas" w:eastAsia="Times New Roman" w:hAnsi="Consolas" w:cs="Times New Roman"/>
-          <w:sz w:val="24"/>
-          <w:szCs w:val="24"/>
-          <w:lang w:eastAsia="fr-FR"/>
-        </w:rPr>
-        <w:t xml:space="preserve">    596 non-</w:t>
-      </w:r>
-      <w:proofErr w:type="spellStart"/>
-      <w:r>
-        <w:rPr>
-          <w:rFonts w:ascii="Consolas" w:eastAsia="Times New Roman" w:hAnsi="Consolas" w:cs="Times New Roman"/>
-          <w:sz w:val="24"/>
-          <w:szCs w:val="24"/>
-          <w:lang w:eastAsia="fr-FR"/>
-        </w:rPr>
-        <w:t>null</w:t>
-      </w:r>
-      <w:proofErr w:type="spellEnd"/>
-      <w:r>
-        <w:rPr>
-          <w:rFonts w:ascii="Consolas" w:eastAsia="Times New Roman" w:hAnsi="Consolas" w:cs="Times New Roman"/>
-          <w:sz w:val="24"/>
-          <w:szCs w:val="24"/>
-          <w:lang w:eastAsia="fr-FR"/>
-        </w:rPr>
-        <w:t xml:space="preserve">    </w:t>
-      </w:r>
-      <w:proofErr w:type="spellStart"/>
-      <w:r>
-        <w:rPr>
-          <w:rFonts w:ascii="Consolas" w:eastAsia="Times New Roman" w:hAnsi="Consolas" w:cs="Times New Roman"/>
-          <w:sz w:val="24"/>
-          <w:szCs w:val="24"/>
-          <w:lang w:eastAsia="fr-FR"/>
-        </w:rPr>
-        <w:t>str</w:t>
-      </w:r>
-      <w:proofErr w:type="spellEnd"/>
-      <w:r>
-        <w:rPr>
-          <w:rFonts w:ascii="Consolas" w:eastAsia="Times New Roman" w:hAnsi="Consolas" w:cs="Times New Roman"/>
-          <w:sz w:val="24"/>
-          <w:szCs w:val="24"/>
-          <w:lang w:eastAsia="fr-FR"/>
-        </w:rPr>
-        <w:t xml:space="preserve">    </w:t>
-      </w:r>
-    </w:p>
-    <w:p>
-      <w:pPr>
-        <w:spacing w:after="0" w:line="240" w:lineRule="auto"/>
-        <w:rPr>
-          <w:rFonts w:ascii="Consolas" w:eastAsia="Times New Roman" w:hAnsi="Consolas" w:cs="Times New Roman"/>
-          <w:sz w:val="24"/>
-          <w:szCs w:val="24"/>
-          <w:lang w:eastAsia="fr-FR"/>
-        </w:rPr>
-      </w:pPr>
-      <w:r>
-        <w:rPr>
-          <w:rFonts w:ascii="Consolas" w:eastAsia="Times New Roman" w:hAnsi="Consolas" w:cs="Times New Roman"/>
-          <w:sz w:val="24"/>
-          <w:szCs w:val="24"/>
-          <w:lang w:eastAsia="fr-FR"/>
-        </w:rPr>
-        <w:t xml:space="preserve"> 3   </w:t>
-      </w:r>
-      <w:proofErr w:type="spellStart"/>
-      <w:r>
-        <w:rPr>
-          <w:rFonts w:ascii="Consolas" w:eastAsia="Times New Roman" w:hAnsi="Consolas" w:cs="Times New Roman"/>
-          <w:sz w:val="24"/>
-          <w:szCs w:val="24"/>
-          <w:lang w:eastAsia="fr-FR"/>
-        </w:rPr>
-        <w:t>batiment</w:t>
-      </w:r>
-      <w:proofErr w:type="spellEnd"/>
-      <w:r>
-        <w:rPr>
-          <w:rFonts w:ascii="Consolas" w:eastAsia="Times New Roman" w:hAnsi="Consolas" w:cs="Times New Roman"/>
-          <w:sz w:val="24"/>
-          <w:szCs w:val="24"/>
-          <w:lang w:eastAsia="fr-FR"/>
-        </w:rPr>
-        <w:t xml:space="preserve">      596 non-</w:t>
-      </w:r>
-      <w:proofErr w:type="spellStart"/>
-      <w:r>
-        <w:rPr>
-          <w:rFonts w:ascii="Consolas" w:eastAsia="Times New Roman" w:hAnsi="Consolas" w:cs="Times New Roman"/>
-          <w:sz w:val="24"/>
-          <w:szCs w:val="24"/>
-          <w:lang w:eastAsia="fr-FR"/>
-        </w:rPr>
-        <w:t>null</w:t>
-      </w:r>
-      <w:proofErr w:type="spellEnd"/>
-      <w:r>
-        <w:rPr>
-          <w:rFonts w:ascii="Consolas" w:eastAsia="Times New Roman" w:hAnsi="Consolas" w:cs="Times New Roman"/>
-          <w:sz w:val="24"/>
-          <w:szCs w:val="24"/>
-          <w:lang w:eastAsia="fr-FR"/>
-        </w:rPr>
-        <w:t xml:space="preserve">    </w:t>
-      </w:r>
-      <w:proofErr w:type="spellStart"/>
-      <w:r>
-        <w:rPr>
-          <w:rFonts w:ascii="Consolas" w:eastAsia="Times New Roman" w:hAnsi="Consolas" w:cs="Times New Roman"/>
-          <w:sz w:val="24"/>
-          <w:szCs w:val="24"/>
-          <w:lang w:eastAsia="fr-FR"/>
-        </w:rPr>
-        <w:t>str</w:t>
-      </w:r>
-      <w:proofErr w:type="spellEnd"/>
-      <w:r>
-        <w:rPr>
-          <w:rFonts w:ascii="Consolas" w:eastAsia="Times New Roman" w:hAnsi="Consolas" w:cs="Times New Roman"/>
-          <w:sz w:val="24"/>
-          <w:szCs w:val="24"/>
-          <w:lang w:eastAsia="fr-FR"/>
-        </w:rPr>
-        <w:t xml:space="preserve">    </w:t>
-      </w:r>
-    </w:p>
-    <w:p>
-      <w:pPr>
-        <w:spacing w:after="0" w:line="240" w:lineRule="auto"/>
-        <w:rPr>
-          <w:rFonts w:ascii="Consolas" w:eastAsia="Times New Roman" w:hAnsi="Consolas" w:cs="Times New Roman"/>
-          <w:sz w:val="24"/>
-          <w:szCs w:val="24"/>
-          <w:lang w:eastAsia="fr-FR"/>
-        </w:rPr>
-      </w:pPr>
-      <w:r>
-        <w:rPr>
-          <w:rFonts w:ascii="Consolas" w:eastAsia="Times New Roman" w:hAnsi="Consolas" w:cs="Times New Roman"/>
-          <w:sz w:val="24"/>
-          <w:szCs w:val="24"/>
-          <w:lang w:eastAsia="fr-FR"/>
-        </w:rPr>
-        <w:t xml:space="preserve"> 4   </w:t>
-      </w:r>
-      <w:proofErr w:type="spellStart"/>
-      <w:r>
-        <w:rPr>
-          <w:rFonts w:ascii="Consolas" w:eastAsia="Times New Roman" w:hAnsi="Consolas" w:cs="Times New Roman"/>
-          <w:sz w:val="24"/>
-          <w:szCs w:val="24"/>
-          <w:lang w:eastAsia="fr-FR"/>
-        </w:rPr>
-        <w:t>temperature</w:t>
-      </w:r>
-      <w:proofErr w:type="spellEnd"/>
-      <w:r>
-        <w:rPr>
-          <w:rFonts w:ascii="Consolas" w:eastAsia="Times New Roman" w:hAnsi="Consolas" w:cs="Times New Roman"/>
-          <w:sz w:val="24"/>
-          <w:szCs w:val="24"/>
-          <w:lang w:eastAsia="fr-FR"/>
-        </w:rPr>
-        <w:t xml:space="preserve">   590 non-</w:t>
-      </w:r>
-      <w:proofErr w:type="spellStart"/>
-      <w:r>
-        <w:rPr>
-          <w:rFonts w:ascii="Consolas" w:eastAsia="Times New Roman" w:hAnsi="Consolas" w:cs="Times New Roman"/>
-          <w:sz w:val="24"/>
-          <w:szCs w:val="24"/>
-          <w:lang w:eastAsia="fr-FR"/>
-        </w:rPr>
-        <w:t>null</w:t>
-      </w:r>
-      <w:proofErr w:type="spellEnd"/>
-      <w:r>
-        <w:rPr>
-          <w:rFonts w:ascii="Consolas" w:eastAsia="Times New Roman" w:hAnsi="Consolas" w:cs="Times New Roman"/>
-          <w:sz w:val="24"/>
-          <w:szCs w:val="24"/>
-          <w:lang w:eastAsia="fr-FR"/>
-        </w:rPr>
-        <w:t xml:space="preserve">    float64</w:t>
-      </w:r>
-    </w:p>
-    <w:p>
-      <w:pPr>
-        <w:spacing w:after="0" w:line="240" w:lineRule="auto"/>
-        <w:rPr>
-          <w:rFonts w:ascii="Consolas" w:eastAsia="Times New Roman" w:hAnsi="Consolas" w:cs="Times New Roman"/>
-          <w:sz w:val="24"/>
-          <w:szCs w:val="24"/>
-          <w:lang w:eastAsia="fr-FR"/>
-        </w:rPr>
-      </w:pPr>
-      <w:r>
-        <w:rPr>
-          <w:rFonts w:ascii="Consolas" w:eastAsia="Times New Roman" w:hAnsi="Consolas" w:cs="Times New Roman"/>
-          <w:sz w:val="24"/>
-          <w:szCs w:val="24"/>
-          <w:lang w:eastAsia="fr-FR"/>
-        </w:rPr>
-        <w:t xml:space="preserve"> 5   </w:t>
-      </w:r>
-      <w:proofErr w:type="spellStart"/>
-      <w:r>
-        <w:rPr>
-          <w:rFonts w:ascii="Consolas" w:eastAsia="Times New Roman" w:hAnsi="Consolas" w:cs="Times New Roman"/>
-          <w:sz w:val="24"/>
-          <w:szCs w:val="24"/>
-          <w:lang w:eastAsia="fr-FR"/>
-        </w:rPr>
-        <w:t>humidite</w:t>
-      </w:r>
-      <w:proofErr w:type="spellEnd"/>
-      <w:r>
-        <w:rPr>
-          <w:rFonts w:ascii="Consolas" w:eastAsia="Times New Roman" w:hAnsi="Consolas" w:cs="Times New Roman"/>
-          <w:sz w:val="24"/>
-          <w:szCs w:val="24"/>
-          <w:lang w:eastAsia="fr-FR"/>
-        </w:rPr>
-        <w:t xml:space="preserve">      591 non-</w:t>
-      </w:r>
-      <w:proofErr w:type="spellStart"/>
-      <w:r>
-        <w:rPr>
-          <w:rFonts w:ascii="Consolas" w:eastAsia="Times New Roman" w:hAnsi="Consolas" w:cs="Times New Roman"/>
-          <w:sz w:val="24"/>
-          <w:szCs w:val="24"/>
-          <w:lang w:eastAsia="fr-FR"/>
-        </w:rPr>
-        <w:t>null</w:t>
-      </w:r>
-      <w:proofErr w:type="spellEnd"/>
-      <w:r>
-        <w:rPr>
-          <w:rFonts w:ascii="Consolas" w:eastAsia="Times New Roman" w:hAnsi="Consolas" w:cs="Times New Roman"/>
-          <w:sz w:val="24"/>
-          <w:szCs w:val="24"/>
-          <w:lang w:eastAsia="fr-FR"/>
-        </w:rPr>
-        <w:t xml:space="preserve">    float64</w:t>
-      </w:r>
-    </w:p>
-    <w:p>
-      <w:pPr>
-        <w:spacing w:after="0" w:line="240" w:lineRule="auto"/>
-        <w:rPr>
-          <w:rFonts w:ascii="Consolas" w:eastAsia="Times New Roman" w:hAnsi="Consolas" w:cs="Times New Roman"/>
-          <w:sz w:val="24"/>
-          <w:szCs w:val="24"/>
-          <w:lang w:eastAsia="fr-FR"/>
-        </w:rPr>
-      </w:pPr>
-      <w:r>
-        <w:rPr>
-          <w:rFonts w:ascii="Consolas" w:eastAsia="Times New Roman" w:hAnsi="Consolas" w:cs="Times New Roman"/>
-          <w:sz w:val="24"/>
-          <w:szCs w:val="24"/>
-          <w:lang w:eastAsia="fr-FR"/>
-        </w:rPr>
-        <w:t xml:space="preserve"> 6   </w:t>
-      </w:r>
-      <w:proofErr w:type="gramStart"/>
-      <w:r>
-        <w:rPr>
-          <w:rFonts w:ascii="Consolas" w:eastAsia="Times New Roman" w:hAnsi="Consolas" w:cs="Times New Roman"/>
-          <w:sz w:val="24"/>
-          <w:szCs w:val="24"/>
-          <w:lang w:eastAsia="fr-FR"/>
-        </w:rPr>
-        <w:t>pression</w:t>
-      </w:r>
-      <w:proofErr w:type="gramEnd"/>
-      <w:r>
-        <w:rPr>
-          <w:rFonts w:ascii="Consolas" w:eastAsia="Times New Roman" w:hAnsi="Consolas" w:cs="Times New Roman"/>
-          <w:sz w:val="24"/>
-          <w:szCs w:val="24"/>
-          <w:lang w:eastAsia="fr-FR"/>
-        </w:rPr>
-        <w:t xml:space="preserve">      591 non-</w:t>
-      </w:r>
-      <w:proofErr w:type="spellStart"/>
-      <w:r>
-        <w:rPr>
-          <w:rFonts w:ascii="Consolas" w:eastAsia="Times New Roman" w:hAnsi="Consolas" w:cs="Times New Roman"/>
-          <w:sz w:val="24"/>
-          <w:szCs w:val="24"/>
-          <w:lang w:eastAsia="fr-FR"/>
-        </w:rPr>
-        <w:t>null</w:t>
-      </w:r>
-      <w:proofErr w:type="spellEnd"/>
-      <w:r>
-        <w:rPr>
-          <w:rFonts w:ascii="Consolas" w:eastAsia="Times New Roman" w:hAnsi="Consolas" w:cs="Times New Roman"/>
-          <w:sz w:val="24"/>
-          <w:szCs w:val="24"/>
-          <w:lang w:eastAsia="fr-FR"/>
-        </w:rPr>
-        <w:t xml:space="preserve">    float64</w:t>
-      </w:r>
-    </w:p>
-    <w:p>
-      <w:pPr>
-        <w:spacing w:after="0" w:line="240" w:lineRule="auto"/>
-        <w:rPr>
-          <w:rFonts w:ascii="Consolas" w:eastAsia="Times New Roman" w:hAnsi="Consolas" w:cs="Times New Roman"/>
-          <w:sz w:val="24"/>
-          <w:szCs w:val="24"/>
-          <w:lang w:eastAsia="fr-FR"/>
-        </w:rPr>
-      </w:pPr>
-      <w:r>
-        <w:rPr>
-          <w:rFonts w:ascii="Consolas" w:eastAsia="Times New Roman" w:hAnsi="Consolas" w:cs="Times New Roman"/>
-          <w:sz w:val="24"/>
-          <w:szCs w:val="24"/>
-          <w:lang w:eastAsia="fr-FR"/>
-        </w:rPr>
-        <w:t xml:space="preserve"> 7   </w:t>
-      </w:r>
-      <w:proofErr w:type="gramStart"/>
-      <w:r>
-        <w:rPr>
-          <w:rFonts w:ascii="Consolas" w:eastAsia="Times New Roman" w:hAnsi="Consolas" w:cs="Times New Roman"/>
-          <w:sz w:val="24"/>
-          <w:szCs w:val="24"/>
-          <w:lang w:eastAsia="fr-FR"/>
-        </w:rPr>
-        <w:t>consommation  591</w:t>
-      </w:r>
-      <w:proofErr w:type="gramEnd"/>
-      <w:r>
-        <w:rPr>
-          <w:rFonts w:ascii="Consolas" w:eastAsia="Times New Roman" w:hAnsi="Consolas" w:cs="Times New Roman"/>
-          <w:sz w:val="24"/>
-          <w:szCs w:val="24"/>
-          <w:lang w:eastAsia="fr-FR"/>
-        </w:rPr>
-        <w:t xml:space="preserve"> non-</w:t>
-      </w:r>
-      <w:proofErr w:type="spellStart"/>
-      <w:r>
-        <w:rPr>
-          <w:rFonts w:ascii="Consolas" w:eastAsia="Times New Roman" w:hAnsi="Consolas" w:cs="Times New Roman"/>
-          <w:sz w:val="24"/>
-          <w:szCs w:val="24"/>
-          <w:lang w:eastAsia="fr-FR"/>
-        </w:rPr>
-        <w:t>null</w:t>
-      </w:r>
-      <w:proofErr w:type="spellEnd"/>
-      <w:r>
-        <w:rPr>
-          <w:rFonts w:ascii="Consolas" w:eastAsia="Times New Roman" w:hAnsi="Consolas" w:cs="Times New Roman"/>
-          <w:sz w:val="24"/>
-          <w:szCs w:val="24"/>
-          <w:lang w:eastAsia="fr-FR"/>
-        </w:rPr>
-        <w:t xml:space="preserve">    float64</w:t>
-      </w:r>
-    </w:p>
-    <w:p>
-      <w:pPr>
-        <w:spacing w:after="0" w:line="240" w:lineRule="auto"/>
-        <w:rPr>
-          <w:rFonts w:ascii="Consolas" w:eastAsia="Times New Roman" w:hAnsi="Consolas" w:cs="Times New Roman"/>
-          <w:sz w:val="24"/>
-          <w:szCs w:val="24"/>
-          <w:lang w:eastAsia="fr-FR"/>
-        </w:rPr>
-      </w:pPr>
-      <w:r>
-        <w:rPr>
-          <w:rFonts w:ascii="Consolas" w:eastAsia="Times New Roman" w:hAnsi="Consolas" w:cs="Times New Roman"/>
-          <w:sz w:val="24"/>
-          <w:szCs w:val="24"/>
-          <w:lang w:eastAsia="fr-FR"/>
-        </w:rPr>
-        <w:t xml:space="preserve"> 8   </w:t>
-      </w:r>
-      <w:proofErr w:type="spellStart"/>
-      <w:r>
-        <w:rPr>
-          <w:rFonts w:ascii="Consolas" w:eastAsia="Times New Roman" w:hAnsi="Consolas" w:cs="Times New Roman"/>
-          <w:sz w:val="24"/>
-          <w:szCs w:val="24"/>
-          <w:lang w:eastAsia="fr-FR"/>
-        </w:rPr>
-        <w:t>etat</w:t>
-      </w:r>
-      <w:proofErr w:type="spellEnd"/>
-      <w:r>
-        <w:rPr>
-          <w:rFonts w:ascii="Consolas" w:eastAsia="Times New Roman" w:hAnsi="Consolas" w:cs="Times New Roman"/>
-          <w:sz w:val="24"/>
-          <w:szCs w:val="24"/>
-          <w:lang w:eastAsia="fr-FR"/>
-        </w:rPr>
-        <w:t xml:space="preserve">          596 non-</w:t>
-      </w:r>
-      <w:proofErr w:type="spellStart"/>
-      <w:r>
-        <w:rPr>
-          <w:rFonts w:ascii="Consolas" w:eastAsia="Times New Roman" w:hAnsi="Consolas" w:cs="Times New Roman"/>
-          <w:sz w:val="24"/>
-          <w:szCs w:val="24"/>
-          <w:lang w:eastAsia="fr-FR"/>
-        </w:rPr>
-        <w:t>null</w:t>
-      </w:r>
-      <w:proofErr w:type="spellEnd"/>
-      <w:r>
-        <w:rPr>
-          <w:rFonts w:ascii="Consolas" w:eastAsia="Times New Roman" w:hAnsi="Consolas" w:cs="Times New Roman"/>
-          <w:sz w:val="24"/>
-          <w:szCs w:val="24"/>
-          <w:lang w:eastAsia="fr-FR"/>
-        </w:rPr>
-        <w:t xml:space="preserve">    </w:t>
-      </w:r>
-      <w:proofErr w:type="spellStart"/>
-      <w:r>
-        <w:rPr>
-          <w:rFonts w:ascii="Consolas" w:eastAsia="Times New Roman" w:hAnsi="Consolas" w:cs="Times New Roman"/>
-          <w:sz w:val="24"/>
-          <w:szCs w:val="24"/>
-          <w:lang w:eastAsia="fr-FR"/>
-        </w:rPr>
-        <w:t>str</w:t>
-      </w:r>
-      <w:proofErr w:type="spellEnd"/>
-      <w:r>
-        <w:rPr>
-          <w:rFonts w:ascii="Consolas" w:eastAsia="Times New Roman" w:hAnsi="Consolas" w:cs="Times New Roman"/>
-          <w:sz w:val="24"/>
-          <w:szCs w:val="24"/>
-          <w:lang w:eastAsia="fr-FR"/>
-        </w:rPr>
-        <w:t xml:space="preserve">    </w:t>
-      </w:r>
-    </w:p>
-    <w:p>
-      <w:pPr>
-        <w:spacing w:after="0" w:line="240" w:lineRule="auto"/>
-        <w:rPr>
-          <w:rFonts w:ascii="Consolas" w:eastAsia="Times New Roman" w:hAnsi="Consolas" w:cs="Times New Roman"/>
-          <w:sz w:val="24"/>
-          <w:szCs w:val="24"/>
-          <w:lang w:val="en-US" w:eastAsia="fr-FR"/>
-        </w:rPr>
-      </w:pPr>
-      <w:proofErr w:type="spellStart"/>
-      <w:r>
-        <w:rPr>
-          <w:rFonts w:ascii="Consolas" w:eastAsia="Times New Roman" w:hAnsi="Consolas" w:cs="Times New Roman"/>
-          <w:sz w:val="24"/>
-          <w:szCs w:val="24"/>
-          <w:lang w:val="en-US" w:eastAsia="fr-FR"/>
-        </w:rPr>
-        <w:t>dtypes</w:t>
-      </w:r>
-      <w:proofErr w:type="spellEnd"/>
-      <w:r>
-        <w:rPr>
-          <w:rFonts w:ascii="Consolas" w:eastAsia="Times New Roman" w:hAnsi="Consolas" w:cs="Times New Roman"/>
-          <w:sz w:val="24"/>
-          <w:szCs w:val="24"/>
-          <w:lang w:val="en-US" w:eastAsia="fr-FR"/>
-        </w:rPr>
-        <w:t xml:space="preserve">: float64(4), </w:t>
-      </w:r>
-      <w:proofErr w:type="gramStart"/>
-      <w:r>
-        <w:rPr>
-          <w:rFonts w:ascii="Consolas" w:eastAsia="Times New Roman" w:hAnsi="Consolas" w:cs="Times New Roman"/>
-          <w:sz w:val="24"/>
-          <w:szCs w:val="24"/>
-          <w:lang w:val="en-US" w:eastAsia="fr-FR"/>
-        </w:rPr>
-        <w:t>str(</w:t>
-      </w:r>
-      <w:proofErr w:type="gramEnd"/>
-      <w:r>
-        <w:rPr>
-          <w:rFonts w:ascii="Consolas" w:eastAsia="Times New Roman" w:hAnsi="Consolas" w:cs="Times New Roman"/>
-          <w:sz w:val="24"/>
-          <w:szCs w:val="24"/>
-          <w:lang w:val="en-US" w:eastAsia="fr-FR"/>
-        </w:rPr>
-        <w:t>5)</w:t>
+        <w:t>: float64(4), str(5)</w:t>
       </w:r>
     </w:p>
     <w:p>
@@ -10437,6 +9816,7 @@
         <w:rPr>
           <w:rStyle w:val="CodeHTML"/>
           <w:rFonts w:ascii="Times New Roman" w:hAnsi="Times New Roman" w:cs="Times New Roman"/>
+          <w:noProof/>
           <w:sz w:val="24"/>
           <w:szCs w:val="24"/>
         </w:rPr>
@@ -10491,6 +9871,7 @@
         <w:rPr>
           <w:rStyle w:val="CodeHTML"/>
           <w:rFonts w:ascii="Times New Roman" w:hAnsi="Times New Roman" w:cs="Times New Roman"/>
+          <w:noProof/>
           <w:sz w:val="24"/>
           <w:szCs w:val="24"/>
         </w:rPr>
@@ -10665,16 +10046,7 @@
           <w:sz w:val="24"/>
           <w:szCs w:val="24"/>
         </w:rPr>
-        <w:t>ression</w:t>
-      </w:r>
-      <w:r>
-        <w:rPr>
-          <w:rStyle w:val="CodeHTML"/>
-          <w:rFonts w:ascii="Times New Roman" w:hAnsi="Times New Roman" w:cs="Times New Roman"/>
-          <w:sz w:val="24"/>
-          <w:szCs w:val="24"/>
-        </w:rPr>
-        <w:t>, consommation énergétique, et un horodatage.</w:t>
+        <w:t>ression, consommation énergétique, et un horodatage.</w:t>
       </w:r>
     </w:p>
     <w:p>
@@ -10991,7 +10363,7 @@
           <w:sz w:val="28"/>
           <w:szCs w:val="28"/>
         </w:rPr>
-        <w:t>Ré</w:t>
+        <w:t>Résultat</w:t>
       </w:r>
       <w:r>
         <w:rPr>
@@ -10999,29 +10371,22 @@
           <w:sz w:val="28"/>
           <w:szCs w:val="28"/>
         </w:rPr>
-        <w:t>sultat</w:t>
-      </w:r>
-      <w:r>
+        <w:t>s :</w:t>
+      </w:r>
+    </w:p>
+    <w:p>
+      <w:pPr>
+        <w:pStyle w:val="NormalWeb"/>
         <w:rPr>
           <w:rStyle w:val="lev"/>
           <w:sz w:val="28"/>
           <w:szCs w:val="28"/>
         </w:rPr>
-        <w:t>s :</w:t>
-      </w:r>
-    </w:p>
-    <w:p>
-      <w:pPr>
-        <w:pStyle w:val="NormalWeb"/>
+      </w:pPr>
+      <w:r>
         <w:rPr>
           <w:rStyle w:val="lev"/>
-          <w:sz w:val="28"/>
-          <w:szCs w:val="28"/>
-        </w:rPr>
-      </w:pPr>
-      <w:r>
-        <w:rPr>
-          <w:rStyle w:val="lev"/>
+          <w:noProof/>
           <w:sz w:val="28"/>
           <w:szCs w:val="28"/>
         </w:rPr>
@@ -11073,6 +10438,7 @@
       </w:pPr>
       <w:r>
         <w:rPr>
+          <w:noProof/>
           <w:sz w:val="28"/>
           <w:szCs w:val="28"/>
         </w:rPr>
@@ -11128,6 +10494,7 @@
         <w:rPr>
           <w:rStyle w:val="CodeHTML"/>
           <w:rFonts w:ascii="Times New Roman" w:hAnsi="Times New Roman" w:cs="Times New Roman"/>
+          <w:noProof/>
           <w:sz w:val="24"/>
           <w:szCs w:val="24"/>
         </w:rPr>
@@ -13040,6 +12407,9 @@
         <w:pStyle w:val="NormalWeb"/>
       </w:pPr>
       <w:r>
+        <w:rPr>
+          <w:noProof/>
+        </w:rPr>
         <w:drawing>
           <wp:inline distT="0" distB="0" distL="0" distR="0" wp14:anchorId="73E76566" wp14:editId="0F29DD6A">
             <wp:extent cx="5169166" cy="4210266"/>
@@ -13451,31 +12821,24 @@
           <w:szCs w:val="28"/>
         </w:rPr>
         <w:lastRenderedPageBreak/>
-        <w:t>Ré</w:t>
-      </w:r>
-      <w:r>
-        <w:rPr>
-          <w:rStyle w:val="lev"/>
+        <w:t>Résultats :</w:t>
+      </w:r>
+    </w:p>
+    <w:p>
+      <w:pPr>
+        <w:pStyle w:val="NormalWeb"/>
+        <w:rPr>
+          <w:rStyle w:val="CodeHTML"/>
+          <w:rFonts w:ascii="Times New Roman" w:hAnsi="Times New Roman" w:cs="Times New Roman"/>
           <w:sz w:val="28"/>
           <w:szCs w:val="28"/>
         </w:rPr>
-        <w:t>sultats :</w:t>
-      </w:r>
-    </w:p>
-    <w:p>
-      <w:pPr>
-        <w:pStyle w:val="NormalWeb"/>
-        <w:rPr>
-          <w:rStyle w:val="CodeHTML"/>
-          <w:rFonts w:ascii="Times New Roman" w:hAnsi="Times New Roman" w:cs="Times New Roman"/>
-          <w:sz w:val="28"/>
-          <w:szCs w:val="28"/>
-        </w:rPr>
-      </w:pPr>
-      <w:r>
-        <w:rPr>
-          <w:rStyle w:val="CodeHTML"/>
-          <w:rFonts w:ascii="Times New Roman" w:hAnsi="Times New Roman" w:cs="Times New Roman"/>
+      </w:pPr>
+      <w:r>
+        <w:rPr>
+          <w:rStyle w:val="CodeHTML"/>
+          <w:rFonts w:ascii="Times New Roman" w:hAnsi="Times New Roman" w:cs="Times New Roman"/>
+          <w:noProof/>
           <w:sz w:val="28"/>
           <w:szCs w:val="28"/>
         </w:rPr>
@@ -13530,6 +12893,7 @@
         <w:rPr>
           <w:rStyle w:val="CodeHTML"/>
           <w:rFonts w:ascii="Times New Roman" w:hAnsi="Times New Roman" w:cs="Times New Roman"/>
+          <w:noProof/>
           <w:sz w:val="28"/>
           <w:szCs w:val="28"/>
         </w:rPr>
@@ -13584,6 +12948,7 @@
         <w:rPr>
           <w:rStyle w:val="CodeHTML"/>
           <w:rFonts w:ascii="Times New Roman" w:hAnsi="Times New Roman" w:cs="Times New Roman"/>
+          <w:noProof/>
           <w:sz w:val="28"/>
           <w:szCs w:val="28"/>
         </w:rPr>
@@ -13639,6 +13004,7 @@
         <w:rPr>
           <w:rStyle w:val="CodeHTML"/>
           <w:rFonts w:ascii="Times New Roman" w:hAnsi="Times New Roman" w:cs="Times New Roman"/>
+          <w:noProof/>
           <w:sz w:val="28"/>
           <w:szCs w:val="28"/>
         </w:rPr>
@@ -13694,6 +13060,7 @@
         <w:rPr>
           <w:rStyle w:val="CodeHTML"/>
           <w:rFonts w:ascii="Times New Roman" w:hAnsi="Times New Roman" w:cs="Times New Roman"/>
+          <w:noProof/>
           <w:sz w:val="28"/>
           <w:szCs w:val="28"/>
         </w:rPr>
@@ -13748,6 +13115,7 @@
         <w:rPr>
           <w:rStyle w:val="CodeHTML"/>
           <w:rFonts w:ascii="Times New Roman" w:hAnsi="Times New Roman" w:cs="Times New Roman"/>
+          <w:noProof/>
           <w:sz w:val="28"/>
           <w:szCs w:val="28"/>
         </w:rPr>
@@ -13803,6 +13171,7 @@
         <w:rPr>
           <w:rStyle w:val="CodeHTML"/>
           <w:rFonts w:ascii="Times New Roman" w:hAnsi="Times New Roman" w:cs="Times New Roman"/>
+          <w:noProof/>
           <w:sz w:val="28"/>
           <w:szCs w:val="28"/>
         </w:rPr>
@@ -13857,6 +13226,7 @@
         <w:rPr>
           <w:rStyle w:val="CodeHTML"/>
           <w:rFonts w:ascii="Times New Roman" w:hAnsi="Times New Roman" w:cs="Times New Roman"/>
+          <w:noProof/>
           <w:sz w:val="28"/>
           <w:szCs w:val="28"/>
         </w:rPr>
@@ -13912,6 +13282,7 @@
         <w:rPr>
           <w:rStyle w:val="CodeHTML"/>
           <w:rFonts w:ascii="Times New Roman" w:hAnsi="Times New Roman" w:cs="Times New Roman"/>
+          <w:noProof/>
           <w:sz w:val="28"/>
           <w:szCs w:val="28"/>
         </w:rPr>
@@ -13966,6 +13337,7 @@
         <w:rPr>
           <w:rStyle w:val="CodeHTML"/>
           <w:rFonts w:ascii="Times New Roman" w:hAnsi="Times New Roman" w:cs="Times New Roman"/>
+          <w:noProof/>
           <w:sz w:val="28"/>
           <w:szCs w:val="28"/>
         </w:rPr>
@@ -14319,7 +13691,7 @@
           <w:sz w:val="28"/>
           <w:szCs w:val="28"/>
         </w:rPr>
-        <w:t>Ré</w:t>
+        <w:t>Résultats</w:t>
       </w:r>
       <w:r>
         <w:rPr>
@@ -14327,29 +13699,22 @@
           <w:sz w:val="28"/>
           <w:szCs w:val="28"/>
         </w:rPr>
-        <w:t>sultats</w:t>
-      </w:r>
-      <w:r>
+        <w:t> :</w:t>
+      </w:r>
+    </w:p>
+    <w:p>
+      <w:pPr>
+        <w:pStyle w:val="NormalWeb"/>
         <w:rPr>
           <w:rStyle w:val="lev"/>
           <w:sz w:val="28"/>
           <w:szCs w:val="28"/>
         </w:rPr>
-        <w:t> :</w:t>
-      </w:r>
-    </w:p>
-    <w:p>
-      <w:pPr>
-        <w:pStyle w:val="NormalWeb"/>
+      </w:pPr>
+      <w:r>
         <w:rPr>
           <w:rStyle w:val="lev"/>
-          <w:sz w:val="28"/>
-          <w:szCs w:val="28"/>
-        </w:rPr>
-      </w:pPr>
-      <w:r>
-        <w:rPr>
-          <w:rStyle w:val="lev"/>
+          <w:noProof/>
           <w:sz w:val="28"/>
           <w:szCs w:val="28"/>
         </w:rPr>
@@ -14403,6 +13768,7 @@
       <w:r>
         <w:rPr>
           <w:rStyle w:val="lev"/>
+          <w:noProof/>
           <w:sz w:val="28"/>
           <w:szCs w:val="28"/>
         </w:rPr>
@@ -14455,6 +13821,7 @@
       <w:r>
         <w:rPr>
           <w:rStyle w:val="lev"/>
+          <w:noProof/>
           <w:sz w:val="28"/>
           <w:szCs w:val="28"/>
         </w:rPr>
@@ -14508,6 +13875,7 @@
       <w:r>
         <w:rPr>
           <w:rStyle w:val="lev"/>
+          <w:noProof/>
           <w:sz w:val="28"/>
           <w:szCs w:val="28"/>
         </w:rPr>
@@ -14562,6 +13930,7 @@
         <w:rPr>
           <w:rStyle w:val="CodeHTML"/>
           <w:rFonts w:ascii="Times New Roman" w:hAnsi="Times New Roman" w:cs="Times New Roman"/>
+          <w:noProof/>
           <w:sz w:val="28"/>
           <w:szCs w:val="28"/>
         </w:rPr>
@@ -14617,6 +13986,7 @@
         <w:rPr>
           <w:rStyle w:val="CodeHTML"/>
           <w:rFonts w:ascii="Times New Roman" w:hAnsi="Times New Roman" w:cs="Times New Roman"/>
+          <w:noProof/>
           <w:sz w:val="28"/>
           <w:szCs w:val="28"/>
         </w:rPr>
@@ -14671,6 +14041,7 @@
         <w:rPr>
           <w:rStyle w:val="CodeHTML"/>
           <w:rFonts w:ascii="Times New Roman" w:hAnsi="Times New Roman" w:cs="Times New Roman"/>
+          <w:noProof/>
           <w:sz w:val="28"/>
           <w:szCs w:val="28"/>
         </w:rPr>
@@ -14711,6 +14082,299 @@
           </wp:inline>
         </w:drawing>
       </w:r>
+    </w:p>
+    <w:p>
+      <w:pPr>
+        <w:pStyle w:val="NormalWeb"/>
+        <w:rPr>
+          <w:rStyle w:val="CodeHTML"/>
+          <w:rFonts w:ascii="Times New Roman" w:hAnsi="Times New Roman" w:cs="Times New Roman"/>
+          <w:sz w:val="28"/>
+          <w:szCs w:val="28"/>
+        </w:rPr>
+      </w:pPr>
+    </w:p>
+    <w:p>
+      <w:pPr>
+        <w:rPr>
+          <w:rFonts w:ascii="Times New Roman" w:hAnsi="Times New Roman" w:cs="Times New Roman"/>
+          <w:sz w:val="36"/>
+          <w:szCs w:val="36"/>
+        </w:rPr>
+      </w:pPr>
+      <w:r>
+        <w:rPr>
+          <w:rFonts w:ascii="Times New Roman" w:hAnsi="Times New Roman" w:cs="Times New Roman"/>
+          <w:sz w:val="36"/>
+          <w:szCs w:val="36"/>
+        </w:rPr>
+        <w:t>Partie 7 Prompt Engineering et RAG</w:t>
+      </w:r>
+    </w:p>
+    <w:p>
+      <w:pPr>
+        <w:pStyle w:val="Titre2"/>
+        <w:rPr>
+          <w:sz w:val="28"/>
+          <w:szCs w:val="28"/>
+        </w:rPr>
+      </w:pPr>
+      <w:r>
+        <w:rPr>
+          <w:sz w:val="28"/>
+          <w:szCs w:val="28"/>
+        </w:rPr>
+        <w:t>1) Choix du document</w:t>
+      </w:r>
+    </w:p>
+    <w:p>
+      <w:pPr>
+        <w:pStyle w:val="NormalWeb"/>
+      </w:pPr>
+      <w:r>
+        <w:t>Choisis un document que le LLM ne connaît probablement pas par cœur (rapport interne, cours récent, article spécialisé peu connu) et repère une question précise dont la réponse s'y trouve. Note ici lequel :</w:t>
+      </w:r>
+    </w:p>
+    <w:p>
+      <w:pPr>
+        <w:pStyle w:val="NormalWeb"/>
+      </w:pPr>
+      <w:r>
+        <w:t xml:space="preserve">Document utilisé : </w:t>
+      </w:r>
+      <w:r>
+        <w:rPr>
+          <w:rStyle w:val="Accentuation"/>
+        </w:rPr>
+        <w:t xml:space="preserve">Mémoire de </w:t>
+      </w:r>
+      <w:r>
+        <w:rPr>
+          <w:rStyle w:val="Accentuation"/>
+        </w:rPr>
+        <w:t>ABBEY ADJOVI MATIALE</w:t>
+      </w:r>
+      <w:r>
+        <w:rPr>
+          <w:rStyle w:val="Accentuation"/>
+        </w:rPr>
+        <w:t xml:space="preserve"> comparer de deux version de </w:t>
+      </w:r>
+      <w:proofErr w:type="spellStart"/>
+      <w:r>
+        <w:rPr>
+          <w:rStyle w:val="Accentuation"/>
+        </w:rPr>
+        <w:t>yolo</w:t>
+      </w:r>
+      <w:proofErr w:type="spellEnd"/>
+      <w:r>
+        <w:rPr>
+          <w:rStyle w:val="Accentuation"/>
+        </w:rPr>
+        <w:t xml:space="preserve"> pour la détection d’objet </w:t>
+      </w:r>
+    </w:p>
+    <w:p>
+      <w:pPr>
+        <w:pStyle w:val="Titre2"/>
+        <w:rPr>
+          <w:sz w:val="28"/>
+          <w:szCs w:val="28"/>
+        </w:rPr>
+      </w:pPr>
+      <w:r>
+        <w:rPr>
+          <w:sz w:val="28"/>
+          <w:szCs w:val="28"/>
+        </w:rPr>
+        <w:t>2) Les trois prompts</w:t>
+      </w:r>
+    </w:p>
+    <w:p>
+      <w:pPr>
+        <w:rPr>
+          <w:rFonts w:ascii="Times New Roman" w:hAnsi="Times New Roman" w:cs="Times New Roman"/>
+          <w:b/>
+          <w:bCs/>
+          <w:sz w:val="24"/>
+          <w:szCs w:val="24"/>
+        </w:rPr>
+      </w:pPr>
+      <w:r>
+        <w:rPr>
+          <w:rFonts w:ascii="Times New Roman" w:hAnsi="Times New Roman" w:cs="Times New Roman"/>
+          <w:b/>
+          <w:bCs/>
+          <w:sz w:val="24"/>
+          <w:szCs w:val="24"/>
+        </w:rPr>
+        <w:t xml:space="preserve">Prompt A </w:t>
+      </w:r>
+      <w:r>
+        <w:rPr>
+          <w:rFonts w:ascii="Times New Roman" w:hAnsi="Times New Roman" w:cs="Times New Roman"/>
+          <w:b/>
+          <w:bCs/>
+          <w:sz w:val="24"/>
+          <w:szCs w:val="24"/>
+        </w:rPr>
+        <w:t>sans</w:t>
+      </w:r>
+      <w:r>
+        <w:rPr>
+          <w:rFonts w:ascii="Times New Roman" w:hAnsi="Times New Roman" w:cs="Times New Roman"/>
+          <w:b/>
+          <w:bCs/>
+          <w:sz w:val="24"/>
+          <w:szCs w:val="24"/>
+        </w:rPr>
+        <w:t xml:space="preserve"> document</w:t>
+      </w:r>
+    </w:p>
+    <w:p>
+      <w:pPr>
+        <w:pStyle w:val="PrformatHTML"/>
+        <w:rPr>
+          <w:rFonts w:ascii="Times New Roman" w:hAnsi="Times New Roman" w:cs="Times New Roman"/>
+          <w:sz w:val="24"/>
+          <w:szCs w:val="24"/>
+        </w:rPr>
+      </w:pPr>
+      <w:r>
+        <w:rPr>
+          <w:rFonts w:ascii="Times New Roman" w:hAnsi="Times New Roman" w:cs="Times New Roman"/>
+          <w:sz w:val="24"/>
+          <w:szCs w:val="24"/>
+        </w:rPr>
+        <w:t xml:space="preserve">Dans le mémoire "Détection de visages par YoloV8 et YoloV5" (Abbey </w:t>
+      </w:r>
+      <w:proofErr w:type="spellStart"/>
+      <w:r>
+        <w:rPr>
+          <w:rFonts w:ascii="Times New Roman" w:hAnsi="Times New Roman" w:cs="Times New Roman"/>
+          <w:sz w:val="24"/>
+          <w:szCs w:val="24"/>
+        </w:rPr>
+        <w:t>Adjovi</w:t>
+      </w:r>
+      <w:proofErr w:type="spellEnd"/>
+      <w:r>
+        <w:rPr>
+          <w:rFonts w:ascii="Times New Roman" w:hAnsi="Times New Roman" w:cs="Times New Roman"/>
+          <w:sz w:val="24"/>
+          <w:szCs w:val="24"/>
+        </w:rPr>
+        <w:t xml:space="preserve"> </w:t>
+      </w:r>
+      <w:proofErr w:type="spellStart"/>
+      <w:r>
+        <w:rPr>
+          <w:rFonts w:ascii="Times New Roman" w:hAnsi="Times New Roman" w:cs="Times New Roman"/>
+          <w:sz w:val="24"/>
+          <w:szCs w:val="24"/>
+        </w:rPr>
+        <w:t>Matiale</w:t>
+      </w:r>
+      <w:proofErr w:type="spellEnd"/>
+      <w:r>
+        <w:rPr>
+          <w:rFonts w:ascii="Times New Roman" w:hAnsi="Times New Roman" w:cs="Times New Roman"/>
+          <w:sz w:val="24"/>
+          <w:szCs w:val="24"/>
+        </w:rPr>
+        <w:t xml:space="preserve">, UQTR, janvier 2025), quelles sont les valeurs de mAP@0.5 et mAP@0.5:0.95 obtenues par </w:t>
+      </w:r>
+      <w:r>
+        <w:rPr>
+          <w:rFonts w:ascii="Times New Roman" w:hAnsi="Times New Roman" w:cs="Times New Roman"/>
+          <w:sz w:val="24"/>
+          <w:szCs w:val="24"/>
+        </w:rPr>
+        <w:lastRenderedPageBreak/>
+        <w:t>YoloV5 et par YoloV8 sur la tâche de détection de visage, et lequel des deux modèles est le plus performant selon ces métriques ?</w:t>
+      </w:r>
+    </w:p>
+    <w:p>
+      <w:pPr>
+        <w:pStyle w:val="NormalWeb"/>
+        <w:rPr>
+          <w:rStyle w:val="lev"/>
+          <w:rFonts w:eastAsiaTheme="majorEastAsia"/>
+          <w:sz w:val="28"/>
+          <w:szCs w:val="28"/>
+        </w:rPr>
+      </w:pPr>
+      <w:r>
+        <w:rPr>
+          <w:rStyle w:val="lev"/>
+          <w:rFonts w:eastAsiaTheme="majorEastAsia"/>
+          <w:sz w:val="28"/>
+          <w:szCs w:val="28"/>
+        </w:rPr>
+        <w:t>Résultats :</w:t>
+      </w:r>
+    </w:p>
+    <w:p>
+      <w:pPr>
+        <w:pStyle w:val="NormalWeb"/>
+        <w:rPr>
+          <w:sz w:val="28"/>
+          <w:szCs w:val="28"/>
+        </w:rPr>
+      </w:pPr>
+      <w:r>
+        <w:rPr>
+          <w:sz w:val="28"/>
+          <w:szCs w:val="28"/>
+        </w:rPr>
+        <w:drawing>
+          <wp:inline distT="0" distB="0" distL="0" distR="0" wp14:anchorId="6010FE4B" wp14:editId="06F876B7">
+            <wp:extent cx="5581937" cy="3905451"/>
+            <wp:effectExtent l="0" t="0" r="0" b="0"/>
+            <wp:docPr id="45" name="Image 45"/>
+            <wp:cNvGraphicFramePr>
+              <a:graphicFrameLocks xmlns:a="http://schemas.openxmlformats.org/drawingml/2006/main" noChangeAspect="1"/>
+            </wp:cNvGraphicFramePr>
+            <a:graphic xmlns:a="http://schemas.openxmlformats.org/drawingml/2006/main">
+              <a:graphicData uri="http://schemas.openxmlformats.org/drawingml/2006/picture">
+                <pic:pic xmlns:pic="http://schemas.openxmlformats.org/drawingml/2006/picture">
+                  <pic:nvPicPr>
+                    <pic:cNvPr id="1" name=""/>
+                    <pic:cNvPicPr/>
+                  </pic:nvPicPr>
+                  <pic:blipFill>
+                    <a:blip r:embed="rId49"/>
+                    <a:stretch>
+                      <a:fillRect/>
+                    </a:stretch>
+                  </pic:blipFill>
+                  <pic:spPr>
+                    <a:xfrm>
+                      <a:off x="0" y="0"/>
+                      <a:ext cx="5581937" cy="3905451"/>
+                    </a:xfrm>
+                    <a:prstGeom prst="rect">
+                      <a:avLst/>
+                    </a:prstGeom>
+                  </pic:spPr>
+                </pic:pic>
+              </a:graphicData>
+            </a:graphic>
+          </wp:inline>
+        </w:drawing>
+      </w:r>
+    </w:p>
+    <w:p>
+      <w:pPr>
+        <w:pStyle w:val="NormalWeb"/>
+        <w:rPr>
+          <w:rStyle w:val="CodeHTML"/>
+          <w:rFonts w:ascii="Times New Roman" w:hAnsi="Times New Roman" w:cs="Times New Roman"/>
+          <w:sz w:val="28"/>
+          <w:szCs w:val="28"/>
+        </w:rPr>
+      </w:pPr>
     </w:p>
     <w:sectPr>
       <w:pgSz w:w="11906" w:h="16838"/>
@@ -16871,6 +16535,7 @@
     <w:lsdException w:name="HTML Sample" w:semiHidden="1" w:unhideWhenUsed="1"/>
     <w:lsdException w:name="HTML Typewriter" w:semiHidden="1" w:unhideWhenUsed="1"/>
     <w:lsdException w:name="HTML Variable" w:semiHidden="1" w:unhideWhenUsed="1"/>
+    <w:lsdException w:name="Normal Table" w:semiHidden="1" w:unhideWhenUsed="1"/>
     <w:lsdException w:name="annotation subject" w:semiHidden="1" w:unhideWhenUsed="1"/>
     <w:lsdException w:name="No List" w:semiHidden="1" w:unhideWhenUsed="1"/>
     <w:lsdException w:name="Outline List 1" w:semiHidden="1" w:unhideWhenUsed="1"/>
@@ -16913,8 +16578,11 @@
     <w:lsdException w:name="Table Contemporary" w:semiHidden="1" w:unhideWhenUsed="1"/>
     <w:lsdException w:name="Table Elegant" w:semiHidden="1" w:unhideWhenUsed="1"/>
     <w:lsdException w:name="Table Professional" w:semiHidden="1" w:unhideWhenUsed="1"/>
+    <w:lsdException w:name="Table Subtle 1" w:semiHidden="1" w:unhideWhenUsed="1"/>
     <w:lsdException w:name="Table Subtle 2" w:semiHidden="1" w:unhideWhenUsed="1"/>
     <w:lsdException w:name="Table Web 1" w:semiHidden="1" w:unhideWhenUsed="1"/>
+    <w:lsdException w:name="Table Web 2" w:semiHidden="1" w:unhideWhenUsed="1"/>
+    <w:lsdException w:name="Table Web 3" w:semiHidden="1" w:unhideWhenUsed="1"/>
     <w:lsdException w:name="Balloon Text" w:semiHidden="1" w:unhideWhenUsed="1"/>
     <w:lsdException w:name="Table Grid" w:uiPriority="39"/>
     <w:lsdException w:name="Table Theme" w:semiHidden="1" w:unhideWhenUsed="1"/>

</xml_diff>

<commit_message>
Partie 6 question 2 Prompt B
</commit_message>
<xml_diff>
--- a/ai-business_assistant.docx
+++ b/ai-business_assistant.docx
@@ -1561,7 +1561,27 @@
           <w:sz w:val="24"/>
           <w:szCs w:val="24"/>
         </w:rPr>
-        <w:t>Commentaire : "Le produit est arrivé cassé et le support ne répond pas."</w:t>
+        <w:t xml:space="preserve">Commentaire : "Le produit est arrivé </w:t>
+      </w:r>
+      <w:proofErr w:type="gramStart"/>
+      <w:r>
+        <w:rPr>
+          <w:rStyle w:val="CodeHTML"/>
+          <w:rFonts w:ascii="Times New Roman" w:eastAsiaTheme="minorHAnsi" w:hAnsi="Times New Roman" w:cs="Times New Roman"/>
+          <w:sz w:val="24"/>
+          <w:szCs w:val="24"/>
+        </w:rPr>
+        <w:t>cassé</w:t>
+      </w:r>
+      <w:proofErr w:type="gramEnd"/>
+      <w:r>
+        <w:rPr>
+          <w:rStyle w:val="CodeHTML"/>
+          <w:rFonts w:ascii="Times New Roman" w:eastAsiaTheme="minorHAnsi" w:hAnsi="Times New Roman" w:cs="Times New Roman"/>
+          <w:sz w:val="24"/>
+          <w:szCs w:val="24"/>
+        </w:rPr>
+        <w:t xml:space="preserve"> et le support ne répond pas."</w:t>
       </w:r>
     </w:p>
     <w:p>
@@ -2036,7 +2056,27 @@
           <w:sz w:val="24"/>
           <w:szCs w:val="24"/>
         </w:rPr>
-        <w:t xml:space="preserve">   (un commentaire mixte penche généralement vers négatif si le problème</w:t>
+        <w:t xml:space="preserve">   (</w:t>
+      </w:r>
+      <w:proofErr w:type="gramStart"/>
+      <w:r>
+        <w:rPr>
+          <w:rStyle w:val="CodeHTML"/>
+          <w:rFonts w:ascii="Times New Roman" w:hAnsi="Times New Roman" w:cs="Times New Roman"/>
+          <w:sz w:val="24"/>
+          <w:szCs w:val="24"/>
+        </w:rPr>
+        <w:t>un</w:t>
+      </w:r>
+      <w:proofErr w:type="gramEnd"/>
+      <w:r>
+        <w:rPr>
+          <w:rStyle w:val="CodeHTML"/>
+          <w:rFonts w:ascii="Times New Roman" w:hAnsi="Times New Roman" w:cs="Times New Roman"/>
+          <w:sz w:val="24"/>
+          <w:szCs w:val="24"/>
+        </w:rPr>
+        <w:t xml:space="preserve"> commentaire mixte penche généralement vers négatif si le problème</w:t>
       </w:r>
     </w:p>
     <w:p>
@@ -2057,7 +2097,27 @@
           <w:sz w:val="24"/>
           <w:szCs w:val="24"/>
         </w:rPr>
-        <w:t xml:space="preserve">   mentionné affecte l'usage du produit).</w:t>
+        <w:t xml:space="preserve">   </w:t>
+      </w:r>
+      <w:proofErr w:type="gramStart"/>
+      <w:r>
+        <w:rPr>
+          <w:rStyle w:val="CodeHTML"/>
+          <w:rFonts w:ascii="Times New Roman" w:hAnsi="Times New Roman" w:cs="Times New Roman"/>
+          <w:sz w:val="24"/>
+          <w:szCs w:val="24"/>
+        </w:rPr>
+        <w:t>mentionné</w:t>
+      </w:r>
+      <w:proofErr w:type="gramEnd"/>
+      <w:r>
+        <w:rPr>
+          <w:rStyle w:val="CodeHTML"/>
+          <w:rFonts w:ascii="Times New Roman" w:hAnsi="Times New Roman" w:cs="Times New Roman"/>
+          <w:sz w:val="24"/>
+          <w:szCs w:val="24"/>
+        </w:rPr>
+        <w:t xml:space="preserve"> affecte l'usage du produit).</w:t>
       </w:r>
     </w:p>
     <w:p>
@@ -2211,14 +2271,25 @@
         <w:t>elements_positifs</w:t>
       </w:r>
       <w:proofErr w:type="spellEnd"/>
-      <w:r>
-        <w:rPr>
-          <w:rStyle w:val="CodeHTML"/>
-          <w:rFonts w:ascii="Times New Roman" w:hAnsi="Times New Roman" w:cs="Times New Roman"/>
-          <w:sz w:val="24"/>
-          <w:szCs w:val="24"/>
-        </w:rPr>
-        <w:t>": [...],</w:t>
+      <w:proofErr w:type="gramStart"/>
+      <w:r>
+        <w:rPr>
+          <w:rStyle w:val="CodeHTML"/>
+          <w:rFonts w:ascii="Times New Roman" w:hAnsi="Times New Roman" w:cs="Times New Roman"/>
+          <w:sz w:val="24"/>
+          <w:szCs w:val="24"/>
+        </w:rPr>
+        <w:t>":</w:t>
+      </w:r>
+      <w:proofErr w:type="gramEnd"/>
+      <w:r>
+        <w:rPr>
+          <w:rStyle w:val="CodeHTML"/>
+          <w:rFonts w:ascii="Times New Roman" w:hAnsi="Times New Roman" w:cs="Times New Roman"/>
+          <w:sz w:val="24"/>
+          <w:szCs w:val="24"/>
+        </w:rPr>
+        <w:t xml:space="preserve"> [...],</w:t>
       </w:r>
     </w:p>
     <w:p>
@@ -2252,14 +2323,25 @@
         <w:t>elements_negatifs</w:t>
       </w:r>
       <w:proofErr w:type="spellEnd"/>
-      <w:r>
-        <w:rPr>
-          <w:rStyle w:val="CodeHTML"/>
-          <w:rFonts w:ascii="Times New Roman" w:hAnsi="Times New Roman" w:cs="Times New Roman"/>
-          <w:sz w:val="24"/>
-          <w:szCs w:val="24"/>
-        </w:rPr>
-        <w:t>": [...],</w:t>
+      <w:proofErr w:type="gramStart"/>
+      <w:r>
+        <w:rPr>
+          <w:rStyle w:val="CodeHTML"/>
+          <w:rFonts w:ascii="Times New Roman" w:hAnsi="Times New Roman" w:cs="Times New Roman"/>
+          <w:sz w:val="24"/>
+          <w:szCs w:val="24"/>
+        </w:rPr>
+        <w:t>":</w:t>
+      </w:r>
+      <w:proofErr w:type="gramEnd"/>
+      <w:r>
+        <w:rPr>
+          <w:rStyle w:val="CodeHTML"/>
+          <w:rFonts w:ascii="Times New Roman" w:hAnsi="Times New Roman" w:cs="Times New Roman"/>
+          <w:sz w:val="24"/>
+          <w:szCs w:val="24"/>
+        </w:rPr>
+        <w:t xml:space="preserve"> [...],</w:t>
       </w:r>
     </w:p>
     <w:p>
@@ -2280,7 +2362,27 @@
           <w:sz w:val="24"/>
           <w:szCs w:val="24"/>
         </w:rPr>
-        <w:t xml:space="preserve">  "classe": "positif | négatif | neutre",</w:t>
+        <w:t xml:space="preserve">  "classe</w:t>
+      </w:r>
+      <w:proofErr w:type="gramStart"/>
+      <w:r>
+        <w:rPr>
+          <w:rStyle w:val="CodeHTML"/>
+          <w:rFonts w:ascii="Times New Roman" w:hAnsi="Times New Roman" w:cs="Times New Roman"/>
+          <w:sz w:val="24"/>
+          <w:szCs w:val="24"/>
+        </w:rPr>
+        <w:t>":</w:t>
+      </w:r>
+      <w:proofErr w:type="gramEnd"/>
+      <w:r>
+        <w:rPr>
+          <w:rStyle w:val="CodeHTML"/>
+          <w:rFonts w:ascii="Times New Roman" w:hAnsi="Times New Roman" w:cs="Times New Roman"/>
+          <w:sz w:val="24"/>
+          <w:szCs w:val="24"/>
+        </w:rPr>
+        <w:t xml:space="preserve"> "positif | négatif | neutre",</w:t>
       </w:r>
     </w:p>
     <w:p>
@@ -2301,7 +2403,27 @@
           <w:sz w:val="24"/>
           <w:szCs w:val="24"/>
         </w:rPr>
-        <w:t xml:space="preserve">  "justification": "..."</w:t>
+        <w:t xml:space="preserve">  "justification</w:t>
+      </w:r>
+      <w:proofErr w:type="gramStart"/>
+      <w:r>
+        <w:rPr>
+          <w:rStyle w:val="CodeHTML"/>
+          <w:rFonts w:ascii="Times New Roman" w:hAnsi="Times New Roman" w:cs="Times New Roman"/>
+          <w:sz w:val="24"/>
+          <w:szCs w:val="24"/>
+        </w:rPr>
+        <w:t>":</w:t>
+      </w:r>
+      <w:proofErr w:type="gramEnd"/>
+      <w:r>
+        <w:rPr>
+          <w:rStyle w:val="CodeHTML"/>
+          <w:rFonts w:ascii="Times New Roman" w:hAnsi="Times New Roman" w:cs="Times New Roman"/>
+          <w:sz w:val="24"/>
+          <w:szCs w:val="24"/>
+        </w:rPr>
+        <w:t xml:space="preserve"> "..."</w:t>
       </w:r>
     </w:p>
     <w:p>
@@ -3160,6 +3282,7 @@
           <w:szCs w:val="24"/>
         </w:rPr>
       </w:pPr>
+      <w:proofErr w:type="gramStart"/>
       <w:r>
         <w:rPr>
           <w:rStyle w:val="CodeHTML"/>
@@ -3167,37 +3290,39 @@
           <w:sz w:val="24"/>
           <w:szCs w:val="24"/>
         </w:rPr>
-        <w:t>pour lundi, mais nous sommes jeudi et je n'ai toujours rien reçu. Le suivi de ma</w:t>
-      </w:r>
-    </w:p>
-    <w:p>
-      <w:pPr>
+        <w:t>pour</w:t>
+      </w:r>
+      <w:proofErr w:type="gramEnd"/>
+      <w:r>
         <w:rPr>
           <w:rStyle w:val="CodeHTML"/>
           <w:rFonts w:ascii="Times New Roman" w:eastAsiaTheme="minorHAnsi" w:hAnsi="Times New Roman" w:cs="Times New Roman"/>
           <w:sz w:val="24"/>
           <w:szCs w:val="24"/>
         </w:rPr>
-      </w:pPr>
-      <w:r>
+        <w:t xml:space="preserve"> lundi, mais nous sommes jeudi et je n'ai toujours rien reçu. Le suivi de ma</w:t>
+      </w:r>
+    </w:p>
+    <w:p>
+      <w:pPr>
         <w:rPr>
           <w:rStyle w:val="CodeHTML"/>
           <w:rFonts w:ascii="Times New Roman" w:eastAsiaTheme="minorHAnsi" w:hAnsi="Times New Roman" w:cs="Times New Roman"/>
           <w:sz w:val="24"/>
           <w:szCs w:val="24"/>
         </w:rPr>
-        <w:t>commande n'a pas été mis à jour depuis lundi. J'ai également contacté le service</w:t>
-      </w:r>
-    </w:p>
-    <w:p>
-      <w:pPr>
+      </w:pPr>
+      <w:proofErr w:type="gramStart"/>
+      <w:r>
         <w:rPr>
           <w:rStyle w:val="CodeHTML"/>
           <w:rFonts w:ascii="Times New Roman" w:eastAsiaTheme="minorHAnsi" w:hAnsi="Times New Roman" w:cs="Times New Roman"/>
           <w:sz w:val="24"/>
           <w:szCs w:val="24"/>
         </w:rPr>
-      </w:pPr>
+        <w:t>commande</w:t>
+      </w:r>
+      <w:proofErr w:type="gramEnd"/>
       <w:r>
         <w:rPr>
           <w:rStyle w:val="CodeHTML"/>
@@ -3205,7 +3330,37 @@
           <w:sz w:val="24"/>
           <w:szCs w:val="24"/>
         </w:rPr>
-        <w:t>client mardi, mais je n'ai reçu aucune réponse jusqu'à présent.</w:t>
+        <w:t xml:space="preserve"> n'a pas été mis à jour depuis lundi. J'ai également contacté le service</w:t>
+      </w:r>
+    </w:p>
+    <w:p>
+      <w:pPr>
+        <w:rPr>
+          <w:rStyle w:val="CodeHTML"/>
+          <w:rFonts w:ascii="Times New Roman" w:eastAsiaTheme="minorHAnsi" w:hAnsi="Times New Roman" w:cs="Times New Roman"/>
+          <w:sz w:val="24"/>
+          <w:szCs w:val="24"/>
+        </w:rPr>
+      </w:pPr>
+      <w:proofErr w:type="gramStart"/>
+      <w:r>
+        <w:rPr>
+          <w:rStyle w:val="CodeHTML"/>
+          <w:rFonts w:ascii="Times New Roman" w:eastAsiaTheme="minorHAnsi" w:hAnsi="Times New Roman" w:cs="Times New Roman"/>
+          <w:sz w:val="24"/>
+          <w:szCs w:val="24"/>
+        </w:rPr>
+        <w:t>client</w:t>
+      </w:r>
+      <w:proofErr w:type="gramEnd"/>
+      <w:r>
+        <w:rPr>
+          <w:rStyle w:val="CodeHTML"/>
+          <w:rFonts w:ascii="Times New Roman" w:eastAsiaTheme="minorHAnsi" w:hAnsi="Times New Roman" w:cs="Times New Roman"/>
+          <w:sz w:val="24"/>
+          <w:szCs w:val="24"/>
+        </w:rPr>
+        <w:t xml:space="preserve"> mardi, mais je n'ai reçu aucune réponse jusqu'à présent.</w:t>
       </w:r>
     </w:p>
     <w:p>
@@ -3805,6 +3960,7 @@
         <w:t>informations_non_justifiees</w:t>
       </w:r>
       <w:proofErr w:type="spellEnd"/>
+      <w:proofErr w:type="gramStart"/>
       <w:r>
         <w:rPr>
           <w:rStyle w:val="CodeHTML"/>
@@ -3812,37 +3968,38 @@
           <w:sz w:val="24"/>
           <w:szCs w:val="24"/>
         </w:rPr>
-        <w:t>": [...],</w:t>
-      </w:r>
-    </w:p>
-    <w:p>
-      <w:pPr>
+        <w:t>":</w:t>
+      </w:r>
+      <w:proofErr w:type="gramEnd"/>
+      <w:r>
         <w:rPr>
           <w:rStyle w:val="CodeHTML"/>
           <w:rFonts w:ascii="Times New Roman" w:eastAsiaTheme="minorHAnsi" w:hAnsi="Times New Roman" w:cs="Times New Roman"/>
           <w:sz w:val="24"/>
           <w:szCs w:val="24"/>
         </w:rPr>
-      </w:pPr>
-      <w:r>
+        <w:t xml:space="preserve"> [...],</w:t>
+      </w:r>
+    </w:p>
+    <w:p>
+      <w:pPr>
         <w:rPr>
           <w:rStyle w:val="CodeHTML"/>
           <w:rFonts w:ascii="Times New Roman" w:eastAsiaTheme="minorHAnsi" w:hAnsi="Times New Roman" w:cs="Times New Roman"/>
           <w:sz w:val="24"/>
           <w:szCs w:val="24"/>
         </w:rPr>
-        <w:t xml:space="preserve">  "contradictions": [...],</w:t>
-      </w:r>
-    </w:p>
-    <w:p>
-      <w:pPr>
+      </w:pPr>
+      <w:r>
         <w:rPr>
           <w:rStyle w:val="CodeHTML"/>
           <w:rFonts w:ascii="Times New Roman" w:eastAsiaTheme="minorHAnsi" w:hAnsi="Times New Roman" w:cs="Times New Roman"/>
           <w:sz w:val="24"/>
           <w:szCs w:val="24"/>
         </w:rPr>
-      </w:pPr>
+        <w:t xml:space="preserve">  "contradictions</w:t>
+      </w:r>
+      <w:proofErr w:type="gramStart"/>
       <w:r>
         <w:rPr>
           <w:rStyle w:val="CodeHTML"/>
@@ -3850,6 +4007,35 @@
           <w:sz w:val="24"/>
           <w:szCs w:val="24"/>
         </w:rPr>
+        <w:t>":</w:t>
+      </w:r>
+      <w:proofErr w:type="gramEnd"/>
+      <w:r>
+        <w:rPr>
+          <w:rStyle w:val="CodeHTML"/>
+          <w:rFonts w:ascii="Times New Roman" w:eastAsiaTheme="minorHAnsi" w:hAnsi="Times New Roman" w:cs="Times New Roman"/>
+          <w:sz w:val="24"/>
+          <w:szCs w:val="24"/>
+        </w:rPr>
+        <w:t xml:space="preserve"> [...],</w:t>
+      </w:r>
+    </w:p>
+    <w:p>
+      <w:pPr>
+        <w:rPr>
+          <w:rStyle w:val="CodeHTML"/>
+          <w:rFonts w:ascii="Times New Roman" w:eastAsiaTheme="minorHAnsi" w:hAnsi="Times New Roman" w:cs="Times New Roman"/>
+          <w:sz w:val="24"/>
+          <w:szCs w:val="24"/>
+        </w:rPr>
+      </w:pPr>
+      <w:r>
+        <w:rPr>
+          <w:rStyle w:val="CodeHTML"/>
+          <w:rFonts w:ascii="Times New Roman" w:eastAsiaTheme="minorHAnsi" w:hAnsi="Times New Roman" w:cs="Times New Roman"/>
+          <w:sz w:val="24"/>
+          <w:szCs w:val="24"/>
+        </w:rPr>
         <w:t xml:space="preserve">  "</w:t>
       </w:r>
       <w:proofErr w:type="spellStart"/>
@@ -3863,6 +4049,7 @@
         <w:t>informations_absentes</w:t>
       </w:r>
       <w:proofErr w:type="spellEnd"/>
+      <w:proofErr w:type="gramStart"/>
       <w:r>
         <w:rPr>
           <w:rStyle w:val="CodeHTML"/>
@@ -3870,37 +4057,38 @@
           <w:sz w:val="24"/>
           <w:szCs w:val="24"/>
         </w:rPr>
-        <w:t>": [...],</w:t>
-      </w:r>
-    </w:p>
-    <w:p>
-      <w:pPr>
+        <w:t>":</w:t>
+      </w:r>
+      <w:proofErr w:type="gramEnd"/>
+      <w:r>
         <w:rPr>
           <w:rStyle w:val="CodeHTML"/>
           <w:rFonts w:ascii="Times New Roman" w:eastAsiaTheme="minorHAnsi" w:hAnsi="Times New Roman" w:cs="Times New Roman"/>
           <w:sz w:val="24"/>
           <w:szCs w:val="24"/>
         </w:rPr>
-      </w:pPr>
-      <w:r>
+        <w:t xml:space="preserve"> [...],</w:t>
+      </w:r>
+    </w:p>
+    <w:p>
+      <w:pPr>
         <w:rPr>
           <w:rStyle w:val="CodeHTML"/>
           <w:rFonts w:ascii="Times New Roman" w:eastAsiaTheme="minorHAnsi" w:hAnsi="Times New Roman" w:cs="Times New Roman"/>
           <w:sz w:val="24"/>
           <w:szCs w:val="24"/>
         </w:rPr>
-        <w:t xml:space="preserve">  "hallucinations": [...],</w:t>
-      </w:r>
-    </w:p>
-    <w:p>
-      <w:pPr>
+      </w:pPr>
+      <w:r>
         <w:rPr>
           <w:rStyle w:val="CodeHTML"/>
           <w:rFonts w:ascii="Times New Roman" w:eastAsiaTheme="minorHAnsi" w:hAnsi="Times New Roman" w:cs="Times New Roman"/>
           <w:sz w:val="24"/>
           <w:szCs w:val="24"/>
         </w:rPr>
-      </w:pPr>
+        <w:t xml:space="preserve">  "hallucinations</w:t>
+      </w:r>
+      <w:proofErr w:type="gramStart"/>
       <w:r>
         <w:rPr>
           <w:rStyle w:val="CodeHTML"/>
@@ -3908,6 +4096,35 @@
           <w:sz w:val="24"/>
           <w:szCs w:val="24"/>
         </w:rPr>
+        <w:t>":</w:t>
+      </w:r>
+      <w:proofErr w:type="gramEnd"/>
+      <w:r>
+        <w:rPr>
+          <w:rStyle w:val="CodeHTML"/>
+          <w:rFonts w:ascii="Times New Roman" w:eastAsiaTheme="minorHAnsi" w:hAnsi="Times New Roman" w:cs="Times New Roman"/>
+          <w:sz w:val="24"/>
+          <w:szCs w:val="24"/>
+        </w:rPr>
+        <w:t xml:space="preserve"> [...],</w:t>
+      </w:r>
+    </w:p>
+    <w:p>
+      <w:pPr>
+        <w:rPr>
+          <w:rStyle w:val="CodeHTML"/>
+          <w:rFonts w:ascii="Times New Roman" w:eastAsiaTheme="minorHAnsi" w:hAnsi="Times New Roman" w:cs="Times New Roman"/>
+          <w:sz w:val="24"/>
+          <w:szCs w:val="24"/>
+        </w:rPr>
+      </w:pPr>
+      <w:r>
+        <w:rPr>
+          <w:rStyle w:val="CodeHTML"/>
+          <w:rFonts w:ascii="Times New Roman" w:eastAsiaTheme="minorHAnsi" w:hAnsi="Times New Roman" w:cs="Times New Roman"/>
+          <w:sz w:val="24"/>
+          <w:szCs w:val="24"/>
+        </w:rPr>
         <w:t xml:space="preserve">  "</w:t>
       </w:r>
       <w:proofErr w:type="spellStart"/>
@@ -3921,6 +4138,7 @@
         <w:t>contraintes_respectees</w:t>
       </w:r>
       <w:proofErr w:type="spellEnd"/>
+      <w:proofErr w:type="gramStart"/>
       <w:r>
         <w:rPr>
           <w:rStyle w:val="CodeHTML"/>
@@ -3928,7 +4146,17 @@
           <w:sz w:val="24"/>
           <w:szCs w:val="24"/>
         </w:rPr>
-        <w:t xml:space="preserve">": </w:t>
+        <w:t>":</w:t>
+      </w:r>
+      <w:proofErr w:type="gramEnd"/>
+      <w:r>
+        <w:rPr>
+          <w:rStyle w:val="CodeHTML"/>
+          <w:rFonts w:ascii="Times New Roman" w:eastAsiaTheme="minorHAnsi" w:hAnsi="Times New Roman" w:cs="Times New Roman"/>
+          <w:sz w:val="24"/>
+          <w:szCs w:val="24"/>
+        </w:rPr>
+        <w:t xml:space="preserve"> </w:t>
       </w:r>
       <w:proofErr w:type="spellStart"/>
       <w:r>
@@ -3980,6 +4208,7 @@
         <w:t>verdict_global</w:t>
       </w:r>
       <w:proofErr w:type="spellEnd"/>
+      <w:proofErr w:type="gramStart"/>
       <w:r>
         <w:rPr>
           <w:rStyle w:val="CodeHTML"/>
@@ -3987,7 +4216,17 @@
           <w:sz w:val="24"/>
           <w:szCs w:val="24"/>
         </w:rPr>
-        <w:t>": "..."</w:t>
+        <w:t>":</w:t>
+      </w:r>
+      <w:proofErr w:type="gramEnd"/>
+      <w:r>
+        <w:rPr>
+          <w:rStyle w:val="CodeHTML"/>
+          <w:rFonts w:ascii="Times New Roman" w:eastAsiaTheme="minorHAnsi" w:hAnsi="Times New Roman" w:cs="Times New Roman"/>
+          <w:sz w:val="24"/>
+          <w:szCs w:val="24"/>
+        </w:rPr>
+        <w:t xml:space="preserve"> "..."</w:t>
       </w:r>
     </w:p>
     <w:p>
@@ -4658,7 +4897,25 @@
           <w:sz w:val="24"/>
           <w:szCs w:val="24"/>
         </w:rPr>
-        <w:t xml:space="preserve">  "sentiment": "</w:t>
+        <w:t xml:space="preserve">  "sentiment</w:t>
+      </w:r>
+      <w:proofErr w:type="gramStart"/>
+      <w:r>
+        <w:rPr>
+          <w:rFonts w:ascii="Times New Roman" w:hAnsi="Times New Roman" w:cs="Times New Roman"/>
+          <w:sz w:val="24"/>
+          <w:szCs w:val="24"/>
+        </w:rPr>
+        <w:t>":</w:t>
+      </w:r>
+      <w:proofErr w:type="gramEnd"/>
+      <w:r>
+        <w:rPr>
+          <w:rFonts w:ascii="Times New Roman" w:hAnsi="Times New Roman" w:cs="Times New Roman"/>
+          <w:sz w:val="24"/>
+          <w:szCs w:val="24"/>
+        </w:rPr>
+        <w:t xml:space="preserve"> "</w:t>
       </w:r>
       <w:proofErr w:type="spellStart"/>
       <w:r>
@@ -4706,13 +4963,23 @@
         <w:t>categorie</w:t>
       </w:r>
       <w:proofErr w:type="spellEnd"/>
-      <w:r>
-        <w:rPr>
-          <w:rFonts w:ascii="Times New Roman" w:hAnsi="Times New Roman" w:cs="Times New Roman"/>
-          <w:sz w:val="24"/>
-          <w:szCs w:val="24"/>
-        </w:rPr>
-        <w:t>": "livraison",</w:t>
+      <w:proofErr w:type="gramStart"/>
+      <w:r>
+        <w:rPr>
+          <w:rFonts w:ascii="Times New Roman" w:hAnsi="Times New Roman" w:cs="Times New Roman"/>
+          <w:sz w:val="24"/>
+          <w:szCs w:val="24"/>
+        </w:rPr>
+        <w:t>":</w:t>
+      </w:r>
+      <w:proofErr w:type="gramEnd"/>
+      <w:r>
+        <w:rPr>
+          <w:rFonts w:ascii="Times New Roman" w:hAnsi="Times New Roman" w:cs="Times New Roman"/>
+          <w:sz w:val="24"/>
+          <w:szCs w:val="24"/>
+        </w:rPr>
+        <w:t xml:space="preserve"> "livraison",</w:t>
       </w:r>
     </w:p>
     <w:p>
@@ -4730,7 +4997,25 @@
           <w:sz w:val="24"/>
           <w:szCs w:val="24"/>
         </w:rPr>
-        <w:t xml:space="preserve">  "urgence": "moyenne",</w:t>
+        <w:t xml:space="preserve">  "urgence</w:t>
+      </w:r>
+      <w:proofErr w:type="gramStart"/>
+      <w:r>
+        <w:rPr>
+          <w:rFonts w:ascii="Times New Roman" w:hAnsi="Times New Roman" w:cs="Times New Roman"/>
+          <w:sz w:val="24"/>
+          <w:szCs w:val="24"/>
+        </w:rPr>
+        <w:t>":</w:t>
+      </w:r>
+      <w:proofErr w:type="gramEnd"/>
+      <w:r>
+        <w:rPr>
+          <w:rFonts w:ascii="Times New Roman" w:hAnsi="Times New Roman" w:cs="Times New Roman"/>
+          <w:sz w:val="24"/>
+          <w:szCs w:val="24"/>
+        </w:rPr>
+        <w:t xml:space="preserve"> "moyenne",</w:t>
       </w:r>
     </w:p>
     <w:p>
@@ -4760,13 +5045,23 @@
         <w:t>probleme</w:t>
       </w:r>
       <w:proofErr w:type="spellEnd"/>
-      <w:r>
-        <w:rPr>
-          <w:rFonts w:ascii="Times New Roman" w:hAnsi="Times New Roman" w:cs="Times New Roman"/>
-          <w:sz w:val="24"/>
-          <w:szCs w:val="24"/>
-        </w:rPr>
-        <w:t>": "Retard de livraison",</w:t>
+      <w:proofErr w:type="gramStart"/>
+      <w:r>
+        <w:rPr>
+          <w:rFonts w:ascii="Times New Roman" w:hAnsi="Times New Roman" w:cs="Times New Roman"/>
+          <w:sz w:val="24"/>
+          <w:szCs w:val="24"/>
+        </w:rPr>
+        <w:t>":</w:t>
+      </w:r>
+      <w:proofErr w:type="gramEnd"/>
+      <w:r>
+        <w:rPr>
+          <w:rFonts w:ascii="Times New Roman" w:hAnsi="Times New Roman" w:cs="Times New Roman"/>
+          <w:sz w:val="24"/>
+          <w:szCs w:val="24"/>
+        </w:rPr>
+        <w:t xml:space="preserve"> "Retard de livraison",</w:t>
       </w:r>
     </w:p>
     <w:p>
@@ -4784,7 +5079,25 @@
           <w:sz w:val="24"/>
           <w:szCs w:val="24"/>
         </w:rPr>
-        <w:t xml:space="preserve">  "confiance": 0.91</w:t>
+        <w:t xml:space="preserve">  "confiance</w:t>
+      </w:r>
+      <w:proofErr w:type="gramStart"/>
+      <w:r>
+        <w:rPr>
+          <w:rFonts w:ascii="Times New Roman" w:hAnsi="Times New Roman" w:cs="Times New Roman"/>
+          <w:sz w:val="24"/>
+          <w:szCs w:val="24"/>
+        </w:rPr>
+        <w:t>":</w:t>
+      </w:r>
+      <w:proofErr w:type="gramEnd"/>
+      <w:r>
+        <w:rPr>
+          <w:rFonts w:ascii="Times New Roman" w:hAnsi="Times New Roman" w:cs="Times New Roman"/>
+          <w:sz w:val="24"/>
+          <w:szCs w:val="24"/>
+        </w:rPr>
+        <w:t xml:space="preserve"> 0.91</w:t>
       </w:r>
     </w:p>
     <w:p>
@@ -5201,8 +5514,18 @@
           <w:sz w:val="24"/>
           <w:szCs w:val="24"/>
         </w:rPr>
-        <w:t>Si une valeur ne peut pas être déterminée avec certitude, choisis la valeur la</w:t>
-      </w:r>
+        <w:t xml:space="preserve">Si une valeur ne peut pas être déterminée avec certitude, choisis la valeur </w:t>
+      </w:r>
+      <w:proofErr w:type="gramStart"/>
+      <w:r>
+        <w:rPr>
+          <w:rFonts w:ascii="Times New Roman" w:hAnsi="Times New Roman" w:cs="Times New Roman"/>
+          <w:sz w:val="24"/>
+          <w:szCs w:val="24"/>
+        </w:rPr>
+        <w:t>la</w:t>
+      </w:r>
+      <w:proofErr w:type="gramEnd"/>
     </w:p>
     <w:p>
       <w:pPr>
@@ -6844,34 +7167,65 @@
         <w:t>categorie</w:t>
       </w:r>
       <w:proofErr w:type="spellEnd"/>
-      <w:r>
-        <w:rPr>
-          <w:rStyle w:val="CodeHTML"/>
-          <w:rFonts w:ascii="Times New Roman" w:hAnsi="Times New Roman" w:cs="Times New Roman"/>
-          <w:sz w:val="24"/>
-          <w:szCs w:val="24"/>
-        </w:rPr>
-        <w:t>": "réseau | logiciel | matériel | sécurité | accès | autre",</w:t>
-      </w:r>
-    </w:p>
-    <w:p>
-      <w:pPr>
-        <w:pStyle w:val="PrformatHTML"/>
-        <w:rPr>
-          <w:rStyle w:val="CodeHTML"/>
-          <w:rFonts w:ascii="Times New Roman" w:hAnsi="Times New Roman" w:cs="Times New Roman"/>
-          <w:sz w:val="24"/>
-          <w:szCs w:val="24"/>
-        </w:rPr>
-      </w:pPr>
-      <w:r>
-        <w:rPr>
-          <w:rStyle w:val="CodeHTML"/>
-          <w:rFonts w:ascii="Times New Roman" w:hAnsi="Times New Roman" w:cs="Times New Roman"/>
-          <w:sz w:val="24"/>
-          <w:szCs w:val="24"/>
-        </w:rPr>
-        <w:t xml:space="preserve">  "justification": "..."</w:t>
+      <w:proofErr w:type="gramStart"/>
+      <w:r>
+        <w:rPr>
+          <w:rStyle w:val="CodeHTML"/>
+          <w:rFonts w:ascii="Times New Roman" w:hAnsi="Times New Roman" w:cs="Times New Roman"/>
+          <w:sz w:val="24"/>
+          <w:szCs w:val="24"/>
+        </w:rPr>
+        <w:t>":</w:t>
+      </w:r>
+      <w:proofErr w:type="gramEnd"/>
+      <w:r>
+        <w:rPr>
+          <w:rStyle w:val="CodeHTML"/>
+          <w:rFonts w:ascii="Times New Roman" w:hAnsi="Times New Roman" w:cs="Times New Roman"/>
+          <w:sz w:val="24"/>
+          <w:szCs w:val="24"/>
+        </w:rPr>
+        <w:t xml:space="preserve"> "réseau | logiciel | matériel | sécurité | accès | autre",</w:t>
+      </w:r>
+    </w:p>
+    <w:p>
+      <w:pPr>
+        <w:pStyle w:val="PrformatHTML"/>
+        <w:rPr>
+          <w:rStyle w:val="CodeHTML"/>
+          <w:rFonts w:ascii="Times New Roman" w:hAnsi="Times New Roman" w:cs="Times New Roman"/>
+          <w:sz w:val="24"/>
+          <w:szCs w:val="24"/>
+        </w:rPr>
+      </w:pPr>
+      <w:r>
+        <w:rPr>
+          <w:rStyle w:val="CodeHTML"/>
+          <w:rFonts w:ascii="Times New Roman" w:hAnsi="Times New Roman" w:cs="Times New Roman"/>
+          <w:sz w:val="24"/>
+          <w:szCs w:val="24"/>
+        </w:rPr>
+        <w:t xml:space="preserve">  "justification</w:t>
+      </w:r>
+      <w:proofErr w:type="gramStart"/>
+      <w:r>
+        <w:rPr>
+          <w:rStyle w:val="CodeHTML"/>
+          <w:rFonts w:ascii="Times New Roman" w:hAnsi="Times New Roman" w:cs="Times New Roman"/>
+          <w:sz w:val="24"/>
+          <w:szCs w:val="24"/>
+        </w:rPr>
+        <w:t>":</w:t>
+      </w:r>
+      <w:proofErr w:type="gramEnd"/>
+      <w:r>
+        <w:rPr>
+          <w:rStyle w:val="CodeHTML"/>
+          <w:rFonts w:ascii="Times New Roman" w:hAnsi="Times New Roman" w:cs="Times New Roman"/>
+          <w:sz w:val="24"/>
+          <w:szCs w:val="24"/>
+        </w:rPr>
+        <w:t xml:space="preserve"> "..."</w:t>
       </w:r>
     </w:p>
     <w:p>
@@ -7423,14 +7777,25 @@
         <w:t>numero_facture</w:t>
       </w:r>
       <w:proofErr w:type="spellEnd"/>
-      <w:r>
-        <w:rPr>
-          <w:rStyle w:val="CodeHTML"/>
-          <w:rFonts w:ascii="Times New Roman" w:hAnsi="Times New Roman" w:cs="Times New Roman"/>
-          <w:sz w:val="24"/>
-          <w:szCs w:val="24"/>
-        </w:rPr>
-        <w:t xml:space="preserve">": ... ou </w:t>
+      <w:proofErr w:type="gramStart"/>
+      <w:r>
+        <w:rPr>
+          <w:rStyle w:val="CodeHTML"/>
+          <w:rFonts w:ascii="Times New Roman" w:hAnsi="Times New Roman" w:cs="Times New Roman"/>
+          <w:sz w:val="24"/>
+          <w:szCs w:val="24"/>
+        </w:rPr>
+        <w:t>":</w:t>
+      </w:r>
+      <w:proofErr w:type="gramEnd"/>
+      <w:r>
+        <w:rPr>
+          <w:rStyle w:val="CodeHTML"/>
+          <w:rFonts w:ascii="Times New Roman" w:hAnsi="Times New Roman" w:cs="Times New Roman"/>
+          <w:sz w:val="24"/>
+          <w:szCs w:val="24"/>
+        </w:rPr>
+        <w:t xml:space="preserve"> ... ou </w:t>
       </w:r>
       <w:proofErr w:type="spellStart"/>
       <w:r>
@@ -7470,7 +7835,27 @@
           <w:sz w:val="24"/>
           <w:szCs w:val="24"/>
         </w:rPr>
-        <w:t xml:space="preserve">  "date": ... ou </w:t>
+        <w:t xml:space="preserve">  "date</w:t>
+      </w:r>
+      <w:proofErr w:type="gramStart"/>
+      <w:r>
+        <w:rPr>
+          <w:rStyle w:val="CodeHTML"/>
+          <w:rFonts w:ascii="Times New Roman" w:hAnsi="Times New Roman" w:cs="Times New Roman"/>
+          <w:sz w:val="24"/>
+          <w:szCs w:val="24"/>
+        </w:rPr>
+        <w:t>":</w:t>
+      </w:r>
+      <w:proofErr w:type="gramEnd"/>
+      <w:r>
+        <w:rPr>
+          <w:rStyle w:val="CodeHTML"/>
+          <w:rFonts w:ascii="Times New Roman" w:hAnsi="Times New Roman" w:cs="Times New Roman"/>
+          <w:sz w:val="24"/>
+          <w:szCs w:val="24"/>
+        </w:rPr>
+        <w:t xml:space="preserve"> ... ou </w:t>
       </w:r>
       <w:proofErr w:type="spellStart"/>
       <w:r>
@@ -7510,7 +7895,27 @@
           <w:sz w:val="24"/>
           <w:szCs w:val="24"/>
         </w:rPr>
-        <w:t xml:space="preserve">  "client": ... ou </w:t>
+        <w:t xml:space="preserve">  "client</w:t>
+      </w:r>
+      <w:proofErr w:type="gramStart"/>
+      <w:r>
+        <w:rPr>
+          <w:rStyle w:val="CodeHTML"/>
+          <w:rFonts w:ascii="Times New Roman" w:hAnsi="Times New Roman" w:cs="Times New Roman"/>
+          <w:sz w:val="24"/>
+          <w:szCs w:val="24"/>
+        </w:rPr>
+        <w:t>":</w:t>
+      </w:r>
+      <w:proofErr w:type="gramEnd"/>
+      <w:r>
+        <w:rPr>
+          <w:rStyle w:val="CodeHTML"/>
+          <w:rFonts w:ascii="Times New Roman" w:hAnsi="Times New Roman" w:cs="Times New Roman"/>
+          <w:sz w:val="24"/>
+          <w:szCs w:val="24"/>
+        </w:rPr>
+        <w:t xml:space="preserve"> ... ou </w:t>
       </w:r>
       <w:proofErr w:type="spellStart"/>
       <w:r>
@@ -7563,14 +7968,25 @@
         <w:t>montant_ht</w:t>
       </w:r>
       <w:proofErr w:type="spellEnd"/>
-      <w:r>
-        <w:rPr>
-          <w:rStyle w:val="CodeHTML"/>
-          <w:rFonts w:ascii="Times New Roman" w:hAnsi="Times New Roman" w:cs="Times New Roman"/>
-          <w:sz w:val="24"/>
-          <w:szCs w:val="24"/>
-        </w:rPr>
-        <w:t xml:space="preserve">": ... ou </w:t>
+      <w:proofErr w:type="gramStart"/>
+      <w:r>
+        <w:rPr>
+          <w:rStyle w:val="CodeHTML"/>
+          <w:rFonts w:ascii="Times New Roman" w:hAnsi="Times New Roman" w:cs="Times New Roman"/>
+          <w:sz w:val="24"/>
+          <w:szCs w:val="24"/>
+        </w:rPr>
+        <w:t>":</w:t>
+      </w:r>
+      <w:proofErr w:type="gramEnd"/>
+      <w:r>
+        <w:rPr>
+          <w:rStyle w:val="CodeHTML"/>
+          <w:rFonts w:ascii="Times New Roman" w:hAnsi="Times New Roman" w:cs="Times New Roman"/>
+          <w:sz w:val="24"/>
+          <w:szCs w:val="24"/>
+        </w:rPr>
+        <w:t xml:space="preserve"> ... ou </w:t>
       </w:r>
       <w:proofErr w:type="spellStart"/>
       <w:r>
@@ -7611,7 +8027,27 @@
           <w:szCs w:val="24"/>
         </w:rPr>
         <w:lastRenderedPageBreak/>
-        <w:t xml:space="preserve">  "tva": ... ou </w:t>
+        <w:t xml:space="preserve">  "tva</w:t>
+      </w:r>
+      <w:proofErr w:type="gramStart"/>
+      <w:r>
+        <w:rPr>
+          <w:rStyle w:val="CodeHTML"/>
+          <w:rFonts w:ascii="Times New Roman" w:hAnsi="Times New Roman" w:cs="Times New Roman"/>
+          <w:sz w:val="24"/>
+          <w:szCs w:val="24"/>
+        </w:rPr>
+        <w:t>":</w:t>
+      </w:r>
+      <w:proofErr w:type="gramEnd"/>
+      <w:r>
+        <w:rPr>
+          <w:rStyle w:val="CodeHTML"/>
+          <w:rFonts w:ascii="Times New Roman" w:hAnsi="Times New Roman" w:cs="Times New Roman"/>
+          <w:sz w:val="24"/>
+          <w:szCs w:val="24"/>
+        </w:rPr>
+        <w:t xml:space="preserve"> ... ou </w:t>
       </w:r>
       <w:proofErr w:type="spellStart"/>
       <w:r>
@@ -7664,14 +8100,25 @@
         <w:t>montant_ttc</w:t>
       </w:r>
       <w:proofErr w:type="spellEnd"/>
-      <w:r>
-        <w:rPr>
-          <w:rStyle w:val="CodeHTML"/>
-          <w:rFonts w:ascii="Times New Roman" w:hAnsi="Times New Roman" w:cs="Times New Roman"/>
-          <w:sz w:val="24"/>
-          <w:szCs w:val="24"/>
-        </w:rPr>
-        <w:t xml:space="preserve">": ... ou </w:t>
+      <w:proofErr w:type="gramStart"/>
+      <w:r>
+        <w:rPr>
+          <w:rStyle w:val="CodeHTML"/>
+          <w:rFonts w:ascii="Times New Roman" w:hAnsi="Times New Roman" w:cs="Times New Roman"/>
+          <w:sz w:val="24"/>
+          <w:szCs w:val="24"/>
+        </w:rPr>
+        <w:t>":</w:t>
+      </w:r>
+      <w:proofErr w:type="gramEnd"/>
+      <w:r>
+        <w:rPr>
+          <w:rStyle w:val="CodeHTML"/>
+          <w:rFonts w:ascii="Times New Roman" w:hAnsi="Times New Roman" w:cs="Times New Roman"/>
+          <w:sz w:val="24"/>
+          <w:szCs w:val="24"/>
+        </w:rPr>
+        <w:t xml:space="preserve"> ... ou </w:t>
       </w:r>
       <w:proofErr w:type="spellStart"/>
       <w:r>
@@ -7777,6 +8224,7 @@
           <w:lang w:val="en-US"/>
         </w:rPr>
       </w:pPr>
+      <w:proofErr w:type="gramStart"/>
       <w:r>
         <w:rPr>
           <w:rFonts w:ascii="Times New Roman" w:hAnsi="Times New Roman" w:cs="Times New Roman"/>
@@ -7784,27 +8232,48 @@
           <w:szCs w:val="24"/>
           <w:lang w:val="en-US"/>
         </w:rPr>
-        <w:t xml:space="preserve">Date : 10/09/2026 </w:t>
-      </w:r>
-    </w:p>
-    <w:p>
-      <w:pPr>
-        <w:pStyle w:val="PrformatHTML"/>
+        <w:t>Date :</w:t>
+      </w:r>
+      <w:proofErr w:type="gramEnd"/>
+      <w:r>
         <w:rPr>
           <w:rFonts w:ascii="Times New Roman" w:hAnsi="Times New Roman" w:cs="Times New Roman"/>
           <w:sz w:val="24"/>
           <w:szCs w:val="24"/>
           <w:lang w:val="en-US"/>
         </w:rPr>
-      </w:pPr>
-      <w:r>
+        <w:t xml:space="preserve"> 10/09/2026 </w:t>
+      </w:r>
+    </w:p>
+    <w:p>
+      <w:pPr>
+        <w:pStyle w:val="PrformatHTML"/>
         <w:rPr>
           <w:rFonts w:ascii="Times New Roman" w:hAnsi="Times New Roman" w:cs="Times New Roman"/>
           <w:sz w:val="24"/>
           <w:szCs w:val="24"/>
           <w:lang w:val="en-US"/>
         </w:rPr>
-        <w:t xml:space="preserve">Client : </w:t>
+      </w:pPr>
+      <w:proofErr w:type="gramStart"/>
+      <w:r>
+        <w:rPr>
+          <w:rFonts w:ascii="Times New Roman" w:hAnsi="Times New Roman" w:cs="Times New Roman"/>
+          <w:sz w:val="24"/>
+          <w:szCs w:val="24"/>
+          <w:lang w:val="en-US"/>
+        </w:rPr>
+        <w:t>Client :</w:t>
+      </w:r>
+      <w:proofErr w:type="gramEnd"/>
+      <w:r>
+        <w:rPr>
+          <w:rFonts w:ascii="Times New Roman" w:hAnsi="Times New Roman" w:cs="Times New Roman"/>
+          <w:sz w:val="24"/>
+          <w:szCs w:val="24"/>
+          <w:lang w:val="en-US"/>
+        </w:rPr>
+        <w:t xml:space="preserve"> </w:t>
       </w:r>
       <w:proofErr w:type="spellStart"/>
       <w:r>
@@ -7855,7 +8324,27 @@
           <w:szCs w:val="24"/>
           <w:lang w:val="en-US"/>
         </w:rPr>
-        <w:t xml:space="preserve"> HT : 100 000 FCFA </w:t>
+        <w:t xml:space="preserve"> </w:t>
+      </w:r>
+      <w:proofErr w:type="gramStart"/>
+      <w:r>
+        <w:rPr>
+          <w:rFonts w:ascii="Times New Roman" w:hAnsi="Times New Roman" w:cs="Times New Roman"/>
+          <w:sz w:val="24"/>
+          <w:szCs w:val="24"/>
+          <w:lang w:val="en-US"/>
+        </w:rPr>
+        <w:t>HT :</w:t>
+      </w:r>
+      <w:proofErr w:type="gramEnd"/>
+      <w:r>
+        <w:rPr>
+          <w:rFonts w:ascii="Times New Roman" w:hAnsi="Times New Roman" w:cs="Times New Roman"/>
+          <w:sz w:val="24"/>
+          <w:szCs w:val="24"/>
+          <w:lang w:val="en-US"/>
+        </w:rPr>
+        <w:t xml:space="preserve"> 100 000 FCFA </w:t>
       </w:r>
     </w:p>
     <w:p>
@@ -8562,7 +9051,27 @@
           <w:szCs w:val="36"/>
           <w:lang w:val="en-US"/>
         </w:rPr>
-        <w:t xml:space="preserve"> 6 : Prompt Engineering pour le Machine Learning</w:t>
+        <w:t xml:space="preserve"> </w:t>
+      </w:r>
+      <w:proofErr w:type="gramStart"/>
+      <w:r>
+        <w:rPr>
+          <w:rFonts w:ascii="Times New Roman" w:hAnsi="Times New Roman" w:cs="Times New Roman"/>
+          <w:sz w:val="36"/>
+          <w:szCs w:val="36"/>
+          <w:lang w:val="en-US"/>
+        </w:rPr>
+        <w:t>6 :</w:t>
+      </w:r>
+      <w:proofErr w:type="gramEnd"/>
+      <w:r>
+        <w:rPr>
+          <w:rFonts w:ascii="Times New Roman" w:hAnsi="Times New Roman" w:cs="Times New Roman"/>
+          <w:sz w:val="36"/>
+          <w:szCs w:val="36"/>
+          <w:lang w:val="en-US"/>
+        </w:rPr>
+        <w:t xml:space="preserve"> Prompt Engineering pour le Machine Learning</w:t>
       </w:r>
     </w:p>
     <w:p>
@@ -8698,6 +9207,7 @@
         <w:t>&lt;class '</w:t>
       </w:r>
       <w:proofErr w:type="spellStart"/>
+      <w:proofErr w:type="gramStart"/>
       <w:r>
         <w:rPr>
           <w:rFonts w:ascii="Consolas" w:eastAsia="Times New Roman" w:hAnsi="Consolas" w:cs="Times New Roman"/>
@@ -8708,6 +9218,7 @@
         <w:t>pandas.DataFrame</w:t>
       </w:r>
       <w:proofErr w:type="spellEnd"/>
+      <w:proofErr w:type="gramEnd"/>
       <w:r>
         <w:rPr>
           <w:rFonts w:ascii="Consolas" w:eastAsia="Times New Roman" w:hAnsi="Consolas" w:cs="Times New Roman"/>
@@ -8786,7 +9297,17 @@
           <w:szCs w:val="24"/>
           <w:lang w:val="en-US" w:eastAsia="fr-FR"/>
         </w:rPr>
-        <w:t xml:space="preserve"> #   Column        Non-Null Count  </w:t>
+        <w:t xml:space="preserve"> #   Column        Non-Null </w:t>
+      </w:r>
+      <w:proofErr w:type="gramStart"/>
+      <w:r>
+        <w:rPr>
+          <w:rFonts w:ascii="Consolas" w:eastAsia="Times New Roman" w:hAnsi="Consolas" w:cs="Times New Roman"/>
+          <w:sz w:val="24"/>
+          <w:szCs w:val="24"/>
+          <w:lang w:val="en-US" w:eastAsia="fr-FR"/>
+        </w:rPr>
+        <w:t xml:space="preserve">Count  </w:t>
       </w:r>
       <w:proofErr w:type="spellStart"/>
       <w:r>
@@ -8799,6 +9320,7 @@
         <w:t>Dtype</w:t>
       </w:r>
       <w:proofErr w:type="spellEnd"/>
+      <w:proofErr w:type="gramEnd"/>
       <w:r>
         <w:rPr>
           <w:rFonts w:ascii="Consolas" w:eastAsia="Times New Roman" w:hAnsi="Consolas" w:cs="Times New Roman"/>
@@ -9295,7 +9817,27 @@
           <w:szCs w:val="24"/>
           <w:lang w:eastAsia="fr-FR"/>
         </w:rPr>
-        <w:t xml:space="preserve"> 6   pression      591 non-</w:t>
+        <w:t xml:space="preserve"> 6   </w:t>
+      </w:r>
+      <w:proofErr w:type="gramStart"/>
+      <w:r>
+        <w:rPr>
+          <w:rFonts w:ascii="Consolas" w:eastAsia="Times New Roman" w:hAnsi="Consolas" w:cs="Times New Roman"/>
+          <w:sz w:val="24"/>
+          <w:szCs w:val="24"/>
+          <w:lang w:eastAsia="fr-FR"/>
+        </w:rPr>
+        <w:t>pression</w:t>
+      </w:r>
+      <w:proofErr w:type="gramEnd"/>
+      <w:r>
+        <w:rPr>
+          <w:rFonts w:ascii="Consolas" w:eastAsia="Times New Roman" w:hAnsi="Consolas" w:cs="Times New Roman"/>
+          <w:sz w:val="24"/>
+          <w:szCs w:val="24"/>
+          <w:lang w:eastAsia="fr-FR"/>
+        </w:rPr>
+        <w:t xml:space="preserve">      591 non-</w:t>
       </w:r>
       <w:proofErr w:type="spellStart"/>
       <w:r>
@@ -9335,7 +9877,27 @@
           <w:szCs w:val="24"/>
           <w:lang w:eastAsia="fr-FR"/>
         </w:rPr>
-        <w:t xml:space="preserve"> 7   consommation  591 non-</w:t>
+        <w:t xml:space="preserve"> 7   </w:t>
+      </w:r>
+      <w:proofErr w:type="gramStart"/>
+      <w:r>
+        <w:rPr>
+          <w:rFonts w:ascii="Consolas" w:eastAsia="Times New Roman" w:hAnsi="Consolas" w:cs="Times New Roman"/>
+          <w:sz w:val="24"/>
+          <w:szCs w:val="24"/>
+          <w:lang w:eastAsia="fr-FR"/>
+        </w:rPr>
+        <w:t>consommation  591</w:t>
+      </w:r>
+      <w:proofErr w:type="gramEnd"/>
+      <w:r>
+        <w:rPr>
+          <w:rFonts w:ascii="Consolas" w:eastAsia="Times New Roman" w:hAnsi="Consolas" w:cs="Times New Roman"/>
+          <w:sz w:val="24"/>
+          <w:szCs w:val="24"/>
+          <w:lang w:eastAsia="fr-FR"/>
+        </w:rPr>
+        <w:t xml:space="preserve"> non-</w:t>
       </w:r>
       <w:proofErr w:type="spellStart"/>
       <w:r>
@@ -9466,7 +10028,27 @@
           <w:szCs w:val="24"/>
           <w:lang w:val="en-US" w:eastAsia="fr-FR"/>
         </w:rPr>
-        <w:t>: float64(4), str(5)</w:t>
+        <w:t xml:space="preserve">: float64(4), </w:t>
+      </w:r>
+      <w:proofErr w:type="gramStart"/>
+      <w:r>
+        <w:rPr>
+          <w:rFonts w:ascii="Consolas" w:eastAsia="Times New Roman" w:hAnsi="Consolas" w:cs="Times New Roman"/>
+          <w:sz w:val="24"/>
+          <w:szCs w:val="24"/>
+          <w:lang w:val="en-US" w:eastAsia="fr-FR"/>
+        </w:rPr>
+        <w:t>str(</w:t>
+      </w:r>
+      <w:proofErr w:type="gramEnd"/>
+      <w:r>
+        <w:rPr>
+          <w:rFonts w:ascii="Consolas" w:eastAsia="Times New Roman" w:hAnsi="Consolas" w:cs="Times New Roman"/>
+          <w:sz w:val="24"/>
+          <w:szCs w:val="24"/>
+          <w:lang w:val="en-US" w:eastAsia="fr-FR"/>
+        </w:rPr>
+        <w:t>5)</w:t>
       </w:r>
     </w:p>
     <w:p>
@@ -14158,7 +14740,21 @@
         <w:rPr>
           <w:rStyle w:val="Accentuation"/>
         </w:rPr>
-        <w:t xml:space="preserve"> comparer de deux version de </w:t>
+        <w:t xml:space="preserve"> comparer de </w:t>
+      </w:r>
+      <w:proofErr w:type="gramStart"/>
+      <w:r>
+        <w:rPr>
+          <w:rStyle w:val="Accentuation"/>
+        </w:rPr>
+        <w:t>deux version</w:t>
+      </w:r>
+      <w:proofErr w:type="gramEnd"/>
+      <w:r>
+        <w:rPr>
+          <w:rStyle w:val="Accentuation"/>
+        </w:rPr>
+        <w:t xml:space="preserve"> de </w:t>
       </w:r>
       <w:proofErr w:type="spellStart"/>
       <w:r>
@@ -14319,12 +14915,14 @@
       <w:pPr>
         <w:pStyle w:val="NormalWeb"/>
         <w:rPr>
+          <w:color w:val="000000" w:themeColor="text1"/>
           <w:sz w:val="28"/>
           <w:szCs w:val="28"/>
         </w:rPr>
       </w:pPr>
       <w:r>
         <w:rPr>
+          <w:color w:val="000000" w:themeColor="text1"/>
           <w:sz w:val="28"/>
           <w:szCs w:val="28"/>
         </w:rPr>
@@ -14353,6 +14951,223 @@
                     <a:xfrm>
                       <a:off x="0" y="0"/>
                       <a:ext cx="5581937" cy="3905451"/>
+                    </a:xfrm>
+                    <a:prstGeom prst="rect">
+                      <a:avLst/>
+                    </a:prstGeom>
+                  </pic:spPr>
+                </pic:pic>
+              </a:graphicData>
+            </a:graphic>
+          </wp:inline>
+        </w:drawing>
+      </w:r>
+    </w:p>
+    <w:p>
+      <w:pPr>
+        <w:pStyle w:val="Titre3"/>
+        <w:rPr>
+          <w:rFonts w:ascii="Times New Roman" w:hAnsi="Times New Roman" w:cs="Times New Roman"/>
+          <w:b/>
+          <w:bCs/>
+          <w:color w:val="000000" w:themeColor="text1"/>
+          <w:sz w:val="28"/>
+          <w:szCs w:val="28"/>
+        </w:rPr>
+      </w:pPr>
+      <w:r>
+        <w:rPr>
+          <w:rFonts w:ascii="Times New Roman" w:hAnsi="Times New Roman" w:cs="Times New Roman"/>
+          <w:b/>
+          <w:bCs/>
+          <w:color w:val="000000" w:themeColor="text1"/>
+          <w:sz w:val="28"/>
+          <w:szCs w:val="28"/>
+        </w:rPr>
+        <w:t>Prompt B avec document, sans contrainte</w:t>
+      </w:r>
+    </w:p>
+    <w:p>
+      <w:pPr>
+        <w:pStyle w:val="PrformatHTML"/>
+        <w:rPr>
+          <w:rStyle w:val="CodeHTML"/>
+          <w:rFonts w:ascii="Times New Roman" w:hAnsi="Times New Roman" w:cs="Times New Roman"/>
+          <w:color w:val="000000" w:themeColor="text1"/>
+          <w:sz w:val="24"/>
+          <w:szCs w:val="24"/>
+        </w:rPr>
+      </w:pPr>
+      <w:r>
+        <w:rPr>
+          <w:rStyle w:val="CodeHTML"/>
+          <w:rFonts w:ascii="Times New Roman" w:hAnsi="Times New Roman" w:cs="Times New Roman"/>
+          <w:color w:val="000000" w:themeColor="text1"/>
+          <w:sz w:val="24"/>
+          <w:szCs w:val="24"/>
+        </w:rPr>
+        <w:t>Voici un document (mémoire de maîtrise sur la détection de visages).</w:t>
+      </w:r>
+    </w:p>
+    <w:p>
+      <w:pPr>
+        <w:pStyle w:val="PrformatHTML"/>
+        <w:rPr>
+          <w:rStyle w:val="CodeHTML"/>
+          <w:rFonts w:ascii="Times New Roman" w:hAnsi="Times New Roman" w:cs="Times New Roman"/>
+          <w:color w:val="000000" w:themeColor="text1"/>
+          <w:sz w:val="24"/>
+          <w:szCs w:val="24"/>
+        </w:rPr>
+      </w:pPr>
+    </w:p>
+    <w:p>
+      <w:pPr>
+        <w:pStyle w:val="PrformatHTML"/>
+        <w:rPr>
+          <w:rStyle w:val="CodeHTML"/>
+          <w:rFonts w:ascii="Times New Roman" w:hAnsi="Times New Roman" w:cs="Times New Roman"/>
+          <w:color w:val="000000" w:themeColor="text1"/>
+          <w:sz w:val="24"/>
+          <w:szCs w:val="24"/>
+        </w:rPr>
+      </w:pPr>
+      <w:r>
+        <w:rPr>
+          <w:rStyle w:val="CodeHTML"/>
+          <w:rFonts w:ascii="Times New Roman" w:hAnsi="Times New Roman" w:cs="Times New Roman"/>
+          <w:b/>
+          <w:bCs/>
+          <w:color w:val="000000" w:themeColor="text1"/>
+          <w:sz w:val="24"/>
+          <w:szCs w:val="24"/>
+        </w:rPr>
+        <w:t>Question</w:t>
+      </w:r>
+      <w:r>
+        <w:rPr>
+          <w:rStyle w:val="CodeHTML"/>
+          <w:rFonts w:ascii="Times New Roman" w:hAnsi="Times New Roman" w:cs="Times New Roman"/>
+          <w:color w:val="000000" w:themeColor="text1"/>
+          <w:sz w:val="24"/>
+          <w:szCs w:val="24"/>
+        </w:rPr>
+        <w:t xml:space="preserve"> : Quelles sont les valeurs de mAP@0.5 et mAP@0.5:0.95 obtenues par</w:t>
+      </w:r>
+    </w:p>
+    <w:p>
+      <w:pPr>
+        <w:pStyle w:val="PrformatHTML"/>
+        <w:rPr>
+          <w:rStyle w:val="CodeHTML"/>
+          <w:rFonts w:ascii="Times New Roman" w:hAnsi="Times New Roman" w:cs="Times New Roman"/>
+          <w:color w:val="000000" w:themeColor="text1"/>
+          <w:sz w:val="24"/>
+          <w:szCs w:val="24"/>
+        </w:rPr>
+      </w:pPr>
+      <w:r>
+        <w:rPr>
+          <w:rStyle w:val="CodeHTML"/>
+          <w:rFonts w:ascii="Times New Roman" w:hAnsi="Times New Roman" w:cs="Times New Roman"/>
+          <w:color w:val="000000" w:themeColor="text1"/>
+          <w:sz w:val="24"/>
+          <w:szCs w:val="24"/>
+        </w:rPr>
+        <w:t>YoloV5 et par YoloV8 sur la tâche de détection de visage, et lequel des deux</w:t>
+      </w:r>
+    </w:p>
+    <w:p>
+      <w:pPr>
+        <w:pStyle w:val="PrformatHTML"/>
+        <w:rPr>
+          <w:rFonts w:ascii="Times New Roman" w:hAnsi="Times New Roman" w:cs="Times New Roman"/>
+          <w:color w:val="000000" w:themeColor="text1"/>
+          <w:sz w:val="24"/>
+          <w:szCs w:val="24"/>
+        </w:rPr>
+      </w:pPr>
+      <w:r>
+        <w:rPr>
+          <w:rStyle w:val="CodeHTML"/>
+          <w:rFonts w:ascii="Times New Roman" w:hAnsi="Times New Roman" w:cs="Times New Roman"/>
+          <w:color w:val="000000" w:themeColor="text1"/>
+          <w:sz w:val="24"/>
+          <w:szCs w:val="24"/>
+        </w:rPr>
+        <w:t>Modèles</w:t>
+      </w:r>
+      <w:r>
+        <w:rPr>
+          <w:rStyle w:val="CodeHTML"/>
+          <w:rFonts w:ascii="Times New Roman" w:hAnsi="Times New Roman" w:cs="Times New Roman"/>
+          <w:color w:val="000000" w:themeColor="text1"/>
+          <w:sz w:val="24"/>
+          <w:szCs w:val="24"/>
+        </w:rPr>
+        <w:t xml:space="preserve"> est le plus performant selon ces métriques ?</w:t>
+      </w:r>
+    </w:p>
+    <w:p>
+      <w:pPr>
+        <w:pStyle w:val="NormalWeb"/>
+        <w:rPr>
+          <w:rStyle w:val="lev"/>
+          <w:color w:val="000000" w:themeColor="text1"/>
+        </w:rPr>
+      </w:pPr>
+      <w:r>
+        <w:rPr>
+          <w:rStyle w:val="lev"/>
+          <w:color w:val="000000" w:themeColor="text1"/>
+        </w:rPr>
+        <w:t>Ré</w:t>
+      </w:r>
+      <w:r>
+        <w:rPr>
+          <w:rStyle w:val="lev"/>
+          <w:color w:val="000000" w:themeColor="text1"/>
+        </w:rPr>
+        <w:t xml:space="preserve">sultats : </w:t>
+      </w:r>
+    </w:p>
+    <w:p>
+      <w:pPr>
+        <w:pStyle w:val="NormalWeb"/>
+        <w:rPr>
+          <w:color w:val="000000" w:themeColor="text1"/>
+        </w:rPr>
+      </w:pPr>
+      <w:r>
+        <w:rPr>
+          <w:color w:val="000000" w:themeColor="text1"/>
+        </w:rPr>
+        <w:lastRenderedPageBreak/>
+        <w:drawing>
+          <wp:inline distT="0" distB="0" distL="0" distR="0" wp14:anchorId="076535F5" wp14:editId="50D3AA48">
+            <wp:extent cx="5588287" cy="3340272"/>
+            <wp:effectExtent l="0" t="0" r="0" b="0"/>
+            <wp:docPr id="46" name="Image 46"/>
+            <wp:cNvGraphicFramePr>
+              <a:graphicFrameLocks xmlns:a="http://schemas.openxmlformats.org/drawingml/2006/main" noChangeAspect="1"/>
+            </wp:cNvGraphicFramePr>
+            <a:graphic xmlns:a="http://schemas.openxmlformats.org/drawingml/2006/main">
+              <a:graphicData uri="http://schemas.openxmlformats.org/drawingml/2006/picture">
+                <pic:pic xmlns:pic="http://schemas.openxmlformats.org/drawingml/2006/picture">
+                  <pic:nvPicPr>
+                    <pic:cNvPr id="1" name=""/>
+                    <pic:cNvPicPr/>
+                  </pic:nvPicPr>
+                  <pic:blipFill>
+                    <a:blip r:embed="rId50"/>
+                    <a:stretch>
+                      <a:fillRect/>
+                    </a:stretch>
+                  </pic:blipFill>
+                  <pic:spPr>
+                    <a:xfrm>
+                      <a:off x="0" y="0"/>
+                      <a:ext cx="5588287" cy="3340272"/>
                     </a:xfrm>
                     <a:prstGeom prst="rect">
                       <a:avLst/>

</xml_diff>

<commit_message>
Partie 6 question 2 Prompt c
</commit_message>
<xml_diff>
--- a/ai-business_assistant.docx
+++ b/ai-business_assistant.docx
@@ -15182,14 +15182,1308 @@
     </w:p>
     <w:p>
       <w:pPr>
-        <w:pStyle w:val="NormalWeb"/>
-        <w:rPr>
-          <w:rStyle w:val="CodeHTML"/>
-          <w:rFonts w:ascii="Times New Roman" w:hAnsi="Times New Roman" w:cs="Times New Roman"/>
+        <w:pStyle w:val="Titre3"/>
+        <w:rPr>
+          <w:rStyle w:val="CodeHTML"/>
+          <w:rFonts w:ascii="Times New Roman" w:eastAsiaTheme="majorEastAsia" w:hAnsi="Times New Roman" w:cs="Times New Roman"/>
+          <w:b/>
+          <w:bCs/>
+          <w:color w:val="000000" w:themeColor="text1"/>
           <w:sz w:val="28"/>
           <w:szCs w:val="28"/>
         </w:rPr>
       </w:pPr>
+      <w:r>
+        <w:rPr>
+          <w:rFonts w:ascii="Times New Roman" w:hAnsi="Times New Roman" w:cs="Times New Roman"/>
+          <w:b/>
+          <w:bCs/>
+          <w:color w:val="000000" w:themeColor="text1"/>
+          <w:sz w:val="28"/>
+          <w:szCs w:val="28"/>
+        </w:rPr>
+        <w:t>Prompt C avec document et contraintes RAG</w:t>
+      </w:r>
+    </w:p>
+    <w:p>
+      <w:pPr>
+        <w:pStyle w:val="PrformatHTML"/>
+        <w:rPr>
+          <w:rStyle w:val="CodeHTML"/>
+          <w:rFonts w:ascii="Times New Roman" w:hAnsi="Times New Roman" w:cs="Times New Roman"/>
+          <w:color w:val="000000" w:themeColor="text1"/>
+          <w:sz w:val="24"/>
+          <w:szCs w:val="24"/>
+        </w:rPr>
+      </w:pPr>
+      <w:r>
+        <w:rPr>
+          <w:rStyle w:val="CodeHTML"/>
+          <w:rFonts w:ascii="Times New Roman" w:hAnsi="Times New Roman" w:cs="Times New Roman"/>
+          <w:b/>
+          <w:bCs/>
+          <w:color w:val="000000" w:themeColor="text1"/>
+          <w:sz w:val="24"/>
+          <w:szCs w:val="24"/>
+        </w:rPr>
+        <w:t>Question</w:t>
+      </w:r>
+      <w:r>
+        <w:rPr>
+          <w:rStyle w:val="CodeHTML"/>
+          <w:rFonts w:ascii="Times New Roman" w:hAnsi="Times New Roman" w:cs="Times New Roman"/>
+          <w:color w:val="000000" w:themeColor="text1"/>
+          <w:sz w:val="24"/>
+          <w:szCs w:val="24"/>
+        </w:rPr>
+        <w:t xml:space="preserve"> : Quelles sont les valeurs de mAP@0.5 et mAP@0.5:0.95 obtenues par</w:t>
+      </w:r>
+    </w:p>
+    <w:p>
+      <w:pPr>
+        <w:pStyle w:val="PrformatHTML"/>
+        <w:rPr>
+          <w:rStyle w:val="CodeHTML"/>
+          <w:rFonts w:ascii="Times New Roman" w:hAnsi="Times New Roman" w:cs="Times New Roman"/>
+          <w:color w:val="000000" w:themeColor="text1"/>
+          <w:sz w:val="24"/>
+          <w:szCs w:val="24"/>
+        </w:rPr>
+      </w:pPr>
+      <w:r>
+        <w:rPr>
+          <w:rStyle w:val="CodeHTML"/>
+          <w:rFonts w:ascii="Times New Roman" w:hAnsi="Times New Roman" w:cs="Times New Roman"/>
+          <w:color w:val="000000" w:themeColor="text1"/>
+          <w:sz w:val="24"/>
+          <w:szCs w:val="24"/>
+        </w:rPr>
+        <w:t>YoloV5 et par YoloV8 sur la tâche de détection de visage, et lequel des deux</w:t>
+      </w:r>
+      <w:r>
+        <w:rPr>
+          <w:rStyle w:val="CodeHTML"/>
+          <w:rFonts w:ascii="Times New Roman" w:hAnsi="Times New Roman" w:cs="Times New Roman"/>
+          <w:color w:val="000000" w:themeColor="text1"/>
+          <w:sz w:val="24"/>
+          <w:szCs w:val="24"/>
+        </w:rPr>
+        <w:t xml:space="preserve"> </w:t>
+      </w:r>
+      <w:r>
+        <w:rPr>
+          <w:rStyle w:val="CodeHTML"/>
+          <w:rFonts w:ascii="Times New Roman" w:hAnsi="Times New Roman" w:cs="Times New Roman"/>
+          <w:color w:val="000000" w:themeColor="text1"/>
+          <w:sz w:val="24"/>
+          <w:szCs w:val="24"/>
+        </w:rPr>
+        <w:t>modèles est le plus performant selon ces métriques ?</w:t>
+      </w:r>
+    </w:p>
+    <w:p>
+      <w:pPr>
+        <w:pStyle w:val="PrformatHTML"/>
+        <w:rPr>
+          <w:rStyle w:val="CodeHTML"/>
+          <w:rFonts w:ascii="Times New Roman" w:hAnsi="Times New Roman" w:cs="Times New Roman"/>
+          <w:color w:val="000000" w:themeColor="text1"/>
+          <w:sz w:val="24"/>
+          <w:szCs w:val="24"/>
+        </w:rPr>
+      </w:pPr>
+    </w:p>
+    <w:p>
+      <w:pPr>
+        <w:pStyle w:val="PrformatHTML"/>
+        <w:rPr>
+          <w:rStyle w:val="CodeHTML"/>
+          <w:rFonts w:ascii="Times New Roman" w:hAnsi="Times New Roman" w:cs="Times New Roman"/>
+          <w:color w:val="000000" w:themeColor="text1"/>
+          <w:sz w:val="24"/>
+          <w:szCs w:val="24"/>
+        </w:rPr>
+      </w:pPr>
+      <w:r>
+        <w:rPr>
+          <w:rStyle w:val="CodeHTML"/>
+          <w:rFonts w:ascii="Times New Roman" w:hAnsi="Times New Roman" w:cs="Times New Roman"/>
+          <w:b/>
+          <w:bCs/>
+          <w:color w:val="000000" w:themeColor="text1"/>
+          <w:sz w:val="24"/>
+          <w:szCs w:val="24"/>
+        </w:rPr>
+        <w:t>Contraintes</w:t>
+      </w:r>
+      <w:r>
+        <w:rPr>
+          <w:rStyle w:val="CodeHTML"/>
+          <w:rFonts w:ascii="Times New Roman" w:hAnsi="Times New Roman" w:cs="Times New Roman"/>
+          <w:color w:val="000000" w:themeColor="text1"/>
+          <w:sz w:val="24"/>
+          <w:szCs w:val="24"/>
+        </w:rPr>
+        <w:t xml:space="preserve"> :</w:t>
+      </w:r>
+    </w:p>
+    <w:p>
+      <w:pPr>
+        <w:pStyle w:val="PrformatHTML"/>
+        <w:numPr>
+          <w:ilvl w:val="0"/>
+          <w:numId w:val="20"/>
+        </w:numPr>
+        <w:rPr>
+          <w:rStyle w:val="CodeHTML"/>
+          <w:rFonts w:ascii="Times New Roman" w:hAnsi="Times New Roman" w:cs="Times New Roman"/>
+          <w:color w:val="000000" w:themeColor="text1"/>
+          <w:sz w:val="24"/>
+          <w:szCs w:val="24"/>
+        </w:rPr>
+      </w:pPr>
+      <w:r>
+        <w:rPr>
+          <w:rStyle w:val="CodeHTML"/>
+          <w:rFonts w:ascii="Times New Roman" w:hAnsi="Times New Roman" w:cs="Times New Roman"/>
+          <w:color w:val="000000" w:themeColor="text1"/>
+          <w:sz w:val="24"/>
+          <w:szCs w:val="24"/>
+        </w:rPr>
+        <w:t>Utilise UNIQUEMENT les informations présentes dans le document ci-dessus pour répondre.</w:t>
+      </w:r>
+    </w:p>
+    <w:p>
+      <w:pPr>
+        <w:pStyle w:val="PrformatHTML"/>
+        <w:numPr>
+          <w:ilvl w:val="0"/>
+          <w:numId w:val="20"/>
+        </w:numPr>
+        <w:rPr>
+          <w:rStyle w:val="CodeHTML"/>
+          <w:rFonts w:ascii="Times New Roman" w:hAnsi="Times New Roman" w:cs="Times New Roman"/>
+          <w:color w:val="000000" w:themeColor="text1"/>
+          <w:sz w:val="24"/>
+          <w:szCs w:val="24"/>
+        </w:rPr>
+      </w:pPr>
+      <w:r>
+        <w:rPr>
+          <w:rStyle w:val="CodeHTML"/>
+          <w:rFonts w:ascii="Times New Roman" w:hAnsi="Times New Roman" w:cs="Times New Roman"/>
+          <w:color w:val="000000" w:themeColor="text1"/>
+          <w:sz w:val="24"/>
+          <w:szCs w:val="24"/>
+        </w:rPr>
+        <w:t>N'invente aucune information absente du document.</w:t>
+      </w:r>
+    </w:p>
+    <w:p>
+      <w:pPr>
+        <w:pStyle w:val="PrformatHTML"/>
+        <w:numPr>
+          <w:ilvl w:val="0"/>
+          <w:numId w:val="20"/>
+        </w:numPr>
+        <w:rPr>
+          <w:rStyle w:val="CodeHTML"/>
+          <w:rFonts w:ascii="Times New Roman" w:hAnsi="Times New Roman" w:cs="Times New Roman"/>
+          <w:color w:val="000000" w:themeColor="text1"/>
+          <w:sz w:val="24"/>
+          <w:szCs w:val="24"/>
+        </w:rPr>
+      </w:pPr>
+      <w:r>
+        <w:rPr>
+          <w:rStyle w:val="CodeHTML"/>
+          <w:rFonts w:ascii="Times New Roman" w:hAnsi="Times New Roman" w:cs="Times New Roman"/>
+          <w:color w:val="000000" w:themeColor="text1"/>
+          <w:sz w:val="24"/>
+          <w:szCs w:val="24"/>
+        </w:rPr>
+        <w:t>Si l'information demandée n'est pas présente dans le document, indique-le</w:t>
+      </w:r>
+      <w:r>
+        <w:rPr>
+          <w:rStyle w:val="CodeHTML"/>
+          <w:rFonts w:ascii="Times New Roman" w:hAnsi="Times New Roman" w:cs="Times New Roman"/>
+          <w:color w:val="000000" w:themeColor="text1"/>
+          <w:sz w:val="24"/>
+          <w:szCs w:val="24"/>
+        </w:rPr>
+        <w:t xml:space="preserve"> </w:t>
+      </w:r>
+      <w:r>
+        <w:rPr>
+          <w:rStyle w:val="CodeHTML"/>
+          <w:rFonts w:ascii="Times New Roman" w:hAnsi="Times New Roman" w:cs="Times New Roman"/>
+          <w:color w:val="000000" w:themeColor="text1"/>
+          <w:sz w:val="24"/>
+          <w:szCs w:val="24"/>
+        </w:rPr>
+        <w:t>explicitement au lieu de deviner.</w:t>
+      </w:r>
+    </w:p>
+    <w:p>
+      <w:pPr>
+        <w:pStyle w:val="PrformatHTML"/>
+        <w:numPr>
+          <w:ilvl w:val="0"/>
+          <w:numId w:val="20"/>
+        </w:numPr>
+        <w:rPr>
+          <w:rFonts w:ascii="Times New Roman" w:hAnsi="Times New Roman" w:cs="Times New Roman"/>
+          <w:color w:val="000000" w:themeColor="text1"/>
+          <w:sz w:val="24"/>
+          <w:szCs w:val="24"/>
+        </w:rPr>
+      </w:pPr>
+      <w:r>
+        <w:rPr>
+          <w:rStyle w:val="CodeHTML"/>
+          <w:rFonts w:ascii="Times New Roman" w:hAnsi="Times New Roman" w:cs="Times New Roman"/>
+          <w:color w:val="000000" w:themeColor="text1"/>
+          <w:sz w:val="24"/>
+          <w:szCs w:val="24"/>
+        </w:rPr>
+        <w:t>Cite le passage ou la section du document qui justifie ta réponse (ex. numéro</w:t>
+      </w:r>
+      <w:r>
+        <w:rPr>
+          <w:rStyle w:val="CodeHTML"/>
+          <w:rFonts w:ascii="Times New Roman" w:hAnsi="Times New Roman" w:cs="Times New Roman"/>
+          <w:color w:val="000000" w:themeColor="text1"/>
+          <w:sz w:val="24"/>
+          <w:szCs w:val="24"/>
+        </w:rPr>
+        <w:t xml:space="preserve"> </w:t>
+      </w:r>
+      <w:r>
+        <w:rPr>
+          <w:rStyle w:val="CodeHTML"/>
+          <w:rFonts w:ascii="Times New Roman" w:hAnsi="Times New Roman" w:cs="Times New Roman"/>
+          <w:color w:val="000000" w:themeColor="text1"/>
+          <w:sz w:val="24"/>
+          <w:szCs w:val="24"/>
+        </w:rPr>
+        <w:t>de tableau, de section ou de page).</w:t>
+      </w:r>
+    </w:p>
+    <w:p>
+      <w:pPr>
+        <w:pStyle w:val="NormalWeb"/>
+        <w:rPr>
+          <w:rStyle w:val="lev"/>
+          <w:color w:val="000000" w:themeColor="text1"/>
+        </w:rPr>
+      </w:pPr>
+      <w:r>
+        <w:rPr>
+          <w:rStyle w:val="lev"/>
+          <w:color w:val="000000" w:themeColor="text1"/>
+          <w:sz w:val="28"/>
+          <w:szCs w:val="28"/>
+        </w:rPr>
+        <w:t>Ré</w:t>
+      </w:r>
+      <w:r>
+        <w:rPr>
+          <w:rStyle w:val="lev"/>
+          <w:color w:val="000000" w:themeColor="text1"/>
+          <w:sz w:val="28"/>
+          <w:szCs w:val="28"/>
+        </w:rPr>
+        <w:t>sultats</w:t>
+      </w:r>
+      <w:r>
+        <w:rPr>
+          <w:rStyle w:val="lev"/>
+          <w:color w:val="000000" w:themeColor="text1"/>
+        </w:rPr>
+        <w:t> :</w:t>
+      </w:r>
+    </w:p>
+    <w:p>
+      <w:pPr>
+        <w:pStyle w:val="NormalWeb"/>
+        <w:rPr>
+          <w:b/>
+          <w:bCs/>
+          <w:color w:val="000000" w:themeColor="text1"/>
+        </w:rPr>
+      </w:pPr>
+      <w:r>
+        <w:rPr>
+          <w:rStyle w:val="lev"/>
+          <w:color w:val="000000" w:themeColor="text1"/>
+        </w:rPr>
+        <w:lastRenderedPageBreak/>
+        <w:drawing>
+          <wp:inline distT="0" distB="0" distL="0" distR="0" wp14:anchorId="4CFC1A68" wp14:editId="7E8DE164">
+            <wp:extent cx="5562886" cy="3257717"/>
+            <wp:effectExtent l="0" t="0" r="0" b="0"/>
+            <wp:docPr id="47" name="Image 47"/>
+            <wp:cNvGraphicFramePr>
+              <a:graphicFrameLocks xmlns:a="http://schemas.openxmlformats.org/drawingml/2006/main" noChangeAspect="1"/>
+            </wp:cNvGraphicFramePr>
+            <a:graphic xmlns:a="http://schemas.openxmlformats.org/drawingml/2006/main">
+              <a:graphicData uri="http://schemas.openxmlformats.org/drawingml/2006/picture">
+                <pic:pic xmlns:pic="http://schemas.openxmlformats.org/drawingml/2006/picture">
+                  <pic:nvPicPr>
+                    <pic:cNvPr id="1" name=""/>
+                    <pic:cNvPicPr/>
+                  </pic:nvPicPr>
+                  <pic:blipFill>
+                    <a:blip r:embed="rId51"/>
+                    <a:stretch>
+                      <a:fillRect/>
+                    </a:stretch>
+                  </pic:blipFill>
+                  <pic:spPr>
+                    <a:xfrm>
+                      <a:off x="0" y="0"/>
+                      <a:ext cx="5562886" cy="3257717"/>
+                    </a:xfrm>
+                    <a:prstGeom prst="rect">
+                      <a:avLst/>
+                    </a:prstGeom>
+                  </pic:spPr>
+                </pic:pic>
+              </a:graphicData>
+            </a:graphic>
+          </wp:inline>
+        </w:drawing>
+      </w:r>
+    </w:p>
+    <w:p>
+      <w:pPr>
+        <w:pStyle w:val="Titre2"/>
+        <w:rPr>
+          <w:sz w:val="28"/>
+          <w:szCs w:val="28"/>
+        </w:rPr>
+      </w:pPr>
+      <w:r>
+        <w:rPr>
+          <w:sz w:val="28"/>
+          <w:szCs w:val="28"/>
+        </w:rPr>
+        <w:t>3) Comparaison des résultats</w:t>
+      </w:r>
+    </w:p>
+    <w:tbl>
+      <w:tblPr>
+        <w:tblW w:w="0" w:type="auto"/>
+        <w:tblCellSpacing w:w="15" w:type="dxa"/>
+        <w:tblCellMar>
+          <w:top w:w="15" w:type="dxa"/>
+          <w:left w:w="15" w:type="dxa"/>
+          <w:bottom w:w="15" w:type="dxa"/>
+          <w:right w:w="15" w:type="dxa"/>
+        </w:tblCellMar>
+        <w:tblLook w:val="04A0" w:firstRow="1" w:lastRow="0" w:firstColumn="1" w:lastColumn="0" w:noHBand="0" w:noVBand="1"/>
+      </w:tblPr>
+      <w:tblGrid>
+        <w:gridCol w:w="1855"/>
+        <w:gridCol w:w="2427"/>
+        <w:gridCol w:w="2576"/>
+        <w:gridCol w:w="2212"/>
+      </w:tblGrid>
+      <w:tr>
+        <w:trPr>
+          <w:tblHeader/>
+          <w:tblCellSpacing w:w="15" w:type="dxa"/>
+        </w:trPr>
+        <w:tc>
+          <w:tcPr>
+            <w:tcW w:w="0" w:type="auto"/>
+            <w:vAlign w:val="center"/>
+            <w:hideMark/>
+          </w:tcPr>
+          <w:p>
+            <w:pPr>
+              <w:spacing w:after="0" w:line="240" w:lineRule="auto"/>
+              <w:jc w:val="center"/>
+              <w:rPr>
+                <w:rFonts w:ascii="Times New Roman" w:eastAsia="Times New Roman" w:hAnsi="Times New Roman" w:cs="Times New Roman"/>
+                <w:b/>
+                <w:bCs/>
+                <w:sz w:val="24"/>
+                <w:szCs w:val="24"/>
+                <w:lang w:eastAsia="fr-FR"/>
+              </w:rPr>
+            </w:pPr>
+            <w:r>
+              <w:rPr>
+                <w:rFonts w:ascii="Times New Roman" w:eastAsia="Times New Roman" w:hAnsi="Times New Roman" w:cs="Times New Roman"/>
+                <w:b/>
+                <w:bCs/>
+                <w:sz w:val="24"/>
+                <w:szCs w:val="24"/>
+                <w:lang w:eastAsia="fr-FR"/>
+              </w:rPr>
+              <w:t>Critère</w:t>
+            </w:r>
+          </w:p>
+        </w:tc>
+        <w:tc>
+          <w:tcPr>
+            <w:tcW w:w="0" w:type="auto"/>
+            <w:vAlign w:val="center"/>
+            <w:hideMark/>
+          </w:tcPr>
+          <w:p>
+            <w:pPr>
+              <w:spacing w:after="0" w:line="240" w:lineRule="auto"/>
+              <w:jc w:val="center"/>
+              <w:rPr>
+                <w:rFonts w:ascii="Times New Roman" w:eastAsia="Times New Roman" w:hAnsi="Times New Roman" w:cs="Times New Roman"/>
+                <w:b/>
+                <w:bCs/>
+                <w:sz w:val="24"/>
+                <w:szCs w:val="24"/>
+                <w:lang w:eastAsia="fr-FR"/>
+              </w:rPr>
+            </w:pPr>
+            <w:r>
+              <w:rPr>
+                <w:rFonts w:ascii="Times New Roman" w:eastAsia="Times New Roman" w:hAnsi="Times New Roman" w:cs="Times New Roman"/>
+                <w:b/>
+                <w:bCs/>
+                <w:sz w:val="24"/>
+                <w:szCs w:val="24"/>
+                <w:lang w:eastAsia="fr-FR"/>
+              </w:rPr>
+              <w:t>Prompt A (sans doc)</w:t>
+            </w:r>
+          </w:p>
+        </w:tc>
+        <w:tc>
+          <w:tcPr>
+            <w:tcW w:w="0" w:type="auto"/>
+            <w:vAlign w:val="center"/>
+            <w:hideMark/>
+          </w:tcPr>
+          <w:p>
+            <w:pPr>
+              <w:spacing w:after="0" w:line="240" w:lineRule="auto"/>
+              <w:jc w:val="center"/>
+              <w:rPr>
+                <w:rFonts w:ascii="Times New Roman" w:eastAsia="Times New Roman" w:hAnsi="Times New Roman" w:cs="Times New Roman"/>
+                <w:b/>
+                <w:bCs/>
+                <w:sz w:val="24"/>
+                <w:szCs w:val="24"/>
+                <w:lang w:eastAsia="fr-FR"/>
+              </w:rPr>
+            </w:pPr>
+            <w:r>
+              <w:rPr>
+                <w:rFonts w:ascii="Times New Roman" w:eastAsia="Times New Roman" w:hAnsi="Times New Roman" w:cs="Times New Roman"/>
+                <w:b/>
+                <w:bCs/>
+                <w:sz w:val="24"/>
+                <w:szCs w:val="24"/>
+                <w:lang w:eastAsia="fr-FR"/>
+              </w:rPr>
+              <w:t>Prompt B (avec doc)</w:t>
+            </w:r>
+          </w:p>
+        </w:tc>
+        <w:tc>
+          <w:tcPr>
+            <w:tcW w:w="0" w:type="auto"/>
+            <w:vAlign w:val="center"/>
+            <w:hideMark/>
+          </w:tcPr>
+          <w:p>
+            <w:pPr>
+              <w:spacing w:after="0" w:line="240" w:lineRule="auto"/>
+              <w:jc w:val="center"/>
+              <w:rPr>
+                <w:rFonts w:ascii="Times New Roman" w:eastAsia="Times New Roman" w:hAnsi="Times New Roman" w:cs="Times New Roman"/>
+                <w:b/>
+                <w:bCs/>
+                <w:sz w:val="24"/>
+                <w:szCs w:val="24"/>
+                <w:lang w:eastAsia="fr-FR"/>
+              </w:rPr>
+            </w:pPr>
+            <w:r>
+              <w:rPr>
+                <w:rFonts w:ascii="Times New Roman" w:eastAsia="Times New Roman" w:hAnsi="Times New Roman" w:cs="Times New Roman"/>
+                <w:b/>
+                <w:bCs/>
+                <w:sz w:val="24"/>
+                <w:szCs w:val="24"/>
+                <w:lang w:eastAsia="fr-FR"/>
+              </w:rPr>
+              <w:t>Prompt C (avec doc + contraintes)</w:t>
+            </w:r>
+          </w:p>
+        </w:tc>
+      </w:tr>
+      <w:tr>
+        <w:trPr>
+          <w:tblCellSpacing w:w="15" w:type="dxa"/>
+        </w:trPr>
+        <w:tc>
+          <w:tcPr>
+            <w:tcW w:w="0" w:type="auto"/>
+            <w:vAlign w:val="center"/>
+            <w:hideMark/>
+          </w:tcPr>
+          <w:p>
+            <w:pPr>
+              <w:spacing w:after="0" w:line="240" w:lineRule="auto"/>
+              <w:rPr>
+                <w:rFonts w:ascii="Times New Roman" w:eastAsia="Times New Roman" w:hAnsi="Times New Roman" w:cs="Times New Roman"/>
+                <w:sz w:val="24"/>
+                <w:szCs w:val="24"/>
+                <w:lang w:eastAsia="fr-FR"/>
+              </w:rPr>
+            </w:pPr>
+            <w:r>
+              <w:rPr>
+                <w:rFonts w:ascii="Times New Roman" w:eastAsia="Times New Roman" w:hAnsi="Times New Roman" w:cs="Times New Roman"/>
+                <w:b/>
+                <w:bCs/>
+                <w:sz w:val="24"/>
+                <w:szCs w:val="24"/>
+                <w:lang w:eastAsia="fr-FR"/>
+              </w:rPr>
+              <w:t>Réponse correcte ?</w:t>
+            </w:r>
+          </w:p>
+        </w:tc>
+        <w:tc>
+          <w:tcPr>
+            <w:tcW w:w="0" w:type="auto"/>
+            <w:vAlign w:val="center"/>
+            <w:hideMark/>
+          </w:tcPr>
+          <w:p>
+            <w:pPr>
+              <w:spacing w:after="0" w:line="240" w:lineRule="auto"/>
+              <w:rPr>
+                <w:rFonts w:ascii="Times New Roman" w:eastAsia="Times New Roman" w:hAnsi="Times New Roman" w:cs="Times New Roman"/>
+                <w:sz w:val="24"/>
+                <w:szCs w:val="24"/>
+                <w:lang w:eastAsia="fr-FR"/>
+              </w:rPr>
+            </w:pPr>
+            <w:r>
+              <w:rPr>
+                <w:rFonts w:ascii="Segoe UI Emoji" w:eastAsia="Times New Roman" w:hAnsi="Segoe UI Emoji" w:cs="Segoe UI Emoji"/>
+                <w:sz w:val="24"/>
+                <w:szCs w:val="24"/>
+                <w:lang w:eastAsia="fr-FR"/>
+              </w:rPr>
+              <w:t>❌</w:t>
+            </w:r>
+            <w:r>
+              <w:rPr>
+                <w:rFonts w:ascii="Segoe UI Emoji" w:eastAsia="Times New Roman" w:hAnsi="Segoe UI Emoji" w:cs="Segoe UI Emoji"/>
+                <w:sz w:val="24"/>
+                <w:szCs w:val="24"/>
+                <w:lang w:eastAsia="fr-FR"/>
+              </w:rPr>
+              <w:t xml:space="preserve"> </w:t>
+            </w:r>
+            <w:r>
+              <w:rPr>
+                <w:rFonts w:ascii="Times New Roman" w:eastAsia="Times New Roman" w:hAnsi="Times New Roman" w:cs="Times New Roman"/>
+                <w:sz w:val="24"/>
+                <w:szCs w:val="24"/>
+                <w:lang w:eastAsia="fr-FR"/>
+              </w:rPr>
+              <w:t>Pas garantie : le modèle doit répondre à partir de ses connaissances et peut se tromper sur les valeurs précises du mémoire.</w:t>
+            </w:r>
+          </w:p>
+        </w:tc>
+        <w:tc>
+          <w:tcPr>
+            <w:tcW w:w="0" w:type="auto"/>
+            <w:vAlign w:val="center"/>
+            <w:hideMark/>
+          </w:tcPr>
+          <w:p>
+            <w:pPr>
+              <w:spacing w:after="0" w:line="240" w:lineRule="auto"/>
+              <w:rPr>
+                <w:rFonts w:ascii="Times New Roman" w:eastAsia="Times New Roman" w:hAnsi="Times New Roman" w:cs="Times New Roman"/>
+                <w:sz w:val="24"/>
+                <w:szCs w:val="24"/>
+                <w:lang w:eastAsia="fr-FR"/>
+              </w:rPr>
+            </w:pPr>
+            <w:r>
+              <w:rPr>
+                <w:rFonts w:ascii="Segoe UI Emoji" w:eastAsia="Times New Roman" w:hAnsi="Segoe UI Emoji" w:cs="Segoe UI Emoji"/>
+                <w:sz w:val="24"/>
+                <w:szCs w:val="24"/>
+                <w:lang w:eastAsia="fr-FR"/>
+              </w:rPr>
+              <w:t>✅</w:t>
+            </w:r>
+            <w:r>
+              <w:rPr>
+                <w:rFonts w:ascii="Times New Roman" w:eastAsia="Times New Roman" w:hAnsi="Times New Roman" w:cs="Times New Roman"/>
+                <w:sz w:val="24"/>
+                <w:szCs w:val="24"/>
+                <w:lang w:eastAsia="fr-FR"/>
+              </w:rPr>
+              <w:t xml:space="preserve"> Oui, si le document contient bien les valeurs recherchées.</w:t>
+            </w:r>
+          </w:p>
+        </w:tc>
+        <w:tc>
+          <w:tcPr>
+            <w:tcW w:w="0" w:type="auto"/>
+            <w:vAlign w:val="center"/>
+            <w:hideMark/>
+          </w:tcPr>
+          <w:p>
+            <w:pPr>
+              <w:spacing w:after="0" w:line="240" w:lineRule="auto"/>
+              <w:rPr>
+                <w:rFonts w:ascii="Times New Roman" w:eastAsia="Times New Roman" w:hAnsi="Times New Roman" w:cs="Times New Roman"/>
+                <w:sz w:val="24"/>
+                <w:szCs w:val="24"/>
+                <w:lang w:eastAsia="fr-FR"/>
+              </w:rPr>
+            </w:pPr>
+            <w:r>
+              <w:rPr>
+                <w:rFonts w:ascii="Segoe UI Emoji" w:eastAsia="Times New Roman" w:hAnsi="Segoe UI Emoji" w:cs="Segoe UI Emoji"/>
+                <w:sz w:val="24"/>
+                <w:szCs w:val="24"/>
+                <w:lang w:eastAsia="fr-FR"/>
+              </w:rPr>
+              <w:t>✅</w:t>
+            </w:r>
+            <w:r>
+              <w:rPr>
+                <w:rFonts w:ascii="Times New Roman" w:eastAsia="Times New Roman" w:hAnsi="Times New Roman" w:cs="Times New Roman"/>
+                <w:sz w:val="24"/>
+                <w:szCs w:val="24"/>
+                <w:lang w:eastAsia="fr-FR"/>
+              </w:rPr>
+              <w:t xml:space="preserve"> </w:t>
+            </w:r>
+            <w:r>
+              <w:rPr>
+                <w:rFonts w:ascii="Times New Roman" w:eastAsia="Times New Roman" w:hAnsi="Times New Roman" w:cs="Times New Roman"/>
+                <w:b/>
+                <w:bCs/>
+                <w:sz w:val="24"/>
+                <w:szCs w:val="24"/>
+                <w:lang w:eastAsia="fr-FR"/>
+              </w:rPr>
+              <w:t>Oui</w:t>
+            </w:r>
+            <w:r>
+              <w:rPr>
+                <w:rFonts w:ascii="Times New Roman" w:eastAsia="Times New Roman" w:hAnsi="Times New Roman" w:cs="Times New Roman"/>
+                <w:sz w:val="24"/>
+                <w:szCs w:val="24"/>
+                <w:lang w:eastAsia="fr-FR"/>
+              </w:rPr>
+              <w:t>, avec une réponse directement fondée sur le document.</w:t>
+            </w:r>
+          </w:p>
+        </w:tc>
+      </w:tr>
+      <w:tr>
+        <w:trPr>
+          <w:tblCellSpacing w:w="15" w:type="dxa"/>
+        </w:trPr>
+        <w:tc>
+          <w:tcPr>
+            <w:tcW w:w="0" w:type="auto"/>
+            <w:vAlign w:val="center"/>
+            <w:hideMark/>
+          </w:tcPr>
+          <w:p>
+            <w:pPr>
+              <w:spacing w:after="0" w:line="240" w:lineRule="auto"/>
+              <w:rPr>
+                <w:rFonts w:ascii="Times New Roman" w:eastAsia="Times New Roman" w:hAnsi="Times New Roman" w:cs="Times New Roman"/>
+                <w:sz w:val="24"/>
+                <w:szCs w:val="24"/>
+                <w:lang w:eastAsia="fr-FR"/>
+              </w:rPr>
+            </w:pPr>
+            <w:r>
+              <w:rPr>
+                <w:rFonts w:ascii="Times New Roman" w:eastAsia="Times New Roman" w:hAnsi="Times New Roman" w:cs="Times New Roman"/>
+                <w:b/>
+                <w:bCs/>
+                <w:sz w:val="24"/>
+                <w:szCs w:val="24"/>
+                <w:lang w:eastAsia="fr-FR"/>
+              </w:rPr>
+              <w:t>Information inventée (hallucination) ?</w:t>
+            </w:r>
+          </w:p>
+        </w:tc>
+        <w:tc>
+          <w:tcPr>
+            <w:tcW w:w="0" w:type="auto"/>
+            <w:vAlign w:val="center"/>
+            <w:hideMark/>
+          </w:tcPr>
+          <w:p>
+            <w:pPr>
+              <w:spacing w:after="0" w:line="240" w:lineRule="auto"/>
+              <w:rPr>
+                <w:rFonts w:ascii="Times New Roman" w:eastAsia="Times New Roman" w:hAnsi="Times New Roman" w:cs="Times New Roman"/>
+                <w:sz w:val="24"/>
+                <w:szCs w:val="24"/>
+                <w:lang w:eastAsia="fr-FR"/>
+              </w:rPr>
+            </w:pPr>
+            <w:r>
+              <w:rPr>
+                <w:rFonts w:ascii="Segoe UI Emoji" w:eastAsia="Times New Roman" w:hAnsi="Segoe UI Emoji" w:cs="Segoe UI Emoji"/>
+                <w:sz w:val="24"/>
+                <w:szCs w:val="24"/>
+                <w:lang w:eastAsia="fr-FR"/>
+              </w:rPr>
+              <w:t>⚠️</w:t>
+            </w:r>
+            <w:r>
+              <w:rPr>
+                <w:rFonts w:ascii="Times New Roman" w:eastAsia="Times New Roman" w:hAnsi="Times New Roman" w:cs="Times New Roman"/>
+                <w:sz w:val="24"/>
+                <w:szCs w:val="24"/>
+                <w:lang w:eastAsia="fr-FR"/>
+              </w:rPr>
+              <w:t xml:space="preserve"> </w:t>
+            </w:r>
+            <w:r>
+              <w:rPr>
+                <w:rFonts w:ascii="Times New Roman" w:eastAsia="Times New Roman" w:hAnsi="Times New Roman" w:cs="Times New Roman"/>
+                <w:b/>
+                <w:bCs/>
+                <w:sz w:val="24"/>
+                <w:szCs w:val="24"/>
+                <w:lang w:eastAsia="fr-FR"/>
+              </w:rPr>
+              <w:t>Risque élevé</w:t>
+            </w:r>
+            <w:r>
+              <w:rPr>
+                <w:rFonts w:ascii="Times New Roman" w:eastAsia="Times New Roman" w:hAnsi="Times New Roman" w:cs="Times New Roman"/>
+                <w:sz w:val="24"/>
+                <w:szCs w:val="24"/>
+                <w:lang w:eastAsia="fr-FR"/>
+              </w:rPr>
+              <w:t xml:space="preserve"> : absence de document et de contraintes permettant de vérifier la réponse.</w:t>
+            </w:r>
+          </w:p>
+        </w:tc>
+        <w:tc>
+          <w:tcPr>
+            <w:tcW w:w="0" w:type="auto"/>
+            <w:vAlign w:val="center"/>
+            <w:hideMark/>
+          </w:tcPr>
+          <w:p>
+            <w:pPr>
+              <w:spacing w:after="0" w:line="240" w:lineRule="auto"/>
+              <w:rPr>
+                <w:rFonts w:ascii="Times New Roman" w:eastAsia="Times New Roman" w:hAnsi="Times New Roman" w:cs="Times New Roman"/>
+                <w:sz w:val="24"/>
+                <w:szCs w:val="24"/>
+                <w:lang w:eastAsia="fr-FR"/>
+              </w:rPr>
+            </w:pPr>
+            <w:r>
+              <w:rPr>
+                <w:rFonts w:ascii="Segoe UI Emoji" w:eastAsia="Times New Roman" w:hAnsi="Segoe UI Emoji" w:cs="Segoe UI Emoji"/>
+                <w:sz w:val="24"/>
+                <w:szCs w:val="24"/>
+                <w:lang w:eastAsia="fr-FR"/>
+              </w:rPr>
+              <w:t>⚠️</w:t>
+            </w:r>
+            <w:r>
+              <w:rPr>
+                <w:rFonts w:ascii="Times New Roman" w:eastAsia="Times New Roman" w:hAnsi="Times New Roman" w:cs="Times New Roman"/>
+                <w:sz w:val="24"/>
+                <w:szCs w:val="24"/>
+                <w:lang w:eastAsia="fr-FR"/>
+              </w:rPr>
+              <w:t xml:space="preserve"> </w:t>
+            </w:r>
+            <w:r>
+              <w:rPr>
+                <w:rFonts w:ascii="Times New Roman" w:eastAsia="Times New Roman" w:hAnsi="Times New Roman" w:cs="Times New Roman"/>
+                <w:b/>
+                <w:bCs/>
+                <w:sz w:val="24"/>
+                <w:szCs w:val="24"/>
+                <w:lang w:eastAsia="fr-FR"/>
+              </w:rPr>
+              <w:t>Risque réduit</w:t>
+            </w:r>
+            <w:r>
+              <w:rPr>
+                <w:rFonts w:ascii="Times New Roman" w:eastAsia="Times New Roman" w:hAnsi="Times New Roman" w:cs="Times New Roman"/>
+                <w:sz w:val="24"/>
+                <w:szCs w:val="24"/>
+                <w:lang w:eastAsia="fr-FR"/>
+              </w:rPr>
+              <w:t>, mais le modèle peut encore compléter avec des connaissances externes ou déduire une information non présente.</w:t>
+            </w:r>
+          </w:p>
+        </w:tc>
+        <w:tc>
+          <w:tcPr>
+            <w:tcW w:w="0" w:type="auto"/>
+            <w:vAlign w:val="center"/>
+            <w:hideMark/>
+          </w:tcPr>
+          <w:p>
+            <w:pPr>
+              <w:spacing w:after="0" w:line="240" w:lineRule="auto"/>
+              <w:rPr>
+                <w:rFonts w:ascii="Times New Roman" w:eastAsia="Times New Roman" w:hAnsi="Times New Roman" w:cs="Times New Roman"/>
+                <w:sz w:val="24"/>
+                <w:szCs w:val="24"/>
+                <w:lang w:eastAsia="fr-FR"/>
+              </w:rPr>
+            </w:pPr>
+            <w:r>
+              <w:rPr>
+                <w:rFonts w:ascii="Segoe UI Emoji" w:eastAsia="Times New Roman" w:hAnsi="Segoe UI Emoji" w:cs="Segoe UI Emoji"/>
+                <w:sz w:val="24"/>
+                <w:szCs w:val="24"/>
+                <w:lang w:eastAsia="fr-FR"/>
+              </w:rPr>
+              <w:t>✅</w:t>
+            </w:r>
+            <w:r>
+              <w:rPr>
+                <w:rFonts w:ascii="Times New Roman" w:eastAsia="Times New Roman" w:hAnsi="Times New Roman" w:cs="Times New Roman"/>
+                <w:sz w:val="24"/>
+                <w:szCs w:val="24"/>
+                <w:lang w:eastAsia="fr-FR"/>
+              </w:rPr>
+              <w:t xml:space="preserve"> </w:t>
+            </w:r>
+            <w:r>
+              <w:rPr>
+                <w:rFonts w:ascii="Times New Roman" w:eastAsia="Times New Roman" w:hAnsi="Times New Roman" w:cs="Times New Roman"/>
+                <w:b/>
+                <w:bCs/>
+                <w:sz w:val="24"/>
+                <w:szCs w:val="24"/>
+                <w:lang w:eastAsia="fr-FR"/>
+              </w:rPr>
+              <w:t>Risque fortement réduit</w:t>
+            </w:r>
+            <w:r>
+              <w:rPr>
+                <w:rFonts w:ascii="Times New Roman" w:eastAsia="Times New Roman" w:hAnsi="Times New Roman" w:cs="Times New Roman"/>
+                <w:sz w:val="24"/>
+                <w:szCs w:val="24"/>
+                <w:lang w:eastAsia="fr-FR"/>
+              </w:rPr>
+              <w:t xml:space="preserve"> grâce à l'obligation d'utiliser uniquement le document et de ne rien inventer.</w:t>
+            </w:r>
+          </w:p>
+        </w:tc>
+      </w:tr>
+      <w:tr>
+        <w:trPr>
+          <w:tblCellSpacing w:w="15" w:type="dxa"/>
+        </w:trPr>
+        <w:tc>
+          <w:tcPr>
+            <w:tcW w:w="0" w:type="auto"/>
+            <w:vAlign w:val="center"/>
+            <w:hideMark/>
+          </w:tcPr>
+          <w:p>
+            <w:pPr>
+              <w:spacing w:after="0" w:line="240" w:lineRule="auto"/>
+              <w:rPr>
+                <w:rFonts w:ascii="Times New Roman" w:eastAsia="Times New Roman" w:hAnsi="Times New Roman" w:cs="Times New Roman"/>
+                <w:sz w:val="24"/>
+                <w:szCs w:val="24"/>
+                <w:lang w:eastAsia="fr-FR"/>
+              </w:rPr>
+            </w:pPr>
+            <w:r>
+              <w:rPr>
+                <w:rFonts w:ascii="Times New Roman" w:eastAsia="Times New Roman" w:hAnsi="Times New Roman" w:cs="Times New Roman"/>
+                <w:b/>
+                <w:bCs/>
+                <w:sz w:val="24"/>
+                <w:szCs w:val="24"/>
+                <w:lang w:eastAsia="fr-FR"/>
+              </w:rPr>
+              <w:t>Source/passage cité ?</w:t>
+            </w:r>
+          </w:p>
+        </w:tc>
+        <w:tc>
+          <w:tcPr>
+            <w:tcW w:w="0" w:type="auto"/>
+            <w:vAlign w:val="center"/>
+            <w:hideMark/>
+          </w:tcPr>
+          <w:p>
+            <w:pPr>
+              <w:spacing w:after="0" w:line="240" w:lineRule="auto"/>
+              <w:rPr>
+                <w:rFonts w:ascii="Times New Roman" w:eastAsia="Times New Roman" w:hAnsi="Times New Roman" w:cs="Times New Roman"/>
+                <w:sz w:val="24"/>
+                <w:szCs w:val="24"/>
+                <w:lang w:eastAsia="fr-FR"/>
+              </w:rPr>
+            </w:pPr>
+            <w:r>
+              <w:rPr>
+                <w:rFonts w:ascii="Segoe UI Emoji" w:eastAsia="Times New Roman" w:hAnsi="Segoe UI Emoji" w:cs="Segoe UI Emoji"/>
+                <w:sz w:val="24"/>
+                <w:szCs w:val="24"/>
+                <w:lang w:eastAsia="fr-FR"/>
+              </w:rPr>
+              <w:t>❌</w:t>
+            </w:r>
+            <w:r>
+              <w:rPr>
+                <w:rFonts w:ascii="Times New Roman" w:eastAsia="Times New Roman" w:hAnsi="Times New Roman" w:cs="Times New Roman"/>
+                <w:sz w:val="24"/>
+                <w:szCs w:val="24"/>
+                <w:lang w:eastAsia="fr-FR"/>
+              </w:rPr>
+              <w:t xml:space="preserve"> Non, puisqu'aucun document n'est fourni.</w:t>
+            </w:r>
+          </w:p>
+        </w:tc>
+        <w:tc>
+          <w:tcPr>
+            <w:tcW w:w="0" w:type="auto"/>
+            <w:vAlign w:val="center"/>
+            <w:hideMark/>
+          </w:tcPr>
+          <w:p>
+            <w:pPr>
+              <w:spacing w:after="0" w:line="240" w:lineRule="auto"/>
+              <w:rPr>
+                <w:rFonts w:ascii="Times New Roman" w:eastAsia="Times New Roman" w:hAnsi="Times New Roman" w:cs="Times New Roman"/>
+                <w:sz w:val="24"/>
+                <w:szCs w:val="24"/>
+                <w:lang w:eastAsia="fr-FR"/>
+              </w:rPr>
+            </w:pPr>
+            <w:r>
+              <w:rPr>
+                <w:rFonts w:ascii="Segoe UI Emoji" w:eastAsia="Times New Roman" w:hAnsi="Segoe UI Emoji" w:cs="Segoe UI Emoji"/>
+                <w:sz w:val="24"/>
+                <w:szCs w:val="24"/>
+                <w:lang w:eastAsia="fr-FR"/>
+              </w:rPr>
+              <w:t>⚠️</w:t>
+            </w:r>
+            <w:r>
+              <w:rPr>
+                <w:rFonts w:ascii="Times New Roman" w:eastAsia="Times New Roman" w:hAnsi="Times New Roman" w:cs="Times New Roman"/>
+                <w:sz w:val="24"/>
+                <w:szCs w:val="24"/>
+                <w:lang w:eastAsia="fr-FR"/>
+              </w:rPr>
+              <w:t xml:space="preserve"> Pas nécessairement : cela dépend de la formulation du prompt.</w:t>
+            </w:r>
+          </w:p>
+        </w:tc>
+        <w:tc>
+          <w:tcPr>
+            <w:tcW w:w="0" w:type="auto"/>
+            <w:vAlign w:val="center"/>
+            <w:hideMark/>
+          </w:tcPr>
+          <w:p>
+            <w:pPr>
+              <w:spacing w:after="0" w:line="240" w:lineRule="auto"/>
+              <w:rPr>
+                <w:rFonts w:ascii="Times New Roman" w:eastAsia="Times New Roman" w:hAnsi="Times New Roman" w:cs="Times New Roman"/>
+                <w:sz w:val="24"/>
+                <w:szCs w:val="24"/>
+                <w:lang w:eastAsia="fr-FR"/>
+              </w:rPr>
+            </w:pPr>
+            <w:r>
+              <w:rPr>
+                <w:rFonts w:ascii="Segoe UI Emoji" w:eastAsia="Times New Roman" w:hAnsi="Segoe UI Emoji" w:cs="Segoe UI Emoji"/>
+                <w:sz w:val="24"/>
+                <w:szCs w:val="24"/>
+                <w:lang w:eastAsia="fr-FR"/>
+              </w:rPr>
+              <w:t>✅</w:t>
+            </w:r>
+            <w:r>
+              <w:rPr>
+                <w:rFonts w:ascii="Times New Roman" w:eastAsia="Times New Roman" w:hAnsi="Times New Roman" w:cs="Times New Roman"/>
+                <w:sz w:val="24"/>
+                <w:szCs w:val="24"/>
+                <w:lang w:eastAsia="fr-FR"/>
+              </w:rPr>
+              <w:t xml:space="preserve"> </w:t>
+            </w:r>
+            <w:r>
+              <w:rPr>
+                <w:rFonts w:ascii="Times New Roman" w:eastAsia="Times New Roman" w:hAnsi="Times New Roman" w:cs="Times New Roman"/>
+                <w:b/>
+                <w:bCs/>
+                <w:sz w:val="24"/>
+                <w:szCs w:val="24"/>
+                <w:lang w:eastAsia="fr-FR"/>
+              </w:rPr>
+              <w:t>Oui</w:t>
+            </w:r>
+            <w:r>
+              <w:rPr>
+                <w:rFonts w:ascii="Times New Roman" w:eastAsia="Times New Roman" w:hAnsi="Times New Roman" w:cs="Times New Roman"/>
+                <w:sz w:val="24"/>
+                <w:szCs w:val="24"/>
+                <w:lang w:eastAsia="fr-FR"/>
+              </w:rPr>
+              <w:t xml:space="preserve"> : le prompt exige explicitement de citer le tableau, la section ou la page.</w:t>
+            </w:r>
+          </w:p>
+        </w:tc>
+      </w:tr>
+      <w:tr>
+        <w:trPr>
+          <w:tblCellSpacing w:w="15" w:type="dxa"/>
+        </w:trPr>
+        <w:tc>
+          <w:tcPr>
+            <w:tcW w:w="0" w:type="auto"/>
+            <w:vAlign w:val="center"/>
+            <w:hideMark/>
+          </w:tcPr>
+          <w:p>
+            <w:pPr>
+              <w:spacing w:after="0" w:line="240" w:lineRule="auto"/>
+              <w:rPr>
+                <w:rFonts w:ascii="Times New Roman" w:eastAsia="Times New Roman" w:hAnsi="Times New Roman" w:cs="Times New Roman"/>
+                <w:sz w:val="24"/>
+                <w:szCs w:val="24"/>
+                <w:lang w:eastAsia="fr-FR"/>
+              </w:rPr>
+            </w:pPr>
+            <w:r>
+              <w:rPr>
+                <w:rFonts w:ascii="Times New Roman" w:eastAsia="Times New Roman" w:hAnsi="Times New Roman" w:cs="Times New Roman"/>
+                <w:b/>
+                <w:bCs/>
+                <w:sz w:val="24"/>
+                <w:szCs w:val="24"/>
+                <w:lang w:eastAsia="fr-FR"/>
+              </w:rPr>
+              <w:t>Signale l'absence d'info si applicable ?</w:t>
+            </w:r>
+          </w:p>
+        </w:tc>
+        <w:tc>
+          <w:tcPr>
+            <w:tcW w:w="0" w:type="auto"/>
+            <w:vAlign w:val="center"/>
+            <w:hideMark/>
+          </w:tcPr>
+          <w:p>
+            <w:pPr>
+              <w:spacing w:after="0" w:line="240" w:lineRule="auto"/>
+              <w:rPr>
+                <w:rFonts w:ascii="Times New Roman" w:eastAsia="Times New Roman" w:hAnsi="Times New Roman" w:cs="Times New Roman"/>
+                <w:sz w:val="24"/>
+                <w:szCs w:val="24"/>
+                <w:lang w:eastAsia="fr-FR"/>
+              </w:rPr>
+            </w:pPr>
+            <w:r>
+              <w:rPr>
+                <w:rFonts w:ascii="Segoe UI Emoji" w:eastAsia="Times New Roman" w:hAnsi="Segoe UI Emoji" w:cs="Segoe UI Emoji"/>
+                <w:sz w:val="24"/>
+                <w:szCs w:val="24"/>
+                <w:lang w:eastAsia="fr-FR"/>
+              </w:rPr>
+              <w:t>❌</w:t>
+            </w:r>
+            <w:r>
+              <w:rPr>
+                <w:rFonts w:ascii="Times New Roman" w:eastAsia="Times New Roman" w:hAnsi="Times New Roman" w:cs="Times New Roman"/>
+                <w:sz w:val="24"/>
+                <w:szCs w:val="24"/>
+                <w:lang w:eastAsia="fr-FR"/>
+              </w:rPr>
+              <w:t xml:space="preserve"> Non imposé.</w:t>
+            </w:r>
+          </w:p>
+        </w:tc>
+        <w:tc>
+          <w:tcPr>
+            <w:tcW w:w="0" w:type="auto"/>
+            <w:vAlign w:val="center"/>
+            <w:hideMark/>
+          </w:tcPr>
+          <w:p>
+            <w:pPr>
+              <w:spacing w:after="0" w:line="240" w:lineRule="auto"/>
+              <w:rPr>
+                <w:rFonts w:ascii="Times New Roman" w:eastAsia="Times New Roman" w:hAnsi="Times New Roman" w:cs="Times New Roman"/>
+                <w:sz w:val="24"/>
+                <w:szCs w:val="24"/>
+                <w:lang w:eastAsia="fr-FR"/>
+              </w:rPr>
+            </w:pPr>
+            <w:r>
+              <w:rPr>
+                <w:rFonts w:ascii="Segoe UI Emoji" w:eastAsia="Times New Roman" w:hAnsi="Segoe UI Emoji" w:cs="Segoe UI Emoji"/>
+                <w:sz w:val="24"/>
+                <w:szCs w:val="24"/>
+                <w:lang w:eastAsia="fr-FR"/>
+              </w:rPr>
+              <w:t>❌</w:t>
+            </w:r>
+            <w:r>
+              <w:rPr>
+                <w:rFonts w:ascii="Times New Roman" w:eastAsia="Times New Roman" w:hAnsi="Times New Roman" w:cs="Times New Roman"/>
+                <w:sz w:val="24"/>
+                <w:szCs w:val="24"/>
+                <w:lang w:eastAsia="fr-FR"/>
+              </w:rPr>
+              <w:t xml:space="preserve"> Non imposé.</w:t>
+            </w:r>
+          </w:p>
+        </w:tc>
+        <w:tc>
+          <w:tcPr>
+            <w:tcW w:w="0" w:type="auto"/>
+            <w:vAlign w:val="center"/>
+            <w:hideMark/>
+          </w:tcPr>
+          <w:p>
+            <w:pPr>
+              <w:spacing w:after="0" w:line="240" w:lineRule="auto"/>
+              <w:rPr>
+                <w:rFonts w:ascii="Times New Roman" w:eastAsia="Times New Roman" w:hAnsi="Times New Roman" w:cs="Times New Roman"/>
+                <w:sz w:val="24"/>
+                <w:szCs w:val="24"/>
+                <w:lang w:eastAsia="fr-FR"/>
+              </w:rPr>
+            </w:pPr>
+            <w:r>
+              <w:rPr>
+                <w:rFonts w:ascii="Segoe UI Emoji" w:eastAsia="Times New Roman" w:hAnsi="Segoe UI Emoji" w:cs="Segoe UI Emoji"/>
+                <w:sz w:val="24"/>
+                <w:szCs w:val="24"/>
+                <w:lang w:eastAsia="fr-FR"/>
+              </w:rPr>
+              <w:t>✅</w:t>
+            </w:r>
+            <w:r>
+              <w:rPr>
+                <w:rFonts w:ascii="Times New Roman" w:eastAsia="Times New Roman" w:hAnsi="Times New Roman" w:cs="Times New Roman"/>
+                <w:sz w:val="24"/>
+                <w:szCs w:val="24"/>
+                <w:lang w:eastAsia="fr-FR"/>
+              </w:rPr>
+              <w:t xml:space="preserve"> </w:t>
+            </w:r>
+            <w:r>
+              <w:rPr>
+                <w:rFonts w:ascii="Times New Roman" w:eastAsia="Times New Roman" w:hAnsi="Times New Roman" w:cs="Times New Roman"/>
+                <w:b/>
+                <w:bCs/>
+                <w:sz w:val="24"/>
+                <w:szCs w:val="24"/>
+                <w:lang w:eastAsia="fr-FR"/>
+              </w:rPr>
+              <w:t>Oui</w:t>
+            </w:r>
+            <w:r>
+              <w:rPr>
+                <w:rFonts w:ascii="Times New Roman" w:eastAsia="Times New Roman" w:hAnsi="Times New Roman" w:cs="Times New Roman"/>
+                <w:sz w:val="24"/>
+                <w:szCs w:val="24"/>
+                <w:lang w:eastAsia="fr-FR"/>
+              </w:rPr>
+              <w:t xml:space="preserve"> : le modèle doit explicitement indiquer si l'information n'est pas présente dans le document.</w:t>
+            </w:r>
+          </w:p>
+        </w:tc>
+      </w:tr>
+    </w:tbl>
+    <w:p>
+      <w:pPr>
+        <w:pStyle w:val="NormalWeb"/>
+        <w:rPr>
+          <w:rStyle w:val="lev"/>
+        </w:rPr>
+      </w:pPr>
+    </w:p>
+    <w:p>
+      <w:pPr>
+        <w:pStyle w:val="NormalWeb"/>
+        <w:rPr>
+          <w:rStyle w:val="CodeHTML"/>
+          <w:rFonts w:ascii="Times New Roman" w:hAnsi="Times New Roman" w:cs="Times New Roman"/>
+          <w:sz w:val="28"/>
+          <w:szCs w:val="28"/>
+        </w:rPr>
+      </w:pPr>
+      <w:r>
+        <w:rPr>
+          <w:rStyle w:val="CodeHTML"/>
+          <w:rFonts w:ascii="Times New Roman" w:hAnsi="Times New Roman" w:cs="Times New Roman"/>
+          <w:sz w:val="28"/>
+          <w:szCs w:val="28"/>
+        </w:rPr>
+        <w:lastRenderedPageBreak/>
+        <w:drawing>
+          <wp:inline distT="0" distB="0" distL="0" distR="0" wp14:anchorId="3652807E" wp14:editId="7E12657F">
+            <wp:extent cx="5759450" cy="3272790"/>
+            <wp:effectExtent l="0" t="0" r="0" b="3810"/>
+            <wp:docPr id="48" name="Image 48"/>
+            <wp:cNvGraphicFramePr>
+              <a:graphicFrameLocks xmlns:a="http://schemas.openxmlformats.org/drawingml/2006/main" noChangeAspect="1"/>
+            </wp:cNvGraphicFramePr>
+            <a:graphic xmlns:a="http://schemas.openxmlformats.org/drawingml/2006/main">
+              <a:graphicData uri="http://schemas.openxmlformats.org/drawingml/2006/picture">
+                <pic:pic xmlns:pic="http://schemas.openxmlformats.org/drawingml/2006/picture">
+                  <pic:nvPicPr>
+                    <pic:cNvPr id="1" name=""/>
+                    <pic:cNvPicPr/>
+                  </pic:nvPicPr>
+                  <pic:blipFill>
+                    <a:blip r:embed="rId52"/>
+                    <a:stretch>
+                      <a:fillRect/>
+                    </a:stretch>
+                  </pic:blipFill>
+                  <pic:spPr>
+                    <a:xfrm>
+                      <a:off x="0" y="0"/>
+                      <a:ext cx="5759450" cy="3272790"/>
+                    </a:xfrm>
+                    <a:prstGeom prst="rect">
+                      <a:avLst/>
+                    </a:prstGeom>
+                  </pic:spPr>
+                </pic:pic>
+              </a:graphicData>
+            </a:graphic>
+          </wp:inline>
+        </w:drawing>
+      </w:r>
     </w:p>
     <w:sectPr>
       <w:pgSz w:w="11906" w:h="16838"/>
@@ -16853,9 +18147,9 @@
     </w:lvl>
   </w:abstractNum>
   <w:abstractNum w:abstractNumId="16" w15:restartNumberingAfterBreak="0">
-    <w:nsid w:val="65390315"/>
+    <w:nsid w:val="63545749"/>
     <w:multiLevelType w:val="hybridMultilevel"/>
-    <w:tmpl w:val="ED686912"/>
+    <w:tmpl w:val="9B06C7DC"/>
     <w:lvl w:ilvl="0" w:tplc="040C0001">
       <w:start w:val="1"/>
       <w:numFmt w:val="bullet"/>
@@ -16966,9 +18260,9 @@
     </w:lvl>
   </w:abstractNum>
   <w:abstractNum w:abstractNumId="17" w15:restartNumberingAfterBreak="0">
-    <w:nsid w:val="6F710360"/>
+    <w:nsid w:val="65390315"/>
     <w:multiLevelType w:val="hybridMultilevel"/>
-    <w:tmpl w:val="66BCC23A"/>
+    <w:tmpl w:val="ED686912"/>
     <w:lvl w:ilvl="0" w:tplc="040C0001">
       <w:start w:val="1"/>
       <w:numFmt w:val="bullet"/>
@@ -17079,6 +18373,119 @@
     </w:lvl>
   </w:abstractNum>
   <w:abstractNum w:abstractNumId="18" w15:restartNumberingAfterBreak="0">
+    <w:nsid w:val="6F710360"/>
+    <w:multiLevelType w:val="hybridMultilevel"/>
+    <w:tmpl w:val="66BCC23A"/>
+    <w:lvl w:ilvl="0" w:tplc="040C0001">
+      <w:start w:val="1"/>
+      <w:numFmt w:val="bullet"/>
+      <w:lvlText w:val=""/>
+      <w:lvlJc w:val="left"/>
+      <w:pPr>
+        <w:ind w:left="720" w:hanging="360"/>
+      </w:pPr>
+      <w:rPr>
+        <w:rFonts w:ascii="Symbol" w:hAnsi="Symbol" w:hint="default"/>
+      </w:rPr>
+    </w:lvl>
+    <w:lvl w:ilvl="1" w:tplc="040C0003" w:tentative="1">
+      <w:start w:val="1"/>
+      <w:numFmt w:val="bullet"/>
+      <w:lvlText w:val="o"/>
+      <w:lvlJc w:val="left"/>
+      <w:pPr>
+        <w:ind w:left="1440" w:hanging="360"/>
+      </w:pPr>
+      <w:rPr>
+        <w:rFonts w:ascii="Courier New" w:hAnsi="Courier New" w:cs="Courier New" w:hint="default"/>
+      </w:rPr>
+    </w:lvl>
+    <w:lvl w:ilvl="2" w:tplc="040C0005" w:tentative="1">
+      <w:start w:val="1"/>
+      <w:numFmt w:val="bullet"/>
+      <w:lvlText w:val=""/>
+      <w:lvlJc w:val="left"/>
+      <w:pPr>
+        <w:ind w:left="2160" w:hanging="360"/>
+      </w:pPr>
+      <w:rPr>
+        <w:rFonts w:ascii="Wingdings" w:hAnsi="Wingdings" w:hint="default"/>
+      </w:rPr>
+    </w:lvl>
+    <w:lvl w:ilvl="3" w:tplc="040C0001" w:tentative="1">
+      <w:start w:val="1"/>
+      <w:numFmt w:val="bullet"/>
+      <w:lvlText w:val=""/>
+      <w:lvlJc w:val="left"/>
+      <w:pPr>
+        <w:ind w:left="2880" w:hanging="360"/>
+      </w:pPr>
+      <w:rPr>
+        <w:rFonts w:ascii="Symbol" w:hAnsi="Symbol" w:hint="default"/>
+      </w:rPr>
+    </w:lvl>
+    <w:lvl w:ilvl="4" w:tplc="040C0003" w:tentative="1">
+      <w:start w:val="1"/>
+      <w:numFmt w:val="bullet"/>
+      <w:lvlText w:val="o"/>
+      <w:lvlJc w:val="left"/>
+      <w:pPr>
+        <w:ind w:left="3600" w:hanging="360"/>
+      </w:pPr>
+      <w:rPr>
+        <w:rFonts w:ascii="Courier New" w:hAnsi="Courier New" w:cs="Courier New" w:hint="default"/>
+      </w:rPr>
+    </w:lvl>
+    <w:lvl w:ilvl="5" w:tplc="040C0005" w:tentative="1">
+      <w:start w:val="1"/>
+      <w:numFmt w:val="bullet"/>
+      <w:lvlText w:val=""/>
+      <w:lvlJc w:val="left"/>
+      <w:pPr>
+        <w:ind w:left="4320" w:hanging="360"/>
+      </w:pPr>
+      <w:rPr>
+        <w:rFonts w:ascii="Wingdings" w:hAnsi="Wingdings" w:hint="default"/>
+      </w:rPr>
+    </w:lvl>
+    <w:lvl w:ilvl="6" w:tplc="040C0001" w:tentative="1">
+      <w:start w:val="1"/>
+      <w:numFmt w:val="bullet"/>
+      <w:lvlText w:val=""/>
+      <w:lvlJc w:val="left"/>
+      <w:pPr>
+        <w:ind w:left="5040" w:hanging="360"/>
+      </w:pPr>
+      <w:rPr>
+        <w:rFonts w:ascii="Symbol" w:hAnsi="Symbol" w:hint="default"/>
+      </w:rPr>
+    </w:lvl>
+    <w:lvl w:ilvl="7" w:tplc="040C0003" w:tentative="1">
+      <w:start w:val="1"/>
+      <w:numFmt w:val="bullet"/>
+      <w:lvlText w:val="o"/>
+      <w:lvlJc w:val="left"/>
+      <w:pPr>
+        <w:ind w:left="5760" w:hanging="360"/>
+      </w:pPr>
+      <w:rPr>
+        <w:rFonts w:ascii="Courier New" w:hAnsi="Courier New" w:cs="Courier New" w:hint="default"/>
+      </w:rPr>
+    </w:lvl>
+    <w:lvl w:ilvl="8" w:tplc="040C0005" w:tentative="1">
+      <w:start w:val="1"/>
+      <w:numFmt w:val="bullet"/>
+      <w:lvlText w:val=""/>
+      <w:lvlJc w:val="left"/>
+      <w:pPr>
+        <w:ind w:left="6480" w:hanging="360"/>
+      </w:pPr>
+      <w:rPr>
+        <w:rFonts w:ascii="Wingdings" w:hAnsi="Wingdings" w:hint="default"/>
+      </w:rPr>
+    </w:lvl>
+  </w:abstractNum>
+  <w:abstractNum w:abstractNumId="19" w15:restartNumberingAfterBreak="0">
     <w:nsid w:val="7EC51315"/>
     <w:multiLevelType w:val="hybridMultilevel"/>
     <w:tmpl w:val="7952CE38"/>
@@ -17177,7 +18584,7 @@
     <w:abstractNumId w:val="8"/>
   </w:num>
   <w:num w:numId="4">
-    <w:abstractNumId w:val="18"/>
+    <w:abstractNumId w:val="19"/>
   </w:num>
   <w:num w:numId="5">
     <w:abstractNumId w:val="6"/>
@@ -17213,7 +18620,7 @@
     <w:abstractNumId w:val="11"/>
   </w:num>
   <w:num w:numId="16">
-    <w:abstractNumId w:val="17"/>
+    <w:abstractNumId w:val="18"/>
   </w:num>
   <w:num w:numId="17">
     <w:abstractNumId w:val="14"/>
@@ -17222,6 +18629,9 @@
     <w:abstractNumId w:val="7"/>
   </w:num>
   <w:num w:numId="19">
+    <w:abstractNumId w:val="17"/>
+  </w:num>
+  <w:num w:numId="20">
     <w:abstractNumId w:val="16"/>
   </w:num>
 </w:numbering>

</xml_diff>

<commit_message>
Partie 8  Prompe A
</commit_message>
<xml_diff>
--- a/ai-business_assistant.docx
+++ b/ai-business_assistant.docx
@@ -120,7 +120,25 @@
           <w:sz w:val="24"/>
           <w:szCs w:val="24"/>
         </w:rPr>
-        <w:t xml:space="preserve"> chatgpt de prendre </w:t>
+        <w:t xml:space="preserve"> </w:t>
+      </w:r>
+      <w:proofErr w:type="spellStart"/>
+      <w:r>
+        <w:rPr>
+          <w:rFonts w:ascii="Times New Roman" w:hAnsi="Times New Roman" w:cs="Times New Roman"/>
+          <w:sz w:val="24"/>
+          <w:szCs w:val="24"/>
+        </w:rPr>
+        <w:t>chatgpt</w:t>
+      </w:r>
+      <w:proofErr w:type="spellEnd"/>
+      <w:r>
+        <w:rPr>
+          <w:rFonts w:ascii="Times New Roman" w:hAnsi="Times New Roman" w:cs="Times New Roman"/>
+          <w:sz w:val="24"/>
+          <w:szCs w:val="24"/>
+        </w:rPr>
+        <w:t xml:space="preserve"> de prendre </w:t>
       </w:r>
       <w:r>
         <w:rPr>
@@ -913,8 +931,18 @@
           <w:sz w:val="36"/>
           <w:szCs w:val="36"/>
         </w:rPr>
-        <w:t>Partie 2 : Comparer les techniques de prompting</w:t>
-      </w:r>
+        <w:t xml:space="preserve">Partie 2 : Comparer les techniques de </w:t>
+      </w:r>
+      <w:proofErr w:type="spellStart"/>
+      <w:r>
+        <w:rPr>
+          <w:rFonts w:ascii="Times New Roman" w:hAnsi="Times New Roman" w:cs="Times New Roman"/>
+          <w:sz w:val="36"/>
+          <w:szCs w:val="36"/>
+        </w:rPr>
+        <w:t>prompting</w:t>
+      </w:r>
+      <w:proofErr w:type="spellEnd"/>
     </w:p>
     <w:p>
       <w:pPr>
@@ -931,7 +959,27 @@
           <w:szCs w:val="24"/>
           <w:lang w:eastAsia="fr-FR"/>
         </w:rPr>
-        <w:t>Tester zero-shot, one-shot, few-shot et prompt structuré sur la classification d'un commentaire.</w:t>
+        <w:t xml:space="preserve">Tester </w:t>
+      </w:r>
+      <w:proofErr w:type="spellStart"/>
+      <w:r>
+        <w:rPr>
+          <w:rFonts w:ascii="Times New Roman" w:eastAsia="Times New Roman" w:hAnsi="Times New Roman" w:cs="Times New Roman"/>
+          <w:sz w:val="24"/>
+          <w:szCs w:val="24"/>
+          <w:lang w:eastAsia="fr-FR"/>
+        </w:rPr>
+        <w:t>zero</w:t>
+      </w:r>
+      <w:proofErr w:type="spellEnd"/>
+      <w:r>
+        <w:rPr>
+          <w:rFonts w:ascii="Times New Roman" w:eastAsia="Times New Roman" w:hAnsi="Times New Roman" w:cs="Times New Roman"/>
+          <w:sz w:val="24"/>
+          <w:szCs w:val="24"/>
+          <w:lang w:eastAsia="fr-FR"/>
+        </w:rPr>
+        <w:t>-shot, one-shot, few-shot et prompt structuré sur la classification d'un commentaire.</w:t>
       </w:r>
     </w:p>
     <w:p>
@@ -1017,7 +1065,27 @@
           <w:sz w:val="28"/>
           <w:szCs w:val="28"/>
         </w:rPr>
-        <w:t>Prompt Zero-shot</w:t>
+        <w:t xml:space="preserve">Prompt </w:t>
+      </w:r>
+      <w:proofErr w:type="spellStart"/>
+      <w:r>
+        <w:rPr>
+          <w:rFonts w:ascii="Times New Roman" w:hAnsi="Times New Roman" w:cs="Times New Roman"/>
+          <w:b/>
+          <w:sz w:val="28"/>
+          <w:szCs w:val="28"/>
+        </w:rPr>
+        <w:t>Zero</w:t>
+      </w:r>
+      <w:proofErr w:type="spellEnd"/>
+      <w:r>
+        <w:rPr>
+          <w:rFonts w:ascii="Times New Roman" w:hAnsi="Times New Roman" w:cs="Times New Roman"/>
+          <w:b/>
+          <w:sz w:val="28"/>
+          <w:szCs w:val="28"/>
+        </w:rPr>
+        <w:t>-shot</w:t>
       </w:r>
     </w:p>
     <w:p>
@@ -2130,7 +2198,27 @@
           <w:sz w:val="24"/>
           <w:szCs w:val="24"/>
         </w:rPr>
-        <w:t xml:space="preserve">  "elements_positifs": [...],</w:t>
+        <w:t xml:space="preserve">  "</w:t>
+      </w:r>
+      <w:proofErr w:type="spellStart"/>
+      <w:r>
+        <w:rPr>
+          <w:rStyle w:val="CodeHTML"/>
+          <w:rFonts w:ascii="Times New Roman" w:hAnsi="Times New Roman" w:cs="Times New Roman"/>
+          <w:sz w:val="24"/>
+          <w:szCs w:val="24"/>
+        </w:rPr>
+        <w:t>elements_positifs</w:t>
+      </w:r>
+      <w:proofErr w:type="spellEnd"/>
+      <w:r>
+        <w:rPr>
+          <w:rStyle w:val="CodeHTML"/>
+          <w:rFonts w:ascii="Times New Roman" w:hAnsi="Times New Roman" w:cs="Times New Roman"/>
+          <w:sz w:val="24"/>
+          <w:szCs w:val="24"/>
+        </w:rPr>
+        <w:t>": [...],</w:t>
       </w:r>
     </w:p>
     <w:p>
@@ -2151,7 +2239,27 @@
           <w:sz w:val="24"/>
           <w:szCs w:val="24"/>
         </w:rPr>
-        <w:t xml:space="preserve">  "elements_negatifs": [...],</w:t>
+        <w:t xml:space="preserve">  "</w:t>
+      </w:r>
+      <w:proofErr w:type="spellStart"/>
+      <w:r>
+        <w:rPr>
+          <w:rStyle w:val="CodeHTML"/>
+          <w:rFonts w:ascii="Times New Roman" w:hAnsi="Times New Roman" w:cs="Times New Roman"/>
+          <w:sz w:val="24"/>
+          <w:szCs w:val="24"/>
+        </w:rPr>
+        <w:t>elements_negatifs</w:t>
+      </w:r>
+      <w:proofErr w:type="spellEnd"/>
+      <w:r>
+        <w:rPr>
+          <w:rStyle w:val="CodeHTML"/>
+          <w:rFonts w:ascii="Times New Roman" w:hAnsi="Times New Roman" w:cs="Times New Roman"/>
+          <w:sz w:val="24"/>
+          <w:szCs w:val="24"/>
+        </w:rPr>
+        <w:t>": [...],</w:t>
       </w:r>
     </w:p>
     <w:p>
@@ -2227,6 +2335,7 @@
           <w:lang w:eastAsia="fr-FR"/>
         </w:rPr>
       </w:pPr>
+      <w:proofErr w:type="spellStart"/>
       <w:r>
         <w:rPr>
           <w:rFonts w:ascii="Times New Roman" w:eastAsia="Times New Roman" w:hAnsi="Times New Roman" w:cs="Times New Roman"/>
@@ -2235,7 +2344,18 @@
           <w:szCs w:val="28"/>
           <w:lang w:eastAsia="fr-FR"/>
         </w:rPr>
-        <w:t>Resultat :</w:t>
+        <w:t>Resultat</w:t>
+      </w:r>
+      <w:proofErr w:type="spellEnd"/>
+      <w:r>
+        <w:rPr>
+          <w:rFonts w:ascii="Times New Roman" w:eastAsia="Times New Roman" w:hAnsi="Times New Roman" w:cs="Times New Roman"/>
+          <w:b/>
+          <w:sz w:val="28"/>
+          <w:szCs w:val="28"/>
+          <w:lang w:eastAsia="fr-FR"/>
+        </w:rPr>
+        <w:t> :</w:t>
       </w:r>
     </w:p>
     <w:p>
@@ -2485,7 +2605,47 @@
           <w:sz w:val="24"/>
           <w:szCs w:val="24"/>
         </w:rPr>
-        <w:t>Tu es un analyste customer experience.</w:t>
+        <w:t xml:space="preserve">Tu es un analyste </w:t>
+      </w:r>
+      <w:proofErr w:type="spellStart"/>
+      <w:r>
+        <w:rPr>
+          <w:rStyle w:val="CodeHTML"/>
+          <w:rFonts w:ascii="Times New Roman" w:hAnsi="Times New Roman" w:cs="Times New Roman"/>
+          <w:sz w:val="24"/>
+          <w:szCs w:val="24"/>
+        </w:rPr>
+        <w:t>customer</w:t>
+      </w:r>
+      <w:proofErr w:type="spellEnd"/>
+      <w:r>
+        <w:rPr>
+          <w:rStyle w:val="CodeHTML"/>
+          <w:rFonts w:ascii="Times New Roman" w:hAnsi="Times New Roman" w:cs="Times New Roman"/>
+          <w:sz w:val="24"/>
+          <w:szCs w:val="24"/>
+        </w:rPr>
+        <w:t xml:space="preserve"> </w:t>
+      </w:r>
+      <w:proofErr w:type="spellStart"/>
+      <w:r>
+        <w:rPr>
+          <w:rStyle w:val="CodeHTML"/>
+          <w:rFonts w:ascii="Times New Roman" w:hAnsi="Times New Roman" w:cs="Times New Roman"/>
+          <w:sz w:val="24"/>
+          <w:szCs w:val="24"/>
+        </w:rPr>
+        <w:t>experience</w:t>
+      </w:r>
+      <w:proofErr w:type="spellEnd"/>
+      <w:r>
+        <w:rPr>
+          <w:rStyle w:val="CodeHTML"/>
+          <w:rFonts w:ascii="Times New Roman" w:hAnsi="Times New Roman" w:cs="Times New Roman"/>
+          <w:sz w:val="24"/>
+          <w:szCs w:val="24"/>
+        </w:rPr>
+        <w:t>.</w:t>
       </w:r>
     </w:p>
     <w:p>
@@ -3632,18 +3792,19 @@
           <w:sz w:val="24"/>
           <w:szCs w:val="24"/>
         </w:rPr>
-        <w:t xml:space="preserve">  "informations_non_justifiees": [...],</w:t>
-      </w:r>
-    </w:p>
-    <w:p>
-      <w:pPr>
+        <w:t xml:space="preserve">  "</w:t>
+      </w:r>
+      <w:proofErr w:type="spellStart"/>
+      <w:r>
         <w:rPr>
           <w:rStyle w:val="CodeHTML"/>
           <w:rFonts w:ascii="Times New Roman" w:eastAsiaTheme="minorHAnsi" w:hAnsi="Times New Roman" w:cs="Times New Roman"/>
           <w:sz w:val="24"/>
           <w:szCs w:val="24"/>
         </w:rPr>
-      </w:pPr>
+        <w:t>informations_non_justifiees</w:t>
+      </w:r>
+      <w:proofErr w:type="spellEnd"/>
       <w:r>
         <w:rPr>
           <w:rStyle w:val="CodeHTML"/>
@@ -3651,6 +3812,25 @@
           <w:sz w:val="24"/>
           <w:szCs w:val="24"/>
         </w:rPr>
+        <w:t>": [...],</w:t>
+      </w:r>
+    </w:p>
+    <w:p>
+      <w:pPr>
+        <w:rPr>
+          <w:rStyle w:val="CodeHTML"/>
+          <w:rFonts w:ascii="Times New Roman" w:eastAsiaTheme="minorHAnsi" w:hAnsi="Times New Roman" w:cs="Times New Roman"/>
+          <w:sz w:val="24"/>
+          <w:szCs w:val="24"/>
+        </w:rPr>
+      </w:pPr>
+      <w:r>
+        <w:rPr>
+          <w:rStyle w:val="CodeHTML"/>
+          <w:rFonts w:ascii="Times New Roman" w:eastAsiaTheme="minorHAnsi" w:hAnsi="Times New Roman" w:cs="Times New Roman"/>
+          <w:sz w:val="24"/>
+          <w:szCs w:val="24"/>
+        </w:rPr>
         <w:t xml:space="preserve">  "contradictions": [...],</w:t>
       </w:r>
     </w:p>
@@ -3670,18 +3850,19 @@
           <w:sz w:val="24"/>
           <w:szCs w:val="24"/>
         </w:rPr>
-        <w:t xml:space="preserve">  "informations_absentes": [...],</w:t>
-      </w:r>
-    </w:p>
-    <w:p>
-      <w:pPr>
+        <w:t xml:space="preserve">  "</w:t>
+      </w:r>
+      <w:proofErr w:type="spellStart"/>
+      <w:r>
         <w:rPr>
           <w:rStyle w:val="CodeHTML"/>
           <w:rFonts w:ascii="Times New Roman" w:eastAsiaTheme="minorHAnsi" w:hAnsi="Times New Roman" w:cs="Times New Roman"/>
           <w:sz w:val="24"/>
           <w:szCs w:val="24"/>
         </w:rPr>
-      </w:pPr>
+        <w:t>informations_absentes</w:t>
+      </w:r>
+      <w:proofErr w:type="spellEnd"/>
       <w:r>
         <w:rPr>
           <w:rStyle w:val="CodeHTML"/>
@@ -3689,6 +3870,25 @@
           <w:sz w:val="24"/>
           <w:szCs w:val="24"/>
         </w:rPr>
+        <w:t>": [...],</w:t>
+      </w:r>
+    </w:p>
+    <w:p>
+      <w:pPr>
+        <w:rPr>
+          <w:rStyle w:val="CodeHTML"/>
+          <w:rFonts w:ascii="Times New Roman" w:eastAsiaTheme="minorHAnsi" w:hAnsi="Times New Roman" w:cs="Times New Roman"/>
+          <w:sz w:val="24"/>
+          <w:szCs w:val="24"/>
+        </w:rPr>
+      </w:pPr>
+      <w:r>
+        <w:rPr>
+          <w:rStyle w:val="CodeHTML"/>
+          <w:rFonts w:ascii="Times New Roman" w:eastAsiaTheme="minorHAnsi" w:hAnsi="Times New Roman" w:cs="Times New Roman"/>
+          <w:sz w:val="24"/>
+          <w:szCs w:val="24"/>
+        </w:rPr>
         <w:t xml:space="preserve">  "hallucinations": [...],</w:t>
       </w:r>
     </w:p>
@@ -3708,18 +3908,19 @@
           <w:sz w:val="24"/>
           <w:szCs w:val="24"/>
         </w:rPr>
-        <w:t xml:space="preserve">  "contraintes_respectees": true/false,</w:t>
-      </w:r>
-    </w:p>
-    <w:p>
-      <w:pPr>
+        <w:t xml:space="preserve">  "</w:t>
+      </w:r>
+      <w:proofErr w:type="spellStart"/>
+      <w:r>
         <w:rPr>
           <w:rStyle w:val="CodeHTML"/>
           <w:rFonts w:ascii="Times New Roman" w:eastAsiaTheme="minorHAnsi" w:hAnsi="Times New Roman" w:cs="Times New Roman"/>
           <w:sz w:val="24"/>
           <w:szCs w:val="24"/>
         </w:rPr>
-      </w:pPr>
+        <w:t>contraintes_respectees</w:t>
+      </w:r>
+      <w:proofErr w:type="spellEnd"/>
       <w:r>
         <w:rPr>
           <w:rStyle w:val="CodeHTML"/>
@@ -3727,7 +3928,66 @@
           <w:sz w:val="24"/>
           <w:szCs w:val="24"/>
         </w:rPr>
-        <w:t xml:space="preserve">  "verdict_global": "..."</w:t>
+        <w:t xml:space="preserve">": </w:t>
+      </w:r>
+      <w:proofErr w:type="spellStart"/>
+      <w:r>
+        <w:rPr>
+          <w:rStyle w:val="CodeHTML"/>
+          <w:rFonts w:ascii="Times New Roman" w:eastAsiaTheme="minorHAnsi" w:hAnsi="Times New Roman" w:cs="Times New Roman"/>
+          <w:sz w:val="24"/>
+          <w:szCs w:val="24"/>
+        </w:rPr>
+        <w:t>true</w:t>
+      </w:r>
+      <w:proofErr w:type="spellEnd"/>
+      <w:r>
+        <w:rPr>
+          <w:rStyle w:val="CodeHTML"/>
+          <w:rFonts w:ascii="Times New Roman" w:eastAsiaTheme="minorHAnsi" w:hAnsi="Times New Roman" w:cs="Times New Roman"/>
+          <w:sz w:val="24"/>
+          <w:szCs w:val="24"/>
+        </w:rPr>
+        <w:t>/false,</w:t>
+      </w:r>
+    </w:p>
+    <w:p>
+      <w:pPr>
+        <w:rPr>
+          <w:rStyle w:val="CodeHTML"/>
+          <w:rFonts w:ascii="Times New Roman" w:eastAsiaTheme="minorHAnsi" w:hAnsi="Times New Roman" w:cs="Times New Roman"/>
+          <w:sz w:val="24"/>
+          <w:szCs w:val="24"/>
+        </w:rPr>
+      </w:pPr>
+      <w:r>
+        <w:rPr>
+          <w:rStyle w:val="CodeHTML"/>
+          <w:rFonts w:ascii="Times New Roman" w:eastAsiaTheme="minorHAnsi" w:hAnsi="Times New Roman" w:cs="Times New Roman"/>
+          <w:sz w:val="24"/>
+          <w:szCs w:val="24"/>
+        </w:rPr>
+        <w:t xml:space="preserve">  "</w:t>
+      </w:r>
+      <w:proofErr w:type="spellStart"/>
+      <w:r>
+        <w:rPr>
+          <w:rStyle w:val="CodeHTML"/>
+          <w:rFonts w:ascii="Times New Roman" w:eastAsiaTheme="minorHAnsi" w:hAnsi="Times New Roman" w:cs="Times New Roman"/>
+          <w:sz w:val="24"/>
+          <w:szCs w:val="24"/>
+        </w:rPr>
+        <w:t>verdict_global</w:t>
+      </w:r>
+      <w:proofErr w:type="spellEnd"/>
+      <w:r>
+        <w:rPr>
+          <w:rStyle w:val="CodeHTML"/>
+          <w:rFonts w:ascii="Times New Roman" w:eastAsiaTheme="minorHAnsi" w:hAnsi="Times New Roman" w:cs="Times New Roman"/>
+          <w:sz w:val="24"/>
+          <w:szCs w:val="24"/>
+        </w:rPr>
+        <w:t>": "..."</w:t>
       </w:r>
     </w:p>
     <w:p>
@@ -4060,7 +4320,25 @@
           <w:sz w:val="24"/>
           <w:szCs w:val="24"/>
         </w:rPr>
-        <w:t xml:space="preserve"> "sentiment" (string) : une valeur parmi "positif", "negatif", "neutre"</w:t>
+        <w:t xml:space="preserve"> "sentiment" (string) : une valeur parmi "positif", "</w:t>
+      </w:r>
+      <w:proofErr w:type="spellStart"/>
+      <w:r>
+        <w:rPr>
+          <w:rFonts w:ascii="Times New Roman" w:hAnsi="Times New Roman" w:cs="Times New Roman"/>
+          <w:sz w:val="24"/>
+          <w:szCs w:val="24"/>
+        </w:rPr>
+        <w:t>negatif</w:t>
+      </w:r>
+      <w:proofErr w:type="spellEnd"/>
+      <w:r>
+        <w:rPr>
+          <w:rFonts w:ascii="Times New Roman" w:hAnsi="Times New Roman" w:cs="Times New Roman"/>
+          <w:sz w:val="24"/>
+          <w:szCs w:val="24"/>
+        </w:rPr>
+        <w:t>", "neutre"</w:t>
       </w:r>
     </w:p>
     <w:p>
@@ -4078,7 +4356,25 @@
           <w:sz w:val="24"/>
           <w:szCs w:val="24"/>
         </w:rPr>
-        <w:t>"categorie" (string) : le thème principal du commentaire (ex. "livraison",</w:t>
+        <w:t>"</w:t>
+      </w:r>
+      <w:proofErr w:type="spellStart"/>
+      <w:r>
+        <w:rPr>
+          <w:rFonts w:ascii="Times New Roman" w:hAnsi="Times New Roman" w:cs="Times New Roman"/>
+          <w:sz w:val="24"/>
+          <w:szCs w:val="24"/>
+        </w:rPr>
+        <w:t>categorie</w:t>
+      </w:r>
+      <w:proofErr w:type="spellEnd"/>
+      <w:r>
+        <w:rPr>
+          <w:rFonts w:ascii="Times New Roman" w:hAnsi="Times New Roman" w:cs="Times New Roman"/>
+          <w:sz w:val="24"/>
+          <w:szCs w:val="24"/>
+        </w:rPr>
+        <w:t>" (string) : le thème principal du commentaire (ex. "livraison",</w:t>
       </w:r>
       <w:r>
         <w:rPr>
@@ -4130,7 +4426,25 @@
           <w:sz w:val="24"/>
           <w:szCs w:val="24"/>
         </w:rPr>
-        <w:t>"probleme" (string) : description courte et factuelle du problème mentionné</w:t>
+        <w:t>"</w:t>
+      </w:r>
+      <w:proofErr w:type="spellStart"/>
+      <w:r>
+        <w:rPr>
+          <w:rFonts w:ascii="Times New Roman" w:hAnsi="Times New Roman" w:cs="Times New Roman"/>
+          <w:sz w:val="24"/>
+          <w:szCs w:val="24"/>
+        </w:rPr>
+        <w:t>probleme</w:t>
+      </w:r>
+      <w:proofErr w:type="spellEnd"/>
+      <w:r>
+        <w:rPr>
+          <w:rFonts w:ascii="Times New Roman" w:hAnsi="Times New Roman" w:cs="Times New Roman"/>
+          <w:sz w:val="24"/>
+          <w:szCs w:val="24"/>
+        </w:rPr>
+        <w:t>" (string) : description courte et factuelle du problème mentionné</w:t>
       </w:r>
       <w:r>
         <w:rPr>
@@ -4164,7 +4478,25 @@
           <w:sz w:val="24"/>
           <w:szCs w:val="24"/>
         </w:rPr>
-        <w:t>"confiance" (number) : score entre 0 et 1 représentant ta confiance dans</w:t>
+        <w:t>"confiance" (</w:t>
+      </w:r>
+      <w:proofErr w:type="spellStart"/>
+      <w:r>
+        <w:rPr>
+          <w:rFonts w:ascii="Times New Roman" w:hAnsi="Times New Roman" w:cs="Times New Roman"/>
+          <w:sz w:val="24"/>
+          <w:szCs w:val="24"/>
+        </w:rPr>
+        <w:t>number</w:t>
+      </w:r>
+      <w:proofErr w:type="spellEnd"/>
+      <w:r>
+        <w:rPr>
+          <w:rFonts w:ascii="Times New Roman" w:hAnsi="Times New Roman" w:cs="Times New Roman"/>
+          <w:sz w:val="24"/>
+          <w:szCs w:val="24"/>
+        </w:rPr>
+        <w:t>) : score entre 0 et 1 représentant ta confiance dans</w:t>
       </w:r>
       <w:r>
         <w:rPr>
@@ -4326,7 +4658,25 @@
           <w:sz w:val="24"/>
           <w:szCs w:val="24"/>
         </w:rPr>
-        <w:t xml:space="preserve">  "sentiment": "negatif",</w:t>
+        <w:t xml:space="preserve">  "sentiment": "</w:t>
+      </w:r>
+      <w:proofErr w:type="spellStart"/>
+      <w:r>
+        <w:rPr>
+          <w:rFonts w:ascii="Times New Roman" w:hAnsi="Times New Roman" w:cs="Times New Roman"/>
+          <w:sz w:val="24"/>
+          <w:szCs w:val="24"/>
+        </w:rPr>
+        <w:t>negatif</w:t>
+      </w:r>
+      <w:proofErr w:type="spellEnd"/>
+      <w:r>
+        <w:rPr>
+          <w:rFonts w:ascii="Times New Roman" w:hAnsi="Times New Roman" w:cs="Times New Roman"/>
+          <w:sz w:val="24"/>
+          <w:szCs w:val="24"/>
+        </w:rPr>
+        <w:t>",</w:t>
       </w:r>
     </w:p>
     <w:p>
@@ -4344,7 +4694,25 @@
           <w:sz w:val="24"/>
           <w:szCs w:val="24"/>
         </w:rPr>
-        <w:t xml:space="preserve">  "categorie": "livraison",</w:t>
+        <w:t xml:space="preserve">  "</w:t>
+      </w:r>
+      <w:proofErr w:type="spellStart"/>
+      <w:r>
+        <w:rPr>
+          <w:rFonts w:ascii="Times New Roman" w:hAnsi="Times New Roman" w:cs="Times New Roman"/>
+          <w:sz w:val="24"/>
+          <w:szCs w:val="24"/>
+        </w:rPr>
+        <w:t>categorie</w:t>
+      </w:r>
+      <w:proofErr w:type="spellEnd"/>
+      <w:r>
+        <w:rPr>
+          <w:rFonts w:ascii="Times New Roman" w:hAnsi="Times New Roman" w:cs="Times New Roman"/>
+          <w:sz w:val="24"/>
+          <w:szCs w:val="24"/>
+        </w:rPr>
+        <w:t>": "livraison",</w:t>
       </w:r>
     </w:p>
     <w:p>
@@ -4380,7 +4748,25 @@
           <w:sz w:val="24"/>
           <w:szCs w:val="24"/>
         </w:rPr>
-        <w:t xml:space="preserve">  "probleme": "Retard de livraison",</w:t>
+        <w:t xml:space="preserve">  "</w:t>
+      </w:r>
+      <w:proofErr w:type="spellStart"/>
+      <w:r>
+        <w:rPr>
+          <w:rFonts w:ascii="Times New Roman" w:hAnsi="Times New Roman" w:cs="Times New Roman"/>
+          <w:sz w:val="24"/>
+          <w:szCs w:val="24"/>
+        </w:rPr>
+        <w:t>probleme</w:t>
+      </w:r>
+      <w:proofErr w:type="spellEnd"/>
+      <w:r>
+        <w:rPr>
+          <w:rFonts w:ascii="Times New Roman" w:hAnsi="Times New Roman" w:cs="Times New Roman"/>
+          <w:sz w:val="24"/>
+          <w:szCs w:val="24"/>
+        </w:rPr>
+        <w:t>": "Retard de livraison",</w:t>
       </w:r>
     </w:p>
     <w:p>
@@ -4669,7 +5055,25 @@
           <w:sz w:val="24"/>
           <w:szCs w:val="24"/>
         </w:rPr>
-        <w:t>Aucune propriété supplémentaire n'est autorisée au-delà de : sentiment, categorie,</w:t>
+        <w:t xml:space="preserve">Aucune propriété supplémentaire n'est autorisée au-delà de : sentiment, </w:t>
+      </w:r>
+      <w:proofErr w:type="spellStart"/>
+      <w:r>
+        <w:rPr>
+          <w:rFonts w:ascii="Times New Roman" w:hAnsi="Times New Roman" w:cs="Times New Roman"/>
+          <w:sz w:val="24"/>
+          <w:szCs w:val="24"/>
+        </w:rPr>
+        <w:t>categorie</w:t>
+      </w:r>
+      <w:proofErr w:type="spellEnd"/>
+      <w:r>
+        <w:rPr>
+          <w:rFonts w:ascii="Times New Roman" w:hAnsi="Times New Roman" w:cs="Times New Roman"/>
+          <w:sz w:val="24"/>
+          <w:szCs w:val="24"/>
+        </w:rPr>
+        <w:t>,</w:t>
       </w:r>
     </w:p>
     <w:p>
@@ -4713,7 +5117,25 @@
           <w:sz w:val="24"/>
           <w:szCs w:val="24"/>
         </w:rPr>
-        <w:t>"sentiment" doit valoir exactement "positif", "negatif" ou "neutre".</w:t>
+        <w:t>"sentiment" doit valoir exactement "positif", "</w:t>
+      </w:r>
+      <w:proofErr w:type="spellStart"/>
+      <w:r>
+        <w:rPr>
+          <w:rFonts w:ascii="Times New Roman" w:hAnsi="Times New Roman" w:cs="Times New Roman"/>
+          <w:sz w:val="24"/>
+          <w:szCs w:val="24"/>
+        </w:rPr>
+        <w:t>negatif</w:t>
+      </w:r>
+      <w:proofErr w:type="spellEnd"/>
+      <w:r>
+        <w:rPr>
+          <w:rFonts w:ascii="Times New Roman" w:hAnsi="Times New Roman" w:cs="Times New Roman"/>
+          <w:sz w:val="24"/>
+          <w:szCs w:val="24"/>
+        </w:rPr>
+        <w:t>" ou "neutre".</w:t>
       </w:r>
     </w:p>
     <w:p>
@@ -6409,7 +6831,27 @@
           <w:sz w:val="24"/>
           <w:szCs w:val="24"/>
         </w:rPr>
-        <w:t xml:space="preserve">  "categorie": "réseau | logiciel | matériel | sécurité | accès | autre",</w:t>
+        <w:t xml:space="preserve">  "</w:t>
+      </w:r>
+      <w:proofErr w:type="spellStart"/>
+      <w:r>
+        <w:rPr>
+          <w:rStyle w:val="CodeHTML"/>
+          <w:rFonts w:ascii="Times New Roman" w:hAnsi="Times New Roman" w:cs="Times New Roman"/>
+          <w:sz w:val="24"/>
+          <w:szCs w:val="24"/>
+        </w:rPr>
+        <w:t>categorie</w:t>
+      </w:r>
+      <w:proofErr w:type="spellEnd"/>
+      <w:r>
+        <w:rPr>
+          <w:rStyle w:val="CodeHTML"/>
+          <w:rFonts w:ascii="Times New Roman" w:hAnsi="Times New Roman" w:cs="Times New Roman"/>
+          <w:sz w:val="24"/>
+          <w:szCs w:val="24"/>
+        </w:rPr>
+        <w:t>": "réseau | logiciel | matériel | sécurité | accès | autre",</w:t>
       </w:r>
     </w:p>
     <w:p>
@@ -6596,6 +7038,7 @@
           <w:szCs w:val="24"/>
         </w:rPr>
       </w:pPr>
+      <w:proofErr w:type="spellStart"/>
       <w:r>
         <w:rPr>
           <w:rStyle w:val="CodeHTML"/>
@@ -6607,6 +7050,7 @@
         </w:rPr>
         <w:t>Role</w:t>
       </w:r>
+      <w:proofErr w:type="spellEnd"/>
       <w:r>
         <w:rPr>
           <w:rStyle w:val="CodeHTML"/>
@@ -6665,7 +7109,27 @@
           <w:sz w:val="24"/>
           <w:szCs w:val="24"/>
         </w:rPr>
-        <w:t xml:space="preserve"> : Extrait les informations suivantes de la facture fournie : numéro_facture,</w:t>
+        <w:t xml:space="preserve"> : Extrait les informations suivantes de la facture fournie : </w:t>
+      </w:r>
+      <w:proofErr w:type="spellStart"/>
+      <w:r>
+        <w:rPr>
+          <w:rStyle w:val="CodeHTML"/>
+          <w:rFonts w:ascii="Times New Roman" w:hAnsi="Times New Roman" w:cs="Times New Roman"/>
+          <w:sz w:val="24"/>
+          <w:szCs w:val="24"/>
+        </w:rPr>
+        <w:t>numéro_facture</w:t>
+      </w:r>
+      <w:proofErr w:type="spellEnd"/>
+      <w:r>
+        <w:rPr>
+          <w:rStyle w:val="CodeHTML"/>
+          <w:rFonts w:ascii="Times New Roman" w:hAnsi="Times New Roman" w:cs="Times New Roman"/>
+          <w:sz w:val="24"/>
+          <w:szCs w:val="24"/>
+        </w:rPr>
+        <w:t>,</w:t>
       </w:r>
       <w:r>
         <w:rPr>
@@ -6683,7 +7147,47 @@
           <w:sz w:val="24"/>
           <w:szCs w:val="24"/>
         </w:rPr>
-        <w:t>date, client, montant_ht, tva, montant_ttc.</w:t>
+        <w:t xml:space="preserve">date, client, </w:t>
+      </w:r>
+      <w:proofErr w:type="spellStart"/>
+      <w:r>
+        <w:rPr>
+          <w:rStyle w:val="CodeHTML"/>
+          <w:rFonts w:ascii="Times New Roman" w:hAnsi="Times New Roman" w:cs="Times New Roman"/>
+          <w:sz w:val="24"/>
+          <w:szCs w:val="24"/>
+        </w:rPr>
+        <w:t>montant_ht</w:t>
+      </w:r>
+      <w:proofErr w:type="spellEnd"/>
+      <w:r>
+        <w:rPr>
+          <w:rStyle w:val="CodeHTML"/>
+          <w:rFonts w:ascii="Times New Roman" w:hAnsi="Times New Roman" w:cs="Times New Roman"/>
+          <w:sz w:val="24"/>
+          <w:szCs w:val="24"/>
+        </w:rPr>
+        <w:t xml:space="preserve">, tva, </w:t>
+      </w:r>
+      <w:proofErr w:type="spellStart"/>
+      <w:r>
+        <w:rPr>
+          <w:rStyle w:val="CodeHTML"/>
+          <w:rFonts w:ascii="Times New Roman" w:hAnsi="Times New Roman" w:cs="Times New Roman"/>
+          <w:sz w:val="24"/>
+          <w:szCs w:val="24"/>
+        </w:rPr>
+        <w:t>montant_ttc</w:t>
+      </w:r>
+      <w:proofErr w:type="spellEnd"/>
+      <w:r>
+        <w:rPr>
+          <w:rStyle w:val="CodeHTML"/>
+          <w:rFonts w:ascii="Times New Roman" w:hAnsi="Times New Roman" w:cs="Times New Roman"/>
+          <w:sz w:val="24"/>
+          <w:szCs w:val="24"/>
+        </w:rPr>
+        <w:t>.</w:t>
       </w:r>
     </w:p>
     <w:p>
@@ -6773,7 +7277,27 @@
           <w:sz w:val="24"/>
           <w:szCs w:val="24"/>
         </w:rPr>
-        <w:t>Si une information est absente ou illisible, mets la valeur null pour ce champ</w:t>
+        <w:t xml:space="preserve">Si une information est absente ou illisible, mets la valeur </w:t>
+      </w:r>
+      <w:proofErr w:type="spellStart"/>
+      <w:r>
+        <w:rPr>
+          <w:rStyle w:val="CodeHTML"/>
+          <w:rFonts w:ascii="Times New Roman" w:hAnsi="Times New Roman" w:cs="Times New Roman"/>
+          <w:sz w:val="24"/>
+          <w:szCs w:val="24"/>
+        </w:rPr>
+        <w:t>null</w:t>
+      </w:r>
+      <w:proofErr w:type="spellEnd"/>
+      <w:r>
+        <w:rPr>
+          <w:rStyle w:val="CodeHTML"/>
+          <w:rFonts w:ascii="Times New Roman" w:hAnsi="Times New Roman" w:cs="Times New Roman"/>
+          <w:sz w:val="24"/>
+          <w:szCs w:val="24"/>
+        </w:rPr>
+        <w:t xml:space="preserve"> pour ce champ</w:t>
       </w:r>
       <w:r>
         <w:rPr>
@@ -6886,67 +7410,187 @@
           <w:sz w:val="24"/>
           <w:szCs w:val="24"/>
         </w:rPr>
-        <w:t xml:space="preserve">  "numero_facture": ... ou null,</w:t>
-      </w:r>
-    </w:p>
-    <w:p>
-      <w:pPr>
-        <w:pStyle w:val="PrformatHTML"/>
-        <w:rPr>
-          <w:rStyle w:val="CodeHTML"/>
-          <w:rFonts w:ascii="Times New Roman" w:hAnsi="Times New Roman" w:cs="Times New Roman"/>
-          <w:sz w:val="24"/>
-          <w:szCs w:val="24"/>
-        </w:rPr>
-      </w:pPr>
-      <w:r>
-        <w:rPr>
-          <w:rStyle w:val="CodeHTML"/>
-          <w:rFonts w:ascii="Times New Roman" w:hAnsi="Times New Roman" w:cs="Times New Roman"/>
-          <w:sz w:val="24"/>
-          <w:szCs w:val="24"/>
-        </w:rPr>
-        <w:t xml:space="preserve">  "date": ... ou null,</w:t>
-      </w:r>
-    </w:p>
-    <w:p>
-      <w:pPr>
-        <w:pStyle w:val="PrformatHTML"/>
-        <w:rPr>
-          <w:rStyle w:val="CodeHTML"/>
-          <w:rFonts w:ascii="Times New Roman" w:hAnsi="Times New Roman" w:cs="Times New Roman"/>
-          <w:sz w:val="24"/>
-          <w:szCs w:val="24"/>
-        </w:rPr>
-      </w:pPr>
-      <w:r>
-        <w:rPr>
-          <w:rStyle w:val="CodeHTML"/>
-          <w:rFonts w:ascii="Times New Roman" w:hAnsi="Times New Roman" w:cs="Times New Roman"/>
-          <w:sz w:val="24"/>
-          <w:szCs w:val="24"/>
-        </w:rPr>
-        <w:t xml:space="preserve">  "client": ... ou null,</w:t>
-      </w:r>
-    </w:p>
-    <w:p>
-      <w:pPr>
-        <w:pStyle w:val="PrformatHTML"/>
-        <w:rPr>
-          <w:rStyle w:val="CodeHTML"/>
-          <w:rFonts w:ascii="Times New Roman" w:hAnsi="Times New Roman" w:cs="Times New Roman"/>
-          <w:sz w:val="24"/>
-          <w:szCs w:val="24"/>
-        </w:rPr>
-      </w:pPr>
-      <w:r>
-        <w:rPr>
-          <w:rStyle w:val="CodeHTML"/>
-          <w:rFonts w:ascii="Times New Roman" w:hAnsi="Times New Roman" w:cs="Times New Roman"/>
-          <w:sz w:val="24"/>
-          <w:szCs w:val="24"/>
-        </w:rPr>
-        <w:t xml:space="preserve">  "montant_ht": ... ou null,</w:t>
+        <w:t xml:space="preserve">  "</w:t>
+      </w:r>
+      <w:proofErr w:type="spellStart"/>
+      <w:r>
+        <w:rPr>
+          <w:rStyle w:val="CodeHTML"/>
+          <w:rFonts w:ascii="Times New Roman" w:hAnsi="Times New Roman" w:cs="Times New Roman"/>
+          <w:sz w:val="24"/>
+          <w:szCs w:val="24"/>
+        </w:rPr>
+        <w:t>numero_facture</w:t>
+      </w:r>
+      <w:proofErr w:type="spellEnd"/>
+      <w:r>
+        <w:rPr>
+          <w:rStyle w:val="CodeHTML"/>
+          <w:rFonts w:ascii="Times New Roman" w:hAnsi="Times New Roman" w:cs="Times New Roman"/>
+          <w:sz w:val="24"/>
+          <w:szCs w:val="24"/>
+        </w:rPr>
+        <w:t xml:space="preserve">": ... ou </w:t>
+      </w:r>
+      <w:proofErr w:type="spellStart"/>
+      <w:r>
+        <w:rPr>
+          <w:rStyle w:val="CodeHTML"/>
+          <w:rFonts w:ascii="Times New Roman" w:hAnsi="Times New Roman" w:cs="Times New Roman"/>
+          <w:sz w:val="24"/>
+          <w:szCs w:val="24"/>
+        </w:rPr>
+        <w:t>null</w:t>
+      </w:r>
+      <w:proofErr w:type="spellEnd"/>
+      <w:r>
+        <w:rPr>
+          <w:rStyle w:val="CodeHTML"/>
+          <w:rFonts w:ascii="Times New Roman" w:hAnsi="Times New Roman" w:cs="Times New Roman"/>
+          <w:sz w:val="24"/>
+          <w:szCs w:val="24"/>
+        </w:rPr>
+        <w:t>,</w:t>
+      </w:r>
+    </w:p>
+    <w:p>
+      <w:pPr>
+        <w:pStyle w:val="PrformatHTML"/>
+        <w:rPr>
+          <w:rStyle w:val="CodeHTML"/>
+          <w:rFonts w:ascii="Times New Roman" w:hAnsi="Times New Roman" w:cs="Times New Roman"/>
+          <w:sz w:val="24"/>
+          <w:szCs w:val="24"/>
+        </w:rPr>
+      </w:pPr>
+      <w:r>
+        <w:rPr>
+          <w:rStyle w:val="CodeHTML"/>
+          <w:rFonts w:ascii="Times New Roman" w:hAnsi="Times New Roman" w:cs="Times New Roman"/>
+          <w:sz w:val="24"/>
+          <w:szCs w:val="24"/>
+        </w:rPr>
+        <w:t xml:space="preserve">  "date": ... ou </w:t>
+      </w:r>
+      <w:proofErr w:type="spellStart"/>
+      <w:r>
+        <w:rPr>
+          <w:rStyle w:val="CodeHTML"/>
+          <w:rFonts w:ascii="Times New Roman" w:hAnsi="Times New Roman" w:cs="Times New Roman"/>
+          <w:sz w:val="24"/>
+          <w:szCs w:val="24"/>
+        </w:rPr>
+        <w:t>null</w:t>
+      </w:r>
+      <w:proofErr w:type="spellEnd"/>
+      <w:r>
+        <w:rPr>
+          <w:rStyle w:val="CodeHTML"/>
+          <w:rFonts w:ascii="Times New Roman" w:hAnsi="Times New Roman" w:cs="Times New Roman"/>
+          <w:sz w:val="24"/>
+          <w:szCs w:val="24"/>
+        </w:rPr>
+        <w:t>,</w:t>
+      </w:r>
+    </w:p>
+    <w:p>
+      <w:pPr>
+        <w:pStyle w:val="PrformatHTML"/>
+        <w:rPr>
+          <w:rStyle w:val="CodeHTML"/>
+          <w:rFonts w:ascii="Times New Roman" w:hAnsi="Times New Roman" w:cs="Times New Roman"/>
+          <w:sz w:val="24"/>
+          <w:szCs w:val="24"/>
+        </w:rPr>
+      </w:pPr>
+      <w:r>
+        <w:rPr>
+          <w:rStyle w:val="CodeHTML"/>
+          <w:rFonts w:ascii="Times New Roman" w:hAnsi="Times New Roman" w:cs="Times New Roman"/>
+          <w:sz w:val="24"/>
+          <w:szCs w:val="24"/>
+        </w:rPr>
+        <w:t xml:space="preserve">  "client": ... ou </w:t>
+      </w:r>
+      <w:proofErr w:type="spellStart"/>
+      <w:r>
+        <w:rPr>
+          <w:rStyle w:val="CodeHTML"/>
+          <w:rFonts w:ascii="Times New Roman" w:hAnsi="Times New Roman" w:cs="Times New Roman"/>
+          <w:sz w:val="24"/>
+          <w:szCs w:val="24"/>
+        </w:rPr>
+        <w:t>null</w:t>
+      </w:r>
+      <w:proofErr w:type="spellEnd"/>
+      <w:r>
+        <w:rPr>
+          <w:rStyle w:val="CodeHTML"/>
+          <w:rFonts w:ascii="Times New Roman" w:hAnsi="Times New Roman" w:cs="Times New Roman"/>
+          <w:sz w:val="24"/>
+          <w:szCs w:val="24"/>
+        </w:rPr>
+        <w:t>,</w:t>
+      </w:r>
+    </w:p>
+    <w:p>
+      <w:pPr>
+        <w:pStyle w:val="PrformatHTML"/>
+        <w:rPr>
+          <w:rStyle w:val="CodeHTML"/>
+          <w:rFonts w:ascii="Times New Roman" w:hAnsi="Times New Roman" w:cs="Times New Roman"/>
+          <w:sz w:val="24"/>
+          <w:szCs w:val="24"/>
+        </w:rPr>
+      </w:pPr>
+      <w:r>
+        <w:rPr>
+          <w:rStyle w:val="CodeHTML"/>
+          <w:rFonts w:ascii="Times New Roman" w:hAnsi="Times New Roman" w:cs="Times New Roman"/>
+          <w:sz w:val="24"/>
+          <w:szCs w:val="24"/>
+        </w:rPr>
+        <w:t xml:space="preserve">  "</w:t>
+      </w:r>
+      <w:proofErr w:type="spellStart"/>
+      <w:r>
+        <w:rPr>
+          <w:rStyle w:val="CodeHTML"/>
+          <w:rFonts w:ascii="Times New Roman" w:hAnsi="Times New Roman" w:cs="Times New Roman"/>
+          <w:sz w:val="24"/>
+          <w:szCs w:val="24"/>
+        </w:rPr>
+        <w:t>montant_ht</w:t>
+      </w:r>
+      <w:proofErr w:type="spellEnd"/>
+      <w:r>
+        <w:rPr>
+          <w:rStyle w:val="CodeHTML"/>
+          <w:rFonts w:ascii="Times New Roman" w:hAnsi="Times New Roman" w:cs="Times New Roman"/>
+          <w:sz w:val="24"/>
+          <w:szCs w:val="24"/>
+        </w:rPr>
+        <w:t xml:space="preserve">": ... ou </w:t>
+      </w:r>
+      <w:proofErr w:type="spellStart"/>
+      <w:r>
+        <w:rPr>
+          <w:rStyle w:val="CodeHTML"/>
+          <w:rFonts w:ascii="Times New Roman" w:hAnsi="Times New Roman" w:cs="Times New Roman"/>
+          <w:sz w:val="24"/>
+          <w:szCs w:val="24"/>
+        </w:rPr>
+        <w:t>null</w:t>
+      </w:r>
+      <w:proofErr w:type="spellEnd"/>
+      <w:r>
+        <w:rPr>
+          <w:rStyle w:val="CodeHTML"/>
+          <w:rFonts w:ascii="Times New Roman" w:hAnsi="Times New Roman" w:cs="Times New Roman"/>
+          <w:sz w:val="24"/>
+          <w:szCs w:val="24"/>
+        </w:rPr>
+        <w:t>,</w:t>
       </w:r>
     </w:p>
     <w:p>
@@ -6967,28 +7611,79 @@
           <w:szCs w:val="24"/>
         </w:rPr>
         <w:lastRenderedPageBreak/>
-        <w:t xml:space="preserve">  "tva": ... ou null,</w:t>
-      </w:r>
-    </w:p>
-    <w:p>
-      <w:pPr>
-        <w:pStyle w:val="PrformatHTML"/>
-        <w:rPr>
-          <w:rStyle w:val="CodeHTML"/>
-          <w:rFonts w:ascii="Times New Roman" w:hAnsi="Times New Roman" w:cs="Times New Roman"/>
-          <w:sz w:val="24"/>
-          <w:szCs w:val="24"/>
-        </w:rPr>
-      </w:pPr>
-      <w:r>
-        <w:rPr>
-          <w:rStyle w:val="CodeHTML"/>
-          <w:rFonts w:ascii="Times New Roman" w:hAnsi="Times New Roman" w:cs="Times New Roman"/>
-          <w:sz w:val="24"/>
-          <w:szCs w:val="24"/>
-        </w:rPr>
-        <w:t xml:space="preserve">  "montant_ttc": ... ou null</w:t>
-      </w:r>
+        <w:t xml:space="preserve">  "tva": ... ou </w:t>
+      </w:r>
+      <w:proofErr w:type="spellStart"/>
+      <w:r>
+        <w:rPr>
+          <w:rStyle w:val="CodeHTML"/>
+          <w:rFonts w:ascii="Times New Roman" w:hAnsi="Times New Roman" w:cs="Times New Roman"/>
+          <w:sz w:val="24"/>
+          <w:szCs w:val="24"/>
+        </w:rPr>
+        <w:t>null</w:t>
+      </w:r>
+      <w:proofErr w:type="spellEnd"/>
+      <w:r>
+        <w:rPr>
+          <w:rStyle w:val="CodeHTML"/>
+          <w:rFonts w:ascii="Times New Roman" w:hAnsi="Times New Roman" w:cs="Times New Roman"/>
+          <w:sz w:val="24"/>
+          <w:szCs w:val="24"/>
+        </w:rPr>
+        <w:t>,</w:t>
+      </w:r>
+    </w:p>
+    <w:p>
+      <w:pPr>
+        <w:pStyle w:val="PrformatHTML"/>
+        <w:rPr>
+          <w:rStyle w:val="CodeHTML"/>
+          <w:rFonts w:ascii="Times New Roman" w:hAnsi="Times New Roman" w:cs="Times New Roman"/>
+          <w:sz w:val="24"/>
+          <w:szCs w:val="24"/>
+        </w:rPr>
+      </w:pPr>
+      <w:r>
+        <w:rPr>
+          <w:rStyle w:val="CodeHTML"/>
+          <w:rFonts w:ascii="Times New Roman" w:hAnsi="Times New Roman" w:cs="Times New Roman"/>
+          <w:sz w:val="24"/>
+          <w:szCs w:val="24"/>
+        </w:rPr>
+        <w:t xml:space="preserve">  "</w:t>
+      </w:r>
+      <w:proofErr w:type="spellStart"/>
+      <w:r>
+        <w:rPr>
+          <w:rStyle w:val="CodeHTML"/>
+          <w:rFonts w:ascii="Times New Roman" w:hAnsi="Times New Roman" w:cs="Times New Roman"/>
+          <w:sz w:val="24"/>
+          <w:szCs w:val="24"/>
+        </w:rPr>
+        <w:t>montant_ttc</w:t>
+      </w:r>
+      <w:proofErr w:type="spellEnd"/>
+      <w:r>
+        <w:rPr>
+          <w:rStyle w:val="CodeHTML"/>
+          <w:rFonts w:ascii="Times New Roman" w:hAnsi="Times New Roman" w:cs="Times New Roman"/>
+          <w:sz w:val="24"/>
+          <w:szCs w:val="24"/>
+        </w:rPr>
+        <w:t xml:space="preserve">": ... ou </w:t>
+      </w:r>
+      <w:proofErr w:type="spellStart"/>
+      <w:r>
+        <w:rPr>
+          <w:rStyle w:val="CodeHTML"/>
+          <w:rFonts w:ascii="Times New Roman" w:hAnsi="Times New Roman" w:cs="Times New Roman"/>
+          <w:sz w:val="24"/>
+          <w:szCs w:val="24"/>
+        </w:rPr>
+        <w:t>null</w:t>
+      </w:r>
+      <w:proofErr w:type="spellEnd"/>
     </w:p>
     <w:p>
       <w:pPr>
@@ -7109,19 +7804,19 @@
           <w:szCs w:val="24"/>
           <w:lang w:val="en-US"/>
         </w:rPr>
-        <w:t xml:space="preserve">Client : KharagneTech Consulting </w:t>
-      </w:r>
-    </w:p>
-    <w:p>
-      <w:pPr>
-        <w:pStyle w:val="PrformatHTML"/>
+        <w:t xml:space="preserve">Client : </w:t>
+      </w:r>
+      <w:proofErr w:type="spellStart"/>
+      <w:r>
         <w:rPr>
           <w:rFonts w:ascii="Times New Roman" w:hAnsi="Times New Roman" w:cs="Times New Roman"/>
           <w:sz w:val="24"/>
           <w:szCs w:val="24"/>
           <w:lang w:val="en-US"/>
         </w:rPr>
-      </w:pPr>
+        <w:t>KharagneTech</w:t>
+      </w:r>
+      <w:proofErr w:type="spellEnd"/>
       <w:r>
         <w:rPr>
           <w:rFonts w:ascii="Times New Roman" w:hAnsi="Times New Roman" w:cs="Times New Roman"/>
@@ -7129,7 +7824,38 @@
           <w:szCs w:val="24"/>
           <w:lang w:val="en-US"/>
         </w:rPr>
-        <w:t xml:space="preserve">Montant HT : 100 000 FCFA </w:t>
+        <w:t xml:space="preserve"> Consulting </w:t>
+      </w:r>
+    </w:p>
+    <w:p>
+      <w:pPr>
+        <w:pStyle w:val="PrformatHTML"/>
+        <w:rPr>
+          <w:rFonts w:ascii="Times New Roman" w:hAnsi="Times New Roman" w:cs="Times New Roman"/>
+          <w:sz w:val="24"/>
+          <w:szCs w:val="24"/>
+          <w:lang w:val="en-US"/>
+        </w:rPr>
+      </w:pPr>
+      <w:proofErr w:type="spellStart"/>
+      <w:r>
+        <w:rPr>
+          <w:rFonts w:ascii="Times New Roman" w:hAnsi="Times New Roman" w:cs="Times New Roman"/>
+          <w:sz w:val="24"/>
+          <w:szCs w:val="24"/>
+          <w:lang w:val="en-US"/>
+        </w:rPr>
+        <w:t>Montant</w:t>
+      </w:r>
+      <w:proofErr w:type="spellEnd"/>
+      <w:r>
+        <w:rPr>
+          <w:rFonts w:ascii="Times New Roman" w:hAnsi="Times New Roman" w:cs="Times New Roman"/>
+          <w:sz w:val="24"/>
+          <w:szCs w:val="24"/>
+          <w:lang w:val="en-US"/>
+        </w:rPr>
+        <w:t xml:space="preserve"> HT : 100 000 FCFA </w:t>
       </w:r>
     </w:p>
     <w:p>
@@ -7818,6 +8544,7 @@
           <w:lang w:val="en-US"/>
         </w:rPr>
       </w:pPr>
+      <w:proofErr w:type="spellStart"/>
       <w:r>
         <w:rPr>
           <w:rFonts w:ascii="Times New Roman" w:hAnsi="Times New Roman" w:cs="Times New Roman"/>
@@ -7825,7 +8552,17 @@
           <w:szCs w:val="36"/>
           <w:lang w:val="en-US"/>
         </w:rPr>
-        <w:t>Partie 6 : Prompt Engineering pour le Machine Learning</w:t>
+        <w:t>Partie</w:t>
+      </w:r>
+      <w:proofErr w:type="spellEnd"/>
+      <w:r>
+        <w:rPr>
+          <w:rFonts w:ascii="Times New Roman" w:hAnsi="Times New Roman" w:cs="Times New Roman"/>
+          <w:sz w:val="36"/>
+          <w:szCs w:val="36"/>
+          <w:lang w:val="en-US"/>
+        </w:rPr>
+        <w:t xml:space="preserve"> 6 : Prompt Engineering pour le Machine Learning</w:t>
       </w:r>
     </w:p>
     <w:p>
@@ -7878,7 +8615,27 @@
           <w:sz w:val="24"/>
           <w:szCs w:val="24"/>
         </w:rPr>
-        <w:t>Tu es un data scientist expérimenté.</w:t>
+        <w:t xml:space="preserve">Tu es un data </w:t>
+      </w:r>
+      <w:proofErr w:type="spellStart"/>
+      <w:r>
+        <w:rPr>
+          <w:rStyle w:val="CodeHTML"/>
+          <w:rFonts w:ascii="Times New Roman" w:hAnsi="Times New Roman" w:cs="Times New Roman"/>
+          <w:sz w:val="24"/>
+          <w:szCs w:val="24"/>
+        </w:rPr>
+        <w:t>scientist</w:t>
+      </w:r>
+      <w:proofErr w:type="spellEnd"/>
+      <w:r>
+        <w:rPr>
+          <w:rStyle w:val="CodeHTML"/>
+          <w:rFonts w:ascii="Times New Roman" w:hAnsi="Times New Roman" w:cs="Times New Roman"/>
+          <w:sz w:val="24"/>
+          <w:szCs w:val="24"/>
+        </w:rPr>
+        <w:t xml:space="preserve"> expérimenté.</w:t>
       </w:r>
     </w:p>
     <w:p>
@@ -7938,7 +8695,27 @@
           <w:szCs w:val="24"/>
           <w:lang w:val="en-US" w:eastAsia="fr-FR"/>
         </w:rPr>
-        <w:t>&lt;class 'pandas.DataFrame'&gt;</w:t>
+        <w:t>&lt;class '</w:t>
+      </w:r>
+      <w:proofErr w:type="spellStart"/>
+      <w:r>
+        <w:rPr>
+          <w:rFonts w:ascii="Consolas" w:eastAsia="Times New Roman" w:hAnsi="Consolas" w:cs="Times New Roman"/>
+          <w:sz w:val="24"/>
+          <w:szCs w:val="24"/>
+          <w:lang w:val="en-US" w:eastAsia="fr-FR"/>
+        </w:rPr>
+        <w:t>pandas.DataFrame</w:t>
+      </w:r>
+      <w:proofErr w:type="spellEnd"/>
+      <w:r>
+        <w:rPr>
+          <w:rFonts w:ascii="Consolas" w:eastAsia="Times New Roman" w:hAnsi="Consolas" w:cs="Times New Roman"/>
+          <w:sz w:val="24"/>
+          <w:szCs w:val="24"/>
+          <w:lang w:val="en-US" w:eastAsia="fr-FR"/>
+        </w:rPr>
+        <w:t>'&gt;</w:t>
       </w:r>
     </w:p>
     <w:p>
@@ -7951,6 +8728,7 @@
           <w:lang w:val="en-US" w:eastAsia="fr-FR"/>
         </w:rPr>
       </w:pPr>
+      <w:proofErr w:type="spellStart"/>
       <w:r>
         <w:rPr>
           <w:rFonts w:ascii="Consolas" w:eastAsia="Times New Roman" w:hAnsi="Consolas" w:cs="Times New Roman"/>
@@ -7958,7 +8736,17 @@
           <w:szCs w:val="24"/>
           <w:lang w:val="en-US" w:eastAsia="fr-FR"/>
         </w:rPr>
-        <w:t>RangeIndex: 596 entries, 0 to 595</w:t>
+        <w:t>RangeIndex</w:t>
+      </w:r>
+      <w:proofErr w:type="spellEnd"/>
+      <w:r>
+        <w:rPr>
+          <w:rFonts w:ascii="Consolas" w:eastAsia="Times New Roman" w:hAnsi="Consolas" w:cs="Times New Roman"/>
+          <w:sz w:val="24"/>
+          <w:szCs w:val="24"/>
+          <w:lang w:val="en-US" w:eastAsia="fr-FR"/>
+        </w:rPr>
+        <w:t>: 596 entries, 0 to 595</w:t>
       </w:r>
     </w:p>
     <w:p>
@@ -7998,7 +8786,27 @@
           <w:szCs w:val="24"/>
           <w:lang w:val="en-US" w:eastAsia="fr-FR"/>
         </w:rPr>
-        <w:t xml:space="preserve"> #   Column        Non-Null Count  Dtype  </w:t>
+        <w:t xml:space="preserve"> #   Column        Non-Null Count  </w:t>
+      </w:r>
+      <w:proofErr w:type="spellStart"/>
+      <w:r>
+        <w:rPr>
+          <w:rFonts w:ascii="Consolas" w:eastAsia="Times New Roman" w:hAnsi="Consolas" w:cs="Times New Roman"/>
+          <w:sz w:val="24"/>
+          <w:szCs w:val="24"/>
+          <w:lang w:val="en-US" w:eastAsia="fr-FR"/>
+        </w:rPr>
+        <w:t>Dtype</w:t>
+      </w:r>
+      <w:proofErr w:type="spellEnd"/>
+      <w:r>
+        <w:rPr>
+          <w:rFonts w:ascii="Consolas" w:eastAsia="Times New Roman" w:hAnsi="Consolas" w:cs="Times New Roman"/>
+          <w:sz w:val="24"/>
+          <w:szCs w:val="24"/>
+          <w:lang w:val="en-US" w:eastAsia="fr-FR"/>
+        </w:rPr>
+        <w:t xml:space="preserve">  </w:t>
       </w:r>
     </w:p>
     <w:p>
@@ -8047,7 +8855,67 @@
           <w:szCs w:val="24"/>
           <w:lang w:eastAsia="fr-FR"/>
         </w:rPr>
-        <w:t xml:space="preserve">0   id_mesure     596 non-null    str    </w:t>
+        <w:t xml:space="preserve">0   </w:t>
+      </w:r>
+      <w:proofErr w:type="spellStart"/>
+      <w:r>
+        <w:rPr>
+          <w:rFonts w:ascii="Consolas" w:eastAsia="Times New Roman" w:hAnsi="Consolas" w:cs="Times New Roman"/>
+          <w:sz w:val="24"/>
+          <w:szCs w:val="24"/>
+          <w:lang w:eastAsia="fr-FR"/>
+        </w:rPr>
+        <w:t>id_mesure</w:t>
+      </w:r>
+      <w:proofErr w:type="spellEnd"/>
+      <w:r>
+        <w:rPr>
+          <w:rFonts w:ascii="Consolas" w:eastAsia="Times New Roman" w:hAnsi="Consolas" w:cs="Times New Roman"/>
+          <w:sz w:val="24"/>
+          <w:szCs w:val="24"/>
+          <w:lang w:eastAsia="fr-FR"/>
+        </w:rPr>
+        <w:t xml:space="preserve">     596 non-</w:t>
+      </w:r>
+      <w:proofErr w:type="spellStart"/>
+      <w:r>
+        <w:rPr>
+          <w:rFonts w:ascii="Consolas" w:eastAsia="Times New Roman" w:hAnsi="Consolas" w:cs="Times New Roman"/>
+          <w:sz w:val="24"/>
+          <w:szCs w:val="24"/>
+          <w:lang w:eastAsia="fr-FR"/>
+        </w:rPr>
+        <w:t>null</w:t>
+      </w:r>
+      <w:proofErr w:type="spellEnd"/>
+      <w:r>
+        <w:rPr>
+          <w:rFonts w:ascii="Consolas" w:eastAsia="Times New Roman" w:hAnsi="Consolas" w:cs="Times New Roman"/>
+          <w:sz w:val="24"/>
+          <w:szCs w:val="24"/>
+          <w:lang w:eastAsia="fr-FR"/>
+        </w:rPr>
+        <w:t xml:space="preserve">    </w:t>
+      </w:r>
+      <w:proofErr w:type="spellStart"/>
+      <w:r>
+        <w:rPr>
+          <w:rFonts w:ascii="Consolas" w:eastAsia="Times New Roman" w:hAnsi="Consolas" w:cs="Times New Roman"/>
+          <w:sz w:val="24"/>
+          <w:szCs w:val="24"/>
+          <w:lang w:eastAsia="fr-FR"/>
+        </w:rPr>
+        <w:t>str</w:t>
+      </w:r>
+      <w:proofErr w:type="spellEnd"/>
+      <w:r>
+        <w:rPr>
+          <w:rFonts w:ascii="Consolas" w:eastAsia="Times New Roman" w:hAnsi="Consolas" w:cs="Times New Roman"/>
+          <w:sz w:val="24"/>
+          <w:szCs w:val="24"/>
+          <w:lang w:eastAsia="fr-FR"/>
+        </w:rPr>
+        <w:t xml:space="preserve">    </w:t>
       </w:r>
     </w:p>
     <w:p>
@@ -8067,7 +8935,67 @@
           <w:szCs w:val="24"/>
           <w:lang w:eastAsia="fr-FR"/>
         </w:rPr>
-        <w:t xml:space="preserve"> 1   date_heure    596 non-null    str    </w:t>
+        <w:t xml:space="preserve"> 1   </w:t>
+      </w:r>
+      <w:proofErr w:type="spellStart"/>
+      <w:r>
+        <w:rPr>
+          <w:rFonts w:ascii="Consolas" w:eastAsia="Times New Roman" w:hAnsi="Consolas" w:cs="Times New Roman"/>
+          <w:sz w:val="24"/>
+          <w:szCs w:val="24"/>
+          <w:lang w:eastAsia="fr-FR"/>
+        </w:rPr>
+        <w:t>date_heure</w:t>
+      </w:r>
+      <w:proofErr w:type="spellEnd"/>
+      <w:r>
+        <w:rPr>
+          <w:rFonts w:ascii="Consolas" w:eastAsia="Times New Roman" w:hAnsi="Consolas" w:cs="Times New Roman"/>
+          <w:sz w:val="24"/>
+          <w:szCs w:val="24"/>
+          <w:lang w:eastAsia="fr-FR"/>
+        </w:rPr>
+        <w:t xml:space="preserve">    596 non-</w:t>
+      </w:r>
+      <w:proofErr w:type="spellStart"/>
+      <w:r>
+        <w:rPr>
+          <w:rFonts w:ascii="Consolas" w:eastAsia="Times New Roman" w:hAnsi="Consolas" w:cs="Times New Roman"/>
+          <w:sz w:val="24"/>
+          <w:szCs w:val="24"/>
+          <w:lang w:eastAsia="fr-FR"/>
+        </w:rPr>
+        <w:t>null</w:t>
+      </w:r>
+      <w:proofErr w:type="spellEnd"/>
+      <w:r>
+        <w:rPr>
+          <w:rFonts w:ascii="Consolas" w:eastAsia="Times New Roman" w:hAnsi="Consolas" w:cs="Times New Roman"/>
+          <w:sz w:val="24"/>
+          <w:szCs w:val="24"/>
+          <w:lang w:eastAsia="fr-FR"/>
+        </w:rPr>
+        <w:t xml:space="preserve">    </w:t>
+      </w:r>
+      <w:proofErr w:type="spellStart"/>
+      <w:r>
+        <w:rPr>
+          <w:rFonts w:ascii="Consolas" w:eastAsia="Times New Roman" w:hAnsi="Consolas" w:cs="Times New Roman"/>
+          <w:sz w:val="24"/>
+          <w:szCs w:val="24"/>
+          <w:lang w:eastAsia="fr-FR"/>
+        </w:rPr>
+        <w:t>str</w:t>
+      </w:r>
+      <w:proofErr w:type="spellEnd"/>
+      <w:r>
+        <w:rPr>
+          <w:rFonts w:ascii="Consolas" w:eastAsia="Times New Roman" w:hAnsi="Consolas" w:cs="Times New Roman"/>
+          <w:sz w:val="24"/>
+          <w:szCs w:val="24"/>
+          <w:lang w:eastAsia="fr-FR"/>
+        </w:rPr>
+        <w:t xml:space="preserve">    </w:t>
       </w:r>
     </w:p>
     <w:p>
@@ -8087,7 +9015,67 @@
           <w:szCs w:val="24"/>
           <w:lang w:eastAsia="fr-FR"/>
         </w:rPr>
-        <w:t xml:space="preserve"> 2   id_capteur    596 non-null    str    </w:t>
+        <w:t xml:space="preserve"> 2   </w:t>
+      </w:r>
+      <w:proofErr w:type="spellStart"/>
+      <w:r>
+        <w:rPr>
+          <w:rFonts w:ascii="Consolas" w:eastAsia="Times New Roman" w:hAnsi="Consolas" w:cs="Times New Roman"/>
+          <w:sz w:val="24"/>
+          <w:szCs w:val="24"/>
+          <w:lang w:eastAsia="fr-FR"/>
+        </w:rPr>
+        <w:t>id_capteur</w:t>
+      </w:r>
+      <w:proofErr w:type="spellEnd"/>
+      <w:r>
+        <w:rPr>
+          <w:rFonts w:ascii="Consolas" w:eastAsia="Times New Roman" w:hAnsi="Consolas" w:cs="Times New Roman"/>
+          <w:sz w:val="24"/>
+          <w:szCs w:val="24"/>
+          <w:lang w:eastAsia="fr-FR"/>
+        </w:rPr>
+        <w:t xml:space="preserve">    596 non-</w:t>
+      </w:r>
+      <w:proofErr w:type="spellStart"/>
+      <w:r>
+        <w:rPr>
+          <w:rFonts w:ascii="Consolas" w:eastAsia="Times New Roman" w:hAnsi="Consolas" w:cs="Times New Roman"/>
+          <w:sz w:val="24"/>
+          <w:szCs w:val="24"/>
+          <w:lang w:eastAsia="fr-FR"/>
+        </w:rPr>
+        <w:t>null</w:t>
+      </w:r>
+      <w:proofErr w:type="spellEnd"/>
+      <w:r>
+        <w:rPr>
+          <w:rFonts w:ascii="Consolas" w:eastAsia="Times New Roman" w:hAnsi="Consolas" w:cs="Times New Roman"/>
+          <w:sz w:val="24"/>
+          <w:szCs w:val="24"/>
+          <w:lang w:eastAsia="fr-FR"/>
+        </w:rPr>
+        <w:t xml:space="preserve">    </w:t>
+      </w:r>
+      <w:proofErr w:type="spellStart"/>
+      <w:r>
+        <w:rPr>
+          <w:rFonts w:ascii="Consolas" w:eastAsia="Times New Roman" w:hAnsi="Consolas" w:cs="Times New Roman"/>
+          <w:sz w:val="24"/>
+          <w:szCs w:val="24"/>
+          <w:lang w:eastAsia="fr-FR"/>
+        </w:rPr>
+        <w:t>str</w:t>
+      </w:r>
+      <w:proofErr w:type="spellEnd"/>
+      <w:r>
+        <w:rPr>
+          <w:rFonts w:ascii="Consolas" w:eastAsia="Times New Roman" w:hAnsi="Consolas" w:cs="Times New Roman"/>
+          <w:sz w:val="24"/>
+          <w:szCs w:val="24"/>
+          <w:lang w:eastAsia="fr-FR"/>
+        </w:rPr>
+        <w:t xml:space="preserve">    </w:t>
       </w:r>
     </w:p>
     <w:p>
@@ -8107,7 +9095,67 @@
           <w:szCs w:val="24"/>
           <w:lang w:eastAsia="fr-FR"/>
         </w:rPr>
-        <w:t xml:space="preserve"> 3   batiment      596 non-null    str    </w:t>
+        <w:t xml:space="preserve"> 3   </w:t>
+      </w:r>
+      <w:proofErr w:type="spellStart"/>
+      <w:r>
+        <w:rPr>
+          <w:rFonts w:ascii="Consolas" w:eastAsia="Times New Roman" w:hAnsi="Consolas" w:cs="Times New Roman"/>
+          <w:sz w:val="24"/>
+          <w:szCs w:val="24"/>
+          <w:lang w:eastAsia="fr-FR"/>
+        </w:rPr>
+        <w:t>batiment</w:t>
+      </w:r>
+      <w:proofErr w:type="spellEnd"/>
+      <w:r>
+        <w:rPr>
+          <w:rFonts w:ascii="Consolas" w:eastAsia="Times New Roman" w:hAnsi="Consolas" w:cs="Times New Roman"/>
+          <w:sz w:val="24"/>
+          <w:szCs w:val="24"/>
+          <w:lang w:eastAsia="fr-FR"/>
+        </w:rPr>
+        <w:t xml:space="preserve">      596 non-</w:t>
+      </w:r>
+      <w:proofErr w:type="spellStart"/>
+      <w:r>
+        <w:rPr>
+          <w:rFonts w:ascii="Consolas" w:eastAsia="Times New Roman" w:hAnsi="Consolas" w:cs="Times New Roman"/>
+          <w:sz w:val="24"/>
+          <w:szCs w:val="24"/>
+          <w:lang w:eastAsia="fr-FR"/>
+        </w:rPr>
+        <w:t>null</w:t>
+      </w:r>
+      <w:proofErr w:type="spellEnd"/>
+      <w:r>
+        <w:rPr>
+          <w:rFonts w:ascii="Consolas" w:eastAsia="Times New Roman" w:hAnsi="Consolas" w:cs="Times New Roman"/>
+          <w:sz w:val="24"/>
+          <w:szCs w:val="24"/>
+          <w:lang w:eastAsia="fr-FR"/>
+        </w:rPr>
+        <w:t xml:space="preserve">    </w:t>
+      </w:r>
+      <w:proofErr w:type="spellStart"/>
+      <w:r>
+        <w:rPr>
+          <w:rFonts w:ascii="Consolas" w:eastAsia="Times New Roman" w:hAnsi="Consolas" w:cs="Times New Roman"/>
+          <w:sz w:val="24"/>
+          <w:szCs w:val="24"/>
+          <w:lang w:eastAsia="fr-FR"/>
+        </w:rPr>
+        <w:t>str</w:t>
+      </w:r>
+      <w:proofErr w:type="spellEnd"/>
+      <w:r>
+        <w:rPr>
+          <w:rFonts w:ascii="Consolas" w:eastAsia="Times New Roman" w:hAnsi="Consolas" w:cs="Times New Roman"/>
+          <w:sz w:val="24"/>
+          <w:szCs w:val="24"/>
+          <w:lang w:eastAsia="fr-FR"/>
+        </w:rPr>
+        <w:t xml:space="preserve">    </w:t>
       </w:r>
     </w:p>
     <w:p>
@@ -8127,7 +9175,47 @@
           <w:szCs w:val="24"/>
           <w:lang w:eastAsia="fr-FR"/>
         </w:rPr>
-        <w:t xml:space="preserve"> 4   temperature   590 non-null    float64</w:t>
+        <w:t xml:space="preserve"> 4   </w:t>
+      </w:r>
+      <w:proofErr w:type="spellStart"/>
+      <w:r>
+        <w:rPr>
+          <w:rFonts w:ascii="Consolas" w:eastAsia="Times New Roman" w:hAnsi="Consolas" w:cs="Times New Roman"/>
+          <w:sz w:val="24"/>
+          <w:szCs w:val="24"/>
+          <w:lang w:eastAsia="fr-FR"/>
+        </w:rPr>
+        <w:t>temperature</w:t>
+      </w:r>
+      <w:proofErr w:type="spellEnd"/>
+      <w:r>
+        <w:rPr>
+          <w:rFonts w:ascii="Consolas" w:eastAsia="Times New Roman" w:hAnsi="Consolas" w:cs="Times New Roman"/>
+          <w:sz w:val="24"/>
+          <w:szCs w:val="24"/>
+          <w:lang w:eastAsia="fr-FR"/>
+        </w:rPr>
+        <w:t xml:space="preserve">   590 non-</w:t>
+      </w:r>
+      <w:proofErr w:type="spellStart"/>
+      <w:r>
+        <w:rPr>
+          <w:rFonts w:ascii="Consolas" w:eastAsia="Times New Roman" w:hAnsi="Consolas" w:cs="Times New Roman"/>
+          <w:sz w:val="24"/>
+          <w:szCs w:val="24"/>
+          <w:lang w:eastAsia="fr-FR"/>
+        </w:rPr>
+        <w:t>null</w:t>
+      </w:r>
+      <w:proofErr w:type="spellEnd"/>
+      <w:r>
+        <w:rPr>
+          <w:rFonts w:ascii="Consolas" w:eastAsia="Times New Roman" w:hAnsi="Consolas" w:cs="Times New Roman"/>
+          <w:sz w:val="24"/>
+          <w:szCs w:val="24"/>
+          <w:lang w:eastAsia="fr-FR"/>
+        </w:rPr>
+        <w:t xml:space="preserve">    float64</w:t>
       </w:r>
     </w:p>
     <w:p>
@@ -8147,7 +9235,47 @@
           <w:szCs w:val="24"/>
           <w:lang w:eastAsia="fr-FR"/>
         </w:rPr>
-        <w:t xml:space="preserve"> 5   humidite      591 non-null    float64</w:t>
+        <w:t xml:space="preserve"> 5   </w:t>
+      </w:r>
+      <w:proofErr w:type="spellStart"/>
+      <w:r>
+        <w:rPr>
+          <w:rFonts w:ascii="Consolas" w:eastAsia="Times New Roman" w:hAnsi="Consolas" w:cs="Times New Roman"/>
+          <w:sz w:val="24"/>
+          <w:szCs w:val="24"/>
+          <w:lang w:eastAsia="fr-FR"/>
+        </w:rPr>
+        <w:t>humidite</w:t>
+      </w:r>
+      <w:proofErr w:type="spellEnd"/>
+      <w:r>
+        <w:rPr>
+          <w:rFonts w:ascii="Consolas" w:eastAsia="Times New Roman" w:hAnsi="Consolas" w:cs="Times New Roman"/>
+          <w:sz w:val="24"/>
+          <w:szCs w:val="24"/>
+          <w:lang w:eastAsia="fr-FR"/>
+        </w:rPr>
+        <w:t xml:space="preserve">      591 non-</w:t>
+      </w:r>
+      <w:proofErr w:type="spellStart"/>
+      <w:r>
+        <w:rPr>
+          <w:rFonts w:ascii="Consolas" w:eastAsia="Times New Roman" w:hAnsi="Consolas" w:cs="Times New Roman"/>
+          <w:sz w:val="24"/>
+          <w:szCs w:val="24"/>
+          <w:lang w:eastAsia="fr-FR"/>
+        </w:rPr>
+        <w:t>null</w:t>
+      </w:r>
+      <w:proofErr w:type="spellEnd"/>
+      <w:r>
+        <w:rPr>
+          <w:rFonts w:ascii="Consolas" w:eastAsia="Times New Roman" w:hAnsi="Consolas" w:cs="Times New Roman"/>
+          <w:sz w:val="24"/>
+          <w:szCs w:val="24"/>
+          <w:lang w:eastAsia="fr-FR"/>
+        </w:rPr>
+        <w:t xml:space="preserve">    float64</w:t>
       </w:r>
     </w:p>
     <w:p>
@@ -8167,7 +9295,27 @@
           <w:szCs w:val="24"/>
           <w:lang w:eastAsia="fr-FR"/>
         </w:rPr>
-        <w:t xml:space="preserve"> 6   pression      591 non-null    float64</w:t>
+        <w:t xml:space="preserve"> 6   pression      591 non-</w:t>
+      </w:r>
+      <w:proofErr w:type="spellStart"/>
+      <w:r>
+        <w:rPr>
+          <w:rFonts w:ascii="Consolas" w:eastAsia="Times New Roman" w:hAnsi="Consolas" w:cs="Times New Roman"/>
+          <w:sz w:val="24"/>
+          <w:szCs w:val="24"/>
+          <w:lang w:eastAsia="fr-FR"/>
+        </w:rPr>
+        <w:t>null</w:t>
+      </w:r>
+      <w:proofErr w:type="spellEnd"/>
+      <w:r>
+        <w:rPr>
+          <w:rFonts w:ascii="Consolas" w:eastAsia="Times New Roman" w:hAnsi="Consolas" w:cs="Times New Roman"/>
+          <w:sz w:val="24"/>
+          <w:szCs w:val="24"/>
+          <w:lang w:eastAsia="fr-FR"/>
+        </w:rPr>
+        <w:t xml:space="preserve">    float64</w:t>
       </w:r>
     </w:p>
     <w:p>
@@ -8187,7 +9335,27 @@
           <w:szCs w:val="24"/>
           <w:lang w:eastAsia="fr-FR"/>
         </w:rPr>
-        <w:t xml:space="preserve"> 7   consommation  591 non-null    float64</w:t>
+        <w:t xml:space="preserve"> 7   consommation  591 non-</w:t>
+      </w:r>
+      <w:proofErr w:type="spellStart"/>
+      <w:r>
+        <w:rPr>
+          <w:rFonts w:ascii="Consolas" w:eastAsia="Times New Roman" w:hAnsi="Consolas" w:cs="Times New Roman"/>
+          <w:sz w:val="24"/>
+          <w:szCs w:val="24"/>
+          <w:lang w:eastAsia="fr-FR"/>
+        </w:rPr>
+        <w:t>null</w:t>
+      </w:r>
+      <w:proofErr w:type="spellEnd"/>
+      <w:r>
+        <w:rPr>
+          <w:rFonts w:ascii="Consolas" w:eastAsia="Times New Roman" w:hAnsi="Consolas" w:cs="Times New Roman"/>
+          <w:sz w:val="24"/>
+          <w:szCs w:val="24"/>
+          <w:lang w:eastAsia="fr-FR"/>
+        </w:rPr>
+        <w:t xml:space="preserve">    float64</w:t>
       </w:r>
     </w:p>
     <w:p>
@@ -8207,7 +9375,67 @@
           <w:szCs w:val="24"/>
           <w:lang w:eastAsia="fr-FR"/>
         </w:rPr>
-        <w:t xml:space="preserve"> 8   etat          596 non-null    str    </w:t>
+        <w:t xml:space="preserve"> 8   </w:t>
+      </w:r>
+      <w:proofErr w:type="spellStart"/>
+      <w:r>
+        <w:rPr>
+          <w:rFonts w:ascii="Consolas" w:eastAsia="Times New Roman" w:hAnsi="Consolas" w:cs="Times New Roman"/>
+          <w:sz w:val="24"/>
+          <w:szCs w:val="24"/>
+          <w:lang w:eastAsia="fr-FR"/>
+        </w:rPr>
+        <w:t>etat</w:t>
+      </w:r>
+      <w:proofErr w:type="spellEnd"/>
+      <w:r>
+        <w:rPr>
+          <w:rFonts w:ascii="Consolas" w:eastAsia="Times New Roman" w:hAnsi="Consolas" w:cs="Times New Roman"/>
+          <w:sz w:val="24"/>
+          <w:szCs w:val="24"/>
+          <w:lang w:eastAsia="fr-FR"/>
+        </w:rPr>
+        <w:t xml:space="preserve">          596 non-</w:t>
+      </w:r>
+      <w:proofErr w:type="spellStart"/>
+      <w:r>
+        <w:rPr>
+          <w:rFonts w:ascii="Consolas" w:eastAsia="Times New Roman" w:hAnsi="Consolas" w:cs="Times New Roman"/>
+          <w:sz w:val="24"/>
+          <w:szCs w:val="24"/>
+          <w:lang w:eastAsia="fr-FR"/>
+        </w:rPr>
+        <w:t>null</w:t>
+      </w:r>
+      <w:proofErr w:type="spellEnd"/>
+      <w:r>
+        <w:rPr>
+          <w:rFonts w:ascii="Consolas" w:eastAsia="Times New Roman" w:hAnsi="Consolas" w:cs="Times New Roman"/>
+          <w:sz w:val="24"/>
+          <w:szCs w:val="24"/>
+          <w:lang w:eastAsia="fr-FR"/>
+        </w:rPr>
+        <w:t xml:space="preserve">    </w:t>
+      </w:r>
+      <w:proofErr w:type="spellStart"/>
+      <w:r>
+        <w:rPr>
+          <w:rFonts w:ascii="Consolas" w:eastAsia="Times New Roman" w:hAnsi="Consolas" w:cs="Times New Roman"/>
+          <w:sz w:val="24"/>
+          <w:szCs w:val="24"/>
+          <w:lang w:eastAsia="fr-FR"/>
+        </w:rPr>
+        <w:t>str</w:t>
+      </w:r>
+      <w:proofErr w:type="spellEnd"/>
+      <w:r>
+        <w:rPr>
+          <w:rFonts w:ascii="Consolas" w:eastAsia="Times New Roman" w:hAnsi="Consolas" w:cs="Times New Roman"/>
+          <w:sz w:val="24"/>
+          <w:szCs w:val="24"/>
+          <w:lang w:eastAsia="fr-FR"/>
+        </w:rPr>
+        <w:t xml:space="preserve">    </w:t>
       </w:r>
     </w:p>
     <w:p>
@@ -8220,6 +9448,7 @@
           <w:lang w:val="en-US" w:eastAsia="fr-FR"/>
         </w:rPr>
       </w:pPr>
+      <w:proofErr w:type="spellStart"/>
       <w:r>
         <w:rPr>
           <w:rFonts w:ascii="Consolas" w:eastAsia="Times New Roman" w:hAnsi="Consolas" w:cs="Times New Roman"/>
@@ -8227,7 +9456,17 @@
           <w:szCs w:val="24"/>
           <w:lang w:val="en-US" w:eastAsia="fr-FR"/>
         </w:rPr>
-        <w:t>dtypes: float64(4), str(5)</w:t>
+        <w:t>dtypes</w:t>
+      </w:r>
+      <w:proofErr w:type="spellEnd"/>
+      <w:r>
+        <w:rPr>
+          <w:rFonts w:ascii="Consolas" w:eastAsia="Times New Roman" w:hAnsi="Consolas" w:cs="Times New Roman"/>
+          <w:sz w:val="24"/>
+          <w:szCs w:val="24"/>
+          <w:lang w:val="en-US" w:eastAsia="fr-FR"/>
+        </w:rPr>
+        <w:t>: float64(4), str(5)</w:t>
       </w:r>
     </w:p>
     <w:p>
@@ -8369,7 +9608,27 @@
           <w:sz w:val="24"/>
           <w:szCs w:val="24"/>
         </w:rPr>
-        <w:t>3. Valeurs aberrantes (outliers)</w:t>
+        <w:t>3. Valeurs aberrantes (</w:t>
+      </w:r>
+      <w:proofErr w:type="spellStart"/>
+      <w:r>
+        <w:rPr>
+          <w:rStyle w:val="CodeHTML"/>
+          <w:rFonts w:ascii="Times New Roman" w:hAnsi="Times New Roman" w:cs="Times New Roman"/>
+          <w:sz w:val="24"/>
+          <w:szCs w:val="24"/>
+        </w:rPr>
+        <w:t>outliers</w:t>
+      </w:r>
+      <w:proofErr w:type="spellEnd"/>
+      <w:r>
+        <w:rPr>
+          <w:rStyle w:val="CodeHTML"/>
+          <w:rFonts w:ascii="Times New Roman" w:hAnsi="Times New Roman" w:cs="Times New Roman"/>
+          <w:sz w:val="24"/>
+          <w:szCs w:val="24"/>
+        </w:rPr>
+        <w:t>)</w:t>
       </w:r>
     </w:p>
     <w:p>
@@ -8707,7 +9966,27 @@
           <w:sz w:val="24"/>
           <w:szCs w:val="24"/>
         </w:rPr>
-        <w:t>Tu es un data analyst spécialisé en visualisation de données.</w:t>
+        <w:t xml:space="preserve">Tu es un data </w:t>
+      </w:r>
+      <w:proofErr w:type="spellStart"/>
+      <w:r>
+        <w:rPr>
+          <w:rStyle w:val="CodeHTML"/>
+          <w:rFonts w:ascii="Times New Roman" w:hAnsi="Times New Roman" w:cs="Times New Roman"/>
+          <w:sz w:val="24"/>
+          <w:szCs w:val="24"/>
+        </w:rPr>
+        <w:t>analyst</w:t>
+      </w:r>
+      <w:proofErr w:type="spellEnd"/>
+      <w:r>
+        <w:rPr>
+          <w:rStyle w:val="CodeHTML"/>
+          <w:rFonts w:ascii="Times New Roman" w:hAnsi="Times New Roman" w:cs="Times New Roman"/>
+          <w:sz w:val="24"/>
+          <w:szCs w:val="24"/>
+        </w:rPr>
+        <w:t xml:space="preserve"> spécialisé en visualisation de données.</w:t>
       </w:r>
     </w:p>
     <w:p>
@@ -8893,7 +10172,67 @@
           <w:sz w:val="24"/>
           <w:szCs w:val="24"/>
         </w:rPr>
-        <w:t>Type de graphique (ex. série temporelle, scatter plot, heatmap, boxplot...)</w:t>
+        <w:t xml:space="preserve">Type de graphique (ex. série temporelle, </w:t>
+      </w:r>
+      <w:proofErr w:type="spellStart"/>
+      <w:r>
+        <w:rPr>
+          <w:rStyle w:val="CodeHTML"/>
+          <w:rFonts w:ascii="Times New Roman" w:hAnsi="Times New Roman" w:cs="Times New Roman"/>
+          <w:sz w:val="24"/>
+          <w:szCs w:val="24"/>
+        </w:rPr>
+        <w:t>scatter</w:t>
+      </w:r>
+      <w:proofErr w:type="spellEnd"/>
+      <w:r>
+        <w:rPr>
+          <w:rStyle w:val="CodeHTML"/>
+          <w:rFonts w:ascii="Times New Roman" w:hAnsi="Times New Roman" w:cs="Times New Roman"/>
+          <w:sz w:val="24"/>
+          <w:szCs w:val="24"/>
+        </w:rPr>
+        <w:t xml:space="preserve"> plot, </w:t>
+      </w:r>
+      <w:proofErr w:type="spellStart"/>
+      <w:r>
+        <w:rPr>
+          <w:rStyle w:val="CodeHTML"/>
+          <w:rFonts w:ascii="Times New Roman" w:hAnsi="Times New Roman" w:cs="Times New Roman"/>
+          <w:sz w:val="24"/>
+          <w:szCs w:val="24"/>
+        </w:rPr>
+        <w:t>heatmap</w:t>
+      </w:r>
+      <w:proofErr w:type="spellEnd"/>
+      <w:r>
+        <w:rPr>
+          <w:rStyle w:val="CodeHTML"/>
+          <w:rFonts w:ascii="Times New Roman" w:hAnsi="Times New Roman" w:cs="Times New Roman"/>
+          <w:sz w:val="24"/>
+          <w:szCs w:val="24"/>
+        </w:rPr>
+        <w:t xml:space="preserve">, </w:t>
+      </w:r>
+      <w:proofErr w:type="spellStart"/>
+      <w:r>
+        <w:rPr>
+          <w:rStyle w:val="CodeHTML"/>
+          <w:rFonts w:ascii="Times New Roman" w:hAnsi="Times New Roman" w:cs="Times New Roman"/>
+          <w:sz w:val="24"/>
+          <w:szCs w:val="24"/>
+        </w:rPr>
+        <w:t>boxplot</w:t>
+      </w:r>
+      <w:proofErr w:type="spellEnd"/>
+      <w:r>
+        <w:rPr>
+          <w:rStyle w:val="CodeHTML"/>
+          <w:rFonts w:ascii="Times New Roman" w:hAnsi="Times New Roman" w:cs="Times New Roman"/>
+          <w:sz w:val="24"/>
+          <w:szCs w:val="24"/>
+        </w:rPr>
+        <w:t>...)</w:t>
       </w:r>
     </w:p>
     <w:p>
@@ -9261,7 +10600,27 @@
           <w:sz w:val="24"/>
           <w:szCs w:val="24"/>
         </w:rPr>
-        <w:t>Tu es un expert en machine learning.</w:t>
+        <w:t xml:space="preserve">Tu es un expert en machine </w:t>
+      </w:r>
+      <w:proofErr w:type="spellStart"/>
+      <w:r>
+        <w:rPr>
+          <w:rStyle w:val="CodeHTML"/>
+          <w:rFonts w:ascii="Times New Roman" w:hAnsi="Times New Roman" w:cs="Times New Roman"/>
+          <w:sz w:val="24"/>
+          <w:szCs w:val="24"/>
+        </w:rPr>
+        <w:t>learning</w:t>
+      </w:r>
+      <w:proofErr w:type="spellEnd"/>
+      <w:r>
+        <w:rPr>
+          <w:rStyle w:val="CodeHTML"/>
+          <w:rFonts w:ascii="Times New Roman" w:hAnsi="Times New Roman" w:cs="Times New Roman"/>
+          <w:sz w:val="24"/>
+          <w:szCs w:val="24"/>
+        </w:rPr>
+        <w:t>.</w:t>
       </w:r>
     </w:p>
     <w:p>
@@ -9770,7 +11129,35 @@
               <w:rPr>
                 <w:lang w:eastAsia="fr-FR"/>
               </w:rPr>
-              <w:t>Cherche une relation linéaire entre la consommation et les variables explicatives (temperature, humidite, pression, etc.).</w:t>
+              <w:t>Cherche une relation linéaire entre la consommation et les variables explicatives (</w:t>
+            </w:r>
+            <w:proofErr w:type="spellStart"/>
+            <w:r>
+              <w:rPr>
+                <w:lang w:eastAsia="fr-FR"/>
+              </w:rPr>
+              <w:t>temperature</w:t>
+            </w:r>
+            <w:proofErr w:type="spellEnd"/>
+            <w:r>
+              <w:rPr>
+                <w:lang w:eastAsia="fr-FR"/>
+              </w:rPr>
+              <w:t xml:space="preserve">, </w:t>
+            </w:r>
+            <w:proofErr w:type="spellStart"/>
+            <w:r>
+              <w:rPr>
+                <w:lang w:eastAsia="fr-FR"/>
+              </w:rPr>
+              <w:t>humidite</w:t>
+            </w:r>
+            <w:proofErr w:type="spellEnd"/>
+            <w:r>
+              <w:rPr>
+                <w:lang w:eastAsia="fr-FR"/>
+              </w:rPr>
+              <w:t>, pression, etc.).</w:t>
             </w:r>
           </w:p>
         </w:tc>
@@ -9790,7 +11177,21 @@
               <w:rPr>
                 <w:lang w:eastAsia="fr-FR"/>
               </w:rPr>
-              <w:t>Simple, rapide et facilement interprétable. Bon modèle de référence (baseline).</w:t>
+              <w:t>Simple, rapide et facilement interprétable. Bon modèle de référence (</w:t>
+            </w:r>
+            <w:proofErr w:type="spellStart"/>
+            <w:r>
+              <w:rPr>
+                <w:lang w:eastAsia="fr-FR"/>
+              </w:rPr>
+              <w:t>baseline</w:t>
+            </w:r>
+            <w:proofErr w:type="spellEnd"/>
+            <w:r>
+              <w:rPr>
+                <w:lang w:eastAsia="fr-FR"/>
+              </w:rPr>
+              <w:t>).</w:t>
             </w:r>
           </w:p>
         </w:tc>
@@ -9871,12 +11272,28 @@
                 <w:lang w:eastAsia="fr-FR"/>
               </w:rPr>
             </w:pPr>
+            <w:proofErr w:type="spellStart"/>
             <w:r>
               <w:rPr>
                 <w:lang w:eastAsia="fr-FR"/>
               </w:rPr>
-              <w:t>Random Forest Regressor</w:t>
+              <w:t>Random</w:t>
             </w:r>
+            <w:proofErr w:type="spellEnd"/>
+            <w:r>
+              <w:rPr>
+                <w:lang w:eastAsia="fr-FR"/>
+              </w:rPr>
+              <w:t xml:space="preserve"> Forest </w:t>
+            </w:r>
+            <w:proofErr w:type="spellStart"/>
+            <w:r>
+              <w:rPr>
+                <w:lang w:eastAsia="fr-FR"/>
+              </w:rPr>
+              <w:t>Regressor</w:t>
+            </w:r>
+            <w:proofErr w:type="spellEnd"/>
           </w:p>
         </w:tc>
         <w:tc>
@@ -9915,7 +11332,21 @@
               <w:rPr>
                 <w:lang w:eastAsia="fr-FR"/>
               </w:rPr>
-              <w:t>Capture les relations non linéaires et les interactions entre variables. Peu sensible aux valeurs aberrantes. Fonctionne bien sur de petits datasets.</w:t>
+              <w:t xml:space="preserve">Capture les relations non linéaires et les interactions entre variables. Peu sensible aux valeurs aberrantes. Fonctionne bien sur de petits </w:t>
+            </w:r>
+            <w:proofErr w:type="spellStart"/>
+            <w:r>
+              <w:rPr>
+                <w:lang w:eastAsia="fr-FR"/>
+              </w:rPr>
+              <w:t>datasets</w:t>
+            </w:r>
+            <w:proofErr w:type="spellEnd"/>
+            <w:r>
+              <w:rPr>
+                <w:lang w:eastAsia="fr-FR"/>
+              </w:rPr>
+              <w:t>.</w:t>
             </w:r>
           </w:p>
         </w:tc>
@@ -9935,7 +11366,21 @@
               <w:rPr>
                 <w:lang w:eastAsia="fr-FR"/>
               </w:rPr>
-              <w:t>Moins interprétable qu'une régression linéaire. Peut être moins performant pour extrapoler dans le temps.</w:t>
+              <w:t xml:space="preserve">Moins interprétable qu'une régression linéaire. </w:t>
+            </w:r>
+            <w:proofErr w:type="spellStart"/>
+            <w:r>
+              <w:rPr>
+                <w:lang w:eastAsia="fr-FR"/>
+              </w:rPr>
+              <w:t>Peut être</w:t>
+            </w:r>
+            <w:proofErr w:type="spellEnd"/>
+            <w:r>
+              <w:rPr>
+                <w:lang w:eastAsia="fr-FR"/>
+              </w:rPr>
+              <w:t xml:space="preserve"> moins performant pour extrapoler dans le temps.</w:t>
             </w:r>
           </w:p>
         </w:tc>
@@ -10001,8 +11446,30 @@
               <w:rPr>
                 <w:lang w:eastAsia="fr-FR"/>
               </w:rPr>
-              <w:t>Gradient Boosting / XGBoost</w:t>
+              <w:t xml:space="preserve">Gradient </w:t>
             </w:r>
+            <w:proofErr w:type="spellStart"/>
+            <w:r>
+              <w:rPr>
+                <w:lang w:eastAsia="fr-FR"/>
+              </w:rPr>
+              <w:t>Boosting</w:t>
+            </w:r>
+            <w:proofErr w:type="spellEnd"/>
+            <w:r>
+              <w:rPr>
+                <w:lang w:eastAsia="fr-FR"/>
+              </w:rPr>
+              <w:t xml:space="preserve"> / </w:t>
+            </w:r>
+            <w:proofErr w:type="spellStart"/>
+            <w:r>
+              <w:rPr>
+                <w:lang w:eastAsia="fr-FR"/>
+              </w:rPr>
+              <w:t>XGBoost</w:t>
+            </w:r>
+            <w:proofErr w:type="spellEnd"/>
           </w:p>
         </w:tc>
         <w:tc>
@@ -10130,12 +11597,14 @@
                 <w:lang w:eastAsia="fr-FR"/>
               </w:rPr>
             </w:pPr>
+            <w:proofErr w:type="spellStart"/>
             <w:r>
               <w:rPr>
                 <w:lang w:eastAsia="fr-FR"/>
               </w:rPr>
               <w:t>LightGBM</w:t>
             </w:r>
+            <w:proofErr w:type="spellEnd"/>
           </w:p>
         </w:tc>
         <w:tc>
@@ -10154,7 +11623,21 @@
               <w:rPr>
                 <w:lang w:eastAsia="fr-FR"/>
               </w:rPr>
-              <w:t>Utilise un algorithme de gradient boosting basé sur des arbres optimisés pour être rapide et efficace.</w:t>
+              <w:t xml:space="preserve">Utilise un algorithme de gradient </w:t>
+            </w:r>
+            <w:proofErr w:type="spellStart"/>
+            <w:r>
+              <w:rPr>
+                <w:lang w:eastAsia="fr-FR"/>
+              </w:rPr>
+              <w:t>boosting</w:t>
+            </w:r>
+            <w:proofErr w:type="spellEnd"/>
+            <w:r>
+              <w:rPr>
+                <w:lang w:eastAsia="fr-FR"/>
+              </w:rPr>
+              <w:t xml:space="preserve"> basé sur des arbres optimisés pour être rapide et efficace.</w:t>
             </w:r>
           </w:p>
         </w:tc>
@@ -10260,7 +11743,35 @@
               <w:rPr>
                 <w:lang w:eastAsia="fr-FR"/>
               </w:rPr>
-              <w:t>SVR (Support Vector Regression)</w:t>
+              <w:t xml:space="preserve">SVR (Support </w:t>
+            </w:r>
+            <w:proofErr w:type="spellStart"/>
+            <w:r>
+              <w:rPr>
+                <w:lang w:eastAsia="fr-FR"/>
+              </w:rPr>
+              <w:t>Vector</w:t>
+            </w:r>
+            <w:proofErr w:type="spellEnd"/>
+            <w:r>
+              <w:rPr>
+                <w:lang w:eastAsia="fr-FR"/>
+              </w:rPr>
+              <w:t xml:space="preserve"> </w:t>
+            </w:r>
+            <w:proofErr w:type="spellStart"/>
+            <w:r>
+              <w:rPr>
+                <w:lang w:eastAsia="fr-FR"/>
+              </w:rPr>
+              <w:t>Regression</w:t>
+            </w:r>
+            <w:proofErr w:type="spellEnd"/>
+            <w:r>
+              <w:rPr>
+                <w:lang w:eastAsia="fr-FR"/>
+              </w:rPr>
+              <w:t>)</w:t>
             </w:r>
           </w:p>
         </w:tc>
@@ -10385,8 +11896,16 @@
               <w:rPr>
                 <w:lang w:eastAsia="fr-FR"/>
               </w:rPr>
-              <w:t>KNN Regressor</w:t>
+              <w:t xml:space="preserve">KNN </w:t>
             </w:r>
+            <w:proofErr w:type="spellStart"/>
+            <w:r>
+              <w:rPr>
+                <w:lang w:eastAsia="fr-FR"/>
+              </w:rPr>
+              <w:t>Regressor</w:t>
+            </w:r>
+            <w:proofErr w:type="spellEnd"/>
           </w:p>
         </w:tc>
         <w:tc>
@@ -10551,7 +12070,21 @@
               <w:rPr>
                 <w:lang w:eastAsia="fr-FR"/>
               </w:rPr>
-              <w:t>Peut apprendre des relations complexes et servir de base à une approche Deep Learning.</w:t>
+              <w:t xml:space="preserve">Peut apprendre des relations complexes et servir de base à une approche </w:t>
+            </w:r>
+            <w:proofErr w:type="spellStart"/>
+            <w:r>
+              <w:rPr>
+                <w:lang w:eastAsia="fr-FR"/>
+              </w:rPr>
+              <w:t>Deep</w:t>
+            </w:r>
+            <w:proofErr w:type="spellEnd"/>
+            <w:r>
+              <w:rPr>
+                <w:lang w:eastAsia="fr-FR"/>
+              </w:rPr>
+              <w:t xml:space="preserve"> Learning.</w:t>
             </w:r>
           </w:p>
         </w:tc>
@@ -10967,7 +12500,27 @@
           <w:sz w:val="24"/>
           <w:szCs w:val="24"/>
         </w:rPr>
-        <w:t>Tu es un formateur en machine learning.</w:t>
+        <w:t xml:space="preserve">Tu es un formateur en machine </w:t>
+      </w:r>
+      <w:proofErr w:type="spellStart"/>
+      <w:r>
+        <w:rPr>
+          <w:rStyle w:val="CodeHTML"/>
+          <w:rFonts w:ascii="Times New Roman" w:hAnsi="Times New Roman" w:cs="Times New Roman"/>
+          <w:sz w:val="24"/>
+          <w:szCs w:val="24"/>
+        </w:rPr>
+        <w:t>learning</w:t>
+      </w:r>
+      <w:proofErr w:type="spellEnd"/>
+      <w:r>
+        <w:rPr>
+          <w:rStyle w:val="CodeHTML"/>
+          <w:rFonts w:ascii="Times New Roman" w:hAnsi="Times New Roman" w:cs="Times New Roman"/>
+          <w:sz w:val="24"/>
+          <w:szCs w:val="24"/>
+        </w:rPr>
+        <w:t>.</w:t>
       </w:r>
     </w:p>
     <w:p>
@@ -11009,7 +12562,27 @@
           <w:sz w:val="24"/>
           <w:szCs w:val="24"/>
         </w:rPr>
-        <w:t xml:space="preserve"> : Explique les métriques de classification suivantes : Accuracy, Precision,</w:t>
+        <w:t xml:space="preserve"> : Explique les métriques de classification suivantes : Accuracy, </w:t>
+      </w:r>
+      <w:proofErr w:type="spellStart"/>
+      <w:r>
+        <w:rPr>
+          <w:rStyle w:val="CodeHTML"/>
+          <w:rFonts w:ascii="Times New Roman" w:hAnsi="Times New Roman" w:cs="Times New Roman"/>
+          <w:sz w:val="24"/>
+          <w:szCs w:val="24"/>
+        </w:rPr>
+        <w:t>Precision</w:t>
+      </w:r>
+      <w:proofErr w:type="spellEnd"/>
+      <w:r>
+        <w:rPr>
+          <w:rStyle w:val="CodeHTML"/>
+          <w:rFonts w:ascii="Times New Roman" w:hAnsi="Times New Roman" w:cs="Times New Roman"/>
+          <w:sz w:val="24"/>
+          <w:szCs w:val="24"/>
+        </w:rPr>
+        <w:t>,</w:t>
       </w:r>
     </w:p>
     <w:p>
@@ -11859,7 +13432,27 @@
           <w:sz w:val="24"/>
           <w:szCs w:val="24"/>
         </w:rPr>
-        <w:t xml:space="preserve"> es un formateur en machine learning.</w:t>
+        <w:t xml:space="preserve"> es un formateur en machine </w:t>
+      </w:r>
+      <w:proofErr w:type="spellStart"/>
+      <w:r>
+        <w:rPr>
+          <w:rStyle w:val="CodeHTML"/>
+          <w:rFonts w:ascii="Times New Roman" w:hAnsi="Times New Roman" w:cs="Times New Roman"/>
+          <w:sz w:val="24"/>
+          <w:szCs w:val="24"/>
+        </w:rPr>
+        <w:t>learning</w:t>
+      </w:r>
+      <w:proofErr w:type="spellEnd"/>
+      <w:r>
+        <w:rPr>
+          <w:rStyle w:val="CodeHTML"/>
+          <w:rFonts w:ascii="Times New Roman" w:hAnsi="Times New Roman" w:cs="Times New Roman"/>
+          <w:sz w:val="24"/>
+          <w:szCs w:val="24"/>
+        </w:rPr>
+        <w:t>.</w:t>
       </w:r>
     </w:p>
     <w:p>
@@ -12565,7 +14158,21 @@
         <w:rPr>
           <w:rStyle w:val="Accentuation"/>
         </w:rPr>
-        <w:t xml:space="preserve"> comparer de deux version de yolo pour la détection d’objet </w:t>
+        <w:t xml:space="preserve"> comparer de deux version de </w:t>
+      </w:r>
+      <w:proofErr w:type="spellStart"/>
+      <w:r>
+        <w:rPr>
+          <w:rStyle w:val="Accentuation"/>
+        </w:rPr>
+        <w:t>yolo</w:t>
+      </w:r>
+      <w:proofErr w:type="spellEnd"/>
+      <w:r>
+        <w:rPr>
+          <w:rStyle w:val="Accentuation"/>
+        </w:rPr>
+        <w:t xml:space="preserve"> pour la détection d’objet </w:t>
       </w:r>
     </w:p>
     <w:p>
@@ -12640,7 +14247,43 @@
           <w:sz w:val="24"/>
           <w:szCs w:val="24"/>
         </w:rPr>
-        <w:t xml:space="preserve">Dans le mémoire "Détection de visages par YoloV8 et YoloV5" (Abbey Adjovi Matiale, UQTR, janvier 2025), quelles sont les valeurs de mAP@0.5 et mAP@0.5:0.95 obtenues par </w:t>
+        <w:t xml:space="preserve">Dans le mémoire "Détection de visages par YoloV8 et YoloV5" (Abbey </w:t>
+      </w:r>
+      <w:proofErr w:type="spellStart"/>
+      <w:r>
+        <w:rPr>
+          <w:rFonts w:ascii="Times New Roman" w:hAnsi="Times New Roman" w:cs="Times New Roman"/>
+          <w:sz w:val="24"/>
+          <w:szCs w:val="24"/>
+        </w:rPr>
+        <w:t>Adjovi</w:t>
+      </w:r>
+      <w:proofErr w:type="spellEnd"/>
+      <w:r>
+        <w:rPr>
+          <w:rFonts w:ascii="Times New Roman" w:hAnsi="Times New Roman" w:cs="Times New Roman"/>
+          <w:sz w:val="24"/>
+          <w:szCs w:val="24"/>
+        </w:rPr>
+        <w:t xml:space="preserve"> </w:t>
+      </w:r>
+      <w:proofErr w:type="spellStart"/>
+      <w:r>
+        <w:rPr>
+          <w:rFonts w:ascii="Times New Roman" w:hAnsi="Times New Roman" w:cs="Times New Roman"/>
+          <w:sz w:val="24"/>
+          <w:szCs w:val="24"/>
+        </w:rPr>
+        <w:t>Matiale</w:t>
+      </w:r>
+      <w:proofErr w:type="spellEnd"/>
+      <w:r>
+        <w:rPr>
+          <w:rFonts w:ascii="Times New Roman" w:hAnsi="Times New Roman" w:cs="Times New Roman"/>
+          <w:sz w:val="24"/>
+          <w:szCs w:val="24"/>
+        </w:rPr>
+        <w:t xml:space="preserve">, UQTR, janvier 2025), quelles sont les valeurs de mAP@0.5 et mAP@0.5:0.95 obtenues par </w:t>
       </w:r>
       <w:r>
         <w:rPr>
@@ -14245,6 +15888,694 @@
           </wp:inline>
         </w:drawing>
       </w:r>
+    </w:p>
+    <w:p>
+      <w:pPr>
+        <w:pStyle w:val="Titre1"/>
+        <w:rPr>
+          <w:sz w:val="28"/>
+          <w:szCs w:val="28"/>
+        </w:rPr>
+      </w:pPr>
+      <w:r>
+        <w:rPr>
+          <w:sz w:val="28"/>
+          <w:szCs w:val="28"/>
+        </w:rPr>
+        <w:t>P</w:t>
+      </w:r>
+      <w:r>
+        <w:rPr>
+          <w:sz w:val="28"/>
+          <w:szCs w:val="28"/>
+        </w:rPr>
+        <w:t xml:space="preserve">artie </w:t>
+      </w:r>
+      <w:r>
+        <w:rPr>
+          <w:sz w:val="28"/>
+          <w:szCs w:val="28"/>
+        </w:rPr>
+        <w:t>8</w:t>
+      </w:r>
+      <w:r>
+        <w:rPr>
+          <w:sz w:val="28"/>
+          <w:szCs w:val="28"/>
+        </w:rPr>
+        <w:t> :</w:t>
+      </w:r>
+      <w:r>
+        <w:rPr>
+          <w:sz w:val="28"/>
+          <w:szCs w:val="28"/>
+        </w:rPr>
+        <w:t xml:space="preserve"> Évaluation</w:t>
+      </w:r>
+      <w:r>
+        <w:rPr>
+          <w:sz w:val="28"/>
+          <w:szCs w:val="28"/>
+        </w:rPr>
+        <w:t xml:space="preserve"> et optimisation des prompts</w:t>
+      </w:r>
+    </w:p>
+    <w:p>
+      <w:pPr>
+        <w:pStyle w:val="Titre2"/>
+        <w:rPr>
+          <w:color w:val="000000" w:themeColor="text1"/>
+          <w:sz w:val="24"/>
+          <w:szCs w:val="24"/>
+        </w:rPr>
+      </w:pPr>
+      <w:r>
+        <w:rPr>
+          <w:color w:val="000000" w:themeColor="text1"/>
+          <w:sz w:val="24"/>
+          <w:szCs w:val="24"/>
+        </w:rPr>
+        <w:t>Prompt A</w:t>
+      </w:r>
+    </w:p>
+    <w:p>
+      <w:pPr>
+        <w:pStyle w:val="PrformatHTML"/>
+        <w:rPr>
+          <w:rStyle w:val="CodeHTML"/>
+          <w:rFonts w:ascii="Times New Roman" w:hAnsi="Times New Roman" w:cs="Times New Roman"/>
+          <w:color w:val="000000" w:themeColor="text1"/>
+          <w:sz w:val="24"/>
+          <w:szCs w:val="24"/>
+        </w:rPr>
+      </w:pPr>
+      <w:r>
+        <w:rPr>
+          <w:rStyle w:val="CodeHTML"/>
+          <w:rFonts w:ascii="Times New Roman" w:hAnsi="Times New Roman" w:cs="Times New Roman"/>
+          <w:color w:val="000000" w:themeColor="text1"/>
+          <w:sz w:val="24"/>
+          <w:szCs w:val="24"/>
+        </w:rPr>
+        <w:t>Résume ce texte.</w:t>
+      </w:r>
+    </w:p>
+    <w:p>
+      <w:pPr>
+        <w:pStyle w:val="PrformatHTML"/>
+        <w:rPr>
+          <w:rStyle w:val="CodeHTML"/>
+          <w:rFonts w:ascii="Times New Roman" w:hAnsi="Times New Roman" w:cs="Times New Roman"/>
+          <w:color w:val="000000" w:themeColor="text1"/>
+          <w:sz w:val="24"/>
+          <w:szCs w:val="24"/>
+        </w:rPr>
+      </w:pPr>
+    </w:p>
+    <w:p>
+      <w:pPr>
+        <w:pStyle w:val="PrformatHTML"/>
+        <w:rPr>
+          <w:rStyle w:val="CodeHTML"/>
+          <w:rFonts w:ascii="Times New Roman" w:hAnsi="Times New Roman" w:cs="Times New Roman"/>
+          <w:color w:val="000000" w:themeColor="text1"/>
+          <w:sz w:val="24"/>
+          <w:szCs w:val="24"/>
+        </w:rPr>
+      </w:pPr>
+      <w:r>
+        <w:rPr>
+          <w:rStyle w:val="CodeHTML"/>
+          <w:rFonts w:ascii="Times New Roman" w:hAnsi="Times New Roman" w:cs="Times New Roman"/>
+          <w:color w:val="000000" w:themeColor="text1"/>
+          <w:sz w:val="24"/>
+          <w:szCs w:val="24"/>
+        </w:rPr>
+        <w:t>Texte :</w:t>
+      </w:r>
+    </w:p>
+    <w:p>
+      <w:pPr>
+        <w:pStyle w:val="PrformatHTML"/>
+        <w:rPr>
+          <w:rStyle w:val="CodeHTML"/>
+          <w:rFonts w:ascii="Times New Roman" w:hAnsi="Times New Roman" w:cs="Times New Roman"/>
+          <w:color w:val="000000" w:themeColor="text1"/>
+          <w:sz w:val="24"/>
+          <w:szCs w:val="24"/>
+        </w:rPr>
+      </w:pPr>
+      <w:r>
+        <w:rPr>
+          <w:rStyle w:val="CodeHTML"/>
+          <w:rFonts w:ascii="Times New Roman" w:hAnsi="Times New Roman" w:cs="Times New Roman"/>
+          <w:color w:val="000000" w:themeColor="text1"/>
+          <w:sz w:val="24"/>
+          <w:szCs w:val="24"/>
+        </w:rPr>
+        <w:t>"""</w:t>
+      </w:r>
+    </w:p>
+    <w:p>
+      <w:pPr>
+        <w:autoSpaceDE w:val="0"/>
+        <w:autoSpaceDN w:val="0"/>
+        <w:adjustRightInd w:val="0"/>
+        <w:spacing w:after="0" w:line="240" w:lineRule="auto"/>
+        <w:rPr>
+          <w:rFonts w:ascii="TimesNewRomanPSMT" w:hAnsi="TimesNewRomanPSMT" w:cs="TimesNewRomanPSMT"/>
+          <w:color w:val="000000"/>
+          <w:sz w:val="24"/>
+          <w:szCs w:val="24"/>
+        </w:rPr>
+      </w:pPr>
+      <w:r>
+        <w:rPr>
+          <w:rFonts w:ascii="TimesNewRomanPSMT" w:hAnsi="TimesNewRomanPSMT" w:cs="TimesNewRomanPSMT"/>
+          <w:color w:val="000000"/>
+          <w:sz w:val="24"/>
+          <w:szCs w:val="24"/>
+        </w:rPr>
+        <w:t>L'objectif de cette recherche est de construire un système qui automatise l'analyse</w:t>
+      </w:r>
+    </w:p>
+    <w:p>
+      <w:pPr>
+        <w:autoSpaceDE w:val="0"/>
+        <w:autoSpaceDN w:val="0"/>
+        <w:adjustRightInd w:val="0"/>
+        <w:spacing w:after="0" w:line="240" w:lineRule="auto"/>
+        <w:rPr>
+          <w:rFonts w:ascii="TimesNewRomanPSMT" w:hAnsi="TimesNewRomanPSMT" w:cs="TimesNewRomanPSMT"/>
+          <w:color w:val="000000"/>
+          <w:sz w:val="24"/>
+          <w:szCs w:val="24"/>
+        </w:rPr>
+      </w:pPr>
+      <w:r>
+        <w:rPr>
+          <w:rFonts w:ascii="TimesNewRomanPSMT" w:hAnsi="TimesNewRomanPSMT" w:cs="TimesNewRomanPSMT"/>
+          <w:color w:val="000000"/>
+          <w:sz w:val="24"/>
+          <w:szCs w:val="24"/>
+        </w:rPr>
+        <w:t>des informations contenues dans les images et plus spécifiquement pour réaliser la tâche</w:t>
+      </w:r>
+    </w:p>
+    <w:p>
+      <w:pPr>
+        <w:autoSpaceDE w:val="0"/>
+        <w:autoSpaceDN w:val="0"/>
+        <w:adjustRightInd w:val="0"/>
+        <w:spacing w:after="0" w:line="240" w:lineRule="auto"/>
+        <w:rPr>
+          <w:rFonts w:ascii="TimesNewRomanPSMT" w:hAnsi="TimesNewRomanPSMT" w:cs="TimesNewRomanPSMT"/>
+          <w:color w:val="000000"/>
+          <w:sz w:val="24"/>
+          <w:szCs w:val="24"/>
+        </w:rPr>
+      </w:pPr>
+      <w:r>
+        <w:rPr>
+          <w:rFonts w:ascii="TimesNewRomanPSMT" w:hAnsi="TimesNewRomanPSMT" w:cs="TimesNewRomanPSMT"/>
+          <w:color w:val="000000"/>
+          <w:sz w:val="24"/>
+          <w:szCs w:val="24"/>
+        </w:rPr>
+        <w:t>de détection de visage. Dans ce contexte il est essentiel de disposer d'algorithmes à la fois</w:t>
+      </w:r>
+    </w:p>
+    <w:p>
+      <w:pPr>
+        <w:autoSpaceDE w:val="0"/>
+        <w:autoSpaceDN w:val="0"/>
+        <w:adjustRightInd w:val="0"/>
+        <w:spacing w:after="0" w:line="240" w:lineRule="auto"/>
+        <w:rPr>
+          <w:rFonts w:ascii="TimesNewRomanPSMT" w:hAnsi="TimesNewRomanPSMT" w:cs="TimesNewRomanPSMT"/>
+          <w:color w:val="000000"/>
+          <w:sz w:val="24"/>
+          <w:szCs w:val="24"/>
+        </w:rPr>
+      </w:pPr>
+      <w:r>
+        <w:rPr>
+          <w:rFonts w:ascii="TimesNewRomanPSMT" w:hAnsi="TimesNewRomanPSMT" w:cs="TimesNewRomanPSMT"/>
+          <w:color w:val="000000"/>
+          <w:sz w:val="24"/>
+          <w:szCs w:val="24"/>
+        </w:rPr>
+        <w:t>efficaces et robustes. En effet, la capacité à détecter avec précision les visages est cruciale</w:t>
+      </w:r>
+    </w:p>
+    <w:p>
+      <w:pPr>
+        <w:autoSpaceDE w:val="0"/>
+        <w:autoSpaceDN w:val="0"/>
+        <w:adjustRightInd w:val="0"/>
+        <w:spacing w:after="0" w:line="240" w:lineRule="auto"/>
+        <w:rPr>
+          <w:rFonts w:ascii="TimesNewRomanPSMT" w:hAnsi="TimesNewRomanPSMT" w:cs="TimesNewRomanPSMT"/>
+          <w:color w:val="000000"/>
+          <w:sz w:val="24"/>
+          <w:szCs w:val="24"/>
+        </w:rPr>
+      </w:pPr>
+      <w:r>
+        <w:rPr>
+          <w:rFonts w:ascii="TimesNewRomanPSMT" w:hAnsi="TimesNewRomanPSMT" w:cs="TimesNewRomanPSMT"/>
+          <w:color w:val="000000"/>
+          <w:sz w:val="24"/>
+          <w:szCs w:val="24"/>
+        </w:rPr>
+        <w:t>dans diverses applications. En réalité, l'importance de la détection des visages ne peut être</w:t>
+      </w:r>
+    </w:p>
+    <w:p>
+      <w:pPr>
+        <w:autoSpaceDE w:val="0"/>
+        <w:autoSpaceDN w:val="0"/>
+        <w:adjustRightInd w:val="0"/>
+        <w:spacing w:after="0" w:line="240" w:lineRule="auto"/>
+        <w:rPr>
+          <w:rFonts w:ascii="TimesNewRomanPSMT" w:hAnsi="TimesNewRomanPSMT" w:cs="TimesNewRomanPSMT"/>
+          <w:color w:val="000000"/>
+          <w:sz w:val="24"/>
+          <w:szCs w:val="24"/>
+        </w:rPr>
+      </w:pPr>
+      <w:r>
+        <w:rPr>
+          <w:rFonts w:ascii="TimesNewRomanPSMT" w:hAnsi="TimesNewRomanPSMT" w:cs="TimesNewRomanPSMT"/>
+          <w:color w:val="000000"/>
+          <w:sz w:val="24"/>
+          <w:szCs w:val="24"/>
+        </w:rPr>
+        <w:t>surestimée lorsqu'il s'agit de tout système impliquant l'analyse des visages. L'objectif est</w:t>
+      </w:r>
+    </w:p>
+    <w:p>
+      <w:pPr>
+        <w:autoSpaceDE w:val="0"/>
+        <w:autoSpaceDN w:val="0"/>
+        <w:adjustRightInd w:val="0"/>
+        <w:spacing w:after="0" w:line="240" w:lineRule="auto"/>
+        <w:rPr>
+          <w:rFonts w:ascii="TimesNewRomanPSMT" w:hAnsi="TimesNewRomanPSMT" w:cs="TimesNewRomanPSMT"/>
+          <w:color w:val="000000"/>
+          <w:sz w:val="24"/>
+          <w:szCs w:val="24"/>
+        </w:rPr>
+      </w:pPr>
+      <w:r>
+        <w:rPr>
+          <w:rFonts w:ascii="TimesNewRomanPSMT" w:hAnsi="TimesNewRomanPSMT" w:cs="TimesNewRomanPSMT"/>
+          <w:color w:val="000000"/>
+          <w:sz w:val="24"/>
+          <w:szCs w:val="24"/>
+        </w:rPr>
+        <w:t>de détecter toutes les zones d'une image qui représentent un visage, sans tenir compte de</w:t>
+      </w:r>
+    </w:p>
+    <w:p>
+      <w:pPr>
+        <w:autoSpaceDE w:val="0"/>
+        <w:autoSpaceDN w:val="0"/>
+        <w:adjustRightInd w:val="0"/>
+        <w:spacing w:after="0" w:line="240" w:lineRule="auto"/>
+        <w:rPr>
+          <w:rFonts w:ascii="TimesNewRomanPSMT" w:hAnsi="TimesNewRomanPSMT" w:cs="TimesNewRomanPSMT"/>
+          <w:color w:val="000000"/>
+          <w:sz w:val="24"/>
+          <w:szCs w:val="24"/>
+        </w:rPr>
+      </w:pPr>
+      <w:r>
+        <w:rPr>
+          <w:rFonts w:ascii="TimesNewRomanPSMT" w:hAnsi="TimesNewRomanPSMT" w:cs="TimesNewRomanPSMT"/>
+          <w:color w:val="000000"/>
+          <w:sz w:val="24"/>
+          <w:szCs w:val="24"/>
+        </w:rPr>
+        <w:t>leur emplacement. Pour mieux comprendre les effets de la position, de l'orientation et de</w:t>
+      </w:r>
+    </w:p>
+    <w:p>
+      <w:pPr>
+        <w:autoSpaceDE w:val="0"/>
+        <w:autoSpaceDN w:val="0"/>
+        <w:adjustRightInd w:val="0"/>
+        <w:spacing w:after="0" w:line="240" w:lineRule="auto"/>
+        <w:rPr>
+          <w:rFonts w:ascii="TimesNewRomanPSMT" w:hAnsi="TimesNewRomanPSMT" w:cs="TimesNewRomanPSMT"/>
+          <w:color w:val="000000"/>
+          <w:sz w:val="24"/>
+          <w:szCs w:val="24"/>
+        </w:rPr>
+      </w:pPr>
+      <w:r>
+        <w:rPr>
+          <w:rFonts w:ascii="TimesNewRomanPSMT" w:hAnsi="TimesNewRomanPSMT" w:cs="TimesNewRomanPSMT"/>
+          <w:color w:val="000000"/>
+          <w:sz w:val="24"/>
+          <w:szCs w:val="24"/>
+        </w:rPr>
+        <w:t>l'éclairage sur la perception visuelle, de nombreuses études ont été menées. Plus</w:t>
+      </w:r>
+    </w:p>
+    <w:p>
+      <w:pPr>
+        <w:autoSpaceDE w:val="0"/>
+        <w:autoSpaceDN w:val="0"/>
+        <w:adjustRightInd w:val="0"/>
+        <w:spacing w:after="0" w:line="240" w:lineRule="auto"/>
+        <w:rPr>
+          <w:rFonts w:ascii="TimesNewRomanPSMT" w:hAnsi="TimesNewRomanPSMT" w:cs="TimesNewRomanPSMT"/>
+          <w:color w:val="000000"/>
+          <w:sz w:val="24"/>
+          <w:szCs w:val="24"/>
+        </w:rPr>
+      </w:pPr>
+      <w:r>
+        <w:rPr>
+          <w:rFonts w:ascii="TimesNewRomanPSMT" w:hAnsi="TimesNewRomanPSMT" w:cs="TimesNewRomanPSMT"/>
+          <w:color w:val="000000"/>
+          <w:sz w:val="24"/>
+          <w:szCs w:val="24"/>
+        </w:rPr>
+        <w:t>précisément, la recherche s'est concentrée sur ces facteurs et leur impact sur la façon dont</w:t>
+      </w:r>
+    </w:p>
+    <w:p>
+      <w:pPr>
+        <w:autoSpaceDE w:val="0"/>
+        <w:autoSpaceDN w:val="0"/>
+        <w:adjustRightInd w:val="0"/>
+        <w:spacing w:after="0" w:line="240" w:lineRule="auto"/>
+        <w:rPr>
+          <w:rFonts w:ascii="TimesNewRomanPSMT" w:hAnsi="TimesNewRomanPSMT" w:cs="TimesNewRomanPSMT"/>
+          <w:color w:val="000000"/>
+          <w:sz w:val="24"/>
+          <w:szCs w:val="24"/>
+        </w:rPr>
+      </w:pPr>
+      <w:r>
+        <w:rPr>
+          <w:rFonts w:ascii="TimesNewRomanPSMT" w:hAnsi="TimesNewRomanPSMT" w:cs="TimesNewRomanPSMT"/>
+          <w:color w:val="000000"/>
+          <w:sz w:val="24"/>
+          <w:szCs w:val="24"/>
+        </w:rPr>
+        <w:t>les individus perçoivent les stimuli visuels. Il existe de nombreuses méthodes pour</w:t>
+      </w:r>
+    </w:p>
+    <w:p>
+      <w:pPr>
+        <w:autoSpaceDE w:val="0"/>
+        <w:autoSpaceDN w:val="0"/>
+        <w:adjustRightInd w:val="0"/>
+        <w:spacing w:after="0" w:line="240" w:lineRule="auto"/>
+        <w:rPr>
+          <w:rFonts w:ascii="TimesNewRomanPSMT" w:hAnsi="TimesNewRomanPSMT" w:cs="TimesNewRomanPSMT"/>
+          <w:color w:val="000000"/>
+          <w:sz w:val="24"/>
+          <w:szCs w:val="24"/>
+        </w:rPr>
+      </w:pPr>
+      <w:r>
+        <w:rPr>
+          <w:rFonts w:ascii="TimesNewRomanPSMT" w:hAnsi="TimesNewRomanPSMT" w:cs="TimesNewRomanPSMT"/>
+          <w:color w:val="000000"/>
+          <w:sz w:val="24"/>
+          <w:szCs w:val="24"/>
+        </w:rPr>
+        <w:t>identifier les visages dans les images statiques qui ont été développées au fil du temps. La</w:t>
+      </w:r>
+    </w:p>
+    <w:p>
+      <w:pPr>
+        <w:autoSpaceDE w:val="0"/>
+        <w:autoSpaceDN w:val="0"/>
+        <w:adjustRightInd w:val="0"/>
+        <w:spacing w:after="0" w:line="240" w:lineRule="auto"/>
+        <w:rPr>
+          <w:rFonts w:ascii="TimesNewRomanPSMT" w:hAnsi="TimesNewRomanPSMT" w:cs="TimesNewRomanPSMT"/>
+          <w:color w:val="202122"/>
+          <w:sz w:val="24"/>
+          <w:szCs w:val="24"/>
+        </w:rPr>
+      </w:pPr>
+      <w:r>
+        <w:rPr>
+          <w:rFonts w:ascii="TimesNewRomanPSMT" w:hAnsi="TimesNewRomanPSMT" w:cs="TimesNewRomanPSMT"/>
+          <w:color w:val="000000"/>
+          <w:sz w:val="24"/>
+          <w:szCs w:val="24"/>
+        </w:rPr>
+        <w:t xml:space="preserve">reconnaissance faciale a été effectuée pour la première fois dans les années 1970 par </w:t>
+      </w:r>
+      <w:r>
+        <w:rPr>
+          <w:rFonts w:ascii="TimesNewRomanPSMT" w:hAnsi="TimesNewRomanPSMT" w:cs="TimesNewRomanPSMT"/>
+          <w:color w:val="202122"/>
+          <w:sz w:val="24"/>
+          <w:szCs w:val="24"/>
+        </w:rPr>
+        <w:t>à</w:t>
+      </w:r>
+    </w:p>
+    <w:p>
+      <w:pPr>
+        <w:autoSpaceDE w:val="0"/>
+        <w:autoSpaceDN w:val="0"/>
+        <w:adjustRightInd w:val="0"/>
+        <w:spacing w:after="0" w:line="240" w:lineRule="auto"/>
+        <w:rPr>
+          <w:rFonts w:ascii="TimesNewRomanPSMT" w:hAnsi="TimesNewRomanPSMT" w:cs="TimesNewRomanPSMT"/>
+          <w:color w:val="202122"/>
+          <w:sz w:val="24"/>
+          <w:szCs w:val="24"/>
+        </w:rPr>
+      </w:pPr>
+      <w:r>
+        <w:rPr>
+          <w:rFonts w:ascii="TimesNewRomanPSMT" w:hAnsi="TimesNewRomanPSMT" w:cs="TimesNewRomanPSMT"/>
+          <w:color w:val="000000"/>
+          <w:sz w:val="24"/>
+          <w:szCs w:val="24"/>
+        </w:rPr>
+        <w:t xml:space="preserve">l’université de Tokyo. La détection faciale est alors surtout utilisée </w:t>
+      </w:r>
+      <w:r>
+        <w:rPr>
+          <w:rFonts w:ascii="TimesNewRomanPSMT" w:hAnsi="TimesNewRomanPSMT" w:cs="TimesNewRomanPSMT"/>
+          <w:color w:val="202122"/>
+          <w:sz w:val="24"/>
+          <w:szCs w:val="24"/>
+        </w:rPr>
+        <w:t>à des fins de sécurité</w:t>
+      </w:r>
+    </w:p>
+    <w:p>
+      <w:pPr>
+        <w:autoSpaceDE w:val="0"/>
+        <w:autoSpaceDN w:val="0"/>
+        <w:adjustRightInd w:val="0"/>
+        <w:spacing w:after="0" w:line="240" w:lineRule="auto"/>
+        <w:rPr>
+          <w:rFonts w:ascii="TimesNewRomanPSMT" w:hAnsi="TimesNewRomanPSMT" w:cs="TimesNewRomanPSMT"/>
+          <w:color w:val="202122"/>
+          <w:sz w:val="24"/>
+          <w:szCs w:val="24"/>
+        </w:rPr>
+      </w:pPr>
+      <w:r>
+        <w:rPr>
+          <w:rFonts w:ascii="TimesNewRomanPSMT" w:hAnsi="TimesNewRomanPSMT" w:cs="TimesNewRomanPSMT"/>
+          <w:color w:val="000000"/>
+          <w:sz w:val="24"/>
+          <w:szCs w:val="24"/>
+        </w:rPr>
+        <w:t xml:space="preserve">[1]. </w:t>
+      </w:r>
+      <w:r>
+        <w:rPr>
+          <w:rFonts w:ascii="TimesNewRomanPSMT" w:hAnsi="TimesNewRomanPSMT" w:cs="TimesNewRomanPSMT"/>
+          <w:color w:val="202122"/>
+          <w:sz w:val="24"/>
+          <w:szCs w:val="24"/>
+        </w:rPr>
+        <w:t>Certaines interfaces homme machine utilisent non seulement le clavier et la souris</w:t>
+      </w:r>
+    </w:p>
+    <w:p>
+      <w:pPr>
+        <w:autoSpaceDE w:val="0"/>
+        <w:autoSpaceDN w:val="0"/>
+        <w:adjustRightInd w:val="0"/>
+        <w:spacing w:after="0" w:line="240" w:lineRule="auto"/>
+        <w:rPr>
+          <w:rFonts w:ascii="TimesNewRomanPSMT" w:hAnsi="TimesNewRomanPSMT" w:cs="TimesNewRomanPSMT"/>
+          <w:color w:val="202122"/>
+          <w:sz w:val="24"/>
+          <w:szCs w:val="24"/>
+        </w:rPr>
+      </w:pPr>
+      <w:r>
+        <w:rPr>
+          <w:rFonts w:ascii="TimesNewRomanPSMT" w:hAnsi="TimesNewRomanPSMT" w:cs="TimesNewRomanPSMT"/>
+          <w:color w:val="202122"/>
+          <w:sz w:val="24"/>
+          <w:szCs w:val="24"/>
+        </w:rPr>
+        <w:t>mais de nouvelles formes de sources d’information comme la reconnaissance des visages.</w:t>
+      </w:r>
+    </w:p>
+    <w:p>
+      <w:pPr>
+        <w:pStyle w:val="PrformatHTML"/>
+        <w:rPr>
+          <w:rFonts w:ascii="TimesNewRomanPSMT" w:hAnsi="TimesNewRomanPSMT" w:cs="TimesNewRomanPSMT"/>
+          <w:color w:val="202122"/>
+          <w:sz w:val="24"/>
+          <w:szCs w:val="24"/>
+        </w:rPr>
+      </w:pPr>
+      <w:r>
+        <w:rPr>
+          <w:rFonts w:ascii="TimesNewRomanPSMT" w:hAnsi="TimesNewRomanPSMT" w:cs="TimesNewRomanPSMT"/>
+          <w:color w:val="202122"/>
+          <w:sz w:val="24"/>
+          <w:szCs w:val="24"/>
+        </w:rPr>
+        <w:t>Dans ce chapitre, nous présenterons l’état de l’art sur les techniques de la détection faciale.</w:t>
+      </w:r>
+    </w:p>
+    <w:p>
+      <w:pPr>
+        <w:pStyle w:val="PrformatHTML"/>
+        <w:rPr>
+          <w:rFonts w:ascii="Times New Roman" w:hAnsi="Times New Roman" w:cs="Times New Roman"/>
+          <w:color w:val="000000" w:themeColor="text1"/>
+          <w:sz w:val="24"/>
+          <w:szCs w:val="24"/>
+        </w:rPr>
+      </w:pPr>
+      <w:r>
+        <w:rPr>
+          <w:rStyle w:val="CodeHTML"/>
+          <w:rFonts w:ascii="Times New Roman" w:hAnsi="Times New Roman" w:cs="Times New Roman"/>
+          <w:color w:val="000000" w:themeColor="text1"/>
+          <w:sz w:val="24"/>
+          <w:szCs w:val="24"/>
+        </w:rPr>
+        <w:t>"""</w:t>
+      </w:r>
+    </w:p>
+    <w:p>
+      <w:pPr>
+        <w:pStyle w:val="NormalWeb"/>
+        <w:rPr>
+          <w:color w:val="000000" w:themeColor="text1"/>
+        </w:rPr>
+      </w:pPr>
+      <w:r>
+        <w:rPr>
+          <w:rStyle w:val="lev"/>
+          <w:color w:val="000000" w:themeColor="text1"/>
+        </w:rPr>
+        <w:t>Ré</w:t>
+      </w:r>
+      <w:r>
+        <w:rPr>
+          <w:rStyle w:val="lev"/>
+          <w:color w:val="000000" w:themeColor="text1"/>
+        </w:rPr>
+        <w:t>sultat</w:t>
+      </w:r>
+      <w:r>
+        <w:rPr>
+          <w:rStyle w:val="lev"/>
+          <w:color w:val="000000" w:themeColor="text1"/>
+        </w:rPr>
+        <w:t>:</w:t>
+      </w:r>
+      <w:r>
+        <w:rPr>
+          <w:color w:val="000000" w:themeColor="text1"/>
+        </w:rPr>
+        <w:t xml:space="preserve"> </w:t>
+      </w:r>
+    </w:p>
+    <w:p>
+      <w:pPr>
+        <w:pStyle w:val="NormalWeb"/>
+        <w:rPr>
+          <w:rStyle w:val="Accentuation"/>
+          <w:color w:val="000000" w:themeColor="text1"/>
+        </w:rPr>
+      </w:pPr>
+      <w:r>
+        <w:rPr>
+          <w:rStyle w:val="Accentuation"/>
+          <w:color w:val="000000" w:themeColor="text1"/>
+        </w:rPr>
+        <w:lastRenderedPageBreak/>
+        <w:drawing>
+          <wp:inline distT="0" distB="0" distL="0" distR="0" wp14:anchorId="68AA9DE7" wp14:editId="74789E47">
+            <wp:extent cx="5588287" cy="1968601"/>
+            <wp:effectExtent l="0" t="0" r="0" b="0"/>
+            <wp:docPr id="51" name="Image 51"/>
+            <wp:cNvGraphicFramePr>
+              <a:graphicFrameLocks xmlns:a="http://schemas.openxmlformats.org/drawingml/2006/main" noChangeAspect="1"/>
+            </wp:cNvGraphicFramePr>
+            <a:graphic xmlns:a="http://schemas.openxmlformats.org/drawingml/2006/main">
+              <a:graphicData uri="http://schemas.openxmlformats.org/drawingml/2006/picture">
+                <pic:pic xmlns:pic="http://schemas.openxmlformats.org/drawingml/2006/picture">
+                  <pic:nvPicPr>
+                    <pic:cNvPr id="1" name=""/>
+                    <pic:cNvPicPr/>
+                  </pic:nvPicPr>
+                  <pic:blipFill>
+                    <a:blip r:embed="rId53"/>
+                    <a:stretch>
+                      <a:fillRect/>
+                    </a:stretch>
+                  </pic:blipFill>
+                  <pic:spPr>
+                    <a:xfrm>
+                      <a:off x="0" y="0"/>
+                      <a:ext cx="5588287" cy="1968601"/>
+                    </a:xfrm>
+                    <a:prstGeom prst="rect">
+                      <a:avLst/>
+                    </a:prstGeom>
+                  </pic:spPr>
+                </pic:pic>
+              </a:graphicData>
+            </a:graphic>
+          </wp:inline>
+        </w:drawing>
+      </w:r>
+    </w:p>
+    <w:p>
+      <w:pPr>
+        <w:pStyle w:val="NormalWeb"/>
+        <w:rPr>
+          <w:color w:val="000000" w:themeColor="text1"/>
+        </w:rPr>
+      </w:pPr>
+    </w:p>
+    <w:p>
+      <w:pPr>
+        <w:pStyle w:val="NormalWeb"/>
+        <w:rPr>
+          <w:rStyle w:val="CodeHTML"/>
+          <w:rFonts w:ascii="Times New Roman" w:hAnsi="Times New Roman" w:cs="Times New Roman"/>
+          <w:sz w:val="28"/>
+          <w:szCs w:val="28"/>
+        </w:rPr>
+      </w:pPr>
     </w:p>
     <w:sectPr>
       <w:pgSz w:w="11906" w:h="16838"/>

</xml_diff>

<commit_message>
Partie 8  Prompe B
</commit_message>
<xml_diff>
--- a/ai-business_assistant.docx
+++ b/ai-business_assistant.docx
@@ -1561,7 +1561,27 @@
           <w:sz w:val="24"/>
           <w:szCs w:val="24"/>
         </w:rPr>
-        <w:t>Commentaire : "Le produit est arrivé cassé et le support ne répond pas."</w:t>
+        <w:t xml:space="preserve">Commentaire : "Le produit est arrivé </w:t>
+      </w:r>
+      <w:proofErr w:type="gramStart"/>
+      <w:r>
+        <w:rPr>
+          <w:rStyle w:val="CodeHTML"/>
+          <w:rFonts w:ascii="Times New Roman" w:eastAsiaTheme="minorHAnsi" w:hAnsi="Times New Roman" w:cs="Times New Roman"/>
+          <w:sz w:val="24"/>
+          <w:szCs w:val="24"/>
+        </w:rPr>
+        <w:t>cassé</w:t>
+      </w:r>
+      <w:proofErr w:type="gramEnd"/>
+      <w:r>
+        <w:rPr>
+          <w:rStyle w:val="CodeHTML"/>
+          <w:rFonts w:ascii="Times New Roman" w:eastAsiaTheme="minorHAnsi" w:hAnsi="Times New Roman" w:cs="Times New Roman"/>
+          <w:sz w:val="24"/>
+          <w:szCs w:val="24"/>
+        </w:rPr>
+        <w:t xml:space="preserve"> et le support ne répond pas."</w:t>
       </w:r>
     </w:p>
     <w:p>
@@ -2036,7 +2056,27 @@
           <w:sz w:val="24"/>
           <w:szCs w:val="24"/>
         </w:rPr>
-        <w:t xml:space="preserve">   (un commentaire mixte penche généralement vers négatif si le problème</w:t>
+        <w:t xml:space="preserve">   (</w:t>
+      </w:r>
+      <w:proofErr w:type="gramStart"/>
+      <w:r>
+        <w:rPr>
+          <w:rStyle w:val="CodeHTML"/>
+          <w:rFonts w:ascii="Times New Roman" w:hAnsi="Times New Roman" w:cs="Times New Roman"/>
+          <w:sz w:val="24"/>
+          <w:szCs w:val="24"/>
+        </w:rPr>
+        <w:t>un</w:t>
+      </w:r>
+      <w:proofErr w:type="gramEnd"/>
+      <w:r>
+        <w:rPr>
+          <w:rStyle w:val="CodeHTML"/>
+          <w:rFonts w:ascii="Times New Roman" w:hAnsi="Times New Roman" w:cs="Times New Roman"/>
+          <w:sz w:val="24"/>
+          <w:szCs w:val="24"/>
+        </w:rPr>
+        <w:t xml:space="preserve"> commentaire mixte penche généralement vers négatif si le problème</w:t>
       </w:r>
     </w:p>
     <w:p>
@@ -2057,7 +2097,27 @@
           <w:sz w:val="24"/>
           <w:szCs w:val="24"/>
         </w:rPr>
-        <w:t xml:space="preserve">   mentionné affecte l'usage du produit).</w:t>
+        <w:t xml:space="preserve">   </w:t>
+      </w:r>
+      <w:proofErr w:type="gramStart"/>
+      <w:r>
+        <w:rPr>
+          <w:rStyle w:val="CodeHTML"/>
+          <w:rFonts w:ascii="Times New Roman" w:hAnsi="Times New Roman" w:cs="Times New Roman"/>
+          <w:sz w:val="24"/>
+          <w:szCs w:val="24"/>
+        </w:rPr>
+        <w:t>mentionné</w:t>
+      </w:r>
+      <w:proofErr w:type="gramEnd"/>
+      <w:r>
+        <w:rPr>
+          <w:rStyle w:val="CodeHTML"/>
+          <w:rFonts w:ascii="Times New Roman" w:hAnsi="Times New Roman" w:cs="Times New Roman"/>
+          <w:sz w:val="24"/>
+          <w:szCs w:val="24"/>
+        </w:rPr>
+        <w:t xml:space="preserve"> affecte l'usage du produit).</w:t>
       </w:r>
     </w:p>
     <w:p>
@@ -2211,14 +2271,25 @@
         <w:t>elements_positifs</w:t>
       </w:r>
       <w:proofErr w:type="spellEnd"/>
-      <w:r>
-        <w:rPr>
-          <w:rStyle w:val="CodeHTML"/>
-          <w:rFonts w:ascii="Times New Roman" w:hAnsi="Times New Roman" w:cs="Times New Roman"/>
-          <w:sz w:val="24"/>
-          <w:szCs w:val="24"/>
-        </w:rPr>
-        <w:t>": [...],</w:t>
+      <w:proofErr w:type="gramStart"/>
+      <w:r>
+        <w:rPr>
+          <w:rStyle w:val="CodeHTML"/>
+          <w:rFonts w:ascii="Times New Roman" w:hAnsi="Times New Roman" w:cs="Times New Roman"/>
+          <w:sz w:val="24"/>
+          <w:szCs w:val="24"/>
+        </w:rPr>
+        <w:t>":</w:t>
+      </w:r>
+      <w:proofErr w:type="gramEnd"/>
+      <w:r>
+        <w:rPr>
+          <w:rStyle w:val="CodeHTML"/>
+          <w:rFonts w:ascii="Times New Roman" w:hAnsi="Times New Roman" w:cs="Times New Roman"/>
+          <w:sz w:val="24"/>
+          <w:szCs w:val="24"/>
+        </w:rPr>
+        <w:t xml:space="preserve"> [...],</w:t>
       </w:r>
     </w:p>
     <w:p>
@@ -2252,14 +2323,25 @@
         <w:t>elements_negatifs</w:t>
       </w:r>
       <w:proofErr w:type="spellEnd"/>
-      <w:r>
-        <w:rPr>
-          <w:rStyle w:val="CodeHTML"/>
-          <w:rFonts w:ascii="Times New Roman" w:hAnsi="Times New Roman" w:cs="Times New Roman"/>
-          <w:sz w:val="24"/>
-          <w:szCs w:val="24"/>
-        </w:rPr>
-        <w:t>": [...],</w:t>
+      <w:proofErr w:type="gramStart"/>
+      <w:r>
+        <w:rPr>
+          <w:rStyle w:val="CodeHTML"/>
+          <w:rFonts w:ascii="Times New Roman" w:hAnsi="Times New Roman" w:cs="Times New Roman"/>
+          <w:sz w:val="24"/>
+          <w:szCs w:val="24"/>
+        </w:rPr>
+        <w:t>":</w:t>
+      </w:r>
+      <w:proofErr w:type="gramEnd"/>
+      <w:r>
+        <w:rPr>
+          <w:rStyle w:val="CodeHTML"/>
+          <w:rFonts w:ascii="Times New Roman" w:hAnsi="Times New Roman" w:cs="Times New Roman"/>
+          <w:sz w:val="24"/>
+          <w:szCs w:val="24"/>
+        </w:rPr>
+        <w:t xml:space="preserve"> [...],</w:t>
       </w:r>
     </w:p>
     <w:p>
@@ -2280,7 +2362,27 @@
           <w:sz w:val="24"/>
           <w:szCs w:val="24"/>
         </w:rPr>
-        <w:t xml:space="preserve">  "classe": "positif | négatif | neutre",</w:t>
+        <w:t xml:space="preserve">  "classe</w:t>
+      </w:r>
+      <w:proofErr w:type="gramStart"/>
+      <w:r>
+        <w:rPr>
+          <w:rStyle w:val="CodeHTML"/>
+          <w:rFonts w:ascii="Times New Roman" w:hAnsi="Times New Roman" w:cs="Times New Roman"/>
+          <w:sz w:val="24"/>
+          <w:szCs w:val="24"/>
+        </w:rPr>
+        <w:t>":</w:t>
+      </w:r>
+      <w:proofErr w:type="gramEnd"/>
+      <w:r>
+        <w:rPr>
+          <w:rStyle w:val="CodeHTML"/>
+          <w:rFonts w:ascii="Times New Roman" w:hAnsi="Times New Roman" w:cs="Times New Roman"/>
+          <w:sz w:val="24"/>
+          <w:szCs w:val="24"/>
+        </w:rPr>
+        <w:t xml:space="preserve"> "positif | négatif | neutre",</w:t>
       </w:r>
     </w:p>
     <w:p>
@@ -2301,7 +2403,27 @@
           <w:sz w:val="24"/>
           <w:szCs w:val="24"/>
         </w:rPr>
-        <w:t xml:space="preserve">  "justification": "..."</w:t>
+        <w:t xml:space="preserve">  "justification</w:t>
+      </w:r>
+      <w:proofErr w:type="gramStart"/>
+      <w:r>
+        <w:rPr>
+          <w:rStyle w:val="CodeHTML"/>
+          <w:rFonts w:ascii="Times New Roman" w:hAnsi="Times New Roman" w:cs="Times New Roman"/>
+          <w:sz w:val="24"/>
+          <w:szCs w:val="24"/>
+        </w:rPr>
+        <w:t>":</w:t>
+      </w:r>
+      <w:proofErr w:type="gramEnd"/>
+      <w:r>
+        <w:rPr>
+          <w:rStyle w:val="CodeHTML"/>
+          <w:rFonts w:ascii="Times New Roman" w:hAnsi="Times New Roman" w:cs="Times New Roman"/>
+          <w:sz w:val="24"/>
+          <w:szCs w:val="24"/>
+        </w:rPr>
+        <w:t xml:space="preserve"> "..."</w:t>
       </w:r>
     </w:p>
     <w:p>
@@ -3160,6 +3282,7 @@
           <w:szCs w:val="24"/>
         </w:rPr>
       </w:pPr>
+      <w:proofErr w:type="gramStart"/>
       <w:r>
         <w:rPr>
           <w:rStyle w:val="CodeHTML"/>
@@ -3167,37 +3290,39 @@
           <w:sz w:val="24"/>
           <w:szCs w:val="24"/>
         </w:rPr>
-        <w:t>pour lundi, mais nous sommes jeudi et je n'ai toujours rien reçu. Le suivi de ma</w:t>
-      </w:r>
-    </w:p>
-    <w:p>
-      <w:pPr>
+        <w:t>pour</w:t>
+      </w:r>
+      <w:proofErr w:type="gramEnd"/>
+      <w:r>
         <w:rPr>
           <w:rStyle w:val="CodeHTML"/>
           <w:rFonts w:ascii="Times New Roman" w:eastAsiaTheme="minorHAnsi" w:hAnsi="Times New Roman" w:cs="Times New Roman"/>
           <w:sz w:val="24"/>
           <w:szCs w:val="24"/>
         </w:rPr>
-      </w:pPr>
-      <w:r>
+        <w:t xml:space="preserve"> lundi, mais nous sommes jeudi et je n'ai toujours rien reçu. Le suivi de ma</w:t>
+      </w:r>
+    </w:p>
+    <w:p>
+      <w:pPr>
         <w:rPr>
           <w:rStyle w:val="CodeHTML"/>
           <w:rFonts w:ascii="Times New Roman" w:eastAsiaTheme="minorHAnsi" w:hAnsi="Times New Roman" w:cs="Times New Roman"/>
           <w:sz w:val="24"/>
           <w:szCs w:val="24"/>
         </w:rPr>
-        <w:t>commande n'a pas été mis à jour depuis lundi. J'ai également contacté le service</w:t>
-      </w:r>
-    </w:p>
-    <w:p>
-      <w:pPr>
+      </w:pPr>
+      <w:proofErr w:type="gramStart"/>
+      <w:r>
         <w:rPr>
           <w:rStyle w:val="CodeHTML"/>
           <w:rFonts w:ascii="Times New Roman" w:eastAsiaTheme="minorHAnsi" w:hAnsi="Times New Roman" w:cs="Times New Roman"/>
           <w:sz w:val="24"/>
           <w:szCs w:val="24"/>
         </w:rPr>
-      </w:pPr>
+        <w:t>commande</w:t>
+      </w:r>
+      <w:proofErr w:type="gramEnd"/>
       <w:r>
         <w:rPr>
           <w:rStyle w:val="CodeHTML"/>
@@ -3205,7 +3330,37 @@
           <w:sz w:val="24"/>
           <w:szCs w:val="24"/>
         </w:rPr>
-        <w:t>client mardi, mais je n'ai reçu aucune réponse jusqu'à présent.</w:t>
+        <w:t xml:space="preserve"> n'a pas été mis à jour depuis lundi. J'ai également contacté le service</w:t>
+      </w:r>
+    </w:p>
+    <w:p>
+      <w:pPr>
+        <w:rPr>
+          <w:rStyle w:val="CodeHTML"/>
+          <w:rFonts w:ascii="Times New Roman" w:eastAsiaTheme="minorHAnsi" w:hAnsi="Times New Roman" w:cs="Times New Roman"/>
+          <w:sz w:val="24"/>
+          <w:szCs w:val="24"/>
+        </w:rPr>
+      </w:pPr>
+      <w:proofErr w:type="gramStart"/>
+      <w:r>
+        <w:rPr>
+          <w:rStyle w:val="CodeHTML"/>
+          <w:rFonts w:ascii="Times New Roman" w:eastAsiaTheme="minorHAnsi" w:hAnsi="Times New Roman" w:cs="Times New Roman"/>
+          <w:sz w:val="24"/>
+          <w:szCs w:val="24"/>
+        </w:rPr>
+        <w:t>client</w:t>
+      </w:r>
+      <w:proofErr w:type="gramEnd"/>
+      <w:r>
+        <w:rPr>
+          <w:rStyle w:val="CodeHTML"/>
+          <w:rFonts w:ascii="Times New Roman" w:eastAsiaTheme="minorHAnsi" w:hAnsi="Times New Roman" w:cs="Times New Roman"/>
+          <w:sz w:val="24"/>
+          <w:szCs w:val="24"/>
+        </w:rPr>
+        <w:t xml:space="preserve"> mardi, mais je n'ai reçu aucune réponse jusqu'à présent.</w:t>
       </w:r>
     </w:p>
     <w:p>
@@ -3805,6 +3960,7 @@
         <w:t>informations_non_justifiees</w:t>
       </w:r>
       <w:proofErr w:type="spellEnd"/>
+      <w:proofErr w:type="gramStart"/>
       <w:r>
         <w:rPr>
           <w:rStyle w:val="CodeHTML"/>
@@ -3812,37 +3968,38 @@
           <w:sz w:val="24"/>
           <w:szCs w:val="24"/>
         </w:rPr>
-        <w:t>": [...],</w:t>
-      </w:r>
-    </w:p>
-    <w:p>
-      <w:pPr>
+        <w:t>":</w:t>
+      </w:r>
+      <w:proofErr w:type="gramEnd"/>
+      <w:r>
         <w:rPr>
           <w:rStyle w:val="CodeHTML"/>
           <w:rFonts w:ascii="Times New Roman" w:eastAsiaTheme="minorHAnsi" w:hAnsi="Times New Roman" w:cs="Times New Roman"/>
           <w:sz w:val="24"/>
           <w:szCs w:val="24"/>
         </w:rPr>
-      </w:pPr>
-      <w:r>
+        <w:t xml:space="preserve"> [...],</w:t>
+      </w:r>
+    </w:p>
+    <w:p>
+      <w:pPr>
         <w:rPr>
           <w:rStyle w:val="CodeHTML"/>
           <w:rFonts w:ascii="Times New Roman" w:eastAsiaTheme="minorHAnsi" w:hAnsi="Times New Roman" w:cs="Times New Roman"/>
           <w:sz w:val="24"/>
           <w:szCs w:val="24"/>
         </w:rPr>
-        <w:t xml:space="preserve">  "contradictions": [...],</w:t>
-      </w:r>
-    </w:p>
-    <w:p>
-      <w:pPr>
+      </w:pPr>
+      <w:r>
         <w:rPr>
           <w:rStyle w:val="CodeHTML"/>
           <w:rFonts w:ascii="Times New Roman" w:eastAsiaTheme="minorHAnsi" w:hAnsi="Times New Roman" w:cs="Times New Roman"/>
           <w:sz w:val="24"/>
           <w:szCs w:val="24"/>
         </w:rPr>
-      </w:pPr>
+        <w:t xml:space="preserve">  "contradictions</w:t>
+      </w:r>
+      <w:proofErr w:type="gramStart"/>
       <w:r>
         <w:rPr>
           <w:rStyle w:val="CodeHTML"/>
@@ -3850,6 +4007,35 @@
           <w:sz w:val="24"/>
           <w:szCs w:val="24"/>
         </w:rPr>
+        <w:t>":</w:t>
+      </w:r>
+      <w:proofErr w:type="gramEnd"/>
+      <w:r>
+        <w:rPr>
+          <w:rStyle w:val="CodeHTML"/>
+          <w:rFonts w:ascii="Times New Roman" w:eastAsiaTheme="minorHAnsi" w:hAnsi="Times New Roman" w:cs="Times New Roman"/>
+          <w:sz w:val="24"/>
+          <w:szCs w:val="24"/>
+        </w:rPr>
+        <w:t xml:space="preserve"> [...],</w:t>
+      </w:r>
+    </w:p>
+    <w:p>
+      <w:pPr>
+        <w:rPr>
+          <w:rStyle w:val="CodeHTML"/>
+          <w:rFonts w:ascii="Times New Roman" w:eastAsiaTheme="minorHAnsi" w:hAnsi="Times New Roman" w:cs="Times New Roman"/>
+          <w:sz w:val="24"/>
+          <w:szCs w:val="24"/>
+        </w:rPr>
+      </w:pPr>
+      <w:r>
+        <w:rPr>
+          <w:rStyle w:val="CodeHTML"/>
+          <w:rFonts w:ascii="Times New Roman" w:eastAsiaTheme="minorHAnsi" w:hAnsi="Times New Roman" w:cs="Times New Roman"/>
+          <w:sz w:val="24"/>
+          <w:szCs w:val="24"/>
+        </w:rPr>
         <w:t xml:space="preserve">  "</w:t>
       </w:r>
       <w:proofErr w:type="spellStart"/>
@@ -3863,6 +4049,7 @@
         <w:t>informations_absentes</w:t>
       </w:r>
       <w:proofErr w:type="spellEnd"/>
+      <w:proofErr w:type="gramStart"/>
       <w:r>
         <w:rPr>
           <w:rStyle w:val="CodeHTML"/>
@@ -3870,37 +4057,38 @@
           <w:sz w:val="24"/>
           <w:szCs w:val="24"/>
         </w:rPr>
-        <w:t>": [...],</w:t>
-      </w:r>
-    </w:p>
-    <w:p>
-      <w:pPr>
+        <w:t>":</w:t>
+      </w:r>
+      <w:proofErr w:type="gramEnd"/>
+      <w:r>
         <w:rPr>
           <w:rStyle w:val="CodeHTML"/>
           <w:rFonts w:ascii="Times New Roman" w:eastAsiaTheme="minorHAnsi" w:hAnsi="Times New Roman" w:cs="Times New Roman"/>
           <w:sz w:val="24"/>
           <w:szCs w:val="24"/>
         </w:rPr>
-      </w:pPr>
-      <w:r>
+        <w:t xml:space="preserve"> [...],</w:t>
+      </w:r>
+    </w:p>
+    <w:p>
+      <w:pPr>
         <w:rPr>
           <w:rStyle w:val="CodeHTML"/>
           <w:rFonts w:ascii="Times New Roman" w:eastAsiaTheme="minorHAnsi" w:hAnsi="Times New Roman" w:cs="Times New Roman"/>
           <w:sz w:val="24"/>
           <w:szCs w:val="24"/>
         </w:rPr>
-        <w:t xml:space="preserve">  "hallucinations": [...],</w:t>
-      </w:r>
-    </w:p>
-    <w:p>
-      <w:pPr>
+      </w:pPr>
+      <w:r>
         <w:rPr>
           <w:rStyle w:val="CodeHTML"/>
           <w:rFonts w:ascii="Times New Roman" w:eastAsiaTheme="minorHAnsi" w:hAnsi="Times New Roman" w:cs="Times New Roman"/>
           <w:sz w:val="24"/>
           <w:szCs w:val="24"/>
         </w:rPr>
-      </w:pPr>
+        <w:t xml:space="preserve">  "hallucinations</w:t>
+      </w:r>
+      <w:proofErr w:type="gramStart"/>
       <w:r>
         <w:rPr>
           <w:rStyle w:val="CodeHTML"/>
@@ -3908,6 +4096,35 @@
           <w:sz w:val="24"/>
           <w:szCs w:val="24"/>
         </w:rPr>
+        <w:t>":</w:t>
+      </w:r>
+      <w:proofErr w:type="gramEnd"/>
+      <w:r>
+        <w:rPr>
+          <w:rStyle w:val="CodeHTML"/>
+          <w:rFonts w:ascii="Times New Roman" w:eastAsiaTheme="minorHAnsi" w:hAnsi="Times New Roman" w:cs="Times New Roman"/>
+          <w:sz w:val="24"/>
+          <w:szCs w:val="24"/>
+        </w:rPr>
+        <w:t xml:space="preserve"> [...],</w:t>
+      </w:r>
+    </w:p>
+    <w:p>
+      <w:pPr>
+        <w:rPr>
+          <w:rStyle w:val="CodeHTML"/>
+          <w:rFonts w:ascii="Times New Roman" w:eastAsiaTheme="minorHAnsi" w:hAnsi="Times New Roman" w:cs="Times New Roman"/>
+          <w:sz w:val="24"/>
+          <w:szCs w:val="24"/>
+        </w:rPr>
+      </w:pPr>
+      <w:r>
+        <w:rPr>
+          <w:rStyle w:val="CodeHTML"/>
+          <w:rFonts w:ascii="Times New Roman" w:eastAsiaTheme="minorHAnsi" w:hAnsi="Times New Roman" w:cs="Times New Roman"/>
+          <w:sz w:val="24"/>
+          <w:szCs w:val="24"/>
+        </w:rPr>
         <w:t xml:space="preserve">  "</w:t>
       </w:r>
       <w:proofErr w:type="spellStart"/>
@@ -3921,6 +4138,7 @@
         <w:t>contraintes_respectees</w:t>
       </w:r>
       <w:proofErr w:type="spellEnd"/>
+      <w:proofErr w:type="gramStart"/>
       <w:r>
         <w:rPr>
           <w:rStyle w:val="CodeHTML"/>
@@ -3928,7 +4146,17 @@
           <w:sz w:val="24"/>
           <w:szCs w:val="24"/>
         </w:rPr>
-        <w:t xml:space="preserve">": </w:t>
+        <w:t>":</w:t>
+      </w:r>
+      <w:proofErr w:type="gramEnd"/>
+      <w:r>
+        <w:rPr>
+          <w:rStyle w:val="CodeHTML"/>
+          <w:rFonts w:ascii="Times New Roman" w:eastAsiaTheme="minorHAnsi" w:hAnsi="Times New Roman" w:cs="Times New Roman"/>
+          <w:sz w:val="24"/>
+          <w:szCs w:val="24"/>
+        </w:rPr>
+        <w:t xml:space="preserve"> </w:t>
       </w:r>
       <w:proofErr w:type="spellStart"/>
       <w:r>
@@ -3980,6 +4208,7 @@
         <w:t>verdict_global</w:t>
       </w:r>
       <w:proofErr w:type="spellEnd"/>
+      <w:proofErr w:type="gramStart"/>
       <w:r>
         <w:rPr>
           <w:rStyle w:val="CodeHTML"/>
@@ -3987,7 +4216,17 @@
           <w:sz w:val="24"/>
           <w:szCs w:val="24"/>
         </w:rPr>
-        <w:t>": "..."</w:t>
+        <w:t>":</w:t>
+      </w:r>
+      <w:proofErr w:type="gramEnd"/>
+      <w:r>
+        <w:rPr>
+          <w:rStyle w:val="CodeHTML"/>
+          <w:rFonts w:ascii="Times New Roman" w:eastAsiaTheme="minorHAnsi" w:hAnsi="Times New Roman" w:cs="Times New Roman"/>
+          <w:sz w:val="24"/>
+          <w:szCs w:val="24"/>
+        </w:rPr>
+        <w:t xml:space="preserve"> "..."</w:t>
       </w:r>
     </w:p>
     <w:p>
@@ -4658,7 +4897,25 @@
           <w:sz w:val="24"/>
           <w:szCs w:val="24"/>
         </w:rPr>
-        <w:t xml:space="preserve">  "sentiment": "</w:t>
+        <w:t xml:space="preserve">  "sentiment</w:t>
+      </w:r>
+      <w:proofErr w:type="gramStart"/>
+      <w:r>
+        <w:rPr>
+          <w:rFonts w:ascii="Times New Roman" w:hAnsi="Times New Roman" w:cs="Times New Roman"/>
+          <w:sz w:val="24"/>
+          <w:szCs w:val="24"/>
+        </w:rPr>
+        <w:t>":</w:t>
+      </w:r>
+      <w:proofErr w:type="gramEnd"/>
+      <w:r>
+        <w:rPr>
+          <w:rFonts w:ascii="Times New Roman" w:hAnsi="Times New Roman" w:cs="Times New Roman"/>
+          <w:sz w:val="24"/>
+          <w:szCs w:val="24"/>
+        </w:rPr>
+        <w:t xml:space="preserve"> "</w:t>
       </w:r>
       <w:proofErr w:type="spellStart"/>
       <w:r>
@@ -4706,13 +4963,23 @@
         <w:t>categorie</w:t>
       </w:r>
       <w:proofErr w:type="spellEnd"/>
-      <w:r>
-        <w:rPr>
-          <w:rFonts w:ascii="Times New Roman" w:hAnsi="Times New Roman" w:cs="Times New Roman"/>
-          <w:sz w:val="24"/>
-          <w:szCs w:val="24"/>
-        </w:rPr>
-        <w:t>": "livraison",</w:t>
+      <w:proofErr w:type="gramStart"/>
+      <w:r>
+        <w:rPr>
+          <w:rFonts w:ascii="Times New Roman" w:hAnsi="Times New Roman" w:cs="Times New Roman"/>
+          <w:sz w:val="24"/>
+          <w:szCs w:val="24"/>
+        </w:rPr>
+        <w:t>":</w:t>
+      </w:r>
+      <w:proofErr w:type="gramEnd"/>
+      <w:r>
+        <w:rPr>
+          <w:rFonts w:ascii="Times New Roman" w:hAnsi="Times New Roman" w:cs="Times New Roman"/>
+          <w:sz w:val="24"/>
+          <w:szCs w:val="24"/>
+        </w:rPr>
+        <w:t xml:space="preserve"> "livraison",</w:t>
       </w:r>
     </w:p>
     <w:p>
@@ -4730,7 +4997,25 @@
           <w:sz w:val="24"/>
           <w:szCs w:val="24"/>
         </w:rPr>
-        <w:t xml:space="preserve">  "urgence": "moyenne",</w:t>
+        <w:t xml:space="preserve">  "urgence</w:t>
+      </w:r>
+      <w:proofErr w:type="gramStart"/>
+      <w:r>
+        <w:rPr>
+          <w:rFonts w:ascii="Times New Roman" w:hAnsi="Times New Roman" w:cs="Times New Roman"/>
+          <w:sz w:val="24"/>
+          <w:szCs w:val="24"/>
+        </w:rPr>
+        <w:t>":</w:t>
+      </w:r>
+      <w:proofErr w:type="gramEnd"/>
+      <w:r>
+        <w:rPr>
+          <w:rFonts w:ascii="Times New Roman" w:hAnsi="Times New Roman" w:cs="Times New Roman"/>
+          <w:sz w:val="24"/>
+          <w:szCs w:val="24"/>
+        </w:rPr>
+        <w:t xml:space="preserve"> "moyenne",</w:t>
       </w:r>
     </w:p>
     <w:p>
@@ -4760,13 +5045,23 @@
         <w:t>probleme</w:t>
       </w:r>
       <w:proofErr w:type="spellEnd"/>
-      <w:r>
-        <w:rPr>
-          <w:rFonts w:ascii="Times New Roman" w:hAnsi="Times New Roman" w:cs="Times New Roman"/>
-          <w:sz w:val="24"/>
-          <w:szCs w:val="24"/>
-        </w:rPr>
-        <w:t>": "Retard de livraison",</w:t>
+      <w:proofErr w:type="gramStart"/>
+      <w:r>
+        <w:rPr>
+          <w:rFonts w:ascii="Times New Roman" w:hAnsi="Times New Roman" w:cs="Times New Roman"/>
+          <w:sz w:val="24"/>
+          <w:szCs w:val="24"/>
+        </w:rPr>
+        <w:t>":</w:t>
+      </w:r>
+      <w:proofErr w:type="gramEnd"/>
+      <w:r>
+        <w:rPr>
+          <w:rFonts w:ascii="Times New Roman" w:hAnsi="Times New Roman" w:cs="Times New Roman"/>
+          <w:sz w:val="24"/>
+          <w:szCs w:val="24"/>
+        </w:rPr>
+        <w:t xml:space="preserve"> "Retard de livraison",</w:t>
       </w:r>
     </w:p>
     <w:p>
@@ -4784,7 +5079,25 @@
           <w:sz w:val="24"/>
           <w:szCs w:val="24"/>
         </w:rPr>
-        <w:t xml:space="preserve">  "confiance": 0.91</w:t>
+        <w:t xml:space="preserve">  "confiance</w:t>
+      </w:r>
+      <w:proofErr w:type="gramStart"/>
+      <w:r>
+        <w:rPr>
+          <w:rFonts w:ascii="Times New Roman" w:hAnsi="Times New Roman" w:cs="Times New Roman"/>
+          <w:sz w:val="24"/>
+          <w:szCs w:val="24"/>
+        </w:rPr>
+        <w:t>":</w:t>
+      </w:r>
+      <w:proofErr w:type="gramEnd"/>
+      <w:r>
+        <w:rPr>
+          <w:rFonts w:ascii="Times New Roman" w:hAnsi="Times New Roman" w:cs="Times New Roman"/>
+          <w:sz w:val="24"/>
+          <w:szCs w:val="24"/>
+        </w:rPr>
+        <w:t xml:space="preserve"> 0.91</w:t>
       </w:r>
     </w:p>
     <w:p>
@@ -5201,8 +5514,18 @@
           <w:sz w:val="24"/>
           <w:szCs w:val="24"/>
         </w:rPr>
-        <w:t>Si une valeur ne peut pas être déterminée avec certitude, choisis la valeur la</w:t>
-      </w:r>
+        <w:t xml:space="preserve">Si une valeur ne peut pas être déterminée avec certitude, choisis la valeur </w:t>
+      </w:r>
+      <w:proofErr w:type="gramStart"/>
+      <w:r>
+        <w:rPr>
+          <w:rFonts w:ascii="Times New Roman" w:hAnsi="Times New Roman" w:cs="Times New Roman"/>
+          <w:sz w:val="24"/>
+          <w:szCs w:val="24"/>
+        </w:rPr>
+        <w:t>la</w:t>
+      </w:r>
+      <w:proofErr w:type="gramEnd"/>
     </w:p>
     <w:p>
       <w:pPr>
@@ -6844,34 +7167,65 @@
         <w:t>categorie</w:t>
       </w:r>
       <w:proofErr w:type="spellEnd"/>
-      <w:r>
-        <w:rPr>
-          <w:rStyle w:val="CodeHTML"/>
-          <w:rFonts w:ascii="Times New Roman" w:hAnsi="Times New Roman" w:cs="Times New Roman"/>
-          <w:sz w:val="24"/>
-          <w:szCs w:val="24"/>
-        </w:rPr>
-        <w:t>": "réseau | logiciel | matériel | sécurité | accès | autre",</w:t>
-      </w:r>
-    </w:p>
-    <w:p>
-      <w:pPr>
-        <w:pStyle w:val="PrformatHTML"/>
-        <w:rPr>
-          <w:rStyle w:val="CodeHTML"/>
-          <w:rFonts w:ascii="Times New Roman" w:hAnsi="Times New Roman" w:cs="Times New Roman"/>
-          <w:sz w:val="24"/>
-          <w:szCs w:val="24"/>
-        </w:rPr>
-      </w:pPr>
-      <w:r>
-        <w:rPr>
-          <w:rStyle w:val="CodeHTML"/>
-          <w:rFonts w:ascii="Times New Roman" w:hAnsi="Times New Roman" w:cs="Times New Roman"/>
-          <w:sz w:val="24"/>
-          <w:szCs w:val="24"/>
-        </w:rPr>
-        <w:t xml:space="preserve">  "justification": "..."</w:t>
+      <w:proofErr w:type="gramStart"/>
+      <w:r>
+        <w:rPr>
+          <w:rStyle w:val="CodeHTML"/>
+          <w:rFonts w:ascii="Times New Roman" w:hAnsi="Times New Roman" w:cs="Times New Roman"/>
+          <w:sz w:val="24"/>
+          <w:szCs w:val="24"/>
+        </w:rPr>
+        <w:t>":</w:t>
+      </w:r>
+      <w:proofErr w:type="gramEnd"/>
+      <w:r>
+        <w:rPr>
+          <w:rStyle w:val="CodeHTML"/>
+          <w:rFonts w:ascii="Times New Roman" w:hAnsi="Times New Roman" w:cs="Times New Roman"/>
+          <w:sz w:val="24"/>
+          <w:szCs w:val="24"/>
+        </w:rPr>
+        <w:t xml:space="preserve"> "réseau | logiciel | matériel | sécurité | accès | autre",</w:t>
+      </w:r>
+    </w:p>
+    <w:p>
+      <w:pPr>
+        <w:pStyle w:val="PrformatHTML"/>
+        <w:rPr>
+          <w:rStyle w:val="CodeHTML"/>
+          <w:rFonts w:ascii="Times New Roman" w:hAnsi="Times New Roman" w:cs="Times New Roman"/>
+          <w:sz w:val="24"/>
+          <w:szCs w:val="24"/>
+        </w:rPr>
+      </w:pPr>
+      <w:r>
+        <w:rPr>
+          <w:rStyle w:val="CodeHTML"/>
+          <w:rFonts w:ascii="Times New Roman" w:hAnsi="Times New Roman" w:cs="Times New Roman"/>
+          <w:sz w:val="24"/>
+          <w:szCs w:val="24"/>
+        </w:rPr>
+        <w:t xml:space="preserve">  "justification</w:t>
+      </w:r>
+      <w:proofErr w:type="gramStart"/>
+      <w:r>
+        <w:rPr>
+          <w:rStyle w:val="CodeHTML"/>
+          <w:rFonts w:ascii="Times New Roman" w:hAnsi="Times New Roman" w:cs="Times New Roman"/>
+          <w:sz w:val="24"/>
+          <w:szCs w:val="24"/>
+        </w:rPr>
+        <w:t>":</w:t>
+      </w:r>
+      <w:proofErr w:type="gramEnd"/>
+      <w:r>
+        <w:rPr>
+          <w:rStyle w:val="CodeHTML"/>
+          <w:rFonts w:ascii="Times New Roman" w:hAnsi="Times New Roman" w:cs="Times New Roman"/>
+          <w:sz w:val="24"/>
+          <w:szCs w:val="24"/>
+        </w:rPr>
+        <w:t xml:space="preserve"> "..."</w:t>
       </w:r>
     </w:p>
     <w:p>
@@ -7423,14 +7777,25 @@
         <w:t>numero_facture</w:t>
       </w:r>
       <w:proofErr w:type="spellEnd"/>
-      <w:r>
-        <w:rPr>
-          <w:rStyle w:val="CodeHTML"/>
-          <w:rFonts w:ascii="Times New Roman" w:hAnsi="Times New Roman" w:cs="Times New Roman"/>
-          <w:sz w:val="24"/>
-          <w:szCs w:val="24"/>
-        </w:rPr>
-        <w:t xml:space="preserve">": ... ou </w:t>
+      <w:proofErr w:type="gramStart"/>
+      <w:r>
+        <w:rPr>
+          <w:rStyle w:val="CodeHTML"/>
+          <w:rFonts w:ascii="Times New Roman" w:hAnsi="Times New Roman" w:cs="Times New Roman"/>
+          <w:sz w:val="24"/>
+          <w:szCs w:val="24"/>
+        </w:rPr>
+        <w:t>":</w:t>
+      </w:r>
+      <w:proofErr w:type="gramEnd"/>
+      <w:r>
+        <w:rPr>
+          <w:rStyle w:val="CodeHTML"/>
+          <w:rFonts w:ascii="Times New Roman" w:hAnsi="Times New Roman" w:cs="Times New Roman"/>
+          <w:sz w:val="24"/>
+          <w:szCs w:val="24"/>
+        </w:rPr>
+        <w:t xml:space="preserve"> ... ou </w:t>
       </w:r>
       <w:proofErr w:type="spellStart"/>
       <w:r>
@@ -7470,7 +7835,27 @@
           <w:sz w:val="24"/>
           <w:szCs w:val="24"/>
         </w:rPr>
-        <w:t xml:space="preserve">  "date": ... ou </w:t>
+        <w:t xml:space="preserve">  "date</w:t>
+      </w:r>
+      <w:proofErr w:type="gramStart"/>
+      <w:r>
+        <w:rPr>
+          <w:rStyle w:val="CodeHTML"/>
+          <w:rFonts w:ascii="Times New Roman" w:hAnsi="Times New Roman" w:cs="Times New Roman"/>
+          <w:sz w:val="24"/>
+          <w:szCs w:val="24"/>
+        </w:rPr>
+        <w:t>":</w:t>
+      </w:r>
+      <w:proofErr w:type="gramEnd"/>
+      <w:r>
+        <w:rPr>
+          <w:rStyle w:val="CodeHTML"/>
+          <w:rFonts w:ascii="Times New Roman" w:hAnsi="Times New Roman" w:cs="Times New Roman"/>
+          <w:sz w:val="24"/>
+          <w:szCs w:val="24"/>
+        </w:rPr>
+        <w:t xml:space="preserve"> ... ou </w:t>
       </w:r>
       <w:proofErr w:type="spellStart"/>
       <w:r>
@@ -7510,7 +7895,27 @@
           <w:sz w:val="24"/>
           <w:szCs w:val="24"/>
         </w:rPr>
-        <w:t xml:space="preserve">  "client": ... ou </w:t>
+        <w:t xml:space="preserve">  "client</w:t>
+      </w:r>
+      <w:proofErr w:type="gramStart"/>
+      <w:r>
+        <w:rPr>
+          <w:rStyle w:val="CodeHTML"/>
+          <w:rFonts w:ascii="Times New Roman" w:hAnsi="Times New Roman" w:cs="Times New Roman"/>
+          <w:sz w:val="24"/>
+          <w:szCs w:val="24"/>
+        </w:rPr>
+        <w:t>":</w:t>
+      </w:r>
+      <w:proofErr w:type="gramEnd"/>
+      <w:r>
+        <w:rPr>
+          <w:rStyle w:val="CodeHTML"/>
+          <w:rFonts w:ascii="Times New Roman" w:hAnsi="Times New Roman" w:cs="Times New Roman"/>
+          <w:sz w:val="24"/>
+          <w:szCs w:val="24"/>
+        </w:rPr>
+        <w:t xml:space="preserve"> ... ou </w:t>
       </w:r>
       <w:proofErr w:type="spellStart"/>
       <w:r>
@@ -7563,14 +7968,25 @@
         <w:t>montant_ht</w:t>
       </w:r>
       <w:proofErr w:type="spellEnd"/>
-      <w:r>
-        <w:rPr>
-          <w:rStyle w:val="CodeHTML"/>
-          <w:rFonts w:ascii="Times New Roman" w:hAnsi="Times New Roman" w:cs="Times New Roman"/>
-          <w:sz w:val="24"/>
-          <w:szCs w:val="24"/>
-        </w:rPr>
-        <w:t xml:space="preserve">": ... ou </w:t>
+      <w:proofErr w:type="gramStart"/>
+      <w:r>
+        <w:rPr>
+          <w:rStyle w:val="CodeHTML"/>
+          <w:rFonts w:ascii="Times New Roman" w:hAnsi="Times New Roman" w:cs="Times New Roman"/>
+          <w:sz w:val="24"/>
+          <w:szCs w:val="24"/>
+        </w:rPr>
+        <w:t>":</w:t>
+      </w:r>
+      <w:proofErr w:type="gramEnd"/>
+      <w:r>
+        <w:rPr>
+          <w:rStyle w:val="CodeHTML"/>
+          <w:rFonts w:ascii="Times New Roman" w:hAnsi="Times New Roman" w:cs="Times New Roman"/>
+          <w:sz w:val="24"/>
+          <w:szCs w:val="24"/>
+        </w:rPr>
+        <w:t xml:space="preserve"> ... ou </w:t>
       </w:r>
       <w:proofErr w:type="spellStart"/>
       <w:r>
@@ -7611,7 +8027,27 @@
           <w:szCs w:val="24"/>
         </w:rPr>
         <w:lastRenderedPageBreak/>
-        <w:t xml:space="preserve">  "tva": ... ou </w:t>
+        <w:t xml:space="preserve">  "tva</w:t>
+      </w:r>
+      <w:proofErr w:type="gramStart"/>
+      <w:r>
+        <w:rPr>
+          <w:rStyle w:val="CodeHTML"/>
+          <w:rFonts w:ascii="Times New Roman" w:hAnsi="Times New Roman" w:cs="Times New Roman"/>
+          <w:sz w:val="24"/>
+          <w:szCs w:val="24"/>
+        </w:rPr>
+        <w:t>":</w:t>
+      </w:r>
+      <w:proofErr w:type="gramEnd"/>
+      <w:r>
+        <w:rPr>
+          <w:rStyle w:val="CodeHTML"/>
+          <w:rFonts w:ascii="Times New Roman" w:hAnsi="Times New Roman" w:cs="Times New Roman"/>
+          <w:sz w:val="24"/>
+          <w:szCs w:val="24"/>
+        </w:rPr>
+        <w:t xml:space="preserve"> ... ou </w:t>
       </w:r>
       <w:proofErr w:type="spellStart"/>
       <w:r>
@@ -7664,14 +8100,25 @@
         <w:t>montant_ttc</w:t>
       </w:r>
       <w:proofErr w:type="spellEnd"/>
-      <w:r>
-        <w:rPr>
-          <w:rStyle w:val="CodeHTML"/>
-          <w:rFonts w:ascii="Times New Roman" w:hAnsi="Times New Roman" w:cs="Times New Roman"/>
-          <w:sz w:val="24"/>
-          <w:szCs w:val="24"/>
-        </w:rPr>
-        <w:t xml:space="preserve">": ... ou </w:t>
+      <w:proofErr w:type="gramStart"/>
+      <w:r>
+        <w:rPr>
+          <w:rStyle w:val="CodeHTML"/>
+          <w:rFonts w:ascii="Times New Roman" w:hAnsi="Times New Roman" w:cs="Times New Roman"/>
+          <w:sz w:val="24"/>
+          <w:szCs w:val="24"/>
+        </w:rPr>
+        <w:t>":</w:t>
+      </w:r>
+      <w:proofErr w:type="gramEnd"/>
+      <w:r>
+        <w:rPr>
+          <w:rStyle w:val="CodeHTML"/>
+          <w:rFonts w:ascii="Times New Roman" w:hAnsi="Times New Roman" w:cs="Times New Roman"/>
+          <w:sz w:val="24"/>
+          <w:szCs w:val="24"/>
+        </w:rPr>
+        <w:t xml:space="preserve"> ... ou </w:t>
       </w:r>
       <w:proofErr w:type="spellStart"/>
       <w:r>
@@ -7777,6 +8224,7 @@
           <w:lang w:val="en-US"/>
         </w:rPr>
       </w:pPr>
+      <w:proofErr w:type="gramStart"/>
       <w:r>
         <w:rPr>
           <w:rFonts w:ascii="Times New Roman" w:hAnsi="Times New Roman" w:cs="Times New Roman"/>
@@ -7784,27 +8232,48 @@
           <w:szCs w:val="24"/>
           <w:lang w:val="en-US"/>
         </w:rPr>
-        <w:t xml:space="preserve">Date : 10/09/2026 </w:t>
-      </w:r>
-    </w:p>
-    <w:p>
-      <w:pPr>
-        <w:pStyle w:val="PrformatHTML"/>
+        <w:t>Date :</w:t>
+      </w:r>
+      <w:proofErr w:type="gramEnd"/>
+      <w:r>
         <w:rPr>
           <w:rFonts w:ascii="Times New Roman" w:hAnsi="Times New Roman" w:cs="Times New Roman"/>
           <w:sz w:val="24"/>
           <w:szCs w:val="24"/>
           <w:lang w:val="en-US"/>
         </w:rPr>
-      </w:pPr>
-      <w:r>
+        <w:t xml:space="preserve"> 10/09/2026 </w:t>
+      </w:r>
+    </w:p>
+    <w:p>
+      <w:pPr>
+        <w:pStyle w:val="PrformatHTML"/>
         <w:rPr>
           <w:rFonts w:ascii="Times New Roman" w:hAnsi="Times New Roman" w:cs="Times New Roman"/>
           <w:sz w:val="24"/>
           <w:szCs w:val="24"/>
           <w:lang w:val="en-US"/>
         </w:rPr>
-        <w:t xml:space="preserve">Client : </w:t>
+      </w:pPr>
+      <w:proofErr w:type="gramStart"/>
+      <w:r>
+        <w:rPr>
+          <w:rFonts w:ascii="Times New Roman" w:hAnsi="Times New Roman" w:cs="Times New Roman"/>
+          <w:sz w:val="24"/>
+          <w:szCs w:val="24"/>
+          <w:lang w:val="en-US"/>
+        </w:rPr>
+        <w:t>Client :</w:t>
+      </w:r>
+      <w:proofErr w:type="gramEnd"/>
+      <w:r>
+        <w:rPr>
+          <w:rFonts w:ascii="Times New Roman" w:hAnsi="Times New Roman" w:cs="Times New Roman"/>
+          <w:sz w:val="24"/>
+          <w:szCs w:val="24"/>
+          <w:lang w:val="en-US"/>
+        </w:rPr>
+        <w:t xml:space="preserve"> </w:t>
       </w:r>
       <w:proofErr w:type="spellStart"/>
       <w:r>
@@ -7855,7 +8324,27 @@
           <w:szCs w:val="24"/>
           <w:lang w:val="en-US"/>
         </w:rPr>
-        <w:t xml:space="preserve"> HT : 100 000 FCFA </w:t>
+        <w:t xml:space="preserve"> </w:t>
+      </w:r>
+      <w:proofErr w:type="gramStart"/>
+      <w:r>
+        <w:rPr>
+          <w:rFonts w:ascii="Times New Roman" w:hAnsi="Times New Roman" w:cs="Times New Roman"/>
+          <w:sz w:val="24"/>
+          <w:szCs w:val="24"/>
+          <w:lang w:val="en-US"/>
+        </w:rPr>
+        <w:t>HT :</w:t>
+      </w:r>
+      <w:proofErr w:type="gramEnd"/>
+      <w:r>
+        <w:rPr>
+          <w:rFonts w:ascii="Times New Roman" w:hAnsi="Times New Roman" w:cs="Times New Roman"/>
+          <w:sz w:val="24"/>
+          <w:szCs w:val="24"/>
+          <w:lang w:val="en-US"/>
+        </w:rPr>
+        <w:t xml:space="preserve"> 100 000 FCFA </w:t>
       </w:r>
     </w:p>
     <w:p>
@@ -8562,7 +9051,27 @@
           <w:szCs w:val="36"/>
           <w:lang w:val="en-US"/>
         </w:rPr>
-        <w:t xml:space="preserve"> 6 : Prompt Engineering pour le Machine Learning</w:t>
+        <w:t xml:space="preserve"> </w:t>
+      </w:r>
+      <w:proofErr w:type="gramStart"/>
+      <w:r>
+        <w:rPr>
+          <w:rFonts w:ascii="Times New Roman" w:hAnsi="Times New Roman" w:cs="Times New Roman"/>
+          <w:sz w:val="36"/>
+          <w:szCs w:val="36"/>
+          <w:lang w:val="en-US"/>
+        </w:rPr>
+        <w:t>6 :</w:t>
+      </w:r>
+      <w:proofErr w:type="gramEnd"/>
+      <w:r>
+        <w:rPr>
+          <w:rFonts w:ascii="Times New Roman" w:hAnsi="Times New Roman" w:cs="Times New Roman"/>
+          <w:sz w:val="36"/>
+          <w:szCs w:val="36"/>
+          <w:lang w:val="en-US"/>
+        </w:rPr>
+        <w:t xml:space="preserve"> Prompt Engineering pour le Machine Learning</w:t>
       </w:r>
     </w:p>
     <w:p>
@@ -8698,6 +9207,7 @@
         <w:t>&lt;class '</w:t>
       </w:r>
       <w:proofErr w:type="spellStart"/>
+      <w:proofErr w:type="gramStart"/>
       <w:r>
         <w:rPr>
           <w:rFonts w:ascii="Consolas" w:eastAsia="Times New Roman" w:hAnsi="Consolas" w:cs="Times New Roman"/>
@@ -8708,6 +9218,7 @@
         <w:t>pandas.DataFrame</w:t>
       </w:r>
       <w:proofErr w:type="spellEnd"/>
+      <w:proofErr w:type="gramEnd"/>
       <w:r>
         <w:rPr>
           <w:rFonts w:ascii="Consolas" w:eastAsia="Times New Roman" w:hAnsi="Consolas" w:cs="Times New Roman"/>
@@ -8786,7 +9297,17 @@
           <w:szCs w:val="24"/>
           <w:lang w:val="en-US" w:eastAsia="fr-FR"/>
         </w:rPr>
-        <w:t xml:space="preserve"> #   Column        Non-Null Count  </w:t>
+        <w:t xml:space="preserve"> #   Column        Non-Null </w:t>
+      </w:r>
+      <w:proofErr w:type="gramStart"/>
+      <w:r>
+        <w:rPr>
+          <w:rFonts w:ascii="Consolas" w:eastAsia="Times New Roman" w:hAnsi="Consolas" w:cs="Times New Roman"/>
+          <w:sz w:val="24"/>
+          <w:szCs w:val="24"/>
+          <w:lang w:val="en-US" w:eastAsia="fr-FR"/>
+        </w:rPr>
+        <w:t xml:space="preserve">Count  </w:t>
       </w:r>
       <w:proofErr w:type="spellStart"/>
       <w:r>
@@ -8799,6 +9320,7 @@
         <w:t>Dtype</w:t>
       </w:r>
       <w:proofErr w:type="spellEnd"/>
+      <w:proofErr w:type="gramEnd"/>
       <w:r>
         <w:rPr>
           <w:rFonts w:ascii="Consolas" w:eastAsia="Times New Roman" w:hAnsi="Consolas" w:cs="Times New Roman"/>
@@ -9295,7 +9817,27 @@
           <w:szCs w:val="24"/>
           <w:lang w:eastAsia="fr-FR"/>
         </w:rPr>
-        <w:t xml:space="preserve"> 6   pression      591 non-</w:t>
+        <w:t xml:space="preserve"> 6   </w:t>
+      </w:r>
+      <w:proofErr w:type="gramStart"/>
+      <w:r>
+        <w:rPr>
+          <w:rFonts w:ascii="Consolas" w:eastAsia="Times New Roman" w:hAnsi="Consolas" w:cs="Times New Roman"/>
+          <w:sz w:val="24"/>
+          <w:szCs w:val="24"/>
+          <w:lang w:eastAsia="fr-FR"/>
+        </w:rPr>
+        <w:t>pression</w:t>
+      </w:r>
+      <w:proofErr w:type="gramEnd"/>
+      <w:r>
+        <w:rPr>
+          <w:rFonts w:ascii="Consolas" w:eastAsia="Times New Roman" w:hAnsi="Consolas" w:cs="Times New Roman"/>
+          <w:sz w:val="24"/>
+          <w:szCs w:val="24"/>
+          <w:lang w:eastAsia="fr-FR"/>
+        </w:rPr>
+        <w:t xml:space="preserve">      591 non-</w:t>
       </w:r>
       <w:proofErr w:type="spellStart"/>
       <w:r>
@@ -9335,7 +9877,27 @@
           <w:szCs w:val="24"/>
           <w:lang w:eastAsia="fr-FR"/>
         </w:rPr>
-        <w:t xml:space="preserve"> 7   consommation  591 non-</w:t>
+        <w:t xml:space="preserve"> 7   </w:t>
+      </w:r>
+      <w:proofErr w:type="gramStart"/>
+      <w:r>
+        <w:rPr>
+          <w:rFonts w:ascii="Consolas" w:eastAsia="Times New Roman" w:hAnsi="Consolas" w:cs="Times New Roman"/>
+          <w:sz w:val="24"/>
+          <w:szCs w:val="24"/>
+          <w:lang w:eastAsia="fr-FR"/>
+        </w:rPr>
+        <w:t>consommation  591</w:t>
+      </w:r>
+      <w:proofErr w:type="gramEnd"/>
+      <w:r>
+        <w:rPr>
+          <w:rFonts w:ascii="Consolas" w:eastAsia="Times New Roman" w:hAnsi="Consolas" w:cs="Times New Roman"/>
+          <w:sz w:val="24"/>
+          <w:szCs w:val="24"/>
+          <w:lang w:eastAsia="fr-FR"/>
+        </w:rPr>
+        <w:t xml:space="preserve"> non-</w:t>
       </w:r>
       <w:proofErr w:type="spellStart"/>
       <w:r>
@@ -9466,7 +10028,27 @@
           <w:szCs w:val="24"/>
           <w:lang w:val="en-US" w:eastAsia="fr-FR"/>
         </w:rPr>
-        <w:t>: float64(4), str(5)</w:t>
+        <w:t xml:space="preserve">: float64(4), </w:t>
+      </w:r>
+      <w:proofErr w:type="gramStart"/>
+      <w:r>
+        <w:rPr>
+          <w:rFonts w:ascii="Consolas" w:eastAsia="Times New Roman" w:hAnsi="Consolas" w:cs="Times New Roman"/>
+          <w:sz w:val="24"/>
+          <w:szCs w:val="24"/>
+          <w:lang w:val="en-US" w:eastAsia="fr-FR"/>
+        </w:rPr>
+        <w:t>str(</w:t>
+      </w:r>
+      <w:proofErr w:type="gramEnd"/>
+      <w:r>
+        <w:rPr>
+          <w:rFonts w:ascii="Consolas" w:eastAsia="Times New Roman" w:hAnsi="Consolas" w:cs="Times New Roman"/>
+          <w:sz w:val="24"/>
+          <w:szCs w:val="24"/>
+          <w:lang w:val="en-US" w:eastAsia="fr-FR"/>
+        </w:rPr>
+        <w:t>5)</w:t>
       </w:r>
     </w:p>
     <w:p>
@@ -14158,7 +14740,21 @@
         <w:rPr>
           <w:rStyle w:val="Accentuation"/>
         </w:rPr>
-        <w:t xml:space="preserve"> comparer de deux version de </w:t>
+        <w:t xml:space="preserve"> comparer de </w:t>
+      </w:r>
+      <w:proofErr w:type="gramStart"/>
+      <w:r>
+        <w:rPr>
+          <w:rStyle w:val="Accentuation"/>
+        </w:rPr>
+        <w:t>deux version</w:t>
+      </w:r>
+      <w:proofErr w:type="gramEnd"/>
+      <w:r>
+        <w:rPr>
+          <w:rStyle w:val="Accentuation"/>
+        </w:rPr>
+        <w:t xml:space="preserve"> de </w:t>
       </w:r>
       <w:proofErr w:type="spellStart"/>
       <w:r>
@@ -16072,6 +16668,7 @@
           <w:szCs w:val="24"/>
         </w:rPr>
       </w:pPr>
+      <w:proofErr w:type="gramStart"/>
       <w:r>
         <w:rPr>
           <w:rFonts w:ascii="TimesNewRomanPSMT" w:hAnsi="TimesNewRomanPSMT" w:cs="TimesNewRomanPSMT"/>
@@ -16079,7 +16676,17 @@
           <w:sz w:val="24"/>
           <w:szCs w:val="24"/>
         </w:rPr>
-        <w:t>des informations contenues dans les images et plus spécifiquement pour réaliser la tâche</w:t>
+        <w:t>des</w:t>
+      </w:r>
+      <w:proofErr w:type="gramEnd"/>
+      <w:r>
+        <w:rPr>
+          <w:rFonts w:ascii="TimesNewRomanPSMT" w:hAnsi="TimesNewRomanPSMT" w:cs="TimesNewRomanPSMT"/>
+          <w:color w:val="000000"/>
+          <w:sz w:val="24"/>
+          <w:szCs w:val="24"/>
+        </w:rPr>
+        <w:t xml:space="preserve"> informations contenues dans les images et plus spécifiquement pour réaliser la tâche</w:t>
       </w:r>
     </w:p>
     <w:p>
@@ -16095,6 +16702,7 @@
           <w:szCs w:val="24"/>
         </w:rPr>
       </w:pPr>
+      <w:proofErr w:type="gramStart"/>
       <w:r>
         <w:rPr>
           <w:rFonts w:ascii="TimesNewRomanPSMT" w:hAnsi="TimesNewRomanPSMT" w:cs="TimesNewRomanPSMT"/>
@@ -16102,7 +16710,17 @@
           <w:sz w:val="24"/>
           <w:szCs w:val="24"/>
         </w:rPr>
-        <w:t>de détection de visage. Dans ce contexte il est essentiel de disposer d'algorithmes à la fois</w:t>
+        <w:t>de</w:t>
+      </w:r>
+      <w:proofErr w:type="gramEnd"/>
+      <w:r>
+        <w:rPr>
+          <w:rFonts w:ascii="TimesNewRomanPSMT" w:hAnsi="TimesNewRomanPSMT" w:cs="TimesNewRomanPSMT"/>
+          <w:color w:val="000000"/>
+          <w:sz w:val="24"/>
+          <w:szCs w:val="24"/>
+        </w:rPr>
+        <w:t xml:space="preserve"> détection de visage. Dans ce contexte il est essentiel de disposer d'algorithmes à la fois</w:t>
       </w:r>
     </w:p>
     <w:p>
@@ -16118,6 +16736,7 @@
           <w:szCs w:val="24"/>
         </w:rPr>
       </w:pPr>
+      <w:proofErr w:type="gramStart"/>
       <w:r>
         <w:rPr>
           <w:rFonts w:ascii="TimesNewRomanPSMT" w:hAnsi="TimesNewRomanPSMT" w:cs="TimesNewRomanPSMT"/>
@@ -16125,7 +16744,17 @@
           <w:sz w:val="24"/>
           <w:szCs w:val="24"/>
         </w:rPr>
-        <w:t>efficaces et robustes. En effet, la capacité à détecter avec précision les visages est cruciale</w:t>
+        <w:t>efficaces</w:t>
+      </w:r>
+      <w:proofErr w:type="gramEnd"/>
+      <w:r>
+        <w:rPr>
+          <w:rFonts w:ascii="TimesNewRomanPSMT" w:hAnsi="TimesNewRomanPSMT" w:cs="TimesNewRomanPSMT"/>
+          <w:color w:val="000000"/>
+          <w:sz w:val="24"/>
+          <w:szCs w:val="24"/>
+        </w:rPr>
+        <w:t xml:space="preserve"> et robustes. En effet, la capacité à détecter avec précision les visages est cruciale</w:t>
       </w:r>
     </w:p>
     <w:p>
@@ -16141,6 +16770,7 @@
           <w:szCs w:val="24"/>
         </w:rPr>
       </w:pPr>
+      <w:proofErr w:type="gramStart"/>
       <w:r>
         <w:rPr>
           <w:rFonts w:ascii="TimesNewRomanPSMT" w:hAnsi="TimesNewRomanPSMT" w:cs="TimesNewRomanPSMT"/>
@@ -16148,7 +16778,17 @@
           <w:sz w:val="24"/>
           <w:szCs w:val="24"/>
         </w:rPr>
-        <w:t>dans diverses applications. En réalité, l'importance de la détection des visages ne peut être</w:t>
+        <w:t>dans</w:t>
+      </w:r>
+      <w:proofErr w:type="gramEnd"/>
+      <w:r>
+        <w:rPr>
+          <w:rFonts w:ascii="TimesNewRomanPSMT" w:hAnsi="TimesNewRomanPSMT" w:cs="TimesNewRomanPSMT"/>
+          <w:color w:val="000000"/>
+          <w:sz w:val="24"/>
+          <w:szCs w:val="24"/>
+        </w:rPr>
+        <w:t xml:space="preserve"> diverses applications. En réalité, l'importance de la détection des visages ne peut être</w:t>
       </w:r>
     </w:p>
     <w:p>
@@ -16164,6 +16804,7 @@
           <w:szCs w:val="24"/>
         </w:rPr>
       </w:pPr>
+      <w:proofErr w:type="gramStart"/>
       <w:r>
         <w:rPr>
           <w:rFonts w:ascii="TimesNewRomanPSMT" w:hAnsi="TimesNewRomanPSMT" w:cs="TimesNewRomanPSMT"/>
@@ -16171,7 +16812,17 @@
           <w:sz w:val="24"/>
           <w:szCs w:val="24"/>
         </w:rPr>
-        <w:t>surestimée lorsqu'il s'agit de tout système impliquant l'analyse des visages. L'objectif est</w:t>
+        <w:t>surestimée</w:t>
+      </w:r>
+      <w:proofErr w:type="gramEnd"/>
+      <w:r>
+        <w:rPr>
+          <w:rFonts w:ascii="TimesNewRomanPSMT" w:hAnsi="TimesNewRomanPSMT" w:cs="TimesNewRomanPSMT"/>
+          <w:color w:val="000000"/>
+          <w:sz w:val="24"/>
+          <w:szCs w:val="24"/>
+        </w:rPr>
+        <w:t xml:space="preserve"> lorsqu'il s'agit de tout système impliquant l'analyse des visages. L'objectif est</w:t>
       </w:r>
     </w:p>
     <w:p>
@@ -16187,6 +16838,7 @@
           <w:szCs w:val="24"/>
         </w:rPr>
       </w:pPr>
+      <w:proofErr w:type="gramStart"/>
       <w:r>
         <w:rPr>
           <w:rFonts w:ascii="TimesNewRomanPSMT" w:hAnsi="TimesNewRomanPSMT" w:cs="TimesNewRomanPSMT"/>
@@ -16194,7 +16846,17 @@
           <w:sz w:val="24"/>
           <w:szCs w:val="24"/>
         </w:rPr>
-        <w:t>de détecter toutes les zones d'une image qui représentent un visage, sans tenir compte de</w:t>
+        <w:t>de</w:t>
+      </w:r>
+      <w:proofErr w:type="gramEnd"/>
+      <w:r>
+        <w:rPr>
+          <w:rFonts w:ascii="TimesNewRomanPSMT" w:hAnsi="TimesNewRomanPSMT" w:cs="TimesNewRomanPSMT"/>
+          <w:color w:val="000000"/>
+          <w:sz w:val="24"/>
+          <w:szCs w:val="24"/>
+        </w:rPr>
+        <w:t xml:space="preserve"> détecter toutes les zones d'une image qui représentent un visage, sans tenir compte de</w:t>
       </w:r>
     </w:p>
     <w:p>
@@ -16210,6 +16872,7 @@
           <w:szCs w:val="24"/>
         </w:rPr>
       </w:pPr>
+      <w:proofErr w:type="gramStart"/>
       <w:r>
         <w:rPr>
           <w:rFonts w:ascii="TimesNewRomanPSMT" w:hAnsi="TimesNewRomanPSMT" w:cs="TimesNewRomanPSMT"/>
@@ -16217,7 +16880,17 @@
           <w:sz w:val="24"/>
           <w:szCs w:val="24"/>
         </w:rPr>
-        <w:t>leur emplacement. Pour mieux comprendre les effets de la position, de l'orientation et de</w:t>
+        <w:t>leur</w:t>
+      </w:r>
+      <w:proofErr w:type="gramEnd"/>
+      <w:r>
+        <w:rPr>
+          <w:rFonts w:ascii="TimesNewRomanPSMT" w:hAnsi="TimesNewRomanPSMT" w:cs="TimesNewRomanPSMT"/>
+          <w:color w:val="000000"/>
+          <w:sz w:val="24"/>
+          <w:szCs w:val="24"/>
+        </w:rPr>
+        <w:t xml:space="preserve"> emplacement. Pour mieux comprendre les effets de la position, de l'orientation et de</w:t>
       </w:r>
     </w:p>
     <w:p>
@@ -16233,6 +16906,7 @@
           <w:szCs w:val="24"/>
         </w:rPr>
       </w:pPr>
+      <w:proofErr w:type="gramStart"/>
       <w:r>
         <w:rPr>
           <w:rFonts w:ascii="TimesNewRomanPSMT" w:hAnsi="TimesNewRomanPSMT" w:cs="TimesNewRomanPSMT"/>
@@ -16240,7 +16914,17 @@
           <w:sz w:val="24"/>
           <w:szCs w:val="24"/>
         </w:rPr>
-        <w:t>l'éclairage sur la perception visuelle, de nombreuses études ont été menées. Plus</w:t>
+        <w:t>l'éclairage</w:t>
+      </w:r>
+      <w:proofErr w:type="gramEnd"/>
+      <w:r>
+        <w:rPr>
+          <w:rFonts w:ascii="TimesNewRomanPSMT" w:hAnsi="TimesNewRomanPSMT" w:cs="TimesNewRomanPSMT"/>
+          <w:color w:val="000000"/>
+          <w:sz w:val="24"/>
+          <w:szCs w:val="24"/>
+        </w:rPr>
+        <w:t xml:space="preserve"> sur la perception visuelle, de nombreuses études ont été menées. Plus</w:t>
       </w:r>
     </w:p>
     <w:p>
@@ -16256,6 +16940,7 @@
           <w:szCs w:val="24"/>
         </w:rPr>
       </w:pPr>
+      <w:proofErr w:type="gramStart"/>
       <w:r>
         <w:rPr>
           <w:rFonts w:ascii="TimesNewRomanPSMT" w:hAnsi="TimesNewRomanPSMT" w:cs="TimesNewRomanPSMT"/>
@@ -16263,7 +16948,17 @@
           <w:sz w:val="24"/>
           <w:szCs w:val="24"/>
         </w:rPr>
-        <w:t>précisément, la recherche s'est concentrée sur ces facteurs et leur impact sur la façon dont</w:t>
+        <w:t>précisément</w:t>
+      </w:r>
+      <w:proofErr w:type="gramEnd"/>
+      <w:r>
+        <w:rPr>
+          <w:rFonts w:ascii="TimesNewRomanPSMT" w:hAnsi="TimesNewRomanPSMT" w:cs="TimesNewRomanPSMT"/>
+          <w:color w:val="000000"/>
+          <w:sz w:val="24"/>
+          <w:szCs w:val="24"/>
+        </w:rPr>
+        <w:t>, la recherche s'est concentrée sur ces facteurs et leur impact sur la façon dont</w:t>
       </w:r>
     </w:p>
     <w:p>
@@ -16279,6 +16974,7 @@
           <w:szCs w:val="24"/>
         </w:rPr>
       </w:pPr>
+      <w:proofErr w:type="gramStart"/>
       <w:r>
         <w:rPr>
           <w:rFonts w:ascii="TimesNewRomanPSMT" w:hAnsi="TimesNewRomanPSMT" w:cs="TimesNewRomanPSMT"/>
@@ -16286,7 +16982,17 @@
           <w:sz w:val="24"/>
           <w:szCs w:val="24"/>
         </w:rPr>
-        <w:t>les individus perçoivent les stimuli visuels. Il existe de nombreuses méthodes pour</w:t>
+        <w:t>les</w:t>
+      </w:r>
+      <w:proofErr w:type="gramEnd"/>
+      <w:r>
+        <w:rPr>
+          <w:rFonts w:ascii="TimesNewRomanPSMT" w:hAnsi="TimesNewRomanPSMT" w:cs="TimesNewRomanPSMT"/>
+          <w:color w:val="000000"/>
+          <w:sz w:val="24"/>
+          <w:szCs w:val="24"/>
+        </w:rPr>
+        <w:t xml:space="preserve"> individus perçoivent les stimuli visuels. Il existe de nombreuses méthodes pour</w:t>
       </w:r>
     </w:p>
     <w:p>
@@ -16302,6 +17008,7 @@
           <w:szCs w:val="24"/>
         </w:rPr>
       </w:pPr>
+      <w:proofErr w:type="gramStart"/>
       <w:r>
         <w:rPr>
           <w:rFonts w:ascii="TimesNewRomanPSMT" w:hAnsi="TimesNewRomanPSMT" w:cs="TimesNewRomanPSMT"/>
@@ -16309,7 +17016,17 @@
           <w:sz w:val="24"/>
           <w:szCs w:val="24"/>
         </w:rPr>
-        <w:t>identifier les visages dans les images statiques qui ont été développées au fil du temps. La</w:t>
+        <w:t>identifier</w:t>
+      </w:r>
+      <w:proofErr w:type="gramEnd"/>
+      <w:r>
+        <w:rPr>
+          <w:rFonts w:ascii="TimesNewRomanPSMT" w:hAnsi="TimesNewRomanPSMT" w:cs="TimesNewRomanPSMT"/>
+          <w:color w:val="000000"/>
+          <w:sz w:val="24"/>
+          <w:szCs w:val="24"/>
+        </w:rPr>
+        <w:t xml:space="preserve"> les visages dans les images statiques qui ont été développées au fil du temps. La</w:t>
       </w:r>
     </w:p>
     <w:p>
@@ -16325,6 +17042,7 @@
           <w:szCs w:val="24"/>
         </w:rPr>
       </w:pPr>
+      <w:proofErr w:type="gramStart"/>
       <w:r>
         <w:rPr>
           <w:rFonts w:ascii="TimesNewRomanPSMT" w:hAnsi="TimesNewRomanPSMT" w:cs="TimesNewRomanPSMT"/>
@@ -16332,7 +17050,17 @@
           <w:sz w:val="24"/>
           <w:szCs w:val="24"/>
         </w:rPr>
-        <w:t xml:space="preserve">reconnaissance faciale a été effectuée pour la première fois dans les années 1970 par </w:t>
+        <w:t>reconnaissance</w:t>
+      </w:r>
+      <w:proofErr w:type="gramEnd"/>
+      <w:r>
+        <w:rPr>
+          <w:rFonts w:ascii="TimesNewRomanPSMT" w:hAnsi="TimesNewRomanPSMT" w:cs="TimesNewRomanPSMT"/>
+          <w:color w:val="000000"/>
+          <w:sz w:val="24"/>
+          <w:szCs w:val="24"/>
+        </w:rPr>
+        <w:t xml:space="preserve"> faciale a été effectuée pour la première fois dans les années 1970 par </w:t>
       </w:r>
       <w:r>
         <w:rPr>
@@ -16357,6 +17085,7 @@
           <w:szCs w:val="24"/>
         </w:rPr>
       </w:pPr>
+      <w:proofErr w:type="gramStart"/>
       <w:r>
         <w:rPr>
           <w:rFonts w:ascii="TimesNewRomanPSMT" w:hAnsi="TimesNewRomanPSMT" w:cs="TimesNewRomanPSMT"/>
@@ -16364,7 +17093,17 @@
           <w:sz w:val="24"/>
           <w:szCs w:val="24"/>
         </w:rPr>
-        <w:t xml:space="preserve">l’université de Tokyo. La détection faciale est alors surtout utilisée </w:t>
+        <w:t>l’université</w:t>
+      </w:r>
+      <w:proofErr w:type="gramEnd"/>
+      <w:r>
+        <w:rPr>
+          <w:rFonts w:ascii="TimesNewRomanPSMT" w:hAnsi="TimesNewRomanPSMT" w:cs="TimesNewRomanPSMT"/>
+          <w:color w:val="000000"/>
+          <w:sz w:val="24"/>
+          <w:szCs w:val="24"/>
+        </w:rPr>
+        <w:t xml:space="preserve"> de Tokyo. La détection faciale est alors surtout utilisée </w:t>
       </w:r>
       <w:r>
         <w:rPr>
@@ -16421,6 +17160,7 @@
           <w:szCs w:val="24"/>
         </w:rPr>
       </w:pPr>
+      <w:proofErr w:type="gramStart"/>
       <w:r>
         <w:rPr>
           <w:rFonts w:ascii="TimesNewRomanPSMT" w:hAnsi="TimesNewRomanPSMT" w:cs="TimesNewRomanPSMT"/>
@@ -16428,7 +17168,17 @@
           <w:sz w:val="24"/>
           <w:szCs w:val="24"/>
         </w:rPr>
-        <w:t>mais de nouvelles formes de sources d’information comme la reconnaissance des visages.</w:t>
+        <w:t>mais</w:t>
+      </w:r>
+      <w:proofErr w:type="gramEnd"/>
+      <w:r>
+        <w:rPr>
+          <w:rFonts w:ascii="TimesNewRomanPSMT" w:hAnsi="TimesNewRomanPSMT" w:cs="TimesNewRomanPSMT"/>
+          <w:color w:val="202122"/>
+          <w:sz w:val="24"/>
+          <w:szCs w:val="24"/>
+        </w:rPr>
+        <w:t xml:space="preserve"> de nouvelles formes de sources d’information comme la reconnaissance des visages.</w:t>
       </w:r>
     </w:p>
     <w:p>
@@ -16560,22 +17310,853 @@
     </w:p>
     <w:p>
       <w:pPr>
-        <w:pStyle w:val="NormalWeb"/>
-        <w:rPr>
-          <w:color w:val="000000" w:themeColor="text1"/>
-        </w:rPr>
-      </w:pPr>
-    </w:p>
-    <w:p>
-      <w:pPr>
-        <w:pStyle w:val="NormalWeb"/>
-        <w:rPr>
-          <w:rStyle w:val="CodeHTML"/>
-          <w:rFonts w:ascii="Times New Roman" w:hAnsi="Times New Roman" w:cs="Times New Roman"/>
+        <w:pStyle w:val="Titre2"/>
+        <w:rPr>
           <w:sz w:val="28"/>
           <w:szCs w:val="28"/>
         </w:rPr>
       </w:pPr>
+      <w:r>
+        <w:rPr>
+          <w:sz w:val="28"/>
+          <w:szCs w:val="28"/>
+        </w:rPr>
+        <w:t xml:space="preserve">Prompt </w:t>
+      </w:r>
+      <w:r>
+        <w:rPr>
+          <w:sz w:val="28"/>
+          <w:szCs w:val="28"/>
+        </w:rPr>
+        <w:t>B avec</w:t>
+      </w:r>
+      <w:r>
+        <w:rPr>
+          <w:sz w:val="28"/>
+          <w:szCs w:val="28"/>
+        </w:rPr>
+        <w:t xml:space="preserve"> contrainte de longueur</w:t>
+      </w:r>
+    </w:p>
+    <w:p>
+      <w:pPr>
+        <w:pStyle w:val="PrformatHTML"/>
+        <w:rPr>
+          <w:rStyle w:val="CodeHTML"/>
+          <w:rFonts w:ascii="Times New Roman" w:hAnsi="Times New Roman" w:cs="Times New Roman"/>
+          <w:color w:val="000000" w:themeColor="text1"/>
+          <w:sz w:val="24"/>
+          <w:szCs w:val="24"/>
+        </w:rPr>
+      </w:pPr>
+      <w:r>
+        <w:rPr>
+          <w:rStyle w:val="CodeHTML"/>
+          <w:rFonts w:ascii="Times New Roman" w:hAnsi="Times New Roman" w:cs="Times New Roman"/>
+          <w:color w:val="000000" w:themeColor="text1"/>
+          <w:sz w:val="24"/>
+          <w:szCs w:val="24"/>
+        </w:rPr>
+        <w:t>Résume ce texte en 150 mots.</w:t>
+      </w:r>
+    </w:p>
+    <w:p>
+      <w:pPr>
+        <w:pStyle w:val="PrformatHTML"/>
+        <w:rPr>
+          <w:rStyle w:val="CodeHTML"/>
+          <w:rFonts w:ascii="Times New Roman" w:hAnsi="Times New Roman" w:cs="Times New Roman"/>
+          <w:color w:val="000000" w:themeColor="text1"/>
+          <w:sz w:val="24"/>
+          <w:szCs w:val="24"/>
+        </w:rPr>
+      </w:pPr>
+    </w:p>
+    <w:p>
+      <w:pPr>
+        <w:pStyle w:val="PrformatHTML"/>
+        <w:rPr>
+          <w:rStyle w:val="CodeHTML"/>
+          <w:rFonts w:ascii="Times New Roman" w:hAnsi="Times New Roman" w:cs="Times New Roman"/>
+          <w:color w:val="000000" w:themeColor="text1"/>
+          <w:sz w:val="24"/>
+          <w:szCs w:val="24"/>
+        </w:rPr>
+      </w:pPr>
+      <w:r>
+        <w:rPr>
+          <w:rStyle w:val="CodeHTML"/>
+          <w:rFonts w:ascii="Times New Roman" w:hAnsi="Times New Roman" w:cs="Times New Roman"/>
+          <w:color w:val="000000" w:themeColor="text1"/>
+          <w:sz w:val="24"/>
+          <w:szCs w:val="24"/>
+        </w:rPr>
+        <w:t>Texte :</w:t>
+      </w:r>
+    </w:p>
+    <w:p>
+      <w:pPr>
+        <w:pStyle w:val="PrformatHTML"/>
+        <w:rPr>
+          <w:rStyle w:val="CodeHTML"/>
+          <w:rFonts w:ascii="Times New Roman" w:hAnsi="Times New Roman" w:cs="Times New Roman"/>
+          <w:color w:val="000000" w:themeColor="text1"/>
+          <w:sz w:val="24"/>
+          <w:szCs w:val="24"/>
+        </w:rPr>
+      </w:pPr>
+      <w:r>
+        <w:rPr>
+          <w:rStyle w:val="CodeHTML"/>
+          <w:rFonts w:ascii="Times New Roman" w:hAnsi="Times New Roman" w:cs="Times New Roman"/>
+          <w:color w:val="000000" w:themeColor="text1"/>
+          <w:sz w:val="24"/>
+          <w:szCs w:val="24"/>
+        </w:rPr>
+        <w:t>"""</w:t>
+      </w:r>
+    </w:p>
+    <w:p>
+      <w:pPr>
+        <w:autoSpaceDE w:val="0"/>
+        <w:autoSpaceDN w:val="0"/>
+        <w:adjustRightInd w:val="0"/>
+        <w:spacing w:after="0" w:line="240" w:lineRule="auto"/>
+        <w:rPr>
+          <w:rFonts w:ascii="TimesNewRomanPSMT" w:hAnsi="TimesNewRomanPSMT" w:cs="TimesNewRomanPSMT"/>
+          <w:color w:val="000000"/>
+          <w:sz w:val="24"/>
+          <w:szCs w:val="24"/>
+        </w:rPr>
+      </w:pPr>
+      <w:r>
+        <w:rPr>
+          <w:rFonts w:ascii="TimesNewRomanPSMT" w:hAnsi="TimesNewRomanPSMT" w:cs="TimesNewRomanPSMT"/>
+          <w:color w:val="000000"/>
+          <w:sz w:val="24"/>
+          <w:szCs w:val="24"/>
+        </w:rPr>
+        <w:t>L'objectif de cette recherche est de construire un système qui automatise l'analyse</w:t>
+      </w:r>
+    </w:p>
+    <w:p>
+      <w:pPr>
+        <w:autoSpaceDE w:val="0"/>
+        <w:autoSpaceDN w:val="0"/>
+        <w:adjustRightInd w:val="0"/>
+        <w:spacing w:after="0" w:line="240" w:lineRule="auto"/>
+        <w:rPr>
+          <w:rFonts w:ascii="TimesNewRomanPSMT" w:hAnsi="TimesNewRomanPSMT" w:cs="TimesNewRomanPSMT"/>
+          <w:color w:val="000000"/>
+          <w:sz w:val="24"/>
+          <w:szCs w:val="24"/>
+        </w:rPr>
+      </w:pPr>
+      <w:proofErr w:type="gramStart"/>
+      <w:r>
+        <w:rPr>
+          <w:rFonts w:ascii="TimesNewRomanPSMT" w:hAnsi="TimesNewRomanPSMT" w:cs="TimesNewRomanPSMT"/>
+          <w:color w:val="000000"/>
+          <w:sz w:val="24"/>
+          <w:szCs w:val="24"/>
+        </w:rPr>
+        <w:t>des</w:t>
+      </w:r>
+      <w:proofErr w:type="gramEnd"/>
+      <w:r>
+        <w:rPr>
+          <w:rFonts w:ascii="TimesNewRomanPSMT" w:hAnsi="TimesNewRomanPSMT" w:cs="TimesNewRomanPSMT"/>
+          <w:color w:val="000000"/>
+          <w:sz w:val="24"/>
+          <w:szCs w:val="24"/>
+        </w:rPr>
+        <w:t xml:space="preserve"> informations contenues dans les images et plus spécifiquement pour réaliser la tâche</w:t>
+      </w:r>
+    </w:p>
+    <w:p>
+      <w:pPr>
+        <w:autoSpaceDE w:val="0"/>
+        <w:autoSpaceDN w:val="0"/>
+        <w:adjustRightInd w:val="0"/>
+        <w:spacing w:after="0" w:line="240" w:lineRule="auto"/>
+        <w:rPr>
+          <w:rFonts w:ascii="TimesNewRomanPSMT" w:hAnsi="TimesNewRomanPSMT" w:cs="TimesNewRomanPSMT"/>
+          <w:color w:val="000000"/>
+          <w:sz w:val="24"/>
+          <w:szCs w:val="24"/>
+        </w:rPr>
+      </w:pPr>
+      <w:proofErr w:type="gramStart"/>
+      <w:r>
+        <w:rPr>
+          <w:rFonts w:ascii="TimesNewRomanPSMT" w:hAnsi="TimesNewRomanPSMT" w:cs="TimesNewRomanPSMT"/>
+          <w:color w:val="000000"/>
+          <w:sz w:val="24"/>
+          <w:szCs w:val="24"/>
+        </w:rPr>
+        <w:t>de</w:t>
+      </w:r>
+      <w:proofErr w:type="gramEnd"/>
+      <w:r>
+        <w:rPr>
+          <w:rFonts w:ascii="TimesNewRomanPSMT" w:hAnsi="TimesNewRomanPSMT" w:cs="TimesNewRomanPSMT"/>
+          <w:color w:val="000000"/>
+          <w:sz w:val="24"/>
+          <w:szCs w:val="24"/>
+        </w:rPr>
+        <w:t xml:space="preserve"> détection de visage. Dans ce contexte il est essentiel de disposer d'algorithmes à la fois</w:t>
+      </w:r>
+    </w:p>
+    <w:p>
+      <w:pPr>
+        <w:autoSpaceDE w:val="0"/>
+        <w:autoSpaceDN w:val="0"/>
+        <w:adjustRightInd w:val="0"/>
+        <w:spacing w:after="0" w:line="240" w:lineRule="auto"/>
+        <w:rPr>
+          <w:rFonts w:ascii="TimesNewRomanPSMT" w:hAnsi="TimesNewRomanPSMT" w:cs="TimesNewRomanPSMT"/>
+          <w:color w:val="000000"/>
+          <w:sz w:val="24"/>
+          <w:szCs w:val="24"/>
+        </w:rPr>
+      </w:pPr>
+      <w:proofErr w:type="gramStart"/>
+      <w:r>
+        <w:rPr>
+          <w:rFonts w:ascii="TimesNewRomanPSMT" w:hAnsi="TimesNewRomanPSMT" w:cs="TimesNewRomanPSMT"/>
+          <w:color w:val="000000"/>
+          <w:sz w:val="24"/>
+          <w:szCs w:val="24"/>
+        </w:rPr>
+        <w:t>efficaces</w:t>
+      </w:r>
+      <w:proofErr w:type="gramEnd"/>
+      <w:r>
+        <w:rPr>
+          <w:rFonts w:ascii="TimesNewRomanPSMT" w:hAnsi="TimesNewRomanPSMT" w:cs="TimesNewRomanPSMT"/>
+          <w:color w:val="000000"/>
+          <w:sz w:val="24"/>
+          <w:szCs w:val="24"/>
+        </w:rPr>
+        <w:t xml:space="preserve"> et robustes. En effet, la capacité à détecter avec précision les visages est cruciale</w:t>
+      </w:r>
+    </w:p>
+    <w:p>
+      <w:pPr>
+        <w:autoSpaceDE w:val="0"/>
+        <w:autoSpaceDN w:val="0"/>
+        <w:adjustRightInd w:val="0"/>
+        <w:spacing w:after="0" w:line="240" w:lineRule="auto"/>
+        <w:rPr>
+          <w:rFonts w:ascii="TimesNewRomanPSMT" w:hAnsi="TimesNewRomanPSMT" w:cs="TimesNewRomanPSMT"/>
+          <w:color w:val="000000"/>
+          <w:sz w:val="24"/>
+          <w:szCs w:val="24"/>
+        </w:rPr>
+      </w:pPr>
+      <w:proofErr w:type="gramStart"/>
+      <w:r>
+        <w:rPr>
+          <w:rFonts w:ascii="TimesNewRomanPSMT" w:hAnsi="TimesNewRomanPSMT" w:cs="TimesNewRomanPSMT"/>
+          <w:color w:val="000000"/>
+          <w:sz w:val="24"/>
+          <w:szCs w:val="24"/>
+        </w:rPr>
+        <w:t>dans</w:t>
+      </w:r>
+      <w:proofErr w:type="gramEnd"/>
+      <w:r>
+        <w:rPr>
+          <w:rFonts w:ascii="TimesNewRomanPSMT" w:hAnsi="TimesNewRomanPSMT" w:cs="TimesNewRomanPSMT"/>
+          <w:color w:val="000000"/>
+          <w:sz w:val="24"/>
+          <w:szCs w:val="24"/>
+        </w:rPr>
+        <w:t xml:space="preserve"> diverses applications. En réalité, l'importance de la détection des visages ne peut être</w:t>
+      </w:r>
+    </w:p>
+    <w:p>
+      <w:pPr>
+        <w:autoSpaceDE w:val="0"/>
+        <w:autoSpaceDN w:val="0"/>
+        <w:adjustRightInd w:val="0"/>
+        <w:spacing w:after="0" w:line="240" w:lineRule="auto"/>
+        <w:rPr>
+          <w:rFonts w:ascii="TimesNewRomanPSMT" w:hAnsi="TimesNewRomanPSMT" w:cs="TimesNewRomanPSMT"/>
+          <w:color w:val="000000"/>
+          <w:sz w:val="24"/>
+          <w:szCs w:val="24"/>
+        </w:rPr>
+      </w:pPr>
+      <w:proofErr w:type="gramStart"/>
+      <w:r>
+        <w:rPr>
+          <w:rFonts w:ascii="TimesNewRomanPSMT" w:hAnsi="TimesNewRomanPSMT" w:cs="TimesNewRomanPSMT"/>
+          <w:color w:val="000000"/>
+          <w:sz w:val="24"/>
+          <w:szCs w:val="24"/>
+        </w:rPr>
+        <w:t>surestimée</w:t>
+      </w:r>
+      <w:proofErr w:type="gramEnd"/>
+      <w:r>
+        <w:rPr>
+          <w:rFonts w:ascii="TimesNewRomanPSMT" w:hAnsi="TimesNewRomanPSMT" w:cs="TimesNewRomanPSMT"/>
+          <w:color w:val="000000"/>
+          <w:sz w:val="24"/>
+          <w:szCs w:val="24"/>
+        </w:rPr>
+        <w:t xml:space="preserve"> lorsqu'il s'agit de tout système impliquant l'analyse des visages. L'objectif est</w:t>
+      </w:r>
+    </w:p>
+    <w:p>
+      <w:pPr>
+        <w:autoSpaceDE w:val="0"/>
+        <w:autoSpaceDN w:val="0"/>
+        <w:adjustRightInd w:val="0"/>
+        <w:spacing w:after="0" w:line="240" w:lineRule="auto"/>
+        <w:rPr>
+          <w:rFonts w:ascii="TimesNewRomanPSMT" w:hAnsi="TimesNewRomanPSMT" w:cs="TimesNewRomanPSMT"/>
+          <w:color w:val="000000"/>
+          <w:sz w:val="24"/>
+          <w:szCs w:val="24"/>
+        </w:rPr>
+      </w:pPr>
+      <w:proofErr w:type="gramStart"/>
+      <w:r>
+        <w:rPr>
+          <w:rFonts w:ascii="TimesNewRomanPSMT" w:hAnsi="TimesNewRomanPSMT" w:cs="TimesNewRomanPSMT"/>
+          <w:color w:val="000000"/>
+          <w:sz w:val="24"/>
+          <w:szCs w:val="24"/>
+        </w:rPr>
+        <w:t>de</w:t>
+      </w:r>
+      <w:proofErr w:type="gramEnd"/>
+      <w:r>
+        <w:rPr>
+          <w:rFonts w:ascii="TimesNewRomanPSMT" w:hAnsi="TimesNewRomanPSMT" w:cs="TimesNewRomanPSMT"/>
+          <w:color w:val="000000"/>
+          <w:sz w:val="24"/>
+          <w:szCs w:val="24"/>
+        </w:rPr>
+        <w:t xml:space="preserve"> détecter toutes les zones d'une image qui représentent un visage, sans tenir compte de</w:t>
+      </w:r>
+    </w:p>
+    <w:p>
+      <w:pPr>
+        <w:autoSpaceDE w:val="0"/>
+        <w:autoSpaceDN w:val="0"/>
+        <w:adjustRightInd w:val="0"/>
+        <w:spacing w:after="0" w:line="240" w:lineRule="auto"/>
+        <w:rPr>
+          <w:rFonts w:ascii="TimesNewRomanPSMT" w:hAnsi="TimesNewRomanPSMT" w:cs="TimesNewRomanPSMT"/>
+          <w:color w:val="000000"/>
+          <w:sz w:val="24"/>
+          <w:szCs w:val="24"/>
+        </w:rPr>
+      </w:pPr>
+      <w:proofErr w:type="gramStart"/>
+      <w:r>
+        <w:rPr>
+          <w:rFonts w:ascii="TimesNewRomanPSMT" w:hAnsi="TimesNewRomanPSMT" w:cs="TimesNewRomanPSMT"/>
+          <w:color w:val="000000"/>
+          <w:sz w:val="24"/>
+          <w:szCs w:val="24"/>
+        </w:rPr>
+        <w:t>leur</w:t>
+      </w:r>
+      <w:proofErr w:type="gramEnd"/>
+      <w:r>
+        <w:rPr>
+          <w:rFonts w:ascii="TimesNewRomanPSMT" w:hAnsi="TimesNewRomanPSMT" w:cs="TimesNewRomanPSMT"/>
+          <w:color w:val="000000"/>
+          <w:sz w:val="24"/>
+          <w:szCs w:val="24"/>
+        </w:rPr>
+        <w:t xml:space="preserve"> emplacement. Pour mieux comprendre les effets de la position, de l'orientation et de</w:t>
+      </w:r>
+    </w:p>
+    <w:p>
+      <w:pPr>
+        <w:autoSpaceDE w:val="0"/>
+        <w:autoSpaceDN w:val="0"/>
+        <w:adjustRightInd w:val="0"/>
+        <w:spacing w:after="0" w:line="240" w:lineRule="auto"/>
+        <w:rPr>
+          <w:rFonts w:ascii="TimesNewRomanPSMT" w:hAnsi="TimesNewRomanPSMT" w:cs="TimesNewRomanPSMT"/>
+          <w:color w:val="000000"/>
+          <w:sz w:val="24"/>
+          <w:szCs w:val="24"/>
+        </w:rPr>
+      </w:pPr>
+      <w:proofErr w:type="gramStart"/>
+      <w:r>
+        <w:rPr>
+          <w:rFonts w:ascii="TimesNewRomanPSMT" w:hAnsi="TimesNewRomanPSMT" w:cs="TimesNewRomanPSMT"/>
+          <w:color w:val="000000"/>
+          <w:sz w:val="24"/>
+          <w:szCs w:val="24"/>
+        </w:rPr>
+        <w:t>l'éclairage</w:t>
+      </w:r>
+      <w:proofErr w:type="gramEnd"/>
+      <w:r>
+        <w:rPr>
+          <w:rFonts w:ascii="TimesNewRomanPSMT" w:hAnsi="TimesNewRomanPSMT" w:cs="TimesNewRomanPSMT"/>
+          <w:color w:val="000000"/>
+          <w:sz w:val="24"/>
+          <w:szCs w:val="24"/>
+        </w:rPr>
+        <w:t xml:space="preserve"> sur la perception visuelle, de nombreuses études ont été menées. Plus</w:t>
+      </w:r>
+    </w:p>
+    <w:p>
+      <w:pPr>
+        <w:autoSpaceDE w:val="0"/>
+        <w:autoSpaceDN w:val="0"/>
+        <w:adjustRightInd w:val="0"/>
+        <w:spacing w:after="0" w:line="240" w:lineRule="auto"/>
+        <w:rPr>
+          <w:rFonts w:ascii="TimesNewRomanPSMT" w:hAnsi="TimesNewRomanPSMT" w:cs="TimesNewRomanPSMT"/>
+          <w:color w:val="000000"/>
+          <w:sz w:val="24"/>
+          <w:szCs w:val="24"/>
+        </w:rPr>
+      </w:pPr>
+      <w:proofErr w:type="gramStart"/>
+      <w:r>
+        <w:rPr>
+          <w:rFonts w:ascii="TimesNewRomanPSMT" w:hAnsi="TimesNewRomanPSMT" w:cs="TimesNewRomanPSMT"/>
+          <w:color w:val="000000"/>
+          <w:sz w:val="24"/>
+          <w:szCs w:val="24"/>
+        </w:rPr>
+        <w:t>précisément</w:t>
+      </w:r>
+      <w:proofErr w:type="gramEnd"/>
+      <w:r>
+        <w:rPr>
+          <w:rFonts w:ascii="TimesNewRomanPSMT" w:hAnsi="TimesNewRomanPSMT" w:cs="TimesNewRomanPSMT"/>
+          <w:color w:val="000000"/>
+          <w:sz w:val="24"/>
+          <w:szCs w:val="24"/>
+        </w:rPr>
+        <w:t>, la recherche s'est concentrée sur ces facteurs et leur impact sur la façon dont</w:t>
+      </w:r>
+    </w:p>
+    <w:p>
+      <w:pPr>
+        <w:autoSpaceDE w:val="0"/>
+        <w:autoSpaceDN w:val="0"/>
+        <w:adjustRightInd w:val="0"/>
+        <w:spacing w:after="0" w:line="240" w:lineRule="auto"/>
+        <w:rPr>
+          <w:rFonts w:ascii="TimesNewRomanPSMT" w:hAnsi="TimesNewRomanPSMT" w:cs="TimesNewRomanPSMT"/>
+          <w:color w:val="000000"/>
+          <w:sz w:val="24"/>
+          <w:szCs w:val="24"/>
+        </w:rPr>
+      </w:pPr>
+      <w:proofErr w:type="gramStart"/>
+      <w:r>
+        <w:rPr>
+          <w:rFonts w:ascii="TimesNewRomanPSMT" w:hAnsi="TimesNewRomanPSMT" w:cs="TimesNewRomanPSMT"/>
+          <w:color w:val="000000"/>
+          <w:sz w:val="24"/>
+          <w:szCs w:val="24"/>
+        </w:rPr>
+        <w:t>les</w:t>
+      </w:r>
+      <w:proofErr w:type="gramEnd"/>
+      <w:r>
+        <w:rPr>
+          <w:rFonts w:ascii="TimesNewRomanPSMT" w:hAnsi="TimesNewRomanPSMT" w:cs="TimesNewRomanPSMT"/>
+          <w:color w:val="000000"/>
+          <w:sz w:val="24"/>
+          <w:szCs w:val="24"/>
+        </w:rPr>
+        <w:t xml:space="preserve"> individus perçoivent les stimuli visuels. Il existe de nombreuses méthodes pour</w:t>
+      </w:r>
+    </w:p>
+    <w:p>
+      <w:pPr>
+        <w:autoSpaceDE w:val="0"/>
+        <w:autoSpaceDN w:val="0"/>
+        <w:adjustRightInd w:val="0"/>
+        <w:spacing w:after="0" w:line="240" w:lineRule="auto"/>
+        <w:rPr>
+          <w:rFonts w:ascii="TimesNewRomanPSMT" w:hAnsi="TimesNewRomanPSMT" w:cs="TimesNewRomanPSMT"/>
+          <w:color w:val="000000"/>
+          <w:sz w:val="24"/>
+          <w:szCs w:val="24"/>
+        </w:rPr>
+      </w:pPr>
+      <w:proofErr w:type="gramStart"/>
+      <w:r>
+        <w:rPr>
+          <w:rFonts w:ascii="TimesNewRomanPSMT" w:hAnsi="TimesNewRomanPSMT" w:cs="TimesNewRomanPSMT"/>
+          <w:color w:val="000000"/>
+          <w:sz w:val="24"/>
+          <w:szCs w:val="24"/>
+        </w:rPr>
+        <w:t>identifier</w:t>
+      </w:r>
+      <w:proofErr w:type="gramEnd"/>
+      <w:r>
+        <w:rPr>
+          <w:rFonts w:ascii="TimesNewRomanPSMT" w:hAnsi="TimesNewRomanPSMT" w:cs="TimesNewRomanPSMT"/>
+          <w:color w:val="000000"/>
+          <w:sz w:val="24"/>
+          <w:szCs w:val="24"/>
+        </w:rPr>
+        <w:t xml:space="preserve"> les visages dans les images statiques qui ont été développées au fil du temps. La</w:t>
+      </w:r>
+    </w:p>
+    <w:p>
+      <w:pPr>
+        <w:autoSpaceDE w:val="0"/>
+        <w:autoSpaceDN w:val="0"/>
+        <w:adjustRightInd w:val="0"/>
+        <w:spacing w:after="0" w:line="240" w:lineRule="auto"/>
+        <w:rPr>
+          <w:rFonts w:ascii="TimesNewRomanPSMT" w:hAnsi="TimesNewRomanPSMT" w:cs="TimesNewRomanPSMT"/>
+          <w:color w:val="202122"/>
+          <w:sz w:val="24"/>
+          <w:szCs w:val="24"/>
+        </w:rPr>
+      </w:pPr>
+      <w:proofErr w:type="gramStart"/>
+      <w:r>
+        <w:rPr>
+          <w:rFonts w:ascii="TimesNewRomanPSMT" w:hAnsi="TimesNewRomanPSMT" w:cs="TimesNewRomanPSMT"/>
+          <w:color w:val="000000"/>
+          <w:sz w:val="24"/>
+          <w:szCs w:val="24"/>
+        </w:rPr>
+        <w:t>reconnaissance</w:t>
+      </w:r>
+      <w:proofErr w:type="gramEnd"/>
+      <w:r>
+        <w:rPr>
+          <w:rFonts w:ascii="TimesNewRomanPSMT" w:hAnsi="TimesNewRomanPSMT" w:cs="TimesNewRomanPSMT"/>
+          <w:color w:val="000000"/>
+          <w:sz w:val="24"/>
+          <w:szCs w:val="24"/>
+        </w:rPr>
+        <w:t xml:space="preserve"> faciale a été effectuée pour la première fois dans les années 1970 par </w:t>
+      </w:r>
+      <w:r>
+        <w:rPr>
+          <w:rFonts w:ascii="TimesNewRomanPSMT" w:hAnsi="TimesNewRomanPSMT" w:cs="TimesNewRomanPSMT"/>
+          <w:color w:val="202122"/>
+          <w:sz w:val="24"/>
+          <w:szCs w:val="24"/>
+        </w:rPr>
+        <w:t>à</w:t>
+      </w:r>
+    </w:p>
+    <w:p>
+      <w:pPr>
+        <w:autoSpaceDE w:val="0"/>
+        <w:autoSpaceDN w:val="0"/>
+        <w:adjustRightInd w:val="0"/>
+        <w:spacing w:after="0" w:line="240" w:lineRule="auto"/>
+        <w:rPr>
+          <w:rFonts w:ascii="TimesNewRomanPSMT" w:hAnsi="TimesNewRomanPSMT" w:cs="TimesNewRomanPSMT"/>
+          <w:color w:val="202122"/>
+          <w:sz w:val="24"/>
+          <w:szCs w:val="24"/>
+        </w:rPr>
+      </w:pPr>
+      <w:proofErr w:type="gramStart"/>
+      <w:r>
+        <w:rPr>
+          <w:rFonts w:ascii="TimesNewRomanPSMT" w:hAnsi="TimesNewRomanPSMT" w:cs="TimesNewRomanPSMT"/>
+          <w:color w:val="000000"/>
+          <w:sz w:val="24"/>
+          <w:szCs w:val="24"/>
+        </w:rPr>
+        <w:t>l’université</w:t>
+      </w:r>
+      <w:proofErr w:type="gramEnd"/>
+      <w:r>
+        <w:rPr>
+          <w:rFonts w:ascii="TimesNewRomanPSMT" w:hAnsi="TimesNewRomanPSMT" w:cs="TimesNewRomanPSMT"/>
+          <w:color w:val="000000"/>
+          <w:sz w:val="24"/>
+          <w:szCs w:val="24"/>
+        </w:rPr>
+        <w:t xml:space="preserve"> de Tokyo. La détection faciale est alors surtout utilisée </w:t>
+      </w:r>
+      <w:r>
+        <w:rPr>
+          <w:rFonts w:ascii="TimesNewRomanPSMT" w:hAnsi="TimesNewRomanPSMT" w:cs="TimesNewRomanPSMT"/>
+          <w:color w:val="202122"/>
+          <w:sz w:val="24"/>
+          <w:szCs w:val="24"/>
+        </w:rPr>
+        <w:t>à des fins de sécurité</w:t>
+      </w:r>
+    </w:p>
+    <w:p>
+      <w:pPr>
+        <w:autoSpaceDE w:val="0"/>
+        <w:autoSpaceDN w:val="0"/>
+        <w:adjustRightInd w:val="0"/>
+        <w:spacing w:after="0" w:line="240" w:lineRule="auto"/>
+        <w:rPr>
+          <w:rFonts w:ascii="TimesNewRomanPSMT" w:hAnsi="TimesNewRomanPSMT" w:cs="TimesNewRomanPSMT"/>
+          <w:color w:val="202122"/>
+          <w:sz w:val="24"/>
+          <w:szCs w:val="24"/>
+        </w:rPr>
+      </w:pPr>
+      <w:r>
+        <w:rPr>
+          <w:rFonts w:ascii="TimesNewRomanPSMT" w:hAnsi="TimesNewRomanPSMT" w:cs="TimesNewRomanPSMT"/>
+          <w:color w:val="000000"/>
+          <w:sz w:val="24"/>
+          <w:szCs w:val="24"/>
+        </w:rPr>
+        <w:t xml:space="preserve">[1]. </w:t>
+      </w:r>
+      <w:r>
+        <w:rPr>
+          <w:rFonts w:ascii="TimesNewRomanPSMT" w:hAnsi="TimesNewRomanPSMT" w:cs="TimesNewRomanPSMT"/>
+          <w:color w:val="202122"/>
+          <w:sz w:val="24"/>
+          <w:szCs w:val="24"/>
+        </w:rPr>
+        <w:t>Certaines interfaces homme machine utilisent non seulement le clavier et la souris</w:t>
+      </w:r>
+    </w:p>
+    <w:p>
+      <w:pPr>
+        <w:autoSpaceDE w:val="0"/>
+        <w:autoSpaceDN w:val="0"/>
+        <w:adjustRightInd w:val="0"/>
+        <w:spacing w:after="0" w:line="240" w:lineRule="auto"/>
+        <w:rPr>
+          <w:rFonts w:ascii="TimesNewRomanPSMT" w:hAnsi="TimesNewRomanPSMT" w:cs="TimesNewRomanPSMT"/>
+          <w:color w:val="202122"/>
+          <w:sz w:val="24"/>
+          <w:szCs w:val="24"/>
+        </w:rPr>
+      </w:pPr>
+      <w:proofErr w:type="gramStart"/>
+      <w:r>
+        <w:rPr>
+          <w:rFonts w:ascii="TimesNewRomanPSMT" w:hAnsi="TimesNewRomanPSMT" w:cs="TimesNewRomanPSMT"/>
+          <w:color w:val="202122"/>
+          <w:sz w:val="24"/>
+          <w:szCs w:val="24"/>
+        </w:rPr>
+        <w:t>mais</w:t>
+      </w:r>
+      <w:proofErr w:type="gramEnd"/>
+      <w:r>
+        <w:rPr>
+          <w:rFonts w:ascii="TimesNewRomanPSMT" w:hAnsi="TimesNewRomanPSMT" w:cs="TimesNewRomanPSMT"/>
+          <w:color w:val="202122"/>
+          <w:sz w:val="24"/>
+          <w:szCs w:val="24"/>
+        </w:rPr>
+        <w:t xml:space="preserve"> de nouvelles formes de sources d’information comme la reconnaissance des visages.</w:t>
+      </w:r>
+    </w:p>
+    <w:p>
+      <w:pPr>
+        <w:pStyle w:val="PrformatHTML"/>
+        <w:rPr>
+          <w:rFonts w:ascii="TimesNewRomanPSMT" w:hAnsi="TimesNewRomanPSMT" w:cs="TimesNewRomanPSMT"/>
+          <w:color w:val="202122"/>
+          <w:sz w:val="24"/>
+          <w:szCs w:val="24"/>
+        </w:rPr>
+      </w:pPr>
+      <w:r>
+        <w:rPr>
+          <w:rFonts w:ascii="TimesNewRomanPSMT" w:hAnsi="TimesNewRomanPSMT" w:cs="TimesNewRomanPSMT"/>
+          <w:color w:val="202122"/>
+          <w:sz w:val="24"/>
+          <w:szCs w:val="24"/>
+        </w:rPr>
+        <w:t>Dans ce chapitre, nous présenterons l’état de l’art sur les techniques de la détection faciale.</w:t>
+      </w:r>
+    </w:p>
+    <w:p>
+      <w:pPr>
+        <w:pStyle w:val="PrformatHTML"/>
+        <w:rPr>
+          <w:rFonts w:ascii="Times New Roman" w:hAnsi="Times New Roman" w:cs="Times New Roman"/>
+          <w:color w:val="000000" w:themeColor="text1"/>
+          <w:sz w:val="24"/>
+          <w:szCs w:val="24"/>
+        </w:rPr>
+      </w:pPr>
+      <w:r>
+        <w:rPr>
+          <w:rStyle w:val="CodeHTML"/>
+          <w:rFonts w:ascii="Times New Roman" w:hAnsi="Times New Roman" w:cs="Times New Roman"/>
+          <w:color w:val="000000" w:themeColor="text1"/>
+          <w:sz w:val="24"/>
+          <w:szCs w:val="24"/>
+        </w:rPr>
+        <w:t>"""</w:t>
+      </w:r>
+    </w:p>
+    <w:p>
+      <w:pPr>
+        <w:pStyle w:val="NormalWeb"/>
+        <w:rPr>
+          <w:b/>
+          <w:bCs/>
+          <w:color w:val="000000" w:themeColor="text1"/>
+          <w:sz w:val="28"/>
+          <w:szCs w:val="28"/>
+        </w:rPr>
+      </w:pPr>
+      <w:r>
+        <w:rPr>
+          <w:b/>
+          <w:bCs/>
+          <w:color w:val="000000" w:themeColor="text1"/>
+          <w:sz w:val="28"/>
+          <w:szCs w:val="28"/>
+        </w:rPr>
+        <w:t>Résultat :</w:t>
+      </w:r>
+    </w:p>
+    <w:p>
+      <w:pPr>
+        <w:pStyle w:val="NormalWeb"/>
+        <w:rPr>
+          <w:rStyle w:val="CodeHTML"/>
+          <w:rFonts w:ascii="Times New Roman" w:hAnsi="Times New Roman" w:cs="Times New Roman"/>
+          <w:b/>
+          <w:bCs/>
+          <w:sz w:val="28"/>
+          <w:szCs w:val="28"/>
+        </w:rPr>
+      </w:pPr>
+      <w:r>
+        <w:rPr>
+          <w:rStyle w:val="CodeHTML"/>
+          <w:rFonts w:ascii="Times New Roman" w:hAnsi="Times New Roman" w:cs="Times New Roman"/>
+          <w:b/>
+          <w:bCs/>
+          <w:sz w:val="28"/>
+          <w:szCs w:val="28"/>
+        </w:rPr>
+        <w:lastRenderedPageBreak/>
+        <w:drawing>
+          <wp:inline distT="0" distB="0" distL="0" distR="0" wp14:anchorId="6CA20289" wp14:editId="2337B2B8">
+            <wp:extent cx="5758163" cy="3144902"/>
+            <wp:effectExtent l="0" t="0" r="0" b="0"/>
+            <wp:docPr id="52" name="Image 52"/>
+            <wp:cNvGraphicFramePr>
+              <a:graphicFrameLocks xmlns:a="http://schemas.openxmlformats.org/drawingml/2006/main" noChangeAspect="1"/>
+            </wp:cNvGraphicFramePr>
+            <a:graphic xmlns:a="http://schemas.openxmlformats.org/drawingml/2006/main">
+              <a:graphicData uri="http://schemas.openxmlformats.org/drawingml/2006/picture">
+                <pic:pic xmlns:pic="http://schemas.openxmlformats.org/drawingml/2006/picture">
+                  <pic:nvPicPr>
+                    <pic:cNvPr id="1" name=""/>
+                    <pic:cNvPicPr/>
+                  </pic:nvPicPr>
+                  <pic:blipFill>
+                    <a:blip r:embed="rId54"/>
+                    <a:stretch>
+                      <a:fillRect/>
+                    </a:stretch>
+                  </pic:blipFill>
+                  <pic:spPr>
+                    <a:xfrm>
+                      <a:off x="0" y="0"/>
+                      <a:ext cx="5834818" cy="3186768"/>
+                    </a:xfrm>
+                    <a:prstGeom prst="rect">
+                      <a:avLst/>
+                    </a:prstGeom>
+                  </pic:spPr>
+                </pic:pic>
+              </a:graphicData>
+            </a:graphic>
+          </wp:inline>
+        </w:drawing>
+      </w:r>
+    </w:p>
+    <w:p>
+      <w:pPr>
+        <w:pStyle w:val="NormalWeb"/>
+        <w:rPr>
+          <w:rStyle w:val="CodeHTML"/>
+          <w:rFonts w:ascii="Times New Roman" w:hAnsi="Times New Roman" w:cs="Times New Roman"/>
+          <w:b/>
+          <w:bCs/>
+          <w:sz w:val="28"/>
+          <w:szCs w:val="28"/>
+        </w:rPr>
+      </w:pPr>
+    </w:p>
+    <w:p>
+      <w:pPr>
+        <w:pStyle w:val="NormalWeb"/>
+        <w:rPr>
+          <w:rStyle w:val="CodeHTML"/>
+          <w:rFonts w:ascii="Times New Roman" w:hAnsi="Times New Roman" w:cs="Times New Roman"/>
+          <w:b/>
+          <w:bCs/>
+          <w:sz w:val="28"/>
+          <w:szCs w:val="28"/>
+        </w:rPr>
+      </w:pPr>
+      <w:r>
+        <w:rPr>
+          <w:rStyle w:val="CodeHTML"/>
+          <w:rFonts w:ascii="Times New Roman" w:hAnsi="Times New Roman" w:cs="Times New Roman"/>
+          <w:b/>
+          <w:bCs/>
+          <w:sz w:val="28"/>
+          <w:szCs w:val="28"/>
+        </w:rPr>
+        <w:drawing>
+          <wp:inline distT="0" distB="0" distL="0" distR="0" wp14:anchorId="68745801" wp14:editId="526101F1">
+            <wp:extent cx="5562886" cy="4559534"/>
+            <wp:effectExtent l="0" t="0" r="0" b="0"/>
+            <wp:docPr id="53" name="Image 53"/>
+            <wp:cNvGraphicFramePr>
+              <a:graphicFrameLocks xmlns:a="http://schemas.openxmlformats.org/drawingml/2006/main" noChangeAspect="1"/>
+            </wp:cNvGraphicFramePr>
+            <a:graphic xmlns:a="http://schemas.openxmlformats.org/drawingml/2006/main">
+              <a:graphicData uri="http://schemas.openxmlformats.org/drawingml/2006/picture">
+                <pic:pic xmlns:pic="http://schemas.openxmlformats.org/drawingml/2006/picture">
+                  <pic:nvPicPr>
+                    <pic:cNvPr id="1" name=""/>
+                    <pic:cNvPicPr/>
+                  </pic:nvPicPr>
+                  <pic:blipFill>
+                    <a:blip r:embed="rId55"/>
+                    <a:stretch>
+                      <a:fillRect/>
+                    </a:stretch>
+                  </pic:blipFill>
+                  <pic:spPr>
+                    <a:xfrm>
+                      <a:off x="0" y="0"/>
+                      <a:ext cx="5562886" cy="4559534"/>
+                    </a:xfrm>
+                    <a:prstGeom prst="rect">
+                      <a:avLst/>
+                    </a:prstGeom>
+                  </pic:spPr>
+                </pic:pic>
+              </a:graphicData>
+            </a:graphic>
+          </wp:inline>
+        </w:drawing>
+      </w:r>
     </w:p>
     <w:sectPr>
       <w:pgSz w:w="11906" w:h="16838"/>
@@ -16590,6 +18171,119 @@
 <file path=word/numbering.xml><?xml version="1.0" encoding="utf-8"?>
 <w:numbering xmlns:wpc="http://schemas.microsoft.com/office/word/2010/wordprocessingCanvas" xmlns:cx="http://schemas.microsoft.com/office/drawing/2014/chartex" xmlns:cx1="http://schemas.microsoft.com/office/drawing/2015/9/8/chartex" xmlns:cx2="http://schemas.microsoft.com/office/drawing/2015/10/21/chartex" xmlns:cx3="http://schemas.microsoft.com/office/drawing/2016/5/9/chartex" xmlns:cx4="http://schemas.microsoft.com/office/drawing/2016/5/10/chartex" xmlns:cx5="http://schemas.microsoft.com/office/drawing/2016/5/11/chartex" xmlns:cx6="http://schemas.microsoft.com/office/drawing/2016/5/12/chartex" xmlns:cx7="http://schemas.microsoft.com/office/drawing/2016/5/13/chartex" xmlns:cx8="http://schemas.microsoft.com/office/drawing/2016/5/14/chartex" xmlns:mc="http://schemas.openxmlformats.org/markup-compatibility/2006" xmlns:aink="http://schemas.microsoft.com/office/drawing/2016/ink" xmlns:am3d="http://schemas.microsoft.com/office/drawing/2017/model3d" xmlns:o="urn:schemas-microsoft-com:office:office" xmlns:r="http://schemas.openxmlformats.org/officeDocument/2006/relationships" xmlns:m="http://schemas.openxmlformats.org/officeDocument/2006/math" xmlns:v="urn:schemas-microsoft-com:vml" xmlns:wp14="http://schemas.microsoft.com/office/word/2010/wordprocessingDrawing" xmlns:wp="http://schemas.openxmlformats.org/drawingml/2006/wordprocessingDrawing" xmlns:w10="urn:schemas-microsoft-com:office:word" xmlns:w="http://schemas.openxmlformats.org/wordprocessingml/2006/main" xmlns:w14="http://schemas.microsoft.com/office/word/2010/wordml" xmlns:w15="http://schemas.microsoft.com/office/word/2012/wordml" xmlns:w16cex="http://schemas.microsoft.com/office/word/2018/wordml/cex" xmlns:w16cid="http://schemas.microsoft.com/office/word/2016/wordml/cid" xmlns:w16="http://schemas.microsoft.com/office/word/2018/wordml" xmlns:w16sdtdh="http://schemas.microsoft.com/office/word/2020/wordml/sdtdatahash" xmlns:w16se="http://schemas.microsoft.com/office/word/2015/wordml/symex" xmlns:wpg="http://schemas.microsoft.com/office/word/2010/wordprocessingGroup" xmlns:wpi="http://schemas.microsoft.com/office/word/2010/wordprocessingInk" xmlns:wne="http://schemas.microsoft.com/office/word/2006/wordml" xmlns:wps="http://schemas.microsoft.com/office/word/2010/wordprocessingShape" mc:Ignorable="w14 w15 w16se w16cid w16 w16cex w16sdtdh wp14">
   <w:abstractNum w:abstractNumId="0" w15:restartNumberingAfterBreak="0">
+    <w:nsid w:val="04EE464E"/>
+    <w:multiLevelType w:val="hybridMultilevel"/>
+    <w:tmpl w:val="D52236E4"/>
+    <w:lvl w:ilvl="0" w:tplc="040C0001">
+      <w:start w:val="1"/>
+      <w:numFmt w:val="bullet"/>
+      <w:lvlText w:val=""/>
+      <w:lvlJc w:val="left"/>
+      <w:pPr>
+        <w:ind w:left="720" w:hanging="360"/>
+      </w:pPr>
+      <w:rPr>
+        <w:rFonts w:ascii="Symbol" w:hAnsi="Symbol" w:hint="default"/>
+      </w:rPr>
+    </w:lvl>
+    <w:lvl w:ilvl="1" w:tplc="040C0003" w:tentative="1">
+      <w:start w:val="1"/>
+      <w:numFmt w:val="bullet"/>
+      <w:lvlText w:val="o"/>
+      <w:lvlJc w:val="left"/>
+      <w:pPr>
+        <w:ind w:left="1440" w:hanging="360"/>
+      </w:pPr>
+      <w:rPr>
+        <w:rFonts w:ascii="Courier New" w:hAnsi="Courier New" w:cs="Courier New" w:hint="default"/>
+      </w:rPr>
+    </w:lvl>
+    <w:lvl w:ilvl="2" w:tplc="040C0005" w:tentative="1">
+      <w:start w:val="1"/>
+      <w:numFmt w:val="bullet"/>
+      <w:lvlText w:val=""/>
+      <w:lvlJc w:val="left"/>
+      <w:pPr>
+        <w:ind w:left="2160" w:hanging="360"/>
+      </w:pPr>
+      <w:rPr>
+        <w:rFonts w:ascii="Wingdings" w:hAnsi="Wingdings" w:hint="default"/>
+      </w:rPr>
+    </w:lvl>
+    <w:lvl w:ilvl="3" w:tplc="040C0001" w:tentative="1">
+      <w:start w:val="1"/>
+      <w:numFmt w:val="bullet"/>
+      <w:lvlText w:val=""/>
+      <w:lvlJc w:val="left"/>
+      <w:pPr>
+        <w:ind w:left="2880" w:hanging="360"/>
+      </w:pPr>
+      <w:rPr>
+        <w:rFonts w:ascii="Symbol" w:hAnsi="Symbol" w:hint="default"/>
+      </w:rPr>
+    </w:lvl>
+    <w:lvl w:ilvl="4" w:tplc="040C0003" w:tentative="1">
+      <w:start w:val="1"/>
+      <w:numFmt w:val="bullet"/>
+      <w:lvlText w:val="o"/>
+      <w:lvlJc w:val="left"/>
+      <w:pPr>
+        <w:ind w:left="3600" w:hanging="360"/>
+      </w:pPr>
+      <w:rPr>
+        <w:rFonts w:ascii="Courier New" w:hAnsi="Courier New" w:cs="Courier New" w:hint="default"/>
+      </w:rPr>
+    </w:lvl>
+    <w:lvl w:ilvl="5" w:tplc="040C0005" w:tentative="1">
+      <w:start w:val="1"/>
+      <w:numFmt w:val="bullet"/>
+      <w:lvlText w:val=""/>
+      <w:lvlJc w:val="left"/>
+      <w:pPr>
+        <w:ind w:left="4320" w:hanging="360"/>
+      </w:pPr>
+      <w:rPr>
+        <w:rFonts w:ascii="Wingdings" w:hAnsi="Wingdings" w:hint="default"/>
+      </w:rPr>
+    </w:lvl>
+    <w:lvl w:ilvl="6" w:tplc="040C0001" w:tentative="1">
+      <w:start w:val="1"/>
+      <w:numFmt w:val="bullet"/>
+      <w:lvlText w:val=""/>
+      <w:lvlJc w:val="left"/>
+      <w:pPr>
+        <w:ind w:left="5040" w:hanging="360"/>
+      </w:pPr>
+      <w:rPr>
+        <w:rFonts w:ascii="Symbol" w:hAnsi="Symbol" w:hint="default"/>
+      </w:rPr>
+    </w:lvl>
+    <w:lvl w:ilvl="7" w:tplc="040C0003" w:tentative="1">
+      <w:start w:val="1"/>
+      <w:numFmt w:val="bullet"/>
+      <w:lvlText w:val="o"/>
+      <w:lvlJc w:val="left"/>
+      <w:pPr>
+        <w:ind w:left="5760" w:hanging="360"/>
+      </w:pPr>
+      <w:rPr>
+        <w:rFonts w:ascii="Courier New" w:hAnsi="Courier New" w:cs="Courier New" w:hint="default"/>
+      </w:rPr>
+    </w:lvl>
+    <w:lvl w:ilvl="8" w:tplc="040C0005" w:tentative="1">
+      <w:start w:val="1"/>
+      <w:numFmt w:val="bullet"/>
+      <w:lvlText w:val=""/>
+      <w:lvlJc w:val="left"/>
+      <w:pPr>
+        <w:ind w:left="6480" w:hanging="360"/>
+      </w:pPr>
+      <w:rPr>
+        <w:rFonts w:ascii="Wingdings" w:hAnsi="Wingdings" w:hint="default"/>
+      </w:rPr>
+    </w:lvl>
+  </w:abstractNum>
+  <w:abstractNum w:abstractNumId="1" w15:restartNumberingAfterBreak="0">
     <w:nsid w:val="04FF5F91"/>
     <w:multiLevelType w:val="hybridMultilevel"/>
     <w:tmpl w:val="42507AA4"/>
@@ -16675,7 +18369,7 @@
       </w:pPr>
     </w:lvl>
   </w:abstractNum>
-  <w:abstractNum w:abstractNumId="1" w15:restartNumberingAfterBreak="0">
+  <w:abstractNum w:abstractNumId="2" w15:restartNumberingAfterBreak="0">
     <w:nsid w:val="051945AE"/>
     <w:multiLevelType w:val="hybridMultilevel"/>
     <w:tmpl w:val="653643A8"/>
@@ -16788,7 +18482,7 @@
       </w:rPr>
     </w:lvl>
   </w:abstractNum>
-  <w:abstractNum w:abstractNumId="2" w15:restartNumberingAfterBreak="0">
+  <w:abstractNum w:abstractNumId="3" w15:restartNumberingAfterBreak="0">
     <w:nsid w:val="089331BD"/>
     <w:multiLevelType w:val="hybridMultilevel"/>
     <w:tmpl w:val="B3706648"/>
@@ -16901,7 +18595,7 @@
       </w:rPr>
     </w:lvl>
   </w:abstractNum>
-  <w:abstractNum w:abstractNumId="3" w15:restartNumberingAfterBreak="0">
+  <w:abstractNum w:abstractNumId="4" w15:restartNumberingAfterBreak="0">
     <w:nsid w:val="08A5551D"/>
     <w:multiLevelType w:val="hybridMultilevel"/>
     <w:tmpl w:val="F084B34A"/>
@@ -17014,7 +18708,7 @@
       </w:rPr>
     </w:lvl>
   </w:abstractNum>
-  <w:abstractNum w:abstractNumId="4" w15:restartNumberingAfterBreak="0">
+  <w:abstractNum w:abstractNumId="5" w15:restartNumberingAfterBreak="0">
     <w:nsid w:val="10E26963"/>
     <w:multiLevelType w:val="hybridMultilevel"/>
     <w:tmpl w:val="A6FCBF36"/>
@@ -17127,7 +18821,7 @@
       </w:rPr>
     </w:lvl>
   </w:abstractNum>
-  <w:abstractNum w:abstractNumId="5" w15:restartNumberingAfterBreak="0">
+  <w:abstractNum w:abstractNumId="6" w15:restartNumberingAfterBreak="0">
     <w:nsid w:val="165D2EC3"/>
     <w:multiLevelType w:val="hybridMultilevel"/>
     <w:tmpl w:val="3490CFEC"/>
@@ -17240,7 +18934,7 @@
       </w:rPr>
     </w:lvl>
   </w:abstractNum>
-  <w:abstractNum w:abstractNumId="6" w15:restartNumberingAfterBreak="0">
+  <w:abstractNum w:abstractNumId="7" w15:restartNumberingAfterBreak="0">
     <w:nsid w:val="19B73A6C"/>
     <w:multiLevelType w:val="hybridMultilevel"/>
     <w:tmpl w:val="0244483A"/>
@@ -17326,7 +19020,7 @@
       </w:pPr>
     </w:lvl>
   </w:abstractNum>
-  <w:abstractNum w:abstractNumId="7" w15:restartNumberingAfterBreak="0">
+  <w:abstractNum w:abstractNumId="8" w15:restartNumberingAfterBreak="0">
     <w:nsid w:val="1A69547A"/>
     <w:multiLevelType w:val="hybridMultilevel"/>
     <w:tmpl w:val="4C00F81E"/>
@@ -17439,7 +19133,7 @@
       </w:rPr>
     </w:lvl>
   </w:abstractNum>
-  <w:abstractNum w:abstractNumId="8" w15:restartNumberingAfterBreak="0">
+  <w:abstractNum w:abstractNumId="9" w15:restartNumberingAfterBreak="0">
     <w:nsid w:val="2DE869EE"/>
     <w:multiLevelType w:val="hybridMultilevel"/>
     <w:tmpl w:val="4E94F688"/>
@@ -17525,7 +19219,7 @@
       </w:pPr>
     </w:lvl>
   </w:abstractNum>
-  <w:abstractNum w:abstractNumId="9" w15:restartNumberingAfterBreak="0">
+  <w:abstractNum w:abstractNumId="10" w15:restartNumberingAfterBreak="0">
     <w:nsid w:val="32BC2236"/>
     <w:multiLevelType w:val="hybridMultilevel"/>
     <w:tmpl w:val="30F47246"/>
@@ -17611,7 +19305,7 @@
       </w:pPr>
     </w:lvl>
   </w:abstractNum>
-  <w:abstractNum w:abstractNumId="10" w15:restartNumberingAfterBreak="0">
+  <w:abstractNum w:abstractNumId="11" w15:restartNumberingAfterBreak="0">
     <w:nsid w:val="414D6B93"/>
     <w:multiLevelType w:val="hybridMultilevel"/>
     <w:tmpl w:val="5B4875DE"/>
@@ -17724,7 +19418,7 @@
       </w:rPr>
     </w:lvl>
   </w:abstractNum>
-  <w:abstractNum w:abstractNumId="11" w15:restartNumberingAfterBreak="0">
+  <w:abstractNum w:abstractNumId="12" w15:restartNumberingAfterBreak="0">
     <w:nsid w:val="41B57D60"/>
     <w:multiLevelType w:val="hybridMultilevel"/>
     <w:tmpl w:val="210405A2"/>
@@ -17837,7 +19531,7 @@
       </w:rPr>
     </w:lvl>
   </w:abstractNum>
-  <w:abstractNum w:abstractNumId="12" w15:restartNumberingAfterBreak="0">
+  <w:abstractNum w:abstractNumId="13" w15:restartNumberingAfterBreak="0">
     <w:nsid w:val="4845549C"/>
     <w:multiLevelType w:val="hybridMultilevel"/>
     <w:tmpl w:val="81762F32"/>
@@ -17950,7 +19644,7 @@
       </w:rPr>
     </w:lvl>
   </w:abstractNum>
-  <w:abstractNum w:abstractNumId="13" w15:restartNumberingAfterBreak="0">
+  <w:abstractNum w:abstractNumId="14" w15:restartNumberingAfterBreak="0">
     <w:nsid w:val="5CE201C5"/>
     <w:multiLevelType w:val="hybridMultilevel"/>
     <w:tmpl w:val="849848D8"/>
@@ -18039,7 +19733,7 @@
       </w:pPr>
     </w:lvl>
   </w:abstractNum>
-  <w:abstractNum w:abstractNumId="14" w15:restartNumberingAfterBreak="0">
+  <w:abstractNum w:abstractNumId="15" w15:restartNumberingAfterBreak="0">
     <w:nsid w:val="5DF708BE"/>
     <w:multiLevelType w:val="hybridMultilevel"/>
     <w:tmpl w:val="2AF0B416"/>
@@ -18152,7 +19846,7 @@
       </w:rPr>
     </w:lvl>
   </w:abstractNum>
-  <w:abstractNum w:abstractNumId="15" w15:restartNumberingAfterBreak="0">
+  <w:abstractNum w:abstractNumId="16" w15:restartNumberingAfterBreak="0">
     <w:nsid w:val="5E0B23B2"/>
     <w:multiLevelType w:val="hybridMultilevel"/>
     <w:tmpl w:val="42507AA4"/>
@@ -18238,7 +19932,7 @@
       </w:pPr>
     </w:lvl>
   </w:abstractNum>
-  <w:abstractNum w:abstractNumId="16" w15:restartNumberingAfterBreak="0">
+  <w:abstractNum w:abstractNumId="17" w15:restartNumberingAfterBreak="0">
     <w:nsid w:val="63545749"/>
     <w:multiLevelType w:val="hybridMultilevel"/>
     <w:tmpl w:val="9B06C7DC"/>
@@ -18351,7 +20045,7 @@
       </w:rPr>
     </w:lvl>
   </w:abstractNum>
-  <w:abstractNum w:abstractNumId="17" w15:restartNumberingAfterBreak="0">
+  <w:abstractNum w:abstractNumId="18" w15:restartNumberingAfterBreak="0">
     <w:nsid w:val="65390315"/>
     <w:multiLevelType w:val="hybridMultilevel"/>
     <w:tmpl w:val="ED686912"/>
@@ -18464,7 +20158,7 @@
       </w:rPr>
     </w:lvl>
   </w:abstractNum>
-  <w:abstractNum w:abstractNumId="18" w15:restartNumberingAfterBreak="0">
+  <w:abstractNum w:abstractNumId="19" w15:restartNumberingAfterBreak="0">
     <w:nsid w:val="6F710360"/>
     <w:multiLevelType w:val="hybridMultilevel"/>
     <w:tmpl w:val="66BCC23A"/>
@@ -18577,7 +20271,7 @@
       </w:rPr>
     </w:lvl>
   </w:abstractNum>
-  <w:abstractNum w:abstractNumId="19" w15:restartNumberingAfterBreak="0">
+  <w:abstractNum w:abstractNumId="20" w15:restartNumberingAfterBreak="0">
     <w:nsid w:val="7EC51315"/>
     <w:multiLevelType w:val="hybridMultilevel"/>
     <w:tmpl w:val="7952CE38"/>
@@ -18667,64 +20361,67 @@
     </w:lvl>
   </w:abstractNum>
   <w:num w:numId="1">
+    <w:abstractNumId w:val="4"/>
+  </w:num>
+  <w:num w:numId="2">
+    <w:abstractNumId w:val="10"/>
+  </w:num>
+  <w:num w:numId="3">
+    <w:abstractNumId w:val="9"/>
+  </w:num>
+  <w:num w:numId="4">
+    <w:abstractNumId w:val="20"/>
+  </w:num>
+  <w:num w:numId="5">
+    <w:abstractNumId w:val="7"/>
+  </w:num>
+  <w:num w:numId="6">
+    <w:abstractNumId w:val="16"/>
+  </w:num>
+  <w:num w:numId="7">
+    <w:abstractNumId w:val="1"/>
+  </w:num>
+  <w:num w:numId="8">
+    <w:abstractNumId w:val="2"/>
+  </w:num>
+  <w:num w:numId="9">
+    <w:abstractNumId w:val="14"/>
+  </w:num>
+  <w:num w:numId="10">
+    <w:abstractNumId w:val="5"/>
+  </w:num>
+  <w:num w:numId="11">
+    <w:abstractNumId w:val="13"/>
+  </w:num>
+  <w:num w:numId="12">
     <w:abstractNumId w:val="3"/>
   </w:num>
-  <w:num w:numId="2">
-    <w:abstractNumId w:val="9"/>
+  <w:num w:numId="13">
+    <w:abstractNumId w:val="6"/>
   </w:num>
-  <w:num w:numId="3">
+  <w:num w:numId="14">
+    <w:abstractNumId w:val="11"/>
+  </w:num>
+  <w:num w:numId="15">
+    <w:abstractNumId w:val="12"/>
+  </w:num>
+  <w:num w:numId="16">
+    <w:abstractNumId w:val="19"/>
+  </w:num>
+  <w:num w:numId="17">
+    <w:abstractNumId w:val="15"/>
+  </w:num>
+  <w:num w:numId="18">
     <w:abstractNumId w:val="8"/>
   </w:num>
-  <w:num w:numId="4">
-    <w:abstractNumId w:val="19"/>
-  </w:num>
-  <w:num w:numId="5">
-    <w:abstractNumId w:val="6"/>
-  </w:num>
-  <w:num w:numId="6">
-    <w:abstractNumId w:val="15"/>
-  </w:num>
-  <w:num w:numId="7">
-    <w:abstractNumId w:val="0"/>
-  </w:num>
-  <w:num w:numId="8">
-    <w:abstractNumId w:val="1"/>
-  </w:num>
-  <w:num w:numId="9">
-    <w:abstractNumId w:val="13"/>
-  </w:num>
-  <w:num w:numId="10">
-    <w:abstractNumId w:val="4"/>
-  </w:num>
-  <w:num w:numId="11">
-    <w:abstractNumId w:val="12"/>
-  </w:num>
-  <w:num w:numId="12">
-    <w:abstractNumId w:val="2"/>
-  </w:num>
-  <w:num w:numId="13">
-    <w:abstractNumId w:val="5"/>
-  </w:num>
-  <w:num w:numId="14">
-    <w:abstractNumId w:val="10"/>
-  </w:num>
-  <w:num w:numId="15">
-    <w:abstractNumId w:val="11"/>
-  </w:num>
-  <w:num w:numId="16">
+  <w:num w:numId="19">
     <w:abstractNumId w:val="18"/>
   </w:num>
-  <w:num w:numId="17">
-    <w:abstractNumId w:val="14"/>
-  </w:num>
-  <w:num w:numId="18">
-    <w:abstractNumId w:val="7"/>
-  </w:num>
-  <w:num w:numId="19">
+  <w:num w:numId="20">
     <w:abstractNumId w:val="17"/>
   </w:num>
-  <w:num w:numId="20">
-    <w:abstractNumId w:val="16"/>
+  <w:num w:numId="21">
+    <w:abstractNumId w:val="0"/>
   </w:num>
 </w:numbering>
 </file>
@@ -19127,7 +20824,7 @@
   <w:style w:type="paragraph" w:default="1" w:styleId="Normal">
     <w:name w:val="Normal"/>
     <w:qFormat/>
-    <w:rsid w:val="00B7184A"/>
+    <w:rsid w:val="003D7140"/>
   </w:style>
   <w:style w:type="paragraph" w:styleId="Titre1">
     <w:name w:val="heading 1"/>

</xml_diff>

<commit_message>
Partie 8  Prompe C
</commit_message>
<xml_diff>
--- a/ai-business_assistant.docx
+++ b/ai-business_assistant.docx
@@ -18102,6 +18102,1076 @@
     </w:p>
     <w:p>
       <w:pPr>
+        <w:pStyle w:val="Titre2"/>
+        <w:rPr>
+          <w:color w:val="000000" w:themeColor="text1"/>
+          <w:sz w:val="28"/>
+          <w:szCs w:val="28"/>
+        </w:rPr>
+      </w:pPr>
+      <w:r>
+        <w:rPr>
+          <w:color w:val="000000" w:themeColor="text1"/>
+          <w:sz w:val="28"/>
+          <w:szCs w:val="28"/>
+        </w:rPr>
+        <w:t xml:space="preserve">Prompt C avec composants de </w:t>
+      </w:r>
+      <w:r>
+        <w:rPr>
+          <w:color w:val="000000" w:themeColor="text1"/>
+          <w:sz w:val="28"/>
+          <w:szCs w:val="28"/>
+        </w:rPr>
+        <w:t>prompts complets</w:t>
+      </w:r>
+    </w:p>
+    <w:p>
+      <w:pPr>
+        <w:pStyle w:val="PrformatHTML"/>
+        <w:rPr>
+          <w:rStyle w:val="CodeHTML"/>
+          <w:rFonts w:ascii="Times New Roman" w:hAnsi="Times New Roman" w:cs="Times New Roman"/>
+          <w:color w:val="000000" w:themeColor="text1"/>
+          <w:sz w:val="24"/>
+          <w:szCs w:val="24"/>
+        </w:rPr>
+      </w:pPr>
+      <w:r>
+        <w:rPr>
+          <w:rStyle w:val="CodeHTML"/>
+          <w:rFonts w:ascii="Times New Roman" w:hAnsi="Times New Roman" w:cs="Times New Roman"/>
+          <w:b/>
+          <w:bCs/>
+          <w:color w:val="000000" w:themeColor="text1"/>
+          <w:sz w:val="24"/>
+          <w:szCs w:val="24"/>
+        </w:rPr>
+        <w:t>Rôle</w:t>
+      </w:r>
+      <w:r>
+        <w:rPr>
+          <w:rStyle w:val="CodeHTML"/>
+          <w:rFonts w:ascii="Times New Roman" w:hAnsi="Times New Roman" w:cs="Times New Roman"/>
+          <w:color w:val="000000" w:themeColor="text1"/>
+          <w:sz w:val="24"/>
+          <w:szCs w:val="24"/>
+        </w:rPr>
+        <w:t xml:space="preserve"> : </w:t>
+      </w:r>
+      <w:r>
+        <w:rPr>
+          <w:rStyle w:val="CodeHTML"/>
+          <w:rFonts w:ascii="Times New Roman" w:hAnsi="Times New Roman" w:cs="Times New Roman"/>
+          <w:color w:val="000000" w:themeColor="text1"/>
+          <w:sz w:val="24"/>
+          <w:szCs w:val="24"/>
+        </w:rPr>
+        <w:t>Tu es un assistant de synthèse spécialisé dans la vulgarisation de documents</w:t>
+      </w:r>
+      <w:r>
+        <w:rPr>
+          <w:rStyle w:val="CodeHTML"/>
+          <w:rFonts w:ascii="Times New Roman" w:hAnsi="Times New Roman" w:cs="Times New Roman"/>
+          <w:color w:val="000000" w:themeColor="text1"/>
+          <w:sz w:val="24"/>
+          <w:szCs w:val="24"/>
+        </w:rPr>
+        <w:t xml:space="preserve"> </w:t>
+      </w:r>
+      <w:r>
+        <w:rPr>
+          <w:rStyle w:val="CodeHTML"/>
+          <w:rFonts w:ascii="Times New Roman" w:hAnsi="Times New Roman" w:cs="Times New Roman"/>
+          <w:color w:val="000000" w:themeColor="text1"/>
+          <w:sz w:val="24"/>
+          <w:szCs w:val="24"/>
+        </w:rPr>
+        <w:t>professionnels.</w:t>
+      </w:r>
+    </w:p>
+    <w:p>
+      <w:pPr>
+        <w:pStyle w:val="PrformatHTML"/>
+        <w:rPr>
+          <w:rStyle w:val="CodeHTML"/>
+          <w:rFonts w:ascii="Times New Roman" w:hAnsi="Times New Roman" w:cs="Times New Roman"/>
+          <w:color w:val="000000" w:themeColor="text1"/>
+          <w:sz w:val="24"/>
+          <w:szCs w:val="24"/>
+        </w:rPr>
+      </w:pPr>
+    </w:p>
+    <w:p>
+      <w:pPr>
+        <w:pStyle w:val="PrformatHTML"/>
+        <w:rPr>
+          <w:rStyle w:val="CodeHTML"/>
+          <w:rFonts w:ascii="Times New Roman" w:hAnsi="Times New Roman" w:cs="Times New Roman"/>
+          <w:color w:val="000000" w:themeColor="text1"/>
+          <w:sz w:val="24"/>
+          <w:szCs w:val="24"/>
+        </w:rPr>
+      </w:pPr>
+      <w:r>
+        <w:rPr>
+          <w:rStyle w:val="CodeHTML"/>
+          <w:rFonts w:ascii="Times New Roman" w:hAnsi="Times New Roman" w:cs="Times New Roman"/>
+          <w:b/>
+          <w:bCs/>
+          <w:color w:val="000000" w:themeColor="text1"/>
+          <w:sz w:val="24"/>
+          <w:szCs w:val="24"/>
+        </w:rPr>
+        <w:t>Contexte</w:t>
+      </w:r>
+      <w:r>
+        <w:rPr>
+          <w:rStyle w:val="CodeHTML"/>
+          <w:rFonts w:ascii="Times New Roman" w:hAnsi="Times New Roman" w:cs="Times New Roman"/>
+          <w:color w:val="000000" w:themeColor="text1"/>
+          <w:sz w:val="24"/>
+          <w:szCs w:val="24"/>
+        </w:rPr>
+        <w:t xml:space="preserve"> : Ce résumé sera lu par des décideurs pressés, qui doivent comprendre</w:t>
+      </w:r>
+      <w:r>
+        <w:rPr>
+          <w:rStyle w:val="CodeHTML"/>
+          <w:rFonts w:ascii="Times New Roman" w:hAnsi="Times New Roman" w:cs="Times New Roman"/>
+          <w:color w:val="000000" w:themeColor="text1"/>
+          <w:sz w:val="24"/>
+          <w:szCs w:val="24"/>
+        </w:rPr>
+        <w:t xml:space="preserve"> </w:t>
+      </w:r>
+      <w:r>
+        <w:rPr>
+          <w:rStyle w:val="CodeHTML"/>
+          <w:rFonts w:ascii="Times New Roman" w:hAnsi="Times New Roman" w:cs="Times New Roman"/>
+          <w:color w:val="000000" w:themeColor="text1"/>
+          <w:sz w:val="24"/>
+          <w:szCs w:val="24"/>
+        </w:rPr>
+        <w:t>l'essentiel du document en moins d'une minute.</w:t>
+      </w:r>
+    </w:p>
+    <w:p>
+      <w:pPr>
+        <w:pStyle w:val="PrformatHTML"/>
+        <w:rPr>
+          <w:rStyle w:val="CodeHTML"/>
+          <w:rFonts w:ascii="Times New Roman" w:hAnsi="Times New Roman" w:cs="Times New Roman"/>
+          <w:color w:val="000000" w:themeColor="text1"/>
+          <w:sz w:val="24"/>
+          <w:szCs w:val="24"/>
+        </w:rPr>
+      </w:pPr>
+    </w:p>
+    <w:p>
+      <w:pPr>
+        <w:pStyle w:val="PrformatHTML"/>
+        <w:rPr>
+          <w:rStyle w:val="CodeHTML"/>
+          <w:rFonts w:ascii="Times New Roman" w:hAnsi="Times New Roman" w:cs="Times New Roman"/>
+          <w:color w:val="000000" w:themeColor="text1"/>
+          <w:sz w:val="24"/>
+          <w:szCs w:val="24"/>
+        </w:rPr>
+      </w:pPr>
+      <w:r>
+        <w:rPr>
+          <w:rStyle w:val="CodeHTML"/>
+          <w:rFonts w:ascii="Times New Roman" w:hAnsi="Times New Roman" w:cs="Times New Roman"/>
+          <w:b/>
+          <w:bCs/>
+          <w:color w:val="000000" w:themeColor="text1"/>
+          <w:sz w:val="24"/>
+          <w:szCs w:val="24"/>
+        </w:rPr>
+        <w:t>Tâche</w:t>
+      </w:r>
+      <w:r>
+        <w:rPr>
+          <w:rStyle w:val="CodeHTML"/>
+          <w:rFonts w:ascii="Times New Roman" w:hAnsi="Times New Roman" w:cs="Times New Roman"/>
+          <w:color w:val="000000" w:themeColor="text1"/>
+          <w:sz w:val="24"/>
+          <w:szCs w:val="24"/>
+        </w:rPr>
+        <w:t xml:space="preserve"> : Résume le texte ci-dessous.</w:t>
+      </w:r>
+    </w:p>
+    <w:p>
+      <w:pPr>
+        <w:pStyle w:val="PrformatHTML"/>
+        <w:rPr>
+          <w:rStyle w:val="CodeHTML"/>
+          <w:rFonts w:ascii="Times New Roman" w:hAnsi="Times New Roman" w:cs="Times New Roman"/>
+          <w:color w:val="000000" w:themeColor="text1"/>
+          <w:sz w:val="24"/>
+          <w:szCs w:val="24"/>
+        </w:rPr>
+      </w:pPr>
+    </w:p>
+    <w:p>
+      <w:pPr>
+        <w:pStyle w:val="PrformatHTML"/>
+        <w:rPr>
+          <w:rStyle w:val="CodeHTML"/>
+          <w:rFonts w:ascii="Times New Roman" w:hAnsi="Times New Roman" w:cs="Times New Roman"/>
+          <w:color w:val="000000" w:themeColor="text1"/>
+          <w:sz w:val="24"/>
+          <w:szCs w:val="24"/>
+        </w:rPr>
+      </w:pPr>
+      <w:r>
+        <w:rPr>
+          <w:rStyle w:val="CodeHTML"/>
+          <w:rFonts w:ascii="Times New Roman" w:hAnsi="Times New Roman" w:cs="Times New Roman"/>
+          <w:b/>
+          <w:bCs/>
+          <w:color w:val="000000" w:themeColor="text1"/>
+          <w:sz w:val="24"/>
+          <w:szCs w:val="24"/>
+        </w:rPr>
+        <w:t>Contraintes</w:t>
+      </w:r>
+      <w:r>
+        <w:rPr>
+          <w:rStyle w:val="CodeHTML"/>
+          <w:rFonts w:ascii="Times New Roman" w:hAnsi="Times New Roman" w:cs="Times New Roman"/>
+          <w:color w:val="000000" w:themeColor="text1"/>
+          <w:sz w:val="24"/>
+          <w:szCs w:val="24"/>
+        </w:rPr>
+        <w:t xml:space="preserve"> :</w:t>
+      </w:r>
+    </w:p>
+    <w:p>
+      <w:pPr>
+        <w:pStyle w:val="PrformatHTML"/>
+        <w:numPr>
+          <w:ilvl w:val="0"/>
+          <w:numId w:val="21"/>
+        </w:numPr>
+        <w:rPr>
+          <w:rStyle w:val="CodeHTML"/>
+          <w:rFonts w:ascii="Times New Roman" w:hAnsi="Times New Roman" w:cs="Times New Roman"/>
+          <w:color w:val="000000" w:themeColor="text1"/>
+          <w:sz w:val="24"/>
+          <w:szCs w:val="24"/>
+        </w:rPr>
+      </w:pPr>
+      <w:r>
+        <w:rPr>
+          <w:rStyle w:val="CodeHTML"/>
+          <w:rFonts w:ascii="Times New Roman" w:hAnsi="Times New Roman" w:cs="Times New Roman"/>
+          <w:color w:val="000000" w:themeColor="text1"/>
+          <w:sz w:val="24"/>
+          <w:szCs w:val="24"/>
+        </w:rPr>
+        <w:t>Longueur : 150 mots maximum.</w:t>
+      </w:r>
+    </w:p>
+    <w:p>
+      <w:pPr>
+        <w:pStyle w:val="PrformatHTML"/>
+        <w:numPr>
+          <w:ilvl w:val="0"/>
+          <w:numId w:val="21"/>
+        </w:numPr>
+        <w:rPr>
+          <w:rStyle w:val="CodeHTML"/>
+          <w:rFonts w:ascii="Times New Roman" w:hAnsi="Times New Roman" w:cs="Times New Roman"/>
+          <w:color w:val="000000" w:themeColor="text1"/>
+          <w:sz w:val="24"/>
+          <w:szCs w:val="24"/>
+        </w:rPr>
+      </w:pPr>
+      <w:r>
+        <w:rPr>
+          <w:rStyle w:val="CodeHTML"/>
+          <w:rFonts w:ascii="Times New Roman" w:hAnsi="Times New Roman" w:cs="Times New Roman"/>
+          <w:color w:val="000000" w:themeColor="text1"/>
+          <w:sz w:val="24"/>
+          <w:szCs w:val="24"/>
+        </w:rPr>
+        <w:t>Conserve uniquement les informations factuelles présentes dans le texte.</w:t>
+      </w:r>
+    </w:p>
+    <w:p>
+      <w:pPr>
+        <w:pStyle w:val="PrformatHTML"/>
+        <w:numPr>
+          <w:ilvl w:val="0"/>
+          <w:numId w:val="21"/>
+        </w:numPr>
+        <w:rPr>
+          <w:rStyle w:val="CodeHTML"/>
+          <w:rFonts w:ascii="Times New Roman" w:hAnsi="Times New Roman" w:cs="Times New Roman"/>
+          <w:color w:val="000000" w:themeColor="text1"/>
+          <w:sz w:val="24"/>
+          <w:szCs w:val="24"/>
+        </w:rPr>
+      </w:pPr>
+      <w:r>
+        <w:rPr>
+          <w:rStyle w:val="CodeHTML"/>
+          <w:rFonts w:ascii="Times New Roman" w:hAnsi="Times New Roman" w:cs="Times New Roman"/>
+          <w:color w:val="000000" w:themeColor="text1"/>
+          <w:sz w:val="24"/>
+          <w:szCs w:val="24"/>
+        </w:rPr>
+        <w:t>Structure le résumé en 3 parties : contexte, points clés, implication/conclusion.</w:t>
+      </w:r>
+    </w:p>
+    <w:p>
+      <w:pPr>
+        <w:pStyle w:val="PrformatHTML"/>
+        <w:numPr>
+          <w:ilvl w:val="0"/>
+          <w:numId w:val="21"/>
+        </w:numPr>
+        <w:rPr>
+          <w:rStyle w:val="CodeHTML"/>
+          <w:rFonts w:ascii="Times New Roman" w:hAnsi="Times New Roman" w:cs="Times New Roman"/>
+          <w:color w:val="000000" w:themeColor="text1"/>
+          <w:sz w:val="24"/>
+          <w:szCs w:val="24"/>
+        </w:rPr>
+      </w:pPr>
+      <w:r>
+        <w:rPr>
+          <w:rStyle w:val="CodeHTML"/>
+          <w:rFonts w:ascii="Times New Roman" w:hAnsi="Times New Roman" w:cs="Times New Roman"/>
+          <w:color w:val="000000" w:themeColor="text1"/>
+          <w:sz w:val="24"/>
+          <w:szCs w:val="24"/>
+        </w:rPr>
+        <w:t>N'invente aucune information absente du texte.</w:t>
+      </w:r>
+    </w:p>
+    <w:p>
+      <w:pPr>
+        <w:pStyle w:val="PrformatHTML"/>
+        <w:numPr>
+          <w:ilvl w:val="0"/>
+          <w:numId w:val="21"/>
+        </w:numPr>
+        <w:rPr>
+          <w:rStyle w:val="CodeHTML"/>
+          <w:rFonts w:ascii="Times New Roman" w:hAnsi="Times New Roman" w:cs="Times New Roman"/>
+          <w:color w:val="000000" w:themeColor="text1"/>
+          <w:sz w:val="24"/>
+          <w:szCs w:val="24"/>
+        </w:rPr>
+      </w:pPr>
+      <w:r>
+        <w:rPr>
+          <w:rStyle w:val="CodeHTML"/>
+          <w:rFonts w:ascii="Times New Roman" w:hAnsi="Times New Roman" w:cs="Times New Roman"/>
+          <w:color w:val="000000" w:themeColor="text1"/>
+          <w:sz w:val="24"/>
+          <w:szCs w:val="24"/>
+        </w:rPr>
+        <w:t>Utilise un langage clair, sans jargon inutile.</w:t>
+      </w:r>
+    </w:p>
+    <w:p>
+      <w:pPr>
+        <w:pStyle w:val="PrformatHTML"/>
+        <w:rPr>
+          <w:rStyle w:val="CodeHTML"/>
+          <w:rFonts w:ascii="Times New Roman" w:hAnsi="Times New Roman" w:cs="Times New Roman"/>
+          <w:color w:val="000000" w:themeColor="text1"/>
+          <w:sz w:val="24"/>
+          <w:szCs w:val="24"/>
+        </w:rPr>
+      </w:pPr>
+    </w:p>
+    <w:p>
+      <w:pPr>
+        <w:pStyle w:val="PrformatHTML"/>
+        <w:rPr>
+          <w:rStyle w:val="CodeHTML"/>
+          <w:rFonts w:ascii="Times New Roman" w:hAnsi="Times New Roman" w:cs="Times New Roman"/>
+          <w:color w:val="000000" w:themeColor="text1"/>
+          <w:sz w:val="24"/>
+          <w:szCs w:val="24"/>
+        </w:rPr>
+      </w:pPr>
+      <w:r>
+        <w:rPr>
+          <w:rStyle w:val="CodeHTML"/>
+          <w:rFonts w:ascii="Times New Roman" w:hAnsi="Times New Roman" w:cs="Times New Roman"/>
+          <w:color w:val="000000" w:themeColor="text1"/>
+          <w:sz w:val="24"/>
+          <w:szCs w:val="24"/>
+        </w:rPr>
+        <w:t>Texte :</w:t>
+      </w:r>
+    </w:p>
+    <w:p>
+      <w:pPr>
+        <w:pStyle w:val="PrformatHTML"/>
+        <w:rPr>
+          <w:rStyle w:val="CodeHTML"/>
+          <w:rFonts w:ascii="Times New Roman" w:hAnsi="Times New Roman" w:cs="Times New Roman"/>
+          <w:color w:val="000000" w:themeColor="text1"/>
+          <w:sz w:val="24"/>
+          <w:szCs w:val="24"/>
+        </w:rPr>
+      </w:pPr>
+      <w:r>
+        <w:rPr>
+          <w:rStyle w:val="CodeHTML"/>
+          <w:rFonts w:ascii="Times New Roman" w:hAnsi="Times New Roman" w:cs="Times New Roman"/>
+          <w:color w:val="000000" w:themeColor="text1"/>
+          <w:sz w:val="24"/>
+          <w:szCs w:val="24"/>
+        </w:rPr>
+        <w:t>"""</w:t>
+      </w:r>
+    </w:p>
+    <w:p>
+      <w:pPr>
+        <w:autoSpaceDE w:val="0"/>
+        <w:autoSpaceDN w:val="0"/>
+        <w:adjustRightInd w:val="0"/>
+        <w:spacing w:after="0" w:line="240" w:lineRule="auto"/>
+        <w:rPr>
+          <w:rFonts w:ascii="TimesNewRomanPSMT" w:hAnsi="TimesNewRomanPSMT" w:cs="TimesNewRomanPSMT"/>
+          <w:color w:val="000000"/>
+          <w:sz w:val="24"/>
+          <w:szCs w:val="24"/>
+        </w:rPr>
+      </w:pPr>
+      <w:r>
+        <w:rPr>
+          <w:rFonts w:ascii="TimesNewRomanPSMT" w:hAnsi="TimesNewRomanPSMT" w:cs="TimesNewRomanPSMT"/>
+          <w:color w:val="000000"/>
+          <w:sz w:val="24"/>
+          <w:szCs w:val="24"/>
+        </w:rPr>
+        <w:t>L'objectif de cette recherche est de construire un système qui automatise l'analyse</w:t>
+      </w:r>
+    </w:p>
+    <w:p>
+      <w:pPr>
+        <w:autoSpaceDE w:val="0"/>
+        <w:autoSpaceDN w:val="0"/>
+        <w:adjustRightInd w:val="0"/>
+        <w:spacing w:after="0" w:line="240" w:lineRule="auto"/>
+        <w:rPr>
+          <w:rFonts w:ascii="TimesNewRomanPSMT" w:hAnsi="TimesNewRomanPSMT" w:cs="TimesNewRomanPSMT"/>
+          <w:color w:val="000000"/>
+          <w:sz w:val="24"/>
+          <w:szCs w:val="24"/>
+        </w:rPr>
+      </w:pPr>
+      <w:proofErr w:type="gramStart"/>
+      <w:r>
+        <w:rPr>
+          <w:rFonts w:ascii="TimesNewRomanPSMT" w:hAnsi="TimesNewRomanPSMT" w:cs="TimesNewRomanPSMT"/>
+          <w:color w:val="000000"/>
+          <w:sz w:val="24"/>
+          <w:szCs w:val="24"/>
+        </w:rPr>
+        <w:t>des</w:t>
+      </w:r>
+      <w:proofErr w:type="gramEnd"/>
+      <w:r>
+        <w:rPr>
+          <w:rFonts w:ascii="TimesNewRomanPSMT" w:hAnsi="TimesNewRomanPSMT" w:cs="TimesNewRomanPSMT"/>
+          <w:color w:val="000000"/>
+          <w:sz w:val="24"/>
+          <w:szCs w:val="24"/>
+        </w:rPr>
+        <w:t xml:space="preserve"> informations contenues dans les images et plus spécifiquement pour réaliser la tâche</w:t>
+      </w:r>
+    </w:p>
+    <w:p>
+      <w:pPr>
+        <w:autoSpaceDE w:val="0"/>
+        <w:autoSpaceDN w:val="0"/>
+        <w:adjustRightInd w:val="0"/>
+        <w:spacing w:after="0" w:line="240" w:lineRule="auto"/>
+        <w:rPr>
+          <w:rFonts w:ascii="TimesNewRomanPSMT" w:hAnsi="TimesNewRomanPSMT" w:cs="TimesNewRomanPSMT"/>
+          <w:color w:val="000000"/>
+          <w:sz w:val="24"/>
+          <w:szCs w:val="24"/>
+        </w:rPr>
+      </w:pPr>
+      <w:proofErr w:type="gramStart"/>
+      <w:r>
+        <w:rPr>
+          <w:rFonts w:ascii="TimesNewRomanPSMT" w:hAnsi="TimesNewRomanPSMT" w:cs="TimesNewRomanPSMT"/>
+          <w:color w:val="000000"/>
+          <w:sz w:val="24"/>
+          <w:szCs w:val="24"/>
+        </w:rPr>
+        <w:t>de</w:t>
+      </w:r>
+      <w:proofErr w:type="gramEnd"/>
+      <w:r>
+        <w:rPr>
+          <w:rFonts w:ascii="TimesNewRomanPSMT" w:hAnsi="TimesNewRomanPSMT" w:cs="TimesNewRomanPSMT"/>
+          <w:color w:val="000000"/>
+          <w:sz w:val="24"/>
+          <w:szCs w:val="24"/>
+        </w:rPr>
+        <w:t xml:space="preserve"> détection de visage. Dans ce contexte il est essentiel de disposer d'algorithmes à la fois</w:t>
+      </w:r>
+    </w:p>
+    <w:p>
+      <w:pPr>
+        <w:autoSpaceDE w:val="0"/>
+        <w:autoSpaceDN w:val="0"/>
+        <w:adjustRightInd w:val="0"/>
+        <w:spacing w:after="0" w:line="240" w:lineRule="auto"/>
+        <w:rPr>
+          <w:rFonts w:ascii="TimesNewRomanPSMT" w:hAnsi="TimesNewRomanPSMT" w:cs="TimesNewRomanPSMT"/>
+          <w:color w:val="000000"/>
+          <w:sz w:val="24"/>
+          <w:szCs w:val="24"/>
+        </w:rPr>
+      </w:pPr>
+      <w:proofErr w:type="gramStart"/>
+      <w:r>
+        <w:rPr>
+          <w:rFonts w:ascii="TimesNewRomanPSMT" w:hAnsi="TimesNewRomanPSMT" w:cs="TimesNewRomanPSMT"/>
+          <w:color w:val="000000"/>
+          <w:sz w:val="24"/>
+          <w:szCs w:val="24"/>
+        </w:rPr>
+        <w:t>efficaces</w:t>
+      </w:r>
+      <w:proofErr w:type="gramEnd"/>
+      <w:r>
+        <w:rPr>
+          <w:rFonts w:ascii="TimesNewRomanPSMT" w:hAnsi="TimesNewRomanPSMT" w:cs="TimesNewRomanPSMT"/>
+          <w:color w:val="000000"/>
+          <w:sz w:val="24"/>
+          <w:szCs w:val="24"/>
+        </w:rPr>
+        <w:t xml:space="preserve"> et robustes. En effet, la capacité à détecter avec précision les visages est cruciale</w:t>
+      </w:r>
+    </w:p>
+    <w:p>
+      <w:pPr>
+        <w:autoSpaceDE w:val="0"/>
+        <w:autoSpaceDN w:val="0"/>
+        <w:adjustRightInd w:val="0"/>
+        <w:spacing w:after="0" w:line="240" w:lineRule="auto"/>
+        <w:rPr>
+          <w:rFonts w:ascii="TimesNewRomanPSMT" w:hAnsi="TimesNewRomanPSMT" w:cs="TimesNewRomanPSMT"/>
+          <w:color w:val="000000"/>
+          <w:sz w:val="24"/>
+          <w:szCs w:val="24"/>
+        </w:rPr>
+      </w:pPr>
+      <w:proofErr w:type="gramStart"/>
+      <w:r>
+        <w:rPr>
+          <w:rFonts w:ascii="TimesNewRomanPSMT" w:hAnsi="TimesNewRomanPSMT" w:cs="TimesNewRomanPSMT"/>
+          <w:color w:val="000000"/>
+          <w:sz w:val="24"/>
+          <w:szCs w:val="24"/>
+        </w:rPr>
+        <w:t>dans</w:t>
+      </w:r>
+      <w:proofErr w:type="gramEnd"/>
+      <w:r>
+        <w:rPr>
+          <w:rFonts w:ascii="TimesNewRomanPSMT" w:hAnsi="TimesNewRomanPSMT" w:cs="TimesNewRomanPSMT"/>
+          <w:color w:val="000000"/>
+          <w:sz w:val="24"/>
+          <w:szCs w:val="24"/>
+        </w:rPr>
+        <w:t xml:space="preserve"> diverses applications. En réalité, l'importance de la détection des visages ne peut être</w:t>
+      </w:r>
+    </w:p>
+    <w:p>
+      <w:pPr>
+        <w:autoSpaceDE w:val="0"/>
+        <w:autoSpaceDN w:val="0"/>
+        <w:adjustRightInd w:val="0"/>
+        <w:spacing w:after="0" w:line="240" w:lineRule="auto"/>
+        <w:rPr>
+          <w:rFonts w:ascii="TimesNewRomanPSMT" w:hAnsi="TimesNewRomanPSMT" w:cs="TimesNewRomanPSMT"/>
+          <w:color w:val="000000"/>
+          <w:sz w:val="24"/>
+          <w:szCs w:val="24"/>
+        </w:rPr>
+      </w:pPr>
+      <w:proofErr w:type="gramStart"/>
+      <w:r>
+        <w:rPr>
+          <w:rFonts w:ascii="TimesNewRomanPSMT" w:hAnsi="TimesNewRomanPSMT" w:cs="TimesNewRomanPSMT"/>
+          <w:color w:val="000000"/>
+          <w:sz w:val="24"/>
+          <w:szCs w:val="24"/>
+        </w:rPr>
+        <w:t>surestimée</w:t>
+      </w:r>
+      <w:proofErr w:type="gramEnd"/>
+      <w:r>
+        <w:rPr>
+          <w:rFonts w:ascii="TimesNewRomanPSMT" w:hAnsi="TimesNewRomanPSMT" w:cs="TimesNewRomanPSMT"/>
+          <w:color w:val="000000"/>
+          <w:sz w:val="24"/>
+          <w:szCs w:val="24"/>
+        </w:rPr>
+        <w:t xml:space="preserve"> lorsqu'il s'agit de tout système impliquant l'analyse des visages. L'objectif est</w:t>
+      </w:r>
+    </w:p>
+    <w:p>
+      <w:pPr>
+        <w:autoSpaceDE w:val="0"/>
+        <w:autoSpaceDN w:val="0"/>
+        <w:adjustRightInd w:val="0"/>
+        <w:spacing w:after="0" w:line="240" w:lineRule="auto"/>
+        <w:rPr>
+          <w:rFonts w:ascii="TimesNewRomanPSMT" w:hAnsi="TimesNewRomanPSMT" w:cs="TimesNewRomanPSMT"/>
+          <w:color w:val="000000"/>
+          <w:sz w:val="24"/>
+          <w:szCs w:val="24"/>
+        </w:rPr>
+      </w:pPr>
+      <w:proofErr w:type="gramStart"/>
+      <w:r>
+        <w:rPr>
+          <w:rFonts w:ascii="TimesNewRomanPSMT" w:hAnsi="TimesNewRomanPSMT" w:cs="TimesNewRomanPSMT"/>
+          <w:color w:val="000000"/>
+          <w:sz w:val="24"/>
+          <w:szCs w:val="24"/>
+        </w:rPr>
+        <w:t>de</w:t>
+      </w:r>
+      <w:proofErr w:type="gramEnd"/>
+      <w:r>
+        <w:rPr>
+          <w:rFonts w:ascii="TimesNewRomanPSMT" w:hAnsi="TimesNewRomanPSMT" w:cs="TimesNewRomanPSMT"/>
+          <w:color w:val="000000"/>
+          <w:sz w:val="24"/>
+          <w:szCs w:val="24"/>
+        </w:rPr>
+        <w:t xml:space="preserve"> détecter toutes les zones d'une image qui représentent un visage, sans tenir compte de</w:t>
+      </w:r>
+    </w:p>
+    <w:p>
+      <w:pPr>
+        <w:autoSpaceDE w:val="0"/>
+        <w:autoSpaceDN w:val="0"/>
+        <w:adjustRightInd w:val="0"/>
+        <w:spacing w:after="0" w:line="240" w:lineRule="auto"/>
+        <w:rPr>
+          <w:rFonts w:ascii="TimesNewRomanPSMT" w:hAnsi="TimesNewRomanPSMT" w:cs="TimesNewRomanPSMT"/>
+          <w:color w:val="000000"/>
+          <w:sz w:val="24"/>
+          <w:szCs w:val="24"/>
+        </w:rPr>
+      </w:pPr>
+      <w:proofErr w:type="gramStart"/>
+      <w:r>
+        <w:rPr>
+          <w:rFonts w:ascii="TimesNewRomanPSMT" w:hAnsi="TimesNewRomanPSMT" w:cs="TimesNewRomanPSMT"/>
+          <w:color w:val="000000"/>
+          <w:sz w:val="24"/>
+          <w:szCs w:val="24"/>
+        </w:rPr>
+        <w:t>leur</w:t>
+      </w:r>
+      <w:proofErr w:type="gramEnd"/>
+      <w:r>
+        <w:rPr>
+          <w:rFonts w:ascii="TimesNewRomanPSMT" w:hAnsi="TimesNewRomanPSMT" w:cs="TimesNewRomanPSMT"/>
+          <w:color w:val="000000"/>
+          <w:sz w:val="24"/>
+          <w:szCs w:val="24"/>
+        </w:rPr>
+        <w:t xml:space="preserve"> emplacement. Pour mieux comprendre les effets de la position, de l'orientation et de</w:t>
+      </w:r>
+    </w:p>
+    <w:p>
+      <w:pPr>
+        <w:autoSpaceDE w:val="0"/>
+        <w:autoSpaceDN w:val="0"/>
+        <w:adjustRightInd w:val="0"/>
+        <w:spacing w:after="0" w:line="240" w:lineRule="auto"/>
+        <w:rPr>
+          <w:rFonts w:ascii="TimesNewRomanPSMT" w:hAnsi="TimesNewRomanPSMT" w:cs="TimesNewRomanPSMT"/>
+          <w:color w:val="000000"/>
+          <w:sz w:val="24"/>
+          <w:szCs w:val="24"/>
+        </w:rPr>
+      </w:pPr>
+      <w:proofErr w:type="gramStart"/>
+      <w:r>
+        <w:rPr>
+          <w:rFonts w:ascii="TimesNewRomanPSMT" w:hAnsi="TimesNewRomanPSMT" w:cs="TimesNewRomanPSMT"/>
+          <w:color w:val="000000"/>
+          <w:sz w:val="24"/>
+          <w:szCs w:val="24"/>
+        </w:rPr>
+        <w:t>l'éclairage</w:t>
+      </w:r>
+      <w:proofErr w:type="gramEnd"/>
+      <w:r>
+        <w:rPr>
+          <w:rFonts w:ascii="TimesNewRomanPSMT" w:hAnsi="TimesNewRomanPSMT" w:cs="TimesNewRomanPSMT"/>
+          <w:color w:val="000000"/>
+          <w:sz w:val="24"/>
+          <w:szCs w:val="24"/>
+        </w:rPr>
+        <w:t xml:space="preserve"> sur la perception visuelle, de nombreuses études ont été menées. Plus</w:t>
+      </w:r>
+    </w:p>
+    <w:p>
+      <w:pPr>
+        <w:autoSpaceDE w:val="0"/>
+        <w:autoSpaceDN w:val="0"/>
+        <w:adjustRightInd w:val="0"/>
+        <w:spacing w:after="0" w:line="240" w:lineRule="auto"/>
+        <w:rPr>
+          <w:rFonts w:ascii="TimesNewRomanPSMT" w:hAnsi="TimesNewRomanPSMT" w:cs="TimesNewRomanPSMT"/>
+          <w:color w:val="000000"/>
+          <w:sz w:val="24"/>
+          <w:szCs w:val="24"/>
+        </w:rPr>
+      </w:pPr>
+      <w:proofErr w:type="gramStart"/>
+      <w:r>
+        <w:rPr>
+          <w:rFonts w:ascii="TimesNewRomanPSMT" w:hAnsi="TimesNewRomanPSMT" w:cs="TimesNewRomanPSMT"/>
+          <w:color w:val="000000"/>
+          <w:sz w:val="24"/>
+          <w:szCs w:val="24"/>
+        </w:rPr>
+        <w:t>précisément</w:t>
+      </w:r>
+      <w:proofErr w:type="gramEnd"/>
+      <w:r>
+        <w:rPr>
+          <w:rFonts w:ascii="TimesNewRomanPSMT" w:hAnsi="TimesNewRomanPSMT" w:cs="TimesNewRomanPSMT"/>
+          <w:color w:val="000000"/>
+          <w:sz w:val="24"/>
+          <w:szCs w:val="24"/>
+        </w:rPr>
+        <w:t>, la recherche s'est concentrée sur ces facteurs et leur impact sur la façon dont</w:t>
+      </w:r>
+    </w:p>
+    <w:p>
+      <w:pPr>
+        <w:autoSpaceDE w:val="0"/>
+        <w:autoSpaceDN w:val="0"/>
+        <w:adjustRightInd w:val="0"/>
+        <w:spacing w:after="0" w:line="240" w:lineRule="auto"/>
+        <w:rPr>
+          <w:rFonts w:ascii="TimesNewRomanPSMT" w:hAnsi="TimesNewRomanPSMT" w:cs="TimesNewRomanPSMT"/>
+          <w:color w:val="000000"/>
+          <w:sz w:val="24"/>
+          <w:szCs w:val="24"/>
+        </w:rPr>
+      </w:pPr>
+      <w:proofErr w:type="gramStart"/>
+      <w:r>
+        <w:rPr>
+          <w:rFonts w:ascii="TimesNewRomanPSMT" w:hAnsi="TimesNewRomanPSMT" w:cs="TimesNewRomanPSMT"/>
+          <w:color w:val="000000"/>
+          <w:sz w:val="24"/>
+          <w:szCs w:val="24"/>
+        </w:rPr>
+        <w:lastRenderedPageBreak/>
+        <w:t>les</w:t>
+      </w:r>
+      <w:proofErr w:type="gramEnd"/>
+      <w:r>
+        <w:rPr>
+          <w:rFonts w:ascii="TimesNewRomanPSMT" w:hAnsi="TimesNewRomanPSMT" w:cs="TimesNewRomanPSMT"/>
+          <w:color w:val="000000"/>
+          <w:sz w:val="24"/>
+          <w:szCs w:val="24"/>
+        </w:rPr>
+        <w:t xml:space="preserve"> individus perçoivent les stimuli visuels. Il existe de nombreuses méthodes pour</w:t>
+      </w:r>
+    </w:p>
+    <w:p>
+      <w:pPr>
+        <w:autoSpaceDE w:val="0"/>
+        <w:autoSpaceDN w:val="0"/>
+        <w:adjustRightInd w:val="0"/>
+        <w:spacing w:after="0" w:line="240" w:lineRule="auto"/>
+        <w:rPr>
+          <w:rFonts w:ascii="TimesNewRomanPSMT" w:hAnsi="TimesNewRomanPSMT" w:cs="TimesNewRomanPSMT"/>
+          <w:color w:val="000000"/>
+          <w:sz w:val="24"/>
+          <w:szCs w:val="24"/>
+        </w:rPr>
+      </w:pPr>
+      <w:proofErr w:type="gramStart"/>
+      <w:r>
+        <w:rPr>
+          <w:rFonts w:ascii="TimesNewRomanPSMT" w:hAnsi="TimesNewRomanPSMT" w:cs="TimesNewRomanPSMT"/>
+          <w:color w:val="000000"/>
+          <w:sz w:val="24"/>
+          <w:szCs w:val="24"/>
+        </w:rPr>
+        <w:t>identifier</w:t>
+      </w:r>
+      <w:proofErr w:type="gramEnd"/>
+      <w:r>
+        <w:rPr>
+          <w:rFonts w:ascii="TimesNewRomanPSMT" w:hAnsi="TimesNewRomanPSMT" w:cs="TimesNewRomanPSMT"/>
+          <w:color w:val="000000"/>
+          <w:sz w:val="24"/>
+          <w:szCs w:val="24"/>
+        </w:rPr>
+        <w:t xml:space="preserve"> les visages dans les images statiques qui ont été développées au fil du temps. La</w:t>
+      </w:r>
+    </w:p>
+    <w:p>
+      <w:pPr>
+        <w:autoSpaceDE w:val="0"/>
+        <w:autoSpaceDN w:val="0"/>
+        <w:adjustRightInd w:val="0"/>
+        <w:spacing w:after="0" w:line="240" w:lineRule="auto"/>
+        <w:rPr>
+          <w:rFonts w:ascii="TimesNewRomanPSMT" w:hAnsi="TimesNewRomanPSMT" w:cs="TimesNewRomanPSMT"/>
+          <w:color w:val="202122"/>
+          <w:sz w:val="24"/>
+          <w:szCs w:val="24"/>
+        </w:rPr>
+      </w:pPr>
+      <w:proofErr w:type="gramStart"/>
+      <w:r>
+        <w:rPr>
+          <w:rFonts w:ascii="TimesNewRomanPSMT" w:hAnsi="TimesNewRomanPSMT" w:cs="TimesNewRomanPSMT"/>
+          <w:color w:val="000000"/>
+          <w:sz w:val="24"/>
+          <w:szCs w:val="24"/>
+        </w:rPr>
+        <w:t>reconnaissance</w:t>
+      </w:r>
+      <w:proofErr w:type="gramEnd"/>
+      <w:r>
+        <w:rPr>
+          <w:rFonts w:ascii="TimesNewRomanPSMT" w:hAnsi="TimesNewRomanPSMT" w:cs="TimesNewRomanPSMT"/>
+          <w:color w:val="000000"/>
+          <w:sz w:val="24"/>
+          <w:szCs w:val="24"/>
+        </w:rPr>
+        <w:t xml:space="preserve"> faciale a été effectuée pour la première fois dans les années 1970 par </w:t>
+      </w:r>
+      <w:r>
+        <w:rPr>
+          <w:rFonts w:ascii="TimesNewRomanPSMT" w:hAnsi="TimesNewRomanPSMT" w:cs="TimesNewRomanPSMT"/>
+          <w:color w:val="202122"/>
+          <w:sz w:val="24"/>
+          <w:szCs w:val="24"/>
+        </w:rPr>
+        <w:t>à</w:t>
+      </w:r>
+    </w:p>
+    <w:p>
+      <w:pPr>
+        <w:autoSpaceDE w:val="0"/>
+        <w:autoSpaceDN w:val="0"/>
+        <w:adjustRightInd w:val="0"/>
+        <w:spacing w:after="0" w:line="240" w:lineRule="auto"/>
+        <w:rPr>
+          <w:rFonts w:ascii="TimesNewRomanPSMT" w:hAnsi="TimesNewRomanPSMT" w:cs="TimesNewRomanPSMT"/>
+          <w:color w:val="202122"/>
+          <w:sz w:val="24"/>
+          <w:szCs w:val="24"/>
+        </w:rPr>
+      </w:pPr>
+      <w:proofErr w:type="gramStart"/>
+      <w:r>
+        <w:rPr>
+          <w:rFonts w:ascii="TimesNewRomanPSMT" w:hAnsi="TimesNewRomanPSMT" w:cs="TimesNewRomanPSMT"/>
+          <w:color w:val="000000"/>
+          <w:sz w:val="24"/>
+          <w:szCs w:val="24"/>
+        </w:rPr>
+        <w:t>l’université</w:t>
+      </w:r>
+      <w:proofErr w:type="gramEnd"/>
+      <w:r>
+        <w:rPr>
+          <w:rFonts w:ascii="TimesNewRomanPSMT" w:hAnsi="TimesNewRomanPSMT" w:cs="TimesNewRomanPSMT"/>
+          <w:color w:val="000000"/>
+          <w:sz w:val="24"/>
+          <w:szCs w:val="24"/>
+        </w:rPr>
+        <w:t xml:space="preserve"> de Tokyo. La détection faciale est alors surtout utilisée </w:t>
+      </w:r>
+      <w:r>
+        <w:rPr>
+          <w:rFonts w:ascii="TimesNewRomanPSMT" w:hAnsi="TimesNewRomanPSMT" w:cs="TimesNewRomanPSMT"/>
+          <w:color w:val="202122"/>
+          <w:sz w:val="24"/>
+          <w:szCs w:val="24"/>
+        </w:rPr>
+        <w:t>à des fins de sécurité</w:t>
+      </w:r>
+    </w:p>
+    <w:p>
+      <w:pPr>
+        <w:autoSpaceDE w:val="0"/>
+        <w:autoSpaceDN w:val="0"/>
+        <w:adjustRightInd w:val="0"/>
+        <w:spacing w:after="0" w:line="240" w:lineRule="auto"/>
+        <w:rPr>
+          <w:rFonts w:ascii="TimesNewRomanPSMT" w:hAnsi="TimesNewRomanPSMT" w:cs="TimesNewRomanPSMT"/>
+          <w:color w:val="202122"/>
+          <w:sz w:val="24"/>
+          <w:szCs w:val="24"/>
+        </w:rPr>
+      </w:pPr>
+      <w:r>
+        <w:rPr>
+          <w:rFonts w:ascii="TimesNewRomanPSMT" w:hAnsi="TimesNewRomanPSMT" w:cs="TimesNewRomanPSMT"/>
+          <w:color w:val="000000"/>
+          <w:sz w:val="24"/>
+          <w:szCs w:val="24"/>
+        </w:rPr>
+        <w:t xml:space="preserve">[1]. </w:t>
+      </w:r>
+      <w:r>
+        <w:rPr>
+          <w:rFonts w:ascii="TimesNewRomanPSMT" w:hAnsi="TimesNewRomanPSMT" w:cs="TimesNewRomanPSMT"/>
+          <w:color w:val="202122"/>
+          <w:sz w:val="24"/>
+          <w:szCs w:val="24"/>
+        </w:rPr>
+        <w:t>Certaines interfaces homme machine utilisent non seulement le clavier et la souris</w:t>
+      </w:r>
+    </w:p>
+    <w:p>
+      <w:pPr>
+        <w:autoSpaceDE w:val="0"/>
+        <w:autoSpaceDN w:val="0"/>
+        <w:adjustRightInd w:val="0"/>
+        <w:spacing w:after="0" w:line="240" w:lineRule="auto"/>
+        <w:rPr>
+          <w:rFonts w:ascii="TimesNewRomanPSMT" w:hAnsi="TimesNewRomanPSMT" w:cs="TimesNewRomanPSMT"/>
+          <w:color w:val="202122"/>
+          <w:sz w:val="24"/>
+          <w:szCs w:val="24"/>
+        </w:rPr>
+      </w:pPr>
+      <w:proofErr w:type="gramStart"/>
+      <w:r>
+        <w:rPr>
+          <w:rFonts w:ascii="TimesNewRomanPSMT" w:hAnsi="TimesNewRomanPSMT" w:cs="TimesNewRomanPSMT"/>
+          <w:color w:val="202122"/>
+          <w:sz w:val="24"/>
+          <w:szCs w:val="24"/>
+        </w:rPr>
+        <w:t>mais</w:t>
+      </w:r>
+      <w:proofErr w:type="gramEnd"/>
+      <w:r>
+        <w:rPr>
+          <w:rFonts w:ascii="TimesNewRomanPSMT" w:hAnsi="TimesNewRomanPSMT" w:cs="TimesNewRomanPSMT"/>
+          <w:color w:val="202122"/>
+          <w:sz w:val="24"/>
+          <w:szCs w:val="24"/>
+        </w:rPr>
+        <w:t xml:space="preserve"> de nouvelles formes de sources d’information comme la reconnaissance des visages.</w:t>
+      </w:r>
+    </w:p>
+    <w:p>
+      <w:pPr>
+        <w:pStyle w:val="PrformatHTML"/>
+        <w:rPr>
+          <w:rFonts w:ascii="TimesNewRomanPSMT" w:hAnsi="TimesNewRomanPSMT" w:cs="TimesNewRomanPSMT"/>
+          <w:color w:val="202122"/>
+          <w:sz w:val="24"/>
+          <w:szCs w:val="24"/>
+        </w:rPr>
+      </w:pPr>
+      <w:r>
+        <w:rPr>
+          <w:rFonts w:ascii="TimesNewRomanPSMT" w:hAnsi="TimesNewRomanPSMT" w:cs="TimesNewRomanPSMT"/>
+          <w:color w:val="202122"/>
+          <w:sz w:val="24"/>
+          <w:szCs w:val="24"/>
+        </w:rPr>
+        <w:t>Dans ce chapitre, nous présenterons l’état de l’art sur les techniques de la détection faciale.</w:t>
+      </w:r>
+    </w:p>
+    <w:p>
+      <w:pPr>
+        <w:pStyle w:val="PrformatHTML"/>
+        <w:rPr>
+          <w:rStyle w:val="CodeHTML"/>
+          <w:rFonts w:ascii="Times New Roman" w:hAnsi="Times New Roman" w:cs="Times New Roman"/>
+          <w:color w:val="000000" w:themeColor="text1"/>
+          <w:sz w:val="24"/>
+          <w:szCs w:val="24"/>
+        </w:rPr>
+      </w:pPr>
+    </w:p>
+    <w:p>
+      <w:pPr>
+        <w:pStyle w:val="PrformatHTML"/>
+        <w:rPr>
+          <w:rFonts w:ascii="Times New Roman" w:hAnsi="Times New Roman" w:cs="Times New Roman"/>
+          <w:color w:val="000000" w:themeColor="text1"/>
+          <w:sz w:val="24"/>
+          <w:szCs w:val="24"/>
+        </w:rPr>
+      </w:pPr>
+      <w:r>
+        <w:rPr>
+          <w:rStyle w:val="CodeHTML"/>
+          <w:rFonts w:ascii="Times New Roman" w:hAnsi="Times New Roman" w:cs="Times New Roman"/>
+          <w:color w:val="000000" w:themeColor="text1"/>
+          <w:sz w:val="24"/>
+          <w:szCs w:val="24"/>
+        </w:rPr>
+        <w:t>"""</w:t>
+      </w:r>
+    </w:p>
+    <w:p>
+      <w:pPr>
+        <w:pStyle w:val="NormalWeb"/>
+        <w:rPr>
+          <w:color w:val="000000" w:themeColor="text1"/>
+        </w:rPr>
+      </w:pPr>
+      <w:r>
+        <w:rPr>
+          <w:rStyle w:val="lev"/>
+          <w:color w:val="000000" w:themeColor="text1"/>
+          <w:sz w:val="28"/>
+          <w:szCs w:val="28"/>
+        </w:rPr>
+        <w:t>Ré</w:t>
+      </w:r>
+      <w:r>
+        <w:rPr>
+          <w:rStyle w:val="lev"/>
+          <w:color w:val="000000" w:themeColor="text1"/>
+          <w:sz w:val="28"/>
+          <w:szCs w:val="28"/>
+        </w:rPr>
+        <w:t>sultats</w:t>
+      </w:r>
+      <w:r>
+        <w:rPr>
+          <w:rStyle w:val="lev"/>
+          <w:color w:val="000000" w:themeColor="text1"/>
+        </w:rPr>
+        <w:t xml:space="preserve"> : </w:t>
+      </w:r>
+    </w:p>
+    <w:p>
+      <w:pPr>
         <w:pStyle w:val="NormalWeb"/>
         <w:rPr>
           <w:rStyle w:val="CodeHTML"/>

</xml_diff>